<commit_message>
Update table of contents depth and section numbering in statistical analysis plan files
</commit_message>
<xml_diff>
--- a/statistical-analysis-plan/statistical-analysis-plan.docx
+++ b/statistical-analysis-plan/statistical-analysis-plan.docx
@@ -76,7 +76,7 @@
         <w:p>
           <w:r>
             <w:fldChar w:fldCharType="begin" w:dirty="true"/>
-            <w:instrText xml:space="preserve">TOC \o "1-3" \h \z \u</w:instrText>
+            <w:instrText xml:space="preserve">TOC \o "1-4" \h \z \u</w:instrText>
             <w:fldChar w:fldCharType="separate"/>
             <w:fldChar w:fldCharType="end"/>
           </w:r>
@@ -1469,7 +1469,7 @@
         <w:pStyle w:val="Heading4"/>
       </w:pPr>
       <w:r>
-        <w:t xml:space="preserve">Collected using the main stepped-wedge design</w:t>
+        <w:t xml:space="preserve">5.3.2.1 Collected using the main stepped-wedge design</w:t>
       </w:r>
     </w:p>
     <w:p>
@@ -1551,7 +1551,7 @@
         <w:pStyle w:val="Heading4"/>
       </w:pPr>
       <w:r>
-        <w:t xml:space="preserve">Collected using the nested staircase design</w:t>
+        <w:t xml:space="preserve">5.3.2.2 Collected using the nested staircase design</w:t>
       </w:r>
     </w:p>
     <w:p>
@@ -4333,7 +4333,7 @@
         <w:pStyle w:val="Heading4"/>
       </w:pPr>
       <w:r>
-        <w:t xml:space="preserve">Models with autoregressive within-cluster correlation</w:t>
+        <w:t xml:space="preserve">5.10.1.1 Models with autoregressive within-cluster correlation</w:t>
       </w:r>
     </w:p>
     <w:p>
@@ -4716,7 +4716,7 @@
         <w:pStyle w:val="Heading4"/>
       </w:pPr>
       <w:r>
-        <w:t xml:space="preserve">Models with batch-specific secular trends</w:t>
+        <w:t xml:space="preserve">5.10.1.2 Models with batch-specific secular trends</w:t>
       </w:r>
     </w:p>
     <w:p>
@@ -5021,7 +5021,7 @@
         <w:pStyle w:val="Heading4"/>
       </w:pPr>
       <w:r>
-        <w:t xml:space="preserve">Models with random cluster by intervention effects</w:t>
+        <w:t xml:space="preserve">5.10.1.3 Models with random cluster by intervention effects</w:t>
       </w:r>
     </w:p>
     <w:p>
@@ -5458,7 +5458,7 @@
         <w:pStyle w:val="Heading4"/>
       </w:pPr>
       <w:r>
-        <w:t xml:space="preserve">Models with correlated random cluster-by-intervention effects</w:t>
+        <w:t xml:space="preserve">5.10.1.4 Models with correlated random cluster-by-intervention effects</w:t>
       </w:r>
     </w:p>
     <w:p>
@@ -6188,7 +6188,7 @@
         <w:pStyle w:val="Heading4"/>
       </w:pPr>
       <w:r>
-        <w:t xml:space="preserve">Models with time modelled with a spline function</w:t>
+        <w:t xml:space="preserve">5.10.1.5 Models with time modelled with a spline function</w:t>
       </w:r>
     </w:p>
     <w:p>
@@ -6672,7 +6672,7 @@
         <w:pStyle w:val="Heading4"/>
       </w:pPr>
       <w:r>
-        <w:t xml:space="preserve">Models exploring lag and weaning effects</w:t>
+        <w:t xml:space="preserve">5.10.1.6 Models exploring lag and weaning effects</w:t>
       </w:r>
     </w:p>
     <w:p>

</xml_diff>

<commit_message>
Restore SAP title page
</commit_message>
<xml_diff>
--- a/statistical-analysis-plan/statistical-analysis-plan.docx
+++ b/statistical-analysis-plan/statistical-analysis-plan.docx
@@ -12,10 +12,22 @@
     </w:p>
     <w:p>
       <w:pPr>
-        <w:pStyle w:val="Author"/>
-      </w:pPr>
-      <w:r>
-        <w:t xml:space="preserve">Version 0.6.0, 2026-03-04</w:t>
+        <w:pStyle w:val="Subtitle"/>
+      </w:pPr>
+      <w:r>
+        <w:t xml:space="preserve">Effects of Advanced Trauma Life Support</w:t>
+      </w:r>
+      <w:r>
+        <w:rPr>
+          <w:vertAlign w:val="superscript"/>
+        </w:rPr>
+        <w:t xml:space="preserve">®</w:t>
+      </w:r>
+      <w:r>
+        <w:t xml:space="preserve"> </w:t>
+      </w:r>
+      <w:r>
+        <w:t xml:space="preserve">Training Compared to Standard Care on Adult Trauma Patient Outcomes: A Stepped-Wedge Cluster Randomised Trial</w:t>
       </w:r>
     </w:p>
     <w:sdt>

</xml_diff>

<commit_message>
Restore SAP content and reapply today's edits
</commit_message>
<xml_diff>
--- a/statistical-analysis-plan/statistical-analysis-plan.docx
+++ b/statistical-analysis-plan/statistical-analysis-plan.docx
@@ -61,7 +61,7 @@
         <w:br w:type="page"/>
       </w:r>
     </w:p>
-    <w:bookmarkStart w:id="40" w:name="administrative-information"/>
+    <w:bookmarkStart w:id="43" w:name="administrative-information"/>
     <w:p>
       <w:pPr>
         <w:pStyle w:val="Heading1"/>
@@ -142,7 +142,7 @@
       </w:r>
     </w:p>
     <w:bookmarkEnd w:id="22"/>
-    <w:bookmarkStart w:id="39" w:name="contributors"/>
+    <w:bookmarkStart w:id="42" w:name="contributors"/>
     <w:p>
       <w:pPr>
         <w:pStyle w:val="Heading2"/>
@@ -537,7 +537,7 @@
               <w:pStyle w:val="Compact"/>
             </w:pPr>
             <w:r>
-              <w:t xml:space="preserve">Jessica Kasza</w:t>
+              <w:t xml:space="preserve">Jessica Kasza (JK)</w:t>
             </w:r>
             <w:r>
               <w:t xml:space="preserve"> </w:t>
@@ -611,15 +611,97 @@
           </w:p>
         </w:tc>
       </w:tr>
+      <w:tr>
+        <w:tc>
+          <w:tcPr/>
+          <w:p>
+            <w:pPr>
+              <w:pStyle w:val="Compact"/>
+            </w:pPr>
+            <w:r>
+              <w:t xml:space="preserve">Arpita Ghosh (AG)</w:t>
+            </w:r>
+            <w:r>
+              <w:t xml:space="preserve"> </w:t>
+            </w:r>
+            <w:hyperlink r:id="rId41">
+              <w:r>
+                <w:drawing>
+                  <wp:inline>
+                    <wp:extent cx="152400" cy="152400"/>
+                    <wp:effectExtent b="0" l="0" r="0" t="0"/>
+                    <wp:docPr descr="" title="" id="39" name="Picture"/>
+                    <a:graphic>
+                      <a:graphicData uri="http://schemas.openxmlformats.org/drawingml/2006/picture">
+                        <pic:pic>
+                          <pic:nvPicPr>
+                            <pic:cNvPr descr="ORCIDiD_icon16x16.png" id="40" name="Picture"/>
+                            <pic:cNvPicPr>
+                              <a:picLocks noChangeArrowheads="1" noChangeAspect="1"/>
+                            </pic:cNvPicPr>
+                          </pic:nvPicPr>
+                          <pic:blipFill>
+                            <a:blip r:embed="rId23"/>
+                            <a:stretch>
+                              <a:fillRect/>
+                            </a:stretch>
+                          </pic:blipFill>
+                          <pic:spPr bwMode="auto">
+                            <a:xfrm>
+                              <a:off x="0" y="0"/>
+                              <a:ext cx="152400" cy="152400"/>
+                            </a:xfrm>
+                            <a:prstGeom prst="rect">
+                              <a:avLst/>
+                            </a:prstGeom>
+                            <a:noFill/>
+                            <a:ln w="9525">
+                              <a:noFill/>
+                              <a:headEnd/>
+                              <a:tailEnd/>
+                            </a:ln>
+                          </pic:spPr>
+                        </pic:pic>
+                      </a:graphicData>
+                    </a:graphic>
+                  </wp:inline>
+                </w:drawing>
+              </w:r>
+            </w:hyperlink>
+          </w:p>
+        </w:tc>
+        <w:tc>
+          <w:tcPr/>
+          <w:p>
+            <w:pPr>
+              <w:pStyle w:val="Compact"/>
+            </w:pPr>
+            <w:r>
+              <w:t xml:space="preserve">The George Institute for Global Health, New Delhi, India</w:t>
+            </w:r>
+          </w:p>
+        </w:tc>
+        <w:tc>
+          <w:tcPr/>
+          <w:p>
+            <w:pPr>
+              <w:pStyle w:val="Compact"/>
+            </w:pPr>
+            <w:r>
+              <w:t xml:space="preserve">Statistician</w:t>
+            </w:r>
+          </w:p>
+        </w:tc>
+      </w:tr>
     </w:tbl>
     <w:p>
       <w:r>
         <w:br w:type="page"/>
       </w:r>
     </w:p>
-    <w:bookmarkEnd w:id="39"/>
-    <w:bookmarkEnd w:id="40"/>
-    <w:bookmarkStart w:id="41" w:name="trial-synopsis"/>
+    <w:bookmarkEnd w:id="42"/>
+    <w:bookmarkEnd w:id="43"/>
+    <w:bookmarkStart w:id="44" w:name="trial-synopsis"/>
     <w:p>
       <w:pPr>
         <w:pStyle w:val="Heading1"/>
@@ -942,8 +1024,8 @@
         <w:br w:type="page"/>
       </w:r>
     </w:p>
-    <w:bookmarkEnd w:id="41"/>
-    <w:bookmarkStart w:id="43" w:name="special-considerations"/>
+    <w:bookmarkEnd w:id="44"/>
+    <w:bookmarkStart w:id="46" w:name="special-considerations"/>
     <w:p>
       <w:pPr>
         <w:pStyle w:val="Heading1"/>
@@ -952,7 +1034,7 @@
         <w:t xml:space="preserve">3. Special considerations</w:t>
       </w:r>
     </w:p>
-    <w:bookmarkStart w:id="42" w:name="funding"/>
+    <w:bookmarkStart w:id="45" w:name="funding"/>
     <w:p>
       <w:pPr>
         <w:pStyle w:val="Heading2"/>
@@ -974,9 +1056,9 @@
         <w:br w:type="page"/>
       </w:r>
     </w:p>
-    <w:bookmarkEnd w:id="42"/>
-    <w:bookmarkEnd w:id="43"/>
-    <w:bookmarkStart w:id="46" w:name="aim-and-objectives"/>
+    <w:bookmarkEnd w:id="45"/>
+    <w:bookmarkEnd w:id="46"/>
+    <w:bookmarkStart w:id="49" w:name="aim-and-objectives"/>
     <w:p>
       <w:pPr>
         <w:pStyle w:val="Heading1"/>
@@ -985,7 +1067,7 @@
         <w:t xml:space="preserve">4. Aim and objectives</w:t>
       </w:r>
     </w:p>
-    <w:bookmarkStart w:id="44" w:name="aim"/>
+    <w:bookmarkStart w:id="47" w:name="aim"/>
     <w:p>
       <w:pPr>
         <w:pStyle w:val="Heading2"/>
@@ -1014,8 +1096,8 @@
         <w:t xml:space="preserve">training with standard care on outcomes in adult trauma patients.</w:t>
       </w:r>
     </w:p>
-    <w:bookmarkEnd w:id="44"/>
-    <w:bookmarkStart w:id="45" w:name="objectives"/>
+    <w:bookmarkEnd w:id="47"/>
+    <w:bookmarkStart w:id="48" w:name="objectives"/>
     <w:p>
       <w:pPr>
         <w:pStyle w:val="Heading2"/>
@@ -1108,9 +1190,9 @@
         <w:t xml:space="preserve">training on subgroups of patients compared to standard care.</w:t>
       </w:r>
     </w:p>
-    <w:bookmarkEnd w:id="45"/>
-    <w:bookmarkEnd w:id="46"/>
-    <w:bookmarkStart w:id="116" w:name="statistical-analysis"/>
+    <w:bookmarkEnd w:id="48"/>
+    <w:bookmarkEnd w:id="49"/>
+    <w:bookmarkStart w:id="119" w:name="statistical-analysis"/>
     <w:p>
       <w:pPr>
         <w:pStyle w:val="Heading1"/>
@@ -1119,7 +1201,7 @@
         <w:t xml:space="preserve">5. Statistical analysis</w:t>
       </w:r>
     </w:p>
-    <w:bookmarkStart w:id="55" w:name="design"/>
+    <w:bookmarkStart w:id="58" w:name="design"/>
     <w:p>
       <w:pPr>
         <w:pStyle w:val="Heading2"/>
@@ -1172,7 +1254,7 @@
       <w:tr>
         <w:tc>
           <w:tcPr/>
-          <w:bookmarkStart w:id="50" w:name="fig-trial-design"/>
+          <w:bookmarkStart w:id="53" w:name="fig-trial-design"/>
           <w:p>
             <w:pPr>
               <w:pStyle w:val="Compact"/>
@@ -1183,18 +1265,18 @@
                 <wp:inline>
                   <wp:extent cx="5334000" cy="3198592"/>
                   <wp:effectExtent b="0" l="0" r="0" t="0"/>
-                  <wp:docPr descr="" title="" id="48" name="Picture"/>
+                  <wp:docPr descr="" title="" id="51" name="Picture"/>
                   <a:graphic>
                     <a:graphicData uri="http://schemas.openxmlformats.org/drawingml/2006/picture">
                       <pic:pic>
                         <pic:nvPicPr>
-                          <pic:cNvPr descr="trial-design-figure-30-clusters-5-sequences-6-batches-6-batches-overlap-4-min-standard-care-4-min-intervention-1-transition-months-0-transition-overlap.0-staircase-months.png" id="49" name="Picture"/>
+                          <pic:cNvPr descr="trial-design-figure-30-clusters-5-sequences-6-batches-6-batches-overlap-4-min-standard-care-4-min-intervention-1-transition-months-0-transition-overlap.0-staircase-months.png" id="52" name="Picture"/>
                           <pic:cNvPicPr>
                             <a:picLocks noChangeArrowheads="1" noChangeAspect="1"/>
                           </pic:cNvPicPr>
                         </pic:nvPicPr>
                         <pic:blipFill>
-                          <a:blip r:embed="rId47"/>
+                          <a:blip r:embed="rId50"/>
                           <a:stretch>
                             <a:fillRect/>
                           </a:stretch>
@@ -1234,7 +1316,7 @@
               <w:t xml:space="preserve">Figure 1: Trial design. Lines represent the duration of patient enrolment across clusters and phases. Clusters will be sequentially allocated to a batch based on when they enter the study. Within each batch clusters will then be randomised to an intervention implementation sequence.</w:t>
             </w:r>
           </w:p>
-          <w:bookmarkEnd w:id="50"/>
+          <w:bookmarkEnd w:id="53"/>
         </w:tc>
       </w:tr>
     </w:tbl>
@@ -1282,7 +1364,7 @@
       <w:tr>
         <w:tc>
           <w:tcPr/>
-          <w:bookmarkStart w:id="54" w:name="fig-nested-staircase-design"/>
+          <w:bookmarkStart w:id="57" w:name="fig-nested-staircase-design"/>
           <w:p>
             <w:pPr>
               <w:pStyle w:val="Compact"/>
@@ -1293,18 +1375,18 @@
                 <wp:inline>
                   <wp:extent cx="5334000" cy="3198592"/>
                   <wp:effectExtent b="0" l="0" r="0" t="0"/>
-                  <wp:docPr descr="" title="" id="52" name="Picture"/>
+                  <wp:docPr descr="" title="" id="55" name="Picture"/>
                   <a:graphic>
                     <a:graphicData uri="http://schemas.openxmlformats.org/drawingml/2006/picture">
                       <pic:pic>
                         <pic:nvPicPr>
-                          <pic:cNvPr descr="trial-design-figure-30-clusters-5-sequences-6-batches-6-batches-overlap-4-min-standard-care-4-min-intervention-1-transition-months-0-transition-overlap.3-staircase-months.png" id="53" name="Picture"/>
+                          <pic:cNvPr descr="trial-design-figure-30-clusters-5-sequences-6-batches-6-batches-overlap-4-min-standard-care-4-min-intervention-1-transition-months-0-transition-overlap.3-staircase-months.png" id="56" name="Picture"/>
                           <pic:cNvPicPr>
                             <a:picLocks noChangeArrowheads="1" noChangeAspect="1"/>
                           </pic:cNvPicPr>
                         </pic:nvPicPr>
                         <pic:blipFill>
-                          <a:blip r:embed="rId51"/>
+                          <a:blip r:embed="rId54"/>
                           <a:stretch>
                             <a:fillRect/>
                           </a:stretch>
@@ -1344,12 +1426,12 @@
               <w:t xml:space="preserve">Figure 2: Nested staircase design. The design includes a random subset of patients presenting during the three months preceding the transition phase, and the three months following the transition phase.</w:t>
             </w:r>
           </w:p>
-          <w:bookmarkEnd w:id="54"/>
+          <w:bookmarkEnd w:id="57"/>
         </w:tc>
       </w:tr>
     </w:tbl>
-    <w:bookmarkEnd w:id="55"/>
-    <w:bookmarkStart w:id="56" w:name="randomisation-of-clusters"/>
+    <w:bookmarkEnd w:id="58"/>
+    <w:bookmarkStart w:id="59" w:name="randomisation-of-clusters"/>
     <w:p>
       <w:pPr>
         <w:pStyle w:val="Heading2"/>
@@ -1363,7 +1445,23 @@
         <w:pStyle w:val="FirstParagraph"/>
       </w:pPr>
       <w:r>
-        <w:t xml:space="preserve">We will assign clusters to batches as they are found to be eligible and receive ethical approval. Batches will include clusters from hospitals in different regions to optimize trial logistics. We will randomise the clusters allocated to each batch to the different intervention implementation sequences within that batch. We will balance the randomisation within each batch on cluster size, defined as monthly volume of eligible patient participants, using covariate constrained randomisation. The random allocation sequence will be generated by JM who will send the results to the trial team, to allow the logistics of securing seats in upcoming courses to be initiated. We will conceal the randomisation order to the sites for as long as it is logistically possible, considering that arrangements at the site level for sending physicians to ATLS</w:t>
+        <w:t xml:space="preserve">We will enrol and assign clusters to batches once eligibility is confirmed and ethical approval is obtained. Each batch will include hospitals from different regions to optimise trial logistics and training delivery. Within each batch, clusters will be randomised to the intervention implementation sequences allocated to that batch. Randomisation is conducted at the cluster level and stratified by batch. Within each batch, allocation is balanced on cluster size, defined as the monthly volume of eligible patients, using covariate-constrained randomisation (CCR). CCR was selected to improve balance between intervention conditions on this key design variable.</w:t>
+      </w:r>
+    </w:p>
+    <w:p>
+      <w:pPr>
+        <w:pStyle w:val="BodyText"/>
+      </w:pPr>
+      <w:r>
+        <w:t xml:space="preserve">For example, in Batch 1, five clusters were randomised to one of five sequences using CCR. A statistician (JM) implemented a computer algorithm in R to evaluate all possible allocations (n = 120) and calculate a balance metric reflecting how evenly cluster size would be distributed between intervention and control conditions. For each allocation, the squared difference in anticipated cluster size between conditions was calculated; because only one covariate was used, this squared difference constituted the balance statistic. The 10% of allocations demonstrating the greatest imbalance were excluded, and the remaining allocations formed the candidate set. The final allocation was then selected at random from this set. Owing to limitations in the algorithm, the balance score was calculated assuming a complete design, although the trial design includes transition periods. This CCR procedure is repeated independently for each batch.</w:t>
+      </w:r>
+    </w:p>
+    <w:p>
+      <w:pPr>
+        <w:pStyle w:val="BodyText"/>
+      </w:pPr>
+      <w:r>
+        <w:t xml:space="preserve">The random allocation sequence is generated by JM and communicated to the trial team to allow logistical arrangements, including securing places on upcoming ATLS</w:t>
       </w:r>
       <w:r>
         <w:rPr>
@@ -1375,16 +1473,11 @@
         <w:t xml:space="preserve"> </w:t>
       </w:r>
       <w:r>
-        <w:t xml:space="preserve">training need to be made in advance.</w:t>
-      </w:r>
-    </w:p>
-    <w:p>
-      <w:pPr>
-        <w:pStyle w:val="BodyText"/>
-      </w:pPr>
-    </w:p>
-    <w:bookmarkEnd w:id="56"/>
-    <w:bookmarkStart w:id="63" w:name="outcomes"/>
+        <w:t xml:space="preserve">training courses, to be initiated. Allocation order will be concealed from participating sites for as long as logistically feasible, recognising that advance planning is required to release physicians for training.</w:t>
+      </w:r>
+    </w:p>
+    <w:bookmarkEnd w:id="59"/>
+    <w:bookmarkStart w:id="66" w:name="outcomes"/>
     <w:p>
       <w:pPr>
         <w:pStyle w:val="Heading2"/>
@@ -1393,7 +1486,7 @@
         <w:t xml:space="preserve">5.3 Outcomes</w:t>
       </w:r>
     </w:p>
-    <w:bookmarkStart w:id="57" w:name="primary-outcome"/>
+    <w:bookmarkStart w:id="60" w:name="primary-outcome"/>
     <w:p>
       <w:pPr>
         <w:pStyle w:val="Heading3"/>
@@ -1410,8 +1503,8 @@
         <w:t xml:space="preserve">The primary outcome will be in-hospital mortality within 30 days of arrival at the emergency department. We define this outcome as any death occurring in the hospital during the initial admission, up to 30 days post arrival at the emergency department. Clinical research coordinators will extract information on death from patient hospital records. If the patient has been transferred to another hospital, the clinical research coordinators will collect data on this outcome by calling the patient or a patient representative, or by contacting the hospital to which the patient was transferred. Data on this outcome will be collected continuously during the trial.</w:t>
       </w:r>
     </w:p>
-    <w:bookmarkEnd w:id="57"/>
-    <w:bookmarkStart w:id="62" w:name="secondary-outcomes"/>
+    <w:bookmarkEnd w:id="60"/>
+    <w:bookmarkStart w:id="65" w:name="secondary-outcomes"/>
     <w:p>
       <w:pPr>
         <w:pStyle w:val="Heading3"/>
@@ -1420,7 +1513,7 @@
         <w:t xml:space="preserve">5.3.2 Secondary outcomes</w:t>
       </w:r>
     </w:p>
-    <w:bookmarkStart w:id="58" w:name="Xdb0e69ac2f6fc09a45efb162c3cc667f9413bd2"/>
+    <w:bookmarkStart w:id="61" w:name="Xdb0e69ac2f6fc09a45efb162c3cc667f9413bd2"/>
     <w:p>
       <w:pPr>
         <w:pStyle w:val="Heading4"/>
@@ -1501,8 +1594,8 @@
         <w:t xml:space="preserve">Return to work at 30 days and three months after arrival at the emergency department. Data on this outcome will be collected in person if the patient is still in hospital, or by phone if the patient has been discharged.</w:t>
       </w:r>
     </w:p>
-    <w:bookmarkEnd w:id="58"/>
-    <w:bookmarkStart w:id="61" w:name="Xac098b8b976789377f406b0c926b7e67113ef4f"/>
+    <w:bookmarkEnd w:id="61"/>
+    <w:bookmarkStart w:id="64" w:name="Xac098b8b976789377f406b0c926b7e67113ef4f"/>
     <w:p>
       <w:pPr>
         <w:pStyle w:val="Heading4"/>
@@ -1644,7 +1737,7 @@
       <w:tr>
         <w:tc>
           <w:tcPr/>
-          <w:bookmarkStart w:id="59" w:name="tbl-outcomes-population"/>
+          <w:bookmarkStart w:id="62" w:name="tbl-outcomes-population"/>
           <w:p>
             <w:pPr>
               <w:jc w:val="center"/>
@@ -2617,7 +2710,7 @@
               </w:tc>
             </w:tr>
           </w:tbl>
-          <w:bookmarkEnd w:id="59"/>
+          <w:bookmarkEnd w:id="62"/>
           <w:p/>
         </w:tc>
       </w:tr>
@@ -2643,7 +2736,7 @@
       <w:tr>
         <w:tc>
           <w:tcPr/>
-          <w:bookmarkStart w:id="60" w:name="tbl-outcomes-analysis"/>
+          <w:bookmarkStart w:id="63" w:name="tbl-outcomes-analysis"/>
           <w:p>
             <w:pPr>
               <w:jc w:val="center"/>
@@ -3821,15 +3914,15 @@
               </w:tc>
             </w:tr>
           </w:tbl>
-          <w:bookmarkEnd w:id="60"/>
+          <w:bookmarkEnd w:id="63"/>
           <w:p/>
         </w:tc>
       </w:tr>
     </w:tbl>
-    <w:bookmarkEnd w:id="61"/>
-    <w:bookmarkEnd w:id="62"/>
-    <w:bookmarkEnd w:id="63"/>
-    <w:bookmarkStart w:id="64" w:name="statistical-hypotheses"/>
+    <w:bookmarkEnd w:id="64"/>
+    <w:bookmarkEnd w:id="65"/>
+    <w:bookmarkEnd w:id="66"/>
+    <w:bookmarkStart w:id="67" w:name="statistical-hypotheses"/>
     <w:p>
       <w:pPr>
         <w:pStyle w:val="Heading2"/>
@@ -3886,7 +3979,7 @@
         <w:t xml:space="preserve"> </w:t>
       </w:r>
       <w:r>
-        <w:t xml:space="preserve">vs standard care would be 1.</w:t>
+        <w:t xml:space="preserve">vs standard care would be 1 and the absolute risk difference (ARD) would be 0.</w:t>
       </w:r>
     </w:p>
     <w:p>
@@ -3929,7 +4022,7 @@
         <w:t xml:space="preserve"> </w:t>
       </w:r>
       <w:r>
-        <w:t xml:space="preserve">vs standard care would be different from 1. Our expectation, based on our pilot study and review of the literature, is that the OR will be less than 1, indicating lower odds of 30-day in-hospital mortality among those randomised to ATLS</w:t>
+        <w:t xml:space="preserve">vs standard care would be different from 1 and the ARD would be different from 0. Our expectation, based on our pilot study and review of the literature, is that the OR will be less than 1 and the ARD will be less than 0, indicating lower odds of 30-day in-hospital mortality among those randomised to ATLS</w:t>
       </w:r>
       <w:r>
         <w:rPr>
@@ -3944,8 +4037,8 @@
         <w:t xml:space="preserve">group compared to those randomised to the standard care group.</w:t>
       </w:r>
     </w:p>
-    <w:bookmarkEnd w:id="64"/>
-    <w:bookmarkStart w:id="71" w:name="sample-size-calculations"/>
+    <w:bookmarkEnd w:id="67"/>
+    <w:bookmarkStart w:id="74" w:name="sample-size-calculations"/>
     <w:p>
       <w:pPr>
         <w:pStyle w:val="Heading2"/>
@@ -3954,7 +4047,7 @@
         <w:t xml:space="preserve">5.5 Sample size calculations</w:t>
       </w:r>
     </w:p>
-    <w:bookmarkStart w:id="69" w:name="Xba08c803f10f7c8cd9a777b53b902d2761b3046"/>
+    <w:bookmarkStart w:id="72" w:name="Xba08c803f10f7c8cd9a777b53b902d2761b3046"/>
     <w:p>
       <w:pPr>
         <w:pStyle w:val="Heading3"/>
@@ -4037,7 +4130,7 @@
       <w:tr>
         <w:tc>
           <w:tcPr/>
-          <w:bookmarkStart w:id="68" w:name="fig-power-curves"/>
+          <w:bookmarkStart w:id="71" w:name="fig-power-curves"/>
           <w:p>
             <w:pPr>
               <w:pStyle w:val="Compact"/>
@@ -4048,18 +4141,18 @@
                 <wp:inline>
                   <wp:extent cx="5334000" cy="2369551"/>
                   <wp:effectExtent b="0" l="0" r="0" t="0"/>
-                  <wp:docPr descr="" title="" id="66" name="Picture"/>
+                  <wp:docPr descr="" title="" id="69" name="Picture"/>
                   <a:graphic>
                     <a:graphicData uri="http://schemas.openxmlformats.org/drawingml/2006/picture">
                       <pic:pic>
                         <pic:nvPicPr>
-                          <pic:cNvPr descr="./combined-power-curves.png" id="67" name="Picture"/>
+                          <pic:cNvPr descr="./combined-power-curves.png" id="70" name="Picture"/>
                           <pic:cNvPicPr>
                             <a:picLocks noChangeArrowheads="1" noChangeAspect="1"/>
                           </pic:cNvPicPr>
                         </pic:nvPicPr>
                         <pic:blipFill>
-                          <a:blip r:embed="rId65"/>
+                          <a:blip r:embed="rId68"/>
                           <a:stretch>
                             <a:fillRect/>
                           </a:stretch>
@@ -4155,12 +4248,12 @@
               <w:t xml:space="preserve">training. Under this scenario, we would need to increase the sample size per month to around 30 observations to achieve 90% powere under most combinations of CAC and ICC.</w:t>
             </w:r>
           </w:p>
-          <w:bookmarkEnd w:id="68"/>
+          <w:bookmarkEnd w:id="71"/>
         </w:tc>
       </w:tr>
     </w:tbl>
-    <w:bookmarkEnd w:id="69"/>
-    <w:bookmarkStart w:id="70" w:name="X37fc7b5fe6b5980542d53d3e88dadde59566406"/>
+    <w:bookmarkEnd w:id="72"/>
+    <w:bookmarkStart w:id="73" w:name="X37fc7b5fe6b5980542d53d3e88dadde59566406"/>
     <w:p>
       <w:pPr>
         <w:pStyle w:val="Heading3"/>
@@ -4228,9 +4321,9 @@
         <w:t xml:space="preserve">principles, quality of life, and disability will be measured in all patients included during these shifts. In each hospital, the number of shifts that will be randomised will be determined by the volume of patients included during the months preceding the staircase months.</w:t>
       </w:r>
     </w:p>
-    <w:bookmarkEnd w:id="70"/>
-    <w:bookmarkEnd w:id="71"/>
-    <w:bookmarkStart w:id="74" w:name="statistical-principles"/>
+    <w:bookmarkEnd w:id="73"/>
+    <w:bookmarkEnd w:id="74"/>
+    <w:bookmarkStart w:id="77" w:name="statistical-principles"/>
     <w:p>
       <w:pPr>
         <w:pStyle w:val="Heading2"/>
@@ -4239,7 +4332,7 @@
         <w:t xml:space="preserve">5.6 Statistical principles</w:t>
       </w:r>
     </w:p>
-    <w:bookmarkStart w:id="72" w:name="statistical-software"/>
+    <w:bookmarkStart w:id="75" w:name="statistical-software"/>
     <w:p>
       <w:pPr>
         <w:pStyle w:val="Heading3"/>
@@ -4265,8 +4358,8 @@
         <w:t xml:space="preserve">.</w:t>
       </w:r>
     </w:p>
-    <w:bookmarkEnd w:id="72"/>
-    <w:bookmarkStart w:id="73" w:name="Xb3701c3e4f516f3436ab2f14fbfd68958c11744"/>
+    <w:bookmarkEnd w:id="75"/>
+    <w:bookmarkStart w:id="76" w:name="Xb3701c3e4f516f3436ab2f14fbfd68958c11744"/>
     <w:p>
       <w:pPr>
         <w:pStyle w:val="Heading3"/>
@@ -4283,9 +4376,9 @@
         <w:t xml:space="preserve">We will use a two-sided significance level of 0.05 for all analyses, and we will report 95% confidence intervals (CI) for all estimates. We will not adjust for multiple testing because no secondary outcome is regarded as singularly more important.</w:t>
       </w:r>
     </w:p>
-    <w:bookmarkEnd w:id="73"/>
-    <w:bookmarkEnd w:id="74"/>
-    <w:bookmarkStart w:id="75" w:name="analysis-populations"/>
+    <w:bookmarkEnd w:id="76"/>
+    <w:bookmarkEnd w:id="77"/>
+    <w:bookmarkStart w:id="78" w:name="analysis-populations"/>
     <w:p>
       <w:pPr>
         <w:pStyle w:val="Heading2"/>
@@ -4311,8 +4404,8 @@
         <w:t xml:space="preserve">.</w:t>
       </w:r>
     </w:p>
-    <w:bookmarkEnd w:id="75"/>
-    <w:bookmarkStart w:id="78" w:name="baseline-analyses"/>
+    <w:bookmarkEnd w:id="78"/>
+    <w:bookmarkStart w:id="81" w:name="baseline-analyses"/>
     <w:p>
       <w:pPr>
         <w:pStyle w:val="Heading2"/>
@@ -4321,7 +4414,7 @@
         <w:t xml:space="preserve">5.8 Baseline analyses</w:t>
       </w:r>
     </w:p>
-    <w:bookmarkStart w:id="76" w:name="cluster-characteristics"/>
+    <w:bookmarkStart w:id="79" w:name="cluster-characteristics"/>
     <w:p>
       <w:pPr>
         <w:pStyle w:val="Heading3"/>
@@ -4338,8 +4431,8 @@
         <w:t xml:space="preserve">We will describe cluster characteristics including location and size using frequencies and percentages for discrete variables and means, standard deviations, medians and interquartile ranges (Q1-Q3) for continuous variables.</w:t>
       </w:r>
     </w:p>
-    <w:bookmarkEnd w:id="76"/>
-    <w:bookmarkStart w:id="77" w:name="patient-characteristics"/>
+    <w:bookmarkEnd w:id="79"/>
+    <w:bookmarkStart w:id="80" w:name="patient-characteristics"/>
     <w:p>
       <w:pPr>
         <w:pStyle w:val="Heading3"/>
@@ -4356,9 +4449,9 @@
         <w:t xml:space="preserve">We will describe patient characteristics at baseline, meaning all pre-training periods, per treatment group and overall using frequencies and percentages for discrete variables and means, standard deviations, medians and interquartile ranges (Q1-Q3) for continuous variables. We will not adjust for clustering when presenting baseline characteristics.</w:t>
       </w:r>
     </w:p>
-    <w:bookmarkEnd w:id="77"/>
-    <w:bookmarkEnd w:id="78"/>
-    <w:bookmarkStart w:id="79" w:name="interim-analysis"/>
+    <w:bookmarkEnd w:id="80"/>
+    <w:bookmarkEnd w:id="81"/>
+    <w:bookmarkStart w:id="82" w:name="interim-analysis"/>
     <w:p>
       <w:pPr>
         <w:pStyle w:val="Heading2"/>
@@ -4375,8 +4468,8 @@
         <w:t xml:space="preserve">There will be one interim analysis after half of the batches have completed the trial. The interim analysis will be assessed by the joint Trial Steering and Data Monitoring Committee. The purposes of this interim analysis will be to assess the trial’s feasibility and recommend that the trial be stopped if it is not feasible (e.g. if hospitals fail to adhere to the randomisation schedule or if there are substantial missing data in outcomes), and to compare characteristics across intervention conditions to monitor for differential recruitment/ascertainment between the intervention and control groups. No efficacy stopping is planned because any estimates obtained at the time point of the interim analysis will be associated with major statistical uncertainties.</w:t>
       </w:r>
     </w:p>
-    <w:bookmarkEnd w:id="79"/>
-    <w:bookmarkStart w:id="101" w:name="analysis-of-the-primary-outcome"/>
+    <w:bookmarkEnd w:id="82"/>
+    <w:bookmarkStart w:id="104" w:name="analysis-of-the-primary-outcome"/>
     <w:p>
       <w:pPr>
         <w:pStyle w:val="Heading2"/>
@@ -4390,7 +4483,7 @@
         <w:pStyle w:val="FirstParagraph"/>
       </w:pPr>
       <w:r>
-        <w:t xml:space="preserve">The primary outcome is in-hospital mortality within 30 days of arrival at the emergency department and will be analysed as a dichotomous variable.</w:t>
+        <w:t xml:space="preserve">The primary outcome is in-hospital mortality within 30 days of arrival at the emergency department and will be analysed as a dichotomous variable. We will estimate the intervention effect as the odds ratio (OR) of death between the ATLS® and standard care arms, with an OR &lt; 1 indicating lower odds of death in the ATLS® arm compared to the standard care arm and vice versa. We will also estimate the absolute risk difference (ARD) of death between the ATLS® and standard care arms, with an ARD &lt; 0 indicating lower risk of death in the ATLS® arm compared to the standard care arm and vice versa.</w:t>
       </w:r>
     </w:p>
     <w:p>
@@ -4398,39 +4491,7 @@
         <w:pStyle w:val="BodyText"/>
       </w:pPr>
       <w:r>
-        <w:t xml:space="preserve">We will estimate the intervention effect as the odds ratio (OR) of death between the ATLS® and standard care arms, with an OR &lt; 1 indicating lower odds of death in the ATLS® arm compared to the standard care arm and vice versa.</w:t>
-      </w:r>
-    </w:p>
-    <w:p>
-      <w:pPr>
-        <w:pStyle w:val="BodyText"/>
-      </w:pPr>
-      <w:r>
-        <w:t xml:space="preserve">We will also estimate the absolute risk difference (ARD) of death between the ATLS® and standard care arms, with an ARD &lt; 0 indicating lower risk of death in the ATLS® arm compared to the standard care arm and vice versa.</w:t>
-      </w:r>
-    </w:p>
-    <w:p>
-      <w:pPr>
-        <w:pStyle w:val="BodyText"/>
-      </w:pPr>
-      <w:r>
-        <w:t xml:space="preserve">We will use a mixed-effects binomial regression model to estimate the effect of ATLS® on mortality. The OR will be estimated using the logit link, and the ARD will be estimated using the identity link.</w:t>
-      </w:r>
-    </w:p>
-    <w:p>
-      <w:pPr>
-        <w:pStyle w:val="BodyText"/>
-      </w:pPr>
-      <w:r>
-        <w:t xml:space="preserve">The primary analysis will be based on the most complex model that converges from a prespecified sequence of models of decreasing complexity, and this model will then be subject to sensitivity analyses.</w:t>
-      </w:r>
-    </w:p>
-    <w:p>
-      <w:pPr>
-        <w:pStyle w:val="BodyText"/>
-      </w:pPr>
-      <w:r>
-        <w:t xml:space="preserve">The analysis will proceed from the most complex model to progressively simpler models if convergence or numerical stability issues arise. If the binomial model with the logit link converges but the corresponding model with the identity link does not, then we will report only an OR.</w:t>
+        <w:t xml:space="preserve">We will use a mixed-effects binomial regression model to estimate the effect of ATLS® on mortality. The OR will be estimated using the logit link, and the ARD will be estimated using the identity link. The primary analysis will be based on the most complex model that converges from a prespecified sequence of models of decreasing complexity, and this model will then be subject to sensitivity analyses. The analysis will proceed from the most complex model to progressively simpler models if there are convergence or numerical stability issues. If the binomial model with the logit link converges but the corresponding model with the identity link does not, then we will report only an OR.</w:t>
       </w:r>
     </w:p>
     <w:p>
@@ -4486,7 +4547,7 @@
       <w:pPr>
         <w:pStyle w:val="FirstParagraph"/>
       </w:pPr>
-      <w:bookmarkStart w:id="80" w:name="eq-primary-model"/>
+      <w:bookmarkStart w:id="83" w:name="eq-primary-model"/>
       <m:oMathPara>
         <m:oMathParaPr>
           <m:jc m:val="center"/>
@@ -4673,7 +4734,7 @@
           </m:d>
         </m:oMath>
       </m:oMathPara>
-      <w:bookmarkEnd w:id="80"/>
+      <w:bookmarkEnd w:id="83"/>
     </w:p>
     <w:p>
       <w:pPr>
@@ -4712,7 +4773,7 @@
       <w:pPr>
         <w:pStyle w:val="FirstParagraph"/>
       </w:pPr>
-      <w:bookmarkStart w:id="81" w:name="eq-simplified-random-effects-model"/>
+      <w:bookmarkStart w:id="84" w:name="eq-simplified-random-effects-model"/>
       <m:oMathPara>
         <m:oMathParaPr>
           <m:jc m:val="center"/>
@@ -4875,7 +4936,7 @@
           </m:d>
         </m:oMath>
       </m:oMathPara>
-      <w:bookmarkEnd w:id="81"/>
+      <w:bookmarkEnd w:id="84"/>
     </w:p>
     <w:p>
       <w:pPr>
@@ -4914,7 +4975,7 @@
       <w:pPr>
         <w:pStyle w:val="FirstParagraph"/>
       </w:pPr>
-      <w:bookmarkStart w:id="82" w:name="eq-shared-period-model"/>
+      <w:bookmarkStart w:id="85" w:name="eq-shared-period-model"/>
       <m:oMathPara>
         <m:oMathParaPr>
           <m:jc m:val="center"/>
@@ -5098,7 +5159,7 @@
           </m:d>
         </m:oMath>
       </m:oMathPara>
-      <w:bookmarkEnd w:id="82"/>
+      <w:bookmarkEnd w:id="85"/>
     </w:p>
     <w:p>
       <w:pPr>
@@ -5137,7 +5198,7 @@
       <w:pPr>
         <w:pStyle w:val="FirstParagraph"/>
       </w:pPr>
-      <w:bookmarkStart w:id="83" w:name="eq-combined-simplified-model"/>
+      <w:bookmarkStart w:id="86" w:name="eq-combined-simplified-model"/>
       <m:oMathPara>
         <m:oMathParaPr>
           <m:jc m:val="center"/>
@@ -5297,7 +5358,7 @@
           </m:d>
         </m:oMath>
       </m:oMathPara>
-      <w:bookmarkEnd w:id="83"/>
+      <w:bookmarkEnd w:id="86"/>
     </w:p>
     <w:p>
       <w:pPr>
@@ -6138,7 +6199,7 @@
       <w:pPr>
         <w:pStyle w:val="BodyText"/>
       </w:pPr>
-      <w:bookmarkStart w:id="84" w:name="eq-distributional-assumptions"/>
+      <w:bookmarkStart w:id="87" w:name="eq-distributional-assumptions"/>
       <m:oMathPara>
         <m:oMathParaPr>
           <m:jc m:val="center"/>
@@ -6414,7 +6475,7 @@
           </m:d>
         </m:oMath>
       </m:oMathPara>
-      <w:bookmarkEnd w:id="84"/>
+      <w:bookmarkEnd w:id="87"/>
     </w:p>
     <w:p>
       <w:pPr>
@@ -6441,7 +6502,7 @@
         <w:t xml:space="preserve">All models will be fitted using residual pseudo-likelihood estimation based on linearisation with subject-specific expansion (RSPL), due to its computational stability and robust performance in small-sample settings. If the binomial model with the logit link converges but the corresponding model with the identity link does not, then we will report only an OR.</w:t>
       </w:r>
     </w:p>
-    <w:bookmarkStart w:id="97" w:name="sensitivity-analyses"/>
+    <w:bookmarkStart w:id="100" w:name="sensitivity-analyses"/>
     <w:p>
       <w:pPr>
         <w:pStyle w:val="Heading3"/>
@@ -6469,7 +6530,7 @@
         <w:t xml:space="preserve">. Unless otherwise stated, each sensitivity analysis will be operationalised using two separate models, one with the logit link and one with the identity link.</w:t>
       </w:r>
     </w:p>
-    <w:bookmarkStart w:id="86" w:name="X22dda602ebb4652e0fd291705062d91648ada05"/>
+    <w:bookmarkStart w:id="89" w:name="X22dda602ebb4652e0fd291705062d91648ada05"/>
     <w:p>
       <w:pPr>
         <w:pStyle w:val="Heading4"/>
@@ -6512,7 +6573,7 @@
       <w:pPr>
         <w:pStyle w:val="BodyText"/>
       </w:pPr>
-      <w:bookmarkStart w:id="85" w:name="eq-ar1"/>
+      <w:bookmarkStart w:id="88" w:name="eq-ar1"/>
       <m:oMathPara>
         <m:oMathParaPr>
           <m:jc m:val="center"/>
@@ -6690,7 +6751,7 @@
           </m:d>
         </m:oMath>
       </m:oMathPara>
-      <w:bookmarkEnd w:id="85"/>
+      <w:bookmarkEnd w:id="88"/>
     </w:p>
     <w:p>
       <w:pPr>
@@ -6851,8 +6912,8 @@
         <w:t xml:space="preserve">is not directly equivalent to parameters used in other specifications and should not be interpreted interchangeably.</w:t>
       </w:r>
     </w:p>
-    <w:bookmarkEnd w:id="86"/>
-    <w:bookmarkStart w:id="88" w:name="X265de50a776706f6d9ec7b4549b866a94e548a1"/>
+    <w:bookmarkEnd w:id="89"/>
+    <w:bookmarkStart w:id="91" w:name="X265de50a776706f6d9ec7b4549b866a94e548a1"/>
     <w:p>
       <w:pPr>
         <w:pStyle w:val="Heading4"/>
@@ -6887,7 +6948,7 @@
       <w:pPr>
         <w:pStyle w:val="BodyText"/>
       </w:pPr>
-      <w:bookmarkStart w:id="87" w:name="eq-model-batch-trend"/>
+      <w:bookmarkStart w:id="90" w:name="eq-model-batch-trend"/>
       <m:oMathPara>
         <m:oMathParaPr>
           <m:jc m:val="center"/>
@@ -7095,7 +7156,7 @@
           </m:d>
         </m:oMath>
       </m:oMathPara>
-      <w:bookmarkEnd w:id="87"/>
+      <w:bookmarkEnd w:id="90"/>
     </w:p>
     <w:p>
       <w:pPr>
@@ -7156,8 +7217,8 @@
         <w:t xml:space="preserve">, capturing between-batch variation in secular trends over time.</w:t>
       </w:r>
     </w:p>
-    <w:bookmarkEnd w:id="88"/>
-    <w:bookmarkStart w:id="90" w:name="X831bc7e780a434f5c3512e5d33d43284b7d37ce"/>
+    <w:bookmarkEnd w:id="91"/>
+    <w:bookmarkStart w:id="93" w:name="X831bc7e780a434f5c3512e5d33d43284b7d37ce"/>
     <w:p>
       <w:pPr>
         <w:pStyle w:val="Heading4"/>
@@ -7192,7 +7253,7 @@
       <w:pPr>
         <w:pStyle w:val="BodyText"/>
       </w:pPr>
-      <w:bookmarkStart w:id="89" w:name="eq-model-random-cluster-intervention"/>
+      <w:bookmarkStart w:id="92" w:name="eq-model-random-cluster-intervention"/>
       <m:oMathPara>
         <m:oMathParaPr>
           <m:jc m:val="center"/>
@@ -7418,7 +7479,7 @@
           </m:d>
         </m:oMath>
       </m:oMathPara>
-      <w:bookmarkEnd w:id="89"/>
+      <w:bookmarkEnd w:id="92"/>
     </w:p>
     <w:p>
       <w:pPr>
@@ -7593,8 +7654,8 @@
         <w:t xml:space="preserve">.</w:t>
       </w:r>
     </w:p>
-    <w:bookmarkEnd w:id="90"/>
-    <w:bookmarkStart w:id="92" w:name="X0324ad02af1274e3e5fe3c1dbe99d3dad84fc47"/>
+    <w:bookmarkEnd w:id="93"/>
+    <w:bookmarkStart w:id="95" w:name="X0324ad02af1274e3e5fe3c1dbe99d3dad84fc47"/>
     <w:p>
       <w:pPr>
         <w:pStyle w:val="Heading4"/>
@@ -7707,7 +7768,7 @@
       <w:pPr>
         <w:pStyle w:val="BodyText"/>
       </w:pPr>
-      <w:bookmarkStart w:id="91" w:name="eq-model-correlated-random-effects"/>
+      <w:bookmarkStart w:id="94" w:name="eq-model-correlated-random-effects"/>
       <m:oMathPara>
         <m:oMathParaPr>
           <m:jc m:val="center"/>
@@ -7933,7 +7994,7 @@
           </m:d>
         </m:oMath>
       </m:oMathPara>
-      <w:bookmarkEnd w:id="91"/>
+      <w:bookmarkEnd w:id="94"/>
     </w:p>
     <w:p>
       <w:pPr>
@@ -8323,8 +8384,8 @@
         </m:oMath>
       </m:oMathPara>
     </w:p>
-    <w:bookmarkEnd w:id="92"/>
-    <w:bookmarkStart w:id="94" w:name="Xb7b1d3ff7c24f0b8dca2081a41dd1947ef59e07"/>
+    <w:bookmarkEnd w:id="95"/>
+    <w:bookmarkStart w:id="97" w:name="Xb7b1d3ff7c24f0b8dca2081a41dd1947ef59e07"/>
     <w:p>
       <w:pPr>
         <w:pStyle w:val="Heading4"/>
@@ -8368,7 +8429,7 @@
       <w:pPr>
         <w:pStyle w:val="BodyText"/>
       </w:pPr>
-      <w:bookmarkStart w:id="93" w:name="eq-spline-model"/>
+      <w:bookmarkStart w:id="96" w:name="eq-spline-model"/>
       <m:oMathPara>
         <m:oMathParaPr>
           <m:jc m:val="center"/>
@@ -8645,7 +8706,7 @@
           </m:d>
         </m:oMath>
       </m:oMathPara>
-      <w:bookmarkEnd w:id="93"/>
+      <w:bookmarkEnd w:id="96"/>
     </w:p>
     <w:p>
       <w:pPr>
@@ -8807,8 +8868,8 @@
         <w:t xml:space="preserve">th spline basis function.</w:t>
       </w:r>
     </w:p>
-    <w:bookmarkEnd w:id="94"/>
-    <w:bookmarkStart w:id="96" w:name="models-exploring-lag-and-weaning-effects"/>
+    <w:bookmarkEnd w:id="97"/>
+    <w:bookmarkStart w:id="99" w:name="models-exploring-lag-and-weaning-effects"/>
     <w:p>
       <w:pPr>
         <w:pStyle w:val="Heading4"/>
@@ -8843,7 +8904,7 @@
       <w:pPr>
         <w:pStyle w:val="BodyText"/>
       </w:pPr>
-      <w:bookmarkStart w:id="95" w:name="eq-lag-weaning-model"/>
+      <w:bookmarkStart w:id="98" w:name="eq-lag-weaning-model"/>
       <m:oMathPara>
         <m:oMathParaPr>
           <m:jc m:val="center"/>
@@ -9094,7 +9155,7 @@
           </m:d>
         </m:oMath>
       </m:oMathPara>
-      <w:bookmarkEnd w:id="95"/>
+      <w:bookmarkEnd w:id="98"/>
     </w:p>
     <w:p>
       <w:pPr>
@@ -9160,9 +9221,9 @@
         <w:t xml:space="preserve">is the number of periods since first exposure.</w:t>
       </w:r>
     </w:p>
-    <w:bookmarkEnd w:id="96"/>
-    <w:bookmarkEnd w:id="97"/>
-    <w:bookmarkStart w:id="98" w:name="adjusted-analyses"/>
+    <w:bookmarkEnd w:id="99"/>
+    <w:bookmarkEnd w:id="100"/>
+    <w:bookmarkStart w:id="101" w:name="adjusted-analyses"/>
     <w:p>
       <w:pPr>
         <w:pStyle w:val="Heading3"/>
@@ -9282,8 +9343,8 @@
         <w:t xml:space="preserve">as fixed effects. We will model the continuous covariates assuming linear effects. We will assume no interaction between subgroups and secular time trends, which may be evaluated in future analyses if indicated.</w:t>
       </w:r>
     </w:p>
-    <w:bookmarkEnd w:id="98"/>
-    <w:bookmarkStart w:id="99" w:name="subgroup-analyses"/>
+    <w:bookmarkEnd w:id="101"/>
+    <w:bookmarkStart w:id="102" w:name="subgroup-analyses"/>
     <w:p>
       <w:pPr>
         <w:pStyle w:val="Heading3"/>
@@ -9309,7 +9370,7 @@
         </w:numPr>
       </w:pPr>
       <w:r>
-        <w:t xml:space="preserve">geographical region, defined using the state in which the participating hospital is located. Demonstrating the consistency of any effect across multiple regions will enhance the generalisibility of the results;</w:t>
+        <w:t xml:space="preserve">geographical region, defined using the state in which the participating hospital is located;</w:t>
       </w:r>
     </w:p>
     <w:p>
@@ -9321,16 +9382,13 @@
         </w:numPr>
       </w:pPr>
       <w:r>
-        <w:t xml:space="preserve">age groups, defined as older adolescents (15-19 years), young adults (20-24 years), adults (25-59 years), and older adults (60 years and older) [</w:t>
+        <w:t xml:space="preserve">age groups, defined as older adolescents (15-19 years), young adults (20-24 years), adults (25-59 years), and older adults (60 years and older)</w:t>
       </w:r>
       <w:r>
         <w:rPr>
           <w:vertAlign w:val="superscript"/>
         </w:rPr>
         <w:t xml:space="preserve">18</w:t>
-      </w:r>
-      <w:r>
-        <w:t xml:space="preserve">;</w:t>
       </w:r>
     </w:p>
     <w:p>
@@ -9354,7 +9412,28 @@
         </w:numPr>
       </w:pPr>
       <w:r>
-        <w:t xml:space="preserve">clinical cohorts, defined as blunt multisystem trauma, penetrating trauma, and severe isolated traumatic brain injury, with modification to avoid overlap between the cohorts; and</w:t>
+        <w:t xml:space="preserve">clinical cohorts, defined as blunt multisystem trauma, penetrating trauma, and severe isolated traumatic brain injury, with modification to avoid overlap between the cohorts</w:t>
+      </w:r>
+      <w:r>
+        <w:rPr>
+          <w:vertAlign w:val="superscript"/>
+        </w:rPr>
+        <w:t xml:space="preserve">19</w:t>
+      </w:r>
+      <w:r>
+        <w:t xml:space="preserve">;</w:t>
+      </w:r>
+    </w:p>
+    <w:p>
+      <w:pPr>
+        <w:pStyle w:val="Compact"/>
+        <w:numPr>
+          <w:ilvl w:val="0"/>
+          <w:numId w:val="1015"/>
+        </w:numPr>
+      </w:pPr>
+      <w:r>
+        <w:t xml:space="preserve">patients with major trauma, defined as patients with an injury severity score (ISS) of 16 or higher;</w:t>
       </w:r>
     </w:p>
     <w:p>
@@ -9391,8 +9470,8 @@
         <w:t xml:space="preserve">.</w:t>
       </w:r>
     </w:p>
-    <w:bookmarkEnd w:id="99"/>
-    <w:bookmarkStart w:id="100" w:name="treatment-of-missing-data"/>
+    <w:bookmarkEnd w:id="102"/>
+    <w:bookmarkStart w:id="103" w:name="treatment-of-missing-data"/>
     <w:p>
       <w:pPr>
         <w:pStyle w:val="Heading3"/>
@@ -9409,9 +9488,9 @@
         <w:t xml:space="preserve">We will present the frequency and percentage of missing data for all variables. If the percentage of missing data for the primary outcome is less than 10%, we will perform a complete case analysis. If the percentage of missing data for the primary outcome is 10% or more, we will handle missing data depending on the missing data mechanism. If the data are missing at random (MAR), we will perform multiple imputation using multiple imputation by chained equations (MICE), imputing data for the primary outcome as well as all covariates included in the fully adjusted model. The number of imputations will be determined by the percentage of missing data, with a minimum of 20 imputations. If there is evidence that the data are missing not at random (MNAR), we will explore the impact of this assumption using a sensitivity analysis (e.g., pattern mixture models or selection models) to assess how robust our findings are to different assumptions about the missing data mechanism. Evidence that data are MNAR may include systematic differences in missingness across observed covariates, patterns suggestive of non-random dropout, or clinical expectations that missingness is related to unmeasured outcomes. Additionally, we will perform diagnostic checks after multiple imputation to ensure the quality of the imputation process, including comparing distributions of observed and imputed data and checking convergence.</w:t>
       </w:r>
     </w:p>
-    <w:bookmarkEnd w:id="100"/>
-    <w:bookmarkEnd w:id="101"/>
-    <w:bookmarkStart w:id="115" w:name="analysis-of-secondary-outcomes"/>
+    <w:bookmarkEnd w:id="103"/>
+    <w:bookmarkEnd w:id="104"/>
+    <w:bookmarkStart w:id="118" w:name="analysis-of-secondary-outcomes"/>
     <w:p>
       <w:pPr>
         <w:pStyle w:val="Heading2"/>
@@ -9428,7 +9507,7 @@
         <w:t xml:space="preserve">Unless otherwise stated, secondary outcomes will be analysed using the same mixed-effects modelling framework as specified for the primary outcome, including fixed effects for time and intervention exposure and random effects for cluster and cluster-by-period, with the link function and outcome distribution adapted to the scale of the outcome.</w:t>
       </w:r>
     </w:p>
-    <w:bookmarkStart w:id="102" w:name="Xf8ad26412ad98b449304d4475d81963b294c2ae"/>
+    <w:bookmarkStart w:id="105" w:name="Xf8ad26412ad98b449304d4475d81963b294c2ae"/>
     <w:p>
       <w:pPr>
         <w:pStyle w:val="Heading3"/>
@@ -9459,8 +9538,8 @@
         <w:t xml:space="preserve">, to estimate odds ratios and absolute risk differences.</w:t>
       </w:r>
     </w:p>
-    <w:bookmarkEnd w:id="102"/>
-    <w:bookmarkStart w:id="105" w:name="X89c97a0c38ba473d58b2facce729a073a7e8df9"/>
+    <w:bookmarkEnd w:id="105"/>
+    <w:bookmarkStart w:id="108" w:name="X89c97a0c38ba473d58b2facce729a073a7e8df9"/>
     <w:p>
       <w:pPr>
         <w:pStyle w:val="Heading3"/>
@@ -9489,7 +9568,7 @@
       <w:pPr>
         <w:pStyle w:val="BodyText"/>
       </w:pPr>
-      <w:bookmarkStart w:id="103" w:name="eq-ordinal-model"/>
+      <w:bookmarkStart w:id="106" w:name="eq-ordinal-model"/>
       <m:oMathPara>
         <m:oMathParaPr>
           <m:jc m:val="center"/>
@@ -9689,7 +9768,7 @@
           </m:d>
         </m:oMath>
       </m:oMathPara>
-      <w:bookmarkEnd w:id="103"/>
+      <w:bookmarkEnd w:id="106"/>
     </w:p>
     <w:p>
       <w:pPr>
@@ -9745,7 +9824,7 @@
       <w:pPr>
         <w:pStyle w:val="BodyText"/>
       </w:pPr>
-      <w:bookmarkStart w:id="104" w:name="eq-linear-model"/>
+      <w:bookmarkStart w:id="107" w:name="eq-linear-model"/>
       <m:oMathPara>
         <m:oMathParaPr>
           <m:jc m:val="center"/>
@@ -9997,10 +10076,10 @@
           </m:d>
         </m:oMath>
       </m:oMathPara>
-      <w:bookmarkEnd w:id="104"/>
-    </w:p>
-    <w:bookmarkEnd w:id="105"/>
-    <w:bookmarkStart w:id="106" w:name="X90cb4e0ebfb4fe618dcdd24cc99dbcaedd01b78"/>
+      <w:bookmarkEnd w:id="107"/>
+    </w:p>
+    <w:bookmarkEnd w:id="108"/>
+    <w:bookmarkStart w:id="109" w:name="X90cb4e0ebfb4fe618dcdd24cc99dbcaedd01b78"/>
     <w:p>
       <w:pPr>
         <w:pStyle w:val="Heading3"/>
@@ -10020,7 +10099,7 @@
         <w:rPr>
           <w:vertAlign w:val="superscript"/>
         </w:rPr>
-        <w:t xml:space="preserve">19</w:t>
+        <w:t xml:space="preserve">20</w:t>
       </w:r>
       <w:r>
         <w:t xml:space="preserve">. This tool assesses six domains of functioning: cognition, mobility, self-care, getting along, life activities, and participation. Each domain is rated on a likert scale from 1 to 5, with 1 indicating no difficulties and 5 indicating extreme difficulties. We will analyse each domain separately using a mixed effects ordinal model as specified in</w:t>
@@ -10066,8 +10145,8 @@
         <w:t xml:space="preserve">.</w:t>
       </w:r>
     </w:p>
-    <w:bookmarkEnd w:id="106"/>
-    <w:bookmarkStart w:id="107" w:name="X0c0155e4b87aec11ab06b9d09220f8543002113"/>
+    <w:bookmarkEnd w:id="109"/>
+    <w:bookmarkStart w:id="110" w:name="X0c0155e4b87aec11ab06b9d09220f8543002113"/>
     <w:p>
       <w:pPr>
         <w:pStyle w:val="Heading3"/>
@@ -10101,8 +10180,8 @@
         <w:t xml:space="preserve">with the logit link.</w:t>
       </w:r>
     </w:p>
-    <w:bookmarkEnd w:id="107"/>
-    <w:bookmarkStart w:id="109" w:name="length-of-emergency-department-stay"/>
+    <w:bookmarkEnd w:id="110"/>
+    <w:bookmarkStart w:id="112" w:name="length-of-emergency-department-stay"/>
     <w:p>
       <w:pPr>
         <w:pStyle w:val="Heading3"/>
@@ -10137,7 +10216,7 @@
       <w:pPr>
         <w:pStyle w:val="BodyText"/>
       </w:pPr>
-      <w:bookmarkStart w:id="108" w:name="eq-competing-risks-model"/>
+      <w:bookmarkStart w:id="111" w:name="eq-competing-risks-model"/>
       <m:oMathPara>
         <m:oMathParaPr>
           <m:jc m:val="center"/>
@@ -10331,7 +10410,7 @@
           </m:d>
         </m:oMath>
       </m:oMathPara>
-      <w:bookmarkEnd w:id="108"/>
+      <w:bookmarkEnd w:id="111"/>
     </w:p>
     <w:p>
       <w:pPr>
@@ -10520,8 +10599,8 @@
         <w:t xml:space="preserve">All other terms are defined as in the primary analysis model.</w:t>
       </w:r>
     </w:p>
-    <w:bookmarkEnd w:id="109"/>
-    <w:bookmarkStart w:id="110" w:name="length-of-hospital-stay"/>
+    <w:bookmarkEnd w:id="112"/>
+    <w:bookmarkStart w:id="113" w:name="length-of-hospital-stay"/>
     <w:p>
       <w:pPr>
         <w:pStyle w:val="Heading3"/>
@@ -10552,8 +10631,8 @@
         <w:t xml:space="preserve">.</w:t>
       </w:r>
     </w:p>
-    <w:bookmarkEnd w:id="110"/>
-    <w:bookmarkStart w:id="111" w:name="intensive-care-unit-admission"/>
+    <w:bookmarkEnd w:id="113"/>
+    <w:bookmarkStart w:id="114" w:name="intensive-care-unit-admission"/>
     <w:p>
       <w:pPr>
         <w:pStyle w:val="Heading3"/>
@@ -10587,8 +10666,8 @@
         <w:t xml:space="preserve">with the logit link.</w:t>
       </w:r>
     </w:p>
-    <w:bookmarkEnd w:id="111"/>
-    <w:bookmarkStart w:id="112" w:name="length-of-intensive-care-unit-stay"/>
+    <w:bookmarkEnd w:id="114"/>
+    <w:bookmarkStart w:id="115" w:name="length-of-intensive-care-unit-stay"/>
     <w:p>
       <w:pPr>
         <w:pStyle w:val="Heading3"/>
@@ -10619,8 +10698,8 @@
         <w:t xml:space="preserve">.</w:t>
       </w:r>
     </w:p>
-    <w:bookmarkEnd w:id="112"/>
-    <w:bookmarkStart w:id="114" w:name="X5037a1d47abaf80439915bb3ba5c524d444c7d7"/>
+    <w:bookmarkEnd w:id="115"/>
+    <w:bookmarkStart w:id="117" w:name="X5037a1d47abaf80439915bb3ba5c524d444c7d7"/>
     <w:p>
       <w:pPr>
         <w:pStyle w:val="Heading3"/>
@@ -10661,7 +10740,7 @@
       <w:pPr>
         <w:pStyle w:val="BodyText"/>
       </w:pPr>
-      <w:bookmarkStart w:id="113" w:name="eq-beta-model"/>
+      <w:bookmarkStart w:id="116" w:name="eq-beta-model"/>
       <m:oMathPara>
         <m:oMathParaPr>
           <m:jc m:val="center"/>
@@ -10840,7 +10919,7 @@
           </m:d>
         </m:oMath>
       </m:oMathPara>
-      <w:bookmarkEnd w:id="113"/>
+      <w:bookmarkEnd w:id="116"/>
     </w:p>
     <w:p>
       <w:pPr>
@@ -10946,10 +11025,10 @@
         <w:t xml:space="preserve">prior to fitting the beta regression model. A beta regression precision (dispersion) parameter will be estimated as part of the model.</w:t>
       </w:r>
     </w:p>
-    <w:bookmarkEnd w:id="114"/>
-    <w:bookmarkEnd w:id="115"/>
-    <w:bookmarkEnd w:id="116"/>
-    <w:bookmarkStart w:id="137" w:name="references"/>
+    <w:bookmarkEnd w:id="117"/>
+    <w:bookmarkEnd w:id="118"/>
+    <w:bookmarkEnd w:id="119"/>
+    <w:bookmarkStart w:id="141" w:name="references"/>
     <w:p>
       <w:pPr>
         <w:pStyle w:val="Heading1"/>
@@ -10958,8 +11037,8 @@
         <w:t xml:space="preserve">6. References</w:t>
       </w:r>
     </w:p>
-    <w:bookmarkStart w:id="136" w:name="refs"/>
-    <w:bookmarkStart w:id="117" w:name="ref-Kasza2022"/>
+    <w:bookmarkStart w:id="140" w:name="refs"/>
+    <w:bookmarkStart w:id="120" w:name="ref-Kasza2022"/>
     <w:p>
       <w:pPr>
         <w:pStyle w:val="Bibliography"/>
@@ -11013,8 +11092,8 @@
         <w:t xml:space="preserve">, 3627–3641 (2022).</w:t>
       </w:r>
     </w:p>
-    <w:bookmarkEnd w:id="117"/>
-    <w:bookmarkStart w:id="118" w:name="ref-grantham_staircase_2024"/>
+    <w:bookmarkEnd w:id="120"/>
+    <w:bookmarkStart w:id="121" w:name="ref-grantham_staircase_2024"/>
     <w:p>
       <w:pPr>
         <w:pStyle w:val="Bibliography"/>
@@ -11080,8 +11159,8 @@
         <w:t xml:space="preserve">, 24–41 (2024).</w:t>
       </w:r>
     </w:p>
-    <w:bookmarkEnd w:id="118"/>
-    <w:bookmarkStart w:id="119" w:name="ref-aukstakalnis_impact_2024"/>
+    <w:bookmarkEnd w:id="121"/>
+    <w:bookmarkStart w:id="122" w:name="ref-aukstakalnis_impact_2024"/>
     <w:p>
       <w:pPr>
         <w:pStyle w:val="Bibliography"/>
@@ -11128,8 +11207,8 @@
         <w:t xml:space="preserve">(2024).</w:t>
       </w:r>
     </w:p>
-    <w:bookmarkEnd w:id="119"/>
-    <w:bookmarkStart w:id="120" w:name="ref-Hemming2020Feb"/>
+    <w:bookmarkEnd w:id="122"/>
+    <w:bookmarkStart w:id="123" w:name="ref-Hemming2020Feb"/>
     <w:p>
       <w:pPr>
         <w:pStyle w:val="Bibliography"/>
@@ -11183,8 +11262,8 @@
         <w:t xml:space="preserve">, 979–995 (2020).</w:t>
       </w:r>
     </w:p>
-    <w:bookmarkEnd w:id="120"/>
-    <w:bookmarkStart w:id="121" w:name="ref-nakhid_effect_2026"/>
+    <w:bookmarkEnd w:id="123"/>
+    <w:bookmarkStart w:id="124" w:name="ref-nakhid_effect_2026"/>
     <w:p>
       <w:pPr>
         <w:pStyle w:val="Bibliography"/>
@@ -11231,8 +11310,8 @@
         <w:t xml:space="preserve">(2026).</w:t>
       </w:r>
     </w:p>
-    <w:bookmarkEnd w:id="121"/>
-    <w:bookmarkStart w:id="122" w:name="ref-gerdin_warnberg_feasibility_2025"/>
+    <w:bookmarkEnd w:id="124"/>
+    <w:bookmarkStart w:id="125" w:name="ref-gerdin_warnberg_feasibility_2025"/>
     <w:p>
       <w:pPr>
         <w:pStyle w:val="Bibliography"/>
@@ -11295,8 +11374,8 @@
         <w:t xml:space="preserve">, e099020 (2025).</w:t>
       </w:r>
     </w:p>
-    <w:bookmarkEnd w:id="122"/>
-    <w:bookmarkStart w:id="123" w:name="ref-Campbell2005"/>
+    <w:bookmarkEnd w:id="125"/>
+    <w:bookmarkStart w:id="126" w:name="ref-Campbell2005"/>
     <w:p>
       <w:pPr>
         <w:pStyle w:val="Bibliography"/>
@@ -11350,8 +11429,8 @@
         <w:t xml:space="preserve">, 99–107 (2005).</w:t>
       </w:r>
     </w:p>
-    <w:bookmarkEnd w:id="123"/>
-    <w:bookmarkStart w:id="124" w:name="ref-Eldridge2015"/>
+    <w:bookmarkEnd w:id="126"/>
+    <w:bookmarkStart w:id="127" w:name="ref-Eldridge2015"/>
     <w:p>
       <w:pPr>
         <w:pStyle w:val="Bibliography"/>
@@ -11405,8 +11484,8 @@
         <w:t xml:space="preserve">, 1039–1056 (2015).</w:t>
       </w:r>
     </w:p>
-    <w:bookmarkEnd w:id="124"/>
-    <w:bookmarkStart w:id="125" w:name="ref-Martin2016"/>
+    <w:bookmarkEnd w:id="127"/>
+    <w:bookmarkStart w:id="128" w:name="ref-Martin2016"/>
     <w:p>
       <w:pPr>
         <w:pStyle w:val="Bibliography"/>
@@ -11460,8 +11539,8 @@
         <w:t xml:space="preserve">, (2016).</w:t>
       </w:r>
     </w:p>
-    <w:bookmarkEnd w:id="125"/>
-    <w:bookmarkStart w:id="126" w:name="ref-Korevaar2021"/>
+    <w:bookmarkEnd w:id="128"/>
+    <w:bookmarkStart w:id="129" w:name="ref-Korevaar2021"/>
     <w:p>
       <w:pPr>
         <w:pStyle w:val="Bibliography"/>
@@ -11515,8 +11594,8 @@
         <w:t xml:space="preserve">, 529–540 (2021).</w:t>
       </w:r>
     </w:p>
-    <w:bookmarkEnd w:id="126"/>
-    <w:bookmarkStart w:id="127" w:name="ref-lashoher_implementation_2017"/>
+    <w:bookmarkEnd w:id="129"/>
+    <w:bookmarkStart w:id="130" w:name="ref-lashoher_implementation_2017"/>
     <w:p>
       <w:pPr>
         <w:pStyle w:val="Bibliography"/>
@@ -11684,8 +11763,8 @@
         <w:t xml:space="preserve">, 954–962 (2017).</w:t>
       </w:r>
     </w:p>
-    <w:bookmarkEnd w:id="127"/>
-    <w:bookmarkStart w:id="128" w:name="ref-kapitan_effect_2024"/>
+    <w:bookmarkEnd w:id="130"/>
+    <w:bookmarkStart w:id="131" w:name="ref-kapitan_effect_2024"/>
     <w:p>
       <w:pPr>
         <w:pStyle w:val="Bibliography"/>
@@ -11741,8 +11820,8 @@
         <w:t xml:space="preserve">2024.09.28.24314529 (2024).</w:t>
       </w:r>
     </w:p>
-    <w:bookmarkEnd w:id="128"/>
-    <w:bookmarkStart w:id="129" w:name="ref-higgins_psychometric_2021"/>
+    <w:bookmarkEnd w:id="131"/>
+    <w:bookmarkStart w:id="132" w:name="ref-higgins_psychometric_2021"/>
     <w:p>
       <w:pPr>
         <w:pStyle w:val="Bibliography"/>
@@ -11808,8 +11887,8 @@
         <w:t xml:space="preserve">, 103–112 (2021).</w:t>
       </w:r>
     </w:p>
-    <w:bookmarkEnd w:id="129"/>
-    <w:bookmarkStart w:id="130" w:name="ref-R"/>
+    <w:bookmarkEnd w:id="132"/>
+    <w:bookmarkStart w:id="133" w:name="ref-R"/>
     <w:p>
       <w:pPr>
         <w:pStyle w:val="Bibliography"/>
@@ -11840,8 +11919,8 @@
         <w:t xml:space="preserve">. (R Foundation for Statistical Computing, 2023).</w:t>
       </w:r>
     </w:p>
-    <w:bookmarkEnd w:id="130"/>
-    <w:bookmarkStart w:id="131" w:name="ref-Hemming2018"/>
+    <w:bookmarkEnd w:id="133"/>
+    <w:bookmarkStart w:id="134" w:name="ref-Hemming2018"/>
     <w:p>
       <w:pPr>
         <w:pStyle w:val="Bibliography"/>
@@ -11888,8 +11967,8 @@
         <w:t xml:space="preserve">k1614 (2018).</w:t>
       </w:r>
     </w:p>
-    <w:bookmarkEnd w:id="131"/>
-    <w:bookmarkStart w:id="132" w:name="ref-grantham_evaluating_2022"/>
+    <w:bookmarkEnd w:id="134"/>
+    <w:bookmarkStart w:id="135" w:name="ref-grantham_evaluating_2022"/>
     <w:p>
       <w:pPr>
         <w:pStyle w:val="Bibliography"/>
@@ -11955,8 +12034,8 @@
         <w:t xml:space="preserve">, 112 (2022).</w:t>
       </w:r>
     </w:p>
-    <w:bookmarkEnd w:id="132"/>
-    <w:bookmarkStart w:id="133" w:name="ref-kenny_analysis_2022"/>
+    <w:bookmarkEnd w:id="135"/>
+    <w:bookmarkStart w:id="136" w:name="ref-kenny_analysis_2022"/>
     <w:p>
       <w:pPr>
         <w:pStyle w:val="Bibliography"/>
@@ -12003,8 +12082,8 @@
         <w:t xml:space="preserve">10.1002/sim.9511 (2022).</w:t>
       </w:r>
     </w:p>
-    <w:bookmarkEnd w:id="133"/>
-    <w:bookmarkStart w:id="134" w:name="ref-Diaz2021"/>
+    <w:bookmarkEnd w:id="136"/>
+    <w:bookmarkStart w:id="137" w:name="ref-Diaz2021"/>
     <w:p>
       <w:pPr>
         <w:pStyle w:val="Bibliography"/>
@@ -12058,8 +12137,8 @@
         <w:t xml:space="preserve">, e436–e443 (2021).</w:t>
       </w:r>
     </w:p>
-    <w:bookmarkEnd w:id="134"/>
-    <w:bookmarkStart w:id="135" w:name="ref-ustun_measuring_2010"/>
+    <w:bookmarkEnd w:id="137"/>
+    <w:bookmarkStart w:id="138" w:name="ref-hornor_quality_2018"/>
     <w:p>
       <w:pPr>
         <w:pStyle w:val="Bibliography"/>
@@ -12074,7 +12153,7 @@
         <w:t xml:space="preserve">	</w:t>
       </w:r>
       <w:r>
-        <w:t xml:space="preserve">Ustun, T. B.</w:t>
+        <w:t xml:space="preserve">Hornor, M. A.</w:t>
       </w:r>
       <w:r>
         <w:t xml:space="preserve"> </w:t>
@@ -12087,6 +12166,103 @@
         <w:t xml:space="preserve">et al.</w:t>
       </w:r>
       <w:r>
+        <w:t xml:space="preserve"> Quality</w:t>
+      </w:r>
+      <w:r>
+        <w:t xml:space="preserve"> </w:t>
+      </w:r>
+      <w:r>
+        <w:t xml:space="preserve">Benchmarking</w:t>
+      </w:r>
+      <w:r>
+        <w:t xml:space="preserve"> </w:t>
+      </w:r>
+      <w:r>
+        <w:t xml:space="preserve">in</w:t>
+      </w:r>
+      <w:r>
+        <w:t xml:space="preserve"> </w:t>
+      </w:r>
+      <w:r>
+        <w:t xml:space="preserve">Trauma</w:t>
+      </w:r>
+      <w:r>
+        <w:t xml:space="preserve">: From the</w:t>
+      </w:r>
+      <w:r>
+        <w:t xml:space="preserve"> </w:t>
+      </w:r>
+      <w:r>
+        <w:t xml:space="preserve">NTDB</w:t>
+      </w:r>
+      <w:r>
+        <w:t xml:space="preserve"> </w:t>
+      </w:r>
+      <w:r>
+        <w:t xml:space="preserve">to</w:t>
+      </w:r>
+      <w:r>
+        <w:t xml:space="preserve"> </w:t>
+      </w:r>
+      <w:r>
+        <w:t xml:space="preserve">TQIP</w:t>
+      </w:r>
+      <w:r>
+        <w:t xml:space="preserve">.</w:t>
+      </w:r>
+      <w:r>
+        <w:t xml:space="preserve"> </w:t>
+      </w:r>
+      <w:r>
+        <w:rPr>
+          <w:i/>
+          <w:iCs/>
+        </w:rPr>
+        <w:t xml:space="preserve">Current Trauma Reports</w:t>
+      </w:r>
+      <w:r>
+        <w:t xml:space="preserve"> </w:t>
+      </w:r>
+      <w:r>
+        <w:rPr>
+          <w:b/>
+          <w:bCs/>
+        </w:rPr>
+        <w:t xml:space="preserve">4</w:t>
+      </w:r>
+      <w:r>
+        <w:t xml:space="preserve">, 160–169 (2018).</w:t>
+      </w:r>
+    </w:p>
+    <w:bookmarkEnd w:id="138"/>
+    <w:bookmarkStart w:id="139" w:name="ref-ustun_measuring_2010"/>
+    <w:p>
+      <w:pPr>
+        <w:pStyle w:val="Bibliography"/>
+      </w:pPr>
+      <w:r>
+        <w:t xml:space="preserve">20.</w:t>
+      </w:r>
+      <w:r>
+        <w:t xml:space="preserve"> </w:t>
+      </w:r>
+      <w:r>
+        <w:t xml:space="preserve">	</w:t>
+      </w:r>
+      <w:r>
+        <w:t xml:space="preserve">Ustun, T. B.</w:t>
+      </w:r>
+      <w:r>
+        <w:t xml:space="preserve"> </w:t>
+      </w:r>
+      <w:r>
+        <w:rPr>
+          <w:i/>
+          <w:iCs/>
+        </w:rPr>
+        <w:t xml:space="preserve">et al.</w:t>
+      </w:r>
+      <w:r>
         <w:t xml:space="preserve"> </w:t>
       </w:r>
       <w:r>
@@ -12268,9 +12444,9 @@
         <w:t xml:space="preserve">. (World Health Organization, 2010).</w:t>
       </w:r>
     </w:p>
-    <w:bookmarkEnd w:id="135"/>
-    <w:bookmarkEnd w:id="136"/>
-    <w:bookmarkEnd w:id="137"/>
+    <w:bookmarkEnd w:id="139"/>
+    <w:bookmarkEnd w:id="140"/>
+    <w:bookmarkEnd w:id="141"/>
     <w:sectPr>
       <w:footnotePr>
         <w:numRestart w:val="eachSect"/>

</xml_diff>

<commit_message>
Update order of outcomes in summary tables
</commit_message>
<xml_diff>
--- a/statistical-analysis-plan/statistical-analysis-plan.docx
+++ b/statistical-analysis-plan/statistical-analysis-plan.docx
@@ -2047,7 +2047,301 @@
                     <w:jc w:val="center"/>
                   </w:pPr>
                   <w:r>
-                    <w:t xml:space="preserve">Quality of life within 7 days of discharge</w:t>
+                    <w:t xml:space="preserve">Length of emergency department stay</w:t>
+                  </w:r>
+                </w:p>
+              </w:tc>
+              <w:tc>
+                <w:tcPr/>
+                <w:p>
+                  <w:pPr>
+                    <w:pStyle w:val="Compact"/>
+                    <w:jc w:val="left"/>
+                    <w:jc w:val="center"/>
+                  </w:pPr>
+                  <w:r>
+                    <w:t xml:space="preserve">Main stepped-wedge</w:t>
+                  </w:r>
+                </w:p>
+              </w:tc>
+              <w:tc>
+                <w:tcPr/>
+                <w:p>
+                  <w:pPr>
+                    <w:pStyle w:val="Compact"/>
+                  </w:pPr>
+                </w:p>
+              </w:tc>
+              <w:tc>
+                <w:tcPr/>
+                <w:p>
+                  <w:pPr>
+                    <w:pStyle w:val="Compact"/>
+                  </w:pPr>
+                </w:p>
+              </w:tc>
+            </w:tr>
+            <w:tr>
+              <w:tc>
+                <w:tcPr/>
+                <w:p>
+                  <w:pPr>
+                    <w:pStyle w:val="Compact"/>
+                    <w:jc w:val="left"/>
+                    <w:jc w:val="center"/>
+                  </w:pPr>
+                  <w:r>
+                    <w:t xml:space="preserve">Length of hospital stay</w:t>
+                  </w:r>
+                </w:p>
+              </w:tc>
+              <w:tc>
+                <w:tcPr/>
+                <w:p>
+                  <w:pPr>
+                    <w:pStyle w:val="Compact"/>
+                    <w:jc w:val="left"/>
+                    <w:jc w:val="center"/>
+                  </w:pPr>
+                  <w:r>
+                    <w:t xml:space="preserve">Main stepped-wedge</w:t>
+                  </w:r>
+                </w:p>
+              </w:tc>
+              <w:tc>
+                <w:tcPr/>
+                <w:p>
+                  <w:pPr>
+                    <w:pStyle w:val="Compact"/>
+                  </w:pPr>
+                </w:p>
+              </w:tc>
+              <w:tc>
+                <w:tcPr/>
+                <w:p>
+                  <w:pPr>
+                    <w:pStyle w:val="Compact"/>
+                  </w:pPr>
+                </w:p>
+              </w:tc>
+            </w:tr>
+            <w:tr>
+              <w:tc>
+                <w:tcPr/>
+                <w:p>
+                  <w:pPr>
+                    <w:pStyle w:val="Compact"/>
+                    <w:jc w:val="left"/>
+                    <w:jc w:val="center"/>
+                  </w:pPr>
+                  <w:r>
+                    <w:t xml:space="preserve">Intensive care unit (ICU) admission</w:t>
+                  </w:r>
+                </w:p>
+              </w:tc>
+              <w:tc>
+                <w:tcPr/>
+                <w:p>
+                  <w:pPr>
+                    <w:pStyle w:val="Compact"/>
+                    <w:jc w:val="left"/>
+                    <w:jc w:val="center"/>
+                  </w:pPr>
+                  <w:r>
+                    <w:t xml:space="preserve">Main stepped-wedge</w:t>
+                  </w:r>
+                </w:p>
+              </w:tc>
+              <w:tc>
+                <w:tcPr/>
+                <w:p>
+                  <w:pPr>
+                    <w:pStyle w:val="Compact"/>
+                    <w:jc w:val="left"/>
+                    <w:jc w:val="center"/>
+                  </w:pPr>
+                  <w:r>
+                    <w:t xml:space="preserve">Binary</w:t>
+                  </w:r>
+                </w:p>
+              </w:tc>
+              <w:tc>
+                <w:tcPr/>
+                <w:p>
+                  <w:pPr>
+                    <w:pStyle w:val="Compact"/>
+                    <w:jc w:val="left"/>
+                    <w:jc w:val="center"/>
+                  </w:pPr>
+                  <w:r>
+                    <w:t xml:space="preserve">All eligible patient participants in the main stepped-wedge trial</w:t>
+                  </w:r>
+                </w:p>
+              </w:tc>
+            </w:tr>
+            <w:tr>
+              <w:tc>
+                <w:tcPr/>
+                <w:p>
+                  <w:pPr>
+                    <w:pStyle w:val="Compact"/>
+                    <w:jc w:val="left"/>
+                    <w:jc w:val="center"/>
+                  </w:pPr>
+                  <w:r>
+                    <w:t xml:space="preserve">Length of Intensive care unit admission stay</w:t>
+                  </w:r>
+                </w:p>
+              </w:tc>
+              <w:tc>
+                <w:tcPr/>
+                <w:p>
+                  <w:pPr>
+                    <w:pStyle w:val="Compact"/>
+                    <w:jc w:val="left"/>
+                    <w:jc w:val="center"/>
+                  </w:pPr>
+                  <w:r>
+                    <w:t xml:space="preserve">Main stepped-wedge</w:t>
+                  </w:r>
+                </w:p>
+              </w:tc>
+              <w:tc>
+                <w:tcPr/>
+                <w:p>
+                  <w:pPr>
+                    <w:pStyle w:val="Compact"/>
+                  </w:pPr>
+                </w:p>
+              </w:tc>
+              <w:tc>
+                <w:tcPr/>
+                <w:p>
+                  <w:pPr>
+                    <w:pStyle w:val="Compact"/>
+                  </w:pPr>
+                </w:p>
+              </w:tc>
+            </w:tr>
+            <w:tr>
+              <w:tc>
+                <w:tcPr/>
+                <w:p>
+                  <w:pPr>
+                    <w:pStyle w:val="Compact"/>
+                    <w:jc w:val="left"/>
+                    <w:jc w:val="center"/>
+                  </w:pPr>
+                  <w:r>
+                    <w:t xml:space="preserve">Return to work 30 days after ED arrival</w:t>
+                  </w:r>
+                </w:p>
+              </w:tc>
+              <w:tc>
+                <w:tcPr/>
+                <w:p>
+                  <w:pPr>
+                    <w:pStyle w:val="Compact"/>
+                    <w:jc w:val="left"/>
+                    <w:jc w:val="center"/>
+                  </w:pPr>
+                  <w:r>
+                    <w:t xml:space="preserve">Main stepped-wedge</w:t>
+                  </w:r>
+                </w:p>
+              </w:tc>
+              <w:tc>
+                <w:tcPr/>
+                <w:p>
+                  <w:pPr>
+                    <w:pStyle w:val="Compact"/>
+                    <w:jc w:val="left"/>
+                    <w:jc w:val="center"/>
+                  </w:pPr>
+                  <w:r>
+                    <w:t xml:space="preserve">Binary</w:t>
+                  </w:r>
+                </w:p>
+              </w:tc>
+              <w:tc>
+                <w:tcPr/>
+                <w:p>
+                  <w:pPr>
+                    <w:pStyle w:val="Compact"/>
+                    <w:jc w:val="left"/>
+                    <w:jc w:val="center"/>
+                  </w:pPr>
+                  <w:r>
+                    <w:t xml:space="preserve">Patients alive at 30 days for whom return to work is relevant</w:t>
+                  </w:r>
+                </w:p>
+              </w:tc>
+            </w:tr>
+            <w:tr>
+              <w:tc>
+                <w:tcPr/>
+                <w:p>
+                  <w:pPr>
+                    <w:pStyle w:val="Compact"/>
+                    <w:jc w:val="left"/>
+                    <w:jc w:val="center"/>
+                  </w:pPr>
+                  <w:r>
+                    <w:t xml:space="preserve">Return to work 3 months after ED arrival</w:t>
+                  </w:r>
+                </w:p>
+              </w:tc>
+              <w:tc>
+                <w:tcPr/>
+                <w:p>
+                  <w:pPr>
+                    <w:pStyle w:val="Compact"/>
+                    <w:jc w:val="left"/>
+                    <w:jc w:val="center"/>
+                  </w:pPr>
+                  <w:r>
+                    <w:t xml:space="preserve">Main stepped-wedge</w:t>
+                  </w:r>
+                </w:p>
+              </w:tc>
+              <w:tc>
+                <w:tcPr/>
+                <w:p>
+                  <w:pPr>
+                    <w:pStyle w:val="Compact"/>
+                    <w:jc w:val="left"/>
+                    <w:jc w:val="center"/>
+                  </w:pPr>
+                  <w:r>
+                    <w:t xml:space="preserve">Binary</w:t>
+                  </w:r>
+                </w:p>
+              </w:tc>
+              <w:tc>
+                <w:tcPr/>
+                <w:p>
+                  <w:pPr>
+                    <w:pStyle w:val="Compact"/>
+                    <w:jc w:val="left"/>
+                    <w:jc w:val="center"/>
+                  </w:pPr>
+                  <w:r>
+                    <w:t xml:space="preserve">Patients alive at 3 months for whom return to work is relevant</w:t>
+                  </w:r>
+                </w:p>
+              </w:tc>
+            </w:tr>
+            <w:tr>
+              <w:tc>
+                <w:tcPr/>
+                <w:p>
+                  <w:pPr>
+                    <w:pStyle w:val="Compact"/>
+                    <w:jc w:val="left"/>
+                    <w:jc w:val="center"/>
+                  </w:pPr>
+                  <w:r>
+                    <w:t xml:space="preserve">Adherence to ATLS® principles during initial resuscitation</w:t>
                   </w:r>
                 </w:p>
               </w:tc>
@@ -2073,6 +2367,60 @@
                     <w:jc w:val="center"/>
                   </w:pPr>
                   <w:r>
+                    <w:t xml:space="preserve">Proportion</w:t>
+                  </w:r>
+                </w:p>
+              </w:tc>
+              <w:tc>
+                <w:tcPr/>
+                <w:p>
+                  <w:pPr>
+                    <w:pStyle w:val="Compact"/>
+                    <w:jc w:val="left"/>
+                    <w:jc w:val="center"/>
+                  </w:pPr>
+                  <w:r>
+                    <w:t xml:space="preserve">Random sample of patients observed in both control and intervention periods within the nested staircase design</w:t>
+                  </w:r>
+                </w:p>
+              </w:tc>
+            </w:tr>
+            <w:tr>
+              <w:tc>
+                <w:tcPr/>
+                <w:p>
+                  <w:pPr>
+                    <w:pStyle w:val="Compact"/>
+                    <w:jc w:val="left"/>
+                    <w:jc w:val="center"/>
+                  </w:pPr>
+                  <w:r>
+                    <w:t xml:space="preserve">Quality of life within 7 days of discharge</w:t>
+                  </w:r>
+                </w:p>
+              </w:tc>
+              <w:tc>
+                <w:tcPr/>
+                <w:p>
+                  <w:pPr>
+                    <w:pStyle w:val="Compact"/>
+                    <w:jc w:val="left"/>
+                    <w:jc w:val="center"/>
+                  </w:pPr>
+                  <w:r>
+                    <w:t xml:space="preserve">Nested staircase</w:t>
+                  </w:r>
+                </w:p>
+              </w:tc>
+              <w:tc>
+                <w:tcPr/>
+                <w:p>
+                  <w:pPr>
+                    <w:pStyle w:val="Compact"/>
+                    <w:jc w:val="left"/>
+                    <w:jc w:val="center"/>
+                  </w:pPr>
+                  <w:r>
                     <w:t xml:space="preserve">Ordinal EQ-5D dimensions; continuous VAS</w:t>
                   </w:r>
                 </w:p>
@@ -2357,354 +2705,6 @@
                   </w:pPr>
                   <w:r>
                     <w:t xml:space="preserve">Patients alive at 3 months within the nested staircase sample</w:t>
-                  </w:r>
-                </w:p>
-              </w:tc>
-            </w:tr>
-            <w:tr>
-              <w:tc>
-                <w:tcPr/>
-                <w:p>
-                  <w:pPr>
-                    <w:pStyle w:val="Compact"/>
-                    <w:jc w:val="left"/>
-                    <w:jc w:val="center"/>
-                  </w:pPr>
-                  <w:r>
-                    <w:t xml:space="preserve">Return to work 30 days after ED arrival</w:t>
-                  </w:r>
-                </w:p>
-              </w:tc>
-              <w:tc>
-                <w:tcPr/>
-                <w:p>
-                  <w:pPr>
-                    <w:pStyle w:val="Compact"/>
-                    <w:jc w:val="left"/>
-                    <w:jc w:val="center"/>
-                  </w:pPr>
-                  <w:r>
-                    <w:t xml:space="preserve">Main stepped-wedge</w:t>
-                  </w:r>
-                </w:p>
-              </w:tc>
-              <w:tc>
-                <w:tcPr/>
-                <w:p>
-                  <w:pPr>
-                    <w:pStyle w:val="Compact"/>
-                    <w:jc w:val="left"/>
-                    <w:jc w:val="center"/>
-                  </w:pPr>
-                  <w:r>
-                    <w:t xml:space="preserve">Binary</w:t>
-                  </w:r>
-                </w:p>
-              </w:tc>
-              <w:tc>
-                <w:tcPr/>
-                <w:p>
-                  <w:pPr>
-                    <w:pStyle w:val="Compact"/>
-                    <w:jc w:val="left"/>
-                    <w:jc w:val="center"/>
-                  </w:pPr>
-                  <w:r>
-                    <w:t xml:space="preserve">Patients alive at 30 days for whom return to work is relevant</w:t>
-                  </w:r>
-                </w:p>
-              </w:tc>
-            </w:tr>
-            <w:tr>
-              <w:tc>
-                <w:tcPr/>
-                <w:p>
-                  <w:pPr>
-                    <w:pStyle w:val="Compact"/>
-                    <w:jc w:val="left"/>
-                    <w:jc w:val="center"/>
-                  </w:pPr>
-                  <w:r>
-                    <w:t xml:space="preserve">Return to work 3 months after ED arrival</w:t>
-                  </w:r>
-                </w:p>
-              </w:tc>
-              <w:tc>
-                <w:tcPr/>
-                <w:p>
-                  <w:pPr>
-                    <w:pStyle w:val="Compact"/>
-                    <w:jc w:val="left"/>
-                    <w:jc w:val="center"/>
-                  </w:pPr>
-                  <w:r>
-                    <w:t xml:space="preserve">Main stepped-wedge</w:t>
-                  </w:r>
-                </w:p>
-              </w:tc>
-              <w:tc>
-                <w:tcPr/>
-                <w:p>
-                  <w:pPr>
-                    <w:pStyle w:val="Compact"/>
-                    <w:jc w:val="left"/>
-                    <w:jc w:val="center"/>
-                  </w:pPr>
-                  <w:r>
-                    <w:t xml:space="preserve">Binary</w:t>
-                  </w:r>
-                </w:p>
-              </w:tc>
-              <w:tc>
-                <w:tcPr/>
-                <w:p>
-                  <w:pPr>
-                    <w:pStyle w:val="Compact"/>
-                    <w:jc w:val="left"/>
-                    <w:jc w:val="center"/>
-                  </w:pPr>
-                  <w:r>
-                    <w:t xml:space="preserve">Patients alive at 3 months for whom return to work is relevant</w:t>
-                  </w:r>
-                </w:p>
-              </w:tc>
-            </w:tr>
-            <w:tr>
-              <w:tc>
-                <w:tcPr/>
-                <w:p>
-                  <w:pPr>
-                    <w:pStyle w:val="Compact"/>
-                    <w:jc w:val="left"/>
-                    <w:jc w:val="center"/>
-                  </w:pPr>
-                  <w:r>
-                    <w:t xml:space="preserve">Length of emergency department stay</w:t>
-                  </w:r>
-                </w:p>
-              </w:tc>
-              <w:tc>
-                <w:tcPr/>
-                <w:p>
-                  <w:pPr>
-                    <w:pStyle w:val="Compact"/>
-                    <w:jc w:val="left"/>
-                    <w:jc w:val="center"/>
-                  </w:pPr>
-                  <w:r>
-                    <w:t xml:space="preserve">Main stepped-wedge</w:t>
-                  </w:r>
-                </w:p>
-              </w:tc>
-              <w:tc>
-                <w:tcPr/>
-                <w:p>
-                  <w:pPr>
-                    <w:pStyle w:val="Compact"/>
-                  </w:pPr>
-                </w:p>
-              </w:tc>
-              <w:tc>
-                <w:tcPr/>
-                <w:p>
-                  <w:pPr>
-                    <w:pStyle w:val="Compact"/>
-                  </w:pPr>
-                </w:p>
-              </w:tc>
-            </w:tr>
-            <w:tr>
-              <w:tc>
-                <w:tcPr/>
-                <w:p>
-                  <w:pPr>
-                    <w:pStyle w:val="Compact"/>
-                    <w:jc w:val="left"/>
-                    <w:jc w:val="center"/>
-                  </w:pPr>
-                  <w:r>
-                    <w:t xml:space="preserve">Length of hospital stay</w:t>
-                  </w:r>
-                </w:p>
-              </w:tc>
-              <w:tc>
-                <w:tcPr/>
-                <w:p>
-                  <w:pPr>
-                    <w:pStyle w:val="Compact"/>
-                    <w:jc w:val="left"/>
-                    <w:jc w:val="center"/>
-                  </w:pPr>
-                  <w:r>
-                    <w:t xml:space="preserve">Main stepped-wedge</w:t>
-                  </w:r>
-                </w:p>
-              </w:tc>
-              <w:tc>
-                <w:tcPr/>
-                <w:p>
-                  <w:pPr>
-                    <w:pStyle w:val="Compact"/>
-                  </w:pPr>
-                </w:p>
-              </w:tc>
-              <w:tc>
-                <w:tcPr/>
-                <w:p>
-                  <w:pPr>
-                    <w:pStyle w:val="Compact"/>
-                  </w:pPr>
-                </w:p>
-              </w:tc>
-            </w:tr>
-            <w:tr>
-              <w:tc>
-                <w:tcPr/>
-                <w:p>
-                  <w:pPr>
-                    <w:pStyle w:val="Compact"/>
-                    <w:jc w:val="left"/>
-                    <w:jc w:val="center"/>
-                  </w:pPr>
-                  <w:r>
-                    <w:t xml:space="preserve">Intensive care unit (ICU) admission</w:t>
-                  </w:r>
-                </w:p>
-              </w:tc>
-              <w:tc>
-                <w:tcPr/>
-                <w:p>
-                  <w:pPr>
-                    <w:pStyle w:val="Compact"/>
-                    <w:jc w:val="left"/>
-                    <w:jc w:val="center"/>
-                  </w:pPr>
-                  <w:r>
-                    <w:t xml:space="preserve">Main stepped-wedge</w:t>
-                  </w:r>
-                </w:p>
-              </w:tc>
-              <w:tc>
-                <w:tcPr/>
-                <w:p>
-                  <w:pPr>
-                    <w:pStyle w:val="Compact"/>
-                    <w:jc w:val="left"/>
-                    <w:jc w:val="center"/>
-                  </w:pPr>
-                  <w:r>
-                    <w:t xml:space="preserve">Binary</w:t>
-                  </w:r>
-                </w:p>
-              </w:tc>
-              <w:tc>
-                <w:tcPr/>
-                <w:p>
-                  <w:pPr>
-                    <w:pStyle w:val="Compact"/>
-                    <w:jc w:val="left"/>
-                    <w:jc w:val="center"/>
-                  </w:pPr>
-                  <w:r>
-                    <w:t xml:space="preserve">All eligible patient participants in the main stepped-wedge trial</w:t>
-                  </w:r>
-                </w:p>
-              </w:tc>
-            </w:tr>
-            <w:tr>
-              <w:tc>
-                <w:tcPr/>
-                <w:p>
-                  <w:pPr>
-                    <w:pStyle w:val="Compact"/>
-                    <w:jc w:val="left"/>
-                    <w:jc w:val="center"/>
-                  </w:pPr>
-                  <w:r>
-                    <w:t xml:space="preserve">Length of Intensive care unit admission stay</w:t>
-                  </w:r>
-                </w:p>
-              </w:tc>
-              <w:tc>
-                <w:tcPr/>
-                <w:p>
-                  <w:pPr>
-                    <w:pStyle w:val="Compact"/>
-                    <w:jc w:val="left"/>
-                    <w:jc w:val="center"/>
-                  </w:pPr>
-                  <w:r>
-                    <w:t xml:space="preserve">Main stepped-wedge</w:t>
-                  </w:r>
-                </w:p>
-              </w:tc>
-              <w:tc>
-                <w:tcPr/>
-                <w:p>
-                  <w:pPr>
-                    <w:pStyle w:val="Compact"/>
-                  </w:pPr>
-                </w:p>
-              </w:tc>
-              <w:tc>
-                <w:tcPr/>
-                <w:p>
-                  <w:pPr>
-                    <w:pStyle w:val="Compact"/>
-                  </w:pPr>
-                </w:p>
-              </w:tc>
-            </w:tr>
-            <w:tr>
-              <w:tc>
-                <w:tcPr/>
-                <w:p>
-                  <w:pPr>
-                    <w:pStyle w:val="Compact"/>
-                    <w:jc w:val="left"/>
-                    <w:jc w:val="center"/>
-                  </w:pPr>
-                  <w:r>
-                    <w:t xml:space="preserve">Adherence to ATLS® principles during initial resuscitation</w:t>
-                  </w:r>
-                </w:p>
-              </w:tc>
-              <w:tc>
-                <w:tcPr/>
-                <w:p>
-                  <w:pPr>
-                    <w:pStyle w:val="Compact"/>
-                    <w:jc w:val="left"/>
-                    <w:jc w:val="center"/>
-                  </w:pPr>
-                  <w:r>
-                    <w:t xml:space="preserve">Nested staircase</w:t>
-                  </w:r>
-                </w:p>
-              </w:tc>
-              <w:tc>
-                <w:tcPr/>
-                <w:p>
-                  <w:pPr>
-                    <w:pStyle w:val="Compact"/>
-                    <w:jc w:val="left"/>
-                    <w:jc w:val="center"/>
-                  </w:pPr>
-                  <w:r>
-                    <w:t xml:space="preserve">Proportion</w:t>
-                  </w:r>
-                </w:p>
-              </w:tc>
-              <w:tc>
-                <w:tcPr/>
-                <w:p>
-                  <w:pPr>
-                    <w:pStyle w:val="Compact"/>
-                    <w:jc w:val="left"/>
-                    <w:jc w:val="center"/>
-                  </w:pPr>
-                  <w:r>
-                    <w:t xml:space="preserve">Random sample of patients observed in both control and intervention periods within the nested staircase design</w:t>
                   </w:r>
                 </w:p>
               </w:tc>
@@ -3112,6 +3112,415 @@
                     <w:jc w:val="center"/>
                   </w:pPr>
                   <w:r>
+                    <w:t xml:space="preserve">Length of emergency department stay</w:t>
+                  </w:r>
+                </w:p>
+              </w:tc>
+              <w:tc>
+                <w:tcPr/>
+                <w:p>
+                  <w:pPr>
+                    <w:pStyle w:val="Compact"/>
+                  </w:pPr>
+                </w:p>
+              </w:tc>
+              <w:tc>
+                <w:tcPr/>
+                <w:p>
+                  <w:pPr>
+                    <w:pStyle w:val="Compact"/>
+                  </w:pPr>
+                </w:p>
+              </w:tc>
+              <w:tc>
+                <w:tcPr/>
+                <w:p>
+                  <w:pPr>
+                    <w:pStyle w:val="Compact"/>
+                  </w:pPr>
+                </w:p>
+              </w:tc>
+              <w:tc>
+                <w:tcPr/>
+                <w:p>
+                  <w:pPr>
+                    <w:pStyle w:val="Compact"/>
+                  </w:pPr>
+                </w:p>
+              </w:tc>
+            </w:tr>
+            <w:tr>
+              <w:tc>
+                <w:tcPr/>
+                <w:p>
+                  <w:pPr>
+                    <w:pStyle w:val="Compact"/>
+                    <w:jc w:val="left"/>
+                    <w:jc w:val="center"/>
+                  </w:pPr>
+                  <w:r>
+                    <w:t xml:space="preserve">Length of hospital stay</w:t>
+                  </w:r>
+                </w:p>
+              </w:tc>
+              <w:tc>
+                <w:tcPr/>
+                <w:p>
+                  <w:pPr>
+                    <w:pStyle w:val="Compact"/>
+                  </w:pPr>
+                </w:p>
+              </w:tc>
+              <w:tc>
+                <w:tcPr/>
+                <w:p>
+                  <w:pPr>
+                    <w:pStyle w:val="Compact"/>
+                  </w:pPr>
+                </w:p>
+              </w:tc>
+              <w:tc>
+                <w:tcPr/>
+                <w:p>
+                  <w:pPr>
+                    <w:pStyle w:val="Compact"/>
+                  </w:pPr>
+                </w:p>
+              </w:tc>
+              <w:tc>
+                <w:tcPr/>
+                <w:p>
+                  <w:pPr>
+                    <w:pStyle w:val="Compact"/>
+                  </w:pPr>
+                </w:p>
+              </w:tc>
+            </w:tr>
+            <w:tr>
+              <w:tc>
+                <w:tcPr/>
+                <w:p>
+                  <w:pPr>
+                    <w:pStyle w:val="Compact"/>
+                    <w:jc w:val="left"/>
+                    <w:jc w:val="center"/>
+                  </w:pPr>
+                  <w:r>
+                    <w:t xml:space="preserve">Intensive care unit (ICU) admission</w:t>
+                  </w:r>
+                </w:p>
+              </w:tc>
+              <w:tc>
+                <w:tcPr/>
+                <w:p>
+                  <w:pPr>
+                    <w:pStyle w:val="Compact"/>
+                    <w:jc w:val="left"/>
+                    <w:jc w:val="center"/>
+                  </w:pPr>
+                  <w:r>
+                    <w:t xml:space="preserve">Mixed-effects binomial regression with logit link</w:t>
+                  </w:r>
+                </w:p>
+              </w:tc>
+              <w:tc>
+                <w:tcPr/>
+                <w:p>
+                  <w:pPr>
+                    <w:pStyle w:val="Compact"/>
+                    <w:jc w:val="left"/>
+                    <w:jc w:val="center"/>
+                  </w:pPr>
+                  <w:r>
+                    <w:t xml:space="preserve">Odds ratio</w:t>
+                  </w:r>
+                </w:p>
+              </w:tc>
+              <w:tc>
+                <w:tcPr/>
+                <w:p>
+                  <w:pPr>
+                    <w:pStyle w:val="Compact"/>
+                    <w:jc w:val="left"/>
+                    <w:jc w:val="center"/>
+                  </w:pPr>
+                  <w:r>
+                    <w:t xml:space="preserve">Death before ICU admission ascertainment; transfer</w:t>
+                  </w:r>
+                </w:p>
+              </w:tc>
+              <w:tc>
+                <w:tcPr/>
+                <w:p>
+                  <w:pPr>
+                    <w:pStyle w:val="Compact"/>
+                    <w:jc w:val="left"/>
+                    <w:jc w:val="center"/>
+                  </w:pPr>
+                  <w:r>
+                    <w:t xml:space="preserve">Treatment policy strategy using available data</w:t>
+                  </w:r>
+                </w:p>
+              </w:tc>
+            </w:tr>
+            <w:tr>
+              <w:tc>
+                <w:tcPr/>
+                <w:p>
+                  <w:pPr>
+                    <w:pStyle w:val="Compact"/>
+                    <w:jc w:val="left"/>
+                    <w:jc w:val="center"/>
+                  </w:pPr>
+                  <w:r>
+                    <w:t xml:space="preserve">Length of Intensive care unit admission stay</w:t>
+                  </w:r>
+                </w:p>
+              </w:tc>
+              <w:tc>
+                <w:tcPr/>
+                <w:p>
+                  <w:pPr>
+                    <w:pStyle w:val="Compact"/>
+                  </w:pPr>
+                </w:p>
+              </w:tc>
+              <w:tc>
+                <w:tcPr/>
+                <w:p>
+                  <w:pPr>
+                    <w:pStyle w:val="Compact"/>
+                  </w:pPr>
+                </w:p>
+              </w:tc>
+              <w:tc>
+                <w:tcPr/>
+                <w:p>
+                  <w:pPr>
+                    <w:pStyle w:val="Compact"/>
+                  </w:pPr>
+                </w:p>
+              </w:tc>
+              <w:tc>
+                <w:tcPr/>
+                <w:p>
+                  <w:pPr>
+                    <w:pStyle w:val="Compact"/>
+                  </w:pPr>
+                </w:p>
+              </w:tc>
+            </w:tr>
+            <w:tr>
+              <w:tc>
+                <w:tcPr/>
+                <w:p>
+                  <w:pPr>
+                    <w:pStyle w:val="Compact"/>
+                    <w:jc w:val="left"/>
+                    <w:jc w:val="center"/>
+                  </w:pPr>
+                  <w:r>
+                    <w:t xml:space="preserve">Return to work 30 days after ED arrival</w:t>
+                  </w:r>
+                </w:p>
+              </w:tc>
+              <w:tc>
+                <w:tcPr/>
+                <w:p>
+                  <w:pPr>
+                    <w:pStyle w:val="Compact"/>
+                    <w:jc w:val="left"/>
+                    <w:jc w:val="center"/>
+                  </w:pPr>
+                  <w:r>
+                    <w:t xml:space="preserve">Mixed-effects binomial regression with logit and identity links</w:t>
+                  </w:r>
+                </w:p>
+              </w:tc>
+              <w:tc>
+                <w:tcPr/>
+                <w:p>
+                  <w:pPr>
+                    <w:pStyle w:val="Compact"/>
+                    <w:jc w:val="left"/>
+                    <w:jc w:val="center"/>
+                  </w:pPr>
+                  <w:r>
+                    <w:t xml:space="preserve">Odds ratio</w:t>
+                  </w:r>
+                </w:p>
+              </w:tc>
+              <w:tc>
+                <w:tcPr/>
+                <w:p>
+                  <w:pPr>
+                    <w:pStyle w:val="Compact"/>
+                    <w:jc w:val="left"/>
+                    <w:jc w:val="center"/>
+                  </w:pPr>
+                  <w:r>
+                    <w:t xml:space="preserve">Death before assessment; withdrawal/loss to follow-up; outcome not relevant for some participants</w:t>
+                  </w:r>
+                </w:p>
+              </w:tc>
+              <w:tc>
+                <w:tcPr/>
+                <w:p>
+                  <w:pPr>
+                    <w:pStyle w:val="Compact"/>
+                    <w:jc w:val="left"/>
+                    <w:jc w:val="center"/>
+                  </w:pPr>
+                  <w:r>
+                    <w:t xml:space="preserve">While alive / outcome-defined population strategy</w:t>
+                  </w:r>
+                </w:p>
+              </w:tc>
+            </w:tr>
+            <w:tr>
+              <w:tc>
+                <w:tcPr/>
+                <w:p>
+                  <w:pPr>
+                    <w:pStyle w:val="Compact"/>
+                    <w:jc w:val="left"/>
+                    <w:jc w:val="center"/>
+                  </w:pPr>
+                  <w:r>
+                    <w:t xml:space="preserve">Return to work 3 months after ED arrival</w:t>
+                  </w:r>
+                </w:p>
+              </w:tc>
+              <w:tc>
+                <w:tcPr/>
+                <w:p>
+                  <w:pPr>
+                    <w:pStyle w:val="Compact"/>
+                    <w:jc w:val="left"/>
+                    <w:jc w:val="center"/>
+                  </w:pPr>
+                  <w:r>
+                    <w:t xml:space="preserve">Mixed-effects binomial regression with logit and identity links</w:t>
+                  </w:r>
+                </w:p>
+              </w:tc>
+              <w:tc>
+                <w:tcPr/>
+                <w:p>
+                  <w:pPr>
+                    <w:pStyle w:val="Compact"/>
+                    <w:jc w:val="left"/>
+                    <w:jc w:val="center"/>
+                  </w:pPr>
+                  <w:r>
+                    <w:t xml:space="preserve">Odds ratio</w:t>
+                  </w:r>
+                </w:p>
+              </w:tc>
+              <w:tc>
+                <w:tcPr/>
+                <w:p>
+                  <w:pPr>
+                    <w:pStyle w:val="Compact"/>
+                    <w:jc w:val="left"/>
+                    <w:jc w:val="center"/>
+                  </w:pPr>
+                  <w:r>
+                    <w:t xml:space="preserve">Death before assessment; withdrawal/loss to follow-up; outcome not relevant for some participants</w:t>
+                  </w:r>
+                </w:p>
+              </w:tc>
+              <w:tc>
+                <w:tcPr/>
+                <w:p>
+                  <w:pPr>
+                    <w:pStyle w:val="Compact"/>
+                    <w:jc w:val="left"/>
+                    <w:jc w:val="center"/>
+                  </w:pPr>
+                  <w:r>
+                    <w:t xml:space="preserve">While alive / outcome-defined population strategy</w:t>
+                  </w:r>
+                </w:p>
+              </w:tc>
+            </w:tr>
+            <w:tr>
+              <w:tc>
+                <w:tcPr/>
+                <w:p>
+                  <w:pPr>
+                    <w:pStyle w:val="Compact"/>
+                    <w:jc w:val="left"/>
+                    <w:jc w:val="center"/>
+                  </w:pPr>
+                  <w:r>
+                    <w:t xml:space="preserve">Adherence to ATLS® principles during initial resuscitation</w:t>
+                  </w:r>
+                </w:p>
+              </w:tc>
+              <w:tc>
+                <w:tcPr/>
+                <w:p>
+                  <w:pPr>
+                    <w:pStyle w:val="Compact"/>
+                    <w:jc w:val="left"/>
+                    <w:jc w:val="center"/>
+                  </w:pPr>
+                  <w:r>
+                    <w:t xml:space="preserve">Mixed-effects beta regression with logit link</w:t>
+                  </w:r>
+                </w:p>
+              </w:tc>
+              <w:tc>
+                <w:tcPr/>
+                <w:p>
+                  <w:pPr>
+                    <w:pStyle w:val="Compact"/>
+                    <w:jc w:val="left"/>
+                    <w:jc w:val="center"/>
+                  </w:pPr>
+                  <w:r>
+                    <w:t xml:space="preserve">Difference in expected adherence proportion on the logit scale</w:t>
+                  </w:r>
+                </w:p>
+              </w:tc>
+              <w:tc>
+                <w:tcPr/>
+                <w:p>
+                  <w:pPr>
+                    <w:pStyle w:val="Compact"/>
+                    <w:jc w:val="left"/>
+                    <w:jc w:val="center"/>
+                  </w:pPr>
+                  <w:r>
+                    <w:t xml:space="preserve">Failure to observe resuscitation; incomplete observation window</w:t>
+                  </w:r>
+                </w:p>
+              </w:tc>
+              <w:tc>
+                <w:tcPr/>
+                <w:p>
+                  <w:pPr>
+                    <w:pStyle w:val="Compact"/>
+                    <w:jc w:val="left"/>
+                    <w:jc w:val="center"/>
+                  </w:pPr>
+                  <w:r>
+                    <w:t xml:space="preserve">Treatment policy strategy for the observed nested sample</w:t>
+                  </w:r>
+                </w:p>
+              </w:tc>
+            </w:tr>
+            <w:tr>
+              <w:tc>
+                <w:tcPr/>
+                <w:p>
+                  <w:pPr>
+                    <w:pStyle w:val="Compact"/>
+                    <w:jc w:val="left"/>
+                    <w:jc w:val="center"/>
+                  </w:pPr>
+                  <w:r>
                     <w:t xml:space="preserve">Quality of life within 7 days of discharge</w:t>
                   </w:r>
                 </w:p>
@@ -3500,415 +3909,6 @@
                   </w:pPr>
                   <w:r>
                     <w:t xml:space="preserve">While alive strategy</w:t>
-                  </w:r>
-                </w:p>
-              </w:tc>
-            </w:tr>
-            <w:tr>
-              <w:tc>
-                <w:tcPr/>
-                <w:p>
-                  <w:pPr>
-                    <w:pStyle w:val="Compact"/>
-                    <w:jc w:val="left"/>
-                    <w:jc w:val="center"/>
-                  </w:pPr>
-                  <w:r>
-                    <w:t xml:space="preserve">Return to work 30 days after ED arrival</w:t>
-                  </w:r>
-                </w:p>
-              </w:tc>
-              <w:tc>
-                <w:tcPr/>
-                <w:p>
-                  <w:pPr>
-                    <w:pStyle w:val="Compact"/>
-                    <w:jc w:val="left"/>
-                    <w:jc w:val="center"/>
-                  </w:pPr>
-                  <w:r>
-                    <w:t xml:space="preserve">Mixed-effects binomial regression with logit and identity links</w:t>
-                  </w:r>
-                </w:p>
-              </w:tc>
-              <w:tc>
-                <w:tcPr/>
-                <w:p>
-                  <w:pPr>
-                    <w:pStyle w:val="Compact"/>
-                    <w:jc w:val="left"/>
-                    <w:jc w:val="center"/>
-                  </w:pPr>
-                  <w:r>
-                    <w:t xml:space="preserve">Odds ratio</w:t>
-                  </w:r>
-                </w:p>
-              </w:tc>
-              <w:tc>
-                <w:tcPr/>
-                <w:p>
-                  <w:pPr>
-                    <w:pStyle w:val="Compact"/>
-                    <w:jc w:val="left"/>
-                    <w:jc w:val="center"/>
-                  </w:pPr>
-                  <w:r>
-                    <w:t xml:space="preserve">Death before assessment; withdrawal/loss to follow-up; outcome not relevant for some participants</w:t>
-                  </w:r>
-                </w:p>
-              </w:tc>
-              <w:tc>
-                <w:tcPr/>
-                <w:p>
-                  <w:pPr>
-                    <w:pStyle w:val="Compact"/>
-                    <w:jc w:val="left"/>
-                    <w:jc w:val="center"/>
-                  </w:pPr>
-                  <w:r>
-                    <w:t xml:space="preserve">While alive / outcome-defined population strategy</w:t>
-                  </w:r>
-                </w:p>
-              </w:tc>
-            </w:tr>
-            <w:tr>
-              <w:tc>
-                <w:tcPr/>
-                <w:p>
-                  <w:pPr>
-                    <w:pStyle w:val="Compact"/>
-                    <w:jc w:val="left"/>
-                    <w:jc w:val="center"/>
-                  </w:pPr>
-                  <w:r>
-                    <w:t xml:space="preserve">Return to work 3 months after ED arrival</w:t>
-                  </w:r>
-                </w:p>
-              </w:tc>
-              <w:tc>
-                <w:tcPr/>
-                <w:p>
-                  <w:pPr>
-                    <w:pStyle w:val="Compact"/>
-                    <w:jc w:val="left"/>
-                    <w:jc w:val="center"/>
-                  </w:pPr>
-                  <w:r>
-                    <w:t xml:space="preserve">Mixed-effects binomial regression with logit and identity links</w:t>
-                  </w:r>
-                </w:p>
-              </w:tc>
-              <w:tc>
-                <w:tcPr/>
-                <w:p>
-                  <w:pPr>
-                    <w:pStyle w:val="Compact"/>
-                    <w:jc w:val="left"/>
-                    <w:jc w:val="center"/>
-                  </w:pPr>
-                  <w:r>
-                    <w:t xml:space="preserve">Odds ratio</w:t>
-                  </w:r>
-                </w:p>
-              </w:tc>
-              <w:tc>
-                <w:tcPr/>
-                <w:p>
-                  <w:pPr>
-                    <w:pStyle w:val="Compact"/>
-                    <w:jc w:val="left"/>
-                    <w:jc w:val="center"/>
-                  </w:pPr>
-                  <w:r>
-                    <w:t xml:space="preserve">Death before assessment; withdrawal/loss to follow-up; outcome not relevant for some participants</w:t>
-                  </w:r>
-                </w:p>
-              </w:tc>
-              <w:tc>
-                <w:tcPr/>
-                <w:p>
-                  <w:pPr>
-                    <w:pStyle w:val="Compact"/>
-                    <w:jc w:val="left"/>
-                    <w:jc w:val="center"/>
-                  </w:pPr>
-                  <w:r>
-                    <w:t xml:space="preserve">While alive / outcome-defined population strategy</w:t>
-                  </w:r>
-                </w:p>
-              </w:tc>
-            </w:tr>
-            <w:tr>
-              <w:tc>
-                <w:tcPr/>
-                <w:p>
-                  <w:pPr>
-                    <w:pStyle w:val="Compact"/>
-                    <w:jc w:val="left"/>
-                    <w:jc w:val="center"/>
-                  </w:pPr>
-                  <w:r>
-                    <w:t xml:space="preserve">Length of emergency department stay</w:t>
-                  </w:r>
-                </w:p>
-              </w:tc>
-              <w:tc>
-                <w:tcPr/>
-                <w:p>
-                  <w:pPr>
-                    <w:pStyle w:val="Compact"/>
-                  </w:pPr>
-                </w:p>
-              </w:tc>
-              <w:tc>
-                <w:tcPr/>
-                <w:p>
-                  <w:pPr>
-                    <w:pStyle w:val="Compact"/>
-                  </w:pPr>
-                </w:p>
-              </w:tc>
-              <w:tc>
-                <w:tcPr/>
-                <w:p>
-                  <w:pPr>
-                    <w:pStyle w:val="Compact"/>
-                  </w:pPr>
-                </w:p>
-              </w:tc>
-              <w:tc>
-                <w:tcPr/>
-                <w:p>
-                  <w:pPr>
-                    <w:pStyle w:val="Compact"/>
-                  </w:pPr>
-                </w:p>
-              </w:tc>
-            </w:tr>
-            <w:tr>
-              <w:tc>
-                <w:tcPr/>
-                <w:p>
-                  <w:pPr>
-                    <w:pStyle w:val="Compact"/>
-                    <w:jc w:val="left"/>
-                    <w:jc w:val="center"/>
-                  </w:pPr>
-                  <w:r>
-                    <w:t xml:space="preserve">Length of hospital stay</w:t>
-                  </w:r>
-                </w:p>
-              </w:tc>
-              <w:tc>
-                <w:tcPr/>
-                <w:p>
-                  <w:pPr>
-                    <w:pStyle w:val="Compact"/>
-                  </w:pPr>
-                </w:p>
-              </w:tc>
-              <w:tc>
-                <w:tcPr/>
-                <w:p>
-                  <w:pPr>
-                    <w:pStyle w:val="Compact"/>
-                  </w:pPr>
-                </w:p>
-              </w:tc>
-              <w:tc>
-                <w:tcPr/>
-                <w:p>
-                  <w:pPr>
-                    <w:pStyle w:val="Compact"/>
-                  </w:pPr>
-                </w:p>
-              </w:tc>
-              <w:tc>
-                <w:tcPr/>
-                <w:p>
-                  <w:pPr>
-                    <w:pStyle w:val="Compact"/>
-                  </w:pPr>
-                </w:p>
-              </w:tc>
-            </w:tr>
-            <w:tr>
-              <w:tc>
-                <w:tcPr/>
-                <w:p>
-                  <w:pPr>
-                    <w:pStyle w:val="Compact"/>
-                    <w:jc w:val="left"/>
-                    <w:jc w:val="center"/>
-                  </w:pPr>
-                  <w:r>
-                    <w:t xml:space="preserve">Intensive care unit (ICU) admission</w:t>
-                  </w:r>
-                </w:p>
-              </w:tc>
-              <w:tc>
-                <w:tcPr/>
-                <w:p>
-                  <w:pPr>
-                    <w:pStyle w:val="Compact"/>
-                    <w:jc w:val="left"/>
-                    <w:jc w:val="center"/>
-                  </w:pPr>
-                  <w:r>
-                    <w:t xml:space="preserve">Mixed-effects binomial regression with logit link</w:t>
-                  </w:r>
-                </w:p>
-              </w:tc>
-              <w:tc>
-                <w:tcPr/>
-                <w:p>
-                  <w:pPr>
-                    <w:pStyle w:val="Compact"/>
-                    <w:jc w:val="left"/>
-                    <w:jc w:val="center"/>
-                  </w:pPr>
-                  <w:r>
-                    <w:t xml:space="preserve">Odds ratio</w:t>
-                  </w:r>
-                </w:p>
-              </w:tc>
-              <w:tc>
-                <w:tcPr/>
-                <w:p>
-                  <w:pPr>
-                    <w:pStyle w:val="Compact"/>
-                    <w:jc w:val="left"/>
-                    <w:jc w:val="center"/>
-                  </w:pPr>
-                  <w:r>
-                    <w:t xml:space="preserve">Death before ICU admission ascertainment; transfer</w:t>
-                  </w:r>
-                </w:p>
-              </w:tc>
-              <w:tc>
-                <w:tcPr/>
-                <w:p>
-                  <w:pPr>
-                    <w:pStyle w:val="Compact"/>
-                    <w:jc w:val="left"/>
-                    <w:jc w:val="center"/>
-                  </w:pPr>
-                  <w:r>
-                    <w:t xml:space="preserve">Treatment policy strategy using available data</w:t>
-                  </w:r>
-                </w:p>
-              </w:tc>
-            </w:tr>
-            <w:tr>
-              <w:tc>
-                <w:tcPr/>
-                <w:p>
-                  <w:pPr>
-                    <w:pStyle w:val="Compact"/>
-                    <w:jc w:val="left"/>
-                    <w:jc w:val="center"/>
-                  </w:pPr>
-                  <w:r>
-                    <w:t xml:space="preserve">Length of Intensive care unit admission stay</w:t>
-                  </w:r>
-                </w:p>
-              </w:tc>
-              <w:tc>
-                <w:tcPr/>
-                <w:p>
-                  <w:pPr>
-                    <w:pStyle w:val="Compact"/>
-                  </w:pPr>
-                </w:p>
-              </w:tc>
-              <w:tc>
-                <w:tcPr/>
-                <w:p>
-                  <w:pPr>
-                    <w:pStyle w:val="Compact"/>
-                  </w:pPr>
-                </w:p>
-              </w:tc>
-              <w:tc>
-                <w:tcPr/>
-                <w:p>
-                  <w:pPr>
-                    <w:pStyle w:val="Compact"/>
-                  </w:pPr>
-                </w:p>
-              </w:tc>
-              <w:tc>
-                <w:tcPr/>
-                <w:p>
-                  <w:pPr>
-                    <w:pStyle w:val="Compact"/>
-                  </w:pPr>
-                </w:p>
-              </w:tc>
-            </w:tr>
-            <w:tr>
-              <w:tc>
-                <w:tcPr/>
-                <w:p>
-                  <w:pPr>
-                    <w:pStyle w:val="Compact"/>
-                    <w:jc w:val="left"/>
-                    <w:jc w:val="center"/>
-                  </w:pPr>
-                  <w:r>
-                    <w:t xml:space="preserve">Adherence to ATLS® principles during initial resuscitation</w:t>
-                  </w:r>
-                </w:p>
-              </w:tc>
-              <w:tc>
-                <w:tcPr/>
-                <w:p>
-                  <w:pPr>
-                    <w:pStyle w:val="Compact"/>
-                    <w:jc w:val="left"/>
-                    <w:jc w:val="center"/>
-                  </w:pPr>
-                  <w:r>
-                    <w:t xml:space="preserve">Mixed-effects beta regression with logit link</w:t>
-                  </w:r>
-                </w:p>
-              </w:tc>
-              <w:tc>
-                <w:tcPr/>
-                <w:p>
-                  <w:pPr>
-                    <w:pStyle w:val="Compact"/>
-                    <w:jc w:val="left"/>
-                    <w:jc w:val="center"/>
-                  </w:pPr>
-                  <w:r>
-                    <w:t xml:space="preserve">Difference in expected adherence proportion on the logit scale</w:t>
-                  </w:r>
-                </w:p>
-              </w:tc>
-              <w:tc>
-                <w:tcPr/>
-                <w:p>
-                  <w:pPr>
-                    <w:pStyle w:val="Compact"/>
-                    <w:jc w:val="left"/>
-                    <w:jc w:val="center"/>
-                  </w:pPr>
-                  <w:r>
-                    <w:t xml:space="preserve">Failure to observe resuscitation; incomplete observation window</w:t>
-                  </w:r>
-                </w:p>
-              </w:tc>
-              <w:tc>
-                <w:tcPr/>
-                <w:p>
-                  <w:pPr>
-                    <w:pStyle w:val="Compact"/>
-                    <w:jc w:val="left"/>
-                    <w:jc w:val="center"/>
-                  </w:pPr>
-                  <w:r>
-                    <w:t xml:space="preserve">Treatment policy strategy for the observed nested sample</w:t>
                   </w:r>
                 </w:p>
               </w:tc>

</xml_diff>

<commit_message>
Combine outcomes summary tables
</commit_message>
<xml_diff>
--- a/statistical-analysis-plan/statistical-analysis-plan.docx
+++ b/statistical-analysis-plan/statistical-analysis-plan.docx
@@ -1192,7 +1192,7 @@
     </w:p>
     <w:bookmarkEnd w:id="48"/>
     <w:bookmarkEnd w:id="49"/>
-    <w:bookmarkStart w:id="119" w:name="statistical-analysis"/>
+    <w:bookmarkStart w:id="118" w:name="statistical-analysis"/>
     <w:p>
       <w:pPr>
         <w:pStyle w:val="Heading1"/>
@@ -1477,7 +1477,7 @@
       </w:r>
     </w:p>
     <w:bookmarkEnd w:id="59"/>
-    <w:bookmarkStart w:id="66" w:name="outcomes"/>
+    <w:bookmarkStart w:id="65" w:name="outcomes"/>
     <w:p>
       <w:pPr>
         <w:pStyle w:val="Heading2"/>
@@ -1504,7 +1504,7 @@
       </w:r>
     </w:p>
     <w:bookmarkEnd w:id="60"/>
-    <w:bookmarkStart w:id="65" w:name="secondary-outcomes"/>
+    <w:bookmarkStart w:id="64" w:name="secondary-outcomes"/>
     <w:p>
       <w:pPr>
         <w:pStyle w:val="Heading3"/>
@@ -1595,7 +1595,7 @@
       </w:r>
     </w:p>
     <w:bookmarkEnd w:id="61"/>
-    <w:bookmarkStart w:id="64" w:name="Xac098b8b976789377f406b0c926b7e67113ef4f"/>
+    <w:bookmarkStart w:id="63" w:name="Xac098b8b976789377f406b0c926b7e67113ef4f"/>
     <w:p>
       <w:pPr>
         <w:pStyle w:val="Heading4"/>
@@ -1695,29 +1695,12 @@
       <w:r>
         <w:t xml:space="preserve"> </w:t>
       </w:r>
-      <w:hyperlink w:anchor="tbl-outcomes-population">
+      <w:hyperlink w:anchor="tbl-outcomes-summary">
         <w:r>
           <w:rPr>
             <w:rStyle w:val="Hyperlink"/>
           </w:rPr>
           <w:t xml:space="preserve">Table 1</w:t>
-        </w:r>
-      </w:hyperlink>
-      <w:r>
-        <w:t xml:space="preserve"> </w:t>
-      </w:r>
-      <w:r>
-        <w:t xml:space="preserve">and</w:t>
-      </w:r>
-      <w:r>
-        <w:t xml:space="preserve"> </w:t>
-      </w:r>
-      <w:hyperlink w:anchor="tbl-outcomes-analysis">
-        <w:r>
-          <w:rPr>
-            <w:rStyle w:val="Hyperlink"/>
-          </w:rPr>
-          <w:t xml:space="preserve">Table 2</w:t>
         </w:r>
       </w:hyperlink>
       <w:r>
@@ -1737,7 +1720,7 @@
       <w:tr>
         <w:tc>
           <w:tcPr/>
-          <w:bookmarkStart w:id="62" w:name="tbl-outcomes-population"/>
+          <w:bookmarkStart w:id="62" w:name="tbl-outcomes-summary"/>
           <w:p>
             <w:pPr>
               <w:jc w:val="center"/>
@@ -1748,979 +1731,209 @@
               <w:pStyle w:val="ImageCaption"/>
             </w:pPr>
             <w:r>
-              <w:t xml:space="preserve">Table 1: Summary of outcomes, design components, data types, and target populations</w:t>
+              <w:t xml:space="preserve">Table 1: Summary of outcomes, populations, effect measures, and handling of intercurrent events</w:t>
             </w:r>
           </w:p>
-          <w:tbl>
-            <w:tblPr>
-              <w:tblStyle w:val="Table"/>
-              <w:tblW w:type="pct" w:w="5000"/>
-              <w:tblLayout w:type="fixed"/>
-              <w:tblLook w:firstRow="1" w:lastRow="0" w:firstColumn="0" w:lastColumn="0" w:noHBand="0" w:noVBand="0" w:val="0020"/>
-            </w:tblPr>
-            <w:tblGrid>
-              <w:gridCol w:w="2180"/>
-              <w:gridCol w:w="609"/>
-              <w:gridCol w:w="1571"/>
-              <w:gridCol w:w="3559"/>
-            </w:tblGrid>
-            <w:tr>
-              <w:trPr>
-                <w:tblHeader w:val="on"/>
-              </w:trPr>
-              <w:tc>
-                <w:tcPr/>
-                <w:p>
-                  <w:pPr>
-                    <w:pStyle w:val="Compact"/>
-                    <w:jc w:val="left"/>
-                    <w:jc w:val="center"/>
-                  </w:pPr>
-                  <w:r>
-                    <w:t xml:space="preserve">Outcome</w:t>
-                  </w:r>
-                </w:p>
-              </w:tc>
-              <w:tc>
-                <w:tcPr/>
-                <w:p>
-                  <w:pPr>
-                    <w:pStyle w:val="Compact"/>
-                    <w:jc w:val="left"/>
-                    <w:jc w:val="center"/>
-                  </w:pPr>
-                  <w:r>
-                    <w:t xml:space="preserve">Design component</w:t>
-                  </w:r>
-                </w:p>
-              </w:tc>
-              <w:tc>
-                <w:tcPr/>
-                <w:p>
-                  <w:pPr>
-                    <w:pStyle w:val="Compact"/>
-                    <w:jc w:val="left"/>
-                    <w:jc w:val="center"/>
-                  </w:pPr>
-                  <w:r>
-                    <w:t xml:space="preserve">Data type</w:t>
-                  </w:r>
-                </w:p>
-              </w:tc>
-              <w:tc>
-                <w:tcPr/>
-                <w:p>
-                  <w:pPr>
-                    <w:pStyle w:val="Compact"/>
-                    <w:jc w:val="left"/>
-                    <w:jc w:val="center"/>
-                  </w:pPr>
-                  <w:r>
-                    <w:t xml:space="preserve">Target population</w:t>
-                  </w:r>
-                </w:p>
-              </w:tc>
-            </w:tr>
-            <w:tr>
-              <w:tc>
-                <w:tcPr/>
-                <w:p>
-                  <w:pPr>
-                    <w:pStyle w:val="Compact"/>
-                    <w:jc w:val="left"/>
-                    <w:jc w:val="center"/>
-                  </w:pPr>
-                  <w:r>
-                    <w:t xml:space="preserve">Primary outcome: In-hospital mortality within 30 days of ED arrival</w:t>
-                  </w:r>
-                </w:p>
-              </w:tc>
-              <w:tc>
-                <w:tcPr/>
-                <w:p>
-                  <w:pPr>
-                    <w:pStyle w:val="Compact"/>
-                    <w:jc w:val="left"/>
-                    <w:jc w:val="center"/>
-                  </w:pPr>
-                  <w:r>
-                    <w:t xml:space="preserve">Main stepped-wedge</w:t>
-                  </w:r>
-                </w:p>
-              </w:tc>
-              <w:tc>
-                <w:tcPr/>
-                <w:p>
-                  <w:pPr>
-                    <w:pStyle w:val="Compact"/>
-                    <w:jc w:val="left"/>
-                    <w:jc w:val="center"/>
-                  </w:pPr>
-                  <w:r>
-                    <w:t xml:space="preserve">Binary</w:t>
-                  </w:r>
-                </w:p>
-              </w:tc>
-              <w:tc>
-                <w:tcPr/>
-                <w:p>
-                  <w:pPr>
-                    <w:pStyle w:val="Compact"/>
-                    <w:jc w:val="left"/>
-                    <w:jc w:val="center"/>
-                  </w:pPr>
-                  <w:r>
-                    <w:t xml:space="preserve">All eligible patient participants in the main stepped-wedge trial</w:t>
-                  </w:r>
-                </w:p>
-              </w:tc>
-            </w:tr>
-            <w:tr>
-              <w:tc>
-                <w:tcPr/>
-                <w:p>
-                  <w:pPr>
-                    <w:pStyle w:val="Compact"/>
-                    <w:jc w:val="left"/>
-                    <w:jc w:val="center"/>
-                  </w:pPr>
-                  <w:r>
-                    <w:t xml:space="preserve">All-cause mortality within 24 hours of ED arrival</w:t>
-                  </w:r>
-                </w:p>
-              </w:tc>
-              <w:tc>
-                <w:tcPr/>
-                <w:p>
-                  <w:pPr>
-                    <w:pStyle w:val="Compact"/>
-                    <w:jc w:val="left"/>
-                    <w:jc w:val="center"/>
-                  </w:pPr>
-                  <w:r>
-                    <w:t xml:space="preserve">Main stepped-wedge</w:t>
-                  </w:r>
-                </w:p>
-              </w:tc>
-              <w:tc>
-                <w:tcPr/>
-                <w:p>
-                  <w:pPr>
-                    <w:pStyle w:val="Compact"/>
-                    <w:jc w:val="left"/>
-                    <w:jc w:val="center"/>
-                  </w:pPr>
-                  <w:r>
-                    <w:t xml:space="preserve">Binary</w:t>
-                  </w:r>
-                </w:p>
-              </w:tc>
-              <w:tc>
-                <w:tcPr/>
-                <w:p>
-                  <w:pPr>
-                    <w:pStyle w:val="Compact"/>
-                    <w:jc w:val="left"/>
-                    <w:jc w:val="center"/>
-                  </w:pPr>
-                  <w:r>
-                    <w:t xml:space="preserve">All eligible patient participants in the main stepped-wedge trial</w:t>
-                  </w:r>
-                </w:p>
-              </w:tc>
-            </w:tr>
-            <w:tr>
-              <w:tc>
-                <w:tcPr/>
-                <w:p>
-                  <w:pPr>
-                    <w:pStyle w:val="Compact"/>
-                    <w:jc w:val="left"/>
-                    <w:jc w:val="center"/>
-                  </w:pPr>
-                  <w:r>
-                    <w:t xml:space="preserve">All-cause mortality within 30 days of ED arrival</w:t>
-                  </w:r>
-                </w:p>
-              </w:tc>
-              <w:tc>
-                <w:tcPr/>
-                <w:p>
-                  <w:pPr>
-                    <w:pStyle w:val="Compact"/>
-                    <w:jc w:val="left"/>
-                    <w:jc w:val="center"/>
-                  </w:pPr>
-                  <w:r>
-                    <w:t xml:space="preserve">Main stepped-wedge</w:t>
-                  </w:r>
-                </w:p>
-              </w:tc>
-              <w:tc>
-                <w:tcPr/>
-                <w:p>
-                  <w:pPr>
-                    <w:pStyle w:val="Compact"/>
-                    <w:jc w:val="left"/>
-                    <w:jc w:val="center"/>
-                  </w:pPr>
-                  <w:r>
-                    <w:t xml:space="preserve">Binary</w:t>
-                  </w:r>
-                </w:p>
-              </w:tc>
-              <w:tc>
-                <w:tcPr/>
-                <w:p>
-                  <w:pPr>
-                    <w:pStyle w:val="Compact"/>
-                    <w:jc w:val="left"/>
-                    <w:jc w:val="center"/>
-                  </w:pPr>
-                  <w:r>
-                    <w:t xml:space="preserve">All eligible patient participants in the main stepped-wedge trial</w:t>
-                  </w:r>
-                </w:p>
-              </w:tc>
-            </w:tr>
-            <w:tr>
-              <w:tc>
-                <w:tcPr/>
-                <w:p>
-                  <w:pPr>
-                    <w:pStyle w:val="Compact"/>
-                    <w:jc w:val="left"/>
-                    <w:jc w:val="center"/>
-                  </w:pPr>
-                  <w:r>
-                    <w:t xml:space="preserve">All-cause mortality within 3 months of ED arrival</w:t>
-                  </w:r>
-                </w:p>
-              </w:tc>
-              <w:tc>
-                <w:tcPr/>
-                <w:p>
-                  <w:pPr>
-                    <w:pStyle w:val="Compact"/>
-                    <w:jc w:val="left"/>
-                    <w:jc w:val="center"/>
-                  </w:pPr>
-                  <w:r>
-                    <w:t xml:space="preserve">Main stepped-wedge</w:t>
-                  </w:r>
-                </w:p>
-              </w:tc>
-              <w:tc>
-                <w:tcPr/>
-                <w:p>
-                  <w:pPr>
-                    <w:pStyle w:val="Compact"/>
-                    <w:jc w:val="left"/>
-                    <w:jc w:val="center"/>
-                  </w:pPr>
-                  <w:r>
-                    <w:t xml:space="preserve">Binary</w:t>
-                  </w:r>
-                </w:p>
-              </w:tc>
-              <w:tc>
-                <w:tcPr/>
-                <w:p>
-                  <w:pPr>
-                    <w:pStyle w:val="Compact"/>
-                    <w:jc w:val="left"/>
-                    <w:jc w:val="center"/>
-                  </w:pPr>
-                  <w:r>
-                    <w:t xml:space="preserve">All eligible patient participants in the main stepped-wedge trial</w:t>
-                  </w:r>
-                </w:p>
-              </w:tc>
-            </w:tr>
-            <w:tr>
-              <w:tc>
-                <w:tcPr/>
-                <w:p>
-                  <w:pPr>
-                    <w:pStyle w:val="Compact"/>
-                    <w:jc w:val="left"/>
-                    <w:jc w:val="center"/>
-                  </w:pPr>
-                  <w:r>
-                    <w:t xml:space="preserve">Length of emergency department stay</w:t>
-                  </w:r>
-                </w:p>
-              </w:tc>
-              <w:tc>
-                <w:tcPr/>
-                <w:p>
-                  <w:pPr>
-                    <w:pStyle w:val="Compact"/>
-                    <w:jc w:val="left"/>
-                    <w:jc w:val="center"/>
-                  </w:pPr>
-                  <w:r>
-                    <w:t xml:space="preserve">Main stepped-wedge</w:t>
-                  </w:r>
-                </w:p>
-              </w:tc>
-              <w:tc>
-                <w:tcPr/>
-                <w:p>
-                  <w:pPr>
-                    <w:pStyle w:val="Compact"/>
-                  </w:pPr>
-                </w:p>
-              </w:tc>
-              <w:tc>
-                <w:tcPr/>
-                <w:p>
-                  <w:pPr>
-                    <w:pStyle w:val="Compact"/>
-                  </w:pPr>
-                </w:p>
-              </w:tc>
-            </w:tr>
-            <w:tr>
-              <w:tc>
-                <w:tcPr/>
-                <w:p>
-                  <w:pPr>
-                    <w:pStyle w:val="Compact"/>
-                    <w:jc w:val="left"/>
-                    <w:jc w:val="center"/>
-                  </w:pPr>
-                  <w:r>
-                    <w:t xml:space="preserve">Length of hospital stay</w:t>
-                  </w:r>
-                </w:p>
-              </w:tc>
-              <w:tc>
-                <w:tcPr/>
-                <w:p>
-                  <w:pPr>
-                    <w:pStyle w:val="Compact"/>
-                    <w:jc w:val="left"/>
-                    <w:jc w:val="center"/>
-                  </w:pPr>
-                  <w:r>
-                    <w:t xml:space="preserve">Main stepped-wedge</w:t>
-                  </w:r>
-                </w:p>
-              </w:tc>
-              <w:tc>
-                <w:tcPr/>
-                <w:p>
-                  <w:pPr>
-                    <w:pStyle w:val="Compact"/>
-                  </w:pPr>
-                </w:p>
-              </w:tc>
-              <w:tc>
-                <w:tcPr/>
-                <w:p>
-                  <w:pPr>
-                    <w:pStyle w:val="Compact"/>
-                  </w:pPr>
-                </w:p>
-              </w:tc>
-            </w:tr>
-            <w:tr>
-              <w:tc>
-                <w:tcPr/>
-                <w:p>
-                  <w:pPr>
-                    <w:pStyle w:val="Compact"/>
-                    <w:jc w:val="left"/>
-                    <w:jc w:val="center"/>
-                  </w:pPr>
-                  <w:r>
-                    <w:t xml:space="preserve">Intensive care unit (ICU) admission</w:t>
-                  </w:r>
-                </w:p>
-              </w:tc>
-              <w:tc>
-                <w:tcPr/>
-                <w:p>
-                  <w:pPr>
-                    <w:pStyle w:val="Compact"/>
-                    <w:jc w:val="left"/>
-                    <w:jc w:val="center"/>
-                  </w:pPr>
-                  <w:r>
-                    <w:t xml:space="preserve">Main stepped-wedge</w:t>
-                  </w:r>
-                </w:p>
-              </w:tc>
-              <w:tc>
-                <w:tcPr/>
-                <w:p>
-                  <w:pPr>
-                    <w:pStyle w:val="Compact"/>
-                    <w:jc w:val="left"/>
-                    <w:jc w:val="center"/>
-                  </w:pPr>
-                  <w:r>
-                    <w:t xml:space="preserve">Binary</w:t>
-                  </w:r>
-                </w:p>
-              </w:tc>
-              <w:tc>
-                <w:tcPr/>
-                <w:p>
-                  <w:pPr>
-                    <w:pStyle w:val="Compact"/>
-                    <w:jc w:val="left"/>
-                    <w:jc w:val="center"/>
-                  </w:pPr>
-                  <w:r>
-                    <w:t xml:space="preserve">All eligible patient participants in the main stepped-wedge trial</w:t>
-                  </w:r>
-                </w:p>
-              </w:tc>
-            </w:tr>
-            <w:tr>
-              <w:tc>
-                <w:tcPr/>
-                <w:p>
-                  <w:pPr>
-                    <w:pStyle w:val="Compact"/>
-                    <w:jc w:val="left"/>
-                    <w:jc w:val="center"/>
-                  </w:pPr>
-                  <w:r>
-                    <w:t xml:space="preserve">Length of Intensive care unit admission stay</w:t>
-                  </w:r>
-                </w:p>
-              </w:tc>
-              <w:tc>
-                <w:tcPr/>
-                <w:p>
-                  <w:pPr>
-                    <w:pStyle w:val="Compact"/>
-                    <w:jc w:val="left"/>
-                    <w:jc w:val="center"/>
-                  </w:pPr>
-                  <w:r>
-                    <w:t xml:space="preserve">Main stepped-wedge</w:t>
-                  </w:r>
-                </w:p>
-              </w:tc>
-              <w:tc>
-                <w:tcPr/>
-                <w:p>
-                  <w:pPr>
-                    <w:pStyle w:val="Compact"/>
-                  </w:pPr>
-                </w:p>
-              </w:tc>
-              <w:tc>
-                <w:tcPr/>
-                <w:p>
-                  <w:pPr>
-                    <w:pStyle w:val="Compact"/>
-                  </w:pPr>
-                </w:p>
-              </w:tc>
-            </w:tr>
-            <w:tr>
-              <w:tc>
-                <w:tcPr/>
-                <w:p>
-                  <w:pPr>
-                    <w:pStyle w:val="Compact"/>
-                    <w:jc w:val="left"/>
-                    <w:jc w:val="center"/>
-                  </w:pPr>
-                  <w:r>
-                    <w:t xml:space="preserve">Return to work 30 days after ED arrival</w:t>
-                  </w:r>
-                </w:p>
-              </w:tc>
-              <w:tc>
-                <w:tcPr/>
-                <w:p>
-                  <w:pPr>
-                    <w:pStyle w:val="Compact"/>
-                    <w:jc w:val="left"/>
-                    <w:jc w:val="center"/>
-                  </w:pPr>
-                  <w:r>
-                    <w:t xml:space="preserve">Main stepped-wedge</w:t>
-                  </w:r>
-                </w:p>
-              </w:tc>
-              <w:tc>
-                <w:tcPr/>
-                <w:p>
-                  <w:pPr>
-                    <w:pStyle w:val="Compact"/>
-                    <w:jc w:val="left"/>
-                    <w:jc w:val="center"/>
-                  </w:pPr>
-                  <w:r>
-                    <w:t xml:space="preserve">Binary</w:t>
-                  </w:r>
-                </w:p>
-              </w:tc>
-              <w:tc>
-                <w:tcPr/>
-                <w:p>
-                  <w:pPr>
-                    <w:pStyle w:val="Compact"/>
-                    <w:jc w:val="left"/>
-                    <w:jc w:val="center"/>
-                  </w:pPr>
-                  <w:r>
-                    <w:t xml:space="preserve">Patients alive at 30 days for whom return to work is relevant</w:t>
-                  </w:r>
-                </w:p>
-              </w:tc>
-            </w:tr>
-            <w:tr>
-              <w:tc>
-                <w:tcPr/>
-                <w:p>
-                  <w:pPr>
-                    <w:pStyle w:val="Compact"/>
-                    <w:jc w:val="left"/>
-                    <w:jc w:val="center"/>
-                  </w:pPr>
-                  <w:r>
-                    <w:t xml:space="preserve">Return to work 3 months after ED arrival</w:t>
-                  </w:r>
-                </w:p>
-              </w:tc>
-              <w:tc>
-                <w:tcPr/>
-                <w:p>
-                  <w:pPr>
-                    <w:pStyle w:val="Compact"/>
-                    <w:jc w:val="left"/>
-                    <w:jc w:val="center"/>
-                  </w:pPr>
-                  <w:r>
-                    <w:t xml:space="preserve">Main stepped-wedge</w:t>
-                  </w:r>
-                </w:p>
-              </w:tc>
-              <w:tc>
-                <w:tcPr/>
-                <w:p>
-                  <w:pPr>
-                    <w:pStyle w:val="Compact"/>
-                    <w:jc w:val="left"/>
-                    <w:jc w:val="center"/>
-                  </w:pPr>
-                  <w:r>
-                    <w:t xml:space="preserve">Binary</w:t>
-                  </w:r>
-                </w:p>
-              </w:tc>
-              <w:tc>
-                <w:tcPr/>
-                <w:p>
-                  <w:pPr>
-                    <w:pStyle w:val="Compact"/>
-                    <w:jc w:val="left"/>
-                    <w:jc w:val="center"/>
-                  </w:pPr>
-                  <w:r>
-                    <w:t xml:space="preserve">Patients alive at 3 months for whom return to work is relevant</w:t>
-                  </w:r>
-                </w:p>
-              </w:tc>
-            </w:tr>
-            <w:tr>
-              <w:tc>
-                <w:tcPr/>
-                <w:p>
-                  <w:pPr>
-                    <w:pStyle w:val="Compact"/>
-                    <w:jc w:val="left"/>
-                    <w:jc w:val="center"/>
-                  </w:pPr>
-                  <w:r>
-                    <w:t xml:space="preserve">Adherence to ATLS® principles during initial resuscitation</w:t>
-                  </w:r>
-                </w:p>
-              </w:tc>
-              <w:tc>
-                <w:tcPr/>
-                <w:p>
-                  <w:pPr>
-                    <w:pStyle w:val="Compact"/>
-                    <w:jc w:val="left"/>
-                    <w:jc w:val="center"/>
-                  </w:pPr>
-                  <w:r>
-                    <w:t xml:space="preserve">Nested staircase</w:t>
-                  </w:r>
-                </w:p>
-              </w:tc>
-              <w:tc>
-                <w:tcPr/>
-                <w:p>
-                  <w:pPr>
-                    <w:pStyle w:val="Compact"/>
-                    <w:jc w:val="left"/>
-                    <w:jc w:val="center"/>
-                  </w:pPr>
-                  <w:r>
-                    <w:t xml:space="preserve">Proportion</w:t>
-                  </w:r>
-                </w:p>
-              </w:tc>
-              <w:tc>
-                <w:tcPr/>
-                <w:p>
-                  <w:pPr>
-                    <w:pStyle w:val="Compact"/>
-                    <w:jc w:val="left"/>
-                    <w:jc w:val="center"/>
-                  </w:pPr>
-                  <w:r>
-                    <w:t xml:space="preserve">Random sample of patients observed in both control and intervention periods within the nested staircase design</w:t>
-                  </w:r>
-                </w:p>
-              </w:tc>
-            </w:tr>
-            <w:tr>
-              <w:tc>
-                <w:tcPr/>
-                <w:p>
-                  <w:pPr>
-                    <w:pStyle w:val="Compact"/>
-                    <w:jc w:val="left"/>
-                    <w:jc w:val="center"/>
-                  </w:pPr>
-                  <w:r>
-                    <w:t xml:space="preserve">Quality of life within 7 days of discharge</w:t>
-                  </w:r>
-                </w:p>
-              </w:tc>
-              <w:tc>
-                <w:tcPr/>
-                <w:p>
-                  <w:pPr>
-                    <w:pStyle w:val="Compact"/>
-                    <w:jc w:val="left"/>
-                    <w:jc w:val="center"/>
-                  </w:pPr>
-                  <w:r>
-                    <w:t xml:space="preserve">Nested staircase</w:t>
-                  </w:r>
-                </w:p>
-              </w:tc>
-              <w:tc>
-                <w:tcPr/>
-                <w:p>
-                  <w:pPr>
-                    <w:pStyle w:val="Compact"/>
-                    <w:jc w:val="left"/>
-                    <w:jc w:val="center"/>
-                  </w:pPr>
-                  <w:r>
-                    <w:t xml:space="preserve">Ordinal EQ-5D dimensions; continuous VAS</w:t>
-                  </w:r>
-                </w:p>
-              </w:tc>
-              <w:tc>
-                <w:tcPr/>
-                <w:p>
-                  <w:pPr>
-                    <w:pStyle w:val="Compact"/>
-                    <w:jc w:val="left"/>
-                    <w:jc w:val="center"/>
-                  </w:pPr>
-                  <w:r>
-                    <w:t xml:space="preserve">Patients alive at the relevant follow-up time point within the nested staircase sample</w:t>
-                  </w:r>
-                </w:p>
-              </w:tc>
-            </w:tr>
-            <w:tr>
-              <w:tc>
-                <w:tcPr/>
-                <w:p>
-                  <w:pPr>
-                    <w:pStyle w:val="Compact"/>
-                    <w:jc w:val="left"/>
-                    <w:jc w:val="center"/>
-                  </w:pPr>
-                  <w:r>
-                    <w:t xml:space="preserve">Quality of life 30 days after ED arrival</w:t>
-                  </w:r>
-                </w:p>
-              </w:tc>
-              <w:tc>
-                <w:tcPr/>
-                <w:p>
-                  <w:pPr>
-                    <w:pStyle w:val="Compact"/>
-                    <w:jc w:val="left"/>
-                    <w:jc w:val="center"/>
-                  </w:pPr>
-                  <w:r>
-                    <w:t xml:space="preserve">Nested staircase</w:t>
-                  </w:r>
-                </w:p>
-              </w:tc>
-              <w:tc>
-                <w:tcPr/>
-                <w:p>
-                  <w:pPr>
-                    <w:pStyle w:val="Compact"/>
-                    <w:jc w:val="left"/>
-                    <w:jc w:val="center"/>
-                  </w:pPr>
-                  <w:r>
-                    <w:t xml:space="preserve">Ordinal EQ-5D dimensions; continuous VAS</w:t>
-                  </w:r>
-                </w:p>
-              </w:tc>
-              <w:tc>
-                <w:tcPr/>
-                <w:p>
-                  <w:pPr>
-                    <w:pStyle w:val="Compact"/>
-                    <w:jc w:val="left"/>
-                    <w:jc w:val="center"/>
-                  </w:pPr>
-                  <w:r>
-                    <w:t xml:space="preserve">Patients alive at 30 days within the nested staircase sample</w:t>
-                  </w:r>
-                </w:p>
-              </w:tc>
-            </w:tr>
-            <w:tr>
-              <w:tc>
-                <w:tcPr/>
-                <w:p>
-                  <w:pPr>
-                    <w:pStyle w:val="Compact"/>
-                    <w:jc w:val="left"/>
-                    <w:jc w:val="center"/>
-                  </w:pPr>
-                  <w:r>
-                    <w:t xml:space="preserve">Quality of life 3 months after ED arrival</w:t>
-                  </w:r>
-                </w:p>
-              </w:tc>
-              <w:tc>
-                <w:tcPr/>
-                <w:p>
-                  <w:pPr>
-                    <w:pStyle w:val="Compact"/>
-                    <w:jc w:val="left"/>
-                    <w:jc w:val="center"/>
-                  </w:pPr>
-                  <w:r>
-                    <w:t xml:space="preserve">Nested staircase</w:t>
-                  </w:r>
-                </w:p>
-              </w:tc>
-              <w:tc>
-                <w:tcPr/>
-                <w:p>
-                  <w:pPr>
-                    <w:pStyle w:val="Compact"/>
-                    <w:jc w:val="left"/>
-                    <w:jc w:val="center"/>
-                  </w:pPr>
-                  <w:r>
-                    <w:t xml:space="preserve">Ordinal EQ-5D dimensions; continuous VAS</w:t>
-                  </w:r>
-                </w:p>
-              </w:tc>
-              <w:tc>
-                <w:tcPr/>
-                <w:p>
-                  <w:pPr>
-                    <w:pStyle w:val="Compact"/>
-                    <w:jc w:val="left"/>
-                    <w:jc w:val="center"/>
-                  </w:pPr>
-                  <w:r>
-                    <w:t xml:space="preserve">Patients alive at 3 months within the nested staircase sample</w:t>
-                  </w:r>
-                </w:p>
-              </w:tc>
-            </w:tr>
-            <w:tr>
-              <w:tc>
-                <w:tcPr/>
-                <w:p>
-                  <w:pPr>
-                    <w:pStyle w:val="Compact"/>
-                    <w:jc w:val="left"/>
-                    <w:jc w:val="center"/>
-                  </w:pPr>
-                  <w:r>
-                    <w:t xml:space="preserve">Disability within 7 days of discharge</w:t>
-                  </w:r>
-                </w:p>
-              </w:tc>
-              <w:tc>
-                <w:tcPr/>
-                <w:p>
-                  <w:pPr>
-                    <w:pStyle w:val="Compact"/>
-                    <w:jc w:val="left"/>
-                    <w:jc w:val="center"/>
-                  </w:pPr>
-                  <w:r>
-                    <w:t xml:space="preserve">Nested staircase</w:t>
-                  </w:r>
-                </w:p>
-              </w:tc>
-              <w:tc>
-                <w:tcPr/>
-                <w:p>
-                  <w:pPr>
-                    <w:pStyle w:val="Compact"/>
-                    <w:jc w:val="left"/>
-                    <w:jc w:val="center"/>
-                  </w:pPr>
-                  <w:r>
-                    <w:t xml:space="preserve">Ordinal WHODAS domains; continuous summary score</w:t>
-                  </w:r>
-                </w:p>
-              </w:tc>
-              <w:tc>
-                <w:tcPr/>
-                <w:p>
-                  <w:pPr>
-                    <w:pStyle w:val="Compact"/>
-                    <w:jc w:val="left"/>
-                    <w:jc w:val="center"/>
-                  </w:pPr>
-                  <w:r>
-                    <w:t xml:space="preserve">Patients alive at the relevant follow-up time point within the nested staircase sample</w:t>
-                  </w:r>
-                </w:p>
-              </w:tc>
-            </w:tr>
-            <w:tr>
-              <w:tc>
-                <w:tcPr/>
-                <w:p>
-                  <w:pPr>
-                    <w:pStyle w:val="Compact"/>
-                    <w:jc w:val="left"/>
-                    <w:jc w:val="center"/>
-                  </w:pPr>
-                  <w:r>
-                    <w:t xml:space="preserve">Disability 30 days after ED arrival</w:t>
-                  </w:r>
-                </w:p>
-              </w:tc>
-              <w:tc>
-                <w:tcPr/>
-                <w:p>
-                  <w:pPr>
-                    <w:pStyle w:val="Compact"/>
-                    <w:jc w:val="left"/>
-                    <w:jc w:val="center"/>
-                  </w:pPr>
-                  <w:r>
-                    <w:t xml:space="preserve">Nested staircase</w:t>
-                  </w:r>
-                </w:p>
-              </w:tc>
-              <w:tc>
-                <w:tcPr/>
-                <w:p>
-                  <w:pPr>
-                    <w:pStyle w:val="Compact"/>
-                    <w:jc w:val="left"/>
-                    <w:jc w:val="center"/>
-                  </w:pPr>
-                  <w:r>
-                    <w:t xml:space="preserve">Ordinal WHODAS domains; continuous summary score</w:t>
-                  </w:r>
-                </w:p>
-              </w:tc>
-              <w:tc>
-                <w:tcPr/>
-                <w:p>
-                  <w:pPr>
-                    <w:pStyle w:val="Compact"/>
-                    <w:jc w:val="left"/>
-                    <w:jc w:val="center"/>
-                  </w:pPr>
-                  <w:r>
-                    <w:t xml:space="preserve">Patients alive at 30 days within the nested staircase sample</w:t>
-                  </w:r>
-                </w:p>
-              </w:tc>
-            </w:tr>
-            <w:tr>
-              <w:tc>
-                <w:tcPr/>
-                <w:p>
-                  <w:pPr>
-                    <w:pStyle w:val="Compact"/>
-                    <w:jc w:val="left"/>
-                    <w:jc w:val="center"/>
-                  </w:pPr>
-                  <w:r>
-                    <w:t xml:space="preserve">Disability 3 months after ED arrival</w:t>
-                  </w:r>
-                </w:p>
-              </w:tc>
-              <w:tc>
-                <w:tcPr/>
-                <w:p>
-                  <w:pPr>
-                    <w:pStyle w:val="Compact"/>
-                    <w:jc w:val="left"/>
-                    <w:jc w:val="center"/>
-                  </w:pPr>
-                  <w:r>
-                    <w:t xml:space="preserve">Nested staircase</w:t>
-                  </w:r>
-                </w:p>
-              </w:tc>
-              <w:tc>
-                <w:tcPr/>
-                <w:p>
-                  <w:pPr>
-                    <w:pStyle w:val="Compact"/>
-                    <w:jc w:val="left"/>
-                    <w:jc w:val="center"/>
-                  </w:pPr>
-                  <w:r>
-                    <w:t xml:space="preserve">Ordinal WHODAS domains; continuous summary score</w:t>
-                  </w:r>
-                </w:p>
-              </w:tc>
-              <w:tc>
-                <w:tcPr/>
-                <w:p>
-                  <w:pPr>
-                    <w:pStyle w:val="Compact"/>
-                    <w:jc w:val="left"/>
-                    <w:jc w:val="center"/>
-                  </w:pPr>
-                  <w:r>
-                    <w:t xml:space="preserve">Patients alive at 3 months within the nested staircase sample</w:t>
-                  </w:r>
-                </w:p>
-              </w:tc>
-            </w:tr>
-          </w:tbl>
           <w:bookmarkEnd w:id="62"/>
-          <w:p/>
         </w:tc>
       </w:tr>
     </w:tbl>
-    <w:p>
-      <w:pPr>
-        <w:pStyle w:val="BodyText"/>
-      </w:pPr>
-      <w:r>
-        <w:t xml:space="preserve"> </w:t>
+    <w:bookmarkEnd w:id="63"/>
+    <w:bookmarkEnd w:id="64"/>
+    <w:bookmarkEnd w:id="65"/>
+    <w:bookmarkStart w:id="66" w:name="statistical-hypotheses"/>
+    <w:p>
+      <w:pPr>
+        <w:pStyle w:val="Heading2"/>
+      </w:pPr>
+      <w:r>
+        <w:t xml:space="preserve">5.4 Statistical hypotheses</w:t>
+      </w:r>
+    </w:p>
+    <w:p>
+      <w:pPr>
+        <w:pStyle w:val="FirstParagraph"/>
+      </w:pPr>
+      <w:r>
+        <w:t xml:space="preserve">Our primary statistical hypotheses are:</w:t>
+      </w:r>
+    </w:p>
+    <w:p>
+      <w:pPr>
+        <w:pStyle w:val="Compact"/>
+        <w:numPr>
+          <w:ilvl w:val="0"/>
+          <w:numId w:val="1005"/>
+        </w:numPr>
+      </w:pPr>
+      <w:r>
+        <w:rPr>
+          <w:b/>
+          <w:bCs/>
+        </w:rPr>
+        <w:t xml:space="preserve">Null hypothesis</w:t>
+      </w:r>
+      <w:r>
+        <w:t xml:space="preserve">: There is no difference in the primary outcome of 30-day in-hospital mortality between those randomised to ATLS</w:t>
+      </w:r>
+      <w:r>
+        <w:rPr>
+          <w:vertAlign w:val="superscript"/>
+        </w:rPr>
+        <w:t xml:space="preserve">®</w:t>
+      </w:r>
+      <w:r>
+        <w:t xml:space="preserve"> </w:t>
+      </w:r>
+      <w:r>
+        <w:t xml:space="preserve">and standard care, meaning that the odds ratio (OR) for ATLS</w:t>
+      </w:r>
+      <w:r>
+        <w:rPr>
+          <w:vertAlign w:val="superscript"/>
+        </w:rPr>
+        <w:t xml:space="preserve">®</w:t>
+      </w:r>
+      <w:r>
+        <w:t xml:space="preserve"> </w:t>
+      </w:r>
+      <w:r>
+        <w:t xml:space="preserve">vs standard care would be 1 and the absolute risk difference (ARD) would be 0.</w:t>
+      </w:r>
+    </w:p>
+    <w:p>
+      <w:pPr>
+        <w:pStyle w:val="Compact"/>
+        <w:numPr>
+          <w:ilvl w:val="0"/>
+          <w:numId w:val="1005"/>
+        </w:numPr>
+      </w:pPr>
+      <w:r>
+        <w:rPr>
+          <w:b/>
+          <w:bCs/>
+        </w:rPr>
+        <w:t xml:space="preserve">Alternative hypothesis</w:t>
+      </w:r>
+      <w:r>
+        <w:t xml:space="preserve">: There is an absolute difference in the primary outcome of 30-day in-hospital mortality between those randomised to ATLS</w:t>
+      </w:r>
+      <w:r>
+        <w:rPr>
+          <w:vertAlign w:val="superscript"/>
+        </w:rPr>
+        <w:t xml:space="preserve">®</w:t>
+      </w:r>
+      <w:r>
+        <w:t xml:space="preserve"> </w:t>
+      </w:r>
+      <w:r>
+        <w:t xml:space="preserve">and standard care of at least 5% units, meaning that the OR for ATLS</w:t>
+      </w:r>
+      <w:r>
+        <w:rPr>
+          <w:vertAlign w:val="superscript"/>
+        </w:rPr>
+        <w:t xml:space="preserve">®</w:t>
+      </w:r>
+      <w:r>
+        <w:t xml:space="preserve"> </w:t>
+      </w:r>
+      <w:r>
+        <w:t xml:space="preserve">vs standard care would be different from 1 and the ARD would be different from 0. Our expectation, based on our pilot study and review of the literature, is that the OR will be less than 1 and the ARD will be less than 0, indicating lower odds of 30-day in-hospital mortality among those randomised to ATLS</w:t>
+      </w:r>
+      <w:r>
+        <w:rPr>
+          <w:vertAlign w:val="superscript"/>
+        </w:rPr>
+        <w:t xml:space="preserve">®</w:t>
+      </w:r>
+      <w:r>
+        <w:t xml:space="preserve"> </w:t>
+      </w:r>
+      <w:r>
+        <w:t xml:space="preserve">group compared to those randomised to the standard care group.</w:t>
+      </w:r>
+    </w:p>
+    <w:bookmarkEnd w:id="66"/>
+    <w:bookmarkStart w:id="73" w:name="sample-size-calculations"/>
+    <w:p>
+      <w:pPr>
+        <w:pStyle w:val="Heading2"/>
+      </w:pPr>
+      <w:r>
+        <w:t xml:space="preserve">5.5 Sample size calculations</w:t>
+      </w:r>
+    </w:p>
+    <w:bookmarkStart w:id="71" w:name="Xba08c803f10f7c8cd9a777b53b902d2761b3046"/>
+    <w:p>
+      <w:pPr>
+        <w:pStyle w:val="Heading3"/>
+      </w:pPr>
+      <w:r>
+        <w:t xml:space="preserve">5.5.1 Main stepped wedge design and primary outcome</w:t>
+      </w:r>
+    </w:p>
+    <w:p>
+      <w:pPr>
+        <w:pStyle w:val="FirstParagraph"/>
+      </w:pPr>
+      <w:r>
+        <w:t xml:space="preserve">With 30 clusters across 6 batches and a total sample size of 4320 our study has ~90% power across different combinations of cluster autocorrelations (CAC) and intra-cluster correlations (ICC) to detect a reduction in the primary outcome of in-hospital mortality within 30 days from 20% under standard care to 15% after ATLS</w:t>
+      </w:r>
+      <w:r>
+        <w:rPr>
+          <w:vertAlign w:val="superscript"/>
+        </w:rPr>
+        <w:t xml:space="preserve">®</w:t>
+      </w:r>
+      <w:r>
+        <w:t xml:space="preserve"> </w:t>
+      </w:r>
+      <w:r>
+        <w:t xml:space="preserve">training (see</w:t>
+      </w:r>
+      <w:r>
+        <w:t xml:space="preserve"> </w:t>
+      </w:r>
+      <w:hyperlink w:anchor="fig-power-curves">
+        <w:r>
+          <w:rPr>
+            <w:rStyle w:val="Hyperlink"/>
+          </w:rPr>
+          <w:t xml:space="preserve">Figure 3</w:t>
+        </w:r>
+      </w:hyperlink>
+      <w:r>
+        <w:t xml:space="preserve">)</w:t>
+      </w:r>
+      <w:r>
+        <w:rPr>
+          <w:vertAlign w:val="superscript"/>
+        </w:rPr>
+        <w:t xml:space="preserve">4</w:t>
+      </w:r>
+      <w:r>
+        <w:t xml:space="preserve">. This 5% absolute reduction in mortality is a clinically meaningful and conservative estimate based on our updated systematic review and pilot study</w:t>
+      </w:r>
+      <w:r>
+        <w:rPr>
+          <w:vertAlign w:val="superscript"/>
+        </w:rPr>
+        <w:t xml:space="preserve">5,6</w:t>
+      </w:r>
+      <w:r>
+        <w:t xml:space="preserve">. We allowed for the clustered design, incorporated the one month transition period, and assumed: a discrete time decay correlation structure, an ICC of 0.02 (but considered sensitivity across the range 0.01-0.05), and a CAC of 0.9 (but considered sensitivity across the range 0.8-1.0), based on our pilot study and current guidance</w:t>
+      </w:r>
+      <w:r>
+        <w:rPr>
+          <w:vertAlign w:val="superscript"/>
+        </w:rPr>
+        <w:t xml:space="preserve">7–10</w:t>
+      </w:r>
+      <w:r>
+        <w:t xml:space="preserve">. We included the CAC to allow for variation in clustering over time. We assume that each cluster will contribute approximately 12 observations per month to the analysis, but allowed for substantial variation in cluster sizes, based on our previous work.</w:t>
       </w:r>
     </w:p>
     <w:tbl>
@@ -2736,1401 +1949,7 @@
       <w:tr>
         <w:tc>
           <w:tcPr/>
-          <w:bookmarkStart w:id="63" w:name="tbl-outcomes-analysis"/>
-          <w:p>
-            <w:pPr>
-              <w:jc w:val="center"/>
-            </w:pPr>
-            <w:pPr>
-              <w:jc w:val="left"/>
-              <w:spacing w:before="200"/>
-              <w:pStyle w:val="ImageCaption"/>
-            </w:pPr>
-            <w:r>
-              <w:t xml:space="preserve">Table 2: Summary of outcome analysis models, effect measures, and handling of intercurrent events</w:t>
-            </w:r>
-          </w:p>
-          <w:tbl>
-            <w:tblPr>
-              <w:tblStyle w:val="Table"/>
-              <w:tblW w:type="pct" w:w="5000"/>
-              <w:tblLayout w:type="fixed"/>
-              <w:tblLook w:firstRow="1" w:lastRow="0" w:firstColumn="0" w:lastColumn="0" w:noHBand="0" w:noVBand="0" w:val="0020"/>
-            </w:tblPr>
-            <w:tblGrid>
-              <w:gridCol w:w="1119"/>
-              <w:gridCol w:w="1646"/>
-              <w:gridCol w:w="1201"/>
-              <w:gridCol w:w="1646"/>
-              <w:gridCol w:w="2305"/>
-            </w:tblGrid>
-            <w:tr>
-              <w:trPr>
-                <w:tblHeader w:val="on"/>
-              </w:trPr>
-              <w:tc>
-                <w:tcPr/>
-                <w:p>
-                  <w:pPr>
-                    <w:pStyle w:val="Compact"/>
-                    <w:jc w:val="left"/>
-                    <w:jc w:val="center"/>
-                  </w:pPr>
-                  <w:r>
-                    <w:t xml:space="preserve">Outcome</w:t>
-                  </w:r>
-                </w:p>
-              </w:tc>
-              <w:tc>
-                <w:tcPr/>
-                <w:p>
-                  <w:pPr>
-                    <w:pStyle w:val="Compact"/>
-                    <w:jc w:val="left"/>
-                    <w:jc w:val="center"/>
-                  </w:pPr>
-                  <w:r>
-                    <w:t xml:space="preserve">Main analysis model</w:t>
-                  </w:r>
-                </w:p>
-              </w:tc>
-              <w:tc>
-                <w:tcPr/>
-                <w:p>
-                  <w:pPr>
-                    <w:pStyle w:val="Compact"/>
-                    <w:jc w:val="left"/>
-                    <w:jc w:val="center"/>
-                  </w:pPr>
-                  <w:r>
-                    <w:t xml:space="preserve">Effect measure</w:t>
-                  </w:r>
-                </w:p>
-              </w:tc>
-              <w:tc>
-                <w:tcPr/>
-                <w:p>
-                  <w:pPr>
-                    <w:pStyle w:val="Compact"/>
-                    <w:jc w:val="left"/>
-                    <w:jc w:val="center"/>
-                  </w:pPr>
-                  <w:r>
-                    <w:t xml:space="preserve">Potential intercurrent events</w:t>
-                  </w:r>
-                </w:p>
-              </w:tc>
-              <w:tc>
-                <w:tcPr/>
-                <w:p>
-                  <w:pPr>
-                    <w:pStyle w:val="Compact"/>
-                    <w:jc w:val="left"/>
-                    <w:jc w:val="center"/>
-                  </w:pPr>
-                  <w:r>
-                    <w:t xml:space="preserve">Strategy for handling intercurrent events</w:t>
-                  </w:r>
-                </w:p>
-              </w:tc>
-            </w:tr>
-            <w:tr>
-              <w:tc>
-                <w:tcPr/>
-                <w:p>
-                  <w:pPr>
-                    <w:pStyle w:val="Compact"/>
-                    <w:jc w:val="left"/>
-                    <w:jc w:val="center"/>
-                  </w:pPr>
-                  <w:r>
-                    <w:t xml:space="preserve">Primary outcome: In-hospital mortality within 30 days of ED arrival</w:t>
-                  </w:r>
-                </w:p>
-              </w:tc>
-              <w:tc>
-                <w:tcPr/>
-                <w:p>
-                  <w:pPr>
-                    <w:pStyle w:val="Compact"/>
-                    <w:jc w:val="left"/>
-                    <w:jc w:val="center"/>
-                  </w:pPr>
-                  <w:r>
-                    <w:t xml:space="preserve">Mixed-effects binomial regression with logit and identity links</w:t>
-                  </w:r>
-                </w:p>
-              </w:tc>
-              <w:tc>
-                <w:tcPr/>
-                <w:p>
-                  <w:pPr>
-                    <w:pStyle w:val="Compact"/>
-                    <w:jc w:val="left"/>
-                    <w:jc w:val="center"/>
-                  </w:pPr>
-                  <w:r>
-                    <w:t xml:space="preserve">Odds ratio; absolute risk difference</w:t>
-                  </w:r>
-                </w:p>
-              </w:tc>
-              <w:tc>
-                <w:tcPr/>
-                <w:p>
-                  <w:pPr>
-                    <w:pStyle w:val="Compact"/>
-                    <w:jc w:val="left"/>
-                    <w:jc w:val="center"/>
-                  </w:pPr>
-                  <w:r>
-                    <w:t xml:space="preserve">Transfer to another hospital before outcome ascertainment; withdrawal/opt-out before final analysis</w:t>
-                  </w:r>
-                </w:p>
-              </w:tc>
-              <w:tc>
-                <w:tcPr/>
-                <w:p>
-                  <w:pPr>
-                    <w:pStyle w:val="Compact"/>
-                    <w:jc w:val="left"/>
-                    <w:jc w:val="center"/>
-                  </w:pPr>
-                  <w:r>
-                    <w:t xml:space="preserve">Treatment policy strategy: outcome will be ascertained irrespective of transfer where possible; all available primary outcome data included</w:t>
-                  </w:r>
-                </w:p>
-              </w:tc>
-            </w:tr>
-            <w:tr>
-              <w:tc>
-                <w:tcPr/>
-                <w:p>
-                  <w:pPr>
-                    <w:pStyle w:val="Compact"/>
-                    <w:jc w:val="left"/>
-                    <w:jc w:val="center"/>
-                  </w:pPr>
-                  <w:r>
-                    <w:t xml:space="preserve">All-cause mortality within 24 hours of ED arrival</w:t>
-                  </w:r>
-                </w:p>
-              </w:tc>
-              <w:tc>
-                <w:tcPr/>
-                <w:p>
-                  <w:pPr>
-                    <w:pStyle w:val="Compact"/>
-                    <w:jc w:val="left"/>
-                    <w:jc w:val="center"/>
-                  </w:pPr>
-                  <w:r>
-                    <w:t xml:space="preserve">Mixed-effects binomial regression with logit and identity links</w:t>
-                  </w:r>
-                </w:p>
-              </w:tc>
-              <w:tc>
-                <w:tcPr/>
-                <w:p>
-                  <w:pPr>
-                    <w:pStyle w:val="Compact"/>
-                    <w:jc w:val="left"/>
-                    <w:jc w:val="center"/>
-                  </w:pPr>
-                  <w:r>
-                    <w:t xml:space="preserve">Odds ratio; absolute risk difference</w:t>
-                  </w:r>
-                </w:p>
-              </w:tc>
-              <w:tc>
-                <w:tcPr/>
-                <w:p>
-                  <w:pPr>
-                    <w:pStyle w:val="Compact"/>
-                    <w:jc w:val="left"/>
-                    <w:jc w:val="center"/>
-                  </w:pPr>
-                  <w:r>
-                    <w:t xml:space="preserve">Loss to follow-up before ascertainment; withdrawal/opt-out</w:t>
-                  </w:r>
-                </w:p>
-              </w:tc>
-              <w:tc>
-                <w:tcPr/>
-                <w:p>
-                  <w:pPr>
-                    <w:pStyle w:val="Compact"/>
-                    <w:jc w:val="left"/>
-                    <w:jc w:val="center"/>
-                  </w:pPr>
-                  <w:r>
-                    <w:t xml:space="preserve">Treatment policy strategy using all available data</w:t>
-                  </w:r>
-                </w:p>
-              </w:tc>
-            </w:tr>
-            <w:tr>
-              <w:tc>
-                <w:tcPr/>
-                <w:p>
-                  <w:pPr>
-                    <w:pStyle w:val="Compact"/>
-                    <w:jc w:val="left"/>
-                    <w:jc w:val="center"/>
-                  </w:pPr>
-                  <w:r>
-                    <w:t xml:space="preserve">All-cause mortality within 30 days of ED arrival</w:t>
-                  </w:r>
-                </w:p>
-              </w:tc>
-              <w:tc>
-                <w:tcPr/>
-                <w:p>
-                  <w:pPr>
-                    <w:pStyle w:val="Compact"/>
-                    <w:jc w:val="left"/>
-                    <w:jc w:val="center"/>
-                  </w:pPr>
-                  <w:r>
-                    <w:t xml:space="preserve">Mixed-effects binomial regression with logit and identity links</w:t>
-                  </w:r>
-                </w:p>
-              </w:tc>
-              <w:tc>
-                <w:tcPr/>
-                <w:p>
-                  <w:pPr>
-                    <w:pStyle w:val="Compact"/>
-                    <w:jc w:val="left"/>
-                    <w:jc w:val="center"/>
-                  </w:pPr>
-                  <w:r>
-                    <w:t xml:space="preserve">Odds ratio; absolute risk difference</w:t>
-                  </w:r>
-                </w:p>
-              </w:tc>
-              <w:tc>
-                <w:tcPr/>
-                <w:p>
-                  <w:pPr>
-                    <w:pStyle w:val="Compact"/>
-                    <w:jc w:val="left"/>
-                    <w:jc w:val="center"/>
-                  </w:pPr>
-                  <w:r>
-                    <w:t xml:space="preserve">Loss to follow-up before ascertainment; withdrawal/opt-out</w:t>
-                  </w:r>
-                </w:p>
-              </w:tc>
-              <w:tc>
-                <w:tcPr/>
-                <w:p>
-                  <w:pPr>
-                    <w:pStyle w:val="Compact"/>
-                    <w:jc w:val="left"/>
-                    <w:jc w:val="center"/>
-                  </w:pPr>
-                  <w:r>
-                    <w:t xml:space="preserve">Treatment policy strategy using all available data</w:t>
-                  </w:r>
-                </w:p>
-              </w:tc>
-            </w:tr>
-            <w:tr>
-              <w:tc>
-                <w:tcPr/>
-                <w:p>
-                  <w:pPr>
-                    <w:pStyle w:val="Compact"/>
-                    <w:jc w:val="left"/>
-                    <w:jc w:val="center"/>
-                  </w:pPr>
-                  <w:r>
-                    <w:t xml:space="preserve">All-cause mortality within 3 months of ED arrival</w:t>
-                  </w:r>
-                </w:p>
-              </w:tc>
-              <w:tc>
-                <w:tcPr/>
-                <w:p>
-                  <w:pPr>
-                    <w:pStyle w:val="Compact"/>
-                    <w:jc w:val="left"/>
-                    <w:jc w:val="center"/>
-                  </w:pPr>
-                  <w:r>
-                    <w:t xml:space="preserve">Mixed-effects binomial regression with logit and identity links</w:t>
-                  </w:r>
-                </w:p>
-              </w:tc>
-              <w:tc>
-                <w:tcPr/>
-                <w:p>
-                  <w:pPr>
-                    <w:pStyle w:val="Compact"/>
-                    <w:jc w:val="left"/>
-                    <w:jc w:val="center"/>
-                  </w:pPr>
-                  <w:r>
-                    <w:t xml:space="preserve">Odds ratio; absolute risk difference</w:t>
-                  </w:r>
-                </w:p>
-              </w:tc>
-              <w:tc>
-                <w:tcPr/>
-                <w:p>
-                  <w:pPr>
-                    <w:pStyle w:val="Compact"/>
-                    <w:jc w:val="left"/>
-                    <w:jc w:val="center"/>
-                  </w:pPr>
-                  <w:r>
-                    <w:t xml:space="preserve">Loss to follow-up before ascertainment; withdrawal/opt-out</w:t>
-                  </w:r>
-                </w:p>
-              </w:tc>
-              <w:tc>
-                <w:tcPr/>
-                <w:p>
-                  <w:pPr>
-                    <w:pStyle w:val="Compact"/>
-                    <w:jc w:val="left"/>
-                    <w:jc w:val="center"/>
-                  </w:pPr>
-                  <w:r>
-                    <w:t xml:space="preserve">Treatment policy strategy using all available data</w:t>
-                  </w:r>
-                </w:p>
-              </w:tc>
-            </w:tr>
-            <w:tr>
-              <w:tc>
-                <w:tcPr/>
-                <w:p>
-                  <w:pPr>
-                    <w:pStyle w:val="Compact"/>
-                    <w:jc w:val="left"/>
-                    <w:jc w:val="center"/>
-                  </w:pPr>
-                  <w:r>
-                    <w:t xml:space="preserve">Length of emergency department stay</w:t>
-                  </w:r>
-                </w:p>
-              </w:tc>
-              <w:tc>
-                <w:tcPr/>
-                <w:p>
-                  <w:pPr>
-                    <w:pStyle w:val="Compact"/>
-                  </w:pPr>
-                </w:p>
-              </w:tc>
-              <w:tc>
-                <w:tcPr/>
-                <w:p>
-                  <w:pPr>
-                    <w:pStyle w:val="Compact"/>
-                  </w:pPr>
-                </w:p>
-              </w:tc>
-              <w:tc>
-                <w:tcPr/>
-                <w:p>
-                  <w:pPr>
-                    <w:pStyle w:val="Compact"/>
-                  </w:pPr>
-                </w:p>
-              </w:tc>
-              <w:tc>
-                <w:tcPr/>
-                <w:p>
-                  <w:pPr>
-                    <w:pStyle w:val="Compact"/>
-                  </w:pPr>
-                </w:p>
-              </w:tc>
-            </w:tr>
-            <w:tr>
-              <w:tc>
-                <w:tcPr/>
-                <w:p>
-                  <w:pPr>
-                    <w:pStyle w:val="Compact"/>
-                    <w:jc w:val="left"/>
-                    <w:jc w:val="center"/>
-                  </w:pPr>
-                  <w:r>
-                    <w:t xml:space="preserve">Length of hospital stay</w:t>
-                  </w:r>
-                </w:p>
-              </w:tc>
-              <w:tc>
-                <w:tcPr/>
-                <w:p>
-                  <w:pPr>
-                    <w:pStyle w:val="Compact"/>
-                  </w:pPr>
-                </w:p>
-              </w:tc>
-              <w:tc>
-                <w:tcPr/>
-                <w:p>
-                  <w:pPr>
-                    <w:pStyle w:val="Compact"/>
-                  </w:pPr>
-                </w:p>
-              </w:tc>
-              <w:tc>
-                <w:tcPr/>
-                <w:p>
-                  <w:pPr>
-                    <w:pStyle w:val="Compact"/>
-                  </w:pPr>
-                </w:p>
-              </w:tc>
-              <w:tc>
-                <w:tcPr/>
-                <w:p>
-                  <w:pPr>
-                    <w:pStyle w:val="Compact"/>
-                  </w:pPr>
-                </w:p>
-              </w:tc>
-            </w:tr>
-            <w:tr>
-              <w:tc>
-                <w:tcPr/>
-                <w:p>
-                  <w:pPr>
-                    <w:pStyle w:val="Compact"/>
-                    <w:jc w:val="left"/>
-                    <w:jc w:val="center"/>
-                  </w:pPr>
-                  <w:r>
-                    <w:t xml:space="preserve">Intensive care unit (ICU) admission</w:t>
-                  </w:r>
-                </w:p>
-              </w:tc>
-              <w:tc>
-                <w:tcPr/>
-                <w:p>
-                  <w:pPr>
-                    <w:pStyle w:val="Compact"/>
-                    <w:jc w:val="left"/>
-                    <w:jc w:val="center"/>
-                  </w:pPr>
-                  <w:r>
-                    <w:t xml:space="preserve">Mixed-effects binomial regression with logit link</w:t>
-                  </w:r>
-                </w:p>
-              </w:tc>
-              <w:tc>
-                <w:tcPr/>
-                <w:p>
-                  <w:pPr>
-                    <w:pStyle w:val="Compact"/>
-                    <w:jc w:val="left"/>
-                    <w:jc w:val="center"/>
-                  </w:pPr>
-                  <w:r>
-                    <w:t xml:space="preserve">Odds ratio</w:t>
-                  </w:r>
-                </w:p>
-              </w:tc>
-              <w:tc>
-                <w:tcPr/>
-                <w:p>
-                  <w:pPr>
-                    <w:pStyle w:val="Compact"/>
-                    <w:jc w:val="left"/>
-                    <w:jc w:val="center"/>
-                  </w:pPr>
-                  <w:r>
-                    <w:t xml:space="preserve">Death before ICU admission ascertainment; transfer</w:t>
-                  </w:r>
-                </w:p>
-              </w:tc>
-              <w:tc>
-                <w:tcPr/>
-                <w:p>
-                  <w:pPr>
-                    <w:pStyle w:val="Compact"/>
-                    <w:jc w:val="left"/>
-                    <w:jc w:val="center"/>
-                  </w:pPr>
-                  <w:r>
-                    <w:t xml:space="preserve">Treatment policy strategy using available data</w:t>
-                  </w:r>
-                </w:p>
-              </w:tc>
-            </w:tr>
-            <w:tr>
-              <w:tc>
-                <w:tcPr/>
-                <w:p>
-                  <w:pPr>
-                    <w:pStyle w:val="Compact"/>
-                    <w:jc w:val="left"/>
-                    <w:jc w:val="center"/>
-                  </w:pPr>
-                  <w:r>
-                    <w:t xml:space="preserve">Length of Intensive care unit admission stay</w:t>
-                  </w:r>
-                </w:p>
-              </w:tc>
-              <w:tc>
-                <w:tcPr/>
-                <w:p>
-                  <w:pPr>
-                    <w:pStyle w:val="Compact"/>
-                  </w:pPr>
-                </w:p>
-              </w:tc>
-              <w:tc>
-                <w:tcPr/>
-                <w:p>
-                  <w:pPr>
-                    <w:pStyle w:val="Compact"/>
-                  </w:pPr>
-                </w:p>
-              </w:tc>
-              <w:tc>
-                <w:tcPr/>
-                <w:p>
-                  <w:pPr>
-                    <w:pStyle w:val="Compact"/>
-                  </w:pPr>
-                </w:p>
-              </w:tc>
-              <w:tc>
-                <w:tcPr/>
-                <w:p>
-                  <w:pPr>
-                    <w:pStyle w:val="Compact"/>
-                  </w:pPr>
-                </w:p>
-              </w:tc>
-            </w:tr>
-            <w:tr>
-              <w:tc>
-                <w:tcPr/>
-                <w:p>
-                  <w:pPr>
-                    <w:pStyle w:val="Compact"/>
-                    <w:jc w:val="left"/>
-                    <w:jc w:val="center"/>
-                  </w:pPr>
-                  <w:r>
-                    <w:t xml:space="preserve">Return to work 30 days after ED arrival</w:t>
-                  </w:r>
-                </w:p>
-              </w:tc>
-              <w:tc>
-                <w:tcPr/>
-                <w:p>
-                  <w:pPr>
-                    <w:pStyle w:val="Compact"/>
-                    <w:jc w:val="left"/>
-                    <w:jc w:val="center"/>
-                  </w:pPr>
-                  <w:r>
-                    <w:t xml:space="preserve">Mixed-effects binomial regression with logit and identity links</w:t>
-                  </w:r>
-                </w:p>
-              </w:tc>
-              <w:tc>
-                <w:tcPr/>
-                <w:p>
-                  <w:pPr>
-                    <w:pStyle w:val="Compact"/>
-                    <w:jc w:val="left"/>
-                    <w:jc w:val="center"/>
-                  </w:pPr>
-                  <w:r>
-                    <w:t xml:space="preserve">Odds ratio</w:t>
-                  </w:r>
-                </w:p>
-              </w:tc>
-              <w:tc>
-                <w:tcPr/>
-                <w:p>
-                  <w:pPr>
-                    <w:pStyle w:val="Compact"/>
-                    <w:jc w:val="left"/>
-                    <w:jc w:val="center"/>
-                  </w:pPr>
-                  <w:r>
-                    <w:t xml:space="preserve">Death before assessment; withdrawal/loss to follow-up; outcome not relevant for some participants</w:t>
-                  </w:r>
-                </w:p>
-              </w:tc>
-              <w:tc>
-                <w:tcPr/>
-                <w:p>
-                  <w:pPr>
-                    <w:pStyle w:val="Compact"/>
-                    <w:jc w:val="left"/>
-                    <w:jc w:val="center"/>
-                  </w:pPr>
-                  <w:r>
-                    <w:t xml:space="preserve">While alive / outcome-defined population strategy</w:t>
-                  </w:r>
-                </w:p>
-              </w:tc>
-            </w:tr>
-            <w:tr>
-              <w:tc>
-                <w:tcPr/>
-                <w:p>
-                  <w:pPr>
-                    <w:pStyle w:val="Compact"/>
-                    <w:jc w:val="left"/>
-                    <w:jc w:val="center"/>
-                  </w:pPr>
-                  <w:r>
-                    <w:t xml:space="preserve">Return to work 3 months after ED arrival</w:t>
-                  </w:r>
-                </w:p>
-              </w:tc>
-              <w:tc>
-                <w:tcPr/>
-                <w:p>
-                  <w:pPr>
-                    <w:pStyle w:val="Compact"/>
-                    <w:jc w:val="left"/>
-                    <w:jc w:val="center"/>
-                  </w:pPr>
-                  <w:r>
-                    <w:t xml:space="preserve">Mixed-effects binomial regression with logit and identity links</w:t>
-                  </w:r>
-                </w:p>
-              </w:tc>
-              <w:tc>
-                <w:tcPr/>
-                <w:p>
-                  <w:pPr>
-                    <w:pStyle w:val="Compact"/>
-                    <w:jc w:val="left"/>
-                    <w:jc w:val="center"/>
-                  </w:pPr>
-                  <w:r>
-                    <w:t xml:space="preserve">Odds ratio</w:t>
-                  </w:r>
-                </w:p>
-              </w:tc>
-              <w:tc>
-                <w:tcPr/>
-                <w:p>
-                  <w:pPr>
-                    <w:pStyle w:val="Compact"/>
-                    <w:jc w:val="left"/>
-                    <w:jc w:val="center"/>
-                  </w:pPr>
-                  <w:r>
-                    <w:t xml:space="preserve">Death before assessment; withdrawal/loss to follow-up; outcome not relevant for some participants</w:t>
-                  </w:r>
-                </w:p>
-              </w:tc>
-              <w:tc>
-                <w:tcPr/>
-                <w:p>
-                  <w:pPr>
-                    <w:pStyle w:val="Compact"/>
-                    <w:jc w:val="left"/>
-                    <w:jc w:val="center"/>
-                  </w:pPr>
-                  <w:r>
-                    <w:t xml:space="preserve">While alive / outcome-defined population strategy</w:t>
-                  </w:r>
-                </w:p>
-              </w:tc>
-            </w:tr>
-            <w:tr>
-              <w:tc>
-                <w:tcPr/>
-                <w:p>
-                  <w:pPr>
-                    <w:pStyle w:val="Compact"/>
-                    <w:jc w:val="left"/>
-                    <w:jc w:val="center"/>
-                  </w:pPr>
-                  <w:r>
-                    <w:t xml:space="preserve">Adherence to ATLS® principles during initial resuscitation</w:t>
-                  </w:r>
-                </w:p>
-              </w:tc>
-              <w:tc>
-                <w:tcPr/>
-                <w:p>
-                  <w:pPr>
-                    <w:pStyle w:val="Compact"/>
-                    <w:jc w:val="left"/>
-                    <w:jc w:val="center"/>
-                  </w:pPr>
-                  <w:r>
-                    <w:t xml:space="preserve">Mixed-effects beta regression with logit link</w:t>
-                  </w:r>
-                </w:p>
-              </w:tc>
-              <w:tc>
-                <w:tcPr/>
-                <w:p>
-                  <w:pPr>
-                    <w:pStyle w:val="Compact"/>
-                    <w:jc w:val="left"/>
-                    <w:jc w:val="center"/>
-                  </w:pPr>
-                  <w:r>
-                    <w:t xml:space="preserve">Difference in expected adherence proportion on the logit scale</w:t>
-                  </w:r>
-                </w:p>
-              </w:tc>
-              <w:tc>
-                <w:tcPr/>
-                <w:p>
-                  <w:pPr>
-                    <w:pStyle w:val="Compact"/>
-                    <w:jc w:val="left"/>
-                    <w:jc w:val="center"/>
-                  </w:pPr>
-                  <w:r>
-                    <w:t xml:space="preserve">Failure to observe resuscitation; incomplete observation window</w:t>
-                  </w:r>
-                </w:p>
-              </w:tc>
-              <w:tc>
-                <w:tcPr/>
-                <w:p>
-                  <w:pPr>
-                    <w:pStyle w:val="Compact"/>
-                    <w:jc w:val="left"/>
-                    <w:jc w:val="center"/>
-                  </w:pPr>
-                  <w:r>
-                    <w:t xml:space="preserve">Treatment policy strategy for the observed nested sample</w:t>
-                  </w:r>
-                </w:p>
-              </w:tc>
-            </w:tr>
-            <w:tr>
-              <w:tc>
-                <w:tcPr/>
-                <w:p>
-                  <w:pPr>
-                    <w:pStyle w:val="Compact"/>
-                    <w:jc w:val="left"/>
-                    <w:jc w:val="center"/>
-                  </w:pPr>
-                  <w:r>
-                    <w:t xml:space="preserve">Quality of life within 7 days of discharge</w:t>
-                  </w:r>
-                </w:p>
-              </w:tc>
-              <w:tc>
-                <w:tcPr/>
-                <w:p>
-                  <w:pPr>
-                    <w:pStyle w:val="Compact"/>
-                    <w:jc w:val="left"/>
-                    <w:jc w:val="center"/>
-                  </w:pPr>
-                  <w:r>
-                    <w:t xml:space="preserve">Mixed-effects cumulative logit model for EQ-5D dimensions; linear mixed-effects model for VAS</w:t>
-                  </w:r>
-                </w:p>
-              </w:tc>
-              <w:tc>
-                <w:tcPr/>
-                <w:p>
-                  <w:pPr>
-                    <w:pStyle w:val="Compact"/>
-                    <w:jc w:val="left"/>
-                    <w:jc w:val="center"/>
-                  </w:pPr>
-                  <w:r>
-                    <w:t xml:space="preserve">Common odds ratio for ordinal dimensions; mean difference for VAS</w:t>
-                  </w:r>
-                </w:p>
-              </w:tc>
-              <w:tc>
-                <w:tcPr/>
-                <w:p>
-                  <w:pPr>
-                    <w:pStyle w:val="Compact"/>
-                    <w:jc w:val="left"/>
-                    <w:jc w:val="center"/>
-                  </w:pPr>
-                  <w:r>
-                    <w:t xml:space="preserve">Death before assessment; withdrawal from non-routine follow-up; loss to follow-up</w:t>
-                  </w:r>
-                </w:p>
-              </w:tc>
-              <w:tc>
-                <w:tcPr/>
-                <w:p>
-                  <w:pPr>
-                    <w:pStyle w:val="Compact"/>
-                    <w:jc w:val="left"/>
-                    <w:jc w:val="center"/>
-                  </w:pPr>
-                  <w:r>
-                    <w:t xml:space="preserve">While alive strategy: analysed among patients alive at the relevant time point; interpreted as conditional on survival</w:t>
-                  </w:r>
-                </w:p>
-              </w:tc>
-            </w:tr>
-            <w:tr>
-              <w:tc>
-                <w:tcPr/>
-                <w:p>
-                  <w:pPr>
-                    <w:pStyle w:val="Compact"/>
-                    <w:jc w:val="left"/>
-                    <w:jc w:val="center"/>
-                  </w:pPr>
-                  <w:r>
-                    <w:t xml:space="preserve">Quality of life 30 days after ED arrival</w:t>
-                  </w:r>
-                </w:p>
-              </w:tc>
-              <w:tc>
-                <w:tcPr/>
-                <w:p>
-                  <w:pPr>
-                    <w:pStyle w:val="Compact"/>
-                    <w:jc w:val="left"/>
-                    <w:jc w:val="center"/>
-                  </w:pPr>
-                  <w:r>
-                    <w:t xml:space="preserve">Mixed-effects cumulative logit model for EQ-5D dimensions; linear mixed-effects model for VAS</w:t>
-                  </w:r>
-                </w:p>
-              </w:tc>
-              <w:tc>
-                <w:tcPr/>
-                <w:p>
-                  <w:pPr>
-                    <w:pStyle w:val="Compact"/>
-                    <w:jc w:val="left"/>
-                    <w:jc w:val="center"/>
-                  </w:pPr>
-                  <w:r>
-                    <w:t xml:space="preserve">Common odds ratio for ordinal dimensions; mean difference for VAS</w:t>
-                  </w:r>
-                </w:p>
-              </w:tc>
-              <w:tc>
-                <w:tcPr/>
-                <w:p>
-                  <w:pPr>
-                    <w:pStyle w:val="Compact"/>
-                    <w:jc w:val="left"/>
-                    <w:jc w:val="center"/>
-                  </w:pPr>
-                  <w:r>
-                    <w:t xml:space="preserve">Death before 30 days; withdrawal from non-routine follow-up; loss to follow-up</w:t>
-                  </w:r>
-                </w:p>
-              </w:tc>
-              <w:tc>
-                <w:tcPr/>
-                <w:p>
-                  <w:pPr>
-                    <w:pStyle w:val="Compact"/>
-                    <w:jc w:val="left"/>
-                    <w:jc w:val="center"/>
-                  </w:pPr>
-                  <w:r>
-                    <w:t xml:space="preserve">While alive strategy</w:t>
-                  </w:r>
-                </w:p>
-              </w:tc>
-            </w:tr>
-            <w:tr>
-              <w:tc>
-                <w:tcPr/>
-                <w:p>
-                  <w:pPr>
-                    <w:pStyle w:val="Compact"/>
-                    <w:jc w:val="left"/>
-                    <w:jc w:val="center"/>
-                  </w:pPr>
-                  <w:r>
-                    <w:t xml:space="preserve">Quality of life 3 months after ED arrival</w:t>
-                  </w:r>
-                </w:p>
-              </w:tc>
-              <w:tc>
-                <w:tcPr/>
-                <w:p>
-                  <w:pPr>
-                    <w:pStyle w:val="Compact"/>
-                    <w:jc w:val="left"/>
-                    <w:jc w:val="center"/>
-                  </w:pPr>
-                  <w:r>
-                    <w:t xml:space="preserve">Mixed-effects cumulative logit model for EQ-5D dimensions; linear mixed-effects model for VAS</w:t>
-                  </w:r>
-                </w:p>
-              </w:tc>
-              <w:tc>
-                <w:tcPr/>
-                <w:p>
-                  <w:pPr>
-                    <w:pStyle w:val="Compact"/>
-                    <w:jc w:val="left"/>
-                    <w:jc w:val="center"/>
-                  </w:pPr>
-                  <w:r>
-                    <w:t xml:space="preserve">Common odds ratio for ordinal dimensions; mean difference for VAS</w:t>
-                  </w:r>
-                </w:p>
-              </w:tc>
-              <w:tc>
-                <w:tcPr/>
-                <w:p>
-                  <w:pPr>
-                    <w:pStyle w:val="Compact"/>
-                    <w:jc w:val="left"/>
-                    <w:jc w:val="center"/>
-                  </w:pPr>
-                  <w:r>
-                    <w:t xml:space="preserve">Death before 3 months; withdrawal from non-routine follow-up; loss to follow-up</w:t>
-                  </w:r>
-                </w:p>
-              </w:tc>
-              <w:tc>
-                <w:tcPr/>
-                <w:p>
-                  <w:pPr>
-                    <w:pStyle w:val="Compact"/>
-                    <w:jc w:val="left"/>
-                    <w:jc w:val="center"/>
-                  </w:pPr>
-                  <w:r>
-                    <w:t xml:space="preserve">While alive strategy</w:t>
-                  </w:r>
-                </w:p>
-              </w:tc>
-            </w:tr>
-            <w:tr>
-              <w:tc>
-                <w:tcPr/>
-                <w:p>
-                  <w:pPr>
-                    <w:pStyle w:val="Compact"/>
-                    <w:jc w:val="left"/>
-                    <w:jc w:val="center"/>
-                  </w:pPr>
-                  <w:r>
-                    <w:t xml:space="preserve">Disability within 7 days of discharge</w:t>
-                  </w:r>
-                </w:p>
-              </w:tc>
-              <w:tc>
-                <w:tcPr/>
-                <w:p>
-                  <w:pPr>
-                    <w:pStyle w:val="Compact"/>
-                    <w:jc w:val="left"/>
-                    <w:jc w:val="center"/>
-                  </w:pPr>
-                  <w:r>
-                    <w:t xml:space="preserve">Mixed-effects ordinal model for WHODAS domains; linear mixed-effects model for WHODAS summary score</w:t>
-                  </w:r>
-                </w:p>
-              </w:tc>
-              <w:tc>
-                <w:tcPr/>
-                <w:p>
-                  <w:pPr>
-                    <w:pStyle w:val="Compact"/>
-                    <w:jc w:val="left"/>
-                    <w:jc w:val="center"/>
-                  </w:pPr>
-                  <w:r>
-                    <w:t xml:space="preserve">Common odds ratio for ordinal domains; mean difference for summary score</w:t>
-                  </w:r>
-                </w:p>
-              </w:tc>
-              <w:tc>
-                <w:tcPr/>
-                <w:p>
-                  <w:pPr>
-                    <w:pStyle w:val="Compact"/>
-                    <w:jc w:val="left"/>
-                    <w:jc w:val="center"/>
-                  </w:pPr>
-                  <w:r>
-                    <w:t xml:space="preserve">Death before assessment; withdrawal from non-routine follow-up; loss to follow-up</w:t>
-                  </w:r>
-                </w:p>
-              </w:tc>
-              <w:tc>
-                <w:tcPr/>
-                <w:p>
-                  <w:pPr>
-                    <w:pStyle w:val="Compact"/>
-                    <w:jc w:val="left"/>
-                    <w:jc w:val="center"/>
-                  </w:pPr>
-                  <w:r>
-                    <w:t xml:space="preserve">While alive strategy</w:t>
-                  </w:r>
-                </w:p>
-              </w:tc>
-            </w:tr>
-            <w:tr>
-              <w:tc>
-                <w:tcPr/>
-                <w:p>
-                  <w:pPr>
-                    <w:pStyle w:val="Compact"/>
-                    <w:jc w:val="left"/>
-                    <w:jc w:val="center"/>
-                  </w:pPr>
-                  <w:r>
-                    <w:t xml:space="preserve">Disability 30 days after ED arrival</w:t>
-                  </w:r>
-                </w:p>
-              </w:tc>
-              <w:tc>
-                <w:tcPr/>
-                <w:p>
-                  <w:pPr>
-                    <w:pStyle w:val="Compact"/>
-                    <w:jc w:val="left"/>
-                    <w:jc w:val="center"/>
-                  </w:pPr>
-                  <w:r>
-                    <w:t xml:space="preserve">Mixed-effects ordinal model for WHODAS domains; linear mixed-effects model for WHODAS summary score</w:t>
-                  </w:r>
-                </w:p>
-              </w:tc>
-              <w:tc>
-                <w:tcPr/>
-                <w:p>
-                  <w:pPr>
-                    <w:pStyle w:val="Compact"/>
-                    <w:jc w:val="left"/>
-                    <w:jc w:val="center"/>
-                  </w:pPr>
-                  <w:r>
-                    <w:t xml:space="preserve">Common odds ratio for ordinal domains; mean difference for summary score</w:t>
-                  </w:r>
-                </w:p>
-              </w:tc>
-              <w:tc>
-                <w:tcPr/>
-                <w:p>
-                  <w:pPr>
-                    <w:pStyle w:val="Compact"/>
-                    <w:jc w:val="left"/>
-                    <w:jc w:val="center"/>
-                  </w:pPr>
-                  <w:r>
-                    <w:t xml:space="preserve">Death before 30 days; withdrawal from non-routine follow-up; loss to follow-up</w:t>
-                  </w:r>
-                </w:p>
-              </w:tc>
-              <w:tc>
-                <w:tcPr/>
-                <w:p>
-                  <w:pPr>
-                    <w:pStyle w:val="Compact"/>
-                    <w:jc w:val="left"/>
-                    <w:jc w:val="center"/>
-                  </w:pPr>
-                  <w:r>
-                    <w:t xml:space="preserve">While alive strategy</w:t>
-                  </w:r>
-                </w:p>
-              </w:tc>
-            </w:tr>
-            <w:tr>
-              <w:tc>
-                <w:tcPr/>
-                <w:p>
-                  <w:pPr>
-                    <w:pStyle w:val="Compact"/>
-                    <w:jc w:val="left"/>
-                    <w:jc w:val="center"/>
-                  </w:pPr>
-                  <w:r>
-                    <w:t xml:space="preserve">Disability 3 months after ED arrival</w:t>
-                  </w:r>
-                </w:p>
-              </w:tc>
-              <w:tc>
-                <w:tcPr/>
-                <w:p>
-                  <w:pPr>
-                    <w:pStyle w:val="Compact"/>
-                    <w:jc w:val="left"/>
-                    <w:jc w:val="center"/>
-                  </w:pPr>
-                  <w:r>
-                    <w:t xml:space="preserve">Mixed-effects ordinal model for WHODAS domains; linear mixed-effects model for WHODAS summary score</w:t>
-                  </w:r>
-                </w:p>
-              </w:tc>
-              <w:tc>
-                <w:tcPr/>
-                <w:p>
-                  <w:pPr>
-                    <w:pStyle w:val="Compact"/>
-                    <w:jc w:val="left"/>
-                    <w:jc w:val="center"/>
-                  </w:pPr>
-                  <w:r>
-                    <w:t xml:space="preserve">Common odds ratio for ordinal domains; mean difference for summary score</w:t>
-                  </w:r>
-                </w:p>
-              </w:tc>
-              <w:tc>
-                <w:tcPr/>
-                <w:p>
-                  <w:pPr>
-                    <w:pStyle w:val="Compact"/>
-                    <w:jc w:val="left"/>
-                    <w:jc w:val="center"/>
-                  </w:pPr>
-                  <w:r>
-                    <w:t xml:space="preserve">Death before 3 months; withdrawal from non-routine follow-up; loss to follow-up</w:t>
-                  </w:r>
-                </w:p>
-              </w:tc>
-              <w:tc>
-                <w:tcPr/>
-                <w:p>
-                  <w:pPr>
-                    <w:pStyle w:val="Compact"/>
-                    <w:jc w:val="left"/>
-                    <w:jc w:val="center"/>
-                  </w:pPr>
-                  <w:r>
-                    <w:t xml:space="preserve">While alive strategy</w:t>
-                  </w:r>
-                </w:p>
-              </w:tc>
-            </w:tr>
-          </w:tbl>
-          <w:bookmarkEnd w:id="63"/>
-          <w:p/>
-        </w:tc>
-      </w:tr>
-    </w:tbl>
-    <w:bookmarkEnd w:id="64"/>
-    <w:bookmarkEnd w:id="65"/>
-    <w:bookmarkEnd w:id="66"/>
-    <w:bookmarkStart w:id="67" w:name="statistical-hypotheses"/>
-    <w:p>
-      <w:pPr>
-        <w:pStyle w:val="Heading2"/>
-      </w:pPr>
-      <w:r>
-        <w:t xml:space="preserve">5.4 Statistical hypotheses</w:t>
-      </w:r>
-    </w:p>
-    <w:p>
-      <w:pPr>
-        <w:pStyle w:val="FirstParagraph"/>
-      </w:pPr>
-      <w:r>
-        <w:t xml:space="preserve">Our primary statistical hypotheses are:</w:t>
-      </w:r>
-    </w:p>
-    <w:p>
-      <w:pPr>
-        <w:pStyle w:val="Compact"/>
-        <w:numPr>
-          <w:ilvl w:val="0"/>
-          <w:numId w:val="1005"/>
-        </w:numPr>
-      </w:pPr>
-      <w:r>
-        <w:rPr>
-          <w:b/>
-          <w:bCs/>
-        </w:rPr>
-        <w:t xml:space="preserve">Null hypothesis</w:t>
-      </w:r>
-      <w:r>
-        <w:t xml:space="preserve">: There is no difference in the primary outcome of 30-day in-hospital mortality between those randomised to ATLS</w:t>
-      </w:r>
-      <w:r>
-        <w:rPr>
-          <w:vertAlign w:val="superscript"/>
-        </w:rPr>
-        <w:t xml:space="preserve">®</w:t>
-      </w:r>
-      <w:r>
-        <w:t xml:space="preserve"> </w:t>
-      </w:r>
-      <w:r>
-        <w:t xml:space="preserve">and standard care, meaning that the odds ratio (OR) for ATLS</w:t>
-      </w:r>
-      <w:r>
-        <w:rPr>
-          <w:vertAlign w:val="superscript"/>
-        </w:rPr>
-        <w:t xml:space="preserve">®</w:t>
-      </w:r>
-      <w:r>
-        <w:t xml:space="preserve"> </w:t>
-      </w:r>
-      <w:r>
-        <w:t xml:space="preserve">vs standard care would be 1 and the absolute risk difference (ARD) would be 0.</w:t>
-      </w:r>
-    </w:p>
-    <w:p>
-      <w:pPr>
-        <w:pStyle w:val="Compact"/>
-        <w:numPr>
-          <w:ilvl w:val="0"/>
-          <w:numId w:val="1005"/>
-        </w:numPr>
-      </w:pPr>
-      <w:r>
-        <w:rPr>
-          <w:b/>
-          <w:bCs/>
-        </w:rPr>
-        <w:t xml:space="preserve">Alternative hypothesis</w:t>
-      </w:r>
-      <w:r>
-        <w:t xml:space="preserve">: There is an absolute difference in the primary outcome of 30-day in-hospital mortality between those randomised to ATLS</w:t>
-      </w:r>
-      <w:r>
-        <w:rPr>
-          <w:vertAlign w:val="superscript"/>
-        </w:rPr>
-        <w:t xml:space="preserve">®</w:t>
-      </w:r>
-      <w:r>
-        <w:t xml:space="preserve"> </w:t>
-      </w:r>
-      <w:r>
-        <w:t xml:space="preserve">and standard care of at least 5% units, meaning that the OR for ATLS</w:t>
-      </w:r>
-      <w:r>
-        <w:rPr>
-          <w:vertAlign w:val="superscript"/>
-        </w:rPr>
-        <w:t xml:space="preserve">®</w:t>
-      </w:r>
-      <w:r>
-        <w:t xml:space="preserve"> </w:t>
-      </w:r>
-      <w:r>
-        <w:t xml:space="preserve">vs standard care would be different from 1 and the ARD would be different from 0. Our expectation, based on our pilot study and review of the literature, is that the OR will be less than 1 and the ARD will be less than 0, indicating lower odds of 30-day in-hospital mortality among those randomised to ATLS</w:t>
-      </w:r>
-      <w:r>
-        <w:rPr>
-          <w:vertAlign w:val="superscript"/>
-        </w:rPr>
-        <w:t xml:space="preserve">®</w:t>
-      </w:r>
-      <w:r>
-        <w:t xml:space="preserve"> </w:t>
-      </w:r>
-      <w:r>
-        <w:t xml:space="preserve">group compared to those randomised to the standard care group.</w:t>
-      </w:r>
-    </w:p>
-    <w:bookmarkEnd w:id="67"/>
-    <w:bookmarkStart w:id="74" w:name="sample-size-calculations"/>
-    <w:p>
-      <w:pPr>
-        <w:pStyle w:val="Heading2"/>
-      </w:pPr>
-      <w:r>
-        <w:t xml:space="preserve">5.5 Sample size calculations</w:t>
-      </w:r>
-    </w:p>
-    <w:bookmarkStart w:id="72" w:name="Xba08c803f10f7c8cd9a777b53b902d2761b3046"/>
-    <w:p>
-      <w:pPr>
-        <w:pStyle w:val="Heading3"/>
-      </w:pPr>
-      <w:r>
-        <w:t xml:space="preserve">5.5.1 Main stepped wedge design and primary outcome</w:t>
-      </w:r>
-    </w:p>
-    <w:p>
-      <w:pPr>
-        <w:pStyle w:val="FirstParagraph"/>
-      </w:pPr>
-      <w:r>
-        <w:t xml:space="preserve">With 30 clusters across 6 batches and a total sample size of 4320 our study has ~90% power across different combinations of cluster autocorrelations (CAC) and intra-cluster correlations (ICC) to detect a reduction in the primary outcome of in-hospital mortality within 30 days from 20% under standard care to 15% after ATLS</w:t>
-      </w:r>
-      <w:r>
-        <w:rPr>
-          <w:vertAlign w:val="superscript"/>
-        </w:rPr>
-        <w:t xml:space="preserve">®</w:t>
-      </w:r>
-      <w:r>
-        <w:t xml:space="preserve"> </w:t>
-      </w:r>
-      <w:r>
-        <w:t xml:space="preserve">training (see</w:t>
-      </w:r>
-      <w:r>
-        <w:t xml:space="preserve"> </w:t>
-      </w:r>
-      <w:hyperlink w:anchor="fig-power-curves">
-        <w:r>
-          <w:rPr>
-            <w:rStyle w:val="Hyperlink"/>
-          </w:rPr>
-          <w:t xml:space="preserve">Figure 3</w:t>
-        </w:r>
-      </w:hyperlink>
-      <w:r>
-        <w:t xml:space="preserve">)</w:t>
-      </w:r>
-      <w:r>
-        <w:rPr>
-          <w:vertAlign w:val="superscript"/>
-        </w:rPr>
-        <w:t xml:space="preserve">4</w:t>
-      </w:r>
-      <w:r>
-        <w:t xml:space="preserve">. This 5% absolute reduction in mortality is a clinically meaningful and conservative estimate based on our updated systematic review and pilot study</w:t>
-      </w:r>
-      <w:r>
-        <w:rPr>
-          <w:vertAlign w:val="superscript"/>
-        </w:rPr>
-        <w:t xml:space="preserve">5,6</w:t>
-      </w:r>
-      <w:r>
-        <w:t xml:space="preserve">. We allowed for the clustered design, incorporated the one month transition period, and assumed: a discrete time decay correlation structure, an ICC of 0.02 (but considered sensitivity across the range 0.01-0.05), and a CAC of 0.9 (but considered sensitivity across the range 0.8-1.0), based on our pilot study and current guidance</w:t>
-      </w:r>
-      <w:r>
-        <w:rPr>
-          <w:vertAlign w:val="superscript"/>
-        </w:rPr>
-        <w:t xml:space="preserve">7–10</w:t>
-      </w:r>
-      <w:r>
-        <w:t xml:space="preserve">. We included the CAC to allow for variation in clustering over time. We assume that each cluster will contribute approximately 12 observations per month to the analysis, but allowed for substantial variation in cluster sizes, based on our previous work.</w:t>
-      </w:r>
-    </w:p>
-    <w:tbl>
-      <w:tblPr>
-        <w:tblStyle w:val="Table"/>
-        <w:tblW w:type="pct" w:w="5000"/>
-        <w:tblLayout w:type="fixed"/>
-        <w:tblLook w:firstRow="0" w:lastRow="0" w:firstColumn="0" w:lastColumn="0" w:noHBand="0" w:noVBand="0" w:val="0000"/>
-      </w:tblPr>
-      <w:tblGrid>
-        <w:gridCol w:w="7920"/>
-      </w:tblGrid>
-      <w:tr>
-        <w:tc>
-          <w:tcPr/>
-          <w:bookmarkStart w:id="71" w:name="fig-power-curves"/>
+          <w:bookmarkStart w:id="70" w:name="fig-power-curves"/>
           <w:p>
             <w:pPr>
               <w:pStyle w:val="Compact"/>
@@ -4141,18 +1960,18 @@
                 <wp:inline>
                   <wp:extent cx="5334000" cy="2369551"/>
                   <wp:effectExtent b="0" l="0" r="0" t="0"/>
-                  <wp:docPr descr="" title="" id="69" name="Picture"/>
+                  <wp:docPr descr="" title="" id="68" name="Picture"/>
                   <a:graphic>
                     <a:graphicData uri="http://schemas.openxmlformats.org/drawingml/2006/picture">
                       <pic:pic>
                         <pic:nvPicPr>
-                          <pic:cNvPr descr="./combined-power-curves.png" id="70" name="Picture"/>
+                          <pic:cNvPr descr="./combined-power-curves.png" id="69" name="Picture"/>
                           <pic:cNvPicPr>
                             <a:picLocks noChangeArrowheads="1" noChangeAspect="1"/>
                           </pic:cNvPicPr>
                         </pic:nvPicPr>
                         <pic:blipFill>
-                          <a:blip r:embed="rId68"/>
+                          <a:blip r:embed="rId67"/>
                           <a:stretch>
                             <a:fillRect/>
                           </a:stretch>
@@ -4248,18 +2067,97 @@
               <w:t xml:space="preserve">training. Under this scenario, we would need to increase the sample size per month to around 30 observations to achieve 90% powere under most combinations of CAC and ICC.</w:t>
             </w:r>
           </w:p>
-          <w:bookmarkEnd w:id="71"/>
+          <w:bookmarkEnd w:id="70"/>
         </w:tc>
       </w:tr>
     </w:tbl>
+    <w:bookmarkEnd w:id="71"/>
+    <w:bookmarkStart w:id="72" w:name="X37fc7b5fe6b5980542d53d3e88dadde59566406"/>
+    <w:p>
+      <w:pPr>
+        <w:pStyle w:val="Heading3"/>
+      </w:pPr>
+      <w:r>
+        <w:t xml:space="preserve">5.5.2 Nested staircase design and secondary outcomes</w:t>
+      </w:r>
+    </w:p>
+    <w:p>
+      <w:pPr>
+        <w:pStyle w:val="FirstParagraph"/>
+      </w:pPr>
+      <w:r>
+        <w:t xml:space="preserve">The secondary outcomes that will be measured using the nested staircase design are adherence to ATLS</w:t>
+      </w:r>
+      <w:r>
+        <w:rPr>
+          <w:vertAlign w:val="superscript"/>
+        </w:rPr>
+        <w:t xml:space="preserve">®</w:t>
+      </w:r>
+      <w:r>
+        <w:t xml:space="preserve"> </w:t>
+      </w:r>
+      <w:r>
+        <w:t xml:space="preserve">principles during initial patient resuscitation, quality of life, and disability. The expected effect of the intervention on each of these outcomes are an improvement in adherence from 50% during standard care to 70% after training</w:t>
+      </w:r>
+      <w:r>
+        <w:rPr>
+          <w:vertAlign w:val="superscript"/>
+        </w:rPr>
+        <w:t xml:space="preserve">11</w:t>
+      </w:r>
+      <w:r>
+        <w:t xml:space="preserve">, an increase in EQ5D5L health status from 70 during care to 75 after training</w:t>
+      </w:r>
+      <w:r>
+        <w:rPr>
+          <w:vertAlign w:val="superscript"/>
+        </w:rPr>
+        <w:t xml:space="preserve">12</w:t>
+      </w:r>
+      <w:r>
+        <w:t xml:space="preserve">, and finally a decrease in disability from a baseline value of 25 during standard care to 22.5 after training</w:t>
+      </w:r>
+      <w:r>
+        <w:rPr>
+          <w:vertAlign w:val="superscript"/>
+        </w:rPr>
+        <w:t xml:space="preserve">13</w:t>
+      </w:r>
+      <w:r>
+        <w:t xml:space="preserve">. For quality of life and disability, these effects correspond to standardised effect sizes, expressed as Cohen’s d, of 0.5. With 30 clusters in total, six per sequence, for a discrete time decay correlation structure, with ICCs of 0.01 to 0.15 and a CAC of 0.8, there is &gt;80% power to detect these effects by including four patients in each cluster in each period. Accounting for loss to follow-up, we will include at least six patients per cluster per month. These patients will be a random subset of patients included in the primary outcome data collection during the staircase months. The random subset will be selected using simple random sampling on the shift level, meaning that the timing of the clinical research coordinator’s shift will be randomised to cover approximately eight hours during the morning, afternoon, or night shift. Adherence to ATLS</w:t>
+      </w:r>
+      <w:r>
+        <w:rPr>
+          <w:vertAlign w:val="superscript"/>
+        </w:rPr>
+        <w:t xml:space="preserve">®</w:t>
+      </w:r>
+      <w:r>
+        <w:t xml:space="preserve"> </w:t>
+      </w:r>
+      <w:r>
+        <w:t xml:space="preserve">principles, quality of life, and disability will be measured in all patients included during these shifts. In each hospital, the number of shifts that will be randomised will be determined by the volume of patients included during the months preceding the staircase months.</w:t>
+      </w:r>
+    </w:p>
     <w:bookmarkEnd w:id="72"/>
-    <w:bookmarkStart w:id="73" w:name="X37fc7b5fe6b5980542d53d3e88dadde59566406"/>
+    <w:bookmarkEnd w:id="73"/>
+    <w:bookmarkStart w:id="76" w:name="statistical-principles"/>
+    <w:p>
+      <w:pPr>
+        <w:pStyle w:val="Heading2"/>
+      </w:pPr>
+      <w:r>
+        <w:t xml:space="preserve">5.6 Statistical principles</w:t>
+      </w:r>
+    </w:p>
+    <w:bookmarkStart w:id="74" w:name="statistical-software"/>
     <w:p>
       <w:pPr>
         <w:pStyle w:val="Heading3"/>
       </w:pPr>
       <w:r>
-        <w:t xml:space="preserve">5.5.2 Nested staircase design and secondary outcomes</w:t>
+        <w:t xml:space="preserve">5.6.1 Statistical software</w:t>
       </w:r>
     </w:p>
     <w:p>
@@ -4267,78 +2165,81 @@
         <w:pStyle w:val="FirstParagraph"/>
       </w:pPr>
       <w:r>
-        <w:t xml:space="preserve">The secondary outcomes that will be measured using the nested staircase design are adherence to ATLS</w:t>
+        <w:t xml:space="preserve">We will use the R Statistical Software for all analyses</w:t>
       </w:r>
       <w:r>
         <w:rPr>
           <w:vertAlign w:val="superscript"/>
         </w:rPr>
-        <w:t xml:space="preserve">®</w:t>
-      </w:r>
-      <w:r>
-        <w:t xml:space="preserve"> </w:t>
-      </w:r>
-      <w:r>
-        <w:t xml:space="preserve">principles during initial patient resuscitation, quality of life, and disability. The expected effect of the intervention on each of these outcomes are an improvement in adherence from 50% during standard care to 70% after training</w:t>
+        <w:t xml:space="preserve">14</w:t>
+      </w:r>
+      <w:r>
+        <w:t xml:space="preserve">.</w:t>
+      </w:r>
+    </w:p>
+    <w:bookmarkEnd w:id="74"/>
+    <w:bookmarkStart w:id="75" w:name="Xb3701c3e4f516f3436ab2f14fbfd68958c11744"/>
+    <w:p>
+      <w:pPr>
+        <w:pStyle w:val="Heading3"/>
+      </w:pPr>
+      <w:r>
+        <w:t xml:space="preserve">5.6.2 Levels of statistical significance and confidence</w:t>
+      </w:r>
+    </w:p>
+    <w:p>
+      <w:pPr>
+        <w:pStyle w:val="FirstParagraph"/>
+      </w:pPr>
+      <w:r>
+        <w:t xml:space="preserve">We will use a two-sided significance level of 0.05 for all analyses, and we will report 95% confidence intervals (CI) for all estimates. We will not adjust for multiple testing because no secondary outcome is regarded as singularly more important.</w:t>
+      </w:r>
+    </w:p>
+    <w:bookmarkEnd w:id="75"/>
+    <w:bookmarkEnd w:id="76"/>
+    <w:bookmarkStart w:id="77" w:name="analysis-populations"/>
+    <w:p>
+      <w:pPr>
+        <w:pStyle w:val="Heading2"/>
+      </w:pPr>
+      <w:r>
+        <w:t xml:space="preserve">5.7 Analysis populations</w:t>
+      </w:r>
+    </w:p>
+    <w:p>
+      <w:pPr>
+        <w:pStyle w:val="FirstParagraph"/>
+      </w:pPr>
+      <w:r>
+        <w:t xml:space="preserve">The unit of randomisation is the hospital, because all units trained in the same hospital will be treated as one cluster, but the unit of analysis is the individual patient. The group allocation for a patient depends on the period in which the patient was admitted to the hospital, and patients will be considered exposed to the intervention if they were admitted to the hospital at any time point following the transition period. We will use an intention-to-treat approach for all analyses, according to the planned date of transition from standard care. We might consider a per protocol analysis if clusters deviate considerably from the planned date of transition, using the actual date of transition as the cut-off point. We will report the results of the per protocol analysis as a sensitivity analysis. We will use a CONSORT diagram to display the flow of hospitals, clusters and patients through the trial. We will present cluster level summaries of the intervention effect. We will report the study according to the CONSORT guidelines for stepped-wedge randomised trials</w:t>
       </w:r>
       <w:r>
         <w:rPr>
           <w:vertAlign w:val="superscript"/>
         </w:rPr>
-        <w:t xml:space="preserve">11</w:t>
-      </w:r>
-      <w:r>
-        <w:t xml:space="preserve">, an increase in EQ5D5L health status from 70 during care to 75 after training</w:t>
-      </w:r>
-      <w:r>
-        <w:rPr>
-          <w:vertAlign w:val="superscript"/>
-        </w:rPr>
-        <w:t xml:space="preserve">12</w:t>
-      </w:r>
-      <w:r>
-        <w:t xml:space="preserve">, and finally a decrease in disability from a baseline value of 25 during standard care to 22.5 after training</w:t>
-      </w:r>
-      <w:r>
-        <w:rPr>
-          <w:vertAlign w:val="superscript"/>
-        </w:rPr>
-        <w:t xml:space="preserve">13</w:t>
-      </w:r>
-      <w:r>
-        <w:t xml:space="preserve">. For quality of life and disability, these effects correspond to standardised effect sizes, expressed as Cohen’s d, of 0.5. With 30 clusters in total, six per sequence, for a discrete time decay correlation structure, with ICCs of 0.01 to 0.15 and a CAC of 0.8, there is &gt;80% power to detect these effects by including four patients in each cluster in each period. Accounting for loss to follow-up, we will include at least six patients per cluster per month. These patients will be a random subset of patients included in the primary outcome data collection during the staircase months. The random subset will be selected using simple random sampling on the shift level, meaning that the timing of the clinical research coordinator’s shift will be randomised to cover approximately eight hours during the morning, afternoon, or night shift. Adherence to ATLS</w:t>
-      </w:r>
-      <w:r>
-        <w:rPr>
-          <w:vertAlign w:val="superscript"/>
-        </w:rPr>
-        <w:t xml:space="preserve">®</w:t>
-      </w:r>
-      <w:r>
-        <w:t xml:space="preserve"> </w:t>
-      </w:r>
-      <w:r>
-        <w:t xml:space="preserve">principles, quality of life, and disability will be measured in all patients included during these shifts. In each hospital, the number of shifts that will be randomised will be determined by the volume of patients included during the months preceding the staircase months.</w:t>
-      </w:r>
-    </w:p>
-    <w:bookmarkEnd w:id="73"/>
-    <w:bookmarkEnd w:id="74"/>
-    <w:bookmarkStart w:id="77" w:name="statistical-principles"/>
+        <w:t xml:space="preserve">15</w:t>
+      </w:r>
+      <w:r>
+        <w:t xml:space="preserve">.</w:t>
+      </w:r>
+    </w:p>
+    <w:bookmarkEnd w:id="77"/>
+    <w:bookmarkStart w:id="80" w:name="baseline-analyses"/>
     <w:p>
       <w:pPr>
         <w:pStyle w:val="Heading2"/>
       </w:pPr>
       <w:r>
-        <w:t xml:space="preserve">5.6 Statistical principles</w:t>
-      </w:r>
-    </w:p>
-    <w:bookmarkStart w:id="75" w:name="statistical-software"/>
+        <w:t xml:space="preserve">5.8 Baseline analyses</w:t>
+      </w:r>
+    </w:p>
+    <w:bookmarkStart w:id="78" w:name="cluster-characteristics"/>
     <w:p>
       <w:pPr>
         <w:pStyle w:val="Heading3"/>
       </w:pPr>
       <w:r>
-        <w:t xml:space="preserve">5.6.1 Statistical software</w:t>
+        <w:t xml:space="preserve">5.8.1 Cluster characteristics</w:t>
       </w:r>
     </w:p>
     <w:p>
@@ -4346,26 +2247,17 @@
         <w:pStyle w:val="FirstParagraph"/>
       </w:pPr>
       <w:r>
-        <w:t xml:space="preserve">We will use the R Statistical Software for all analyses</w:t>
-      </w:r>
-      <w:r>
-        <w:rPr>
-          <w:vertAlign w:val="superscript"/>
-        </w:rPr>
-        <w:t xml:space="preserve">14</w:t>
-      </w:r>
-      <w:r>
-        <w:t xml:space="preserve">.</w:t>
-      </w:r>
-    </w:p>
-    <w:bookmarkEnd w:id="75"/>
-    <w:bookmarkStart w:id="76" w:name="Xb3701c3e4f516f3436ab2f14fbfd68958c11744"/>
+        <w:t xml:space="preserve">We will describe cluster characteristics including location and size using frequencies and percentages for discrete variables and means, standard deviations, medians and interquartile ranges (Q1-Q3) for continuous variables.</w:t>
+      </w:r>
+    </w:p>
+    <w:bookmarkEnd w:id="78"/>
+    <w:bookmarkStart w:id="79" w:name="patient-characteristics"/>
     <w:p>
       <w:pPr>
         <w:pStyle w:val="Heading3"/>
       </w:pPr>
       <w:r>
-        <w:t xml:space="preserve">5.6.2 Levels of statistical significance and confidence</w:t>
+        <w:t xml:space="preserve">5.8.2 Patient characteristics</w:t>
       </w:r>
     </w:p>
     <w:p>
@@ -4373,18 +2265,18 @@
         <w:pStyle w:val="FirstParagraph"/>
       </w:pPr>
       <w:r>
-        <w:t xml:space="preserve">We will use a two-sided significance level of 0.05 for all analyses, and we will report 95% confidence intervals (CI) for all estimates. We will not adjust for multiple testing because no secondary outcome is regarded as singularly more important.</w:t>
-      </w:r>
-    </w:p>
-    <w:bookmarkEnd w:id="76"/>
-    <w:bookmarkEnd w:id="77"/>
-    <w:bookmarkStart w:id="78" w:name="analysis-populations"/>
+        <w:t xml:space="preserve">We will describe patient characteristics at baseline, meaning all pre-training periods, per treatment group and overall using frequencies and percentages for discrete variables and means, standard deviations, medians and interquartile ranges (Q1-Q3) for continuous variables. We will not adjust for clustering when presenting baseline characteristics.</w:t>
+      </w:r>
+    </w:p>
+    <w:bookmarkEnd w:id="79"/>
+    <w:bookmarkEnd w:id="80"/>
+    <w:bookmarkStart w:id="81" w:name="interim-analysis"/>
     <w:p>
       <w:pPr>
         <w:pStyle w:val="Heading2"/>
       </w:pPr>
       <w:r>
-        <w:t xml:space="preserve">5.7 Analysis populations</w:t>
+        <w:t xml:space="preserve">5.9 Interim analysis</w:t>
       </w:r>
     </w:p>
     <w:p>
@@ -4392,84 +2284,11 @@
         <w:pStyle w:val="FirstParagraph"/>
       </w:pPr>
       <w:r>
-        <w:t xml:space="preserve">The unit of randomisation is the hospital, because all units trained in the same hospital will be treated as one cluster, but the unit of analysis is the individual patient. The group allocation for a patient depends on the period in which the patient was admitted to the hospital, and patients will be considered exposed to the intervention if they were admitted to the hospital at any time point following the transition period. We will use an intention-to-treat approach for all analyses, according to the planned date of transition from standard care. We might consider a per protocol analysis if clusters deviate considerably from the planned date of transition, using the actual date of transition as the cut-off point. We will report the results of the per protocol analysis as a sensitivity analysis. We will use a CONSORT diagram to display the flow of hospitals, clusters and patients through the trial. We will present cluster level summaries of the intervention effect. We will report the study according to the CONSORT guidelines for stepped-wedge randomised trials</w:t>
-      </w:r>
-      <w:r>
-        <w:rPr>
-          <w:vertAlign w:val="superscript"/>
-        </w:rPr>
-        <w:t xml:space="preserve">15</w:t>
-      </w:r>
-      <w:r>
-        <w:t xml:space="preserve">.</w:t>
-      </w:r>
-    </w:p>
-    <w:bookmarkEnd w:id="78"/>
-    <w:bookmarkStart w:id="81" w:name="baseline-analyses"/>
-    <w:p>
-      <w:pPr>
-        <w:pStyle w:val="Heading2"/>
-      </w:pPr>
-      <w:r>
-        <w:t xml:space="preserve">5.8 Baseline analyses</w:t>
-      </w:r>
-    </w:p>
-    <w:bookmarkStart w:id="79" w:name="cluster-characteristics"/>
-    <w:p>
-      <w:pPr>
-        <w:pStyle w:val="Heading3"/>
-      </w:pPr>
-      <w:r>
-        <w:t xml:space="preserve">5.8.1 Cluster characteristics</w:t>
-      </w:r>
-    </w:p>
-    <w:p>
-      <w:pPr>
-        <w:pStyle w:val="FirstParagraph"/>
-      </w:pPr>
-      <w:r>
-        <w:t xml:space="preserve">We will describe cluster characteristics including location and size using frequencies and percentages for discrete variables and means, standard deviations, medians and interquartile ranges (Q1-Q3) for continuous variables.</w:t>
-      </w:r>
-    </w:p>
-    <w:bookmarkEnd w:id="79"/>
-    <w:bookmarkStart w:id="80" w:name="patient-characteristics"/>
-    <w:p>
-      <w:pPr>
-        <w:pStyle w:val="Heading3"/>
-      </w:pPr>
-      <w:r>
-        <w:t xml:space="preserve">5.8.2 Patient characteristics</w:t>
-      </w:r>
-    </w:p>
-    <w:p>
-      <w:pPr>
-        <w:pStyle w:val="FirstParagraph"/>
-      </w:pPr>
-      <w:r>
-        <w:t xml:space="preserve">We will describe patient characteristics at baseline, meaning all pre-training periods, per treatment group and overall using frequencies and percentages for discrete variables and means, standard deviations, medians and interquartile ranges (Q1-Q3) for continuous variables. We will not adjust for clustering when presenting baseline characteristics.</w:t>
-      </w:r>
-    </w:p>
-    <w:bookmarkEnd w:id="80"/>
+        <w:t xml:space="preserve">There will be one interim analysis after half of the batches have completed the trial. The interim analysis will be assessed by the joint Trial Steering and Data Monitoring Committee. The purposes of this interim analysis will be to assess the trial’s feasibility and recommend that the trial be stopped if it is not feasible (e.g. if hospitals fail to adhere to the randomisation schedule or if there are substantial missing data in outcomes), and to compare characteristics across intervention conditions to monitor for differential recruitment/ascertainment between the intervention and control groups. No efficacy stopping is planned because any estimates obtained at the time point of the interim analysis will be associated with major statistical uncertainties.</w:t>
+      </w:r>
+    </w:p>
     <w:bookmarkEnd w:id="81"/>
-    <w:bookmarkStart w:id="82" w:name="interim-analysis"/>
-    <w:p>
-      <w:pPr>
-        <w:pStyle w:val="Heading2"/>
-      </w:pPr>
-      <w:r>
-        <w:t xml:space="preserve">5.9 Interim analysis</w:t>
-      </w:r>
-    </w:p>
-    <w:p>
-      <w:pPr>
-        <w:pStyle w:val="FirstParagraph"/>
-      </w:pPr>
-      <w:r>
-        <w:t xml:space="preserve">There will be one interim analysis after half of the batches have completed the trial. The interim analysis will be assessed by the joint Trial Steering and Data Monitoring Committee. The purposes of this interim analysis will be to assess the trial’s feasibility and recommend that the trial be stopped if it is not feasible (e.g. if hospitals fail to adhere to the randomisation schedule or if there are substantial missing data in outcomes), and to compare characteristics across intervention conditions to monitor for differential recruitment/ascertainment between the intervention and control groups. No efficacy stopping is planned because any estimates obtained at the time point of the interim analysis will be associated with major statistical uncertainties.</w:t>
-      </w:r>
-    </w:p>
-    <w:bookmarkEnd w:id="82"/>
-    <w:bookmarkStart w:id="104" w:name="analysis-of-the-primary-outcome"/>
+    <w:bookmarkStart w:id="103" w:name="analysis-of-the-primary-outcome"/>
     <w:p>
       <w:pPr>
         <w:pStyle w:val="Heading2"/>
@@ -4547,7 +2366,7 @@
       <w:pPr>
         <w:pStyle w:val="FirstParagraph"/>
       </w:pPr>
-      <w:bookmarkStart w:id="83" w:name="eq-primary-model"/>
+      <w:bookmarkStart w:id="82" w:name="eq-primary-model"/>
       <m:oMathPara>
         <m:oMathParaPr>
           <m:jc m:val="center"/>
@@ -4734,7 +2553,7 @@
           </m:d>
         </m:oMath>
       </m:oMathPara>
-      <w:bookmarkEnd w:id="83"/>
+      <w:bookmarkEnd w:id="82"/>
     </w:p>
     <w:p>
       <w:pPr>
@@ -4773,7 +2592,7 @@
       <w:pPr>
         <w:pStyle w:val="FirstParagraph"/>
       </w:pPr>
-      <w:bookmarkStart w:id="84" w:name="eq-simplified-random-effects-model"/>
+      <w:bookmarkStart w:id="83" w:name="eq-simplified-random-effects-model"/>
       <m:oMathPara>
         <m:oMathParaPr>
           <m:jc m:val="center"/>
@@ -4936,7 +2755,7 @@
           </m:d>
         </m:oMath>
       </m:oMathPara>
-      <w:bookmarkEnd w:id="84"/>
+      <w:bookmarkEnd w:id="83"/>
     </w:p>
     <w:p>
       <w:pPr>
@@ -4975,7 +2794,7 @@
       <w:pPr>
         <w:pStyle w:val="FirstParagraph"/>
       </w:pPr>
-      <w:bookmarkStart w:id="85" w:name="eq-shared-period-model"/>
+      <w:bookmarkStart w:id="84" w:name="eq-shared-period-model"/>
       <m:oMathPara>
         <m:oMathParaPr>
           <m:jc m:val="center"/>
@@ -5159,7 +2978,7 @@
           </m:d>
         </m:oMath>
       </m:oMathPara>
-      <w:bookmarkEnd w:id="85"/>
+      <w:bookmarkEnd w:id="84"/>
     </w:p>
     <w:p>
       <w:pPr>
@@ -5198,7 +3017,7 @@
       <w:pPr>
         <w:pStyle w:val="FirstParagraph"/>
       </w:pPr>
-      <w:bookmarkStart w:id="86" w:name="eq-combined-simplified-model"/>
+      <w:bookmarkStart w:id="85" w:name="eq-combined-simplified-model"/>
       <m:oMathPara>
         <m:oMathParaPr>
           <m:jc m:val="center"/>
@@ -5358,7 +3177,7 @@
           </m:d>
         </m:oMath>
       </m:oMathPara>
-      <w:bookmarkEnd w:id="86"/>
+      <w:bookmarkEnd w:id="85"/>
     </w:p>
     <w:p>
       <w:pPr>
@@ -6199,7 +4018,7 @@
       <w:pPr>
         <w:pStyle w:val="BodyText"/>
       </w:pPr>
-      <w:bookmarkStart w:id="87" w:name="eq-distributional-assumptions"/>
+      <w:bookmarkStart w:id="86" w:name="eq-distributional-assumptions"/>
       <m:oMathPara>
         <m:oMathParaPr>
           <m:jc m:val="center"/>
@@ -6475,7 +4294,7 @@
           </m:d>
         </m:oMath>
       </m:oMathPara>
-      <w:bookmarkEnd w:id="87"/>
+      <w:bookmarkEnd w:id="86"/>
     </w:p>
     <w:p>
       <w:pPr>
@@ -6502,7 +4321,7 @@
         <w:t xml:space="preserve">All models will be fitted using residual pseudo-likelihood estimation based on linearisation with subject-specific expansion (RSPL), due to its computational stability and robust performance in small-sample settings. If the binomial model with the logit link converges but the corresponding model with the identity link does not, then we will report only an OR.</w:t>
       </w:r>
     </w:p>
-    <w:bookmarkStart w:id="100" w:name="sensitivity-analyses"/>
+    <w:bookmarkStart w:id="99" w:name="sensitivity-analyses"/>
     <w:p>
       <w:pPr>
         <w:pStyle w:val="Heading3"/>
@@ -6530,7 +4349,7 @@
         <w:t xml:space="preserve">. Unless otherwise stated, each sensitivity analysis will be operationalised using two separate models, one with the logit link and one with the identity link.</w:t>
       </w:r>
     </w:p>
-    <w:bookmarkStart w:id="89" w:name="X22dda602ebb4652e0fd291705062d91648ada05"/>
+    <w:bookmarkStart w:id="88" w:name="X22dda602ebb4652e0fd291705062d91648ada05"/>
     <w:p>
       <w:pPr>
         <w:pStyle w:val="Heading4"/>
@@ -6573,7 +4392,7 @@
       <w:pPr>
         <w:pStyle w:val="BodyText"/>
       </w:pPr>
-      <w:bookmarkStart w:id="88" w:name="eq-ar1"/>
+      <w:bookmarkStart w:id="87" w:name="eq-ar1"/>
       <m:oMathPara>
         <m:oMathParaPr>
           <m:jc m:val="center"/>
@@ -6751,7 +4570,7 @@
           </m:d>
         </m:oMath>
       </m:oMathPara>
-      <w:bookmarkEnd w:id="88"/>
+      <w:bookmarkEnd w:id="87"/>
     </w:p>
     <w:p>
       <w:pPr>
@@ -6912,8 +4731,8 @@
         <w:t xml:space="preserve">is not directly equivalent to parameters used in other specifications and should not be interpreted interchangeably.</w:t>
       </w:r>
     </w:p>
-    <w:bookmarkEnd w:id="89"/>
-    <w:bookmarkStart w:id="91" w:name="X265de50a776706f6d9ec7b4549b866a94e548a1"/>
+    <w:bookmarkEnd w:id="88"/>
+    <w:bookmarkStart w:id="90" w:name="X265de50a776706f6d9ec7b4549b866a94e548a1"/>
     <w:p>
       <w:pPr>
         <w:pStyle w:val="Heading4"/>
@@ -6948,7 +4767,7 @@
       <w:pPr>
         <w:pStyle w:val="BodyText"/>
       </w:pPr>
-      <w:bookmarkStart w:id="90" w:name="eq-model-batch-trend"/>
+      <w:bookmarkStart w:id="89" w:name="eq-model-batch-trend"/>
       <m:oMathPara>
         <m:oMathParaPr>
           <m:jc m:val="center"/>
@@ -7156,7 +4975,7 @@
           </m:d>
         </m:oMath>
       </m:oMathPara>
-      <w:bookmarkEnd w:id="90"/>
+      <w:bookmarkEnd w:id="89"/>
     </w:p>
     <w:p>
       <w:pPr>
@@ -7217,8 +5036,8 @@
         <w:t xml:space="preserve">, capturing between-batch variation in secular trends over time.</w:t>
       </w:r>
     </w:p>
-    <w:bookmarkEnd w:id="91"/>
-    <w:bookmarkStart w:id="93" w:name="X831bc7e780a434f5c3512e5d33d43284b7d37ce"/>
+    <w:bookmarkEnd w:id="90"/>
+    <w:bookmarkStart w:id="92" w:name="X831bc7e780a434f5c3512e5d33d43284b7d37ce"/>
     <w:p>
       <w:pPr>
         <w:pStyle w:val="Heading4"/>
@@ -7253,7 +5072,7 @@
       <w:pPr>
         <w:pStyle w:val="BodyText"/>
       </w:pPr>
-      <w:bookmarkStart w:id="92" w:name="eq-model-random-cluster-intervention"/>
+      <w:bookmarkStart w:id="91" w:name="eq-model-random-cluster-intervention"/>
       <m:oMathPara>
         <m:oMathParaPr>
           <m:jc m:val="center"/>
@@ -7479,7 +5298,7 @@
           </m:d>
         </m:oMath>
       </m:oMathPara>
-      <w:bookmarkEnd w:id="92"/>
+      <w:bookmarkEnd w:id="91"/>
     </w:p>
     <w:p>
       <w:pPr>
@@ -7654,8 +5473,8 @@
         <w:t xml:space="preserve">.</w:t>
       </w:r>
     </w:p>
-    <w:bookmarkEnd w:id="93"/>
-    <w:bookmarkStart w:id="95" w:name="X0324ad02af1274e3e5fe3c1dbe99d3dad84fc47"/>
+    <w:bookmarkEnd w:id="92"/>
+    <w:bookmarkStart w:id="94" w:name="X0324ad02af1274e3e5fe3c1dbe99d3dad84fc47"/>
     <w:p>
       <w:pPr>
         <w:pStyle w:val="Heading4"/>
@@ -7768,7 +5587,7 @@
       <w:pPr>
         <w:pStyle w:val="BodyText"/>
       </w:pPr>
-      <w:bookmarkStart w:id="94" w:name="eq-model-correlated-random-effects"/>
+      <w:bookmarkStart w:id="93" w:name="eq-model-correlated-random-effects"/>
       <m:oMathPara>
         <m:oMathParaPr>
           <m:jc m:val="center"/>
@@ -7994,7 +5813,7 @@
           </m:d>
         </m:oMath>
       </m:oMathPara>
-      <w:bookmarkEnd w:id="94"/>
+      <w:bookmarkEnd w:id="93"/>
     </w:p>
     <w:p>
       <w:pPr>
@@ -8384,8 +6203,8 @@
         </m:oMath>
       </m:oMathPara>
     </w:p>
-    <w:bookmarkEnd w:id="95"/>
-    <w:bookmarkStart w:id="97" w:name="Xb7b1d3ff7c24f0b8dca2081a41dd1947ef59e07"/>
+    <w:bookmarkEnd w:id="94"/>
+    <w:bookmarkStart w:id="96" w:name="Xb7b1d3ff7c24f0b8dca2081a41dd1947ef59e07"/>
     <w:p>
       <w:pPr>
         <w:pStyle w:val="Heading4"/>
@@ -8429,7 +6248,7 @@
       <w:pPr>
         <w:pStyle w:val="BodyText"/>
       </w:pPr>
-      <w:bookmarkStart w:id="96" w:name="eq-spline-model"/>
+      <w:bookmarkStart w:id="95" w:name="eq-spline-model"/>
       <m:oMathPara>
         <m:oMathParaPr>
           <m:jc m:val="center"/>
@@ -8706,7 +6525,7 @@
           </m:d>
         </m:oMath>
       </m:oMathPara>
-      <w:bookmarkEnd w:id="96"/>
+      <w:bookmarkEnd w:id="95"/>
     </w:p>
     <w:p>
       <w:pPr>
@@ -8868,8 +6687,8 @@
         <w:t xml:space="preserve">th spline basis function.</w:t>
       </w:r>
     </w:p>
-    <w:bookmarkEnd w:id="97"/>
-    <w:bookmarkStart w:id="99" w:name="models-exploring-lag-and-weaning-effects"/>
+    <w:bookmarkEnd w:id="96"/>
+    <w:bookmarkStart w:id="98" w:name="models-exploring-lag-and-weaning-effects"/>
     <w:p>
       <w:pPr>
         <w:pStyle w:val="Heading4"/>
@@ -8904,7 +6723,7 @@
       <w:pPr>
         <w:pStyle w:val="BodyText"/>
       </w:pPr>
-      <w:bookmarkStart w:id="98" w:name="eq-lag-weaning-model"/>
+      <w:bookmarkStart w:id="97" w:name="eq-lag-weaning-model"/>
       <m:oMathPara>
         <m:oMathParaPr>
           <m:jc m:val="center"/>
@@ -9155,7 +6974,7 @@
           </m:d>
         </m:oMath>
       </m:oMathPara>
-      <w:bookmarkEnd w:id="98"/>
+      <w:bookmarkEnd w:id="97"/>
     </w:p>
     <w:p>
       <w:pPr>
@@ -9221,9 +7040,9 @@
         <w:t xml:space="preserve">is the number of periods since first exposure.</w:t>
       </w:r>
     </w:p>
+    <w:bookmarkEnd w:id="98"/>
     <w:bookmarkEnd w:id="99"/>
-    <w:bookmarkEnd w:id="100"/>
-    <w:bookmarkStart w:id="101" w:name="adjusted-analyses"/>
+    <w:bookmarkStart w:id="100" w:name="adjusted-analyses"/>
     <w:p>
       <w:pPr>
         <w:pStyle w:val="Heading3"/>
@@ -9343,8 +7162,8 @@
         <w:t xml:space="preserve">as fixed effects. We will model the continuous covariates assuming linear effects. We will assume no interaction between subgroups and secular time trends, which may be evaluated in future analyses if indicated.</w:t>
       </w:r>
     </w:p>
-    <w:bookmarkEnd w:id="101"/>
-    <w:bookmarkStart w:id="102" w:name="subgroup-analyses"/>
+    <w:bookmarkEnd w:id="100"/>
+    <w:bookmarkStart w:id="101" w:name="subgroup-analyses"/>
     <w:p>
       <w:pPr>
         <w:pStyle w:val="Heading3"/>
@@ -9470,14 +7289,33 @@
         <w:t xml:space="preserve">.</w:t>
       </w:r>
     </w:p>
+    <w:bookmarkEnd w:id="101"/>
+    <w:bookmarkStart w:id="102" w:name="treatment-of-missing-data"/>
+    <w:p>
+      <w:pPr>
+        <w:pStyle w:val="Heading3"/>
+      </w:pPr>
+      <w:r>
+        <w:t xml:space="preserve">5.10.4 Treatment of missing data</w:t>
+      </w:r>
+    </w:p>
+    <w:p>
+      <w:pPr>
+        <w:pStyle w:val="FirstParagraph"/>
+      </w:pPr>
+      <w:r>
+        <w:t xml:space="preserve">We will present the frequency and percentage of missing data for all variables. If the percentage of missing data for the primary outcome is less than 10%, we will perform a complete case analysis. If the percentage of missing data for the primary outcome is 10% or more, we will handle missing data depending on the missing data mechanism. If the data are missing at random (MAR), we will perform multiple imputation using multiple imputation by chained equations (MICE), imputing data for the primary outcome as well as all covariates included in the fully adjusted model. The number of imputations will be determined by the percentage of missing data, with a minimum of 20 imputations. If there is evidence that the data are missing not at random (MNAR), we will explore the impact of this assumption using a sensitivity analysis (e.g., pattern mixture models or selection models) to assess how robust our findings are to different assumptions about the missing data mechanism. Evidence that data are MNAR may include systematic differences in missingness across observed covariates, patterns suggestive of non-random dropout, or clinical expectations that missingness is related to unmeasured outcomes. Additionally, we will perform diagnostic checks after multiple imputation to ensure the quality of the imputation process, including comparing distributions of observed and imputed data and checking convergence.</w:t>
+      </w:r>
+    </w:p>
     <w:bookmarkEnd w:id="102"/>
-    <w:bookmarkStart w:id="103" w:name="treatment-of-missing-data"/>
-    <w:p>
-      <w:pPr>
-        <w:pStyle w:val="Heading3"/>
-      </w:pPr>
-      <w:r>
-        <w:t xml:space="preserve">5.10.4 Treatment of missing data</w:t>
+    <w:bookmarkEnd w:id="103"/>
+    <w:bookmarkStart w:id="117" w:name="analysis-of-secondary-outcomes"/>
+    <w:p>
+      <w:pPr>
+        <w:pStyle w:val="Heading2"/>
+      </w:pPr>
+      <w:r>
+        <w:t xml:space="preserve">5.11 Analysis of secondary outcomes</w:t>
       </w:r>
     </w:p>
     <w:p>
@@ -9485,29 +7323,10 @@
         <w:pStyle w:val="FirstParagraph"/>
       </w:pPr>
       <w:r>
-        <w:t xml:space="preserve">We will present the frequency and percentage of missing data for all variables. If the percentage of missing data for the primary outcome is less than 10%, we will perform a complete case analysis. If the percentage of missing data for the primary outcome is 10% or more, we will handle missing data depending on the missing data mechanism. If the data are missing at random (MAR), we will perform multiple imputation using multiple imputation by chained equations (MICE), imputing data for the primary outcome as well as all covariates included in the fully adjusted model. The number of imputations will be determined by the percentage of missing data, with a minimum of 20 imputations. If there is evidence that the data are missing not at random (MNAR), we will explore the impact of this assumption using a sensitivity analysis (e.g., pattern mixture models or selection models) to assess how robust our findings are to different assumptions about the missing data mechanism. Evidence that data are MNAR may include systematic differences in missingness across observed covariates, patterns suggestive of non-random dropout, or clinical expectations that missingness is related to unmeasured outcomes. Additionally, we will perform diagnostic checks after multiple imputation to ensure the quality of the imputation process, including comparing distributions of observed and imputed data and checking convergence.</w:t>
-      </w:r>
-    </w:p>
-    <w:bookmarkEnd w:id="103"/>
-    <w:bookmarkEnd w:id="104"/>
-    <w:bookmarkStart w:id="118" w:name="analysis-of-secondary-outcomes"/>
-    <w:p>
-      <w:pPr>
-        <w:pStyle w:val="Heading2"/>
-      </w:pPr>
-      <w:r>
-        <w:t xml:space="preserve">5.11 Analysis of secondary outcomes</w:t>
-      </w:r>
-    </w:p>
-    <w:p>
-      <w:pPr>
-        <w:pStyle w:val="FirstParagraph"/>
-      </w:pPr>
-      <w:r>
         <w:t xml:space="preserve">Unless otherwise stated, secondary outcomes will be analysed using the same mixed-effects modelling framework as specified for the primary outcome, including fixed effects for time and intervention exposure and random effects for cluster and cluster-by-period, with the link function and outcome distribution adapted to the scale of the outcome.</w:t>
       </w:r>
     </w:p>
-    <w:bookmarkStart w:id="105" w:name="Xf8ad26412ad98b449304d4475d81963b294c2ae"/>
+    <w:bookmarkStart w:id="104" w:name="Xf8ad26412ad98b449304d4475d81963b294c2ae"/>
     <w:p>
       <w:pPr>
         <w:pStyle w:val="Heading3"/>
@@ -9538,8 +7357,8 @@
         <w:t xml:space="preserve">, to estimate odds ratios and absolute risk differences.</w:t>
       </w:r>
     </w:p>
-    <w:bookmarkEnd w:id="105"/>
-    <w:bookmarkStart w:id="108" w:name="X89c97a0c38ba473d58b2facce729a073a7e8df9"/>
+    <w:bookmarkEnd w:id="104"/>
+    <w:bookmarkStart w:id="107" w:name="X89c97a0c38ba473d58b2facce729a073a7e8df9"/>
     <w:p>
       <w:pPr>
         <w:pStyle w:val="Heading3"/>
@@ -9568,7 +7387,7 @@
       <w:pPr>
         <w:pStyle w:val="BodyText"/>
       </w:pPr>
-      <w:bookmarkStart w:id="106" w:name="eq-ordinal-model"/>
+      <w:bookmarkStart w:id="105" w:name="eq-ordinal-model"/>
       <m:oMathPara>
         <m:oMathParaPr>
           <m:jc m:val="center"/>
@@ -9768,7 +7587,7 @@
           </m:d>
         </m:oMath>
       </m:oMathPara>
-      <w:bookmarkEnd w:id="106"/>
+      <w:bookmarkEnd w:id="105"/>
     </w:p>
     <w:p>
       <w:pPr>
@@ -9824,7 +7643,7 @@
       <w:pPr>
         <w:pStyle w:val="BodyText"/>
       </w:pPr>
-      <w:bookmarkStart w:id="107" w:name="eq-linear-model"/>
+      <w:bookmarkStart w:id="106" w:name="eq-linear-model"/>
       <m:oMathPara>
         <m:oMathParaPr>
           <m:jc m:val="center"/>
@@ -10076,10 +7895,10 @@
           </m:d>
         </m:oMath>
       </m:oMathPara>
-      <w:bookmarkEnd w:id="107"/>
-    </w:p>
-    <w:bookmarkEnd w:id="108"/>
-    <w:bookmarkStart w:id="109" w:name="X90cb4e0ebfb4fe618dcdd24cc99dbcaedd01b78"/>
+      <w:bookmarkEnd w:id="106"/>
+    </w:p>
+    <w:bookmarkEnd w:id="107"/>
+    <w:bookmarkStart w:id="108" w:name="X90cb4e0ebfb4fe618dcdd24cc99dbcaedd01b78"/>
     <w:p>
       <w:pPr>
         <w:pStyle w:val="Heading3"/>
@@ -10145,8 +7964,8 @@
         <w:t xml:space="preserve">.</w:t>
       </w:r>
     </w:p>
-    <w:bookmarkEnd w:id="109"/>
-    <w:bookmarkStart w:id="110" w:name="X0c0155e4b87aec11ab06b9d09220f8543002113"/>
+    <w:bookmarkEnd w:id="108"/>
+    <w:bookmarkStart w:id="109" w:name="X0c0155e4b87aec11ab06b9d09220f8543002113"/>
     <w:p>
       <w:pPr>
         <w:pStyle w:val="Heading3"/>
@@ -10180,8 +7999,8 @@
         <w:t xml:space="preserve">with the logit link.</w:t>
       </w:r>
     </w:p>
-    <w:bookmarkEnd w:id="110"/>
-    <w:bookmarkStart w:id="112" w:name="length-of-emergency-department-stay"/>
+    <w:bookmarkEnd w:id="109"/>
+    <w:bookmarkStart w:id="111" w:name="length-of-emergency-department-stay"/>
     <w:p>
       <w:pPr>
         <w:pStyle w:val="Heading3"/>
@@ -10216,7 +8035,7 @@
       <w:pPr>
         <w:pStyle w:val="BodyText"/>
       </w:pPr>
-      <w:bookmarkStart w:id="111" w:name="eq-competing-risks-model"/>
+      <w:bookmarkStart w:id="110" w:name="eq-competing-risks-model"/>
       <m:oMathPara>
         <m:oMathParaPr>
           <m:jc m:val="center"/>
@@ -10410,7 +8229,7 @@
           </m:d>
         </m:oMath>
       </m:oMathPara>
-      <w:bookmarkEnd w:id="111"/>
+      <w:bookmarkEnd w:id="110"/>
     </w:p>
     <w:p>
       <w:pPr>
@@ -10599,8 +8418,8 @@
         <w:t xml:space="preserve">All other terms are defined as in the primary analysis model.</w:t>
       </w:r>
     </w:p>
-    <w:bookmarkEnd w:id="112"/>
-    <w:bookmarkStart w:id="113" w:name="length-of-hospital-stay"/>
+    <w:bookmarkEnd w:id="111"/>
+    <w:bookmarkStart w:id="112" w:name="length-of-hospital-stay"/>
     <w:p>
       <w:pPr>
         <w:pStyle w:val="Heading3"/>
@@ -10631,8 +8450,8 @@
         <w:t xml:space="preserve">.</w:t>
       </w:r>
     </w:p>
-    <w:bookmarkEnd w:id="113"/>
-    <w:bookmarkStart w:id="114" w:name="intensive-care-unit-admission"/>
+    <w:bookmarkEnd w:id="112"/>
+    <w:bookmarkStart w:id="113" w:name="intensive-care-unit-admission"/>
     <w:p>
       <w:pPr>
         <w:pStyle w:val="Heading3"/>
@@ -10666,8 +8485,8 @@
         <w:t xml:space="preserve">with the logit link.</w:t>
       </w:r>
     </w:p>
-    <w:bookmarkEnd w:id="114"/>
-    <w:bookmarkStart w:id="115" w:name="length-of-intensive-care-unit-stay"/>
+    <w:bookmarkEnd w:id="113"/>
+    <w:bookmarkStart w:id="114" w:name="length-of-intensive-care-unit-stay"/>
     <w:p>
       <w:pPr>
         <w:pStyle w:val="Heading3"/>
@@ -10698,8 +8517,8 @@
         <w:t xml:space="preserve">.</w:t>
       </w:r>
     </w:p>
-    <w:bookmarkEnd w:id="115"/>
-    <w:bookmarkStart w:id="117" w:name="X5037a1d47abaf80439915bb3ba5c524d444c7d7"/>
+    <w:bookmarkEnd w:id="114"/>
+    <w:bookmarkStart w:id="116" w:name="X5037a1d47abaf80439915bb3ba5c524d444c7d7"/>
     <w:p>
       <w:pPr>
         <w:pStyle w:val="Heading3"/>
@@ -10740,7 +8559,7 @@
       <w:pPr>
         <w:pStyle w:val="BodyText"/>
       </w:pPr>
-      <w:bookmarkStart w:id="116" w:name="eq-beta-model"/>
+      <w:bookmarkStart w:id="115" w:name="eq-beta-model"/>
       <m:oMathPara>
         <m:oMathParaPr>
           <m:jc m:val="center"/>
@@ -10919,7 +8738,7 @@
           </m:d>
         </m:oMath>
       </m:oMathPara>
-      <w:bookmarkEnd w:id="116"/>
+      <w:bookmarkEnd w:id="115"/>
     </w:p>
     <w:p>
       <w:pPr>
@@ -11025,10 +8844,10 @@
         <w:t xml:space="preserve">prior to fitting the beta regression model. A beta regression precision (dispersion) parameter will be estimated as part of the model.</w:t>
       </w:r>
     </w:p>
+    <w:bookmarkEnd w:id="116"/>
     <w:bookmarkEnd w:id="117"/>
     <w:bookmarkEnd w:id="118"/>
-    <w:bookmarkEnd w:id="119"/>
-    <w:bookmarkStart w:id="141" w:name="references"/>
+    <w:bookmarkStart w:id="140" w:name="references"/>
     <w:p>
       <w:pPr>
         <w:pStyle w:val="Heading1"/>
@@ -11037,8 +8856,8 @@
         <w:t xml:space="preserve">6. References</w:t>
       </w:r>
     </w:p>
-    <w:bookmarkStart w:id="140" w:name="refs"/>
-    <w:bookmarkStart w:id="120" w:name="ref-Kasza2022"/>
+    <w:bookmarkStart w:id="139" w:name="refs"/>
+    <w:bookmarkStart w:id="119" w:name="ref-Kasza2022"/>
     <w:p>
       <w:pPr>
         <w:pStyle w:val="Bibliography"/>
@@ -11092,8 +8911,8 @@
         <w:t xml:space="preserve">, 3627–3641 (2022).</w:t>
       </w:r>
     </w:p>
-    <w:bookmarkEnd w:id="120"/>
-    <w:bookmarkStart w:id="121" w:name="ref-grantham_staircase_2024"/>
+    <w:bookmarkEnd w:id="119"/>
+    <w:bookmarkStart w:id="120" w:name="ref-grantham_staircase_2024"/>
     <w:p>
       <w:pPr>
         <w:pStyle w:val="Bibliography"/>
@@ -11159,8 +8978,8 @@
         <w:t xml:space="preserve">, 24–41 (2024).</w:t>
       </w:r>
     </w:p>
-    <w:bookmarkEnd w:id="121"/>
-    <w:bookmarkStart w:id="122" w:name="ref-aukstakalnis_impact_2024"/>
+    <w:bookmarkEnd w:id="120"/>
+    <w:bookmarkStart w:id="121" w:name="ref-aukstakalnis_impact_2024"/>
     <w:p>
       <w:pPr>
         <w:pStyle w:val="Bibliography"/>
@@ -11207,8 +9026,8 @@
         <w:t xml:space="preserve">(2024).</w:t>
       </w:r>
     </w:p>
-    <w:bookmarkEnd w:id="122"/>
-    <w:bookmarkStart w:id="123" w:name="ref-Hemming2020Feb"/>
+    <w:bookmarkEnd w:id="121"/>
+    <w:bookmarkStart w:id="122" w:name="ref-Hemming2020Feb"/>
     <w:p>
       <w:pPr>
         <w:pStyle w:val="Bibliography"/>
@@ -11262,8 +9081,8 @@
         <w:t xml:space="preserve">, 979–995 (2020).</w:t>
       </w:r>
     </w:p>
-    <w:bookmarkEnd w:id="123"/>
-    <w:bookmarkStart w:id="124" w:name="ref-nakhid_effect_2026"/>
+    <w:bookmarkEnd w:id="122"/>
+    <w:bookmarkStart w:id="123" w:name="ref-nakhid_effect_2026"/>
     <w:p>
       <w:pPr>
         <w:pStyle w:val="Bibliography"/>
@@ -11310,8 +9129,8 @@
         <w:t xml:space="preserve">(2026).</w:t>
       </w:r>
     </w:p>
-    <w:bookmarkEnd w:id="124"/>
-    <w:bookmarkStart w:id="125" w:name="ref-gerdin_warnberg_feasibility_2025"/>
+    <w:bookmarkEnd w:id="123"/>
+    <w:bookmarkStart w:id="124" w:name="ref-gerdin_warnberg_feasibility_2025"/>
     <w:p>
       <w:pPr>
         <w:pStyle w:val="Bibliography"/>
@@ -11374,8 +9193,8 @@
         <w:t xml:space="preserve">, e099020 (2025).</w:t>
       </w:r>
     </w:p>
-    <w:bookmarkEnd w:id="125"/>
-    <w:bookmarkStart w:id="126" w:name="ref-Campbell2005"/>
+    <w:bookmarkEnd w:id="124"/>
+    <w:bookmarkStart w:id="125" w:name="ref-Campbell2005"/>
     <w:p>
       <w:pPr>
         <w:pStyle w:val="Bibliography"/>
@@ -11429,8 +9248,8 @@
         <w:t xml:space="preserve">, 99–107 (2005).</w:t>
       </w:r>
     </w:p>
-    <w:bookmarkEnd w:id="126"/>
-    <w:bookmarkStart w:id="127" w:name="ref-Eldridge2015"/>
+    <w:bookmarkEnd w:id="125"/>
+    <w:bookmarkStart w:id="126" w:name="ref-Eldridge2015"/>
     <w:p>
       <w:pPr>
         <w:pStyle w:val="Bibliography"/>
@@ -11484,8 +9303,8 @@
         <w:t xml:space="preserve">, 1039–1056 (2015).</w:t>
       </w:r>
     </w:p>
-    <w:bookmarkEnd w:id="127"/>
-    <w:bookmarkStart w:id="128" w:name="ref-Martin2016"/>
+    <w:bookmarkEnd w:id="126"/>
+    <w:bookmarkStart w:id="127" w:name="ref-Martin2016"/>
     <w:p>
       <w:pPr>
         <w:pStyle w:val="Bibliography"/>
@@ -11539,8 +9358,8 @@
         <w:t xml:space="preserve">, (2016).</w:t>
       </w:r>
     </w:p>
-    <w:bookmarkEnd w:id="128"/>
-    <w:bookmarkStart w:id="129" w:name="ref-Korevaar2021"/>
+    <w:bookmarkEnd w:id="127"/>
+    <w:bookmarkStart w:id="128" w:name="ref-Korevaar2021"/>
     <w:p>
       <w:pPr>
         <w:pStyle w:val="Bibliography"/>
@@ -11594,8 +9413,8 @@
         <w:t xml:space="preserve">, 529–540 (2021).</w:t>
       </w:r>
     </w:p>
-    <w:bookmarkEnd w:id="129"/>
-    <w:bookmarkStart w:id="130" w:name="ref-lashoher_implementation_2017"/>
+    <w:bookmarkEnd w:id="128"/>
+    <w:bookmarkStart w:id="129" w:name="ref-lashoher_implementation_2017"/>
     <w:p>
       <w:pPr>
         <w:pStyle w:val="Bibliography"/>
@@ -11763,8 +9582,8 @@
         <w:t xml:space="preserve">, 954–962 (2017).</w:t>
       </w:r>
     </w:p>
-    <w:bookmarkEnd w:id="130"/>
-    <w:bookmarkStart w:id="131" w:name="ref-kapitan_effect_2024"/>
+    <w:bookmarkEnd w:id="129"/>
+    <w:bookmarkStart w:id="130" w:name="ref-kapitan_effect_2024"/>
     <w:p>
       <w:pPr>
         <w:pStyle w:val="Bibliography"/>
@@ -11820,8 +9639,8 @@
         <w:t xml:space="preserve">2024.09.28.24314529 (2024).</w:t>
       </w:r>
     </w:p>
-    <w:bookmarkEnd w:id="131"/>
-    <w:bookmarkStart w:id="132" w:name="ref-higgins_psychometric_2021"/>
+    <w:bookmarkEnd w:id="130"/>
+    <w:bookmarkStart w:id="131" w:name="ref-higgins_psychometric_2021"/>
     <w:p>
       <w:pPr>
         <w:pStyle w:val="Bibliography"/>
@@ -11887,8 +9706,8 @@
         <w:t xml:space="preserve">, 103–112 (2021).</w:t>
       </w:r>
     </w:p>
-    <w:bookmarkEnd w:id="132"/>
-    <w:bookmarkStart w:id="133" w:name="ref-R"/>
+    <w:bookmarkEnd w:id="131"/>
+    <w:bookmarkStart w:id="132" w:name="ref-R"/>
     <w:p>
       <w:pPr>
         <w:pStyle w:val="Bibliography"/>
@@ -11919,8 +9738,8 @@
         <w:t xml:space="preserve">. (R Foundation for Statistical Computing, 2023).</w:t>
       </w:r>
     </w:p>
-    <w:bookmarkEnd w:id="133"/>
-    <w:bookmarkStart w:id="134" w:name="ref-Hemming2018"/>
+    <w:bookmarkEnd w:id="132"/>
+    <w:bookmarkStart w:id="133" w:name="ref-Hemming2018"/>
     <w:p>
       <w:pPr>
         <w:pStyle w:val="Bibliography"/>
@@ -11967,8 +9786,8 @@
         <w:t xml:space="preserve">k1614 (2018).</w:t>
       </w:r>
     </w:p>
-    <w:bookmarkEnd w:id="134"/>
-    <w:bookmarkStart w:id="135" w:name="ref-grantham_evaluating_2022"/>
+    <w:bookmarkEnd w:id="133"/>
+    <w:bookmarkStart w:id="134" w:name="ref-grantham_evaluating_2022"/>
     <w:p>
       <w:pPr>
         <w:pStyle w:val="Bibliography"/>
@@ -12034,8 +9853,8 @@
         <w:t xml:space="preserve">, 112 (2022).</w:t>
       </w:r>
     </w:p>
-    <w:bookmarkEnd w:id="135"/>
-    <w:bookmarkStart w:id="136" w:name="ref-kenny_analysis_2022"/>
+    <w:bookmarkEnd w:id="134"/>
+    <w:bookmarkStart w:id="135" w:name="ref-kenny_analysis_2022"/>
     <w:p>
       <w:pPr>
         <w:pStyle w:val="Bibliography"/>
@@ -12082,8 +9901,8 @@
         <w:t xml:space="preserve">10.1002/sim.9511 (2022).</w:t>
       </w:r>
     </w:p>
-    <w:bookmarkEnd w:id="136"/>
-    <w:bookmarkStart w:id="137" w:name="ref-Diaz2021"/>
+    <w:bookmarkEnd w:id="135"/>
+    <w:bookmarkStart w:id="136" w:name="ref-Diaz2021"/>
     <w:p>
       <w:pPr>
         <w:pStyle w:val="Bibliography"/>
@@ -12137,8 +9956,8 @@
         <w:t xml:space="preserve">, e436–e443 (2021).</w:t>
       </w:r>
     </w:p>
-    <w:bookmarkEnd w:id="137"/>
-    <w:bookmarkStart w:id="138" w:name="ref-hornor_quality_2018"/>
+    <w:bookmarkEnd w:id="136"/>
+    <w:bookmarkStart w:id="137" w:name="ref-hornor_quality_2018"/>
     <w:p>
       <w:pPr>
         <w:pStyle w:val="Bibliography"/>
@@ -12234,8 +10053,8 @@
         <w:t xml:space="preserve">, 160–169 (2018).</w:t>
       </w:r>
     </w:p>
-    <w:bookmarkEnd w:id="138"/>
-    <w:bookmarkStart w:id="139" w:name="ref-ustun_measuring_2010"/>
+    <w:bookmarkEnd w:id="137"/>
+    <w:bookmarkStart w:id="138" w:name="ref-ustun_measuring_2010"/>
     <w:p>
       <w:pPr>
         <w:pStyle w:val="Bibliography"/>
@@ -12444,9 +10263,9 @@
         <w:t xml:space="preserve">. (World Health Organization, 2010).</w:t>
       </w:r>
     </w:p>
+    <w:bookmarkEnd w:id="138"/>
     <w:bookmarkEnd w:id="139"/>
     <w:bookmarkEnd w:id="140"/>
-    <w:bookmarkEnd w:id="141"/>
     <w:sectPr>
       <w:footnotePr>
         <w:numRestart w:val="eachSect"/>

</xml_diff>

<commit_message>
Align outcomes summary to analysis section and condense that information
</commit_message>
<xml_diff>
--- a/statistical-analysis-plan/statistical-analysis-plan.docx
+++ b/statistical-analysis-plan/statistical-analysis-plan.docx
@@ -1486,205 +1486,6 @@
         <w:t xml:space="preserve">5.3 Outcomes</w:t>
       </w:r>
     </w:p>
-    <w:bookmarkStart w:id="60" w:name="primary-outcome"/>
-    <w:p>
-      <w:pPr>
-        <w:pStyle w:val="Heading3"/>
-      </w:pPr>
-      <w:r>
-        <w:t xml:space="preserve">5.3.1 Primary outcome</w:t>
-      </w:r>
-    </w:p>
-    <w:p>
-      <w:pPr>
-        <w:pStyle w:val="FirstParagraph"/>
-      </w:pPr>
-      <w:r>
-        <w:t xml:space="preserve">The primary outcome will be in-hospital mortality within 30 days of arrival at the emergency department. We define this outcome as any death occurring in the hospital during the initial admission, up to 30 days post arrival at the emergency department. Clinical research coordinators will extract information on death from patient hospital records. If the patient has been transferred to another hospital, the clinical research coordinators will collect data on this outcome by calling the patient or a patient representative, or by contacting the hospital to which the patient was transferred. Data on this outcome will be collected continuously during the trial.</w:t>
-      </w:r>
-    </w:p>
-    <w:bookmarkEnd w:id="60"/>
-    <w:bookmarkStart w:id="64" w:name="secondary-outcomes"/>
-    <w:p>
-      <w:pPr>
-        <w:pStyle w:val="Heading3"/>
-      </w:pPr>
-      <w:r>
-        <w:t xml:space="preserve">5.3.2 Secondary outcomes</w:t>
-      </w:r>
-    </w:p>
-    <w:bookmarkStart w:id="61" w:name="Xdb0e69ac2f6fc09a45efb162c3cc667f9413bd2"/>
-    <w:p>
-      <w:pPr>
-        <w:pStyle w:val="Heading4"/>
-      </w:pPr>
-      <w:r>
-        <w:t xml:space="preserve">5.3.2.1 Collected using the main stepped-wedge design</w:t>
-      </w:r>
-    </w:p>
-    <w:p>
-      <w:pPr>
-        <w:pStyle w:val="Compact"/>
-        <w:numPr>
-          <w:ilvl w:val="0"/>
-          <w:numId w:val="1003"/>
-        </w:numPr>
-      </w:pPr>
-      <w:r>
-        <w:t xml:space="preserve">All cause mortality within 24 hours, 30 days and three months of arrival at the emergency department. In contrast to the primary outcome, all-cause mortality includes all deaths regardless of setting. Data on this outcome will be collected in the same way as for the primary outcome.</w:t>
-      </w:r>
-    </w:p>
-    <w:p>
-      <w:pPr>
-        <w:pStyle w:val="Compact"/>
-        <w:numPr>
-          <w:ilvl w:val="0"/>
-          <w:numId w:val="1003"/>
-        </w:numPr>
-      </w:pPr>
-      <w:r>
-        <w:t xml:space="preserve">Length of emergency department stay. Data on this outcome will be collected from patient hospital records.</w:t>
-      </w:r>
-    </w:p>
-    <w:p>
-      <w:pPr>
-        <w:pStyle w:val="Compact"/>
-        <w:numPr>
-          <w:ilvl w:val="0"/>
-          <w:numId w:val="1003"/>
-        </w:numPr>
-      </w:pPr>
-      <w:r>
-        <w:t xml:space="preserve">Length of hospital stay. Data on this outcome will be collected from patient hospital records.</w:t>
-      </w:r>
-    </w:p>
-    <w:p>
-      <w:pPr>
-        <w:pStyle w:val="Compact"/>
-        <w:numPr>
-          <w:ilvl w:val="0"/>
-          <w:numId w:val="1003"/>
-        </w:numPr>
-      </w:pPr>
-      <w:r>
-        <w:t xml:space="preserve">Intensive care unit admission. Data on this outcome will be collected from patient hospital records.</w:t>
-      </w:r>
-    </w:p>
-    <w:p>
-      <w:pPr>
-        <w:pStyle w:val="Compact"/>
-        <w:numPr>
-          <w:ilvl w:val="0"/>
-          <w:numId w:val="1003"/>
-        </w:numPr>
-      </w:pPr>
-      <w:r>
-        <w:t xml:space="preserve">Length of intensive care unit stay. Data on this outcome will be collected from patient hospital records.</w:t>
-      </w:r>
-    </w:p>
-    <w:p>
-      <w:pPr>
-        <w:pStyle w:val="Compact"/>
-        <w:numPr>
-          <w:ilvl w:val="0"/>
-          <w:numId w:val="1003"/>
-        </w:numPr>
-      </w:pPr>
-      <w:r>
-        <w:t xml:space="preserve">Return to work at 30 days and three months after arrival at the emergency department. Data on this outcome will be collected in person if the patient is still in hospital, or by phone if the patient has been discharged.</w:t>
-      </w:r>
-    </w:p>
-    <w:bookmarkEnd w:id="61"/>
-    <w:bookmarkStart w:id="63" w:name="Xac098b8b976789377f406b0c926b7e67113ef4f"/>
-    <w:p>
-      <w:pPr>
-        <w:pStyle w:val="Heading4"/>
-      </w:pPr>
-      <w:r>
-        <w:t xml:space="preserve">5.3.2.2 Collected using the nested staircase design</w:t>
-      </w:r>
-    </w:p>
-    <w:p>
-      <w:pPr>
-        <w:pStyle w:val="Compact"/>
-        <w:numPr>
-          <w:ilvl w:val="0"/>
-          <w:numId w:val="1004"/>
-        </w:numPr>
-      </w:pPr>
-      <w:r>
-        <w:t xml:space="preserve">Adherence to ATLS</w:t>
-      </w:r>
-      <w:r>
-        <w:rPr>
-          <w:vertAlign w:val="superscript"/>
-        </w:rPr>
-        <w:t xml:space="preserve">®</w:t>
-      </w:r>
-      <w:r>
-        <w:t xml:space="preserve"> </w:t>
-      </w:r>
-      <w:r>
-        <w:t xml:space="preserve">principles during initial patient resuscitation, up to one hour after the physician has first seen the patient. This assessment will be done using a 14 item checklist covering the key steps of the ATLS</w:t>
-      </w:r>
-      <w:r>
-        <w:rPr>
-          <w:vertAlign w:val="superscript"/>
-        </w:rPr>
-        <w:t xml:space="preserve">®</w:t>
-      </w:r>
-      <w:r>
-        <w:t xml:space="preserve"> </w:t>
-      </w:r>
-      <w:r>
-        <w:t xml:space="preserve">primary survey, which was modelled based on previous work on ATLS</w:t>
-      </w:r>
-      <w:r>
-        <w:rPr>
-          <w:vertAlign w:val="superscript"/>
-        </w:rPr>
-        <w:t xml:space="preserve">®</w:t>
-      </w:r>
-      <w:r>
-        <w:t xml:space="preserve"> </w:t>
-      </w:r>
-      <w:r>
-        <w:t xml:space="preserve">adherence</w:t>
-      </w:r>
-      <w:r>
-        <w:rPr>
-          <w:vertAlign w:val="superscript"/>
-        </w:rPr>
-        <w:t xml:space="preserve">3</w:t>
-      </w:r>
-      <w:r>
-        <w:t xml:space="preserve">. We will consider completion of all 14 steps as 100% adherence. The clinical research coordinators collecting the data will be trained by the trial team to do this, prior to the start of the trial. We will collect this data by observing the care of a random sample of patients. The sampling will be designed as a nested staircase design.</w:t>
-      </w:r>
-    </w:p>
-    <w:p>
-      <w:pPr>
-        <w:pStyle w:val="Compact"/>
-        <w:numPr>
-          <w:ilvl w:val="0"/>
-          <w:numId w:val="1004"/>
-        </w:numPr>
-      </w:pPr>
-      <w:r>
-        <w:t xml:space="preserve">Quality of life within seven days of discharge, and at 30 days and three months of arrival at the emergency department, measured by the official and validated translations of the EQ5D3L. This outcome is only relevant to alive patients. Data on this outcome will be collected in person if the patient is still in hospital, or by phone if the patient has been discharged. We will collect this data using a nested staircase design.</w:t>
-      </w:r>
-    </w:p>
-    <w:p>
-      <w:pPr>
-        <w:pStyle w:val="Compact"/>
-        <w:numPr>
-          <w:ilvl w:val="0"/>
-          <w:numId w:val="1004"/>
-        </w:numPr>
-      </w:pPr>
-      <w:r>
-        <w:t xml:space="preserve">Disability within seven days of discharge, and at 30 days and three months of arrival at the emergency department, assessed using the WHO Disability Assessment Schedule 2.0 (WHODAS 2.0). This outcome is only relevant to alive patients. Data on this outcome will be collected in person if the patient is still in hospital, or by phone if the patient has been discharged. This data will also be collected using a nested staircase design.</w:t>
-      </w:r>
-    </w:p>
     <w:p>
       <w:pPr>
         <w:pStyle w:val="FirstParagraph"/>
@@ -1705,6 +1506,205 @@
       </w:hyperlink>
       <w:r>
         <w:t xml:space="preserve">.</w:t>
+      </w:r>
+    </w:p>
+    <w:bookmarkStart w:id="60" w:name="primary-outcome"/>
+    <w:p>
+      <w:pPr>
+        <w:pStyle w:val="Heading3"/>
+      </w:pPr>
+      <w:r>
+        <w:t xml:space="preserve">5.3.1 Primary outcome</w:t>
+      </w:r>
+    </w:p>
+    <w:p>
+      <w:pPr>
+        <w:pStyle w:val="FirstParagraph"/>
+      </w:pPr>
+      <w:r>
+        <w:t xml:space="preserve">The primary outcome will be in-hospital mortality within 30 days of arrival at the emergency department. We define this outcome as any death occurring in the hospital during the initial admission, up to 30 days post arrival at the emergency department. Clinical research coordinators will extract information on death from patient hospital records. If the patient has been transferred to another hospital, the clinical research coordinators will collect data on this outcome by calling the patient or a patient representative, or by contacting the hospital to which the patient was transferred. Data on this outcome will be collected continuously during the trial.</w:t>
+      </w:r>
+    </w:p>
+    <w:bookmarkEnd w:id="60"/>
+    <w:bookmarkStart w:id="64" w:name="secondary-outcomes"/>
+    <w:p>
+      <w:pPr>
+        <w:pStyle w:val="Heading3"/>
+      </w:pPr>
+      <w:r>
+        <w:t xml:space="preserve">5.3.2 Secondary outcomes</w:t>
+      </w:r>
+    </w:p>
+    <w:bookmarkStart w:id="61" w:name="Xdb0e69ac2f6fc09a45efb162c3cc667f9413bd2"/>
+    <w:p>
+      <w:pPr>
+        <w:pStyle w:val="Heading4"/>
+      </w:pPr>
+      <w:r>
+        <w:t xml:space="preserve">5.3.2.1 Collected using the main stepped-wedge design</w:t>
+      </w:r>
+    </w:p>
+    <w:p>
+      <w:pPr>
+        <w:pStyle w:val="Compact"/>
+        <w:numPr>
+          <w:ilvl w:val="0"/>
+          <w:numId w:val="1003"/>
+        </w:numPr>
+      </w:pPr>
+      <w:r>
+        <w:t xml:space="preserve">All cause mortality within 24 hours, 30 days and three months of arrival at the emergency department. In contrast to the primary outcome, all-cause mortality includes all deaths regardless of setting. Data on this outcome will be collected in the same way as for the primary outcome.</w:t>
+      </w:r>
+    </w:p>
+    <w:p>
+      <w:pPr>
+        <w:pStyle w:val="Compact"/>
+        <w:numPr>
+          <w:ilvl w:val="0"/>
+          <w:numId w:val="1003"/>
+        </w:numPr>
+      </w:pPr>
+      <w:r>
+        <w:t xml:space="preserve">Length of emergency department stay. Data on this outcome will be collected from patient hospital records.</w:t>
+      </w:r>
+    </w:p>
+    <w:p>
+      <w:pPr>
+        <w:pStyle w:val="Compact"/>
+        <w:numPr>
+          <w:ilvl w:val="0"/>
+          <w:numId w:val="1003"/>
+        </w:numPr>
+      </w:pPr>
+      <w:r>
+        <w:t xml:space="preserve">Length of hospital stay. Data on this outcome will be collected from patient hospital records.</w:t>
+      </w:r>
+    </w:p>
+    <w:p>
+      <w:pPr>
+        <w:pStyle w:val="Compact"/>
+        <w:numPr>
+          <w:ilvl w:val="0"/>
+          <w:numId w:val="1003"/>
+        </w:numPr>
+      </w:pPr>
+      <w:r>
+        <w:t xml:space="preserve">Intensive care unit admission. Data on this outcome will be collected from patient hospital records.</w:t>
+      </w:r>
+    </w:p>
+    <w:p>
+      <w:pPr>
+        <w:pStyle w:val="Compact"/>
+        <w:numPr>
+          <w:ilvl w:val="0"/>
+          <w:numId w:val="1003"/>
+        </w:numPr>
+      </w:pPr>
+      <w:r>
+        <w:t xml:space="preserve">Length of intensive care unit stay. Data on this outcome will be collected from patient hospital records.</w:t>
+      </w:r>
+    </w:p>
+    <w:p>
+      <w:pPr>
+        <w:pStyle w:val="Compact"/>
+        <w:numPr>
+          <w:ilvl w:val="0"/>
+          <w:numId w:val="1003"/>
+        </w:numPr>
+      </w:pPr>
+      <w:r>
+        <w:t xml:space="preserve">Return to work at 30 days and three months after arrival at the emergency department. Data on this outcome will be collected in person if the patient is still in hospital, or by phone if the patient has been discharged.</w:t>
+      </w:r>
+    </w:p>
+    <w:bookmarkEnd w:id="61"/>
+    <w:bookmarkStart w:id="63" w:name="Xac098b8b976789377f406b0c926b7e67113ef4f"/>
+    <w:p>
+      <w:pPr>
+        <w:pStyle w:val="Heading4"/>
+      </w:pPr>
+      <w:r>
+        <w:t xml:space="preserve">5.3.2.2 Collected using the nested staircase design</w:t>
+      </w:r>
+    </w:p>
+    <w:p>
+      <w:pPr>
+        <w:pStyle w:val="Compact"/>
+        <w:numPr>
+          <w:ilvl w:val="0"/>
+          <w:numId w:val="1004"/>
+        </w:numPr>
+      </w:pPr>
+      <w:r>
+        <w:t xml:space="preserve">Adherence to ATLS</w:t>
+      </w:r>
+      <w:r>
+        <w:rPr>
+          <w:vertAlign w:val="superscript"/>
+        </w:rPr>
+        <w:t xml:space="preserve">®</w:t>
+      </w:r>
+      <w:r>
+        <w:t xml:space="preserve"> </w:t>
+      </w:r>
+      <w:r>
+        <w:t xml:space="preserve">principles during initial patient resuscitation, up to one hour after the physician has first seen the patient. This assessment will be done using a 14 item checklist covering the key steps of the ATLS</w:t>
+      </w:r>
+      <w:r>
+        <w:rPr>
+          <w:vertAlign w:val="superscript"/>
+        </w:rPr>
+        <w:t xml:space="preserve">®</w:t>
+      </w:r>
+      <w:r>
+        <w:t xml:space="preserve"> </w:t>
+      </w:r>
+      <w:r>
+        <w:t xml:space="preserve">primary survey, which was modelled based on previous work on ATLS</w:t>
+      </w:r>
+      <w:r>
+        <w:rPr>
+          <w:vertAlign w:val="superscript"/>
+        </w:rPr>
+        <w:t xml:space="preserve">®</w:t>
+      </w:r>
+      <w:r>
+        <w:t xml:space="preserve"> </w:t>
+      </w:r>
+      <w:r>
+        <w:t xml:space="preserve">adherence</w:t>
+      </w:r>
+      <w:r>
+        <w:rPr>
+          <w:vertAlign w:val="superscript"/>
+        </w:rPr>
+        <w:t xml:space="preserve">3</w:t>
+      </w:r>
+      <w:r>
+        <w:t xml:space="preserve">. We will consider completion of all 14 steps as 100% adherence. The clinical research coordinators collecting the data will be trained by the trial team to do this, prior to the start of the trial. We will collect this data by observing the care of a random sample of patients. The sampling will be designed as a nested staircase design.</w:t>
+      </w:r>
+    </w:p>
+    <w:p>
+      <w:pPr>
+        <w:pStyle w:val="Compact"/>
+        <w:numPr>
+          <w:ilvl w:val="0"/>
+          <w:numId w:val="1004"/>
+        </w:numPr>
+      </w:pPr>
+      <w:r>
+        <w:t xml:space="preserve">Quality of life within seven days of discharge, and at 30 days and three months of arrival at the emergency department, measured by the official and validated translations of the EQ5D5L. This outcome is only relevant to alive patients. Data on this outcome will be collected in person if the patient is still in hospital, or by phone if the patient has been discharged. We will collect this data using a nested staircase design.</w:t>
+      </w:r>
+    </w:p>
+    <w:p>
+      <w:pPr>
+        <w:pStyle w:val="Compact"/>
+        <w:numPr>
+          <w:ilvl w:val="0"/>
+          <w:numId w:val="1004"/>
+        </w:numPr>
+      </w:pPr>
+      <w:r>
+        <w:t xml:space="preserve">Disability within seven days of discharge, and at 30 days and three months of arrival at the emergency department, assessed using the WHO Disability Assessment Schedule 2.0 (WHODAS 2.0). This outcome is only relevant to alive patients. Data on this outcome will be collected in person if the patient is still in hospital, or by phone if the patient has been discharged. This data will also be collected using a nested staircase design.</w:t>
       </w:r>
     </w:p>
     <w:tbl>

</xml_diff>

<commit_message>
Revise ITT/per protocol terminology in SAP to align with the protocol
</commit_message>
<xml_diff>
--- a/statistical-analysis-plan/statistical-analysis-plan.docx
+++ b/statistical-analysis-plan/statistical-analysis-plan.docx
@@ -1491,7 +1491,7 @@
         <w:pStyle w:val="FirstParagraph"/>
       </w:pPr>
       <w:r>
-        <w:t xml:space="preserve">A summary of all outcomes, populations, effect measures, and handling of intercurrent events is provided in</w:t>
+        <w:t xml:space="preserve">A summary of all outcomes, analysis sets, effect measures, and handling of intercurrent events is provided in</w:t>
       </w:r>
       <w:r>
         <w:t xml:space="preserve"> </w:t>
@@ -1731,7 +1731,7 @@
               <w:pStyle w:val="ImageCaption"/>
             </w:pPr>
             <w:r>
-              <w:t xml:space="preserve">Table 1: Summary of outcomes, populations, effect measures, and handling of intercurrent events</w:t>
+              <w:t xml:space="preserve">Table 1: Summary of outcomes, analysis sets, effect measures, and handling of intercurrent events</w:t>
             </w:r>
           </w:p>
           <w:bookmarkEnd w:id="62"/>
@@ -2197,13 +2197,13 @@
     </w:p>
     <w:bookmarkEnd w:id="75"/>
     <w:bookmarkEnd w:id="76"/>
-    <w:bookmarkStart w:id="77" w:name="analysis-populations"/>
+    <w:bookmarkStart w:id="77" w:name="analysis-sets"/>
     <w:p>
       <w:pPr>
         <w:pStyle w:val="Heading2"/>
       </w:pPr>
       <w:r>
-        <w:t xml:space="preserve">5.7 Analysis populations</w:t>
+        <w:t xml:space="preserve">5.7 Analysis sets</w:t>
       </w:r>
     </w:p>
     <w:p>
@@ -2211,7 +2211,7 @@
         <w:pStyle w:val="FirstParagraph"/>
       </w:pPr>
       <w:r>
-        <w:t xml:space="preserve">The unit of randomisation is the hospital, because all units trained in the same hospital will be treated as one cluster, but the unit of analysis is the individual patient. The group allocation for a patient depends on the period in which the patient was admitted to the hospital, and patients will be considered exposed to the intervention if they were admitted to the hospital at any time point following the transition period. We will use an intention-to-treat approach for all analyses, according to the planned date of transition from standard care. We might consider a per protocol analysis if clusters deviate considerably from the planned date of transition, using the actual date of transition as the cut-off point. We will report the results of the per protocol analysis as a sensitivity analysis. We will use a CONSORT diagram to display the flow of hospitals, clusters and patients through the trial. We will present cluster level summaries of the intervention effect. We will report the study according to the CONSORT guidelines for stepped-wedge randomised trials</w:t>
+        <w:t xml:space="preserve">The unit of randomisation is the hospital, because all units trained in the same hospital will be treated as one cluster, but the unit of analysis is the individual patient. The primary analysis set will include all observations within clusters with available data and irrespective of the receipt of the intervention. Clusters and observations within clusters will be considered exposed to the intervention after the date at which the cluster was scheduled to transition. All data will be included with the exception of the transition phases. Group allocation for a patient depends on the period in which the patient was admitted to the hospital. If clusters deviate considerably from the scheduled date of transition, we will conduct a sensitivity analysis using the actual date of transition to define exposure. We will use a CONSORT diagram to display the flow of hospitals, clusters and patients through the trial. We will present cluster level summaries of the intervention effect. We will report the study according to the CONSORT guidelines for stepped-wedge randomised trials</w:t>
       </w:r>
       <w:r>
         <w:rPr>

</xml_diff>

<commit_message>
Add consort diagram to SAP
</commit_message>
<xml_diff>
--- a/statistical-analysis-plan/statistical-analysis-plan.docx
+++ b/statistical-analysis-plan/statistical-analysis-plan.docx
@@ -1192,7 +1192,7 @@
     </w:p>
     <w:bookmarkEnd w:id="48"/>
     <w:bookmarkEnd w:id="49"/>
-    <w:bookmarkStart w:id="118" w:name="statistical-analysis"/>
+    <w:bookmarkStart w:id="122" w:name="statistical-analysis"/>
     <w:p>
       <w:pPr>
         <w:pStyle w:val="Heading1"/>
@@ -1229,7 +1229,15 @@
         </w:r>
       </w:hyperlink>
       <w:r>
-        <w:t xml:space="preserve">). The trial will be composed of 6 batches of identical 12-period 5-sequence designs, with one cluster being assigned to each sequence of each batch</w:t>
+        <w:t xml:space="preserve">). Each cluster is a hospital and represents the unit for randomisation, even if one or more units are trained in the same hospital. There are two intervention conditions: ATLS® training and standard care. The trial is designed and will be analysed within a superiority framework, with ATLS® training compared with standard care for the primary and secondary outcomes.</w:t>
+      </w:r>
+    </w:p>
+    <w:p>
+      <w:pPr>
+        <w:pStyle w:val="BodyText"/>
+      </w:pPr>
+      <w:r>
+        <w:t xml:space="preserve">The trial will be composed of 6 batches of identical 12-period 5-sequence designs, with one cluster being assigned to each sequence of each batch</w:t>
       </w:r>
       <w:r>
         <w:rPr>
@@ -1238,7 +1246,15 @@
         <w:t xml:space="preserve">1</w:t>
       </w:r>
       <w:r>
-        <w:t xml:space="preserve">. Each period is one month, and each cluster will be in the trial for a total of 13 months. The intervention will be implemented during a one-month transition period, which will be excluded from the analysis. There will be an overlap of 6 months between successive batches.</w:t>
+        <w:t xml:space="preserve">. Each period is one month, and each cluster will be in the trial for a total of 13 months. The intervention will be implemented during a one-month transition period, which will be excluded from the analysis. There will be an anticpated overlap of 6 months between successive batches.</w:t>
+      </w:r>
+    </w:p>
+    <w:p>
+      <w:pPr>
+        <w:pStyle w:val="BodyText"/>
+      </w:pPr>
+      <w:r>
+        <w:t xml:space="preserve">Clusters will be sequentially allocated to batches based on when they enter the study, and within each batch clusters will then be randomised to an intervention implementation sequence. Individual patients will be included cross-sectionally for the primary outcome, although some secondary outcomes will be assessed at multiple follow-up time points. The anticipated trial period is from February 2025 to October 2029.</w:t>
       </w:r>
     </w:p>
     <w:tbl>
@@ -1445,7 +1461,7 @@
         <w:pStyle w:val="FirstParagraph"/>
       </w:pPr>
       <w:r>
-        <w:t xml:space="preserve">We will enrol and assign clusters to batches once eligibility is confirmed and ethical approval is obtained. Each batch will include hospitals from different regions to optimise trial logistics and training delivery. Within each batch, clusters will be randomised to the intervention implementation sequences allocated to that batch. Randomisation is conducted at the cluster level and stratified by batch. Within each batch, allocation is balanced on cluster size, defined as the monthly volume of eligible patients, using covariate-constrained randomisation (CCR). CCR was selected to improve balance between intervention conditions on this key design variable.</w:t>
+        <w:t xml:space="preserve">We will enrol and assign clusters to batches once eligibility is confirmed and ethical approval is obtained. Each batch will include hospitals from different regions to optimise trial logistics and training delivery. Within each batch, clusters will be randomised to the intervention implementation sequences allocated to that batch.</w:t>
       </w:r>
     </w:p>
     <w:p>
@@ -1453,7 +1469,23 @@
         <w:pStyle w:val="BodyText"/>
       </w:pPr>
       <w:r>
-        <w:t xml:space="preserve">For example, in Batch 1, five clusters were randomised to one of five sequences using CCR. A statistician (JM) implemented a computer algorithm in R to evaluate all possible allocations (n = 120) and calculate a balance metric reflecting how evenly cluster size would be distributed between intervention and control conditions. For each allocation, the squared difference in anticipated cluster size between conditions was calculated; because only one covariate was used, this squared difference constituted the balance statistic. The 10% of allocations demonstrating the greatest imbalance were excluded, and the remaining allocations formed the candidate set. The final allocation was then selected at random from this set. Owing to limitations in the algorithm, the balance score was calculated assuming a complete design, although the trial design includes transition periods. This CCR procedure is repeated independently for each batch.</w:t>
+        <w:t xml:space="preserve">Randomisation is conducted at the cluster level and stratified by batch. Within each batch, allocation is balanced on cluster size, defined as the monthly volume of eligible patients, using covariate-constrained randomisation (CCR). CCR was selected to improve balance between intervention conditions on this key design variable.</w:t>
+      </w:r>
+    </w:p>
+    <w:p>
+      <w:pPr>
+        <w:pStyle w:val="BodyText"/>
+      </w:pPr>
+      <w:r>
+        <w:t xml:space="preserve">For example, in Batch 1, five clusters were randomised to one of five sequences using CCR. A statistician (JM) implemented a computer algorithm in R to evaluate all possible allocations (n = 120) and calculate a balance metric reflecting how evenly cluster size would be distributed between intervention and control conditions. For each allocation, the squared difference in anticipated cluster size between conditions was calculated; because only one covariate was used, this squared difference constituted the balance statistic.</w:t>
+      </w:r>
+    </w:p>
+    <w:p>
+      <w:pPr>
+        <w:pStyle w:val="BodyText"/>
+      </w:pPr>
+      <w:r>
+        <w:t xml:space="preserve">The 10% of allocations demonstrating the greatest imbalance were excluded, and the remaining allocations formed the candidate set. The final allocation was then selected at random from this set. Owing to limitations in the algorithm, the balance score was calculated assuming a complete design, although the trial design includes transition periods. This CCR procedure is repeated independently for each batch.</w:t>
       </w:r>
     </w:p>
     <w:p>
@@ -1755,105 +1787,7 @@
         <w:pStyle w:val="FirstParagraph"/>
       </w:pPr>
       <w:r>
-        <w:t xml:space="preserve">Our primary statistical hypotheses are:</w:t>
-      </w:r>
-    </w:p>
-    <w:p>
-      <w:pPr>
-        <w:pStyle w:val="Compact"/>
-        <w:numPr>
-          <w:ilvl w:val="0"/>
-          <w:numId w:val="1005"/>
-        </w:numPr>
-      </w:pPr>
-      <w:r>
-        <w:rPr>
-          <w:b/>
-          <w:bCs/>
-        </w:rPr>
-        <w:t xml:space="preserve">Null hypothesis</w:t>
-      </w:r>
-      <w:r>
-        <w:t xml:space="preserve">: There is no difference in the primary outcome of 30-day in-hospital mortality between those randomised to ATLS</w:t>
-      </w:r>
-      <w:r>
-        <w:rPr>
-          <w:vertAlign w:val="superscript"/>
-        </w:rPr>
-        <w:t xml:space="preserve">®</w:t>
-      </w:r>
-      <w:r>
-        <w:t xml:space="preserve"> </w:t>
-      </w:r>
-      <w:r>
-        <w:t xml:space="preserve">and standard care, meaning that the odds ratio (OR) for ATLS</w:t>
-      </w:r>
-      <w:r>
-        <w:rPr>
-          <w:vertAlign w:val="superscript"/>
-        </w:rPr>
-        <w:t xml:space="preserve">®</w:t>
-      </w:r>
-      <w:r>
-        <w:t xml:space="preserve"> </w:t>
-      </w:r>
-      <w:r>
-        <w:t xml:space="preserve">vs standard care would be 1 and the absolute risk difference (ARD) would be 0.</w:t>
-      </w:r>
-    </w:p>
-    <w:p>
-      <w:pPr>
-        <w:pStyle w:val="Compact"/>
-        <w:numPr>
-          <w:ilvl w:val="0"/>
-          <w:numId w:val="1005"/>
-        </w:numPr>
-      </w:pPr>
-      <w:r>
-        <w:rPr>
-          <w:b/>
-          <w:bCs/>
-        </w:rPr>
-        <w:t xml:space="preserve">Alternative hypothesis</w:t>
-      </w:r>
-      <w:r>
-        <w:t xml:space="preserve">: There is an absolute difference in the primary outcome of 30-day in-hospital mortality between those randomised to ATLS</w:t>
-      </w:r>
-      <w:r>
-        <w:rPr>
-          <w:vertAlign w:val="superscript"/>
-        </w:rPr>
-        <w:t xml:space="preserve">®</w:t>
-      </w:r>
-      <w:r>
-        <w:t xml:space="preserve"> </w:t>
-      </w:r>
-      <w:r>
-        <w:t xml:space="preserve">and standard care of at least 5% units, meaning that the OR for ATLS</w:t>
-      </w:r>
-      <w:r>
-        <w:rPr>
-          <w:vertAlign w:val="superscript"/>
-        </w:rPr>
-        <w:t xml:space="preserve">®</w:t>
-      </w:r>
-      <w:r>
-        <w:t xml:space="preserve"> </w:t>
-      </w:r>
-      <w:r>
-        <w:t xml:space="preserve">vs standard care would be different from 1 and the ARD would be different from 0. Our expectation, based on our pilot study and review of the literature, is that the OR will be less than 1 and the ARD will be less than 0, indicating lower odds of 30-day in-hospital mortality among those randomised to ATLS</w:t>
-      </w:r>
-      <w:r>
-        <w:rPr>
-          <w:vertAlign w:val="superscript"/>
-        </w:rPr>
-        <w:t xml:space="preserve">®</w:t>
-      </w:r>
-      <w:r>
-        <w:t xml:space="preserve"> </w:t>
-      </w:r>
-      <w:r>
-        <w:t xml:space="preserve">group compared to those randomised to the standard care group.</w:t>
+        <w:t xml:space="preserve">The primary analysis will estimate the effect of ATLS training on 30-day in-hospital mortality compared with standard care. The treatment effect will be expressed as an odds ratio (OR) and as an absolute risk difference (ARD). An OR &lt; 1 or ARD &lt; 0 indicates lower mortality among patients treated in hospitals after ATLS implementation compared with standard care. Based on our pilot study and systematic review of the literature, we expect the intervention to reduce mortality.</w:t>
       </w:r>
     </w:p>
     <w:bookmarkEnd w:id="66"/>
@@ -1906,7 +1840,10 @@
         </w:r>
       </w:hyperlink>
       <w:r>
-        <w:t xml:space="preserve">)</w:t>
+        <w:t xml:space="preserve"> </w:t>
+      </w:r>
+      <w:r>
+        <w:t xml:space="preserve">A)</w:t>
       </w:r>
       <w:r>
         <w:rPr>
@@ -1933,7 +1870,24 @@
         <w:t xml:space="preserve">7–10</w:t>
       </w:r>
       <w:r>
-        <w:t xml:space="preserve">. We included the CAC to allow for variation in clustering over time. We assume that each cluster will contribute approximately 12 observations per month to the analysis, but allowed for substantial variation in cluster sizes, based on our previous work.</w:t>
+        <w:t xml:space="preserve">. We included the CAC to allow for variation in clustering over time. We assume that each cluster will contribute approximately 12 observations per month to the analysis, but allowed for substantial variation in cluster sizes, based on our previous work. We also estimated the sample size required to detect a reduction in the primary outcome from 10% to 7.5%, which would require at least 30 observations per period and cluster (see</w:t>
+      </w:r>
+      <w:r>
+        <w:t xml:space="preserve"> </w:t>
+      </w:r>
+      <w:hyperlink w:anchor="fig-power-curves">
+        <w:r>
+          <w:rPr>
+            <w:rStyle w:val="Hyperlink"/>
+          </w:rPr>
+          <w:t xml:space="preserve">Figure 3</w:t>
+        </w:r>
+      </w:hyperlink>
+      <w:r>
+        <w:t xml:space="preserve"> </w:t>
+      </w:r>
+      <w:r>
+        <w:t xml:space="preserve">B).</w:t>
       </w:r>
     </w:p>
     <w:tbl>
@@ -2086,7 +2040,7 @@
         <w:pStyle w:val="FirstParagraph"/>
       </w:pPr>
       <w:r>
-        <w:t xml:space="preserve">The secondary outcomes that will be measured using the nested staircase design are adherence to ATLS</w:t>
+        <w:t xml:space="preserve">The secondary outcomes that will be measured using the nested staircase design are secondary outcomes, and the power calculations presented here are intended only to inform the sample size required for their data collection within the nested staircase design. These outcomes are adherence to ATLS</w:t>
       </w:r>
       <w:r>
         <w:rPr>
@@ -2125,7 +2079,7 @@
         <w:t xml:space="preserve">13</w:t>
       </w:r>
       <w:r>
-        <w:t xml:space="preserve">. For quality of life and disability, these effects correspond to standardised effect sizes, expressed as Cohen’s d, of 0.5. With 30 clusters in total, six per sequence, for a discrete time decay correlation structure, with ICCs of 0.01 to 0.15 and a CAC of 0.8, there is &gt;80% power to detect these effects by including four patients in each cluster in each period. Accounting for loss to follow-up, we will include at least six patients per cluster per month. These patients will be a random subset of patients included in the primary outcome data collection during the staircase months. The random subset will be selected using simple random sampling on the shift level, meaning that the timing of the clinical research coordinator’s shift will be randomised to cover approximately eight hours during the morning, afternoon, or night shift. Adherence to ATLS</w:t>
+        <w:t xml:space="preserve">. For quality of life and disability, these effects correspond to standardised effect sizes, expressed as Cohen’s d, of 0.5. With 30 clusters in total, six per sequence, for a discrete time decay correlation structure, with ICCs of 0.01 to 0.15 and a CAC of 0.8, there is &gt;80% power to detect these effects by including four patients in each cluster in each period. Accounting for loss to follow-up, we will include at least six patients per cluster per month. These patients will be a random subset of patients included in the primary outcome data collection during the staircase months. The random subset will be selected using stratified random sampling by shift, meaning that the timing of the clinical research coordinator’s shift will be randomised to cover approximately eight hours during the morning, afternoon, or night shift. Adherence to ATLS</w:t>
       </w:r>
       <w:r>
         <w:rPr>
@@ -2197,7 +2151,7 @@
     </w:p>
     <w:bookmarkEnd w:id="75"/>
     <w:bookmarkEnd w:id="76"/>
-    <w:bookmarkStart w:id="77" w:name="analysis-sets"/>
+    <w:bookmarkStart w:id="81" w:name="analysis-sets"/>
     <w:p>
       <w:pPr>
         <w:pStyle w:val="Heading2"/>
@@ -2211,7 +2165,67 @@
         <w:pStyle w:val="FirstParagraph"/>
       </w:pPr>
       <w:r>
-        <w:t xml:space="preserve">The unit of randomisation is the hospital, because all units trained in the same hospital will be treated as one cluster, but the unit of analysis is the individual patient. The primary analysis set will include all observations within clusters with available data and irrespective of the receipt of the intervention. Clusters and observations within clusters will be considered exposed to the intervention after the date at which the cluster was scheduled to transition. All data will be included with the exception of the transition phases. Group allocation for a patient depends on the period in which the patient was admitted to the hospital. If clusters deviate considerably from the scheduled date of transition, we will conduct a sensitivity analysis using the actual date of transition to define exposure. We will use a CONSORT diagram to display the flow of hospitals, clusters and patients through the trial. We will present cluster level summaries of the intervention effect. We will report the study according to the CONSORT guidelines for stepped-wedge randomised trials</w:t>
+        <w:t xml:space="preserve">The trial has a hierarchical structure in which hospitals represent the clusters, clinical units within hospitals deliver care, and individual patients constitute the unit of observation and analysis. Randomisation is performed at the hospital level, with all trained units within the same hospital treated as part of the same cluster. The primary analysis set will include all observations within clusters with available data on the primary outcome and irrespective of the receipt of the intervention.</w:t>
+      </w:r>
+    </w:p>
+    <w:p>
+      <w:pPr>
+        <w:pStyle w:val="BodyText"/>
+      </w:pPr>
+      <w:r>
+        <w:t xml:space="preserve">Clusters and observations within clusters will be considered exposed to the intervention after the date at which the cluster was scheduled to transition. All data will be included with the exception of the transition phases. Group allocation for a patient depends on the period in which the patient was admitted to the hospital. If clusters deviate considerably from the scheduled date of transition, defined as more than four weeks, we will conduct a sensitivity analysis using the actual date of transition to define exposure.</w:t>
+      </w:r>
+    </w:p>
+    <w:p>
+      <w:pPr>
+        <w:pStyle w:val="BodyText"/>
+      </w:pPr>
+      <w:r>
+        <w:t xml:space="preserve">The analysis set will be specified for each analysis. For the primary outcome and mortality secondary outcomes, the analysis set is all eligible patient participants included in the main stepped-wedge trial. For quality-of-life, disability, and return-to-work outcomes, the analysis set is patients alive at the relevant follow-up time point. For adherence to ATLS® principles, the analysis set is the random sample of patients observed within the nested staircase design.</w:t>
+      </w:r>
+    </w:p>
+    <w:p>
+      <w:pPr>
+        <w:pStyle w:val="BodyText"/>
+      </w:pPr>
+      <w:r>
+        <w:t xml:space="preserve">The analysis set for each outcome will include all available participants from the relevant target population with observed outcome data, subject to any restrictions imposed by the outcome definition or the nested staircase sampling scheme. For adjusted analyses, the analysis set may be further restricted by the availability of covariate data, as described in</w:t>
+      </w:r>
+      <w:r>
+        <w:t xml:space="preserve"> </w:t>
+      </w:r>
+      <w:hyperlink w:anchor="sec-treatment-of-missing-data">
+        <w:r>
+          <w:rPr>
+            <w:rStyle w:val="Hyperlink"/>
+          </w:rPr>
+          <w:t xml:space="preserve">Section 5.10.4</w:t>
+        </w:r>
+      </w:hyperlink>
+      <w:r>
+        <w:t xml:space="preserve">.</w:t>
+      </w:r>
+    </w:p>
+    <w:p>
+      <w:pPr>
+        <w:pStyle w:val="BodyText"/>
+      </w:pPr>
+      <w:r>
+        <w:t xml:space="preserve">We will use a CONSORT diagram to display the flow of hospitals, clusters and patients through the trial, see</w:t>
+      </w:r>
+      <w:r>
+        <w:t xml:space="preserve"> </w:t>
+      </w:r>
+      <w:hyperlink w:anchor="fig-consort-diagram">
+        <w:r>
+          <w:rPr>
+            <w:rStyle w:val="Hyperlink"/>
+          </w:rPr>
+          <w:t xml:space="preserve">Figure 4</w:t>
+        </w:r>
+      </w:hyperlink>
+      <w:r>
+        <w:t xml:space="preserve">. We will present cluster level summaries of the intervention effect. We will report the study according to the CONSORT guidelines for stepped-wedge randomised trials</w:t>
       </w:r>
       <w:r>
         <w:rPr>
@@ -2223,8 +2237,87 @@
         <w:t xml:space="preserve">.</w:t>
       </w:r>
     </w:p>
-    <w:bookmarkEnd w:id="77"/>
-    <w:bookmarkStart w:id="80" w:name="baseline-analyses"/>
+    <w:tbl>
+      <w:tblPr>
+        <w:tblStyle w:val="Table"/>
+        <w:tblW w:type="pct" w:w="5000"/>
+        <w:tblLayout w:type="fixed"/>
+        <w:tblLook w:firstRow="0" w:lastRow="0" w:firstColumn="0" w:lastColumn="0" w:noHBand="0" w:noVBand="0" w:val="0000"/>
+      </w:tblPr>
+      <w:tblGrid>
+        <w:gridCol w:w="7920"/>
+      </w:tblGrid>
+      <w:tr>
+        <w:tc>
+          <w:tcPr/>
+          <w:bookmarkStart w:id="80" w:name="fig-consort-diagram"/>
+          <w:p>
+            <w:pPr>
+              <w:pStyle w:val="Compact"/>
+              <w:jc w:val="center"/>
+            </w:pPr>
+            <w:r>
+              <w:drawing>
+                <wp:inline>
+                  <wp:extent cx="5334000" cy="9066502"/>
+                  <wp:effectExtent b="0" l="0" r="0" t="0"/>
+                  <wp:docPr descr="" title="" id="78" name="Picture"/>
+                  <a:graphic>
+                    <a:graphicData uri="http://schemas.openxmlformats.org/drawingml/2006/picture">
+                      <pic:pic>
+                        <pic:nvPicPr>
+                          <pic:cNvPr descr="consort-diagram-5-sequences.png" id="79" name="Picture"/>
+                          <pic:cNvPicPr>
+                            <a:picLocks noChangeArrowheads="1" noChangeAspect="1"/>
+                          </pic:cNvPicPr>
+                        </pic:nvPicPr>
+                        <pic:blipFill>
+                          <a:blip r:embed="rId77"/>
+                          <a:stretch>
+                            <a:fillRect/>
+                          </a:stretch>
+                        </pic:blipFill>
+                        <pic:spPr bwMode="auto">
+                          <a:xfrm>
+                            <a:off x="0" y="0"/>
+                            <a:ext cx="5334000" cy="9066502"/>
+                          </a:xfrm>
+                          <a:prstGeom prst="rect">
+                            <a:avLst/>
+                          </a:prstGeom>
+                          <a:noFill/>
+                          <a:ln w="9525">
+                            <a:noFill/>
+                            <a:headEnd/>
+                            <a:tailEnd/>
+                          </a:ln>
+                        </pic:spPr>
+                      </pic:pic>
+                    </a:graphicData>
+                  </a:graphic>
+                </wp:inline>
+              </w:drawing>
+            </w:r>
+          </w:p>
+          <w:p>
+            <w:pPr>
+              <w:jc w:val="center"/>
+            </w:pPr>
+            <w:pPr>
+              <w:jc w:val="left"/>
+              <w:spacing w:before="200"/>
+              <w:pStyle w:val="ImageCaption"/>
+            </w:pPr>
+            <w:r>
+              <w:t xml:space="preserve">Figure 4: Consort diagram. The diagram displays the flow of clusters and participants through the trial.</w:t>
+            </w:r>
+          </w:p>
+          <w:bookmarkEnd w:id="80"/>
+        </w:tc>
+      </w:tr>
+    </w:tbl>
+    <w:bookmarkEnd w:id="81"/>
+    <w:bookmarkStart w:id="84" w:name="baseline-analyses"/>
     <w:p>
       <w:pPr>
         <w:pStyle w:val="Heading2"/>
@@ -2233,7 +2326,7 @@
         <w:t xml:space="preserve">5.8 Baseline analyses</w:t>
       </w:r>
     </w:p>
-    <w:bookmarkStart w:id="78" w:name="cluster-characteristics"/>
+    <w:bookmarkStart w:id="82" w:name="cluster-characteristics"/>
     <w:p>
       <w:pPr>
         <w:pStyle w:val="Heading3"/>
@@ -2250,8 +2343,8 @@
         <w:t xml:space="preserve">We will describe cluster characteristics including location and size using frequencies and percentages for discrete variables and means, standard deviations, medians and interquartile ranges (Q1-Q3) for continuous variables.</w:t>
       </w:r>
     </w:p>
-    <w:bookmarkEnd w:id="78"/>
-    <w:bookmarkStart w:id="79" w:name="patient-characteristics"/>
+    <w:bookmarkEnd w:id="82"/>
+    <w:bookmarkStart w:id="83" w:name="patient-characteristics"/>
     <w:p>
       <w:pPr>
         <w:pStyle w:val="Heading3"/>
@@ -2268,9 +2361,9 @@
         <w:t xml:space="preserve">We will describe patient characteristics at baseline, meaning all pre-training periods, per treatment group and overall using frequencies and percentages for discrete variables and means, standard deviations, medians and interquartile ranges (Q1-Q3) for continuous variables. We will not adjust for clustering when presenting baseline characteristics.</w:t>
       </w:r>
     </w:p>
-    <w:bookmarkEnd w:id="79"/>
-    <w:bookmarkEnd w:id="80"/>
-    <w:bookmarkStart w:id="81" w:name="interim-analysis"/>
+    <w:bookmarkEnd w:id="83"/>
+    <w:bookmarkEnd w:id="84"/>
+    <w:bookmarkStart w:id="85" w:name="interim-analysis"/>
     <w:p>
       <w:pPr>
         <w:pStyle w:val="Heading2"/>
@@ -2287,8 +2380,8 @@
         <w:t xml:space="preserve">There will be one interim analysis after half of the batches have completed the trial. The interim analysis will be assessed by the joint Trial Steering and Data Monitoring Committee. The purposes of this interim analysis will be to assess the trial’s feasibility and recommend that the trial be stopped if it is not feasible (e.g. if hospitals fail to adhere to the randomisation schedule or if there are substantial missing data in outcomes), and to compare characteristics across intervention conditions to monitor for differential recruitment/ascertainment between the intervention and control groups. No efficacy stopping is planned because any estimates obtained at the time point of the interim analysis will be associated with major statistical uncertainties.</w:t>
       </w:r>
     </w:p>
-    <w:bookmarkEnd w:id="81"/>
-    <w:bookmarkStart w:id="103" w:name="analysis-of-the-primary-outcome"/>
+    <w:bookmarkEnd w:id="85"/>
+    <w:bookmarkStart w:id="107" w:name="analysis-of-the-primary-outcome"/>
     <w:p>
       <w:pPr>
         <w:pStyle w:val="Heading2"/>
@@ -2334,7 +2427,7 @@
         <w:pStyle w:val="Compact"/>
         <w:numPr>
           <w:ilvl w:val="0"/>
-          <w:numId w:val="1006"/>
+          <w:numId w:val="1005"/>
         </w:numPr>
       </w:pPr>
       <w:r>
@@ -2366,7 +2459,7 @@
       <w:pPr>
         <w:pStyle w:val="FirstParagraph"/>
       </w:pPr>
-      <w:bookmarkStart w:id="82" w:name="eq-primary-model"/>
+      <w:bookmarkStart w:id="86" w:name="eq-primary-model"/>
       <m:oMathPara>
         <m:oMathParaPr>
           <m:jc m:val="center"/>
@@ -2553,14 +2646,14 @@
           </m:d>
         </m:oMath>
       </m:oMathPara>
-      <w:bookmarkEnd w:id="82"/>
+      <w:bookmarkEnd w:id="86"/>
     </w:p>
     <w:p>
       <w:pPr>
         <w:pStyle w:val="Compact"/>
         <w:numPr>
           <w:ilvl w:val="0"/>
-          <w:numId w:val="1007"/>
+          <w:numId w:val="1006"/>
         </w:numPr>
       </w:pPr>
       <w:r>
@@ -2592,7 +2685,7 @@
       <w:pPr>
         <w:pStyle w:val="FirstParagraph"/>
       </w:pPr>
-      <w:bookmarkStart w:id="83" w:name="eq-simplified-random-effects-model"/>
+      <w:bookmarkStart w:id="87" w:name="eq-simplified-random-effects-model"/>
       <m:oMathPara>
         <m:oMathParaPr>
           <m:jc m:val="center"/>
@@ -2755,14 +2848,14 @@
           </m:d>
         </m:oMath>
       </m:oMathPara>
-      <w:bookmarkEnd w:id="83"/>
+      <w:bookmarkEnd w:id="87"/>
     </w:p>
     <w:p>
       <w:pPr>
         <w:pStyle w:val="Compact"/>
         <w:numPr>
           <w:ilvl w:val="0"/>
-          <w:numId w:val="1008"/>
+          <w:numId w:val="1007"/>
         </w:numPr>
       </w:pPr>
       <w:r>
@@ -2794,7 +2887,7 @@
       <w:pPr>
         <w:pStyle w:val="FirstParagraph"/>
       </w:pPr>
-      <w:bookmarkStart w:id="84" w:name="eq-shared-period-model"/>
+      <w:bookmarkStart w:id="88" w:name="eq-shared-period-model"/>
       <m:oMathPara>
         <m:oMathParaPr>
           <m:jc m:val="center"/>
@@ -2978,14 +3071,14 @@
           </m:d>
         </m:oMath>
       </m:oMathPara>
-      <w:bookmarkEnd w:id="84"/>
+      <w:bookmarkEnd w:id="88"/>
     </w:p>
     <w:p>
       <w:pPr>
         <w:pStyle w:val="Compact"/>
         <w:numPr>
           <w:ilvl w:val="0"/>
-          <w:numId w:val="1009"/>
+          <w:numId w:val="1008"/>
         </w:numPr>
       </w:pPr>
       <w:r>
@@ -3017,7 +3110,7 @@
       <w:pPr>
         <w:pStyle w:val="FirstParagraph"/>
       </w:pPr>
-      <w:bookmarkStart w:id="85" w:name="eq-combined-simplified-model"/>
+      <w:bookmarkStart w:id="89" w:name="eq-combined-simplified-model"/>
       <m:oMathPara>
         <m:oMathParaPr>
           <m:jc m:val="center"/>
@@ -3177,7 +3270,7 @@
           </m:d>
         </m:oMath>
       </m:oMathPara>
-      <w:bookmarkEnd w:id="85"/>
+      <w:bookmarkEnd w:id="89"/>
     </w:p>
     <w:p>
       <w:pPr>
@@ -3192,7 +3285,7 @@
         <w:pStyle w:val="Compact"/>
         <w:numPr>
           <w:ilvl w:val="0"/>
-          <w:numId w:val="1010"/>
+          <w:numId w:val="1009"/>
         </w:numPr>
       </w:pPr>
       <m:oMath>
@@ -3337,7 +3430,7 @@
         <w:pStyle w:val="Compact"/>
         <w:numPr>
           <w:ilvl w:val="0"/>
-          <w:numId w:val="1010"/>
+          <w:numId w:val="1009"/>
         </w:numPr>
       </w:pPr>
       <m:oMath>
@@ -3367,7 +3460,7 @@
         <w:pStyle w:val="Compact"/>
         <w:numPr>
           <w:ilvl w:val="0"/>
-          <w:numId w:val="1010"/>
+          <w:numId w:val="1009"/>
         </w:numPr>
       </w:pPr>
       <m:oMath>
@@ -3600,7 +3693,7 @@
         <w:pStyle w:val="Compact"/>
         <w:numPr>
           <w:ilvl w:val="0"/>
-          <w:numId w:val="1010"/>
+          <w:numId w:val="1009"/>
         </w:numPr>
       </w:pPr>
       <m:oMath>
@@ -3617,7 +3710,7 @@
         <w:pStyle w:val="Compact"/>
         <w:numPr>
           <w:ilvl w:val="0"/>
-          <w:numId w:val="1010"/>
+          <w:numId w:val="1009"/>
         </w:numPr>
       </w:pPr>
       <m:oMath>
@@ -3654,7 +3747,7 @@
         <w:pStyle w:val="Compact"/>
         <w:numPr>
           <w:ilvl w:val="0"/>
-          <w:numId w:val="1010"/>
+          <w:numId w:val="1009"/>
         </w:numPr>
       </w:pPr>
       <m:oMath>
@@ -3725,7 +3818,7 @@
         <w:pStyle w:val="Compact"/>
         <w:numPr>
           <w:ilvl w:val="0"/>
-          <w:numId w:val="1010"/>
+          <w:numId w:val="1009"/>
         </w:numPr>
       </w:pPr>
       <m:oMath>
@@ -3872,7 +3965,7 @@
         <w:pStyle w:val="Compact"/>
         <w:numPr>
           <w:ilvl w:val="0"/>
-          <w:numId w:val="1010"/>
+          <w:numId w:val="1009"/>
         </w:numPr>
       </w:pPr>
       <m:oMath>
@@ -3926,7 +4019,7 @@
         <w:pStyle w:val="Compact"/>
         <w:numPr>
           <w:ilvl w:val="0"/>
-          <w:numId w:val="1010"/>
+          <w:numId w:val="1009"/>
         </w:numPr>
       </w:pPr>
       <m:oMath>
@@ -4018,7 +4111,7 @@
       <w:pPr>
         <w:pStyle w:val="BodyText"/>
       </w:pPr>
-      <w:bookmarkStart w:id="86" w:name="eq-distributional-assumptions"/>
+      <w:bookmarkStart w:id="90" w:name="eq-distributional-assumptions"/>
       <m:oMathPara>
         <m:oMathParaPr>
           <m:jc m:val="center"/>
@@ -4294,7 +4387,7 @@
           </m:d>
         </m:oMath>
       </m:oMathPara>
-      <w:bookmarkEnd w:id="86"/>
+      <w:bookmarkEnd w:id="90"/>
     </w:p>
     <w:p>
       <w:pPr>
@@ -4321,7 +4414,7 @@
         <w:t xml:space="preserve">All models will be fitted using residual pseudo-likelihood estimation based on linearisation with subject-specific expansion (RSPL), due to its computational stability and robust performance in small-sample settings. If the binomial model with the logit link converges but the corresponding model with the identity link does not, then we will report only an OR.</w:t>
       </w:r>
     </w:p>
-    <w:bookmarkStart w:id="99" w:name="sensitivity-analyses"/>
+    <w:bookmarkStart w:id="103" w:name="sensitivity-analyses"/>
     <w:p>
       <w:pPr>
         <w:pStyle w:val="Heading3"/>
@@ -4349,7 +4442,7 @@
         <w:t xml:space="preserve">. Unless otherwise stated, each sensitivity analysis will be operationalised using two separate models, one with the logit link and one with the identity link.</w:t>
       </w:r>
     </w:p>
-    <w:bookmarkStart w:id="88" w:name="X22dda602ebb4652e0fd291705062d91648ada05"/>
+    <w:bookmarkStart w:id="92" w:name="X22dda602ebb4652e0fd291705062d91648ada05"/>
     <w:p>
       <w:pPr>
         <w:pStyle w:val="Heading4"/>
@@ -4392,7 +4485,7 @@
       <w:pPr>
         <w:pStyle w:val="BodyText"/>
       </w:pPr>
-      <w:bookmarkStart w:id="87" w:name="eq-ar1"/>
+      <w:bookmarkStart w:id="91" w:name="eq-ar1"/>
       <m:oMathPara>
         <m:oMathParaPr>
           <m:jc m:val="center"/>
@@ -4570,7 +4663,7 @@
           </m:d>
         </m:oMath>
       </m:oMathPara>
-      <w:bookmarkEnd w:id="87"/>
+      <w:bookmarkEnd w:id="91"/>
     </w:p>
     <w:p>
       <w:pPr>
@@ -4585,7 +4678,7 @@
         <w:pStyle w:val="Compact"/>
         <w:numPr>
           <w:ilvl w:val="0"/>
-          <w:numId w:val="1011"/>
+          <w:numId w:val="1010"/>
         </w:numPr>
       </w:pPr>
       <m:oMath>
@@ -4605,7 +4698,7 @@
         <w:pStyle w:val="Compact"/>
         <w:numPr>
           <w:ilvl w:val="0"/>
-          <w:numId w:val="1011"/>
+          <w:numId w:val="1010"/>
         </w:numPr>
       </w:pPr>
       <m:oMath>
@@ -4685,7 +4778,7 @@
         <w:pStyle w:val="Compact"/>
         <w:numPr>
           <w:ilvl w:val="0"/>
-          <w:numId w:val="1011"/>
+          <w:numId w:val="1010"/>
         </w:numPr>
       </w:pPr>
       <m:oMath>
@@ -4731,8 +4824,8 @@
         <w:t xml:space="preserve">is not directly equivalent to parameters used in other specifications and should not be interpreted interchangeably.</w:t>
       </w:r>
     </w:p>
-    <w:bookmarkEnd w:id="88"/>
-    <w:bookmarkStart w:id="90" w:name="X265de50a776706f6d9ec7b4549b866a94e548a1"/>
+    <w:bookmarkEnd w:id="92"/>
+    <w:bookmarkStart w:id="94" w:name="X265de50a776706f6d9ec7b4549b866a94e548a1"/>
     <w:p>
       <w:pPr>
         <w:pStyle w:val="Heading4"/>
@@ -4767,7 +4860,7 @@
       <w:pPr>
         <w:pStyle w:val="BodyText"/>
       </w:pPr>
-      <w:bookmarkStart w:id="89" w:name="eq-model-batch-trend"/>
+      <w:bookmarkStart w:id="93" w:name="eq-model-batch-trend"/>
       <m:oMathPara>
         <m:oMathParaPr>
           <m:jc m:val="center"/>
@@ -4975,7 +5068,7 @@
           </m:d>
         </m:oMath>
       </m:oMathPara>
-      <w:bookmarkEnd w:id="89"/>
+      <w:bookmarkEnd w:id="93"/>
     </w:p>
     <w:p>
       <w:pPr>
@@ -5036,8 +5129,8 @@
         <w:t xml:space="preserve">, capturing between-batch variation in secular trends over time.</w:t>
       </w:r>
     </w:p>
-    <w:bookmarkEnd w:id="90"/>
-    <w:bookmarkStart w:id="92" w:name="X831bc7e780a434f5c3512e5d33d43284b7d37ce"/>
+    <w:bookmarkEnd w:id="94"/>
+    <w:bookmarkStart w:id="96" w:name="X831bc7e780a434f5c3512e5d33d43284b7d37ce"/>
     <w:p>
       <w:pPr>
         <w:pStyle w:val="Heading4"/>
@@ -5072,7 +5165,7 @@
       <w:pPr>
         <w:pStyle w:val="BodyText"/>
       </w:pPr>
-      <w:bookmarkStart w:id="91" w:name="eq-model-random-cluster-intervention"/>
+      <w:bookmarkStart w:id="95" w:name="eq-model-random-cluster-intervention"/>
       <m:oMathPara>
         <m:oMathParaPr>
           <m:jc m:val="center"/>
@@ -5298,7 +5391,7 @@
           </m:d>
         </m:oMath>
       </m:oMathPara>
-      <w:bookmarkEnd w:id="91"/>
+      <w:bookmarkEnd w:id="95"/>
     </w:p>
     <w:p>
       <w:pPr>
@@ -5313,7 +5406,7 @@
         <w:pStyle w:val="Compact"/>
         <w:numPr>
           <w:ilvl w:val="0"/>
-          <w:numId w:val="1012"/>
+          <w:numId w:val="1011"/>
         </w:numPr>
       </w:pPr>
       <m:oMath>
@@ -5394,7 +5487,7 @@
         <w:pStyle w:val="Compact"/>
         <w:numPr>
           <w:ilvl w:val="0"/>
-          <w:numId w:val="1012"/>
+          <w:numId w:val="1011"/>
         </w:numPr>
       </w:pPr>
       <m:oMath>
@@ -5473,8 +5566,8 @@
         <w:t xml:space="preserve">.</w:t>
       </w:r>
     </w:p>
-    <w:bookmarkEnd w:id="92"/>
-    <w:bookmarkStart w:id="94" w:name="X0324ad02af1274e3e5fe3c1dbe99d3dad84fc47"/>
+    <w:bookmarkEnd w:id="96"/>
+    <w:bookmarkStart w:id="98" w:name="X0324ad02af1274e3e5fe3c1dbe99d3dad84fc47"/>
     <w:p>
       <w:pPr>
         <w:pStyle w:val="Heading4"/>
@@ -5587,7 +5680,7 @@
       <w:pPr>
         <w:pStyle w:val="BodyText"/>
       </w:pPr>
-      <w:bookmarkStart w:id="93" w:name="eq-model-correlated-random-effects"/>
+      <w:bookmarkStart w:id="97" w:name="eq-model-correlated-random-effects"/>
       <m:oMathPara>
         <m:oMathParaPr>
           <m:jc m:val="center"/>
@@ -5813,7 +5906,7 @@
           </m:d>
         </m:oMath>
       </m:oMathPara>
-      <w:bookmarkEnd w:id="93"/>
+      <w:bookmarkEnd w:id="97"/>
     </w:p>
     <w:p>
       <w:pPr>
@@ -6203,8 +6296,8 @@
         </m:oMath>
       </m:oMathPara>
     </w:p>
-    <w:bookmarkEnd w:id="94"/>
-    <w:bookmarkStart w:id="96" w:name="Xb7b1d3ff7c24f0b8dca2081a41dd1947ef59e07"/>
+    <w:bookmarkEnd w:id="98"/>
+    <w:bookmarkStart w:id="100" w:name="Xb7b1d3ff7c24f0b8dca2081a41dd1947ef59e07"/>
     <w:p>
       <w:pPr>
         <w:pStyle w:val="Heading4"/>
@@ -6248,7 +6341,7 @@
       <w:pPr>
         <w:pStyle w:val="BodyText"/>
       </w:pPr>
-      <w:bookmarkStart w:id="95" w:name="eq-spline-model"/>
+      <w:bookmarkStart w:id="99" w:name="eq-spline-model"/>
       <m:oMathPara>
         <m:oMathParaPr>
           <m:jc m:val="center"/>
@@ -6525,7 +6618,7 @@
           </m:d>
         </m:oMath>
       </m:oMathPara>
-      <w:bookmarkEnd w:id="95"/>
+      <w:bookmarkEnd w:id="99"/>
     </w:p>
     <w:p>
       <w:pPr>
@@ -6540,7 +6633,7 @@
         <w:pStyle w:val="Compact"/>
         <w:numPr>
           <w:ilvl w:val="0"/>
-          <w:numId w:val="1013"/>
+          <w:numId w:val="1012"/>
         </w:numPr>
       </w:pPr>
       <m:oMath>
@@ -6560,7 +6653,7 @@
         <w:pStyle w:val="Compact"/>
         <w:numPr>
           <w:ilvl w:val="0"/>
-          <w:numId w:val="1013"/>
+          <w:numId w:val="1012"/>
         </w:numPr>
       </w:pPr>
       <m:oMath>
@@ -6652,7 +6745,7 @@
         <w:pStyle w:val="Compact"/>
         <w:numPr>
           <w:ilvl w:val="0"/>
-          <w:numId w:val="1013"/>
+          <w:numId w:val="1012"/>
         </w:numPr>
       </w:pPr>
       <m:oMath>
@@ -6687,8 +6780,8 @@
         <w:t xml:space="preserve">th spline basis function.</w:t>
       </w:r>
     </w:p>
-    <w:bookmarkEnd w:id="96"/>
-    <w:bookmarkStart w:id="98" w:name="models-exploring-lag-and-weaning-effects"/>
+    <w:bookmarkEnd w:id="100"/>
+    <w:bookmarkStart w:id="102" w:name="models-exploring-lag-and-weaning-effects"/>
     <w:p>
       <w:pPr>
         <w:pStyle w:val="Heading4"/>
@@ -6723,7 +6816,7 @@
       <w:pPr>
         <w:pStyle w:val="BodyText"/>
       </w:pPr>
-      <w:bookmarkStart w:id="97" w:name="eq-lag-weaning-model"/>
+      <w:bookmarkStart w:id="101" w:name="eq-lag-weaning-model"/>
       <m:oMathPara>
         <m:oMathParaPr>
           <m:jc m:val="center"/>
@@ -6974,7 +7067,7 @@
           </m:d>
         </m:oMath>
       </m:oMathPara>
-      <w:bookmarkEnd w:id="97"/>
+      <w:bookmarkEnd w:id="101"/>
     </w:p>
     <w:p>
       <w:pPr>
@@ -7040,9 +7133,9 @@
         <w:t xml:space="preserve">is the number of periods since first exposure.</w:t>
       </w:r>
     </w:p>
-    <w:bookmarkEnd w:id="98"/>
-    <w:bookmarkEnd w:id="99"/>
-    <w:bookmarkStart w:id="100" w:name="adjusted-analyses"/>
+    <w:bookmarkEnd w:id="102"/>
+    <w:bookmarkEnd w:id="103"/>
+    <w:bookmarkStart w:id="104" w:name="adjusted-analyses"/>
     <w:p>
       <w:pPr>
         <w:pStyle w:val="Heading3"/>
@@ -7070,7 +7163,7 @@
         <w:pStyle w:val="Compact"/>
         <w:numPr>
           <w:ilvl w:val="0"/>
-          <w:numId w:val="1014"/>
+          <w:numId w:val="1013"/>
         </w:numPr>
       </w:pPr>
       <w:r>
@@ -7082,7 +7175,7 @@
         <w:pStyle w:val="Compact"/>
         <w:numPr>
           <w:ilvl w:val="0"/>
-          <w:numId w:val="1014"/>
+          <w:numId w:val="1013"/>
         </w:numPr>
       </w:pPr>
       <w:r>
@@ -7094,7 +7187,7 @@
         <w:pStyle w:val="Compact"/>
         <w:numPr>
           <w:ilvl w:val="0"/>
-          <w:numId w:val="1014"/>
+          <w:numId w:val="1013"/>
         </w:numPr>
       </w:pPr>
       <w:r>
@@ -7106,7 +7199,7 @@
         <w:pStyle w:val="Compact"/>
         <w:numPr>
           <w:ilvl w:val="0"/>
-          <w:numId w:val="1014"/>
+          <w:numId w:val="1013"/>
         </w:numPr>
       </w:pPr>
       <w:r>
@@ -7118,7 +7211,7 @@
         <w:pStyle w:val="Compact"/>
         <w:numPr>
           <w:ilvl w:val="0"/>
-          <w:numId w:val="1014"/>
+          <w:numId w:val="1013"/>
         </w:numPr>
       </w:pPr>
       <w:r>
@@ -7130,7 +7223,7 @@
         <w:pStyle w:val="Compact"/>
         <w:numPr>
           <w:ilvl w:val="0"/>
-          <w:numId w:val="1014"/>
+          <w:numId w:val="1013"/>
         </w:numPr>
       </w:pPr>
       <w:r>
@@ -7162,8 +7255,8 @@
         <w:t xml:space="preserve">as fixed effects. We will model the continuous covariates assuming linear effects. We will assume no interaction between subgroups and secular time trends, which may be evaluated in future analyses if indicated.</w:t>
       </w:r>
     </w:p>
-    <w:bookmarkEnd w:id="100"/>
-    <w:bookmarkStart w:id="101" w:name="subgroup-analyses"/>
+    <w:bookmarkEnd w:id="104"/>
+    <w:bookmarkStart w:id="105" w:name="subgroup-analyses"/>
     <w:p>
       <w:pPr>
         <w:pStyle w:val="Heading3"/>
@@ -7185,7 +7278,7 @@
         <w:pStyle w:val="Compact"/>
         <w:numPr>
           <w:ilvl w:val="0"/>
-          <w:numId w:val="1015"/>
+          <w:numId w:val="1014"/>
         </w:numPr>
       </w:pPr>
       <w:r>
@@ -7197,7 +7290,7 @@
         <w:pStyle w:val="Compact"/>
         <w:numPr>
           <w:ilvl w:val="0"/>
-          <w:numId w:val="1015"/>
+          <w:numId w:val="1014"/>
         </w:numPr>
       </w:pPr>
       <w:r>
@@ -7215,7 +7308,7 @@
         <w:pStyle w:val="Compact"/>
         <w:numPr>
           <w:ilvl w:val="0"/>
-          <w:numId w:val="1015"/>
+          <w:numId w:val="1014"/>
         </w:numPr>
       </w:pPr>
       <w:r>
@@ -7227,7 +7320,7 @@
         <w:pStyle w:val="Compact"/>
         <w:numPr>
           <w:ilvl w:val="0"/>
-          <w:numId w:val="1015"/>
+          <w:numId w:val="1014"/>
         </w:numPr>
       </w:pPr>
       <w:r>
@@ -7248,7 +7341,7 @@
         <w:pStyle w:val="Compact"/>
         <w:numPr>
           <w:ilvl w:val="0"/>
-          <w:numId w:val="1015"/>
+          <w:numId w:val="1014"/>
         </w:numPr>
       </w:pPr>
       <w:r>
@@ -7260,7 +7353,7 @@
         <w:pStyle w:val="Compact"/>
         <w:numPr>
           <w:ilvl w:val="0"/>
-          <w:numId w:val="1015"/>
+          <w:numId w:val="1014"/>
         </w:numPr>
       </w:pPr>
       <w:r>
@@ -7289,8 +7382,8 @@
         <w:t xml:space="preserve">.</w:t>
       </w:r>
     </w:p>
-    <w:bookmarkEnd w:id="101"/>
-    <w:bookmarkStart w:id="102" w:name="treatment-of-missing-data"/>
+    <w:bookmarkEnd w:id="105"/>
+    <w:bookmarkStart w:id="106" w:name="sec-treatment-of-missing-data"/>
     <w:p>
       <w:pPr>
         <w:pStyle w:val="Heading3"/>
@@ -7307,9 +7400,9 @@
         <w:t xml:space="preserve">We will present the frequency and percentage of missing data for all variables. If the percentage of missing data for the primary outcome is less than 10%, we will perform a complete case analysis. If the percentage of missing data for the primary outcome is 10% or more, we will handle missing data depending on the missing data mechanism. If the data are missing at random (MAR), we will perform multiple imputation using multiple imputation by chained equations (MICE), imputing data for the primary outcome as well as all covariates included in the fully adjusted model. The number of imputations will be determined by the percentage of missing data, with a minimum of 20 imputations. If there is evidence that the data are missing not at random (MNAR), we will explore the impact of this assumption using a sensitivity analysis (e.g., pattern mixture models or selection models) to assess how robust our findings are to different assumptions about the missing data mechanism. Evidence that data are MNAR may include systematic differences in missingness across observed covariates, patterns suggestive of non-random dropout, or clinical expectations that missingness is related to unmeasured outcomes. Additionally, we will perform diagnostic checks after multiple imputation to ensure the quality of the imputation process, including comparing distributions of observed and imputed data and checking convergence.</w:t>
       </w:r>
     </w:p>
-    <w:bookmarkEnd w:id="102"/>
-    <w:bookmarkEnd w:id="103"/>
-    <w:bookmarkStart w:id="117" w:name="analysis-of-secondary-outcomes"/>
+    <w:bookmarkEnd w:id="106"/>
+    <w:bookmarkEnd w:id="107"/>
+    <w:bookmarkStart w:id="121" w:name="analysis-of-secondary-outcomes"/>
     <w:p>
       <w:pPr>
         <w:pStyle w:val="Heading2"/>
@@ -7326,7 +7419,7 @@
         <w:t xml:space="preserve">Unless otherwise stated, secondary outcomes will be analysed using the same mixed-effects modelling framework as specified for the primary outcome, including fixed effects for time and intervention exposure and random effects for cluster and cluster-by-period, with the link function and outcome distribution adapted to the scale of the outcome.</w:t>
       </w:r>
     </w:p>
-    <w:bookmarkStart w:id="104" w:name="Xf8ad26412ad98b449304d4475d81963b294c2ae"/>
+    <w:bookmarkStart w:id="108" w:name="Xf8ad26412ad98b449304d4475d81963b294c2ae"/>
     <w:p>
       <w:pPr>
         <w:pStyle w:val="Heading3"/>
@@ -7357,8 +7450,8 @@
         <w:t xml:space="preserve">, to estimate odds ratios and absolute risk differences.</w:t>
       </w:r>
     </w:p>
-    <w:bookmarkEnd w:id="104"/>
-    <w:bookmarkStart w:id="107" w:name="X89c97a0c38ba473d58b2facce729a073a7e8df9"/>
+    <w:bookmarkEnd w:id="108"/>
+    <w:bookmarkStart w:id="111" w:name="X89c97a0c38ba473d58b2facce729a073a7e8df9"/>
     <w:p>
       <w:pPr>
         <w:pStyle w:val="Heading3"/>
@@ -7387,7 +7480,7 @@
       <w:pPr>
         <w:pStyle w:val="BodyText"/>
       </w:pPr>
-      <w:bookmarkStart w:id="105" w:name="eq-ordinal-model"/>
+      <w:bookmarkStart w:id="109" w:name="eq-ordinal-model"/>
       <m:oMathPara>
         <m:oMathParaPr>
           <m:jc m:val="center"/>
@@ -7587,7 +7680,7 @@
           </m:d>
         </m:oMath>
       </m:oMathPara>
-      <w:bookmarkEnd w:id="105"/>
+      <w:bookmarkEnd w:id="109"/>
     </w:p>
     <w:p>
       <w:pPr>
@@ -7643,7 +7736,7 @@
       <w:pPr>
         <w:pStyle w:val="BodyText"/>
       </w:pPr>
-      <w:bookmarkStart w:id="106" w:name="eq-linear-model"/>
+      <w:bookmarkStart w:id="110" w:name="eq-linear-model"/>
       <m:oMathPara>
         <m:oMathParaPr>
           <m:jc m:val="center"/>
@@ -7895,10 +7988,10 @@
           </m:d>
         </m:oMath>
       </m:oMathPara>
-      <w:bookmarkEnd w:id="106"/>
-    </w:p>
-    <w:bookmarkEnd w:id="107"/>
-    <w:bookmarkStart w:id="108" w:name="X90cb4e0ebfb4fe618dcdd24cc99dbcaedd01b78"/>
+      <w:bookmarkEnd w:id="110"/>
+    </w:p>
+    <w:bookmarkEnd w:id="111"/>
+    <w:bookmarkStart w:id="112" w:name="X90cb4e0ebfb4fe618dcdd24cc99dbcaedd01b78"/>
     <w:p>
       <w:pPr>
         <w:pStyle w:val="Heading3"/>
@@ -7964,8 +8057,8 @@
         <w:t xml:space="preserve">.</w:t>
       </w:r>
     </w:p>
-    <w:bookmarkEnd w:id="108"/>
-    <w:bookmarkStart w:id="109" w:name="X0c0155e4b87aec11ab06b9d09220f8543002113"/>
+    <w:bookmarkEnd w:id="112"/>
+    <w:bookmarkStart w:id="113" w:name="X0c0155e4b87aec11ab06b9d09220f8543002113"/>
     <w:p>
       <w:pPr>
         <w:pStyle w:val="Heading3"/>
@@ -7999,8 +8092,8 @@
         <w:t xml:space="preserve">with the logit link.</w:t>
       </w:r>
     </w:p>
-    <w:bookmarkEnd w:id="109"/>
-    <w:bookmarkStart w:id="111" w:name="length-of-emergency-department-stay"/>
+    <w:bookmarkEnd w:id="113"/>
+    <w:bookmarkStart w:id="115" w:name="length-of-emergency-department-stay"/>
     <w:p>
       <w:pPr>
         <w:pStyle w:val="Heading3"/>
@@ -8035,7 +8128,7 @@
       <w:pPr>
         <w:pStyle w:val="BodyText"/>
       </w:pPr>
-      <w:bookmarkStart w:id="110" w:name="eq-competing-risks-model"/>
+      <w:bookmarkStart w:id="114" w:name="eq-competing-risks-model"/>
       <m:oMathPara>
         <m:oMathParaPr>
           <m:jc m:val="center"/>
@@ -8229,7 +8322,7 @@
           </m:d>
         </m:oMath>
       </m:oMathPara>
-      <w:bookmarkEnd w:id="110"/>
+      <w:bookmarkEnd w:id="114"/>
     </w:p>
     <w:p>
       <w:pPr>
@@ -8244,7 +8337,7 @@
         <w:pStyle w:val="Compact"/>
         <w:numPr>
           <w:ilvl w:val="0"/>
-          <w:numId w:val="1016"/>
+          <w:numId w:val="1015"/>
         </w:numPr>
       </w:pPr>
       <m:oMath>
@@ -8340,7 +8433,7 @@
         <w:pStyle w:val="Compact"/>
         <w:numPr>
           <w:ilvl w:val="0"/>
-          <w:numId w:val="1016"/>
+          <w:numId w:val="1015"/>
         </w:numPr>
       </w:pPr>
       <m:oMath>
@@ -8394,7 +8487,7 @@
         <w:pStyle w:val="Compact"/>
         <w:numPr>
           <w:ilvl w:val="0"/>
-          <w:numId w:val="1016"/>
+          <w:numId w:val="1015"/>
         </w:numPr>
       </w:pPr>
       <m:oMath>
@@ -8411,15 +8504,15 @@
         <w:pStyle w:val="Compact"/>
         <w:numPr>
           <w:ilvl w:val="0"/>
-          <w:numId w:val="1016"/>
+          <w:numId w:val="1015"/>
         </w:numPr>
       </w:pPr>
       <w:r>
         <w:t xml:space="preserve">All other terms are defined as in the primary analysis model.</w:t>
       </w:r>
     </w:p>
-    <w:bookmarkEnd w:id="111"/>
-    <w:bookmarkStart w:id="112" w:name="length-of-hospital-stay"/>
+    <w:bookmarkEnd w:id="115"/>
+    <w:bookmarkStart w:id="116" w:name="length-of-hospital-stay"/>
     <w:p>
       <w:pPr>
         <w:pStyle w:val="Heading3"/>
@@ -8450,8 +8543,8 @@
         <w:t xml:space="preserve">.</w:t>
       </w:r>
     </w:p>
-    <w:bookmarkEnd w:id="112"/>
-    <w:bookmarkStart w:id="113" w:name="intensive-care-unit-admission"/>
+    <w:bookmarkEnd w:id="116"/>
+    <w:bookmarkStart w:id="117" w:name="intensive-care-unit-admission"/>
     <w:p>
       <w:pPr>
         <w:pStyle w:val="Heading3"/>
@@ -8485,8 +8578,8 @@
         <w:t xml:space="preserve">with the logit link.</w:t>
       </w:r>
     </w:p>
-    <w:bookmarkEnd w:id="113"/>
-    <w:bookmarkStart w:id="114" w:name="length-of-intensive-care-unit-stay"/>
+    <w:bookmarkEnd w:id="117"/>
+    <w:bookmarkStart w:id="118" w:name="length-of-intensive-care-unit-stay"/>
     <w:p>
       <w:pPr>
         <w:pStyle w:val="Heading3"/>
@@ -8517,8 +8610,8 @@
         <w:t xml:space="preserve">.</w:t>
       </w:r>
     </w:p>
-    <w:bookmarkEnd w:id="114"/>
-    <w:bookmarkStart w:id="116" w:name="X5037a1d47abaf80439915bb3ba5c524d444c7d7"/>
+    <w:bookmarkEnd w:id="118"/>
+    <w:bookmarkStart w:id="120" w:name="X5037a1d47abaf80439915bb3ba5c524d444c7d7"/>
     <w:p>
       <w:pPr>
         <w:pStyle w:val="Heading3"/>
@@ -8559,7 +8652,7 @@
       <w:pPr>
         <w:pStyle w:val="BodyText"/>
       </w:pPr>
-      <w:bookmarkStart w:id="115" w:name="eq-beta-model"/>
+      <w:bookmarkStart w:id="119" w:name="eq-beta-model"/>
       <m:oMathPara>
         <m:oMathParaPr>
           <m:jc m:val="center"/>
@@ -8738,7 +8831,7 @@
           </m:d>
         </m:oMath>
       </m:oMathPara>
-      <w:bookmarkEnd w:id="115"/>
+      <w:bookmarkEnd w:id="119"/>
     </w:p>
     <w:p>
       <w:pPr>
@@ -8844,10 +8937,10 @@
         <w:t xml:space="preserve">prior to fitting the beta regression model. A beta regression precision (dispersion) parameter will be estimated as part of the model.</w:t>
       </w:r>
     </w:p>
-    <w:bookmarkEnd w:id="116"/>
-    <w:bookmarkEnd w:id="117"/>
-    <w:bookmarkEnd w:id="118"/>
-    <w:bookmarkStart w:id="140" w:name="references"/>
+    <w:bookmarkEnd w:id="120"/>
+    <w:bookmarkEnd w:id="121"/>
+    <w:bookmarkEnd w:id="122"/>
+    <w:bookmarkStart w:id="144" w:name="references"/>
     <w:p>
       <w:pPr>
         <w:pStyle w:val="Heading1"/>
@@ -8856,8 +8949,8 @@
         <w:t xml:space="preserve">6. References</w:t>
       </w:r>
     </w:p>
-    <w:bookmarkStart w:id="139" w:name="refs"/>
-    <w:bookmarkStart w:id="119" w:name="ref-Kasza2022"/>
+    <w:bookmarkStart w:id="143" w:name="refs"/>
+    <w:bookmarkStart w:id="123" w:name="ref-Kasza2022"/>
     <w:p>
       <w:pPr>
         <w:pStyle w:val="Bibliography"/>
@@ -8911,8 +9004,8 @@
         <w:t xml:space="preserve">, 3627–3641 (2022).</w:t>
       </w:r>
     </w:p>
-    <w:bookmarkEnd w:id="119"/>
-    <w:bookmarkStart w:id="120" w:name="ref-grantham_staircase_2024"/>
+    <w:bookmarkEnd w:id="123"/>
+    <w:bookmarkStart w:id="124" w:name="ref-grantham_staircase_2024"/>
     <w:p>
       <w:pPr>
         <w:pStyle w:val="Bibliography"/>
@@ -8978,8 +9071,8 @@
         <w:t xml:space="preserve">, 24–41 (2024).</w:t>
       </w:r>
     </w:p>
-    <w:bookmarkEnd w:id="120"/>
-    <w:bookmarkStart w:id="121" w:name="ref-aukstakalnis_impact_2024"/>
+    <w:bookmarkEnd w:id="124"/>
+    <w:bookmarkStart w:id="125" w:name="ref-aukstakalnis_impact_2024"/>
     <w:p>
       <w:pPr>
         <w:pStyle w:val="Bibliography"/>
@@ -9026,8 +9119,8 @@
         <w:t xml:space="preserve">(2024).</w:t>
       </w:r>
     </w:p>
-    <w:bookmarkEnd w:id="121"/>
-    <w:bookmarkStart w:id="122" w:name="ref-Hemming2020Feb"/>
+    <w:bookmarkEnd w:id="125"/>
+    <w:bookmarkStart w:id="126" w:name="ref-Hemming2020Feb"/>
     <w:p>
       <w:pPr>
         <w:pStyle w:val="Bibliography"/>
@@ -9081,8 +9174,8 @@
         <w:t xml:space="preserve">, 979–995 (2020).</w:t>
       </w:r>
     </w:p>
-    <w:bookmarkEnd w:id="122"/>
-    <w:bookmarkStart w:id="123" w:name="ref-nakhid_effect_2026"/>
+    <w:bookmarkEnd w:id="126"/>
+    <w:bookmarkStart w:id="127" w:name="ref-nakhid_effect_2026"/>
     <w:p>
       <w:pPr>
         <w:pStyle w:val="Bibliography"/>
@@ -9129,8 +9222,8 @@
         <w:t xml:space="preserve">(2026).</w:t>
       </w:r>
     </w:p>
-    <w:bookmarkEnd w:id="123"/>
-    <w:bookmarkStart w:id="124" w:name="ref-gerdin_warnberg_feasibility_2025"/>
+    <w:bookmarkEnd w:id="127"/>
+    <w:bookmarkStart w:id="128" w:name="ref-gerdin_warnberg_feasibility_2025"/>
     <w:p>
       <w:pPr>
         <w:pStyle w:val="Bibliography"/>
@@ -9193,8 +9286,8 @@
         <w:t xml:space="preserve">, e099020 (2025).</w:t>
       </w:r>
     </w:p>
-    <w:bookmarkEnd w:id="124"/>
-    <w:bookmarkStart w:id="125" w:name="ref-Campbell2005"/>
+    <w:bookmarkEnd w:id="128"/>
+    <w:bookmarkStart w:id="129" w:name="ref-Campbell2005"/>
     <w:p>
       <w:pPr>
         <w:pStyle w:val="Bibliography"/>
@@ -9248,8 +9341,8 @@
         <w:t xml:space="preserve">, 99–107 (2005).</w:t>
       </w:r>
     </w:p>
-    <w:bookmarkEnd w:id="125"/>
-    <w:bookmarkStart w:id="126" w:name="ref-Eldridge2015"/>
+    <w:bookmarkEnd w:id="129"/>
+    <w:bookmarkStart w:id="130" w:name="ref-Eldridge2015"/>
     <w:p>
       <w:pPr>
         <w:pStyle w:val="Bibliography"/>
@@ -9303,8 +9396,8 @@
         <w:t xml:space="preserve">, 1039–1056 (2015).</w:t>
       </w:r>
     </w:p>
-    <w:bookmarkEnd w:id="126"/>
-    <w:bookmarkStart w:id="127" w:name="ref-Martin2016"/>
+    <w:bookmarkEnd w:id="130"/>
+    <w:bookmarkStart w:id="131" w:name="ref-Martin2016"/>
     <w:p>
       <w:pPr>
         <w:pStyle w:val="Bibliography"/>
@@ -9358,8 +9451,8 @@
         <w:t xml:space="preserve">, (2016).</w:t>
       </w:r>
     </w:p>
-    <w:bookmarkEnd w:id="127"/>
-    <w:bookmarkStart w:id="128" w:name="ref-Korevaar2021"/>
+    <w:bookmarkEnd w:id="131"/>
+    <w:bookmarkStart w:id="132" w:name="ref-Korevaar2021"/>
     <w:p>
       <w:pPr>
         <w:pStyle w:val="Bibliography"/>
@@ -9413,8 +9506,8 @@
         <w:t xml:space="preserve">, 529–540 (2021).</w:t>
       </w:r>
     </w:p>
-    <w:bookmarkEnd w:id="128"/>
-    <w:bookmarkStart w:id="129" w:name="ref-lashoher_implementation_2017"/>
+    <w:bookmarkEnd w:id="132"/>
+    <w:bookmarkStart w:id="133" w:name="ref-lashoher_implementation_2017"/>
     <w:p>
       <w:pPr>
         <w:pStyle w:val="Bibliography"/>
@@ -9582,8 +9675,8 @@
         <w:t xml:space="preserve">, 954–962 (2017).</w:t>
       </w:r>
     </w:p>
-    <w:bookmarkEnd w:id="129"/>
-    <w:bookmarkStart w:id="130" w:name="ref-kapitan_effect_2024"/>
+    <w:bookmarkEnd w:id="133"/>
+    <w:bookmarkStart w:id="134" w:name="ref-kapitan_effect_2024"/>
     <w:p>
       <w:pPr>
         <w:pStyle w:val="Bibliography"/>
@@ -9639,8 +9732,8 @@
         <w:t xml:space="preserve">2024.09.28.24314529 (2024).</w:t>
       </w:r>
     </w:p>
-    <w:bookmarkEnd w:id="130"/>
-    <w:bookmarkStart w:id="131" w:name="ref-higgins_psychometric_2021"/>
+    <w:bookmarkEnd w:id="134"/>
+    <w:bookmarkStart w:id="135" w:name="ref-higgins_psychometric_2021"/>
     <w:p>
       <w:pPr>
         <w:pStyle w:val="Bibliography"/>
@@ -9706,8 +9799,8 @@
         <w:t xml:space="preserve">, 103–112 (2021).</w:t>
       </w:r>
     </w:p>
-    <w:bookmarkEnd w:id="131"/>
-    <w:bookmarkStart w:id="132" w:name="ref-R"/>
+    <w:bookmarkEnd w:id="135"/>
+    <w:bookmarkStart w:id="136" w:name="ref-R"/>
     <w:p>
       <w:pPr>
         <w:pStyle w:val="Bibliography"/>
@@ -9738,8 +9831,8 @@
         <w:t xml:space="preserve">. (R Foundation for Statistical Computing, 2023).</w:t>
       </w:r>
     </w:p>
-    <w:bookmarkEnd w:id="132"/>
-    <w:bookmarkStart w:id="133" w:name="ref-Hemming2018"/>
+    <w:bookmarkEnd w:id="136"/>
+    <w:bookmarkStart w:id="137" w:name="ref-Hemming2018"/>
     <w:p>
       <w:pPr>
         <w:pStyle w:val="Bibliography"/>
@@ -9786,8 +9879,8 @@
         <w:t xml:space="preserve">k1614 (2018).</w:t>
       </w:r>
     </w:p>
-    <w:bookmarkEnd w:id="133"/>
-    <w:bookmarkStart w:id="134" w:name="ref-grantham_evaluating_2022"/>
+    <w:bookmarkEnd w:id="137"/>
+    <w:bookmarkStart w:id="138" w:name="ref-grantham_evaluating_2022"/>
     <w:p>
       <w:pPr>
         <w:pStyle w:val="Bibliography"/>
@@ -9853,8 +9946,8 @@
         <w:t xml:space="preserve">, 112 (2022).</w:t>
       </w:r>
     </w:p>
-    <w:bookmarkEnd w:id="134"/>
-    <w:bookmarkStart w:id="135" w:name="ref-kenny_analysis_2022"/>
+    <w:bookmarkEnd w:id="138"/>
+    <w:bookmarkStart w:id="139" w:name="ref-kenny_analysis_2022"/>
     <w:p>
       <w:pPr>
         <w:pStyle w:val="Bibliography"/>
@@ -9901,8 +9994,8 @@
         <w:t xml:space="preserve">10.1002/sim.9511 (2022).</w:t>
       </w:r>
     </w:p>
-    <w:bookmarkEnd w:id="135"/>
-    <w:bookmarkStart w:id="136" w:name="ref-Diaz2021"/>
+    <w:bookmarkEnd w:id="139"/>
+    <w:bookmarkStart w:id="140" w:name="ref-Diaz2021"/>
     <w:p>
       <w:pPr>
         <w:pStyle w:val="Bibliography"/>
@@ -9956,8 +10049,8 @@
         <w:t xml:space="preserve">, e436–e443 (2021).</w:t>
       </w:r>
     </w:p>
-    <w:bookmarkEnd w:id="136"/>
-    <w:bookmarkStart w:id="137" w:name="ref-hornor_quality_2018"/>
+    <w:bookmarkEnd w:id="140"/>
+    <w:bookmarkStart w:id="141" w:name="ref-hornor_quality_2018"/>
     <w:p>
       <w:pPr>
         <w:pStyle w:val="Bibliography"/>
@@ -10053,8 +10146,8 @@
         <w:t xml:space="preserve">, 160–169 (2018).</w:t>
       </w:r>
     </w:p>
-    <w:bookmarkEnd w:id="137"/>
-    <w:bookmarkStart w:id="138" w:name="ref-ustun_measuring_2010"/>
+    <w:bookmarkEnd w:id="141"/>
+    <w:bookmarkStart w:id="142" w:name="ref-ustun_measuring_2010"/>
     <w:p>
       <w:pPr>
         <w:pStyle w:val="Bibliography"/>
@@ -10263,9 +10356,9 @@
         <w:t xml:space="preserve">. (World Health Organization, 2010).</w:t>
       </w:r>
     </w:p>
-    <w:bookmarkEnd w:id="138"/>
-    <w:bookmarkEnd w:id="139"/>
-    <w:bookmarkEnd w:id="140"/>
+    <w:bookmarkEnd w:id="142"/>
+    <w:bookmarkEnd w:id="143"/>
+    <w:bookmarkEnd w:id="144"/>
     <w:sectPr>
       <w:footnotePr>
         <w:numRestart w:val="eachSect"/>
@@ -10835,9 +10928,6 @@
     <w:abstractNumId w:val="991"/>
   </w:num>
   <w:num w:numId="1005">
-    <w:abstractNumId w:val="991"/>
-  </w:num>
-  <w:num w:numId="1006">
     <w:abstractNumId w:val="99411"/>
     <w:lvlOverride w:ilvl="0">
       <w:startOverride w:val="1"/>
@@ -10867,7 +10957,7 @@
       <w:startOverride w:val="1"/>
     </w:lvlOverride>
   </w:num>
-  <w:num w:numId="1007">
+  <w:num w:numId="1006">
     <w:abstractNumId w:val="99412"/>
     <w:lvlOverride w:ilvl="0">
       <w:startOverride w:val="2"/>
@@ -10897,7 +10987,7 @@
       <w:startOverride w:val="2"/>
     </w:lvlOverride>
   </w:num>
-  <w:num w:numId="1008">
+  <w:num w:numId="1007">
     <w:abstractNumId w:val="99413"/>
     <w:lvlOverride w:ilvl="0">
       <w:startOverride w:val="3"/>
@@ -10927,7 +11017,7 @@
       <w:startOverride w:val="3"/>
     </w:lvlOverride>
   </w:num>
-  <w:num w:numId="1009">
+  <w:num w:numId="1008">
     <w:abstractNumId w:val="99414"/>
     <w:lvlOverride w:ilvl="0">
       <w:startOverride w:val="4"/>
@@ -10957,6 +11047,9 @@
       <w:startOverride w:val="4"/>
     </w:lvlOverride>
   </w:num>
+  <w:num w:numId="1009">
+    <w:abstractNumId w:val="991"/>
+  </w:num>
   <w:num w:numId="1010">
     <w:abstractNumId w:val="991"/>
   </w:num>
@@ -10973,9 +11066,6 @@
     <w:abstractNumId w:val="991"/>
   </w:num>
   <w:num w:numId="1015">
-    <w:abstractNumId w:val="991"/>
-  </w:num>
-  <w:num w:numId="1016">
     <w:abstractNumId w:val="991"/>
   </w:num>
 </w:numbering>

</xml_diff>

<commit_message>
Add table of cluster characteristics to SAP
</commit_message>
<xml_diff>
--- a/statistical-analysis-plan/statistical-analysis-plan.docx
+++ b/statistical-analysis-plan/statistical-analysis-plan.docx
@@ -1192,7 +1192,7 @@
     </w:p>
     <w:bookmarkEnd w:id="48"/>
     <w:bookmarkEnd w:id="49"/>
-    <w:bookmarkStart w:id="122" w:name="statistical-analysis"/>
+    <w:bookmarkStart w:id="123" w:name="statistical-analysis"/>
     <w:p>
       <w:pPr>
         <w:pStyle w:val="Heading1"/>
@@ -2317,7 +2317,7 @@
       </w:tr>
     </w:tbl>
     <w:bookmarkEnd w:id="81"/>
-    <w:bookmarkStart w:id="84" w:name="baseline-analyses"/>
+    <w:bookmarkStart w:id="85" w:name="baseline-analyses"/>
     <w:p>
       <w:pPr>
         <w:pStyle w:val="Heading2"/>
@@ -2326,7 +2326,7 @@
         <w:t xml:space="preserve">5.8 Baseline analyses</w:t>
       </w:r>
     </w:p>
-    <w:bookmarkStart w:id="82" w:name="cluster-characteristics"/>
+    <w:bookmarkStart w:id="83" w:name="cluster-characteristics"/>
     <w:p>
       <w:pPr>
         <w:pStyle w:val="Heading3"/>
@@ -2340,11 +2340,3939 @@
         <w:pStyle w:val="FirstParagraph"/>
       </w:pPr>
       <w:r>
-        <w:t xml:space="preserve">We will describe cluster characteristics including location and size using frequencies and percentages for discrete variables and means, standard deviations, medians and interquartile ranges (Q1-Q3) for continuous variables.</w:t>
-      </w:r>
-    </w:p>
-    <w:bookmarkEnd w:id="82"/>
-    <w:bookmarkStart w:id="83" w:name="patient-characteristics"/>
+        <w:t xml:space="preserve">We will describe cluster characteristics including location and size using frequencies and percentages for discrete variables and medians and interquartile ranges (Q1-Q3) for continuous variables. See</w:t>
+      </w:r>
+      <w:r>
+        <w:t xml:space="preserve"> </w:t>
+      </w:r>
+      <w:hyperlink w:anchor="tbl-cluster-characteristics">
+        <w:r>
+          <w:rPr>
+            <w:rStyle w:val="Hyperlink"/>
+          </w:rPr>
+          <w:t xml:space="preserve">Table 2</w:t>
+        </w:r>
+      </w:hyperlink>
+      <w:r>
+        <w:t xml:space="preserve"> </w:t>
+      </w:r>
+      <w:r>
+        <w:t xml:space="preserve">for details.</w:t>
+      </w:r>
+    </w:p>
+    <w:tbl>
+      <w:tblPr>
+        <w:tblStyle w:val="Table"/>
+        <w:tblW w:type="pct" w:w="5000"/>
+        <w:tblLayout w:type="fixed"/>
+        <w:tblLook w:firstRow="0" w:lastRow="0" w:firstColumn="0" w:lastColumn="0" w:noHBand="0" w:noVBand="0" w:val="0000"/>
+      </w:tblPr>
+      <w:tblGrid>
+        <w:gridCol w:w="7920"/>
+      </w:tblGrid>
+      <w:tr>
+        <w:tc>
+          <w:tcPr/>
+          <w:bookmarkStart w:id="82" w:name="tbl-cluster-characteristics"/>
+          <w:p>
+            <w:pPr>
+              <w:jc w:val="center"/>
+            </w:pPr>
+            <w:pPr>
+              <w:jc w:val="left"/>
+              <w:spacing w:before="200"/>
+              <w:pStyle w:val="ImageCaption"/>
+            </w:pPr>
+            <w:r>
+              <w:t xml:space="preserve">Table 2: Cluster characteristics</w:t>
+            </w:r>
+          </w:p>
+          <w:tbl xmlns:w="http://schemas.openxmlformats.org/wordprocessingml/2006/main" xmlns:wp="http://schemas.openxmlformats.org/drawingml/2006/wordprocessingDrawing" xmlns:r="http://schemas.openxmlformats.org/officeDocument/2006/relationships" xmlns:w14="http://schemas.microsoft.com/office/word/2010/wordml">
+            <w:tblPr>
+              <w:tblCellMar>
+                <w:top w:w="0" w:type="dxa"/>
+                <w:bottom w:w="0" w:type="dxa"/>
+                <w:start w:w="60" w:type="dxa"/>
+                <w:end w:w="60" w:type="dxa"/>
+              </w:tblCellMar>
+              <w:tblW w:type="auto" w:w="0"/>
+              <w:tblLook w:firstRow="0" w:lastRow="0" w:firstColumn="0" w:lastColumn="0" w:noHBand="0" w:noVBand="0"/>
+              <w:jc w:val="center"/>
+            </w:tblPr>
+            <w:tr>
+              <w:trPr>
+                <w:cantSplit/>
+                <w:tblHeader/>
+              </w:trPr>
+              <w:tc>
+                <w:tcPr>
+                  <w:tcBorders>
+                    <w:top w:val="single" w:sz="16" w:space="0" w:color="D3D3D3"/>
+                    <w:start w:val="single" w:space="0" w:color="D3D3D3"/>
+                  </w:tcBorders>
+                </w:tcPr>
+                <w:p>
+                  <w:pPr>
+                    <w:spacing w:before="0" w:after="60"/>
+                    <w:keepNext/>
+                  </w:pPr>
+                  <w:r>
+                    <w:rPr>
+                      <w:rFonts w:ascii="Calibri" w:hAnsi="Calibri"/>
+                      <w:sz w:val="20"/>
+                    </w:rPr>
+                    <w:t xml:space="default"/>
+                  </w:r>
+                </w:p>
+              </w:tc>
+              <w:tc>
+                <w:tcPr>
+                  <w:tcBorders>
+                    <w:top w:val="single" w:sz="16" w:space="0" w:color="D3D3D3"/>
+                    <w:bottom w:val="single" w:sz="16" w:space="0" w:color="D3D3D3"/>
+                  </w:tcBorders>
+                  <w:gridSpan w:val="5"/>
+                </w:tcPr>
+                <w:p>
+                  <w:pPr>
+                    <w:spacing w:before="0" w:after="60"/>
+                    <w:keepNext/>
+                    <w:jc w:val="center"/>
+                  </w:pPr>
+                  <w:r>
+                    <w:rPr>
+                      <w:b w:val="true"/>
+                      <w:rFonts w:ascii="Calibri" w:hAnsi="Calibri"/>
+                      <w:sz w:val="20"/>
+                    </w:rPr>
+                    <w:t xml:space="preserve">Implementation sequence</w:t>
+                  </w:r>
+                </w:p>
+              </w:tc>
+              <w:tc>
+                <w:tcPr>
+                  <w:tcBorders>
+                    <w:top w:val="single" w:sz="16" w:space="0" w:color="D3D3D3"/>
+                    <w:end w:val="single" w:space="0" w:color="D3D3D3"/>
+                  </w:tcBorders>
+                </w:tcPr>
+                <w:p>
+                  <w:pPr>
+                    <w:spacing w:before="0" w:after="60"/>
+                    <w:keepNext/>
+                  </w:pPr>
+                  <w:r>
+                    <w:rPr>
+                      <w:rFonts w:ascii="Calibri" w:hAnsi="Calibri"/>
+                      <w:sz w:val="20"/>
+                    </w:rPr>
+                    <w:t xml:space="default"/>
+                  </w:r>
+                </w:p>
+              </w:tc>
+            </w:tr>
+            <w:tr>
+              <w:trPr>
+                <w:cantSplit/>
+                <w:tblHeader/>
+              </w:trPr>
+              <w:tc>
+                <w:tcPr>
+                  <w:tcBorders>
+                    <w:bottom w:val="single" w:sz="16" w:space="0" w:color="D3D3D3"/>
+                    <w:start w:val="single" w:space="0" w:color="D3D3D3"/>
+                  </w:tcBorders>
+                </w:tcPr>
+                <w:p>
+                  <w:pPr>
+                    <w:spacing w:before="0" w:after="60"/>
+                    <w:keepNext/>
+                    <w:jc w:val="start"/>
+                  </w:pPr>
+                  <w:r>
+                    <w:rPr>
+                      <w:b w:val="true"/>
+                      <w:rFonts w:ascii="Calibri" w:hAnsi="Calibri"/>
+                      <w:sz w:val="20"/>
+                    </w:rPr>
+                    <w:t xml:space="preserve">Characteristic</w:t>
+                  </w:r>
+                </w:p>
+              </w:tc>
+              <w:tc>
+                <w:tcPr>
+                  <w:tcBorders>
+                    <w:bottom w:val="single" w:sz="16" w:space="0" w:color="D3D3D3"/>
+                  </w:tcBorders>
+                </w:tcPr>
+                <w:p>
+                  <w:pPr>
+                    <w:spacing w:before="0" w:after="60"/>
+                    <w:keepNext/>
+                    <w:jc w:val="center"/>
+                  </w:pPr>
+                  <w:r>
+                    <w:rPr>
+                      <w:b w:val="true"/>
+                      <w:rFonts w:ascii="Calibri" w:hAnsi="Calibri"/>
+                      <w:sz w:val="20"/>
+                    </w:rPr>
+                    <w:t xml:space="preserve">Sequence 1</w:t>
+                  </w:r>
+                </w:p>
+              </w:tc>
+              <w:tc>
+                <w:tcPr>
+                  <w:tcBorders>
+                    <w:bottom w:val="single" w:sz="16" w:space="0" w:color="D3D3D3"/>
+                  </w:tcBorders>
+                </w:tcPr>
+                <w:p>
+                  <w:pPr>
+                    <w:spacing w:before="0" w:after="60"/>
+                    <w:keepNext/>
+                    <w:jc w:val="center"/>
+                  </w:pPr>
+                  <w:r>
+                    <w:rPr>
+                      <w:b w:val="true"/>
+                      <w:rFonts w:ascii="Calibri" w:hAnsi="Calibri"/>
+                      <w:sz w:val="20"/>
+                    </w:rPr>
+                    <w:t xml:space="preserve">Sequence 2</w:t>
+                  </w:r>
+                </w:p>
+              </w:tc>
+              <w:tc>
+                <w:tcPr>
+                  <w:tcBorders>
+                    <w:bottom w:val="single" w:sz="16" w:space="0" w:color="D3D3D3"/>
+                  </w:tcBorders>
+                </w:tcPr>
+                <w:p>
+                  <w:pPr>
+                    <w:spacing w:before="0" w:after="60"/>
+                    <w:keepNext/>
+                    <w:jc w:val="center"/>
+                  </w:pPr>
+                  <w:r>
+                    <w:rPr>
+                      <w:b w:val="true"/>
+                      <w:rFonts w:ascii="Calibri" w:hAnsi="Calibri"/>
+                      <w:sz w:val="20"/>
+                    </w:rPr>
+                    <w:t xml:space="preserve">Sequence 3</w:t>
+                  </w:r>
+                </w:p>
+              </w:tc>
+              <w:tc>
+                <w:tcPr>
+                  <w:tcBorders>
+                    <w:bottom w:val="single" w:sz="16" w:space="0" w:color="D3D3D3"/>
+                  </w:tcBorders>
+                </w:tcPr>
+                <w:p>
+                  <w:pPr>
+                    <w:spacing w:before="0" w:after="60"/>
+                    <w:keepNext/>
+                    <w:jc w:val="center"/>
+                  </w:pPr>
+                  <w:r>
+                    <w:rPr>
+                      <w:b w:val="true"/>
+                      <w:rFonts w:ascii="Calibri" w:hAnsi="Calibri"/>
+                      <w:sz w:val="20"/>
+                    </w:rPr>
+                    <w:t xml:space="preserve">Sequence 4</w:t>
+                  </w:r>
+                </w:p>
+              </w:tc>
+              <w:tc>
+                <w:tcPr>
+                  <w:tcBorders>
+                    <w:bottom w:val="single" w:sz="16" w:space="0" w:color="D3D3D3"/>
+                  </w:tcBorders>
+                </w:tcPr>
+                <w:p>
+                  <w:pPr>
+                    <w:spacing w:before="0" w:after="60"/>
+                    <w:keepNext/>
+                    <w:jc w:val="center"/>
+                  </w:pPr>
+                  <w:r>
+                    <w:rPr>
+                      <w:b w:val="true"/>
+                      <w:rFonts w:ascii="Calibri" w:hAnsi="Calibri"/>
+                      <w:sz w:val="20"/>
+                    </w:rPr>
+                    <w:t xml:space="preserve">Sequence 5</w:t>
+                  </w:r>
+                </w:p>
+              </w:tc>
+              <w:tc>
+                <w:tcPr>
+                  <w:tcBorders>
+                    <w:bottom w:val="single" w:sz="16" w:space="0" w:color="D3D3D3"/>
+                    <w:end w:val="single" w:space="0" w:color="D3D3D3"/>
+                  </w:tcBorders>
+                </w:tcPr>
+                <w:p>
+                  <w:pPr>
+                    <w:spacing w:before="0" w:after="60"/>
+                    <w:keepNext/>
+                    <w:jc w:val="center"/>
+                  </w:pPr>
+                  <w:r>
+                    <w:rPr>
+                      <w:b w:val="true"/>
+                      <w:rFonts w:ascii="Calibri" w:hAnsi="Calibri"/>
+                      <w:sz w:val="20"/>
+                    </w:rPr>
+                    <w:t xml:space="preserve">Overall</w:t>
+                  </w:r>
+                </w:p>
+              </w:tc>
+            </w:tr>
+            <w:tr>
+              <w:trPr>
+                <w:cantSplit/>
+              </w:trPr>
+              <w:tc>
+                <w:tcPr>
+                  <w:tcBorders>
+                    <w:top w:val="single" w:space="0" w:color="D3D3D3"/>
+                    <w:bottom w:val="single" w:space="0" w:color="D3D3D3"/>
+                    <w:start w:val="single" w:space="0" w:color="D3D3D3"/>
+                    <w:end w:val="single" w:space="0" w:color="D3D3D3"/>
+                  </w:tcBorders>
+                </w:tcPr>
+                <w:p>
+                  <w:pPr>
+                    <w:spacing w:before="0" w:after="60"/>
+                    <w:keepNext/>
+                    <w:jc w:val="start"/>
+                  </w:pPr>
+                  <w:r>
+                    <w:rPr>
+                      <w:rFonts w:ascii="Calibri" w:hAnsi="Calibri"/>
+                      <w:sz w:val="20"/>
+                    </w:rPr>
+                    <w:t xml:space="default">Monthly trauma patient volume, Median (Q1, Q3)</w:t>
+                  </w:r>
+                </w:p>
+              </w:tc>
+              <w:tc>
+                <w:tcPr>
+                  <w:tcBorders>
+                    <w:top w:val="single" w:space="0" w:color="D3D3D3"/>
+                    <w:bottom w:val="single" w:space="0" w:color="D3D3D3"/>
+                    <w:start w:val="single" w:space="0" w:color="D3D3D3"/>
+                    <w:end w:val="single" w:space="0" w:color="D3D3D3"/>
+                  </w:tcBorders>
+                </w:tcPr>
+                <w:p>
+                  <w:pPr>
+                    <w:spacing w:before="0" w:after="60"/>
+                    <w:keepNext/>
+                    <w:jc w:val="center"/>
+                  </w:pPr>
+                  <w:r>
+                    <w:rPr>
+                      <w:rFonts w:ascii="Calibri" w:hAnsi="Calibri"/>
+                      <w:sz w:val="20"/>
+                    </w:rPr>
+                    <w:t xml:space="default">median (Q1-Q3)</w:t>
+                  </w:r>
+                </w:p>
+              </w:tc>
+              <w:tc>
+                <w:tcPr>
+                  <w:tcBorders>
+                    <w:top w:val="single" w:space="0" w:color="D3D3D3"/>
+                    <w:bottom w:val="single" w:space="0" w:color="D3D3D3"/>
+                    <w:start w:val="single" w:space="0" w:color="D3D3D3"/>
+                    <w:end w:val="single" w:space="0" w:color="D3D3D3"/>
+                  </w:tcBorders>
+                </w:tcPr>
+                <w:p>
+                  <w:pPr>
+                    <w:spacing w:before="0" w:after="60"/>
+                    <w:keepNext/>
+                    <w:jc w:val="center"/>
+                  </w:pPr>
+                  <w:r>
+                    <w:rPr>
+                      <w:rFonts w:ascii="Calibri" w:hAnsi="Calibri"/>
+                      <w:sz w:val="20"/>
+                    </w:rPr>
+                    <w:t xml:space="default">median (Q1-Q3)</w:t>
+                  </w:r>
+                </w:p>
+              </w:tc>
+              <w:tc>
+                <w:tcPr>
+                  <w:tcBorders>
+                    <w:top w:val="single" w:space="0" w:color="D3D3D3"/>
+                    <w:bottom w:val="single" w:space="0" w:color="D3D3D3"/>
+                    <w:start w:val="single" w:space="0" w:color="D3D3D3"/>
+                    <w:end w:val="single" w:space="0" w:color="D3D3D3"/>
+                  </w:tcBorders>
+                </w:tcPr>
+                <w:p>
+                  <w:pPr>
+                    <w:spacing w:before="0" w:after="60"/>
+                    <w:keepNext/>
+                    <w:jc w:val="center"/>
+                  </w:pPr>
+                  <w:r>
+                    <w:rPr>
+                      <w:rFonts w:ascii="Calibri" w:hAnsi="Calibri"/>
+                      <w:sz w:val="20"/>
+                    </w:rPr>
+                    <w:t xml:space="default">median (Q1-Q3)</w:t>
+                  </w:r>
+                </w:p>
+              </w:tc>
+              <w:tc>
+                <w:tcPr>
+                  <w:tcBorders>
+                    <w:top w:val="single" w:space="0" w:color="D3D3D3"/>
+                    <w:bottom w:val="single" w:space="0" w:color="D3D3D3"/>
+                    <w:start w:val="single" w:space="0" w:color="D3D3D3"/>
+                    <w:end w:val="single" w:space="0" w:color="D3D3D3"/>
+                  </w:tcBorders>
+                </w:tcPr>
+                <w:p>
+                  <w:pPr>
+                    <w:spacing w:before="0" w:after="60"/>
+                    <w:keepNext/>
+                    <w:jc w:val="center"/>
+                  </w:pPr>
+                  <w:r>
+                    <w:rPr>
+                      <w:rFonts w:ascii="Calibri" w:hAnsi="Calibri"/>
+                      <w:sz w:val="20"/>
+                    </w:rPr>
+                    <w:t xml:space="default">median (Q1-Q3)</w:t>
+                  </w:r>
+                </w:p>
+              </w:tc>
+              <w:tc>
+                <w:tcPr>
+                  <w:tcBorders>
+                    <w:top w:val="single" w:space="0" w:color="D3D3D3"/>
+                    <w:bottom w:val="single" w:space="0" w:color="D3D3D3"/>
+                    <w:start w:val="single" w:space="0" w:color="D3D3D3"/>
+                    <w:end w:val="single" w:space="0" w:color="D3D3D3"/>
+                  </w:tcBorders>
+                </w:tcPr>
+                <w:p>
+                  <w:pPr>
+                    <w:spacing w:before="0" w:after="60"/>
+                    <w:keepNext/>
+                    <w:jc w:val="center"/>
+                  </w:pPr>
+                  <w:r>
+                    <w:rPr>
+                      <w:rFonts w:ascii="Calibri" w:hAnsi="Calibri"/>
+                      <w:sz w:val="20"/>
+                    </w:rPr>
+                    <w:t xml:space="default">median (Q1-Q3)</w:t>
+                  </w:r>
+                </w:p>
+              </w:tc>
+              <w:tc>
+                <w:tcPr>
+                  <w:tcBorders>
+                    <w:top w:val="single" w:space="0" w:color="D3D3D3"/>
+                    <w:bottom w:val="single" w:space="0" w:color="D3D3D3"/>
+                    <w:start w:val="single" w:space="0" w:color="D3D3D3"/>
+                    <w:end w:val="single" w:space="0" w:color="D3D3D3"/>
+                  </w:tcBorders>
+                </w:tcPr>
+                <w:p>
+                  <w:pPr>
+                    <w:spacing w:before="0" w:after="60"/>
+                    <w:keepNext/>
+                    <w:jc w:val="center"/>
+                  </w:pPr>
+                  <w:r>
+                    <w:rPr>
+                      <w:rFonts w:ascii="Calibri" w:hAnsi="Calibri"/>
+                      <w:sz w:val="20"/>
+                    </w:rPr>
+                    <w:t xml:space="default">median (Q1-Q3)</w:t>
+                  </w:r>
+                </w:p>
+              </w:tc>
+            </w:tr>
+            <w:tr>
+              <w:trPr>
+                <w:cantSplit/>
+              </w:trPr>
+              <w:tc>
+                <w:tcPr>
+                  <w:tcBorders>
+                    <w:top w:val="single" w:space="0" w:color="D3D3D3"/>
+                    <w:bottom w:val="single" w:space="0" w:color="D3D3D3"/>
+                    <w:start w:val="single" w:space="0" w:color="D3D3D3"/>
+                    <w:end w:val="single" w:space="0" w:color="D3D3D3"/>
+                  </w:tcBorders>
+                </w:tcPr>
+                <w:p>
+                  <w:pPr>
+                    <w:spacing w:before="0" w:after="60"/>
+                    <w:keepNext/>
+                    <w:jc w:val="start"/>
+                  </w:pPr>
+                  <w:r>
+                    <w:rPr>
+                      <w:rFonts w:ascii="Calibri" w:hAnsi="Calibri"/>
+                      <w:sz w:val="20"/>
+                    </w:rPr>
+                    <w:t xml:space="default">Hospital beds, Median (Q1, Q3)</w:t>
+                  </w:r>
+                </w:p>
+              </w:tc>
+              <w:tc>
+                <w:tcPr>
+                  <w:tcBorders>
+                    <w:top w:val="single" w:space="0" w:color="D3D3D3"/>
+                    <w:bottom w:val="single" w:space="0" w:color="D3D3D3"/>
+                    <w:start w:val="single" w:space="0" w:color="D3D3D3"/>
+                    <w:end w:val="single" w:space="0" w:color="D3D3D3"/>
+                  </w:tcBorders>
+                </w:tcPr>
+                <w:p>
+                  <w:pPr>
+                    <w:spacing w:before="0" w:after="60"/>
+                    <w:keepNext/>
+                    <w:jc w:val="center"/>
+                  </w:pPr>
+                  <w:r>
+                    <w:rPr>
+                      <w:rFonts w:ascii="Calibri" w:hAnsi="Calibri"/>
+                      <w:sz w:val="20"/>
+                    </w:rPr>
+                    <w:t xml:space="default">median (Q1-Q3)</w:t>
+                  </w:r>
+                </w:p>
+              </w:tc>
+              <w:tc>
+                <w:tcPr>
+                  <w:tcBorders>
+                    <w:top w:val="single" w:space="0" w:color="D3D3D3"/>
+                    <w:bottom w:val="single" w:space="0" w:color="D3D3D3"/>
+                    <w:start w:val="single" w:space="0" w:color="D3D3D3"/>
+                    <w:end w:val="single" w:space="0" w:color="D3D3D3"/>
+                  </w:tcBorders>
+                </w:tcPr>
+                <w:p>
+                  <w:pPr>
+                    <w:spacing w:before="0" w:after="60"/>
+                    <w:keepNext/>
+                    <w:jc w:val="center"/>
+                  </w:pPr>
+                  <w:r>
+                    <w:rPr>
+                      <w:rFonts w:ascii="Calibri" w:hAnsi="Calibri"/>
+                      <w:sz w:val="20"/>
+                    </w:rPr>
+                    <w:t xml:space="default">median (Q1-Q3)</w:t>
+                  </w:r>
+                </w:p>
+              </w:tc>
+              <w:tc>
+                <w:tcPr>
+                  <w:tcBorders>
+                    <w:top w:val="single" w:space="0" w:color="D3D3D3"/>
+                    <w:bottom w:val="single" w:space="0" w:color="D3D3D3"/>
+                    <w:start w:val="single" w:space="0" w:color="D3D3D3"/>
+                    <w:end w:val="single" w:space="0" w:color="D3D3D3"/>
+                  </w:tcBorders>
+                </w:tcPr>
+                <w:p>
+                  <w:pPr>
+                    <w:spacing w:before="0" w:after="60"/>
+                    <w:keepNext/>
+                    <w:jc w:val="center"/>
+                  </w:pPr>
+                  <w:r>
+                    <w:rPr>
+                      <w:rFonts w:ascii="Calibri" w:hAnsi="Calibri"/>
+                      <w:sz w:val="20"/>
+                    </w:rPr>
+                    <w:t xml:space="default">median (Q1-Q3)</w:t>
+                  </w:r>
+                </w:p>
+              </w:tc>
+              <w:tc>
+                <w:tcPr>
+                  <w:tcBorders>
+                    <w:top w:val="single" w:space="0" w:color="D3D3D3"/>
+                    <w:bottom w:val="single" w:space="0" w:color="D3D3D3"/>
+                    <w:start w:val="single" w:space="0" w:color="D3D3D3"/>
+                    <w:end w:val="single" w:space="0" w:color="D3D3D3"/>
+                  </w:tcBorders>
+                </w:tcPr>
+                <w:p>
+                  <w:pPr>
+                    <w:spacing w:before="0" w:after="60"/>
+                    <w:keepNext/>
+                    <w:jc w:val="center"/>
+                  </w:pPr>
+                  <w:r>
+                    <w:rPr>
+                      <w:rFonts w:ascii="Calibri" w:hAnsi="Calibri"/>
+                      <w:sz w:val="20"/>
+                    </w:rPr>
+                    <w:t xml:space="default">median (Q1-Q3)</w:t>
+                  </w:r>
+                </w:p>
+              </w:tc>
+              <w:tc>
+                <w:tcPr>
+                  <w:tcBorders>
+                    <w:top w:val="single" w:space="0" w:color="D3D3D3"/>
+                    <w:bottom w:val="single" w:space="0" w:color="D3D3D3"/>
+                    <w:start w:val="single" w:space="0" w:color="D3D3D3"/>
+                    <w:end w:val="single" w:space="0" w:color="D3D3D3"/>
+                  </w:tcBorders>
+                </w:tcPr>
+                <w:p>
+                  <w:pPr>
+                    <w:spacing w:before="0" w:after="60"/>
+                    <w:keepNext/>
+                    <w:jc w:val="center"/>
+                  </w:pPr>
+                  <w:r>
+                    <w:rPr>
+                      <w:rFonts w:ascii="Calibri" w:hAnsi="Calibri"/>
+                      <w:sz w:val="20"/>
+                    </w:rPr>
+                    <w:t xml:space="default">median (Q1-Q3)</w:t>
+                  </w:r>
+                </w:p>
+              </w:tc>
+              <w:tc>
+                <w:tcPr>
+                  <w:tcBorders>
+                    <w:top w:val="single" w:space="0" w:color="D3D3D3"/>
+                    <w:bottom w:val="single" w:space="0" w:color="D3D3D3"/>
+                    <w:start w:val="single" w:space="0" w:color="D3D3D3"/>
+                    <w:end w:val="single" w:space="0" w:color="D3D3D3"/>
+                  </w:tcBorders>
+                </w:tcPr>
+                <w:p>
+                  <w:pPr>
+                    <w:spacing w:before="0" w:after="60"/>
+                    <w:keepNext/>
+                    <w:jc w:val="center"/>
+                  </w:pPr>
+                  <w:r>
+                    <w:rPr>
+                      <w:rFonts w:ascii="Calibri" w:hAnsi="Calibri"/>
+                      <w:sz w:val="20"/>
+                    </w:rPr>
+                    <w:t xml:space="default">median (Q1-Q3)</w:t>
+                  </w:r>
+                </w:p>
+              </w:tc>
+            </w:tr>
+            <w:tr>
+              <w:trPr>
+                <w:cantSplit/>
+              </w:trPr>
+              <w:tc>
+                <w:tcPr>
+                  <w:tcBorders>
+                    <w:top w:val="single" w:space="0" w:color="D3D3D3"/>
+                    <w:bottom w:val="single" w:space="0" w:color="D3D3D3"/>
+                    <w:start w:val="single" w:space="0" w:color="D3D3D3"/>
+                    <w:end w:val="single" w:space="0" w:color="D3D3D3"/>
+                  </w:tcBorders>
+                </w:tcPr>
+                <w:p>
+                  <w:pPr>
+                    <w:spacing w:before="0" w:after="60"/>
+                    <w:keepNext/>
+                    <w:jc w:val="start"/>
+                  </w:pPr>
+                  <w:r>
+                    <w:rPr>
+                      <w:rFonts w:ascii="Calibri" w:hAnsi="Calibri"/>
+                      <w:sz w:val="20"/>
+                    </w:rPr>
+                    <w:t xml:space="default">Intensive care unit beds, Median (Q1, Q3)</w:t>
+                  </w:r>
+                </w:p>
+              </w:tc>
+              <w:tc>
+                <w:tcPr>
+                  <w:tcBorders>
+                    <w:top w:val="single" w:space="0" w:color="D3D3D3"/>
+                    <w:bottom w:val="single" w:space="0" w:color="D3D3D3"/>
+                    <w:start w:val="single" w:space="0" w:color="D3D3D3"/>
+                    <w:end w:val="single" w:space="0" w:color="D3D3D3"/>
+                  </w:tcBorders>
+                </w:tcPr>
+                <w:p>
+                  <w:pPr>
+                    <w:spacing w:before="0" w:after="60"/>
+                    <w:keepNext/>
+                    <w:jc w:val="center"/>
+                  </w:pPr>
+                  <w:r>
+                    <w:rPr>
+                      <w:rFonts w:ascii="Calibri" w:hAnsi="Calibri"/>
+                      <w:sz w:val="20"/>
+                    </w:rPr>
+                    <w:t xml:space="default">median (Q1-Q3)</w:t>
+                  </w:r>
+                </w:p>
+              </w:tc>
+              <w:tc>
+                <w:tcPr>
+                  <w:tcBorders>
+                    <w:top w:val="single" w:space="0" w:color="D3D3D3"/>
+                    <w:bottom w:val="single" w:space="0" w:color="D3D3D3"/>
+                    <w:start w:val="single" w:space="0" w:color="D3D3D3"/>
+                    <w:end w:val="single" w:space="0" w:color="D3D3D3"/>
+                  </w:tcBorders>
+                </w:tcPr>
+                <w:p>
+                  <w:pPr>
+                    <w:spacing w:before="0" w:after="60"/>
+                    <w:keepNext/>
+                    <w:jc w:val="center"/>
+                  </w:pPr>
+                  <w:r>
+                    <w:rPr>
+                      <w:rFonts w:ascii="Calibri" w:hAnsi="Calibri"/>
+                      <w:sz w:val="20"/>
+                    </w:rPr>
+                    <w:t xml:space="default">median (Q1-Q3)</w:t>
+                  </w:r>
+                </w:p>
+              </w:tc>
+              <w:tc>
+                <w:tcPr>
+                  <w:tcBorders>
+                    <w:top w:val="single" w:space="0" w:color="D3D3D3"/>
+                    <w:bottom w:val="single" w:space="0" w:color="D3D3D3"/>
+                    <w:start w:val="single" w:space="0" w:color="D3D3D3"/>
+                    <w:end w:val="single" w:space="0" w:color="D3D3D3"/>
+                  </w:tcBorders>
+                </w:tcPr>
+                <w:p>
+                  <w:pPr>
+                    <w:spacing w:before="0" w:after="60"/>
+                    <w:keepNext/>
+                    <w:jc w:val="center"/>
+                  </w:pPr>
+                  <w:r>
+                    <w:rPr>
+                      <w:rFonts w:ascii="Calibri" w:hAnsi="Calibri"/>
+                      <w:sz w:val="20"/>
+                    </w:rPr>
+                    <w:t xml:space="default">median (Q1-Q3)</w:t>
+                  </w:r>
+                </w:p>
+              </w:tc>
+              <w:tc>
+                <w:tcPr>
+                  <w:tcBorders>
+                    <w:top w:val="single" w:space="0" w:color="D3D3D3"/>
+                    <w:bottom w:val="single" w:space="0" w:color="D3D3D3"/>
+                    <w:start w:val="single" w:space="0" w:color="D3D3D3"/>
+                    <w:end w:val="single" w:space="0" w:color="D3D3D3"/>
+                  </w:tcBorders>
+                </w:tcPr>
+                <w:p>
+                  <w:pPr>
+                    <w:spacing w:before="0" w:after="60"/>
+                    <w:keepNext/>
+                    <w:jc w:val="center"/>
+                  </w:pPr>
+                  <w:r>
+                    <w:rPr>
+                      <w:rFonts w:ascii="Calibri" w:hAnsi="Calibri"/>
+                      <w:sz w:val="20"/>
+                    </w:rPr>
+                    <w:t xml:space="default">median (Q1-Q3)</w:t>
+                  </w:r>
+                </w:p>
+              </w:tc>
+              <w:tc>
+                <w:tcPr>
+                  <w:tcBorders>
+                    <w:top w:val="single" w:space="0" w:color="D3D3D3"/>
+                    <w:bottom w:val="single" w:space="0" w:color="D3D3D3"/>
+                    <w:start w:val="single" w:space="0" w:color="D3D3D3"/>
+                    <w:end w:val="single" w:space="0" w:color="D3D3D3"/>
+                  </w:tcBorders>
+                </w:tcPr>
+                <w:p>
+                  <w:pPr>
+                    <w:spacing w:before="0" w:after="60"/>
+                    <w:keepNext/>
+                    <w:jc w:val="center"/>
+                  </w:pPr>
+                  <w:r>
+                    <w:rPr>
+                      <w:rFonts w:ascii="Calibri" w:hAnsi="Calibri"/>
+                      <w:sz w:val="20"/>
+                    </w:rPr>
+                    <w:t xml:space="default">median (Q1-Q3)</w:t>
+                  </w:r>
+                </w:p>
+              </w:tc>
+              <w:tc>
+                <w:tcPr>
+                  <w:tcBorders>
+                    <w:top w:val="single" w:space="0" w:color="D3D3D3"/>
+                    <w:bottom w:val="single" w:space="0" w:color="D3D3D3"/>
+                    <w:start w:val="single" w:space="0" w:color="D3D3D3"/>
+                    <w:end w:val="single" w:space="0" w:color="D3D3D3"/>
+                  </w:tcBorders>
+                </w:tcPr>
+                <w:p>
+                  <w:pPr>
+                    <w:spacing w:before="0" w:after="60"/>
+                    <w:keepNext/>
+                    <w:jc w:val="center"/>
+                  </w:pPr>
+                  <w:r>
+                    <w:rPr>
+                      <w:rFonts w:ascii="Calibri" w:hAnsi="Calibri"/>
+                      <w:sz w:val="20"/>
+                    </w:rPr>
+                    <w:t xml:space="default">median (Q1-Q3)</w:t>
+                  </w:r>
+                </w:p>
+              </w:tc>
+            </w:tr>
+            <w:tr>
+              <w:trPr>
+                <w:cantSplit/>
+              </w:trPr>
+              <w:tc>
+                <w:tcPr>
+                  <w:tcBorders>
+                    <w:top w:val="single" w:space="0" w:color="D3D3D3"/>
+                    <w:bottom w:val="single" w:space="0" w:color="D3D3D3"/>
+                    <w:start w:val="single" w:space="0" w:color="D3D3D3"/>
+                    <w:end w:val="single" w:space="0" w:color="D3D3D3"/>
+                  </w:tcBorders>
+                </w:tcPr>
+                <w:p>
+                  <w:pPr>
+                    <w:spacing w:before="0" w:after="60"/>
+                    <w:keepNext/>
+                    <w:jc w:val="start"/>
+                  </w:pPr>
+                  <w:r>
+                    <w:rPr>
+                      <w:rFonts w:ascii="Calibri" w:hAnsi="Calibri"/>
+                      <w:sz w:val="20"/>
+                    </w:rPr>
+                    <w:t xml:space="default">Dedicated trauma beds, Median (Q1, Q3)</w:t>
+                  </w:r>
+                </w:p>
+              </w:tc>
+              <w:tc>
+                <w:tcPr>
+                  <w:tcBorders>
+                    <w:top w:val="single" w:space="0" w:color="D3D3D3"/>
+                    <w:bottom w:val="single" w:space="0" w:color="D3D3D3"/>
+                    <w:start w:val="single" w:space="0" w:color="D3D3D3"/>
+                    <w:end w:val="single" w:space="0" w:color="D3D3D3"/>
+                  </w:tcBorders>
+                </w:tcPr>
+                <w:p>
+                  <w:pPr>
+                    <w:spacing w:before="0" w:after="60"/>
+                    <w:keepNext/>
+                    <w:jc w:val="center"/>
+                  </w:pPr>
+                  <w:r>
+                    <w:rPr>
+                      <w:rFonts w:ascii="Calibri" w:hAnsi="Calibri"/>
+                      <w:sz w:val="20"/>
+                    </w:rPr>
+                    <w:t xml:space="default">median (Q1-Q3)</w:t>
+                  </w:r>
+                </w:p>
+              </w:tc>
+              <w:tc>
+                <w:tcPr>
+                  <w:tcBorders>
+                    <w:top w:val="single" w:space="0" w:color="D3D3D3"/>
+                    <w:bottom w:val="single" w:space="0" w:color="D3D3D3"/>
+                    <w:start w:val="single" w:space="0" w:color="D3D3D3"/>
+                    <w:end w:val="single" w:space="0" w:color="D3D3D3"/>
+                  </w:tcBorders>
+                </w:tcPr>
+                <w:p>
+                  <w:pPr>
+                    <w:spacing w:before="0" w:after="60"/>
+                    <w:keepNext/>
+                    <w:jc w:val="center"/>
+                  </w:pPr>
+                  <w:r>
+                    <w:rPr>
+                      <w:rFonts w:ascii="Calibri" w:hAnsi="Calibri"/>
+                      <w:sz w:val="20"/>
+                    </w:rPr>
+                    <w:t xml:space="default">median (Q1-Q3)</w:t>
+                  </w:r>
+                </w:p>
+              </w:tc>
+              <w:tc>
+                <w:tcPr>
+                  <w:tcBorders>
+                    <w:top w:val="single" w:space="0" w:color="D3D3D3"/>
+                    <w:bottom w:val="single" w:space="0" w:color="D3D3D3"/>
+                    <w:start w:val="single" w:space="0" w:color="D3D3D3"/>
+                    <w:end w:val="single" w:space="0" w:color="D3D3D3"/>
+                  </w:tcBorders>
+                </w:tcPr>
+                <w:p>
+                  <w:pPr>
+                    <w:spacing w:before="0" w:after="60"/>
+                    <w:keepNext/>
+                    <w:jc w:val="center"/>
+                  </w:pPr>
+                  <w:r>
+                    <w:rPr>
+                      <w:rFonts w:ascii="Calibri" w:hAnsi="Calibri"/>
+                      <w:sz w:val="20"/>
+                    </w:rPr>
+                    <w:t xml:space="default">median (Q1-Q3)</w:t>
+                  </w:r>
+                </w:p>
+              </w:tc>
+              <w:tc>
+                <w:tcPr>
+                  <w:tcBorders>
+                    <w:top w:val="single" w:space="0" w:color="D3D3D3"/>
+                    <w:bottom w:val="single" w:space="0" w:color="D3D3D3"/>
+                    <w:start w:val="single" w:space="0" w:color="D3D3D3"/>
+                    <w:end w:val="single" w:space="0" w:color="D3D3D3"/>
+                  </w:tcBorders>
+                </w:tcPr>
+                <w:p>
+                  <w:pPr>
+                    <w:spacing w:before="0" w:after="60"/>
+                    <w:keepNext/>
+                    <w:jc w:val="center"/>
+                  </w:pPr>
+                  <w:r>
+                    <w:rPr>
+                      <w:rFonts w:ascii="Calibri" w:hAnsi="Calibri"/>
+                      <w:sz w:val="20"/>
+                    </w:rPr>
+                    <w:t xml:space="default">median (Q1-Q3)</w:t>
+                  </w:r>
+                </w:p>
+              </w:tc>
+              <w:tc>
+                <w:tcPr>
+                  <w:tcBorders>
+                    <w:top w:val="single" w:space="0" w:color="D3D3D3"/>
+                    <w:bottom w:val="single" w:space="0" w:color="D3D3D3"/>
+                    <w:start w:val="single" w:space="0" w:color="D3D3D3"/>
+                    <w:end w:val="single" w:space="0" w:color="D3D3D3"/>
+                  </w:tcBorders>
+                </w:tcPr>
+                <w:p>
+                  <w:pPr>
+                    <w:spacing w:before="0" w:after="60"/>
+                    <w:keepNext/>
+                    <w:jc w:val="center"/>
+                  </w:pPr>
+                  <w:r>
+                    <w:rPr>
+                      <w:rFonts w:ascii="Calibri" w:hAnsi="Calibri"/>
+                      <w:sz w:val="20"/>
+                    </w:rPr>
+                    <w:t xml:space="default">median (Q1-Q3)</w:t>
+                  </w:r>
+                </w:p>
+              </w:tc>
+              <w:tc>
+                <w:tcPr>
+                  <w:tcBorders>
+                    <w:top w:val="single" w:space="0" w:color="D3D3D3"/>
+                    <w:bottom w:val="single" w:space="0" w:color="D3D3D3"/>
+                    <w:start w:val="single" w:space="0" w:color="D3D3D3"/>
+                    <w:end w:val="single" w:space="0" w:color="D3D3D3"/>
+                  </w:tcBorders>
+                </w:tcPr>
+                <w:p>
+                  <w:pPr>
+                    <w:spacing w:before="0" w:after="60"/>
+                    <w:keepNext/>
+                    <w:jc w:val="center"/>
+                  </w:pPr>
+                  <w:r>
+                    <w:rPr>
+                      <w:rFonts w:ascii="Calibri" w:hAnsi="Calibri"/>
+                      <w:sz w:val="20"/>
+                    </w:rPr>
+                    <w:t xml:space="default">median (Q1-Q3)</w:t>
+                  </w:r>
+                </w:p>
+              </w:tc>
+            </w:tr>
+            <w:tr>
+              <w:trPr>
+                <w:cantSplit/>
+              </w:trPr>
+              <w:tc>
+                <w:tcPr>
+                  <w:tcBorders>
+                    <w:top w:val="single" w:space="0" w:color="D3D3D3"/>
+                    <w:bottom w:val="single" w:space="0" w:color="D3D3D3"/>
+                    <w:start w:val="single" w:space="0" w:color="D3D3D3"/>
+                    <w:end w:val="single" w:space="0" w:color="D3D3D3"/>
+                  </w:tcBorders>
+                </w:tcPr>
+                <w:p>
+                  <w:pPr>
+                    <w:spacing w:before="0" w:after="60"/>
+                    <w:keepNext/>
+                    <w:jc w:val="start"/>
+                  </w:pPr>
+                  <w:r>
+                    <w:rPr>
+                      <w:rFonts w:ascii="Calibri" w:hAnsi="Calibri"/>
+                      <w:sz w:val="20"/>
+                    </w:rPr>
+                    <w:t xml:space="default">Specialities available around the clock, n (%)</w:t>
+                  </w:r>
+                </w:p>
+              </w:tc>
+              <w:tc>
+                <w:tcPr>
+                  <w:tcBorders>
+                    <w:top w:val="single" w:space="0" w:color="D3D3D3"/>
+                    <w:bottom w:val="single" w:space="0" w:color="D3D3D3"/>
+                    <w:start w:val="single" w:space="0" w:color="D3D3D3"/>
+                    <w:end w:val="single" w:space="0" w:color="D3D3D3"/>
+                  </w:tcBorders>
+                </w:tcPr>
+                <w:p>
+                  <w:pPr>
+                    <w:spacing w:before="0" w:after="60"/>
+                    <w:keepNext/>
+                    <w:jc w:val="center"/>
+                  </w:pPr>
+                  <w:r>
+                    <w:rPr>
+                      <w:rFonts w:ascii="Calibri" w:hAnsi="Calibri"/>
+                      <w:sz w:val="20"/>
+                    </w:rPr>
+                    <w:t xml:space="default"/>
+                  </w:r>
+                </w:p>
+              </w:tc>
+              <w:tc>
+                <w:tcPr>
+                  <w:tcBorders>
+                    <w:top w:val="single" w:space="0" w:color="D3D3D3"/>
+                    <w:bottom w:val="single" w:space="0" w:color="D3D3D3"/>
+                    <w:start w:val="single" w:space="0" w:color="D3D3D3"/>
+                    <w:end w:val="single" w:space="0" w:color="D3D3D3"/>
+                  </w:tcBorders>
+                </w:tcPr>
+                <w:p>
+                  <w:pPr>
+                    <w:spacing w:before="0" w:after="60"/>
+                    <w:keepNext/>
+                    <w:jc w:val="center"/>
+                  </w:pPr>
+                  <w:r>
+                    <w:rPr>
+                      <w:rFonts w:ascii="Calibri" w:hAnsi="Calibri"/>
+                      <w:sz w:val="20"/>
+                    </w:rPr>
+                    <w:t xml:space="default"/>
+                  </w:r>
+                </w:p>
+              </w:tc>
+              <w:tc>
+                <w:tcPr>
+                  <w:tcBorders>
+                    <w:top w:val="single" w:space="0" w:color="D3D3D3"/>
+                    <w:bottom w:val="single" w:space="0" w:color="D3D3D3"/>
+                    <w:start w:val="single" w:space="0" w:color="D3D3D3"/>
+                    <w:end w:val="single" w:space="0" w:color="D3D3D3"/>
+                  </w:tcBorders>
+                </w:tcPr>
+                <w:p>
+                  <w:pPr>
+                    <w:spacing w:before="0" w:after="60"/>
+                    <w:keepNext/>
+                    <w:jc w:val="center"/>
+                  </w:pPr>
+                  <w:r>
+                    <w:rPr>
+                      <w:rFonts w:ascii="Calibri" w:hAnsi="Calibri"/>
+                      <w:sz w:val="20"/>
+                    </w:rPr>
+                    <w:t xml:space="default"/>
+                  </w:r>
+                </w:p>
+              </w:tc>
+              <w:tc>
+                <w:tcPr>
+                  <w:tcBorders>
+                    <w:top w:val="single" w:space="0" w:color="D3D3D3"/>
+                    <w:bottom w:val="single" w:space="0" w:color="D3D3D3"/>
+                    <w:start w:val="single" w:space="0" w:color="D3D3D3"/>
+                    <w:end w:val="single" w:space="0" w:color="D3D3D3"/>
+                  </w:tcBorders>
+                </w:tcPr>
+                <w:p>
+                  <w:pPr>
+                    <w:spacing w:before="0" w:after="60"/>
+                    <w:keepNext/>
+                    <w:jc w:val="center"/>
+                  </w:pPr>
+                  <w:r>
+                    <w:rPr>
+                      <w:rFonts w:ascii="Calibri" w:hAnsi="Calibri"/>
+                      <w:sz w:val="20"/>
+                    </w:rPr>
+                    <w:t xml:space="default"/>
+                  </w:r>
+                </w:p>
+              </w:tc>
+              <w:tc>
+                <w:tcPr>
+                  <w:tcBorders>
+                    <w:top w:val="single" w:space="0" w:color="D3D3D3"/>
+                    <w:bottom w:val="single" w:space="0" w:color="D3D3D3"/>
+                    <w:start w:val="single" w:space="0" w:color="D3D3D3"/>
+                    <w:end w:val="single" w:space="0" w:color="D3D3D3"/>
+                  </w:tcBorders>
+                </w:tcPr>
+                <w:p>
+                  <w:pPr>
+                    <w:spacing w:before="0" w:after="60"/>
+                    <w:keepNext/>
+                    <w:jc w:val="center"/>
+                  </w:pPr>
+                  <w:r>
+                    <w:rPr>
+                      <w:rFonts w:ascii="Calibri" w:hAnsi="Calibri"/>
+                      <w:sz w:val="20"/>
+                    </w:rPr>
+                    <w:t xml:space="default"/>
+                  </w:r>
+                </w:p>
+              </w:tc>
+              <w:tc>
+                <w:tcPr>
+                  <w:tcBorders>
+                    <w:top w:val="single" w:space="0" w:color="D3D3D3"/>
+                    <w:bottom w:val="single" w:space="0" w:color="D3D3D3"/>
+                    <w:start w:val="single" w:space="0" w:color="D3D3D3"/>
+                    <w:end w:val="single" w:space="0" w:color="D3D3D3"/>
+                  </w:tcBorders>
+                </w:tcPr>
+                <w:p>
+                  <w:pPr>
+                    <w:spacing w:before="0" w:after="60"/>
+                    <w:keepNext/>
+                    <w:jc w:val="center"/>
+                  </w:pPr>
+                  <w:r>
+                    <w:rPr>
+                      <w:rFonts w:ascii="Calibri" w:hAnsi="Calibri"/>
+                      <w:sz w:val="20"/>
+                    </w:rPr>
+                    <w:t xml:space="default"/>
+                  </w:r>
+                </w:p>
+              </w:tc>
+            </w:tr>
+            <w:tr>
+              <w:trPr>
+                <w:cantSplit/>
+              </w:trPr>
+              <w:tc>
+                <w:tcPr>
+                  <w:tcBorders>
+                    <w:top w:val="single" w:space="0" w:color="D3D3D3"/>
+                    <w:bottom w:val="single" w:space="0" w:color="D3D3D3"/>
+                    <w:start w:val="single" w:space="0" w:color="D3D3D3"/>
+                    <w:end w:val="single" w:space="0" w:color="D3D3D3"/>
+                  </w:tcBorders>
+                </w:tcPr>
+                <w:p>
+                  <w:pPr>
+                    <w:spacing w:before="0" w:after="60"/>
+                    <w:keepNext/>
+                    <w:jc w:val="start"/>
+                  </w:pPr>
+                  <w:r>
+                    <w:rPr>
+                      <w:rFonts w:ascii="Calibri" w:hAnsi="Calibri"/>
+                      <w:sz w:val="20"/>
+                    </w:rPr>
+                    <w:t xml:space="default">    General surgery</w:t>
+                  </w:r>
+                </w:p>
+              </w:tc>
+              <w:tc>
+                <w:tcPr>
+                  <w:tcBorders>
+                    <w:top w:val="single" w:space="0" w:color="D3D3D3"/>
+                    <w:bottom w:val="single" w:space="0" w:color="D3D3D3"/>
+                    <w:start w:val="single" w:space="0" w:color="D3D3D3"/>
+                    <w:end w:val="single" w:space="0" w:color="D3D3D3"/>
+                  </w:tcBorders>
+                </w:tcPr>
+                <w:p>
+                  <w:pPr>
+                    <w:spacing w:before="0" w:after="60"/>
+                    <w:keepNext/>
+                    <w:jc w:val="center"/>
+                  </w:pPr>
+                  <w:r>
+                    <w:rPr>
+                      <w:rFonts w:ascii="Calibri" w:hAnsi="Calibri"/>
+                      <w:sz w:val="20"/>
+                    </w:rPr>
+                    <w:t xml:space="default">n (%)</w:t>
+                  </w:r>
+                </w:p>
+              </w:tc>
+              <w:tc>
+                <w:tcPr>
+                  <w:tcBorders>
+                    <w:top w:val="single" w:space="0" w:color="D3D3D3"/>
+                    <w:bottom w:val="single" w:space="0" w:color="D3D3D3"/>
+                    <w:start w:val="single" w:space="0" w:color="D3D3D3"/>
+                    <w:end w:val="single" w:space="0" w:color="D3D3D3"/>
+                  </w:tcBorders>
+                </w:tcPr>
+                <w:p>
+                  <w:pPr>
+                    <w:spacing w:before="0" w:after="60"/>
+                    <w:keepNext/>
+                    <w:jc w:val="center"/>
+                  </w:pPr>
+                  <w:r>
+                    <w:rPr>
+                      <w:rFonts w:ascii="Calibri" w:hAnsi="Calibri"/>
+                      <w:sz w:val="20"/>
+                    </w:rPr>
+                    <w:t xml:space="default">n (%)</w:t>
+                  </w:r>
+                </w:p>
+              </w:tc>
+              <w:tc>
+                <w:tcPr>
+                  <w:tcBorders>
+                    <w:top w:val="single" w:space="0" w:color="D3D3D3"/>
+                    <w:bottom w:val="single" w:space="0" w:color="D3D3D3"/>
+                    <w:start w:val="single" w:space="0" w:color="D3D3D3"/>
+                    <w:end w:val="single" w:space="0" w:color="D3D3D3"/>
+                  </w:tcBorders>
+                </w:tcPr>
+                <w:p>
+                  <w:pPr>
+                    <w:spacing w:before="0" w:after="60"/>
+                    <w:keepNext/>
+                    <w:jc w:val="center"/>
+                  </w:pPr>
+                  <w:r>
+                    <w:rPr>
+                      <w:rFonts w:ascii="Calibri" w:hAnsi="Calibri"/>
+                      <w:sz w:val="20"/>
+                    </w:rPr>
+                    <w:t xml:space="default">n (%)</w:t>
+                  </w:r>
+                </w:p>
+              </w:tc>
+              <w:tc>
+                <w:tcPr>
+                  <w:tcBorders>
+                    <w:top w:val="single" w:space="0" w:color="D3D3D3"/>
+                    <w:bottom w:val="single" w:space="0" w:color="D3D3D3"/>
+                    <w:start w:val="single" w:space="0" w:color="D3D3D3"/>
+                    <w:end w:val="single" w:space="0" w:color="D3D3D3"/>
+                  </w:tcBorders>
+                </w:tcPr>
+                <w:p>
+                  <w:pPr>
+                    <w:spacing w:before="0" w:after="60"/>
+                    <w:keepNext/>
+                    <w:jc w:val="center"/>
+                  </w:pPr>
+                  <w:r>
+                    <w:rPr>
+                      <w:rFonts w:ascii="Calibri" w:hAnsi="Calibri"/>
+                      <w:sz w:val="20"/>
+                    </w:rPr>
+                    <w:t xml:space="default">n (%)</w:t>
+                  </w:r>
+                </w:p>
+              </w:tc>
+              <w:tc>
+                <w:tcPr>
+                  <w:tcBorders>
+                    <w:top w:val="single" w:space="0" w:color="D3D3D3"/>
+                    <w:bottom w:val="single" w:space="0" w:color="D3D3D3"/>
+                    <w:start w:val="single" w:space="0" w:color="D3D3D3"/>
+                    <w:end w:val="single" w:space="0" w:color="D3D3D3"/>
+                  </w:tcBorders>
+                </w:tcPr>
+                <w:p>
+                  <w:pPr>
+                    <w:spacing w:before="0" w:after="60"/>
+                    <w:keepNext/>
+                    <w:jc w:val="center"/>
+                  </w:pPr>
+                  <w:r>
+                    <w:rPr>
+                      <w:rFonts w:ascii="Calibri" w:hAnsi="Calibri"/>
+                      <w:sz w:val="20"/>
+                    </w:rPr>
+                    <w:t xml:space="default">n (%)</w:t>
+                  </w:r>
+                </w:p>
+              </w:tc>
+              <w:tc>
+                <w:tcPr>
+                  <w:tcBorders>
+                    <w:top w:val="single" w:space="0" w:color="D3D3D3"/>
+                    <w:bottom w:val="single" w:space="0" w:color="D3D3D3"/>
+                    <w:start w:val="single" w:space="0" w:color="D3D3D3"/>
+                    <w:end w:val="single" w:space="0" w:color="D3D3D3"/>
+                  </w:tcBorders>
+                </w:tcPr>
+                <w:p>
+                  <w:pPr>
+                    <w:spacing w:before="0" w:after="60"/>
+                    <w:keepNext/>
+                    <w:jc w:val="center"/>
+                  </w:pPr>
+                  <w:r>
+                    <w:rPr>
+                      <w:rFonts w:ascii="Calibri" w:hAnsi="Calibri"/>
+                      <w:sz w:val="20"/>
+                    </w:rPr>
+                    <w:t xml:space="default">n (%)</w:t>
+                  </w:r>
+                </w:p>
+              </w:tc>
+            </w:tr>
+            <w:tr>
+              <w:trPr>
+                <w:cantSplit/>
+              </w:trPr>
+              <w:tc>
+                <w:tcPr>
+                  <w:tcBorders>
+                    <w:top w:val="single" w:space="0" w:color="D3D3D3"/>
+                    <w:bottom w:val="single" w:space="0" w:color="D3D3D3"/>
+                    <w:start w:val="single" w:space="0" w:color="D3D3D3"/>
+                    <w:end w:val="single" w:space="0" w:color="D3D3D3"/>
+                  </w:tcBorders>
+                </w:tcPr>
+                <w:p>
+                  <w:pPr>
+                    <w:spacing w:before="0" w:after="60"/>
+                    <w:keepNext/>
+                    <w:jc w:val="start"/>
+                  </w:pPr>
+                  <w:r>
+                    <w:rPr>
+                      <w:rFonts w:ascii="Calibri" w:hAnsi="Calibri"/>
+                      <w:sz w:val="20"/>
+                    </w:rPr>
+                    <w:t xml:space="default">    Orthopaedics</w:t>
+                  </w:r>
+                </w:p>
+              </w:tc>
+              <w:tc>
+                <w:tcPr>
+                  <w:tcBorders>
+                    <w:top w:val="single" w:space="0" w:color="D3D3D3"/>
+                    <w:bottom w:val="single" w:space="0" w:color="D3D3D3"/>
+                    <w:start w:val="single" w:space="0" w:color="D3D3D3"/>
+                    <w:end w:val="single" w:space="0" w:color="D3D3D3"/>
+                  </w:tcBorders>
+                </w:tcPr>
+                <w:p>
+                  <w:pPr>
+                    <w:spacing w:before="0" w:after="60"/>
+                    <w:keepNext/>
+                    <w:jc w:val="center"/>
+                  </w:pPr>
+                  <w:r>
+                    <w:rPr>
+                      <w:rFonts w:ascii="Calibri" w:hAnsi="Calibri"/>
+                      <w:sz w:val="20"/>
+                    </w:rPr>
+                    <w:t xml:space="default">n (%)</w:t>
+                  </w:r>
+                </w:p>
+              </w:tc>
+              <w:tc>
+                <w:tcPr>
+                  <w:tcBorders>
+                    <w:top w:val="single" w:space="0" w:color="D3D3D3"/>
+                    <w:bottom w:val="single" w:space="0" w:color="D3D3D3"/>
+                    <w:start w:val="single" w:space="0" w:color="D3D3D3"/>
+                    <w:end w:val="single" w:space="0" w:color="D3D3D3"/>
+                  </w:tcBorders>
+                </w:tcPr>
+                <w:p>
+                  <w:pPr>
+                    <w:spacing w:before="0" w:after="60"/>
+                    <w:keepNext/>
+                    <w:jc w:val="center"/>
+                  </w:pPr>
+                  <w:r>
+                    <w:rPr>
+                      <w:rFonts w:ascii="Calibri" w:hAnsi="Calibri"/>
+                      <w:sz w:val="20"/>
+                    </w:rPr>
+                    <w:t xml:space="default">n (%)</w:t>
+                  </w:r>
+                </w:p>
+              </w:tc>
+              <w:tc>
+                <w:tcPr>
+                  <w:tcBorders>
+                    <w:top w:val="single" w:space="0" w:color="D3D3D3"/>
+                    <w:bottom w:val="single" w:space="0" w:color="D3D3D3"/>
+                    <w:start w:val="single" w:space="0" w:color="D3D3D3"/>
+                    <w:end w:val="single" w:space="0" w:color="D3D3D3"/>
+                  </w:tcBorders>
+                </w:tcPr>
+                <w:p>
+                  <w:pPr>
+                    <w:spacing w:before="0" w:after="60"/>
+                    <w:keepNext/>
+                    <w:jc w:val="center"/>
+                  </w:pPr>
+                  <w:r>
+                    <w:rPr>
+                      <w:rFonts w:ascii="Calibri" w:hAnsi="Calibri"/>
+                      <w:sz w:val="20"/>
+                    </w:rPr>
+                    <w:t xml:space="default">n (%)</w:t>
+                  </w:r>
+                </w:p>
+              </w:tc>
+              <w:tc>
+                <w:tcPr>
+                  <w:tcBorders>
+                    <w:top w:val="single" w:space="0" w:color="D3D3D3"/>
+                    <w:bottom w:val="single" w:space="0" w:color="D3D3D3"/>
+                    <w:start w:val="single" w:space="0" w:color="D3D3D3"/>
+                    <w:end w:val="single" w:space="0" w:color="D3D3D3"/>
+                  </w:tcBorders>
+                </w:tcPr>
+                <w:p>
+                  <w:pPr>
+                    <w:spacing w:before="0" w:after="60"/>
+                    <w:keepNext/>
+                    <w:jc w:val="center"/>
+                  </w:pPr>
+                  <w:r>
+                    <w:rPr>
+                      <w:rFonts w:ascii="Calibri" w:hAnsi="Calibri"/>
+                      <w:sz w:val="20"/>
+                    </w:rPr>
+                    <w:t xml:space="default">n (%)</w:t>
+                  </w:r>
+                </w:p>
+              </w:tc>
+              <w:tc>
+                <w:tcPr>
+                  <w:tcBorders>
+                    <w:top w:val="single" w:space="0" w:color="D3D3D3"/>
+                    <w:bottom w:val="single" w:space="0" w:color="D3D3D3"/>
+                    <w:start w:val="single" w:space="0" w:color="D3D3D3"/>
+                    <w:end w:val="single" w:space="0" w:color="D3D3D3"/>
+                  </w:tcBorders>
+                </w:tcPr>
+                <w:p>
+                  <w:pPr>
+                    <w:spacing w:before="0" w:after="60"/>
+                    <w:keepNext/>
+                    <w:jc w:val="center"/>
+                  </w:pPr>
+                  <w:r>
+                    <w:rPr>
+                      <w:rFonts w:ascii="Calibri" w:hAnsi="Calibri"/>
+                      <w:sz w:val="20"/>
+                    </w:rPr>
+                    <w:t xml:space="default">n (%)</w:t>
+                  </w:r>
+                </w:p>
+              </w:tc>
+              <w:tc>
+                <w:tcPr>
+                  <w:tcBorders>
+                    <w:top w:val="single" w:space="0" w:color="D3D3D3"/>
+                    <w:bottom w:val="single" w:space="0" w:color="D3D3D3"/>
+                    <w:start w:val="single" w:space="0" w:color="D3D3D3"/>
+                    <w:end w:val="single" w:space="0" w:color="D3D3D3"/>
+                  </w:tcBorders>
+                </w:tcPr>
+                <w:p>
+                  <w:pPr>
+                    <w:spacing w:before="0" w:after="60"/>
+                    <w:keepNext/>
+                    <w:jc w:val="center"/>
+                  </w:pPr>
+                  <w:r>
+                    <w:rPr>
+                      <w:rFonts w:ascii="Calibri" w:hAnsi="Calibri"/>
+                      <w:sz w:val="20"/>
+                    </w:rPr>
+                    <w:t xml:space="default">n (%)</w:t>
+                  </w:r>
+                </w:p>
+              </w:tc>
+            </w:tr>
+            <w:tr>
+              <w:trPr>
+                <w:cantSplit/>
+              </w:trPr>
+              <w:tc>
+                <w:tcPr>
+                  <w:tcBorders>
+                    <w:top w:val="single" w:space="0" w:color="D3D3D3"/>
+                    <w:bottom w:val="single" w:space="0" w:color="D3D3D3"/>
+                    <w:start w:val="single" w:space="0" w:color="D3D3D3"/>
+                    <w:end w:val="single" w:space="0" w:color="D3D3D3"/>
+                  </w:tcBorders>
+                </w:tcPr>
+                <w:p>
+                  <w:pPr>
+                    <w:spacing w:before="0" w:after="60"/>
+                    <w:keepNext/>
+                    <w:jc w:val="start"/>
+                  </w:pPr>
+                  <w:r>
+                    <w:rPr>
+                      <w:rFonts w:ascii="Calibri" w:hAnsi="Calibri"/>
+                      <w:sz w:val="20"/>
+                    </w:rPr>
+                    <w:t xml:space="default">    Neurosurgery</w:t>
+                  </w:r>
+                </w:p>
+              </w:tc>
+              <w:tc>
+                <w:tcPr>
+                  <w:tcBorders>
+                    <w:top w:val="single" w:space="0" w:color="D3D3D3"/>
+                    <w:bottom w:val="single" w:space="0" w:color="D3D3D3"/>
+                    <w:start w:val="single" w:space="0" w:color="D3D3D3"/>
+                    <w:end w:val="single" w:space="0" w:color="D3D3D3"/>
+                  </w:tcBorders>
+                </w:tcPr>
+                <w:p>
+                  <w:pPr>
+                    <w:spacing w:before="0" w:after="60"/>
+                    <w:keepNext/>
+                    <w:jc w:val="center"/>
+                  </w:pPr>
+                  <w:r>
+                    <w:rPr>
+                      <w:rFonts w:ascii="Calibri" w:hAnsi="Calibri"/>
+                      <w:sz w:val="20"/>
+                    </w:rPr>
+                    <w:t xml:space="default">n (%)</w:t>
+                  </w:r>
+                </w:p>
+              </w:tc>
+              <w:tc>
+                <w:tcPr>
+                  <w:tcBorders>
+                    <w:top w:val="single" w:space="0" w:color="D3D3D3"/>
+                    <w:bottom w:val="single" w:space="0" w:color="D3D3D3"/>
+                    <w:start w:val="single" w:space="0" w:color="D3D3D3"/>
+                    <w:end w:val="single" w:space="0" w:color="D3D3D3"/>
+                  </w:tcBorders>
+                </w:tcPr>
+                <w:p>
+                  <w:pPr>
+                    <w:spacing w:before="0" w:after="60"/>
+                    <w:keepNext/>
+                    <w:jc w:val="center"/>
+                  </w:pPr>
+                  <w:r>
+                    <w:rPr>
+                      <w:rFonts w:ascii="Calibri" w:hAnsi="Calibri"/>
+                      <w:sz w:val="20"/>
+                    </w:rPr>
+                    <w:t xml:space="default">n (%)</w:t>
+                  </w:r>
+                </w:p>
+              </w:tc>
+              <w:tc>
+                <w:tcPr>
+                  <w:tcBorders>
+                    <w:top w:val="single" w:space="0" w:color="D3D3D3"/>
+                    <w:bottom w:val="single" w:space="0" w:color="D3D3D3"/>
+                    <w:start w:val="single" w:space="0" w:color="D3D3D3"/>
+                    <w:end w:val="single" w:space="0" w:color="D3D3D3"/>
+                  </w:tcBorders>
+                </w:tcPr>
+                <w:p>
+                  <w:pPr>
+                    <w:spacing w:before="0" w:after="60"/>
+                    <w:keepNext/>
+                    <w:jc w:val="center"/>
+                  </w:pPr>
+                  <w:r>
+                    <w:rPr>
+                      <w:rFonts w:ascii="Calibri" w:hAnsi="Calibri"/>
+                      <w:sz w:val="20"/>
+                    </w:rPr>
+                    <w:t xml:space="default">n (%)</w:t>
+                  </w:r>
+                </w:p>
+              </w:tc>
+              <w:tc>
+                <w:tcPr>
+                  <w:tcBorders>
+                    <w:top w:val="single" w:space="0" w:color="D3D3D3"/>
+                    <w:bottom w:val="single" w:space="0" w:color="D3D3D3"/>
+                    <w:start w:val="single" w:space="0" w:color="D3D3D3"/>
+                    <w:end w:val="single" w:space="0" w:color="D3D3D3"/>
+                  </w:tcBorders>
+                </w:tcPr>
+                <w:p>
+                  <w:pPr>
+                    <w:spacing w:before="0" w:after="60"/>
+                    <w:keepNext/>
+                    <w:jc w:val="center"/>
+                  </w:pPr>
+                  <w:r>
+                    <w:rPr>
+                      <w:rFonts w:ascii="Calibri" w:hAnsi="Calibri"/>
+                      <w:sz w:val="20"/>
+                    </w:rPr>
+                    <w:t xml:space="default">n (%)</w:t>
+                  </w:r>
+                </w:p>
+              </w:tc>
+              <w:tc>
+                <w:tcPr>
+                  <w:tcBorders>
+                    <w:top w:val="single" w:space="0" w:color="D3D3D3"/>
+                    <w:bottom w:val="single" w:space="0" w:color="D3D3D3"/>
+                    <w:start w:val="single" w:space="0" w:color="D3D3D3"/>
+                    <w:end w:val="single" w:space="0" w:color="D3D3D3"/>
+                  </w:tcBorders>
+                </w:tcPr>
+                <w:p>
+                  <w:pPr>
+                    <w:spacing w:before="0" w:after="60"/>
+                    <w:keepNext/>
+                    <w:jc w:val="center"/>
+                  </w:pPr>
+                  <w:r>
+                    <w:rPr>
+                      <w:rFonts w:ascii="Calibri" w:hAnsi="Calibri"/>
+                      <w:sz w:val="20"/>
+                    </w:rPr>
+                    <w:t xml:space="default">n (%)</w:t>
+                  </w:r>
+                </w:p>
+              </w:tc>
+              <w:tc>
+                <w:tcPr>
+                  <w:tcBorders>
+                    <w:top w:val="single" w:space="0" w:color="D3D3D3"/>
+                    <w:bottom w:val="single" w:space="0" w:color="D3D3D3"/>
+                    <w:start w:val="single" w:space="0" w:color="D3D3D3"/>
+                    <w:end w:val="single" w:space="0" w:color="D3D3D3"/>
+                  </w:tcBorders>
+                </w:tcPr>
+                <w:p>
+                  <w:pPr>
+                    <w:spacing w:before="0" w:after="60"/>
+                    <w:keepNext/>
+                    <w:jc w:val="center"/>
+                  </w:pPr>
+                  <w:r>
+                    <w:rPr>
+                      <w:rFonts w:ascii="Calibri" w:hAnsi="Calibri"/>
+                      <w:sz w:val="20"/>
+                    </w:rPr>
+                    <w:t xml:space="default">n (%)</w:t>
+                  </w:r>
+                </w:p>
+              </w:tc>
+            </w:tr>
+            <w:tr>
+              <w:trPr>
+                <w:cantSplit/>
+              </w:trPr>
+              <w:tc>
+                <w:tcPr>
+                  <w:tcBorders>
+                    <w:top w:val="single" w:space="0" w:color="D3D3D3"/>
+                    <w:bottom w:val="single" w:space="0" w:color="D3D3D3"/>
+                    <w:start w:val="single" w:space="0" w:color="D3D3D3"/>
+                    <w:end w:val="single" w:space="0" w:color="D3D3D3"/>
+                  </w:tcBorders>
+                </w:tcPr>
+                <w:p>
+                  <w:pPr>
+                    <w:spacing w:before="0" w:after="60"/>
+                    <w:keepNext/>
+                    <w:jc w:val="start"/>
+                  </w:pPr>
+                  <w:r>
+                    <w:rPr>
+                      <w:rFonts w:ascii="Calibri" w:hAnsi="Calibri"/>
+                      <w:sz w:val="20"/>
+                    </w:rPr>
+                    <w:t xml:space="default">    Vascular surgery</w:t>
+                  </w:r>
+                </w:p>
+              </w:tc>
+              <w:tc>
+                <w:tcPr>
+                  <w:tcBorders>
+                    <w:top w:val="single" w:space="0" w:color="D3D3D3"/>
+                    <w:bottom w:val="single" w:space="0" w:color="D3D3D3"/>
+                    <w:start w:val="single" w:space="0" w:color="D3D3D3"/>
+                    <w:end w:val="single" w:space="0" w:color="D3D3D3"/>
+                  </w:tcBorders>
+                </w:tcPr>
+                <w:p>
+                  <w:pPr>
+                    <w:spacing w:before="0" w:after="60"/>
+                    <w:keepNext/>
+                    <w:jc w:val="center"/>
+                  </w:pPr>
+                  <w:r>
+                    <w:rPr>
+                      <w:rFonts w:ascii="Calibri" w:hAnsi="Calibri"/>
+                      <w:sz w:val="20"/>
+                    </w:rPr>
+                    <w:t xml:space="default">n (%)</w:t>
+                  </w:r>
+                </w:p>
+              </w:tc>
+              <w:tc>
+                <w:tcPr>
+                  <w:tcBorders>
+                    <w:top w:val="single" w:space="0" w:color="D3D3D3"/>
+                    <w:bottom w:val="single" w:space="0" w:color="D3D3D3"/>
+                    <w:start w:val="single" w:space="0" w:color="D3D3D3"/>
+                    <w:end w:val="single" w:space="0" w:color="D3D3D3"/>
+                  </w:tcBorders>
+                </w:tcPr>
+                <w:p>
+                  <w:pPr>
+                    <w:spacing w:before="0" w:after="60"/>
+                    <w:keepNext/>
+                    <w:jc w:val="center"/>
+                  </w:pPr>
+                  <w:r>
+                    <w:rPr>
+                      <w:rFonts w:ascii="Calibri" w:hAnsi="Calibri"/>
+                      <w:sz w:val="20"/>
+                    </w:rPr>
+                    <w:t xml:space="default">n (%)</w:t>
+                  </w:r>
+                </w:p>
+              </w:tc>
+              <w:tc>
+                <w:tcPr>
+                  <w:tcBorders>
+                    <w:top w:val="single" w:space="0" w:color="D3D3D3"/>
+                    <w:bottom w:val="single" w:space="0" w:color="D3D3D3"/>
+                    <w:start w:val="single" w:space="0" w:color="D3D3D3"/>
+                    <w:end w:val="single" w:space="0" w:color="D3D3D3"/>
+                  </w:tcBorders>
+                </w:tcPr>
+                <w:p>
+                  <w:pPr>
+                    <w:spacing w:before="0" w:after="60"/>
+                    <w:keepNext/>
+                    <w:jc w:val="center"/>
+                  </w:pPr>
+                  <w:r>
+                    <w:rPr>
+                      <w:rFonts w:ascii="Calibri" w:hAnsi="Calibri"/>
+                      <w:sz w:val="20"/>
+                    </w:rPr>
+                    <w:t xml:space="default">n (%)</w:t>
+                  </w:r>
+                </w:p>
+              </w:tc>
+              <w:tc>
+                <w:tcPr>
+                  <w:tcBorders>
+                    <w:top w:val="single" w:space="0" w:color="D3D3D3"/>
+                    <w:bottom w:val="single" w:space="0" w:color="D3D3D3"/>
+                    <w:start w:val="single" w:space="0" w:color="D3D3D3"/>
+                    <w:end w:val="single" w:space="0" w:color="D3D3D3"/>
+                  </w:tcBorders>
+                </w:tcPr>
+                <w:p>
+                  <w:pPr>
+                    <w:spacing w:before="0" w:after="60"/>
+                    <w:keepNext/>
+                    <w:jc w:val="center"/>
+                  </w:pPr>
+                  <w:r>
+                    <w:rPr>
+                      <w:rFonts w:ascii="Calibri" w:hAnsi="Calibri"/>
+                      <w:sz w:val="20"/>
+                    </w:rPr>
+                    <w:t xml:space="default">n (%)</w:t>
+                  </w:r>
+                </w:p>
+              </w:tc>
+              <w:tc>
+                <w:tcPr>
+                  <w:tcBorders>
+                    <w:top w:val="single" w:space="0" w:color="D3D3D3"/>
+                    <w:bottom w:val="single" w:space="0" w:color="D3D3D3"/>
+                    <w:start w:val="single" w:space="0" w:color="D3D3D3"/>
+                    <w:end w:val="single" w:space="0" w:color="D3D3D3"/>
+                  </w:tcBorders>
+                </w:tcPr>
+                <w:p>
+                  <w:pPr>
+                    <w:spacing w:before="0" w:after="60"/>
+                    <w:keepNext/>
+                    <w:jc w:val="center"/>
+                  </w:pPr>
+                  <w:r>
+                    <w:rPr>
+                      <w:rFonts w:ascii="Calibri" w:hAnsi="Calibri"/>
+                      <w:sz w:val="20"/>
+                    </w:rPr>
+                    <w:t xml:space="default">n (%)</w:t>
+                  </w:r>
+                </w:p>
+              </w:tc>
+              <w:tc>
+                <w:tcPr>
+                  <w:tcBorders>
+                    <w:top w:val="single" w:space="0" w:color="D3D3D3"/>
+                    <w:bottom w:val="single" w:space="0" w:color="D3D3D3"/>
+                    <w:start w:val="single" w:space="0" w:color="D3D3D3"/>
+                    <w:end w:val="single" w:space="0" w:color="D3D3D3"/>
+                  </w:tcBorders>
+                </w:tcPr>
+                <w:p>
+                  <w:pPr>
+                    <w:spacing w:before="0" w:after="60"/>
+                    <w:keepNext/>
+                    <w:jc w:val="center"/>
+                  </w:pPr>
+                  <w:r>
+                    <w:rPr>
+                      <w:rFonts w:ascii="Calibri" w:hAnsi="Calibri"/>
+                      <w:sz w:val="20"/>
+                    </w:rPr>
+                    <w:t xml:space="default">n (%)</w:t>
+                  </w:r>
+                </w:p>
+              </w:tc>
+            </w:tr>
+            <w:tr>
+              <w:trPr>
+                <w:cantSplit/>
+              </w:trPr>
+              <w:tc>
+                <w:tcPr>
+                  <w:tcBorders>
+                    <w:top w:val="single" w:space="0" w:color="D3D3D3"/>
+                    <w:bottom w:val="single" w:space="0" w:color="D3D3D3"/>
+                    <w:start w:val="single" w:space="0" w:color="D3D3D3"/>
+                    <w:end w:val="single" w:space="0" w:color="D3D3D3"/>
+                  </w:tcBorders>
+                </w:tcPr>
+                <w:p>
+                  <w:pPr>
+                    <w:spacing w:before="0" w:after="60"/>
+                    <w:keepNext/>
+                    <w:jc w:val="start"/>
+                  </w:pPr>
+                  <w:r>
+                    <w:rPr>
+                      <w:rFonts w:ascii="Calibri" w:hAnsi="Calibri"/>
+                      <w:sz w:val="20"/>
+                    </w:rPr>
+                    <w:t xml:space="default">    Interventional radiology</w:t>
+                  </w:r>
+                </w:p>
+              </w:tc>
+              <w:tc>
+                <w:tcPr>
+                  <w:tcBorders>
+                    <w:top w:val="single" w:space="0" w:color="D3D3D3"/>
+                    <w:bottom w:val="single" w:space="0" w:color="D3D3D3"/>
+                    <w:start w:val="single" w:space="0" w:color="D3D3D3"/>
+                    <w:end w:val="single" w:space="0" w:color="D3D3D3"/>
+                  </w:tcBorders>
+                </w:tcPr>
+                <w:p>
+                  <w:pPr>
+                    <w:spacing w:before="0" w:after="60"/>
+                    <w:keepNext/>
+                    <w:jc w:val="center"/>
+                  </w:pPr>
+                  <w:r>
+                    <w:rPr>
+                      <w:rFonts w:ascii="Calibri" w:hAnsi="Calibri"/>
+                      <w:sz w:val="20"/>
+                    </w:rPr>
+                    <w:t xml:space="default">n (%)</w:t>
+                  </w:r>
+                </w:p>
+              </w:tc>
+              <w:tc>
+                <w:tcPr>
+                  <w:tcBorders>
+                    <w:top w:val="single" w:space="0" w:color="D3D3D3"/>
+                    <w:bottom w:val="single" w:space="0" w:color="D3D3D3"/>
+                    <w:start w:val="single" w:space="0" w:color="D3D3D3"/>
+                    <w:end w:val="single" w:space="0" w:color="D3D3D3"/>
+                  </w:tcBorders>
+                </w:tcPr>
+                <w:p>
+                  <w:pPr>
+                    <w:spacing w:before="0" w:after="60"/>
+                    <w:keepNext/>
+                    <w:jc w:val="center"/>
+                  </w:pPr>
+                  <w:r>
+                    <w:rPr>
+                      <w:rFonts w:ascii="Calibri" w:hAnsi="Calibri"/>
+                      <w:sz w:val="20"/>
+                    </w:rPr>
+                    <w:t xml:space="default">n (%)</w:t>
+                  </w:r>
+                </w:p>
+              </w:tc>
+              <w:tc>
+                <w:tcPr>
+                  <w:tcBorders>
+                    <w:top w:val="single" w:space="0" w:color="D3D3D3"/>
+                    <w:bottom w:val="single" w:space="0" w:color="D3D3D3"/>
+                    <w:start w:val="single" w:space="0" w:color="D3D3D3"/>
+                    <w:end w:val="single" w:space="0" w:color="D3D3D3"/>
+                  </w:tcBorders>
+                </w:tcPr>
+                <w:p>
+                  <w:pPr>
+                    <w:spacing w:before="0" w:after="60"/>
+                    <w:keepNext/>
+                    <w:jc w:val="center"/>
+                  </w:pPr>
+                  <w:r>
+                    <w:rPr>
+                      <w:rFonts w:ascii="Calibri" w:hAnsi="Calibri"/>
+                      <w:sz w:val="20"/>
+                    </w:rPr>
+                    <w:t xml:space="default">n (%)</w:t>
+                  </w:r>
+                </w:p>
+              </w:tc>
+              <w:tc>
+                <w:tcPr>
+                  <w:tcBorders>
+                    <w:top w:val="single" w:space="0" w:color="D3D3D3"/>
+                    <w:bottom w:val="single" w:space="0" w:color="D3D3D3"/>
+                    <w:start w:val="single" w:space="0" w:color="D3D3D3"/>
+                    <w:end w:val="single" w:space="0" w:color="D3D3D3"/>
+                  </w:tcBorders>
+                </w:tcPr>
+                <w:p>
+                  <w:pPr>
+                    <w:spacing w:before="0" w:after="60"/>
+                    <w:keepNext/>
+                    <w:jc w:val="center"/>
+                  </w:pPr>
+                  <w:r>
+                    <w:rPr>
+                      <w:rFonts w:ascii="Calibri" w:hAnsi="Calibri"/>
+                      <w:sz w:val="20"/>
+                    </w:rPr>
+                    <w:t xml:space="default">n (%)</w:t>
+                  </w:r>
+                </w:p>
+              </w:tc>
+              <w:tc>
+                <w:tcPr>
+                  <w:tcBorders>
+                    <w:top w:val="single" w:space="0" w:color="D3D3D3"/>
+                    <w:bottom w:val="single" w:space="0" w:color="D3D3D3"/>
+                    <w:start w:val="single" w:space="0" w:color="D3D3D3"/>
+                    <w:end w:val="single" w:space="0" w:color="D3D3D3"/>
+                  </w:tcBorders>
+                </w:tcPr>
+                <w:p>
+                  <w:pPr>
+                    <w:spacing w:before="0" w:after="60"/>
+                    <w:keepNext/>
+                    <w:jc w:val="center"/>
+                  </w:pPr>
+                  <w:r>
+                    <w:rPr>
+                      <w:rFonts w:ascii="Calibri" w:hAnsi="Calibri"/>
+                      <w:sz w:val="20"/>
+                    </w:rPr>
+                    <w:t xml:space="default">n (%)</w:t>
+                  </w:r>
+                </w:p>
+              </w:tc>
+              <w:tc>
+                <w:tcPr>
+                  <w:tcBorders>
+                    <w:top w:val="single" w:space="0" w:color="D3D3D3"/>
+                    <w:bottom w:val="single" w:space="0" w:color="D3D3D3"/>
+                    <w:start w:val="single" w:space="0" w:color="D3D3D3"/>
+                    <w:end w:val="single" w:space="0" w:color="D3D3D3"/>
+                  </w:tcBorders>
+                </w:tcPr>
+                <w:p>
+                  <w:pPr>
+                    <w:spacing w:before="0" w:after="60"/>
+                    <w:keepNext/>
+                    <w:jc w:val="center"/>
+                  </w:pPr>
+                  <w:r>
+                    <w:rPr>
+                      <w:rFonts w:ascii="Calibri" w:hAnsi="Calibri"/>
+                      <w:sz w:val="20"/>
+                    </w:rPr>
+                    <w:t xml:space="default">n (%)</w:t>
+                  </w:r>
+                </w:p>
+              </w:tc>
+            </w:tr>
+            <w:tr>
+              <w:trPr>
+                <w:cantSplit/>
+              </w:trPr>
+              <w:tc>
+                <w:tcPr>
+                  <w:tcBorders>
+                    <w:top w:val="single" w:space="0" w:color="D3D3D3"/>
+                    <w:bottom w:val="single" w:space="0" w:color="D3D3D3"/>
+                    <w:start w:val="single" w:space="0" w:color="D3D3D3"/>
+                    <w:end w:val="single" w:space="0" w:color="D3D3D3"/>
+                  </w:tcBorders>
+                </w:tcPr>
+                <w:p>
+                  <w:pPr>
+                    <w:spacing w:before="0" w:after="60"/>
+                    <w:keepNext/>
+                    <w:jc w:val="start"/>
+                  </w:pPr>
+                  <w:r>
+                    <w:rPr>
+                      <w:rFonts w:ascii="Calibri" w:hAnsi="Calibri"/>
+                      <w:sz w:val="20"/>
+                    </w:rPr>
+                    <w:t xml:space="default">    Emergency medicine</w:t>
+                  </w:r>
+                </w:p>
+              </w:tc>
+              <w:tc>
+                <w:tcPr>
+                  <w:tcBorders>
+                    <w:top w:val="single" w:space="0" w:color="D3D3D3"/>
+                    <w:bottom w:val="single" w:space="0" w:color="D3D3D3"/>
+                    <w:start w:val="single" w:space="0" w:color="D3D3D3"/>
+                    <w:end w:val="single" w:space="0" w:color="D3D3D3"/>
+                  </w:tcBorders>
+                </w:tcPr>
+                <w:p>
+                  <w:pPr>
+                    <w:spacing w:before="0" w:after="60"/>
+                    <w:keepNext/>
+                    <w:jc w:val="center"/>
+                  </w:pPr>
+                  <w:r>
+                    <w:rPr>
+                      <w:rFonts w:ascii="Calibri" w:hAnsi="Calibri"/>
+                      <w:sz w:val="20"/>
+                    </w:rPr>
+                    <w:t xml:space="default">n (%)</w:t>
+                  </w:r>
+                </w:p>
+              </w:tc>
+              <w:tc>
+                <w:tcPr>
+                  <w:tcBorders>
+                    <w:top w:val="single" w:space="0" w:color="D3D3D3"/>
+                    <w:bottom w:val="single" w:space="0" w:color="D3D3D3"/>
+                    <w:start w:val="single" w:space="0" w:color="D3D3D3"/>
+                    <w:end w:val="single" w:space="0" w:color="D3D3D3"/>
+                  </w:tcBorders>
+                </w:tcPr>
+                <w:p>
+                  <w:pPr>
+                    <w:spacing w:before="0" w:after="60"/>
+                    <w:keepNext/>
+                    <w:jc w:val="center"/>
+                  </w:pPr>
+                  <w:r>
+                    <w:rPr>
+                      <w:rFonts w:ascii="Calibri" w:hAnsi="Calibri"/>
+                      <w:sz w:val="20"/>
+                    </w:rPr>
+                    <w:t xml:space="default">n (%)</w:t>
+                  </w:r>
+                </w:p>
+              </w:tc>
+              <w:tc>
+                <w:tcPr>
+                  <w:tcBorders>
+                    <w:top w:val="single" w:space="0" w:color="D3D3D3"/>
+                    <w:bottom w:val="single" w:space="0" w:color="D3D3D3"/>
+                    <w:start w:val="single" w:space="0" w:color="D3D3D3"/>
+                    <w:end w:val="single" w:space="0" w:color="D3D3D3"/>
+                  </w:tcBorders>
+                </w:tcPr>
+                <w:p>
+                  <w:pPr>
+                    <w:spacing w:before="0" w:after="60"/>
+                    <w:keepNext/>
+                    <w:jc w:val="center"/>
+                  </w:pPr>
+                  <w:r>
+                    <w:rPr>
+                      <w:rFonts w:ascii="Calibri" w:hAnsi="Calibri"/>
+                      <w:sz w:val="20"/>
+                    </w:rPr>
+                    <w:t xml:space="default">n (%)</w:t>
+                  </w:r>
+                </w:p>
+              </w:tc>
+              <w:tc>
+                <w:tcPr>
+                  <w:tcBorders>
+                    <w:top w:val="single" w:space="0" w:color="D3D3D3"/>
+                    <w:bottom w:val="single" w:space="0" w:color="D3D3D3"/>
+                    <w:start w:val="single" w:space="0" w:color="D3D3D3"/>
+                    <w:end w:val="single" w:space="0" w:color="D3D3D3"/>
+                  </w:tcBorders>
+                </w:tcPr>
+                <w:p>
+                  <w:pPr>
+                    <w:spacing w:before="0" w:after="60"/>
+                    <w:keepNext/>
+                    <w:jc w:val="center"/>
+                  </w:pPr>
+                  <w:r>
+                    <w:rPr>
+                      <w:rFonts w:ascii="Calibri" w:hAnsi="Calibri"/>
+                      <w:sz w:val="20"/>
+                    </w:rPr>
+                    <w:t xml:space="default">n (%)</w:t>
+                  </w:r>
+                </w:p>
+              </w:tc>
+              <w:tc>
+                <w:tcPr>
+                  <w:tcBorders>
+                    <w:top w:val="single" w:space="0" w:color="D3D3D3"/>
+                    <w:bottom w:val="single" w:space="0" w:color="D3D3D3"/>
+                    <w:start w:val="single" w:space="0" w:color="D3D3D3"/>
+                    <w:end w:val="single" w:space="0" w:color="D3D3D3"/>
+                  </w:tcBorders>
+                </w:tcPr>
+                <w:p>
+                  <w:pPr>
+                    <w:spacing w:before="0" w:after="60"/>
+                    <w:keepNext/>
+                    <w:jc w:val="center"/>
+                  </w:pPr>
+                  <w:r>
+                    <w:rPr>
+                      <w:rFonts w:ascii="Calibri" w:hAnsi="Calibri"/>
+                      <w:sz w:val="20"/>
+                    </w:rPr>
+                    <w:t xml:space="default">n (%)</w:t>
+                  </w:r>
+                </w:p>
+              </w:tc>
+              <w:tc>
+                <w:tcPr>
+                  <w:tcBorders>
+                    <w:top w:val="single" w:space="0" w:color="D3D3D3"/>
+                    <w:bottom w:val="single" w:space="0" w:color="D3D3D3"/>
+                    <w:start w:val="single" w:space="0" w:color="D3D3D3"/>
+                    <w:end w:val="single" w:space="0" w:color="D3D3D3"/>
+                  </w:tcBorders>
+                </w:tcPr>
+                <w:p>
+                  <w:pPr>
+                    <w:spacing w:before="0" w:after="60"/>
+                    <w:keepNext/>
+                    <w:jc w:val="center"/>
+                  </w:pPr>
+                  <w:r>
+                    <w:rPr>
+                      <w:rFonts w:ascii="Calibri" w:hAnsi="Calibri"/>
+                      <w:sz w:val="20"/>
+                    </w:rPr>
+                    <w:t xml:space="default">n (%)</w:t>
+                  </w:r>
+                </w:p>
+              </w:tc>
+            </w:tr>
+            <w:tr>
+              <w:trPr>
+                <w:cantSplit/>
+              </w:trPr>
+              <w:tc>
+                <w:tcPr>
+                  <w:tcBorders>
+                    <w:top w:val="single" w:space="0" w:color="D3D3D3"/>
+                    <w:bottom w:val="single" w:space="0" w:color="D3D3D3"/>
+                    <w:start w:val="single" w:space="0" w:color="D3D3D3"/>
+                    <w:end w:val="single" w:space="0" w:color="D3D3D3"/>
+                  </w:tcBorders>
+                </w:tcPr>
+                <w:p>
+                  <w:pPr>
+                    <w:spacing w:before="0" w:after="60"/>
+                    <w:keepNext/>
+                    <w:jc w:val="start"/>
+                  </w:pPr>
+                  <w:r>
+                    <w:rPr>
+                      <w:rFonts w:ascii="Calibri" w:hAnsi="Calibri"/>
+                      <w:sz w:val="20"/>
+                    </w:rPr>
+                    <w:t xml:space="default">Facilities available around the clock, n (%)</w:t>
+                  </w:r>
+                </w:p>
+              </w:tc>
+              <w:tc>
+                <w:tcPr>
+                  <w:tcBorders>
+                    <w:top w:val="single" w:space="0" w:color="D3D3D3"/>
+                    <w:bottom w:val="single" w:space="0" w:color="D3D3D3"/>
+                    <w:start w:val="single" w:space="0" w:color="D3D3D3"/>
+                    <w:end w:val="single" w:space="0" w:color="D3D3D3"/>
+                  </w:tcBorders>
+                </w:tcPr>
+                <w:p>
+                  <w:pPr>
+                    <w:spacing w:before="0" w:after="60"/>
+                    <w:keepNext/>
+                    <w:jc w:val="center"/>
+                  </w:pPr>
+                  <w:r>
+                    <w:rPr>
+                      <w:rFonts w:ascii="Calibri" w:hAnsi="Calibri"/>
+                      <w:sz w:val="20"/>
+                    </w:rPr>
+                    <w:t xml:space="default"/>
+                  </w:r>
+                </w:p>
+              </w:tc>
+              <w:tc>
+                <w:tcPr>
+                  <w:tcBorders>
+                    <w:top w:val="single" w:space="0" w:color="D3D3D3"/>
+                    <w:bottom w:val="single" w:space="0" w:color="D3D3D3"/>
+                    <w:start w:val="single" w:space="0" w:color="D3D3D3"/>
+                    <w:end w:val="single" w:space="0" w:color="D3D3D3"/>
+                  </w:tcBorders>
+                </w:tcPr>
+                <w:p>
+                  <w:pPr>
+                    <w:spacing w:before="0" w:after="60"/>
+                    <w:keepNext/>
+                    <w:jc w:val="center"/>
+                  </w:pPr>
+                  <w:r>
+                    <w:rPr>
+                      <w:rFonts w:ascii="Calibri" w:hAnsi="Calibri"/>
+                      <w:sz w:val="20"/>
+                    </w:rPr>
+                    <w:t xml:space="default"/>
+                  </w:r>
+                </w:p>
+              </w:tc>
+              <w:tc>
+                <w:tcPr>
+                  <w:tcBorders>
+                    <w:top w:val="single" w:space="0" w:color="D3D3D3"/>
+                    <w:bottom w:val="single" w:space="0" w:color="D3D3D3"/>
+                    <w:start w:val="single" w:space="0" w:color="D3D3D3"/>
+                    <w:end w:val="single" w:space="0" w:color="D3D3D3"/>
+                  </w:tcBorders>
+                </w:tcPr>
+                <w:p>
+                  <w:pPr>
+                    <w:spacing w:before="0" w:after="60"/>
+                    <w:keepNext/>
+                    <w:jc w:val="center"/>
+                  </w:pPr>
+                  <w:r>
+                    <w:rPr>
+                      <w:rFonts w:ascii="Calibri" w:hAnsi="Calibri"/>
+                      <w:sz w:val="20"/>
+                    </w:rPr>
+                    <w:t xml:space="default"/>
+                  </w:r>
+                </w:p>
+              </w:tc>
+              <w:tc>
+                <w:tcPr>
+                  <w:tcBorders>
+                    <w:top w:val="single" w:space="0" w:color="D3D3D3"/>
+                    <w:bottom w:val="single" w:space="0" w:color="D3D3D3"/>
+                    <w:start w:val="single" w:space="0" w:color="D3D3D3"/>
+                    <w:end w:val="single" w:space="0" w:color="D3D3D3"/>
+                  </w:tcBorders>
+                </w:tcPr>
+                <w:p>
+                  <w:pPr>
+                    <w:spacing w:before="0" w:after="60"/>
+                    <w:keepNext/>
+                    <w:jc w:val="center"/>
+                  </w:pPr>
+                  <w:r>
+                    <w:rPr>
+                      <w:rFonts w:ascii="Calibri" w:hAnsi="Calibri"/>
+                      <w:sz w:val="20"/>
+                    </w:rPr>
+                    <w:t xml:space="default"/>
+                  </w:r>
+                </w:p>
+              </w:tc>
+              <w:tc>
+                <w:tcPr>
+                  <w:tcBorders>
+                    <w:top w:val="single" w:space="0" w:color="D3D3D3"/>
+                    <w:bottom w:val="single" w:space="0" w:color="D3D3D3"/>
+                    <w:start w:val="single" w:space="0" w:color="D3D3D3"/>
+                    <w:end w:val="single" w:space="0" w:color="D3D3D3"/>
+                  </w:tcBorders>
+                </w:tcPr>
+                <w:p>
+                  <w:pPr>
+                    <w:spacing w:before="0" w:after="60"/>
+                    <w:keepNext/>
+                    <w:jc w:val="center"/>
+                  </w:pPr>
+                  <w:r>
+                    <w:rPr>
+                      <w:rFonts w:ascii="Calibri" w:hAnsi="Calibri"/>
+                      <w:sz w:val="20"/>
+                    </w:rPr>
+                    <w:t xml:space="default"/>
+                  </w:r>
+                </w:p>
+              </w:tc>
+              <w:tc>
+                <w:tcPr>
+                  <w:tcBorders>
+                    <w:top w:val="single" w:space="0" w:color="D3D3D3"/>
+                    <w:bottom w:val="single" w:space="0" w:color="D3D3D3"/>
+                    <w:start w:val="single" w:space="0" w:color="D3D3D3"/>
+                    <w:end w:val="single" w:space="0" w:color="D3D3D3"/>
+                  </w:tcBorders>
+                </w:tcPr>
+                <w:p>
+                  <w:pPr>
+                    <w:spacing w:before="0" w:after="60"/>
+                    <w:keepNext/>
+                    <w:jc w:val="center"/>
+                  </w:pPr>
+                  <w:r>
+                    <w:rPr>
+                      <w:rFonts w:ascii="Calibri" w:hAnsi="Calibri"/>
+                      <w:sz w:val="20"/>
+                    </w:rPr>
+                    <w:t xml:space="default"/>
+                  </w:r>
+                </w:p>
+              </w:tc>
+            </w:tr>
+            <w:tr>
+              <w:trPr>
+                <w:cantSplit/>
+              </w:trPr>
+              <w:tc>
+                <w:tcPr>
+                  <w:tcBorders>
+                    <w:top w:val="single" w:space="0" w:color="D3D3D3"/>
+                    <w:bottom w:val="single" w:space="0" w:color="D3D3D3"/>
+                    <w:start w:val="single" w:space="0" w:color="D3D3D3"/>
+                    <w:end w:val="single" w:space="0" w:color="D3D3D3"/>
+                  </w:tcBorders>
+                </w:tcPr>
+                <w:p>
+                  <w:pPr>
+                    <w:spacing w:before="0" w:after="60"/>
+                    <w:keepNext/>
+                    <w:jc w:val="start"/>
+                  </w:pPr>
+                  <w:r>
+                    <w:rPr>
+                      <w:rFonts w:ascii="Calibri" w:hAnsi="Calibri"/>
+                      <w:sz w:val="20"/>
+                    </w:rPr>
+                    <w:t xml:space="default">    X-ray</w:t>
+                  </w:r>
+                </w:p>
+              </w:tc>
+              <w:tc>
+                <w:tcPr>
+                  <w:tcBorders>
+                    <w:top w:val="single" w:space="0" w:color="D3D3D3"/>
+                    <w:bottom w:val="single" w:space="0" w:color="D3D3D3"/>
+                    <w:start w:val="single" w:space="0" w:color="D3D3D3"/>
+                    <w:end w:val="single" w:space="0" w:color="D3D3D3"/>
+                  </w:tcBorders>
+                </w:tcPr>
+                <w:p>
+                  <w:pPr>
+                    <w:spacing w:before="0" w:after="60"/>
+                    <w:keepNext/>
+                    <w:jc w:val="center"/>
+                  </w:pPr>
+                  <w:r>
+                    <w:rPr>
+                      <w:rFonts w:ascii="Calibri" w:hAnsi="Calibri"/>
+                      <w:sz w:val="20"/>
+                    </w:rPr>
+                    <w:t xml:space="default">n (%)</w:t>
+                  </w:r>
+                </w:p>
+              </w:tc>
+              <w:tc>
+                <w:tcPr>
+                  <w:tcBorders>
+                    <w:top w:val="single" w:space="0" w:color="D3D3D3"/>
+                    <w:bottom w:val="single" w:space="0" w:color="D3D3D3"/>
+                    <w:start w:val="single" w:space="0" w:color="D3D3D3"/>
+                    <w:end w:val="single" w:space="0" w:color="D3D3D3"/>
+                  </w:tcBorders>
+                </w:tcPr>
+                <w:p>
+                  <w:pPr>
+                    <w:spacing w:before="0" w:after="60"/>
+                    <w:keepNext/>
+                    <w:jc w:val="center"/>
+                  </w:pPr>
+                  <w:r>
+                    <w:rPr>
+                      <w:rFonts w:ascii="Calibri" w:hAnsi="Calibri"/>
+                      <w:sz w:val="20"/>
+                    </w:rPr>
+                    <w:t xml:space="default">n (%)</w:t>
+                  </w:r>
+                </w:p>
+              </w:tc>
+              <w:tc>
+                <w:tcPr>
+                  <w:tcBorders>
+                    <w:top w:val="single" w:space="0" w:color="D3D3D3"/>
+                    <w:bottom w:val="single" w:space="0" w:color="D3D3D3"/>
+                    <w:start w:val="single" w:space="0" w:color="D3D3D3"/>
+                    <w:end w:val="single" w:space="0" w:color="D3D3D3"/>
+                  </w:tcBorders>
+                </w:tcPr>
+                <w:p>
+                  <w:pPr>
+                    <w:spacing w:before="0" w:after="60"/>
+                    <w:keepNext/>
+                    <w:jc w:val="center"/>
+                  </w:pPr>
+                  <w:r>
+                    <w:rPr>
+                      <w:rFonts w:ascii="Calibri" w:hAnsi="Calibri"/>
+                      <w:sz w:val="20"/>
+                    </w:rPr>
+                    <w:t xml:space="default">n (%)</w:t>
+                  </w:r>
+                </w:p>
+              </w:tc>
+              <w:tc>
+                <w:tcPr>
+                  <w:tcBorders>
+                    <w:top w:val="single" w:space="0" w:color="D3D3D3"/>
+                    <w:bottom w:val="single" w:space="0" w:color="D3D3D3"/>
+                    <w:start w:val="single" w:space="0" w:color="D3D3D3"/>
+                    <w:end w:val="single" w:space="0" w:color="D3D3D3"/>
+                  </w:tcBorders>
+                </w:tcPr>
+                <w:p>
+                  <w:pPr>
+                    <w:spacing w:before="0" w:after="60"/>
+                    <w:keepNext/>
+                    <w:jc w:val="center"/>
+                  </w:pPr>
+                  <w:r>
+                    <w:rPr>
+                      <w:rFonts w:ascii="Calibri" w:hAnsi="Calibri"/>
+                      <w:sz w:val="20"/>
+                    </w:rPr>
+                    <w:t xml:space="default">n (%)</w:t>
+                  </w:r>
+                </w:p>
+              </w:tc>
+              <w:tc>
+                <w:tcPr>
+                  <w:tcBorders>
+                    <w:top w:val="single" w:space="0" w:color="D3D3D3"/>
+                    <w:bottom w:val="single" w:space="0" w:color="D3D3D3"/>
+                    <w:start w:val="single" w:space="0" w:color="D3D3D3"/>
+                    <w:end w:val="single" w:space="0" w:color="D3D3D3"/>
+                  </w:tcBorders>
+                </w:tcPr>
+                <w:p>
+                  <w:pPr>
+                    <w:spacing w:before="0" w:after="60"/>
+                    <w:keepNext/>
+                    <w:jc w:val="center"/>
+                  </w:pPr>
+                  <w:r>
+                    <w:rPr>
+                      <w:rFonts w:ascii="Calibri" w:hAnsi="Calibri"/>
+                      <w:sz w:val="20"/>
+                    </w:rPr>
+                    <w:t xml:space="default">n (%)</w:t>
+                  </w:r>
+                </w:p>
+              </w:tc>
+              <w:tc>
+                <w:tcPr>
+                  <w:tcBorders>
+                    <w:top w:val="single" w:space="0" w:color="D3D3D3"/>
+                    <w:bottom w:val="single" w:space="0" w:color="D3D3D3"/>
+                    <w:start w:val="single" w:space="0" w:color="D3D3D3"/>
+                    <w:end w:val="single" w:space="0" w:color="D3D3D3"/>
+                  </w:tcBorders>
+                </w:tcPr>
+                <w:p>
+                  <w:pPr>
+                    <w:spacing w:before="0" w:after="60"/>
+                    <w:keepNext/>
+                    <w:jc w:val="center"/>
+                  </w:pPr>
+                  <w:r>
+                    <w:rPr>
+                      <w:rFonts w:ascii="Calibri" w:hAnsi="Calibri"/>
+                      <w:sz w:val="20"/>
+                    </w:rPr>
+                    <w:t xml:space="default">n (%)</w:t>
+                  </w:r>
+                </w:p>
+              </w:tc>
+            </w:tr>
+            <w:tr>
+              <w:trPr>
+                <w:cantSplit/>
+              </w:trPr>
+              <w:tc>
+                <w:tcPr>
+                  <w:tcBorders>
+                    <w:top w:val="single" w:space="0" w:color="D3D3D3"/>
+                    <w:bottom w:val="single" w:space="0" w:color="D3D3D3"/>
+                    <w:start w:val="single" w:space="0" w:color="D3D3D3"/>
+                    <w:end w:val="single" w:space="0" w:color="D3D3D3"/>
+                  </w:tcBorders>
+                </w:tcPr>
+                <w:p>
+                  <w:pPr>
+                    <w:spacing w:before="0" w:after="60"/>
+                    <w:keepNext/>
+                    <w:jc w:val="start"/>
+                  </w:pPr>
+                  <w:r>
+                    <w:rPr>
+                      <w:rFonts w:ascii="Calibri" w:hAnsi="Calibri"/>
+                      <w:sz w:val="20"/>
+                    </w:rPr>
+                    <w:t xml:space="default">    Ultrasound/FAST</w:t>
+                  </w:r>
+                </w:p>
+              </w:tc>
+              <w:tc>
+                <w:tcPr>
+                  <w:tcBorders>
+                    <w:top w:val="single" w:space="0" w:color="D3D3D3"/>
+                    <w:bottom w:val="single" w:space="0" w:color="D3D3D3"/>
+                    <w:start w:val="single" w:space="0" w:color="D3D3D3"/>
+                    <w:end w:val="single" w:space="0" w:color="D3D3D3"/>
+                  </w:tcBorders>
+                </w:tcPr>
+                <w:p>
+                  <w:pPr>
+                    <w:spacing w:before="0" w:after="60"/>
+                    <w:keepNext/>
+                    <w:jc w:val="center"/>
+                  </w:pPr>
+                  <w:r>
+                    <w:rPr>
+                      <w:rFonts w:ascii="Calibri" w:hAnsi="Calibri"/>
+                      <w:sz w:val="20"/>
+                    </w:rPr>
+                    <w:t xml:space="default">n (%)</w:t>
+                  </w:r>
+                </w:p>
+              </w:tc>
+              <w:tc>
+                <w:tcPr>
+                  <w:tcBorders>
+                    <w:top w:val="single" w:space="0" w:color="D3D3D3"/>
+                    <w:bottom w:val="single" w:space="0" w:color="D3D3D3"/>
+                    <w:start w:val="single" w:space="0" w:color="D3D3D3"/>
+                    <w:end w:val="single" w:space="0" w:color="D3D3D3"/>
+                  </w:tcBorders>
+                </w:tcPr>
+                <w:p>
+                  <w:pPr>
+                    <w:spacing w:before="0" w:after="60"/>
+                    <w:keepNext/>
+                    <w:jc w:val="center"/>
+                  </w:pPr>
+                  <w:r>
+                    <w:rPr>
+                      <w:rFonts w:ascii="Calibri" w:hAnsi="Calibri"/>
+                      <w:sz w:val="20"/>
+                    </w:rPr>
+                    <w:t xml:space="default">n (%)</w:t>
+                  </w:r>
+                </w:p>
+              </w:tc>
+              <w:tc>
+                <w:tcPr>
+                  <w:tcBorders>
+                    <w:top w:val="single" w:space="0" w:color="D3D3D3"/>
+                    <w:bottom w:val="single" w:space="0" w:color="D3D3D3"/>
+                    <w:start w:val="single" w:space="0" w:color="D3D3D3"/>
+                    <w:end w:val="single" w:space="0" w:color="D3D3D3"/>
+                  </w:tcBorders>
+                </w:tcPr>
+                <w:p>
+                  <w:pPr>
+                    <w:spacing w:before="0" w:after="60"/>
+                    <w:keepNext/>
+                    <w:jc w:val="center"/>
+                  </w:pPr>
+                  <w:r>
+                    <w:rPr>
+                      <w:rFonts w:ascii="Calibri" w:hAnsi="Calibri"/>
+                      <w:sz w:val="20"/>
+                    </w:rPr>
+                    <w:t xml:space="default">n (%)</w:t>
+                  </w:r>
+                </w:p>
+              </w:tc>
+              <w:tc>
+                <w:tcPr>
+                  <w:tcBorders>
+                    <w:top w:val="single" w:space="0" w:color="D3D3D3"/>
+                    <w:bottom w:val="single" w:space="0" w:color="D3D3D3"/>
+                    <w:start w:val="single" w:space="0" w:color="D3D3D3"/>
+                    <w:end w:val="single" w:space="0" w:color="D3D3D3"/>
+                  </w:tcBorders>
+                </w:tcPr>
+                <w:p>
+                  <w:pPr>
+                    <w:spacing w:before="0" w:after="60"/>
+                    <w:keepNext/>
+                    <w:jc w:val="center"/>
+                  </w:pPr>
+                  <w:r>
+                    <w:rPr>
+                      <w:rFonts w:ascii="Calibri" w:hAnsi="Calibri"/>
+                      <w:sz w:val="20"/>
+                    </w:rPr>
+                    <w:t xml:space="default">n (%)</w:t>
+                  </w:r>
+                </w:p>
+              </w:tc>
+              <w:tc>
+                <w:tcPr>
+                  <w:tcBorders>
+                    <w:top w:val="single" w:space="0" w:color="D3D3D3"/>
+                    <w:bottom w:val="single" w:space="0" w:color="D3D3D3"/>
+                    <w:start w:val="single" w:space="0" w:color="D3D3D3"/>
+                    <w:end w:val="single" w:space="0" w:color="D3D3D3"/>
+                  </w:tcBorders>
+                </w:tcPr>
+                <w:p>
+                  <w:pPr>
+                    <w:spacing w:before="0" w:after="60"/>
+                    <w:keepNext/>
+                    <w:jc w:val="center"/>
+                  </w:pPr>
+                  <w:r>
+                    <w:rPr>
+                      <w:rFonts w:ascii="Calibri" w:hAnsi="Calibri"/>
+                      <w:sz w:val="20"/>
+                    </w:rPr>
+                    <w:t xml:space="default">n (%)</w:t>
+                  </w:r>
+                </w:p>
+              </w:tc>
+              <w:tc>
+                <w:tcPr>
+                  <w:tcBorders>
+                    <w:top w:val="single" w:space="0" w:color="D3D3D3"/>
+                    <w:bottom w:val="single" w:space="0" w:color="D3D3D3"/>
+                    <w:start w:val="single" w:space="0" w:color="D3D3D3"/>
+                    <w:end w:val="single" w:space="0" w:color="D3D3D3"/>
+                  </w:tcBorders>
+                </w:tcPr>
+                <w:p>
+                  <w:pPr>
+                    <w:spacing w:before="0" w:after="60"/>
+                    <w:keepNext/>
+                    <w:jc w:val="center"/>
+                  </w:pPr>
+                  <w:r>
+                    <w:rPr>
+                      <w:rFonts w:ascii="Calibri" w:hAnsi="Calibri"/>
+                      <w:sz w:val="20"/>
+                    </w:rPr>
+                    <w:t xml:space="default">n (%)</w:t>
+                  </w:r>
+                </w:p>
+              </w:tc>
+            </w:tr>
+            <w:tr>
+              <w:trPr>
+                <w:cantSplit/>
+              </w:trPr>
+              <w:tc>
+                <w:tcPr>
+                  <w:tcBorders>
+                    <w:top w:val="single" w:space="0" w:color="D3D3D3"/>
+                    <w:bottom w:val="single" w:space="0" w:color="D3D3D3"/>
+                    <w:start w:val="single" w:space="0" w:color="D3D3D3"/>
+                    <w:end w:val="single" w:space="0" w:color="D3D3D3"/>
+                  </w:tcBorders>
+                </w:tcPr>
+                <w:p>
+                  <w:pPr>
+                    <w:spacing w:before="0" w:after="60"/>
+                    <w:keepNext/>
+                    <w:jc w:val="start"/>
+                  </w:pPr>
+                  <w:r>
+                    <w:rPr>
+                      <w:rFonts w:ascii="Calibri" w:hAnsi="Calibri"/>
+                      <w:sz w:val="20"/>
+                    </w:rPr>
+                    <w:t xml:space="default">    CT</w:t>
+                  </w:r>
+                </w:p>
+              </w:tc>
+              <w:tc>
+                <w:tcPr>
+                  <w:tcBorders>
+                    <w:top w:val="single" w:space="0" w:color="D3D3D3"/>
+                    <w:bottom w:val="single" w:space="0" w:color="D3D3D3"/>
+                    <w:start w:val="single" w:space="0" w:color="D3D3D3"/>
+                    <w:end w:val="single" w:space="0" w:color="D3D3D3"/>
+                  </w:tcBorders>
+                </w:tcPr>
+                <w:p>
+                  <w:pPr>
+                    <w:spacing w:before="0" w:after="60"/>
+                    <w:keepNext/>
+                    <w:jc w:val="center"/>
+                  </w:pPr>
+                  <w:r>
+                    <w:rPr>
+                      <w:rFonts w:ascii="Calibri" w:hAnsi="Calibri"/>
+                      <w:sz w:val="20"/>
+                    </w:rPr>
+                    <w:t xml:space="default">n (%)</w:t>
+                  </w:r>
+                </w:p>
+              </w:tc>
+              <w:tc>
+                <w:tcPr>
+                  <w:tcBorders>
+                    <w:top w:val="single" w:space="0" w:color="D3D3D3"/>
+                    <w:bottom w:val="single" w:space="0" w:color="D3D3D3"/>
+                    <w:start w:val="single" w:space="0" w:color="D3D3D3"/>
+                    <w:end w:val="single" w:space="0" w:color="D3D3D3"/>
+                  </w:tcBorders>
+                </w:tcPr>
+                <w:p>
+                  <w:pPr>
+                    <w:spacing w:before="0" w:after="60"/>
+                    <w:keepNext/>
+                    <w:jc w:val="center"/>
+                  </w:pPr>
+                  <w:r>
+                    <w:rPr>
+                      <w:rFonts w:ascii="Calibri" w:hAnsi="Calibri"/>
+                      <w:sz w:val="20"/>
+                    </w:rPr>
+                    <w:t xml:space="default">n (%)</w:t>
+                  </w:r>
+                </w:p>
+              </w:tc>
+              <w:tc>
+                <w:tcPr>
+                  <w:tcBorders>
+                    <w:top w:val="single" w:space="0" w:color="D3D3D3"/>
+                    <w:bottom w:val="single" w:space="0" w:color="D3D3D3"/>
+                    <w:start w:val="single" w:space="0" w:color="D3D3D3"/>
+                    <w:end w:val="single" w:space="0" w:color="D3D3D3"/>
+                  </w:tcBorders>
+                </w:tcPr>
+                <w:p>
+                  <w:pPr>
+                    <w:spacing w:before="0" w:after="60"/>
+                    <w:keepNext/>
+                    <w:jc w:val="center"/>
+                  </w:pPr>
+                  <w:r>
+                    <w:rPr>
+                      <w:rFonts w:ascii="Calibri" w:hAnsi="Calibri"/>
+                      <w:sz w:val="20"/>
+                    </w:rPr>
+                    <w:t xml:space="default">n (%)</w:t>
+                  </w:r>
+                </w:p>
+              </w:tc>
+              <w:tc>
+                <w:tcPr>
+                  <w:tcBorders>
+                    <w:top w:val="single" w:space="0" w:color="D3D3D3"/>
+                    <w:bottom w:val="single" w:space="0" w:color="D3D3D3"/>
+                    <w:start w:val="single" w:space="0" w:color="D3D3D3"/>
+                    <w:end w:val="single" w:space="0" w:color="D3D3D3"/>
+                  </w:tcBorders>
+                </w:tcPr>
+                <w:p>
+                  <w:pPr>
+                    <w:spacing w:before="0" w:after="60"/>
+                    <w:keepNext/>
+                    <w:jc w:val="center"/>
+                  </w:pPr>
+                  <w:r>
+                    <w:rPr>
+                      <w:rFonts w:ascii="Calibri" w:hAnsi="Calibri"/>
+                      <w:sz w:val="20"/>
+                    </w:rPr>
+                    <w:t xml:space="default">n (%)</w:t>
+                  </w:r>
+                </w:p>
+              </w:tc>
+              <w:tc>
+                <w:tcPr>
+                  <w:tcBorders>
+                    <w:top w:val="single" w:space="0" w:color="D3D3D3"/>
+                    <w:bottom w:val="single" w:space="0" w:color="D3D3D3"/>
+                    <w:start w:val="single" w:space="0" w:color="D3D3D3"/>
+                    <w:end w:val="single" w:space="0" w:color="D3D3D3"/>
+                  </w:tcBorders>
+                </w:tcPr>
+                <w:p>
+                  <w:pPr>
+                    <w:spacing w:before="0" w:after="60"/>
+                    <w:keepNext/>
+                    <w:jc w:val="center"/>
+                  </w:pPr>
+                  <w:r>
+                    <w:rPr>
+                      <w:rFonts w:ascii="Calibri" w:hAnsi="Calibri"/>
+                      <w:sz w:val="20"/>
+                    </w:rPr>
+                    <w:t xml:space="default">n (%)</w:t>
+                  </w:r>
+                </w:p>
+              </w:tc>
+              <w:tc>
+                <w:tcPr>
+                  <w:tcBorders>
+                    <w:top w:val="single" w:space="0" w:color="D3D3D3"/>
+                    <w:bottom w:val="single" w:space="0" w:color="D3D3D3"/>
+                    <w:start w:val="single" w:space="0" w:color="D3D3D3"/>
+                    <w:end w:val="single" w:space="0" w:color="D3D3D3"/>
+                  </w:tcBorders>
+                </w:tcPr>
+                <w:p>
+                  <w:pPr>
+                    <w:spacing w:before="0" w:after="60"/>
+                    <w:keepNext/>
+                    <w:jc w:val="center"/>
+                  </w:pPr>
+                  <w:r>
+                    <w:rPr>
+                      <w:rFonts w:ascii="Calibri" w:hAnsi="Calibri"/>
+                      <w:sz w:val="20"/>
+                    </w:rPr>
+                    <w:t xml:space="default">n (%)</w:t>
+                  </w:r>
+                </w:p>
+              </w:tc>
+            </w:tr>
+            <w:tr>
+              <w:trPr>
+                <w:cantSplit/>
+              </w:trPr>
+              <w:tc>
+                <w:tcPr>
+                  <w:tcBorders>
+                    <w:top w:val="single" w:space="0" w:color="D3D3D3"/>
+                    <w:bottom w:val="single" w:space="0" w:color="D3D3D3"/>
+                    <w:start w:val="single" w:space="0" w:color="D3D3D3"/>
+                    <w:end w:val="single" w:space="0" w:color="D3D3D3"/>
+                  </w:tcBorders>
+                </w:tcPr>
+                <w:p>
+                  <w:pPr>
+                    <w:spacing w:before="0" w:after="60"/>
+                    <w:keepNext/>
+                    <w:jc w:val="start"/>
+                  </w:pPr>
+                  <w:r>
+                    <w:rPr>
+                      <w:rFonts w:ascii="Calibri" w:hAnsi="Calibri"/>
+                      <w:sz w:val="20"/>
+                    </w:rPr>
+                    <w:t xml:space="default">    MRI</w:t>
+                  </w:r>
+                </w:p>
+              </w:tc>
+              <w:tc>
+                <w:tcPr>
+                  <w:tcBorders>
+                    <w:top w:val="single" w:space="0" w:color="D3D3D3"/>
+                    <w:bottom w:val="single" w:space="0" w:color="D3D3D3"/>
+                    <w:start w:val="single" w:space="0" w:color="D3D3D3"/>
+                    <w:end w:val="single" w:space="0" w:color="D3D3D3"/>
+                  </w:tcBorders>
+                </w:tcPr>
+                <w:p>
+                  <w:pPr>
+                    <w:spacing w:before="0" w:after="60"/>
+                    <w:keepNext/>
+                    <w:jc w:val="center"/>
+                  </w:pPr>
+                  <w:r>
+                    <w:rPr>
+                      <w:rFonts w:ascii="Calibri" w:hAnsi="Calibri"/>
+                      <w:sz w:val="20"/>
+                    </w:rPr>
+                    <w:t xml:space="default">n (%)</w:t>
+                  </w:r>
+                </w:p>
+              </w:tc>
+              <w:tc>
+                <w:tcPr>
+                  <w:tcBorders>
+                    <w:top w:val="single" w:space="0" w:color="D3D3D3"/>
+                    <w:bottom w:val="single" w:space="0" w:color="D3D3D3"/>
+                    <w:start w:val="single" w:space="0" w:color="D3D3D3"/>
+                    <w:end w:val="single" w:space="0" w:color="D3D3D3"/>
+                  </w:tcBorders>
+                </w:tcPr>
+                <w:p>
+                  <w:pPr>
+                    <w:spacing w:before="0" w:after="60"/>
+                    <w:keepNext/>
+                    <w:jc w:val="center"/>
+                  </w:pPr>
+                  <w:r>
+                    <w:rPr>
+                      <w:rFonts w:ascii="Calibri" w:hAnsi="Calibri"/>
+                      <w:sz w:val="20"/>
+                    </w:rPr>
+                    <w:t xml:space="default">n (%)</w:t>
+                  </w:r>
+                </w:p>
+              </w:tc>
+              <w:tc>
+                <w:tcPr>
+                  <w:tcBorders>
+                    <w:top w:val="single" w:space="0" w:color="D3D3D3"/>
+                    <w:bottom w:val="single" w:space="0" w:color="D3D3D3"/>
+                    <w:start w:val="single" w:space="0" w:color="D3D3D3"/>
+                    <w:end w:val="single" w:space="0" w:color="D3D3D3"/>
+                  </w:tcBorders>
+                </w:tcPr>
+                <w:p>
+                  <w:pPr>
+                    <w:spacing w:before="0" w:after="60"/>
+                    <w:keepNext/>
+                    <w:jc w:val="center"/>
+                  </w:pPr>
+                  <w:r>
+                    <w:rPr>
+                      <w:rFonts w:ascii="Calibri" w:hAnsi="Calibri"/>
+                      <w:sz w:val="20"/>
+                    </w:rPr>
+                    <w:t xml:space="default">n (%)</w:t>
+                  </w:r>
+                </w:p>
+              </w:tc>
+              <w:tc>
+                <w:tcPr>
+                  <w:tcBorders>
+                    <w:top w:val="single" w:space="0" w:color="D3D3D3"/>
+                    <w:bottom w:val="single" w:space="0" w:color="D3D3D3"/>
+                    <w:start w:val="single" w:space="0" w:color="D3D3D3"/>
+                    <w:end w:val="single" w:space="0" w:color="D3D3D3"/>
+                  </w:tcBorders>
+                </w:tcPr>
+                <w:p>
+                  <w:pPr>
+                    <w:spacing w:before="0" w:after="60"/>
+                    <w:keepNext/>
+                    <w:jc w:val="center"/>
+                  </w:pPr>
+                  <w:r>
+                    <w:rPr>
+                      <w:rFonts w:ascii="Calibri" w:hAnsi="Calibri"/>
+                      <w:sz w:val="20"/>
+                    </w:rPr>
+                    <w:t xml:space="default">n (%)</w:t>
+                  </w:r>
+                </w:p>
+              </w:tc>
+              <w:tc>
+                <w:tcPr>
+                  <w:tcBorders>
+                    <w:top w:val="single" w:space="0" w:color="D3D3D3"/>
+                    <w:bottom w:val="single" w:space="0" w:color="D3D3D3"/>
+                    <w:start w:val="single" w:space="0" w:color="D3D3D3"/>
+                    <w:end w:val="single" w:space="0" w:color="D3D3D3"/>
+                  </w:tcBorders>
+                </w:tcPr>
+                <w:p>
+                  <w:pPr>
+                    <w:spacing w:before="0" w:after="60"/>
+                    <w:keepNext/>
+                    <w:jc w:val="center"/>
+                  </w:pPr>
+                  <w:r>
+                    <w:rPr>
+                      <w:rFonts w:ascii="Calibri" w:hAnsi="Calibri"/>
+                      <w:sz w:val="20"/>
+                    </w:rPr>
+                    <w:t xml:space="default">n (%)</w:t>
+                  </w:r>
+                </w:p>
+              </w:tc>
+              <w:tc>
+                <w:tcPr>
+                  <w:tcBorders>
+                    <w:top w:val="single" w:space="0" w:color="D3D3D3"/>
+                    <w:bottom w:val="single" w:space="0" w:color="D3D3D3"/>
+                    <w:start w:val="single" w:space="0" w:color="D3D3D3"/>
+                    <w:end w:val="single" w:space="0" w:color="D3D3D3"/>
+                  </w:tcBorders>
+                </w:tcPr>
+                <w:p>
+                  <w:pPr>
+                    <w:spacing w:before="0" w:after="60"/>
+                    <w:keepNext/>
+                    <w:jc w:val="center"/>
+                  </w:pPr>
+                  <w:r>
+                    <w:rPr>
+                      <w:rFonts w:ascii="Calibri" w:hAnsi="Calibri"/>
+                      <w:sz w:val="20"/>
+                    </w:rPr>
+                    <w:t xml:space="default">n (%)</w:t>
+                  </w:r>
+                </w:p>
+              </w:tc>
+            </w:tr>
+            <w:tr>
+              <w:trPr>
+                <w:cantSplit/>
+              </w:trPr>
+              <w:tc>
+                <w:tcPr>
+                  <w:tcBorders>
+                    <w:top w:val="single" w:space="0" w:color="D3D3D3"/>
+                    <w:bottom w:val="single" w:space="0" w:color="D3D3D3"/>
+                    <w:start w:val="single" w:space="0" w:color="D3D3D3"/>
+                    <w:end w:val="single" w:space="0" w:color="D3D3D3"/>
+                  </w:tcBorders>
+                </w:tcPr>
+                <w:p>
+                  <w:pPr>
+                    <w:spacing w:before="0" w:after="60"/>
+                    <w:keepNext/>
+                    <w:jc w:val="start"/>
+                  </w:pPr>
+                  <w:r>
+                    <w:rPr>
+                      <w:rFonts w:ascii="Calibri" w:hAnsi="Calibri"/>
+                      <w:sz w:val="20"/>
+                    </w:rPr>
+                    <w:t xml:space="default">    Blood bank</w:t>
+                  </w:r>
+                </w:p>
+              </w:tc>
+              <w:tc>
+                <w:tcPr>
+                  <w:tcBorders>
+                    <w:top w:val="single" w:space="0" w:color="D3D3D3"/>
+                    <w:bottom w:val="single" w:space="0" w:color="D3D3D3"/>
+                    <w:start w:val="single" w:space="0" w:color="D3D3D3"/>
+                    <w:end w:val="single" w:space="0" w:color="D3D3D3"/>
+                  </w:tcBorders>
+                </w:tcPr>
+                <w:p>
+                  <w:pPr>
+                    <w:spacing w:before="0" w:after="60"/>
+                    <w:keepNext/>
+                    <w:jc w:val="center"/>
+                  </w:pPr>
+                  <w:r>
+                    <w:rPr>
+                      <w:rFonts w:ascii="Calibri" w:hAnsi="Calibri"/>
+                      <w:sz w:val="20"/>
+                    </w:rPr>
+                    <w:t xml:space="default">n (%)</w:t>
+                  </w:r>
+                </w:p>
+              </w:tc>
+              <w:tc>
+                <w:tcPr>
+                  <w:tcBorders>
+                    <w:top w:val="single" w:space="0" w:color="D3D3D3"/>
+                    <w:bottom w:val="single" w:space="0" w:color="D3D3D3"/>
+                    <w:start w:val="single" w:space="0" w:color="D3D3D3"/>
+                    <w:end w:val="single" w:space="0" w:color="D3D3D3"/>
+                  </w:tcBorders>
+                </w:tcPr>
+                <w:p>
+                  <w:pPr>
+                    <w:spacing w:before="0" w:after="60"/>
+                    <w:keepNext/>
+                    <w:jc w:val="center"/>
+                  </w:pPr>
+                  <w:r>
+                    <w:rPr>
+                      <w:rFonts w:ascii="Calibri" w:hAnsi="Calibri"/>
+                      <w:sz w:val="20"/>
+                    </w:rPr>
+                    <w:t xml:space="default">n (%)</w:t>
+                  </w:r>
+                </w:p>
+              </w:tc>
+              <w:tc>
+                <w:tcPr>
+                  <w:tcBorders>
+                    <w:top w:val="single" w:space="0" w:color="D3D3D3"/>
+                    <w:bottom w:val="single" w:space="0" w:color="D3D3D3"/>
+                    <w:start w:val="single" w:space="0" w:color="D3D3D3"/>
+                    <w:end w:val="single" w:space="0" w:color="D3D3D3"/>
+                  </w:tcBorders>
+                </w:tcPr>
+                <w:p>
+                  <w:pPr>
+                    <w:spacing w:before="0" w:after="60"/>
+                    <w:keepNext/>
+                    <w:jc w:val="center"/>
+                  </w:pPr>
+                  <w:r>
+                    <w:rPr>
+                      <w:rFonts w:ascii="Calibri" w:hAnsi="Calibri"/>
+                      <w:sz w:val="20"/>
+                    </w:rPr>
+                    <w:t xml:space="default">n (%)</w:t>
+                  </w:r>
+                </w:p>
+              </w:tc>
+              <w:tc>
+                <w:tcPr>
+                  <w:tcBorders>
+                    <w:top w:val="single" w:space="0" w:color="D3D3D3"/>
+                    <w:bottom w:val="single" w:space="0" w:color="D3D3D3"/>
+                    <w:start w:val="single" w:space="0" w:color="D3D3D3"/>
+                    <w:end w:val="single" w:space="0" w:color="D3D3D3"/>
+                  </w:tcBorders>
+                </w:tcPr>
+                <w:p>
+                  <w:pPr>
+                    <w:spacing w:before="0" w:after="60"/>
+                    <w:keepNext/>
+                    <w:jc w:val="center"/>
+                  </w:pPr>
+                  <w:r>
+                    <w:rPr>
+                      <w:rFonts w:ascii="Calibri" w:hAnsi="Calibri"/>
+                      <w:sz w:val="20"/>
+                    </w:rPr>
+                    <w:t xml:space="default">n (%)</w:t>
+                  </w:r>
+                </w:p>
+              </w:tc>
+              <w:tc>
+                <w:tcPr>
+                  <w:tcBorders>
+                    <w:top w:val="single" w:space="0" w:color="D3D3D3"/>
+                    <w:bottom w:val="single" w:space="0" w:color="D3D3D3"/>
+                    <w:start w:val="single" w:space="0" w:color="D3D3D3"/>
+                    <w:end w:val="single" w:space="0" w:color="D3D3D3"/>
+                  </w:tcBorders>
+                </w:tcPr>
+                <w:p>
+                  <w:pPr>
+                    <w:spacing w:before="0" w:after="60"/>
+                    <w:keepNext/>
+                    <w:jc w:val="center"/>
+                  </w:pPr>
+                  <w:r>
+                    <w:rPr>
+                      <w:rFonts w:ascii="Calibri" w:hAnsi="Calibri"/>
+                      <w:sz w:val="20"/>
+                    </w:rPr>
+                    <w:t xml:space="default">n (%)</w:t>
+                  </w:r>
+                </w:p>
+              </w:tc>
+              <w:tc>
+                <w:tcPr>
+                  <w:tcBorders>
+                    <w:top w:val="single" w:space="0" w:color="D3D3D3"/>
+                    <w:bottom w:val="single" w:space="0" w:color="D3D3D3"/>
+                    <w:start w:val="single" w:space="0" w:color="D3D3D3"/>
+                    <w:end w:val="single" w:space="0" w:color="D3D3D3"/>
+                  </w:tcBorders>
+                </w:tcPr>
+                <w:p>
+                  <w:pPr>
+                    <w:spacing w:before="0" w:after="60"/>
+                    <w:keepNext/>
+                    <w:jc w:val="center"/>
+                  </w:pPr>
+                  <w:r>
+                    <w:rPr>
+                      <w:rFonts w:ascii="Calibri" w:hAnsi="Calibri"/>
+                      <w:sz w:val="20"/>
+                    </w:rPr>
+                    <w:t xml:space="default">n (%)</w:t>
+                  </w:r>
+                </w:p>
+              </w:tc>
+            </w:tr>
+            <w:tr>
+              <w:trPr>
+                <w:cantSplit/>
+              </w:trPr>
+              <w:tc>
+                <w:tcPr>
+                  <w:tcBorders>
+                    <w:top w:val="single" w:space="0" w:color="D3D3D3"/>
+                    <w:bottom w:val="single" w:space="0" w:color="D3D3D3"/>
+                    <w:start w:val="single" w:space="0" w:color="D3D3D3"/>
+                    <w:end w:val="single" w:space="0" w:color="D3D3D3"/>
+                  </w:tcBorders>
+                </w:tcPr>
+                <w:p>
+                  <w:pPr>
+                    <w:spacing w:before="0" w:after="60"/>
+                    <w:keepNext/>
+                    <w:jc w:val="start"/>
+                  </w:pPr>
+                  <w:r>
+                    <w:rPr>
+                      <w:rFonts w:ascii="Calibri" w:hAnsi="Calibri"/>
+                      <w:sz w:val="20"/>
+                    </w:rPr>
+                    <w:t xml:space="default">Initial resuscitation provider, n (%)</w:t>
+                  </w:r>
+                </w:p>
+              </w:tc>
+              <w:tc>
+                <w:tcPr>
+                  <w:tcBorders>
+                    <w:top w:val="single" w:space="0" w:color="D3D3D3"/>
+                    <w:bottom w:val="single" w:space="0" w:color="D3D3D3"/>
+                    <w:start w:val="single" w:space="0" w:color="D3D3D3"/>
+                    <w:end w:val="single" w:space="0" w:color="D3D3D3"/>
+                  </w:tcBorders>
+                </w:tcPr>
+                <w:p>
+                  <w:pPr>
+                    <w:spacing w:before="0" w:after="60"/>
+                    <w:keepNext/>
+                    <w:jc w:val="center"/>
+                  </w:pPr>
+                  <w:r>
+                    <w:rPr>
+                      <w:rFonts w:ascii="Calibri" w:hAnsi="Calibri"/>
+                      <w:sz w:val="20"/>
+                    </w:rPr>
+                    <w:t xml:space="default"/>
+                  </w:r>
+                </w:p>
+              </w:tc>
+              <w:tc>
+                <w:tcPr>
+                  <w:tcBorders>
+                    <w:top w:val="single" w:space="0" w:color="D3D3D3"/>
+                    <w:bottom w:val="single" w:space="0" w:color="D3D3D3"/>
+                    <w:start w:val="single" w:space="0" w:color="D3D3D3"/>
+                    <w:end w:val="single" w:space="0" w:color="D3D3D3"/>
+                  </w:tcBorders>
+                </w:tcPr>
+                <w:p>
+                  <w:pPr>
+                    <w:spacing w:before="0" w:after="60"/>
+                    <w:keepNext/>
+                    <w:jc w:val="center"/>
+                  </w:pPr>
+                  <w:r>
+                    <w:rPr>
+                      <w:rFonts w:ascii="Calibri" w:hAnsi="Calibri"/>
+                      <w:sz w:val="20"/>
+                    </w:rPr>
+                    <w:t xml:space="default"/>
+                  </w:r>
+                </w:p>
+              </w:tc>
+              <w:tc>
+                <w:tcPr>
+                  <w:tcBorders>
+                    <w:top w:val="single" w:space="0" w:color="D3D3D3"/>
+                    <w:bottom w:val="single" w:space="0" w:color="D3D3D3"/>
+                    <w:start w:val="single" w:space="0" w:color="D3D3D3"/>
+                    <w:end w:val="single" w:space="0" w:color="D3D3D3"/>
+                  </w:tcBorders>
+                </w:tcPr>
+                <w:p>
+                  <w:pPr>
+                    <w:spacing w:before="0" w:after="60"/>
+                    <w:keepNext/>
+                    <w:jc w:val="center"/>
+                  </w:pPr>
+                  <w:r>
+                    <w:rPr>
+                      <w:rFonts w:ascii="Calibri" w:hAnsi="Calibri"/>
+                      <w:sz w:val="20"/>
+                    </w:rPr>
+                    <w:t xml:space="default"/>
+                  </w:r>
+                </w:p>
+              </w:tc>
+              <w:tc>
+                <w:tcPr>
+                  <w:tcBorders>
+                    <w:top w:val="single" w:space="0" w:color="D3D3D3"/>
+                    <w:bottom w:val="single" w:space="0" w:color="D3D3D3"/>
+                    <w:start w:val="single" w:space="0" w:color="D3D3D3"/>
+                    <w:end w:val="single" w:space="0" w:color="D3D3D3"/>
+                  </w:tcBorders>
+                </w:tcPr>
+                <w:p>
+                  <w:pPr>
+                    <w:spacing w:before="0" w:after="60"/>
+                    <w:keepNext/>
+                    <w:jc w:val="center"/>
+                  </w:pPr>
+                  <w:r>
+                    <w:rPr>
+                      <w:rFonts w:ascii="Calibri" w:hAnsi="Calibri"/>
+                      <w:sz w:val="20"/>
+                    </w:rPr>
+                    <w:t xml:space="default"/>
+                  </w:r>
+                </w:p>
+              </w:tc>
+              <w:tc>
+                <w:tcPr>
+                  <w:tcBorders>
+                    <w:top w:val="single" w:space="0" w:color="D3D3D3"/>
+                    <w:bottom w:val="single" w:space="0" w:color="D3D3D3"/>
+                    <w:start w:val="single" w:space="0" w:color="D3D3D3"/>
+                    <w:end w:val="single" w:space="0" w:color="D3D3D3"/>
+                  </w:tcBorders>
+                </w:tcPr>
+                <w:p>
+                  <w:pPr>
+                    <w:spacing w:before="0" w:after="60"/>
+                    <w:keepNext/>
+                    <w:jc w:val="center"/>
+                  </w:pPr>
+                  <w:r>
+                    <w:rPr>
+                      <w:rFonts w:ascii="Calibri" w:hAnsi="Calibri"/>
+                      <w:sz w:val="20"/>
+                    </w:rPr>
+                    <w:t xml:space="default"/>
+                  </w:r>
+                </w:p>
+              </w:tc>
+              <w:tc>
+                <w:tcPr>
+                  <w:tcBorders>
+                    <w:top w:val="single" w:space="0" w:color="D3D3D3"/>
+                    <w:bottom w:val="single" w:space="0" w:color="D3D3D3"/>
+                    <w:start w:val="single" w:space="0" w:color="D3D3D3"/>
+                    <w:end w:val="single" w:space="0" w:color="D3D3D3"/>
+                  </w:tcBorders>
+                </w:tcPr>
+                <w:p>
+                  <w:pPr>
+                    <w:spacing w:before="0" w:after="60"/>
+                    <w:keepNext/>
+                    <w:jc w:val="center"/>
+                  </w:pPr>
+                  <w:r>
+                    <w:rPr>
+                      <w:rFonts w:ascii="Calibri" w:hAnsi="Calibri"/>
+                      <w:sz w:val="20"/>
+                    </w:rPr>
+                    <w:t xml:space="default"/>
+                  </w:r>
+                </w:p>
+              </w:tc>
+            </w:tr>
+            <w:tr>
+              <w:trPr>
+                <w:cantSplit/>
+              </w:trPr>
+              <w:tc>
+                <w:tcPr>
+                  <w:tcBorders>
+                    <w:top w:val="single" w:space="0" w:color="D3D3D3"/>
+                    <w:bottom w:val="single" w:space="0" w:color="D3D3D3"/>
+                    <w:start w:val="single" w:space="0" w:color="D3D3D3"/>
+                    <w:end w:val="single" w:space="0" w:color="D3D3D3"/>
+                  </w:tcBorders>
+                </w:tcPr>
+                <w:p>
+                  <w:pPr>
+                    <w:spacing w:before="0" w:after="60"/>
+                    <w:keepNext/>
+                    <w:jc w:val="start"/>
+                  </w:pPr>
+                  <w:r>
+                    <w:rPr>
+                      <w:rFonts w:ascii="Calibri" w:hAnsi="Calibri"/>
+                      <w:sz w:val="20"/>
+                    </w:rPr>
+                    <w:t xml:space="default">    Casualty medical officers</w:t>
+                  </w:r>
+                </w:p>
+              </w:tc>
+              <w:tc>
+                <w:tcPr>
+                  <w:tcBorders>
+                    <w:top w:val="single" w:space="0" w:color="D3D3D3"/>
+                    <w:bottom w:val="single" w:space="0" w:color="D3D3D3"/>
+                    <w:start w:val="single" w:space="0" w:color="D3D3D3"/>
+                    <w:end w:val="single" w:space="0" w:color="D3D3D3"/>
+                  </w:tcBorders>
+                </w:tcPr>
+                <w:p>
+                  <w:pPr>
+                    <w:spacing w:before="0" w:after="60"/>
+                    <w:keepNext/>
+                    <w:jc w:val="center"/>
+                  </w:pPr>
+                  <w:r>
+                    <w:rPr>
+                      <w:rFonts w:ascii="Calibri" w:hAnsi="Calibri"/>
+                      <w:sz w:val="20"/>
+                    </w:rPr>
+                    <w:t xml:space="default">n (%)</w:t>
+                  </w:r>
+                </w:p>
+              </w:tc>
+              <w:tc>
+                <w:tcPr>
+                  <w:tcBorders>
+                    <w:top w:val="single" w:space="0" w:color="D3D3D3"/>
+                    <w:bottom w:val="single" w:space="0" w:color="D3D3D3"/>
+                    <w:start w:val="single" w:space="0" w:color="D3D3D3"/>
+                    <w:end w:val="single" w:space="0" w:color="D3D3D3"/>
+                  </w:tcBorders>
+                </w:tcPr>
+                <w:p>
+                  <w:pPr>
+                    <w:spacing w:before="0" w:after="60"/>
+                    <w:keepNext/>
+                    <w:jc w:val="center"/>
+                  </w:pPr>
+                  <w:r>
+                    <w:rPr>
+                      <w:rFonts w:ascii="Calibri" w:hAnsi="Calibri"/>
+                      <w:sz w:val="20"/>
+                    </w:rPr>
+                    <w:t xml:space="default">n (%)</w:t>
+                  </w:r>
+                </w:p>
+              </w:tc>
+              <w:tc>
+                <w:tcPr>
+                  <w:tcBorders>
+                    <w:top w:val="single" w:space="0" w:color="D3D3D3"/>
+                    <w:bottom w:val="single" w:space="0" w:color="D3D3D3"/>
+                    <w:start w:val="single" w:space="0" w:color="D3D3D3"/>
+                    <w:end w:val="single" w:space="0" w:color="D3D3D3"/>
+                  </w:tcBorders>
+                </w:tcPr>
+                <w:p>
+                  <w:pPr>
+                    <w:spacing w:before="0" w:after="60"/>
+                    <w:keepNext/>
+                    <w:jc w:val="center"/>
+                  </w:pPr>
+                  <w:r>
+                    <w:rPr>
+                      <w:rFonts w:ascii="Calibri" w:hAnsi="Calibri"/>
+                      <w:sz w:val="20"/>
+                    </w:rPr>
+                    <w:t xml:space="default">n (%)</w:t>
+                  </w:r>
+                </w:p>
+              </w:tc>
+              <w:tc>
+                <w:tcPr>
+                  <w:tcBorders>
+                    <w:top w:val="single" w:space="0" w:color="D3D3D3"/>
+                    <w:bottom w:val="single" w:space="0" w:color="D3D3D3"/>
+                    <w:start w:val="single" w:space="0" w:color="D3D3D3"/>
+                    <w:end w:val="single" w:space="0" w:color="D3D3D3"/>
+                  </w:tcBorders>
+                </w:tcPr>
+                <w:p>
+                  <w:pPr>
+                    <w:spacing w:before="0" w:after="60"/>
+                    <w:keepNext/>
+                    <w:jc w:val="center"/>
+                  </w:pPr>
+                  <w:r>
+                    <w:rPr>
+                      <w:rFonts w:ascii="Calibri" w:hAnsi="Calibri"/>
+                      <w:sz w:val="20"/>
+                    </w:rPr>
+                    <w:t xml:space="default">n (%)</w:t>
+                  </w:r>
+                </w:p>
+              </w:tc>
+              <w:tc>
+                <w:tcPr>
+                  <w:tcBorders>
+                    <w:top w:val="single" w:space="0" w:color="D3D3D3"/>
+                    <w:bottom w:val="single" w:space="0" w:color="D3D3D3"/>
+                    <w:start w:val="single" w:space="0" w:color="D3D3D3"/>
+                    <w:end w:val="single" w:space="0" w:color="D3D3D3"/>
+                  </w:tcBorders>
+                </w:tcPr>
+                <w:p>
+                  <w:pPr>
+                    <w:spacing w:before="0" w:after="60"/>
+                    <w:keepNext/>
+                    <w:jc w:val="center"/>
+                  </w:pPr>
+                  <w:r>
+                    <w:rPr>
+                      <w:rFonts w:ascii="Calibri" w:hAnsi="Calibri"/>
+                      <w:sz w:val="20"/>
+                    </w:rPr>
+                    <w:t xml:space="default">n (%)</w:t>
+                  </w:r>
+                </w:p>
+              </w:tc>
+              <w:tc>
+                <w:tcPr>
+                  <w:tcBorders>
+                    <w:top w:val="single" w:space="0" w:color="D3D3D3"/>
+                    <w:bottom w:val="single" w:space="0" w:color="D3D3D3"/>
+                    <w:start w:val="single" w:space="0" w:color="D3D3D3"/>
+                    <w:end w:val="single" w:space="0" w:color="D3D3D3"/>
+                  </w:tcBorders>
+                </w:tcPr>
+                <w:p>
+                  <w:pPr>
+                    <w:spacing w:before="0" w:after="60"/>
+                    <w:keepNext/>
+                    <w:jc w:val="center"/>
+                  </w:pPr>
+                  <w:r>
+                    <w:rPr>
+                      <w:rFonts w:ascii="Calibri" w:hAnsi="Calibri"/>
+                      <w:sz w:val="20"/>
+                    </w:rPr>
+                    <w:t xml:space="default">n (%)</w:t>
+                  </w:r>
+                </w:p>
+              </w:tc>
+            </w:tr>
+            <w:tr>
+              <w:trPr>
+                <w:cantSplit/>
+              </w:trPr>
+              <w:tc>
+                <w:tcPr>
+                  <w:tcBorders>
+                    <w:top w:val="single" w:space="0" w:color="D3D3D3"/>
+                    <w:bottom w:val="single" w:space="0" w:color="D3D3D3"/>
+                    <w:start w:val="single" w:space="0" w:color="D3D3D3"/>
+                    <w:end w:val="single" w:space="0" w:color="D3D3D3"/>
+                  </w:tcBorders>
+                </w:tcPr>
+                <w:p>
+                  <w:pPr>
+                    <w:spacing w:before="0" w:after="60"/>
+                    <w:keepNext/>
+                    <w:jc w:val="start"/>
+                  </w:pPr>
+                  <w:r>
+                    <w:rPr>
+                      <w:rFonts w:ascii="Calibri" w:hAnsi="Calibri"/>
+                      <w:sz w:val="20"/>
+                    </w:rPr>
+                    <w:t xml:space="default">    Emergency medicine residents</w:t>
+                  </w:r>
+                </w:p>
+              </w:tc>
+              <w:tc>
+                <w:tcPr>
+                  <w:tcBorders>
+                    <w:top w:val="single" w:space="0" w:color="D3D3D3"/>
+                    <w:bottom w:val="single" w:space="0" w:color="D3D3D3"/>
+                    <w:start w:val="single" w:space="0" w:color="D3D3D3"/>
+                    <w:end w:val="single" w:space="0" w:color="D3D3D3"/>
+                  </w:tcBorders>
+                </w:tcPr>
+                <w:p>
+                  <w:pPr>
+                    <w:spacing w:before="0" w:after="60"/>
+                    <w:keepNext/>
+                    <w:jc w:val="center"/>
+                  </w:pPr>
+                  <w:r>
+                    <w:rPr>
+                      <w:rFonts w:ascii="Calibri" w:hAnsi="Calibri"/>
+                      <w:sz w:val="20"/>
+                    </w:rPr>
+                    <w:t xml:space="default">n (%)</w:t>
+                  </w:r>
+                </w:p>
+              </w:tc>
+              <w:tc>
+                <w:tcPr>
+                  <w:tcBorders>
+                    <w:top w:val="single" w:space="0" w:color="D3D3D3"/>
+                    <w:bottom w:val="single" w:space="0" w:color="D3D3D3"/>
+                    <w:start w:val="single" w:space="0" w:color="D3D3D3"/>
+                    <w:end w:val="single" w:space="0" w:color="D3D3D3"/>
+                  </w:tcBorders>
+                </w:tcPr>
+                <w:p>
+                  <w:pPr>
+                    <w:spacing w:before="0" w:after="60"/>
+                    <w:keepNext/>
+                    <w:jc w:val="center"/>
+                  </w:pPr>
+                  <w:r>
+                    <w:rPr>
+                      <w:rFonts w:ascii="Calibri" w:hAnsi="Calibri"/>
+                      <w:sz w:val="20"/>
+                    </w:rPr>
+                    <w:t xml:space="default">n (%)</w:t>
+                  </w:r>
+                </w:p>
+              </w:tc>
+              <w:tc>
+                <w:tcPr>
+                  <w:tcBorders>
+                    <w:top w:val="single" w:space="0" w:color="D3D3D3"/>
+                    <w:bottom w:val="single" w:space="0" w:color="D3D3D3"/>
+                    <w:start w:val="single" w:space="0" w:color="D3D3D3"/>
+                    <w:end w:val="single" w:space="0" w:color="D3D3D3"/>
+                  </w:tcBorders>
+                </w:tcPr>
+                <w:p>
+                  <w:pPr>
+                    <w:spacing w:before="0" w:after="60"/>
+                    <w:keepNext/>
+                    <w:jc w:val="center"/>
+                  </w:pPr>
+                  <w:r>
+                    <w:rPr>
+                      <w:rFonts w:ascii="Calibri" w:hAnsi="Calibri"/>
+                      <w:sz w:val="20"/>
+                    </w:rPr>
+                    <w:t xml:space="default">n (%)</w:t>
+                  </w:r>
+                </w:p>
+              </w:tc>
+              <w:tc>
+                <w:tcPr>
+                  <w:tcBorders>
+                    <w:top w:val="single" w:space="0" w:color="D3D3D3"/>
+                    <w:bottom w:val="single" w:space="0" w:color="D3D3D3"/>
+                    <w:start w:val="single" w:space="0" w:color="D3D3D3"/>
+                    <w:end w:val="single" w:space="0" w:color="D3D3D3"/>
+                  </w:tcBorders>
+                </w:tcPr>
+                <w:p>
+                  <w:pPr>
+                    <w:spacing w:before="0" w:after="60"/>
+                    <w:keepNext/>
+                    <w:jc w:val="center"/>
+                  </w:pPr>
+                  <w:r>
+                    <w:rPr>
+                      <w:rFonts w:ascii="Calibri" w:hAnsi="Calibri"/>
+                      <w:sz w:val="20"/>
+                    </w:rPr>
+                    <w:t xml:space="default">n (%)</w:t>
+                  </w:r>
+                </w:p>
+              </w:tc>
+              <w:tc>
+                <w:tcPr>
+                  <w:tcBorders>
+                    <w:top w:val="single" w:space="0" w:color="D3D3D3"/>
+                    <w:bottom w:val="single" w:space="0" w:color="D3D3D3"/>
+                    <w:start w:val="single" w:space="0" w:color="D3D3D3"/>
+                    <w:end w:val="single" w:space="0" w:color="D3D3D3"/>
+                  </w:tcBorders>
+                </w:tcPr>
+                <w:p>
+                  <w:pPr>
+                    <w:spacing w:before="0" w:after="60"/>
+                    <w:keepNext/>
+                    <w:jc w:val="center"/>
+                  </w:pPr>
+                  <w:r>
+                    <w:rPr>
+                      <w:rFonts w:ascii="Calibri" w:hAnsi="Calibri"/>
+                      <w:sz w:val="20"/>
+                    </w:rPr>
+                    <w:t xml:space="default">n (%)</w:t>
+                  </w:r>
+                </w:p>
+              </w:tc>
+              <w:tc>
+                <w:tcPr>
+                  <w:tcBorders>
+                    <w:top w:val="single" w:space="0" w:color="D3D3D3"/>
+                    <w:bottom w:val="single" w:space="0" w:color="D3D3D3"/>
+                    <w:start w:val="single" w:space="0" w:color="D3D3D3"/>
+                    <w:end w:val="single" w:space="0" w:color="D3D3D3"/>
+                  </w:tcBorders>
+                </w:tcPr>
+                <w:p>
+                  <w:pPr>
+                    <w:spacing w:before="0" w:after="60"/>
+                    <w:keepNext/>
+                    <w:jc w:val="center"/>
+                  </w:pPr>
+                  <w:r>
+                    <w:rPr>
+                      <w:rFonts w:ascii="Calibri" w:hAnsi="Calibri"/>
+                      <w:sz w:val="20"/>
+                    </w:rPr>
+                    <w:t xml:space="default">n (%)</w:t>
+                  </w:r>
+                </w:p>
+              </w:tc>
+            </w:tr>
+            <w:tr>
+              <w:trPr>
+                <w:cantSplit/>
+              </w:trPr>
+              <w:tc>
+                <w:tcPr>
+                  <w:tcBorders>
+                    <w:top w:val="single" w:space="0" w:color="D3D3D3"/>
+                    <w:bottom w:val="single" w:space="0" w:color="D3D3D3"/>
+                    <w:start w:val="single" w:space="0" w:color="D3D3D3"/>
+                    <w:end w:val="single" w:space="0" w:color="D3D3D3"/>
+                  </w:tcBorders>
+                </w:tcPr>
+                <w:p>
+                  <w:pPr>
+                    <w:spacing w:before="0" w:after="60"/>
+                    <w:keepNext/>
+                    <w:jc w:val="start"/>
+                  </w:pPr>
+                  <w:r>
+                    <w:rPr>
+                      <w:rFonts w:ascii="Calibri" w:hAnsi="Calibri"/>
+                      <w:sz w:val="20"/>
+                    </w:rPr>
+                    <w:t xml:space="default">    Surgical residents</w:t>
+                  </w:r>
+                </w:p>
+              </w:tc>
+              <w:tc>
+                <w:tcPr>
+                  <w:tcBorders>
+                    <w:top w:val="single" w:space="0" w:color="D3D3D3"/>
+                    <w:bottom w:val="single" w:space="0" w:color="D3D3D3"/>
+                    <w:start w:val="single" w:space="0" w:color="D3D3D3"/>
+                    <w:end w:val="single" w:space="0" w:color="D3D3D3"/>
+                  </w:tcBorders>
+                </w:tcPr>
+                <w:p>
+                  <w:pPr>
+                    <w:spacing w:before="0" w:after="60"/>
+                    <w:keepNext/>
+                    <w:jc w:val="center"/>
+                  </w:pPr>
+                  <w:r>
+                    <w:rPr>
+                      <w:rFonts w:ascii="Calibri" w:hAnsi="Calibri"/>
+                      <w:sz w:val="20"/>
+                    </w:rPr>
+                    <w:t xml:space="default">n (%)</w:t>
+                  </w:r>
+                </w:p>
+              </w:tc>
+              <w:tc>
+                <w:tcPr>
+                  <w:tcBorders>
+                    <w:top w:val="single" w:space="0" w:color="D3D3D3"/>
+                    <w:bottom w:val="single" w:space="0" w:color="D3D3D3"/>
+                    <w:start w:val="single" w:space="0" w:color="D3D3D3"/>
+                    <w:end w:val="single" w:space="0" w:color="D3D3D3"/>
+                  </w:tcBorders>
+                </w:tcPr>
+                <w:p>
+                  <w:pPr>
+                    <w:spacing w:before="0" w:after="60"/>
+                    <w:keepNext/>
+                    <w:jc w:val="center"/>
+                  </w:pPr>
+                  <w:r>
+                    <w:rPr>
+                      <w:rFonts w:ascii="Calibri" w:hAnsi="Calibri"/>
+                      <w:sz w:val="20"/>
+                    </w:rPr>
+                    <w:t xml:space="default">n (%)</w:t>
+                  </w:r>
+                </w:p>
+              </w:tc>
+              <w:tc>
+                <w:tcPr>
+                  <w:tcBorders>
+                    <w:top w:val="single" w:space="0" w:color="D3D3D3"/>
+                    <w:bottom w:val="single" w:space="0" w:color="D3D3D3"/>
+                    <w:start w:val="single" w:space="0" w:color="D3D3D3"/>
+                    <w:end w:val="single" w:space="0" w:color="D3D3D3"/>
+                  </w:tcBorders>
+                </w:tcPr>
+                <w:p>
+                  <w:pPr>
+                    <w:spacing w:before="0" w:after="60"/>
+                    <w:keepNext/>
+                    <w:jc w:val="center"/>
+                  </w:pPr>
+                  <w:r>
+                    <w:rPr>
+                      <w:rFonts w:ascii="Calibri" w:hAnsi="Calibri"/>
+                      <w:sz w:val="20"/>
+                    </w:rPr>
+                    <w:t xml:space="default">n (%)</w:t>
+                  </w:r>
+                </w:p>
+              </w:tc>
+              <w:tc>
+                <w:tcPr>
+                  <w:tcBorders>
+                    <w:top w:val="single" w:space="0" w:color="D3D3D3"/>
+                    <w:bottom w:val="single" w:space="0" w:color="D3D3D3"/>
+                    <w:start w:val="single" w:space="0" w:color="D3D3D3"/>
+                    <w:end w:val="single" w:space="0" w:color="D3D3D3"/>
+                  </w:tcBorders>
+                </w:tcPr>
+                <w:p>
+                  <w:pPr>
+                    <w:spacing w:before="0" w:after="60"/>
+                    <w:keepNext/>
+                    <w:jc w:val="center"/>
+                  </w:pPr>
+                  <w:r>
+                    <w:rPr>
+                      <w:rFonts w:ascii="Calibri" w:hAnsi="Calibri"/>
+                      <w:sz w:val="20"/>
+                    </w:rPr>
+                    <w:t xml:space="default">n (%)</w:t>
+                  </w:r>
+                </w:p>
+              </w:tc>
+              <w:tc>
+                <w:tcPr>
+                  <w:tcBorders>
+                    <w:top w:val="single" w:space="0" w:color="D3D3D3"/>
+                    <w:bottom w:val="single" w:space="0" w:color="D3D3D3"/>
+                    <w:start w:val="single" w:space="0" w:color="D3D3D3"/>
+                    <w:end w:val="single" w:space="0" w:color="D3D3D3"/>
+                  </w:tcBorders>
+                </w:tcPr>
+                <w:p>
+                  <w:pPr>
+                    <w:spacing w:before="0" w:after="60"/>
+                    <w:keepNext/>
+                    <w:jc w:val="center"/>
+                  </w:pPr>
+                  <w:r>
+                    <w:rPr>
+                      <w:rFonts w:ascii="Calibri" w:hAnsi="Calibri"/>
+                      <w:sz w:val="20"/>
+                    </w:rPr>
+                    <w:t xml:space="default">n (%)</w:t>
+                  </w:r>
+                </w:p>
+              </w:tc>
+              <w:tc>
+                <w:tcPr>
+                  <w:tcBorders>
+                    <w:top w:val="single" w:space="0" w:color="D3D3D3"/>
+                    <w:bottom w:val="single" w:space="0" w:color="D3D3D3"/>
+                    <w:start w:val="single" w:space="0" w:color="D3D3D3"/>
+                    <w:end w:val="single" w:space="0" w:color="D3D3D3"/>
+                  </w:tcBorders>
+                </w:tcPr>
+                <w:p>
+                  <w:pPr>
+                    <w:spacing w:before="0" w:after="60"/>
+                    <w:keepNext/>
+                    <w:jc w:val="center"/>
+                  </w:pPr>
+                  <w:r>
+                    <w:rPr>
+                      <w:rFonts w:ascii="Calibri" w:hAnsi="Calibri"/>
+                      <w:sz w:val="20"/>
+                    </w:rPr>
+                    <w:t xml:space="default">n (%)</w:t>
+                  </w:r>
+                </w:p>
+              </w:tc>
+            </w:tr>
+          </w:tbl>
+          <w:bookmarkEnd w:id="82"/>
+        </w:tc>
+      </w:tr>
+    </w:tbl>
+    <w:bookmarkEnd w:id="83"/>
+    <w:bookmarkStart w:id="84" w:name="patient-characteristics"/>
     <w:p>
       <w:pPr>
         <w:pStyle w:val="Heading3"/>
@@ -2361,9 +6289,9 @@
         <w:t xml:space="preserve">We will describe patient characteristics at baseline, meaning all pre-training periods, per treatment group and overall using frequencies and percentages for discrete variables and means, standard deviations, medians and interquartile ranges (Q1-Q3) for continuous variables. We will not adjust for clustering when presenting baseline characteristics.</w:t>
       </w:r>
     </w:p>
-    <w:bookmarkEnd w:id="83"/>
     <w:bookmarkEnd w:id="84"/>
-    <w:bookmarkStart w:id="85" w:name="interim-analysis"/>
+    <w:bookmarkEnd w:id="85"/>
+    <w:bookmarkStart w:id="86" w:name="interim-analysis"/>
     <w:p>
       <w:pPr>
         <w:pStyle w:val="Heading2"/>
@@ -2380,8 +6308,8 @@
         <w:t xml:space="preserve">There will be one interim analysis after half of the batches have completed the trial. The interim analysis will be assessed by the joint Trial Steering and Data Monitoring Committee. The purposes of this interim analysis will be to assess the trial’s feasibility and recommend that the trial be stopped if it is not feasible (e.g. if hospitals fail to adhere to the randomisation schedule or if there are substantial missing data in outcomes), and to compare characteristics across intervention conditions to monitor for differential recruitment/ascertainment between the intervention and control groups. No efficacy stopping is planned because any estimates obtained at the time point of the interim analysis will be associated with major statistical uncertainties.</w:t>
       </w:r>
     </w:p>
-    <w:bookmarkEnd w:id="85"/>
-    <w:bookmarkStart w:id="107" w:name="analysis-of-the-primary-outcome"/>
+    <w:bookmarkEnd w:id="86"/>
+    <w:bookmarkStart w:id="108" w:name="analysis-of-the-primary-outcome"/>
     <w:p>
       <w:pPr>
         <w:pStyle w:val="Heading2"/>
@@ -2459,7 +6387,7 @@
       <w:pPr>
         <w:pStyle w:val="FirstParagraph"/>
       </w:pPr>
-      <w:bookmarkStart w:id="86" w:name="eq-primary-model"/>
+      <w:bookmarkStart w:id="87" w:name="eq-primary-model"/>
       <m:oMathPara>
         <m:oMathParaPr>
           <m:jc m:val="center"/>
@@ -2646,7 +6574,7 @@
           </m:d>
         </m:oMath>
       </m:oMathPara>
-      <w:bookmarkEnd w:id="86"/>
+      <w:bookmarkEnd w:id="87"/>
     </w:p>
     <w:p>
       <w:pPr>
@@ -2685,7 +6613,7 @@
       <w:pPr>
         <w:pStyle w:val="FirstParagraph"/>
       </w:pPr>
-      <w:bookmarkStart w:id="87" w:name="eq-simplified-random-effects-model"/>
+      <w:bookmarkStart w:id="88" w:name="eq-simplified-random-effects-model"/>
       <m:oMathPara>
         <m:oMathParaPr>
           <m:jc m:val="center"/>
@@ -2848,7 +6776,7 @@
           </m:d>
         </m:oMath>
       </m:oMathPara>
-      <w:bookmarkEnd w:id="87"/>
+      <w:bookmarkEnd w:id="88"/>
     </w:p>
     <w:p>
       <w:pPr>
@@ -2887,7 +6815,7 @@
       <w:pPr>
         <w:pStyle w:val="FirstParagraph"/>
       </w:pPr>
-      <w:bookmarkStart w:id="88" w:name="eq-shared-period-model"/>
+      <w:bookmarkStart w:id="89" w:name="eq-shared-period-model"/>
       <m:oMathPara>
         <m:oMathParaPr>
           <m:jc m:val="center"/>
@@ -3071,7 +6999,7 @@
           </m:d>
         </m:oMath>
       </m:oMathPara>
-      <w:bookmarkEnd w:id="88"/>
+      <w:bookmarkEnd w:id="89"/>
     </w:p>
     <w:p>
       <w:pPr>
@@ -3110,7 +7038,7 @@
       <w:pPr>
         <w:pStyle w:val="FirstParagraph"/>
       </w:pPr>
-      <w:bookmarkStart w:id="89" w:name="eq-combined-simplified-model"/>
+      <w:bookmarkStart w:id="90" w:name="eq-combined-simplified-model"/>
       <m:oMathPara>
         <m:oMathParaPr>
           <m:jc m:val="center"/>
@@ -3270,7 +7198,7 @@
           </m:d>
         </m:oMath>
       </m:oMathPara>
-      <w:bookmarkEnd w:id="89"/>
+      <w:bookmarkEnd w:id="90"/>
     </w:p>
     <w:p>
       <w:pPr>
@@ -4111,7 +8039,7 @@
       <w:pPr>
         <w:pStyle w:val="BodyText"/>
       </w:pPr>
-      <w:bookmarkStart w:id="90" w:name="eq-distributional-assumptions"/>
+      <w:bookmarkStart w:id="91" w:name="eq-distributional-assumptions"/>
       <m:oMathPara>
         <m:oMathParaPr>
           <m:jc m:val="center"/>
@@ -4387,7 +8315,7 @@
           </m:d>
         </m:oMath>
       </m:oMathPara>
-      <w:bookmarkEnd w:id="90"/>
+      <w:bookmarkEnd w:id="91"/>
     </w:p>
     <w:p>
       <w:pPr>
@@ -4414,7 +8342,7 @@
         <w:t xml:space="preserve">All models will be fitted using residual pseudo-likelihood estimation based on linearisation with subject-specific expansion (RSPL), due to its computational stability and robust performance in small-sample settings. If the binomial model with the logit link converges but the corresponding model with the identity link does not, then we will report only an OR.</w:t>
       </w:r>
     </w:p>
-    <w:bookmarkStart w:id="103" w:name="sensitivity-analyses"/>
+    <w:bookmarkStart w:id="104" w:name="sensitivity-analyses"/>
     <w:p>
       <w:pPr>
         <w:pStyle w:val="Heading3"/>
@@ -4442,7 +8370,7 @@
         <w:t xml:space="preserve">. Unless otherwise stated, each sensitivity analysis will be operationalised using two separate models, one with the logit link and one with the identity link.</w:t>
       </w:r>
     </w:p>
-    <w:bookmarkStart w:id="92" w:name="X22dda602ebb4652e0fd291705062d91648ada05"/>
+    <w:bookmarkStart w:id="93" w:name="X22dda602ebb4652e0fd291705062d91648ada05"/>
     <w:p>
       <w:pPr>
         <w:pStyle w:val="Heading4"/>
@@ -4485,7 +8413,7 @@
       <w:pPr>
         <w:pStyle w:val="BodyText"/>
       </w:pPr>
-      <w:bookmarkStart w:id="91" w:name="eq-ar1"/>
+      <w:bookmarkStart w:id="92" w:name="eq-ar1"/>
       <m:oMathPara>
         <m:oMathParaPr>
           <m:jc m:val="center"/>
@@ -4663,7 +8591,7 @@
           </m:d>
         </m:oMath>
       </m:oMathPara>
-      <w:bookmarkEnd w:id="91"/>
+      <w:bookmarkEnd w:id="92"/>
     </w:p>
     <w:p>
       <w:pPr>
@@ -4824,8 +8752,8 @@
         <w:t xml:space="preserve">is not directly equivalent to parameters used in other specifications and should not be interpreted interchangeably.</w:t>
       </w:r>
     </w:p>
-    <w:bookmarkEnd w:id="92"/>
-    <w:bookmarkStart w:id="94" w:name="X265de50a776706f6d9ec7b4549b866a94e548a1"/>
+    <w:bookmarkEnd w:id="93"/>
+    <w:bookmarkStart w:id="95" w:name="X265de50a776706f6d9ec7b4549b866a94e548a1"/>
     <w:p>
       <w:pPr>
         <w:pStyle w:val="Heading4"/>
@@ -4860,7 +8788,7 @@
       <w:pPr>
         <w:pStyle w:val="BodyText"/>
       </w:pPr>
-      <w:bookmarkStart w:id="93" w:name="eq-model-batch-trend"/>
+      <w:bookmarkStart w:id="94" w:name="eq-model-batch-trend"/>
       <m:oMathPara>
         <m:oMathParaPr>
           <m:jc m:val="center"/>
@@ -5068,7 +8996,7 @@
           </m:d>
         </m:oMath>
       </m:oMathPara>
-      <w:bookmarkEnd w:id="93"/>
+      <w:bookmarkEnd w:id="94"/>
     </w:p>
     <w:p>
       <w:pPr>
@@ -5129,8 +9057,8 @@
         <w:t xml:space="preserve">, capturing between-batch variation in secular trends over time.</w:t>
       </w:r>
     </w:p>
-    <w:bookmarkEnd w:id="94"/>
-    <w:bookmarkStart w:id="96" w:name="X831bc7e780a434f5c3512e5d33d43284b7d37ce"/>
+    <w:bookmarkEnd w:id="95"/>
+    <w:bookmarkStart w:id="97" w:name="X831bc7e780a434f5c3512e5d33d43284b7d37ce"/>
     <w:p>
       <w:pPr>
         <w:pStyle w:val="Heading4"/>
@@ -5165,7 +9093,7 @@
       <w:pPr>
         <w:pStyle w:val="BodyText"/>
       </w:pPr>
-      <w:bookmarkStart w:id="95" w:name="eq-model-random-cluster-intervention"/>
+      <w:bookmarkStart w:id="96" w:name="eq-model-random-cluster-intervention"/>
       <m:oMathPara>
         <m:oMathParaPr>
           <m:jc m:val="center"/>
@@ -5391,7 +9319,7 @@
           </m:d>
         </m:oMath>
       </m:oMathPara>
-      <w:bookmarkEnd w:id="95"/>
+      <w:bookmarkEnd w:id="96"/>
     </w:p>
     <w:p>
       <w:pPr>
@@ -5566,8 +9494,8 @@
         <w:t xml:space="preserve">.</w:t>
       </w:r>
     </w:p>
-    <w:bookmarkEnd w:id="96"/>
-    <w:bookmarkStart w:id="98" w:name="X0324ad02af1274e3e5fe3c1dbe99d3dad84fc47"/>
+    <w:bookmarkEnd w:id="97"/>
+    <w:bookmarkStart w:id="99" w:name="X0324ad02af1274e3e5fe3c1dbe99d3dad84fc47"/>
     <w:p>
       <w:pPr>
         <w:pStyle w:val="Heading4"/>
@@ -5680,7 +9608,7 @@
       <w:pPr>
         <w:pStyle w:val="BodyText"/>
       </w:pPr>
-      <w:bookmarkStart w:id="97" w:name="eq-model-correlated-random-effects"/>
+      <w:bookmarkStart w:id="98" w:name="eq-model-correlated-random-effects"/>
       <m:oMathPara>
         <m:oMathParaPr>
           <m:jc m:val="center"/>
@@ -5906,7 +9834,7 @@
           </m:d>
         </m:oMath>
       </m:oMathPara>
-      <w:bookmarkEnd w:id="97"/>
+      <w:bookmarkEnd w:id="98"/>
     </w:p>
     <w:p>
       <w:pPr>
@@ -6296,8 +10224,8 @@
         </m:oMath>
       </m:oMathPara>
     </w:p>
-    <w:bookmarkEnd w:id="98"/>
-    <w:bookmarkStart w:id="100" w:name="Xb7b1d3ff7c24f0b8dca2081a41dd1947ef59e07"/>
+    <w:bookmarkEnd w:id="99"/>
+    <w:bookmarkStart w:id="101" w:name="Xb7b1d3ff7c24f0b8dca2081a41dd1947ef59e07"/>
     <w:p>
       <w:pPr>
         <w:pStyle w:val="Heading4"/>
@@ -6341,7 +10269,7 @@
       <w:pPr>
         <w:pStyle w:val="BodyText"/>
       </w:pPr>
-      <w:bookmarkStart w:id="99" w:name="eq-spline-model"/>
+      <w:bookmarkStart w:id="100" w:name="eq-spline-model"/>
       <m:oMathPara>
         <m:oMathParaPr>
           <m:jc m:val="center"/>
@@ -6618,7 +10546,7 @@
           </m:d>
         </m:oMath>
       </m:oMathPara>
-      <w:bookmarkEnd w:id="99"/>
+      <w:bookmarkEnd w:id="100"/>
     </w:p>
     <w:p>
       <w:pPr>
@@ -6780,8 +10708,8 @@
         <w:t xml:space="preserve">th spline basis function.</w:t>
       </w:r>
     </w:p>
-    <w:bookmarkEnd w:id="100"/>
-    <w:bookmarkStart w:id="102" w:name="models-exploring-lag-and-weaning-effects"/>
+    <w:bookmarkEnd w:id="101"/>
+    <w:bookmarkStart w:id="103" w:name="models-exploring-lag-and-weaning-effects"/>
     <w:p>
       <w:pPr>
         <w:pStyle w:val="Heading4"/>
@@ -6816,7 +10744,7 @@
       <w:pPr>
         <w:pStyle w:val="BodyText"/>
       </w:pPr>
-      <w:bookmarkStart w:id="101" w:name="eq-lag-weaning-model"/>
+      <w:bookmarkStart w:id="102" w:name="eq-lag-weaning-model"/>
       <m:oMathPara>
         <m:oMathParaPr>
           <m:jc m:val="center"/>
@@ -7067,7 +10995,7 @@
           </m:d>
         </m:oMath>
       </m:oMathPara>
-      <w:bookmarkEnd w:id="101"/>
+      <w:bookmarkEnd w:id="102"/>
     </w:p>
     <w:p>
       <w:pPr>
@@ -7133,9 +11061,9 @@
         <w:t xml:space="preserve">is the number of periods since first exposure.</w:t>
       </w:r>
     </w:p>
-    <w:bookmarkEnd w:id="102"/>
     <w:bookmarkEnd w:id="103"/>
-    <w:bookmarkStart w:id="104" w:name="adjusted-analyses"/>
+    <w:bookmarkEnd w:id="104"/>
+    <w:bookmarkStart w:id="105" w:name="adjusted-analyses"/>
     <w:p>
       <w:pPr>
         <w:pStyle w:val="Heading3"/>
@@ -7255,8 +11183,8 @@
         <w:t xml:space="preserve">as fixed effects. We will model the continuous covariates assuming linear effects. We will assume no interaction between subgroups and secular time trends, which may be evaluated in future analyses if indicated.</w:t>
       </w:r>
     </w:p>
-    <w:bookmarkEnd w:id="104"/>
-    <w:bookmarkStart w:id="105" w:name="subgroup-analyses"/>
+    <w:bookmarkEnd w:id="105"/>
+    <w:bookmarkStart w:id="106" w:name="subgroup-analyses"/>
     <w:p>
       <w:pPr>
         <w:pStyle w:val="Heading3"/>
@@ -7382,8 +11310,8 @@
         <w:t xml:space="preserve">.</w:t>
       </w:r>
     </w:p>
-    <w:bookmarkEnd w:id="105"/>
-    <w:bookmarkStart w:id="106" w:name="sec-treatment-of-missing-data"/>
+    <w:bookmarkEnd w:id="106"/>
+    <w:bookmarkStart w:id="107" w:name="sec-treatment-of-missing-data"/>
     <w:p>
       <w:pPr>
         <w:pStyle w:val="Heading3"/>
@@ -7400,9 +11328,9 @@
         <w:t xml:space="preserve">We will present the frequency and percentage of missing data for all variables. If the percentage of missing data for the primary outcome is less than 10%, we will perform a complete case analysis. If the percentage of missing data for the primary outcome is 10% or more, we will handle missing data depending on the missing data mechanism. If the data are missing at random (MAR), we will perform multiple imputation using multiple imputation by chained equations (MICE), imputing data for the primary outcome as well as all covariates included in the fully adjusted model. The number of imputations will be determined by the percentage of missing data, with a minimum of 20 imputations. If there is evidence that the data are missing not at random (MNAR), we will explore the impact of this assumption using a sensitivity analysis (e.g., pattern mixture models or selection models) to assess how robust our findings are to different assumptions about the missing data mechanism. Evidence that data are MNAR may include systematic differences in missingness across observed covariates, patterns suggestive of non-random dropout, or clinical expectations that missingness is related to unmeasured outcomes. Additionally, we will perform diagnostic checks after multiple imputation to ensure the quality of the imputation process, including comparing distributions of observed and imputed data and checking convergence.</w:t>
       </w:r>
     </w:p>
-    <w:bookmarkEnd w:id="106"/>
     <w:bookmarkEnd w:id="107"/>
-    <w:bookmarkStart w:id="121" w:name="analysis-of-secondary-outcomes"/>
+    <w:bookmarkEnd w:id="108"/>
+    <w:bookmarkStart w:id="122" w:name="analysis-of-secondary-outcomes"/>
     <w:p>
       <w:pPr>
         <w:pStyle w:val="Heading2"/>
@@ -7419,7 +11347,7 @@
         <w:t xml:space="preserve">Unless otherwise stated, secondary outcomes will be analysed using the same mixed-effects modelling framework as specified for the primary outcome, including fixed effects for time and intervention exposure and random effects for cluster and cluster-by-period, with the link function and outcome distribution adapted to the scale of the outcome.</w:t>
       </w:r>
     </w:p>
-    <w:bookmarkStart w:id="108" w:name="Xf8ad26412ad98b449304d4475d81963b294c2ae"/>
+    <w:bookmarkStart w:id="109" w:name="Xf8ad26412ad98b449304d4475d81963b294c2ae"/>
     <w:p>
       <w:pPr>
         <w:pStyle w:val="Heading3"/>
@@ -7450,8 +11378,8 @@
         <w:t xml:space="preserve">, to estimate odds ratios and absolute risk differences.</w:t>
       </w:r>
     </w:p>
-    <w:bookmarkEnd w:id="108"/>
-    <w:bookmarkStart w:id="111" w:name="X89c97a0c38ba473d58b2facce729a073a7e8df9"/>
+    <w:bookmarkEnd w:id="109"/>
+    <w:bookmarkStart w:id="112" w:name="X89c97a0c38ba473d58b2facce729a073a7e8df9"/>
     <w:p>
       <w:pPr>
         <w:pStyle w:val="Heading3"/>
@@ -7480,7 +11408,7 @@
       <w:pPr>
         <w:pStyle w:val="BodyText"/>
       </w:pPr>
-      <w:bookmarkStart w:id="109" w:name="eq-ordinal-model"/>
+      <w:bookmarkStart w:id="110" w:name="eq-ordinal-model"/>
       <m:oMathPara>
         <m:oMathParaPr>
           <m:jc m:val="center"/>
@@ -7680,7 +11608,7 @@
           </m:d>
         </m:oMath>
       </m:oMathPara>
-      <w:bookmarkEnd w:id="109"/>
+      <w:bookmarkEnd w:id="110"/>
     </w:p>
     <w:p>
       <w:pPr>
@@ -7736,7 +11664,7 @@
       <w:pPr>
         <w:pStyle w:val="BodyText"/>
       </w:pPr>
-      <w:bookmarkStart w:id="110" w:name="eq-linear-model"/>
+      <w:bookmarkStart w:id="111" w:name="eq-linear-model"/>
       <m:oMathPara>
         <m:oMathParaPr>
           <m:jc m:val="center"/>
@@ -7988,10 +11916,10 @@
           </m:d>
         </m:oMath>
       </m:oMathPara>
-      <w:bookmarkEnd w:id="110"/>
-    </w:p>
-    <w:bookmarkEnd w:id="111"/>
-    <w:bookmarkStart w:id="112" w:name="X90cb4e0ebfb4fe618dcdd24cc99dbcaedd01b78"/>
+      <w:bookmarkEnd w:id="111"/>
+    </w:p>
+    <w:bookmarkEnd w:id="112"/>
+    <w:bookmarkStart w:id="113" w:name="X90cb4e0ebfb4fe618dcdd24cc99dbcaedd01b78"/>
     <w:p>
       <w:pPr>
         <w:pStyle w:val="Heading3"/>
@@ -8057,8 +11985,8 @@
         <w:t xml:space="preserve">.</w:t>
       </w:r>
     </w:p>
-    <w:bookmarkEnd w:id="112"/>
-    <w:bookmarkStart w:id="113" w:name="X0c0155e4b87aec11ab06b9d09220f8543002113"/>
+    <w:bookmarkEnd w:id="113"/>
+    <w:bookmarkStart w:id="114" w:name="X0c0155e4b87aec11ab06b9d09220f8543002113"/>
     <w:p>
       <w:pPr>
         <w:pStyle w:val="Heading3"/>
@@ -8092,8 +12020,8 @@
         <w:t xml:space="preserve">with the logit link.</w:t>
       </w:r>
     </w:p>
-    <w:bookmarkEnd w:id="113"/>
-    <w:bookmarkStart w:id="115" w:name="length-of-emergency-department-stay"/>
+    <w:bookmarkEnd w:id="114"/>
+    <w:bookmarkStart w:id="116" w:name="length-of-emergency-department-stay"/>
     <w:p>
       <w:pPr>
         <w:pStyle w:val="Heading3"/>
@@ -8128,7 +12056,7 @@
       <w:pPr>
         <w:pStyle w:val="BodyText"/>
       </w:pPr>
-      <w:bookmarkStart w:id="114" w:name="eq-competing-risks-model"/>
+      <w:bookmarkStart w:id="115" w:name="eq-competing-risks-model"/>
       <m:oMathPara>
         <m:oMathParaPr>
           <m:jc m:val="center"/>
@@ -8322,7 +12250,7 @@
           </m:d>
         </m:oMath>
       </m:oMathPara>
-      <w:bookmarkEnd w:id="114"/>
+      <w:bookmarkEnd w:id="115"/>
     </w:p>
     <w:p>
       <w:pPr>
@@ -8511,8 +12439,8 @@
         <w:t xml:space="preserve">All other terms are defined as in the primary analysis model.</w:t>
       </w:r>
     </w:p>
-    <w:bookmarkEnd w:id="115"/>
-    <w:bookmarkStart w:id="116" w:name="length-of-hospital-stay"/>
+    <w:bookmarkEnd w:id="116"/>
+    <w:bookmarkStart w:id="117" w:name="length-of-hospital-stay"/>
     <w:p>
       <w:pPr>
         <w:pStyle w:val="Heading3"/>
@@ -8543,8 +12471,8 @@
         <w:t xml:space="preserve">.</w:t>
       </w:r>
     </w:p>
-    <w:bookmarkEnd w:id="116"/>
-    <w:bookmarkStart w:id="117" w:name="intensive-care-unit-admission"/>
+    <w:bookmarkEnd w:id="117"/>
+    <w:bookmarkStart w:id="118" w:name="intensive-care-unit-admission"/>
     <w:p>
       <w:pPr>
         <w:pStyle w:val="Heading3"/>
@@ -8578,8 +12506,8 @@
         <w:t xml:space="preserve">with the logit link.</w:t>
       </w:r>
     </w:p>
-    <w:bookmarkEnd w:id="117"/>
-    <w:bookmarkStart w:id="118" w:name="length-of-intensive-care-unit-stay"/>
+    <w:bookmarkEnd w:id="118"/>
+    <w:bookmarkStart w:id="119" w:name="length-of-intensive-care-unit-stay"/>
     <w:p>
       <w:pPr>
         <w:pStyle w:val="Heading3"/>
@@ -8610,8 +12538,8 @@
         <w:t xml:space="preserve">.</w:t>
       </w:r>
     </w:p>
-    <w:bookmarkEnd w:id="118"/>
-    <w:bookmarkStart w:id="120" w:name="X5037a1d47abaf80439915bb3ba5c524d444c7d7"/>
+    <w:bookmarkEnd w:id="119"/>
+    <w:bookmarkStart w:id="121" w:name="X5037a1d47abaf80439915bb3ba5c524d444c7d7"/>
     <w:p>
       <w:pPr>
         <w:pStyle w:val="Heading3"/>
@@ -8652,7 +12580,7 @@
       <w:pPr>
         <w:pStyle w:val="BodyText"/>
       </w:pPr>
-      <w:bookmarkStart w:id="119" w:name="eq-beta-model"/>
+      <w:bookmarkStart w:id="120" w:name="eq-beta-model"/>
       <m:oMathPara>
         <m:oMathParaPr>
           <m:jc m:val="center"/>
@@ -8831,7 +12759,7 @@
           </m:d>
         </m:oMath>
       </m:oMathPara>
-      <w:bookmarkEnd w:id="119"/>
+      <w:bookmarkEnd w:id="120"/>
     </w:p>
     <w:p>
       <w:pPr>
@@ -8937,10 +12865,10 @@
         <w:t xml:space="preserve">prior to fitting the beta regression model. A beta regression precision (dispersion) parameter will be estimated as part of the model.</w:t>
       </w:r>
     </w:p>
-    <w:bookmarkEnd w:id="120"/>
     <w:bookmarkEnd w:id="121"/>
     <w:bookmarkEnd w:id="122"/>
-    <w:bookmarkStart w:id="144" w:name="references"/>
+    <w:bookmarkEnd w:id="123"/>
+    <w:bookmarkStart w:id="145" w:name="references"/>
     <w:p>
       <w:pPr>
         <w:pStyle w:val="Heading1"/>
@@ -8949,8 +12877,8 @@
         <w:t xml:space="preserve">6. References</w:t>
       </w:r>
     </w:p>
-    <w:bookmarkStart w:id="143" w:name="refs"/>
-    <w:bookmarkStart w:id="123" w:name="ref-Kasza2022"/>
+    <w:bookmarkStart w:id="144" w:name="refs"/>
+    <w:bookmarkStart w:id="124" w:name="ref-Kasza2022"/>
     <w:p>
       <w:pPr>
         <w:pStyle w:val="Bibliography"/>
@@ -9004,8 +12932,8 @@
         <w:t xml:space="preserve">, 3627–3641 (2022).</w:t>
       </w:r>
     </w:p>
-    <w:bookmarkEnd w:id="123"/>
-    <w:bookmarkStart w:id="124" w:name="ref-grantham_staircase_2024"/>
+    <w:bookmarkEnd w:id="124"/>
+    <w:bookmarkStart w:id="125" w:name="ref-grantham_staircase_2024"/>
     <w:p>
       <w:pPr>
         <w:pStyle w:val="Bibliography"/>
@@ -9071,8 +12999,8 @@
         <w:t xml:space="preserve">, 24–41 (2024).</w:t>
       </w:r>
     </w:p>
-    <w:bookmarkEnd w:id="124"/>
-    <w:bookmarkStart w:id="125" w:name="ref-aukstakalnis_impact_2024"/>
+    <w:bookmarkEnd w:id="125"/>
+    <w:bookmarkStart w:id="126" w:name="ref-aukstakalnis_impact_2024"/>
     <w:p>
       <w:pPr>
         <w:pStyle w:val="Bibliography"/>
@@ -9119,8 +13047,8 @@
         <w:t xml:space="preserve">(2024).</w:t>
       </w:r>
     </w:p>
-    <w:bookmarkEnd w:id="125"/>
-    <w:bookmarkStart w:id="126" w:name="ref-Hemming2020Feb"/>
+    <w:bookmarkEnd w:id="126"/>
+    <w:bookmarkStart w:id="127" w:name="ref-Hemming2020Feb"/>
     <w:p>
       <w:pPr>
         <w:pStyle w:val="Bibliography"/>
@@ -9174,8 +13102,8 @@
         <w:t xml:space="preserve">, 979–995 (2020).</w:t>
       </w:r>
     </w:p>
-    <w:bookmarkEnd w:id="126"/>
-    <w:bookmarkStart w:id="127" w:name="ref-nakhid_effect_2026"/>
+    <w:bookmarkEnd w:id="127"/>
+    <w:bookmarkStart w:id="128" w:name="ref-nakhid_effect_2026"/>
     <w:p>
       <w:pPr>
         <w:pStyle w:val="Bibliography"/>
@@ -9222,8 +13150,8 @@
         <w:t xml:space="preserve">(2026).</w:t>
       </w:r>
     </w:p>
-    <w:bookmarkEnd w:id="127"/>
-    <w:bookmarkStart w:id="128" w:name="ref-gerdin_warnberg_feasibility_2025"/>
+    <w:bookmarkEnd w:id="128"/>
+    <w:bookmarkStart w:id="129" w:name="ref-gerdin_warnberg_feasibility_2025"/>
     <w:p>
       <w:pPr>
         <w:pStyle w:val="Bibliography"/>
@@ -9286,8 +13214,8 @@
         <w:t xml:space="preserve">, e099020 (2025).</w:t>
       </w:r>
     </w:p>
-    <w:bookmarkEnd w:id="128"/>
-    <w:bookmarkStart w:id="129" w:name="ref-Campbell2005"/>
+    <w:bookmarkEnd w:id="129"/>
+    <w:bookmarkStart w:id="130" w:name="ref-Campbell2005"/>
     <w:p>
       <w:pPr>
         <w:pStyle w:val="Bibliography"/>
@@ -9341,8 +13269,8 @@
         <w:t xml:space="preserve">, 99–107 (2005).</w:t>
       </w:r>
     </w:p>
-    <w:bookmarkEnd w:id="129"/>
-    <w:bookmarkStart w:id="130" w:name="ref-Eldridge2015"/>
+    <w:bookmarkEnd w:id="130"/>
+    <w:bookmarkStart w:id="131" w:name="ref-Eldridge2015"/>
     <w:p>
       <w:pPr>
         <w:pStyle w:val="Bibliography"/>
@@ -9396,8 +13324,8 @@
         <w:t xml:space="preserve">, 1039–1056 (2015).</w:t>
       </w:r>
     </w:p>
-    <w:bookmarkEnd w:id="130"/>
-    <w:bookmarkStart w:id="131" w:name="ref-Martin2016"/>
+    <w:bookmarkEnd w:id="131"/>
+    <w:bookmarkStart w:id="132" w:name="ref-Martin2016"/>
     <w:p>
       <w:pPr>
         <w:pStyle w:val="Bibliography"/>
@@ -9451,8 +13379,8 @@
         <w:t xml:space="preserve">, (2016).</w:t>
       </w:r>
     </w:p>
-    <w:bookmarkEnd w:id="131"/>
-    <w:bookmarkStart w:id="132" w:name="ref-Korevaar2021"/>
+    <w:bookmarkEnd w:id="132"/>
+    <w:bookmarkStart w:id="133" w:name="ref-Korevaar2021"/>
     <w:p>
       <w:pPr>
         <w:pStyle w:val="Bibliography"/>
@@ -9506,8 +13434,8 @@
         <w:t xml:space="preserve">, 529–540 (2021).</w:t>
       </w:r>
     </w:p>
-    <w:bookmarkEnd w:id="132"/>
-    <w:bookmarkStart w:id="133" w:name="ref-lashoher_implementation_2017"/>
+    <w:bookmarkEnd w:id="133"/>
+    <w:bookmarkStart w:id="134" w:name="ref-lashoher_implementation_2017"/>
     <w:p>
       <w:pPr>
         <w:pStyle w:val="Bibliography"/>
@@ -9675,8 +13603,8 @@
         <w:t xml:space="preserve">, 954–962 (2017).</w:t>
       </w:r>
     </w:p>
-    <w:bookmarkEnd w:id="133"/>
-    <w:bookmarkStart w:id="134" w:name="ref-kapitan_effect_2024"/>
+    <w:bookmarkEnd w:id="134"/>
+    <w:bookmarkStart w:id="135" w:name="ref-kapitan_effect_2024"/>
     <w:p>
       <w:pPr>
         <w:pStyle w:val="Bibliography"/>
@@ -9732,8 +13660,8 @@
         <w:t xml:space="preserve">2024.09.28.24314529 (2024).</w:t>
       </w:r>
     </w:p>
-    <w:bookmarkEnd w:id="134"/>
-    <w:bookmarkStart w:id="135" w:name="ref-higgins_psychometric_2021"/>
+    <w:bookmarkEnd w:id="135"/>
+    <w:bookmarkStart w:id="136" w:name="ref-higgins_psychometric_2021"/>
     <w:p>
       <w:pPr>
         <w:pStyle w:val="Bibliography"/>
@@ -9799,8 +13727,8 @@
         <w:t xml:space="preserve">, 103–112 (2021).</w:t>
       </w:r>
     </w:p>
-    <w:bookmarkEnd w:id="135"/>
-    <w:bookmarkStart w:id="136" w:name="ref-R"/>
+    <w:bookmarkEnd w:id="136"/>
+    <w:bookmarkStart w:id="137" w:name="ref-R"/>
     <w:p>
       <w:pPr>
         <w:pStyle w:val="Bibliography"/>
@@ -9831,8 +13759,8 @@
         <w:t xml:space="preserve">. (R Foundation for Statistical Computing, 2023).</w:t>
       </w:r>
     </w:p>
-    <w:bookmarkEnd w:id="136"/>
-    <w:bookmarkStart w:id="137" w:name="ref-Hemming2018"/>
+    <w:bookmarkEnd w:id="137"/>
+    <w:bookmarkStart w:id="138" w:name="ref-Hemming2018"/>
     <w:p>
       <w:pPr>
         <w:pStyle w:val="Bibliography"/>
@@ -9879,8 +13807,8 @@
         <w:t xml:space="preserve">k1614 (2018).</w:t>
       </w:r>
     </w:p>
-    <w:bookmarkEnd w:id="137"/>
-    <w:bookmarkStart w:id="138" w:name="ref-grantham_evaluating_2022"/>
+    <w:bookmarkEnd w:id="138"/>
+    <w:bookmarkStart w:id="139" w:name="ref-grantham_evaluating_2022"/>
     <w:p>
       <w:pPr>
         <w:pStyle w:val="Bibliography"/>
@@ -9946,8 +13874,8 @@
         <w:t xml:space="preserve">, 112 (2022).</w:t>
       </w:r>
     </w:p>
-    <w:bookmarkEnd w:id="138"/>
-    <w:bookmarkStart w:id="139" w:name="ref-kenny_analysis_2022"/>
+    <w:bookmarkEnd w:id="139"/>
+    <w:bookmarkStart w:id="140" w:name="ref-kenny_analysis_2022"/>
     <w:p>
       <w:pPr>
         <w:pStyle w:val="Bibliography"/>
@@ -9994,8 +13922,8 @@
         <w:t xml:space="preserve">10.1002/sim.9511 (2022).</w:t>
       </w:r>
     </w:p>
-    <w:bookmarkEnd w:id="139"/>
-    <w:bookmarkStart w:id="140" w:name="ref-Diaz2021"/>
+    <w:bookmarkEnd w:id="140"/>
+    <w:bookmarkStart w:id="141" w:name="ref-Diaz2021"/>
     <w:p>
       <w:pPr>
         <w:pStyle w:val="Bibliography"/>
@@ -10049,8 +13977,8 @@
         <w:t xml:space="preserve">, e436–e443 (2021).</w:t>
       </w:r>
     </w:p>
-    <w:bookmarkEnd w:id="140"/>
-    <w:bookmarkStart w:id="141" w:name="ref-hornor_quality_2018"/>
+    <w:bookmarkEnd w:id="141"/>
+    <w:bookmarkStart w:id="142" w:name="ref-hornor_quality_2018"/>
     <w:p>
       <w:pPr>
         <w:pStyle w:val="Bibliography"/>
@@ -10146,8 +14074,8 @@
         <w:t xml:space="preserve">, 160–169 (2018).</w:t>
       </w:r>
     </w:p>
-    <w:bookmarkEnd w:id="141"/>
-    <w:bookmarkStart w:id="142" w:name="ref-ustun_measuring_2010"/>
+    <w:bookmarkEnd w:id="142"/>
+    <w:bookmarkStart w:id="143" w:name="ref-ustun_measuring_2010"/>
     <w:p>
       <w:pPr>
         <w:pStyle w:val="Bibliography"/>
@@ -10356,9 +14284,9 @@
         <w:t xml:space="preserve">. (World Health Organization, 2010).</w:t>
       </w:r>
     </w:p>
-    <w:bookmarkEnd w:id="142"/>
     <w:bookmarkEnd w:id="143"/>
     <w:bookmarkEnd w:id="144"/>
+    <w:bookmarkEnd w:id="145"/>
     <w:sectPr>
       <w:footnotePr>
         <w:numRestart w:val="eachSect"/>

</xml_diff>

<commit_message>
Remove table placeholder text
</commit_message>
<xml_diff>
--- a/statistical-analysis-plan/statistical-analysis-plan.docx
+++ b/statistical-analysis-plan/statistical-analysis-plan.docx
@@ -2681,7 +2681,7 @@
                       <w:rFonts w:ascii="Calibri" w:hAnsi="Calibri"/>
                       <w:sz w:val="20"/>
                     </w:rPr>
-                    <w:t xml:space="default">median (Q1-Q3)</w:t>
+                    <w:t xml:space="default"/>
                   </w:r>
                 </w:p>
               </w:tc>
@@ -2705,7 +2705,7 @@
                       <w:rFonts w:ascii="Calibri" w:hAnsi="Calibri"/>
                       <w:sz w:val="20"/>
                     </w:rPr>
-                    <w:t xml:space="default">median (Q1-Q3)</w:t>
+                    <w:t xml:space="default"/>
                   </w:r>
                 </w:p>
               </w:tc>
@@ -2729,7 +2729,7 @@
                       <w:rFonts w:ascii="Calibri" w:hAnsi="Calibri"/>
                       <w:sz w:val="20"/>
                     </w:rPr>
-                    <w:t xml:space="default">median (Q1-Q3)</w:t>
+                    <w:t xml:space="default"/>
                   </w:r>
                 </w:p>
               </w:tc>
@@ -2753,7 +2753,7 @@
                       <w:rFonts w:ascii="Calibri" w:hAnsi="Calibri"/>
                       <w:sz w:val="20"/>
                     </w:rPr>
-                    <w:t xml:space="default">median (Q1-Q3)</w:t>
+                    <w:t xml:space="default"/>
                   </w:r>
                 </w:p>
               </w:tc>
@@ -2777,7 +2777,7 @@
                       <w:rFonts w:ascii="Calibri" w:hAnsi="Calibri"/>
                       <w:sz w:val="20"/>
                     </w:rPr>
-                    <w:t xml:space="default">median (Q1-Q3)</w:t>
+                    <w:t xml:space="default"/>
                   </w:r>
                 </w:p>
               </w:tc>
@@ -2801,7 +2801,7 @@
                       <w:rFonts w:ascii="Calibri" w:hAnsi="Calibri"/>
                       <w:sz w:val="20"/>
                     </w:rPr>
-                    <w:t xml:space="default">median (Q1-Q3)</w:t>
+                    <w:t xml:space="default"/>
                   </w:r>
                 </w:p>
               </w:tc>
@@ -2854,7 +2854,7 @@
                       <w:rFonts w:ascii="Calibri" w:hAnsi="Calibri"/>
                       <w:sz w:val="20"/>
                     </w:rPr>
-                    <w:t xml:space="default">median (Q1-Q3)</w:t>
+                    <w:t xml:space="default"/>
                   </w:r>
                 </w:p>
               </w:tc>
@@ -2878,7 +2878,7 @@
                       <w:rFonts w:ascii="Calibri" w:hAnsi="Calibri"/>
                       <w:sz w:val="20"/>
                     </w:rPr>
-                    <w:t xml:space="default">median (Q1-Q3)</w:t>
+                    <w:t xml:space="default"/>
                   </w:r>
                 </w:p>
               </w:tc>
@@ -2902,7 +2902,7 @@
                       <w:rFonts w:ascii="Calibri" w:hAnsi="Calibri"/>
                       <w:sz w:val="20"/>
                     </w:rPr>
-                    <w:t xml:space="default">median (Q1-Q3)</w:t>
+                    <w:t xml:space="default"/>
                   </w:r>
                 </w:p>
               </w:tc>
@@ -2926,7 +2926,7 @@
                       <w:rFonts w:ascii="Calibri" w:hAnsi="Calibri"/>
                       <w:sz w:val="20"/>
                     </w:rPr>
-                    <w:t xml:space="default">median (Q1-Q3)</w:t>
+                    <w:t xml:space="default"/>
                   </w:r>
                 </w:p>
               </w:tc>
@@ -2950,7 +2950,7 @@
                       <w:rFonts w:ascii="Calibri" w:hAnsi="Calibri"/>
                       <w:sz w:val="20"/>
                     </w:rPr>
-                    <w:t xml:space="default">median (Q1-Q3)</w:t>
+                    <w:t xml:space="default"/>
                   </w:r>
                 </w:p>
               </w:tc>
@@ -2974,7 +2974,7 @@
                       <w:rFonts w:ascii="Calibri" w:hAnsi="Calibri"/>
                       <w:sz w:val="20"/>
                     </w:rPr>
-                    <w:t xml:space="default">median (Q1-Q3)</w:t>
+                    <w:t xml:space="default"/>
                   </w:r>
                 </w:p>
               </w:tc>
@@ -3027,7 +3027,7 @@
                       <w:rFonts w:ascii="Calibri" w:hAnsi="Calibri"/>
                       <w:sz w:val="20"/>
                     </w:rPr>
-                    <w:t xml:space="default">median (Q1-Q3)</w:t>
+                    <w:t xml:space="default"/>
                   </w:r>
                 </w:p>
               </w:tc>
@@ -3051,7 +3051,7 @@
                       <w:rFonts w:ascii="Calibri" w:hAnsi="Calibri"/>
                       <w:sz w:val="20"/>
                     </w:rPr>
-                    <w:t xml:space="default">median (Q1-Q3)</w:t>
+                    <w:t xml:space="default"/>
                   </w:r>
                 </w:p>
               </w:tc>
@@ -3075,7 +3075,7 @@
                       <w:rFonts w:ascii="Calibri" w:hAnsi="Calibri"/>
                       <w:sz w:val="20"/>
                     </w:rPr>
-                    <w:t xml:space="default">median (Q1-Q3)</w:t>
+                    <w:t xml:space="default"/>
                   </w:r>
                 </w:p>
               </w:tc>
@@ -3099,7 +3099,7 @@
                       <w:rFonts w:ascii="Calibri" w:hAnsi="Calibri"/>
                       <w:sz w:val="20"/>
                     </w:rPr>
-                    <w:t xml:space="default">median (Q1-Q3)</w:t>
+                    <w:t xml:space="default"/>
                   </w:r>
                 </w:p>
               </w:tc>
@@ -3123,7 +3123,7 @@
                       <w:rFonts w:ascii="Calibri" w:hAnsi="Calibri"/>
                       <w:sz w:val="20"/>
                     </w:rPr>
-                    <w:t xml:space="default">median (Q1-Q3)</w:t>
+                    <w:t xml:space="default"/>
                   </w:r>
                 </w:p>
               </w:tc>
@@ -3147,7 +3147,7 @@
                       <w:rFonts w:ascii="Calibri" w:hAnsi="Calibri"/>
                       <w:sz w:val="20"/>
                     </w:rPr>
-                    <w:t xml:space="default">median (Q1-Q3)</w:t>
+                    <w:t xml:space="default"/>
                   </w:r>
                 </w:p>
               </w:tc>
@@ -3200,7 +3200,7 @@
                       <w:rFonts w:ascii="Calibri" w:hAnsi="Calibri"/>
                       <w:sz w:val="20"/>
                     </w:rPr>
-                    <w:t xml:space="default">median (Q1-Q3)</w:t>
+                    <w:t xml:space="default"/>
                   </w:r>
                 </w:p>
               </w:tc>
@@ -3224,7 +3224,7 @@
                       <w:rFonts w:ascii="Calibri" w:hAnsi="Calibri"/>
                       <w:sz w:val="20"/>
                     </w:rPr>
-                    <w:t xml:space="default">median (Q1-Q3)</w:t>
+                    <w:t xml:space="default"/>
                   </w:r>
                 </w:p>
               </w:tc>
@@ -3248,7 +3248,7 @@
                       <w:rFonts w:ascii="Calibri" w:hAnsi="Calibri"/>
                       <w:sz w:val="20"/>
                     </w:rPr>
-                    <w:t xml:space="default">median (Q1-Q3)</w:t>
+                    <w:t xml:space="default"/>
                   </w:r>
                 </w:p>
               </w:tc>
@@ -3272,7 +3272,7 @@
                       <w:rFonts w:ascii="Calibri" w:hAnsi="Calibri"/>
                       <w:sz w:val="20"/>
                     </w:rPr>
-                    <w:t xml:space="default">median (Q1-Q3)</w:t>
+                    <w:t xml:space="default"/>
                   </w:r>
                 </w:p>
               </w:tc>
@@ -3296,7 +3296,7 @@
                       <w:rFonts w:ascii="Calibri" w:hAnsi="Calibri"/>
                       <w:sz w:val="20"/>
                     </w:rPr>
-                    <w:t xml:space="default">median (Q1-Q3)</w:t>
+                    <w:t xml:space="default"/>
                   </w:r>
                 </w:p>
               </w:tc>
@@ -3320,7 +3320,7 @@
                       <w:rFonts w:ascii="Calibri" w:hAnsi="Calibri"/>
                       <w:sz w:val="20"/>
                     </w:rPr>
-                    <w:t xml:space="default">median (Q1-Q3)</w:t>
+                    <w:t xml:space="default"/>
                   </w:r>
                 </w:p>
               </w:tc>
@@ -3546,7 +3546,7 @@
                       <w:rFonts w:ascii="Calibri" w:hAnsi="Calibri"/>
                       <w:sz w:val="20"/>
                     </w:rPr>
-                    <w:t xml:space="default">n (%)</w:t>
+                    <w:t xml:space="default"/>
                   </w:r>
                 </w:p>
               </w:tc>
@@ -3570,7 +3570,7 @@
                       <w:rFonts w:ascii="Calibri" w:hAnsi="Calibri"/>
                       <w:sz w:val="20"/>
                     </w:rPr>
-                    <w:t xml:space="default">n (%)</w:t>
+                    <w:t xml:space="default"/>
                   </w:r>
                 </w:p>
               </w:tc>
@@ -3594,7 +3594,7 @@
                       <w:rFonts w:ascii="Calibri" w:hAnsi="Calibri"/>
                       <w:sz w:val="20"/>
                     </w:rPr>
-                    <w:t xml:space="default">n (%)</w:t>
+                    <w:t xml:space="default"/>
                   </w:r>
                 </w:p>
               </w:tc>
@@ -3618,7 +3618,7 @@
                       <w:rFonts w:ascii="Calibri" w:hAnsi="Calibri"/>
                       <w:sz w:val="20"/>
                     </w:rPr>
-                    <w:t xml:space="default">n (%)</w:t>
+                    <w:t xml:space="default"/>
                   </w:r>
                 </w:p>
               </w:tc>
@@ -3642,7 +3642,7 @@
                       <w:rFonts w:ascii="Calibri" w:hAnsi="Calibri"/>
                       <w:sz w:val="20"/>
                     </w:rPr>
-                    <w:t xml:space="default">n (%)</w:t>
+                    <w:t xml:space="default"/>
                   </w:r>
                 </w:p>
               </w:tc>
@@ -3666,7 +3666,7 @@
                       <w:rFonts w:ascii="Calibri" w:hAnsi="Calibri"/>
                       <w:sz w:val="20"/>
                     </w:rPr>
-                    <w:t xml:space="default">n (%)</w:t>
+                    <w:t xml:space="default"/>
                   </w:r>
                 </w:p>
               </w:tc>
@@ -3719,7 +3719,7 @@
                       <w:rFonts w:ascii="Calibri" w:hAnsi="Calibri"/>
                       <w:sz w:val="20"/>
                     </w:rPr>
-                    <w:t xml:space="default">n (%)</w:t>
+                    <w:t xml:space="default"/>
                   </w:r>
                 </w:p>
               </w:tc>
@@ -3743,7 +3743,7 @@
                       <w:rFonts w:ascii="Calibri" w:hAnsi="Calibri"/>
                       <w:sz w:val="20"/>
                     </w:rPr>
-                    <w:t xml:space="default">n (%)</w:t>
+                    <w:t xml:space="default"/>
                   </w:r>
                 </w:p>
               </w:tc>
@@ -3767,7 +3767,7 @@
                       <w:rFonts w:ascii="Calibri" w:hAnsi="Calibri"/>
                       <w:sz w:val="20"/>
                     </w:rPr>
-                    <w:t xml:space="default">n (%)</w:t>
+                    <w:t xml:space="default"/>
                   </w:r>
                 </w:p>
               </w:tc>
@@ -3791,7 +3791,7 @@
                       <w:rFonts w:ascii="Calibri" w:hAnsi="Calibri"/>
                       <w:sz w:val="20"/>
                     </w:rPr>
-                    <w:t xml:space="default">n (%)</w:t>
+                    <w:t xml:space="default"/>
                   </w:r>
                 </w:p>
               </w:tc>
@@ -3815,7 +3815,7 @@
                       <w:rFonts w:ascii="Calibri" w:hAnsi="Calibri"/>
                       <w:sz w:val="20"/>
                     </w:rPr>
-                    <w:t xml:space="default">n (%)</w:t>
+                    <w:t xml:space="default"/>
                   </w:r>
                 </w:p>
               </w:tc>
@@ -3839,7 +3839,7 @@
                       <w:rFonts w:ascii="Calibri" w:hAnsi="Calibri"/>
                       <w:sz w:val="20"/>
                     </w:rPr>
-                    <w:t xml:space="default">n (%)</w:t>
+                    <w:t xml:space="default"/>
                   </w:r>
                 </w:p>
               </w:tc>
@@ -3892,7 +3892,7 @@
                       <w:rFonts w:ascii="Calibri" w:hAnsi="Calibri"/>
                       <w:sz w:val="20"/>
                     </w:rPr>
-                    <w:t xml:space="default">n (%)</w:t>
+                    <w:t xml:space="default"/>
                   </w:r>
                 </w:p>
               </w:tc>
@@ -3916,7 +3916,7 @@
                       <w:rFonts w:ascii="Calibri" w:hAnsi="Calibri"/>
                       <w:sz w:val="20"/>
                     </w:rPr>
-                    <w:t xml:space="default">n (%)</w:t>
+                    <w:t xml:space="default"/>
                   </w:r>
                 </w:p>
               </w:tc>
@@ -3940,7 +3940,7 @@
                       <w:rFonts w:ascii="Calibri" w:hAnsi="Calibri"/>
                       <w:sz w:val="20"/>
                     </w:rPr>
-                    <w:t xml:space="default">n (%)</w:t>
+                    <w:t xml:space="default"/>
                   </w:r>
                 </w:p>
               </w:tc>
@@ -3964,7 +3964,7 @@
                       <w:rFonts w:ascii="Calibri" w:hAnsi="Calibri"/>
                       <w:sz w:val="20"/>
                     </w:rPr>
-                    <w:t xml:space="default">n (%)</w:t>
+                    <w:t xml:space="default"/>
                   </w:r>
                 </w:p>
               </w:tc>
@@ -3988,7 +3988,7 @@
                       <w:rFonts w:ascii="Calibri" w:hAnsi="Calibri"/>
                       <w:sz w:val="20"/>
                     </w:rPr>
-                    <w:t xml:space="default">n (%)</w:t>
+                    <w:t xml:space="default"/>
                   </w:r>
                 </w:p>
               </w:tc>
@@ -4012,7 +4012,7 @@
                       <w:rFonts w:ascii="Calibri" w:hAnsi="Calibri"/>
                       <w:sz w:val="20"/>
                     </w:rPr>
-                    <w:t xml:space="default">n (%)</w:t>
+                    <w:t xml:space="default"/>
                   </w:r>
                 </w:p>
               </w:tc>
@@ -4065,7 +4065,7 @@
                       <w:rFonts w:ascii="Calibri" w:hAnsi="Calibri"/>
                       <w:sz w:val="20"/>
                     </w:rPr>
-                    <w:t xml:space="default">n (%)</w:t>
+                    <w:t xml:space="default"/>
                   </w:r>
                 </w:p>
               </w:tc>
@@ -4089,7 +4089,7 @@
                       <w:rFonts w:ascii="Calibri" w:hAnsi="Calibri"/>
                       <w:sz w:val="20"/>
                     </w:rPr>
-                    <w:t xml:space="default">n (%)</w:t>
+                    <w:t xml:space="default"/>
                   </w:r>
                 </w:p>
               </w:tc>
@@ -4113,7 +4113,7 @@
                       <w:rFonts w:ascii="Calibri" w:hAnsi="Calibri"/>
                       <w:sz w:val="20"/>
                     </w:rPr>
-                    <w:t xml:space="default">n (%)</w:t>
+                    <w:t xml:space="default"/>
                   </w:r>
                 </w:p>
               </w:tc>
@@ -4137,7 +4137,7 @@
                       <w:rFonts w:ascii="Calibri" w:hAnsi="Calibri"/>
                       <w:sz w:val="20"/>
                     </w:rPr>
-                    <w:t xml:space="default">n (%)</w:t>
+                    <w:t xml:space="default"/>
                   </w:r>
                 </w:p>
               </w:tc>
@@ -4161,7 +4161,7 @@
                       <w:rFonts w:ascii="Calibri" w:hAnsi="Calibri"/>
                       <w:sz w:val="20"/>
                     </w:rPr>
-                    <w:t xml:space="default">n (%)</w:t>
+                    <w:t xml:space="default"/>
                   </w:r>
                 </w:p>
               </w:tc>
@@ -4185,7 +4185,7 @@
                       <w:rFonts w:ascii="Calibri" w:hAnsi="Calibri"/>
                       <w:sz w:val="20"/>
                     </w:rPr>
-                    <w:t xml:space="default">n (%)</w:t>
+                    <w:t xml:space="default"/>
                   </w:r>
                 </w:p>
               </w:tc>
@@ -4238,7 +4238,7 @@
                       <w:rFonts w:ascii="Calibri" w:hAnsi="Calibri"/>
                       <w:sz w:val="20"/>
                     </w:rPr>
-                    <w:t xml:space="default">n (%)</w:t>
+                    <w:t xml:space="default"/>
                   </w:r>
                 </w:p>
               </w:tc>
@@ -4262,7 +4262,7 @@
                       <w:rFonts w:ascii="Calibri" w:hAnsi="Calibri"/>
                       <w:sz w:val="20"/>
                     </w:rPr>
-                    <w:t xml:space="default">n (%)</w:t>
+                    <w:t xml:space="default"/>
                   </w:r>
                 </w:p>
               </w:tc>
@@ -4286,7 +4286,7 @@
                       <w:rFonts w:ascii="Calibri" w:hAnsi="Calibri"/>
                       <w:sz w:val="20"/>
                     </w:rPr>
-                    <w:t xml:space="default">n (%)</w:t>
+                    <w:t xml:space="default"/>
                   </w:r>
                 </w:p>
               </w:tc>
@@ -4310,7 +4310,7 @@
                       <w:rFonts w:ascii="Calibri" w:hAnsi="Calibri"/>
                       <w:sz w:val="20"/>
                     </w:rPr>
-                    <w:t xml:space="default">n (%)</w:t>
+                    <w:t xml:space="default"/>
                   </w:r>
                 </w:p>
               </w:tc>
@@ -4334,7 +4334,7 @@
                       <w:rFonts w:ascii="Calibri" w:hAnsi="Calibri"/>
                       <w:sz w:val="20"/>
                     </w:rPr>
-                    <w:t xml:space="default">n (%)</w:t>
+                    <w:t xml:space="default"/>
                   </w:r>
                 </w:p>
               </w:tc>
@@ -4358,7 +4358,7 @@
                       <w:rFonts w:ascii="Calibri" w:hAnsi="Calibri"/>
                       <w:sz w:val="20"/>
                     </w:rPr>
-                    <w:t xml:space="default">n (%)</w:t>
+                    <w:t xml:space="default"/>
                   </w:r>
                 </w:p>
               </w:tc>
@@ -4411,7 +4411,7 @@
                       <w:rFonts w:ascii="Calibri" w:hAnsi="Calibri"/>
                       <w:sz w:val="20"/>
                     </w:rPr>
-                    <w:t xml:space="default">n (%)</w:t>
+                    <w:t xml:space="default"/>
                   </w:r>
                 </w:p>
               </w:tc>
@@ -4435,7 +4435,7 @@
                       <w:rFonts w:ascii="Calibri" w:hAnsi="Calibri"/>
                       <w:sz w:val="20"/>
                     </w:rPr>
-                    <w:t xml:space="default">n (%)</w:t>
+                    <w:t xml:space="default"/>
                   </w:r>
                 </w:p>
               </w:tc>
@@ -4459,7 +4459,7 @@
                       <w:rFonts w:ascii="Calibri" w:hAnsi="Calibri"/>
                       <w:sz w:val="20"/>
                     </w:rPr>
-                    <w:t xml:space="default">n (%)</w:t>
+                    <w:t xml:space="default"/>
                   </w:r>
                 </w:p>
               </w:tc>
@@ -4483,7 +4483,7 @@
                       <w:rFonts w:ascii="Calibri" w:hAnsi="Calibri"/>
                       <w:sz w:val="20"/>
                     </w:rPr>
-                    <w:t xml:space="default">n (%)</w:t>
+                    <w:t xml:space="default"/>
                   </w:r>
                 </w:p>
               </w:tc>
@@ -4507,7 +4507,7 @@
                       <w:rFonts w:ascii="Calibri" w:hAnsi="Calibri"/>
                       <w:sz w:val="20"/>
                     </w:rPr>
-                    <w:t xml:space="default">n (%)</w:t>
+                    <w:t xml:space="default"/>
                   </w:r>
                 </w:p>
               </w:tc>
@@ -4531,7 +4531,7 @@
                       <w:rFonts w:ascii="Calibri" w:hAnsi="Calibri"/>
                       <w:sz w:val="20"/>
                     </w:rPr>
-                    <w:t xml:space="default">n (%)</w:t>
+                    <w:t xml:space="default"/>
                   </w:r>
                 </w:p>
               </w:tc>
@@ -4757,7 +4757,7 @@
                       <w:rFonts w:ascii="Calibri" w:hAnsi="Calibri"/>
                       <w:sz w:val="20"/>
                     </w:rPr>
-                    <w:t xml:space="default">n (%)</w:t>
+                    <w:t xml:space="default"/>
                   </w:r>
                 </w:p>
               </w:tc>
@@ -4781,7 +4781,7 @@
                       <w:rFonts w:ascii="Calibri" w:hAnsi="Calibri"/>
                       <w:sz w:val="20"/>
                     </w:rPr>
-                    <w:t xml:space="default">n (%)</w:t>
+                    <w:t xml:space="default"/>
                   </w:r>
                 </w:p>
               </w:tc>
@@ -4805,7 +4805,7 @@
                       <w:rFonts w:ascii="Calibri" w:hAnsi="Calibri"/>
                       <w:sz w:val="20"/>
                     </w:rPr>
-                    <w:t xml:space="default">n (%)</w:t>
+                    <w:t xml:space="default"/>
                   </w:r>
                 </w:p>
               </w:tc>
@@ -4829,7 +4829,7 @@
                       <w:rFonts w:ascii="Calibri" w:hAnsi="Calibri"/>
                       <w:sz w:val="20"/>
                     </w:rPr>
-                    <w:t xml:space="default">n (%)</w:t>
+                    <w:t xml:space="default"/>
                   </w:r>
                 </w:p>
               </w:tc>
@@ -4853,7 +4853,7 @@
                       <w:rFonts w:ascii="Calibri" w:hAnsi="Calibri"/>
                       <w:sz w:val="20"/>
                     </w:rPr>
-                    <w:t xml:space="default">n (%)</w:t>
+                    <w:t xml:space="default"/>
                   </w:r>
                 </w:p>
               </w:tc>
@@ -4877,7 +4877,7 @@
                       <w:rFonts w:ascii="Calibri" w:hAnsi="Calibri"/>
                       <w:sz w:val="20"/>
                     </w:rPr>
-                    <w:t xml:space="default">n (%)</w:t>
+                    <w:t xml:space="default"/>
                   </w:r>
                 </w:p>
               </w:tc>
@@ -4930,7 +4930,7 @@
                       <w:rFonts w:ascii="Calibri" w:hAnsi="Calibri"/>
                       <w:sz w:val="20"/>
                     </w:rPr>
-                    <w:t xml:space="default">n (%)</w:t>
+                    <w:t xml:space="default"/>
                   </w:r>
                 </w:p>
               </w:tc>
@@ -4954,7 +4954,7 @@
                       <w:rFonts w:ascii="Calibri" w:hAnsi="Calibri"/>
                       <w:sz w:val="20"/>
                     </w:rPr>
-                    <w:t xml:space="default">n (%)</w:t>
+                    <w:t xml:space="default"/>
                   </w:r>
                 </w:p>
               </w:tc>
@@ -4978,7 +4978,7 @@
                       <w:rFonts w:ascii="Calibri" w:hAnsi="Calibri"/>
                       <w:sz w:val="20"/>
                     </w:rPr>
-                    <w:t xml:space="default">n (%)</w:t>
+                    <w:t xml:space="default"/>
                   </w:r>
                 </w:p>
               </w:tc>
@@ -5002,7 +5002,7 @@
                       <w:rFonts w:ascii="Calibri" w:hAnsi="Calibri"/>
                       <w:sz w:val="20"/>
                     </w:rPr>
-                    <w:t xml:space="default">n (%)</w:t>
+                    <w:t xml:space="default"/>
                   </w:r>
                 </w:p>
               </w:tc>
@@ -5026,7 +5026,7 @@
                       <w:rFonts w:ascii="Calibri" w:hAnsi="Calibri"/>
                       <w:sz w:val="20"/>
                     </w:rPr>
-                    <w:t xml:space="default">n (%)</w:t>
+                    <w:t xml:space="default"/>
                   </w:r>
                 </w:p>
               </w:tc>
@@ -5050,7 +5050,7 @@
                       <w:rFonts w:ascii="Calibri" w:hAnsi="Calibri"/>
                       <w:sz w:val="20"/>
                     </w:rPr>
-                    <w:t xml:space="default">n (%)</w:t>
+                    <w:t xml:space="default"/>
                   </w:r>
                 </w:p>
               </w:tc>
@@ -5103,7 +5103,7 @@
                       <w:rFonts w:ascii="Calibri" w:hAnsi="Calibri"/>
                       <w:sz w:val="20"/>
                     </w:rPr>
-                    <w:t xml:space="default">n (%)</w:t>
+                    <w:t xml:space="default"/>
                   </w:r>
                 </w:p>
               </w:tc>
@@ -5127,7 +5127,7 @@
                       <w:rFonts w:ascii="Calibri" w:hAnsi="Calibri"/>
                       <w:sz w:val="20"/>
                     </w:rPr>
-                    <w:t xml:space="default">n (%)</w:t>
+                    <w:t xml:space="default"/>
                   </w:r>
                 </w:p>
               </w:tc>
@@ -5151,7 +5151,7 @@
                       <w:rFonts w:ascii="Calibri" w:hAnsi="Calibri"/>
                       <w:sz w:val="20"/>
                     </w:rPr>
-                    <w:t xml:space="default">n (%)</w:t>
+                    <w:t xml:space="default"/>
                   </w:r>
                 </w:p>
               </w:tc>
@@ -5175,7 +5175,7 @@
                       <w:rFonts w:ascii="Calibri" w:hAnsi="Calibri"/>
                       <w:sz w:val="20"/>
                     </w:rPr>
-                    <w:t xml:space="default">n (%)</w:t>
+                    <w:t xml:space="default"/>
                   </w:r>
                 </w:p>
               </w:tc>
@@ -5199,7 +5199,7 @@
                       <w:rFonts w:ascii="Calibri" w:hAnsi="Calibri"/>
                       <w:sz w:val="20"/>
                     </w:rPr>
-                    <w:t xml:space="default">n (%)</w:t>
+                    <w:t xml:space="default"/>
                   </w:r>
                 </w:p>
               </w:tc>
@@ -5223,7 +5223,7 @@
                       <w:rFonts w:ascii="Calibri" w:hAnsi="Calibri"/>
                       <w:sz w:val="20"/>
                     </w:rPr>
-                    <w:t xml:space="default">n (%)</w:t>
+                    <w:t xml:space="default"/>
                   </w:r>
                 </w:p>
               </w:tc>
@@ -5276,7 +5276,7 @@
                       <w:rFonts w:ascii="Calibri" w:hAnsi="Calibri"/>
                       <w:sz w:val="20"/>
                     </w:rPr>
-                    <w:t xml:space="default">n (%)</w:t>
+                    <w:t xml:space="default"/>
                   </w:r>
                 </w:p>
               </w:tc>
@@ -5300,7 +5300,7 @@
                       <w:rFonts w:ascii="Calibri" w:hAnsi="Calibri"/>
                       <w:sz w:val="20"/>
                     </w:rPr>
-                    <w:t xml:space="default">n (%)</w:t>
+                    <w:t xml:space="default"/>
                   </w:r>
                 </w:p>
               </w:tc>
@@ -5324,7 +5324,7 @@
                       <w:rFonts w:ascii="Calibri" w:hAnsi="Calibri"/>
                       <w:sz w:val="20"/>
                     </w:rPr>
-                    <w:t xml:space="default">n (%)</w:t>
+                    <w:t xml:space="default"/>
                   </w:r>
                 </w:p>
               </w:tc>
@@ -5348,7 +5348,7 @@
                       <w:rFonts w:ascii="Calibri" w:hAnsi="Calibri"/>
                       <w:sz w:val="20"/>
                     </w:rPr>
-                    <w:t xml:space="default">n (%)</w:t>
+                    <w:t xml:space="default"/>
                   </w:r>
                 </w:p>
               </w:tc>
@@ -5372,7 +5372,7 @@
                       <w:rFonts w:ascii="Calibri" w:hAnsi="Calibri"/>
                       <w:sz w:val="20"/>
                     </w:rPr>
-                    <w:t xml:space="default">n (%)</w:t>
+                    <w:t xml:space="default"/>
                   </w:r>
                 </w:p>
               </w:tc>
@@ -5396,7 +5396,7 @@
                       <w:rFonts w:ascii="Calibri" w:hAnsi="Calibri"/>
                       <w:sz w:val="20"/>
                     </w:rPr>
-                    <w:t xml:space="default">n (%)</w:t>
+                    <w:t xml:space="default"/>
                   </w:r>
                 </w:p>
               </w:tc>
@@ -5449,7 +5449,7 @@
                       <w:rFonts w:ascii="Calibri" w:hAnsi="Calibri"/>
                       <w:sz w:val="20"/>
                     </w:rPr>
-                    <w:t xml:space="default">n (%)</w:t>
+                    <w:t xml:space="default"/>
                   </w:r>
                 </w:p>
               </w:tc>
@@ -5473,7 +5473,7 @@
                       <w:rFonts w:ascii="Calibri" w:hAnsi="Calibri"/>
                       <w:sz w:val="20"/>
                     </w:rPr>
-                    <w:t xml:space="default">n (%)</w:t>
+                    <w:t xml:space="default"/>
                   </w:r>
                 </w:p>
               </w:tc>
@@ -5497,7 +5497,7 @@
                       <w:rFonts w:ascii="Calibri" w:hAnsi="Calibri"/>
                       <w:sz w:val="20"/>
                     </w:rPr>
-                    <w:t xml:space="default">n (%)</w:t>
+                    <w:t xml:space="default"/>
                   </w:r>
                 </w:p>
               </w:tc>
@@ -5521,7 +5521,7 @@
                       <w:rFonts w:ascii="Calibri" w:hAnsi="Calibri"/>
                       <w:sz w:val="20"/>
                     </w:rPr>
-                    <w:t xml:space="default">n (%)</w:t>
+                    <w:t xml:space="default"/>
                   </w:r>
                 </w:p>
               </w:tc>
@@ -5545,7 +5545,7 @@
                       <w:rFonts w:ascii="Calibri" w:hAnsi="Calibri"/>
                       <w:sz w:val="20"/>
                     </w:rPr>
-                    <w:t xml:space="default">n (%)</w:t>
+                    <w:t xml:space="default"/>
                   </w:r>
                 </w:p>
               </w:tc>
@@ -5569,7 +5569,7 @@
                       <w:rFonts w:ascii="Calibri" w:hAnsi="Calibri"/>
                       <w:sz w:val="20"/>
                     </w:rPr>
-                    <w:t xml:space="default">n (%)</w:t>
+                    <w:t xml:space="default"/>
                   </w:r>
                 </w:p>
               </w:tc>
@@ -5795,7 +5795,7 @@
                       <w:rFonts w:ascii="Calibri" w:hAnsi="Calibri"/>
                       <w:sz w:val="20"/>
                     </w:rPr>
-                    <w:t xml:space="default">n (%)</w:t>
+                    <w:t xml:space="default"/>
                   </w:r>
                 </w:p>
               </w:tc>
@@ -5819,7 +5819,7 @@
                       <w:rFonts w:ascii="Calibri" w:hAnsi="Calibri"/>
                       <w:sz w:val="20"/>
                     </w:rPr>
-                    <w:t xml:space="default">n (%)</w:t>
+                    <w:t xml:space="default"/>
                   </w:r>
                 </w:p>
               </w:tc>
@@ -5843,7 +5843,7 @@
                       <w:rFonts w:ascii="Calibri" w:hAnsi="Calibri"/>
                       <w:sz w:val="20"/>
                     </w:rPr>
-                    <w:t xml:space="default">n (%)</w:t>
+                    <w:t xml:space="default"/>
                   </w:r>
                 </w:p>
               </w:tc>
@@ -5867,7 +5867,7 @@
                       <w:rFonts w:ascii="Calibri" w:hAnsi="Calibri"/>
                       <w:sz w:val="20"/>
                     </w:rPr>
-                    <w:t xml:space="default">n (%)</w:t>
+                    <w:t xml:space="default"/>
                   </w:r>
                 </w:p>
               </w:tc>
@@ -5891,7 +5891,7 @@
                       <w:rFonts w:ascii="Calibri" w:hAnsi="Calibri"/>
                       <w:sz w:val="20"/>
                     </w:rPr>
-                    <w:t xml:space="default">n (%)</w:t>
+                    <w:t xml:space="default"/>
                   </w:r>
                 </w:p>
               </w:tc>
@@ -5915,7 +5915,7 @@
                       <w:rFonts w:ascii="Calibri" w:hAnsi="Calibri"/>
                       <w:sz w:val="20"/>
                     </w:rPr>
-                    <w:t xml:space="default">n (%)</w:t>
+                    <w:t xml:space="default"/>
                   </w:r>
                 </w:p>
               </w:tc>
@@ -5968,7 +5968,7 @@
                       <w:rFonts w:ascii="Calibri" w:hAnsi="Calibri"/>
                       <w:sz w:val="20"/>
                     </w:rPr>
-                    <w:t xml:space="default">n (%)</w:t>
+                    <w:t xml:space="default"/>
                   </w:r>
                 </w:p>
               </w:tc>
@@ -5992,7 +5992,7 @@
                       <w:rFonts w:ascii="Calibri" w:hAnsi="Calibri"/>
                       <w:sz w:val="20"/>
                     </w:rPr>
-                    <w:t xml:space="default">n (%)</w:t>
+                    <w:t xml:space="default"/>
                   </w:r>
                 </w:p>
               </w:tc>
@@ -6016,7 +6016,7 @@
                       <w:rFonts w:ascii="Calibri" w:hAnsi="Calibri"/>
                       <w:sz w:val="20"/>
                     </w:rPr>
-                    <w:t xml:space="default">n (%)</w:t>
+                    <w:t xml:space="default"/>
                   </w:r>
                 </w:p>
               </w:tc>
@@ -6040,7 +6040,7 @@
                       <w:rFonts w:ascii="Calibri" w:hAnsi="Calibri"/>
                       <w:sz w:val="20"/>
                     </w:rPr>
-                    <w:t xml:space="default">n (%)</w:t>
+                    <w:t xml:space="default"/>
                   </w:r>
                 </w:p>
               </w:tc>
@@ -6064,7 +6064,7 @@
                       <w:rFonts w:ascii="Calibri" w:hAnsi="Calibri"/>
                       <w:sz w:val="20"/>
                     </w:rPr>
-                    <w:t xml:space="default">n (%)</w:t>
+                    <w:t xml:space="default"/>
                   </w:r>
                 </w:p>
               </w:tc>
@@ -6088,7 +6088,7 @@
                       <w:rFonts w:ascii="Calibri" w:hAnsi="Calibri"/>
                       <w:sz w:val="20"/>
                     </w:rPr>
-                    <w:t xml:space="default">n (%)</w:t>
+                    <w:t xml:space="default"/>
                   </w:r>
                 </w:p>
               </w:tc>
@@ -6141,7 +6141,7 @@
                       <w:rFonts w:ascii="Calibri" w:hAnsi="Calibri"/>
                       <w:sz w:val="20"/>
                     </w:rPr>
-                    <w:t xml:space="default">n (%)</w:t>
+                    <w:t xml:space="default"/>
                   </w:r>
                 </w:p>
               </w:tc>
@@ -6165,7 +6165,7 @@
                       <w:rFonts w:ascii="Calibri" w:hAnsi="Calibri"/>
                       <w:sz w:val="20"/>
                     </w:rPr>
-                    <w:t xml:space="default">n (%)</w:t>
+                    <w:t xml:space="default"/>
                   </w:r>
                 </w:p>
               </w:tc>
@@ -6189,7 +6189,7 @@
                       <w:rFonts w:ascii="Calibri" w:hAnsi="Calibri"/>
                       <w:sz w:val="20"/>
                     </w:rPr>
-                    <w:t xml:space="default">n (%)</w:t>
+                    <w:t xml:space="default"/>
                   </w:r>
                 </w:p>
               </w:tc>
@@ -6213,7 +6213,7 @@
                       <w:rFonts w:ascii="Calibri" w:hAnsi="Calibri"/>
                       <w:sz w:val="20"/>
                     </w:rPr>
-                    <w:t xml:space="default">n (%)</w:t>
+                    <w:t xml:space="default"/>
                   </w:r>
                 </w:p>
               </w:tc>
@@ -6237,7 +6237,7 @@
                       <w:rFonts w:ascii="Calibri" w:hAnsi="Calibri"/>
                       <w:sz w:val="20"/>
                     </w:rPr>
-                    <w:t xml:space="default">n (%)</w:t>
+                    <w:t xml:space="default"/>
                   </w:r>
                 </w:p>
               </w:tc>
@@ -6261,7 +6261,7 @@
                       <w:rFonts w:ascii="Calibri" w:hAnsi="Calibri"/>
                       <w:sz w:val="20"/>
                     </w:rPr>
-                    <w:t xml:space="default">n (%)</w:t>
+                    <w:t xml:space="default"/>
                   </w:r>
                 </w:p>
               </w:tc>

</xml_diff>

<commit_message>
Add main table of patient characteristics
</commit_message>
<xml_diff>
--- a/statistical-analysis-plan/statistical-analysis-plan.docx
+++ b/statistical-analysis-plan/statistical-analysis-plan.docx
@@ -1192,7 +1192,7 @@
     </w:p>
     <w:bookmarkEnd w:id="48"/>
     <w:bookmarkEnd w:id="49"/>
-    <w:bookmarkStart w:id="123" w:name="statistical-analysis"/>
+    <w:bookmarkStart w:id="124" w:name="statistical-analysis"/>
     <w:p>
       <w:pPr>
         <w:pStyle w:val="Heading1"/>
@@ -2317,7 +2317,7 @@
       </w:tr>
     </w:tbl>
     <w:bookmarkEnd w:id="81"/>
-    <w:bookmarkStart w:id="85" w:name="baseline-analyses"/>
+    <w:bookmarkStart w:id="86" w:name="baseline-analyses"/>
     <w:p>
       <w:pPr>
         <w:pStyle w:val="Heading2"/>
@@ -6272,7 +6272,7 @@
       </w:tr>
     </w:tbl>
     <w:bookmarkEnd w:id="83"/>
-    <w:bookmarkStart w:id="84" w:name="patient-characteristics"/>
+    <w:bookmarkStart w:id="85" w:name="patient-characteristics"/>
     <w:p>
       <w:pPr>
         <w:pStyle w:val="Heading3"/>
@@ -6286,12 +6286,3675 @@
         <w:pStyle w:val="FirstParagraph"/>
       </w:pPr>
       <w:r>
-        <w:t xml:space="preserve">We will describe patient characteristics at baseline, meaning all pre-training periods, per treatment group and overall using frequencies and percentages for discrete variables and means, standard deviations, medians and interquartile ranges (Q1-Q3) for continuous variables. We will not adjust for clustering when presenting baseline characteristics.</w:t>
-      </w:r>
-    </w:p>
-    <w:bookmarkEnd w:id="84"/>
+        <w:t xml:space="preserve">We will describe patient characteristics stratified by before and after ATLS training and overall, using frequencies and percentages for discrete variables and medians and interquartile ranges (Q1-Q3) for continuous variables. Missing values will be reported for each characteristic. We will not adjust for clustering when presenting baseline characteristics. See</w:t>
+      </w:r>
+      <w:r>
+        <w:t xml:space="preserve"> </w:t>
+      </w:r>
+      <w:hyperlink w:anchor="tbl-patient-characteristics">
+        <w:r>
+          <w:rPr>
+            <w:rStyle w:val="Hyperlink"/>
+          </w:rPr>
+          <w:t xml:space="preserve">Table 3</w:t>
+        </w:r>
+      </w:hyperlink>
+      <w:r>
+        <w:t xml:space="preserve"> </w:t>
+      </w:r>
+      <w:r>
+        <w:t xml:space="preserve">for details.</w:t>
+      </w:r>
+    </w:p>
+    <w:tbl>
+      <w:tblPr>
+        <w:tblStyle w:val="Table"/>
+        <w:tblW w:type="pct" w:w="5000"/>
+        <w:tblLayout w:type="fixed"/>
+        <w:tblLook w:firstRow="0" w:lastRow="0" w:firstColumn="0" w:lastColumn="0" w:noHBand="0" w:noVBand="0" w:val="0000"/>
+      </w:tblPr>
+      <w:tblGrid>
+        <w:gridCol w:w="7920"/>
+      </w:tblGrid>
+      <w:tr>
+        <w:tc>
+          <w:tcPr/>
+          <w:bookmarkStart w:id="84" w:name="tbl-patient-characteristics"/>
+          <w:p>
+            <w:pPr>
+              <w:jc w:val="center"/>
+            </w:pPr>
+            <w:pPr>
+              <w:jc w:val="left"/>
+              <w:spacing w:before="200"/>
+              <w:pStyle w:val="ImageCaption"/>
+            </w:pPr>
+            <w:r>
+              <w:t xml:space="preserve">Table 3: Patient characteristics</w:t>
+            </w:r>
+          </w:p>
+          <w:tbl xmlns:w="http://schemas.openxmlformats.org/wordprocessingml/2006/main" xmlns:wp="http://schemas.openxmlformats.org/drawingml/2006/wordprocessingDrawing" xmlns:r="http://schemas.openxmlformats.org/officeDocument/2006/relationships" xmlns:w14="http://schemas.microsoft.com/office/word/2010/wordml">
+            <w:tblPr>
+              <w:tblCellMar>
+                <w:top w:w="0" w:type="dxa"/>
+                <w:bottom w:w="0" w:type="dxa"/>
+                <w:start w:w="60" w:type="dxa"/>
+                <w:end w:w="60" w:type="dxa"/>
+              </w:tblCellMar>
+              <w:tblW w:type="auto" w:w="0"/>
+              <w:tblLook w:firstRow="0" w:lastRow="0" w:firstColumn="0" w:lastColumn="0" w:noHBand="0" w:noVBand="0"/>
+              <w:jc w:val="center"/>
+            </w:tblPr>
+            <w:tr>
+              <w:trPr>
+                <w:cantSplit/>
+                <w:tblHeader/>
+              </w:trPr>
+              <w:tc>
+                <w:tcPr>
+                  <w:tcBorders>
+                    <w:top w:val="single" w:sz="16" w:space="0" w:color="D3D3D3"/>
+                    <w:start w:val="single" w:space="0" w:color="D3D3D3"/>
+                  </w:tcBorders>
+                </w:tcPr>
+                <w:p>
+                  <w:pPr>
+                    <w:spacing w:before="0" w:after="60"/>
+                    <w:keepNext/>
+                  </w:pPr>
+                  <w:r>
+                    <w:rPr>
+                      <w:rFonts w:ascii="Calibri" w:hAnsi="Calibri"/>
+                      <w:sz w:val="20"/>
+                    </w:rPr>
+                    <w:t xml:space="default"/>
+                  </w:r>
+                </w:p>
+              </w:tc>
+              <w:tc>
+                <w:tcPr>
+                  <w:tcBorders>
+                    <w:top w:val="single" w:sz="16" w:space="0" w:color="D3D3D3"/>
+                    <w:bottom w:val="single" w:sz="16" w:space="0" w:color="D3D3D3"/>
+                  </w:tcBorders>
+                  <w:gridSpan w:val="2"/>
+                </w:tcPr>
+                <w:p>
+                  <w:pPr>
+                    <w:spacing w:before="0" w:after="60"/>
+                    <w:keepNext/>
+                    <w:jc w:val="center"/>
+                  </w:pPr>
+                  <w:r>
+                    <w:rPr>
+                      <w:b w:val="true"/>
+                      <w:rFonts w:ascii="Calibri" w:hAnsi="Calibri"/>
+                      <w:sz w:val="20"/>
+                    </w:rPr>
+                    <w:t xml:space="preserve">ATLS training</w:t>
+                  </w:r>
+                </w:p>
+              </w:tc>
+              <w:tc>
+                <w:tcPr>
+                  <w:tcBorders>
+                    <w:top w:val="single" w:sz="16" w:space="0" w:color="D3D3D3"/>
+                    <w:end w:val="single" w:space="0" w:color="D3D3D3"/>
+                  </w:tcBorders>
+                </w:tcPr>
+                <w:p>
+                  <w:pPr>
+                    <w:spacing w:before="0" w:after="60"/>
+                    <w:keepNext/>
+                  </w:pPr>
+                  <w:r>
+                    <w:rPr>
+                      <w:rFonts w:ascii="Calibri" w:hAnsi="Calibri"/>
+                      <w:sz w:val="20"/>
+                    </w:rPr>
+                    <w:t xml:space="default"/>
+                  </w:r>
+                </w:p>
+              </w:tc>
+            </w:tr>
+            <w:tr>
+              <w:trPr>
+                <w:cantSplit/>
+                <w:tblHeader/>
+              </w:trPr>
+              <w:tc>
+                <w:tcPr>
+                  <w:tcBorders>
+                    <w:bottom w:val="single" w:sz="16" w:space="0" w:color="D3D3D3"/>
+                    <w:start w:val="single" w:space="0" w:color="D3D3D3"/>
+                  </w:tcBorders>
+                </w:tcPr>
+                <w:p>
+                  <w:pPr>
+                    <w:spacing w:before="0" w:after="60"/>
+                    <w:keepNext/>
+                    <w:jc w:val="start"/>
+                  </w:pPr>
+                  <w:r>
+                    <w:rPr>
+                      <w:b w:val="true"/>
+                      <w:rFonts w:ascii="Calibri" w:hAnsi="Calibri"/>
+                      <w:sz w:val="20"/>
+                    </w:rPr>
+                    <w:t xml:space="preserve">Characteristic</w:t>
+                  </w:r>
+                </w:p>
+              </w:tc>
+              <w:tc>
+                <w:tcPr>
+                  <w:tcBorders>
+                    <w:bottom w:val="single" w:sz="16" w:space="0" w:color="D3D3D3"/>
+                  </w:tcBorders>
+                </w:tcPr>
+                <w:p>
+                  <w:pPr>
+                    <w:spacing w:before="0" w:after="60"/>
+                    <w:keepNext/>
+                    <w:jc w:val="center"/>
+                  </w:pPr>
+                  <w:r>
+                    <w:rPr>
+                      <w:b w:val="true"/>
+                      <w:rFonts w:ascii="Calibri" w:hAnsi="Calibri"/>
+                      <w:sz w:val="20"/>
+                    </w:rPr>
+                    <w:t xml:space="preserve">Before ATLS</w:t>
+                  </w:r>
+                </w:p>
+              </w:tc>
+              <w:tc>
+                <w:tcPr>
+                  <w:tcBorders>
+                    <w:bottom w:val="single" w:sz="16" w:space="0" w:color="D3D3D3"/>
+                  </w:tcBorders>
+                </w:tcPr>
+                <w:p>
+                  <w:pPr>
+                    <w:spacing w:before="0" w:after="60"/>
+                    <w:keepNext/>
+                    <w:jc w:val="center"/>
+                  </w:pPr>
+                  <w:r>
+                    <w:rPr>
+                      <w:b w:val="true"/>
+                      <w:rFonts w:ascii="Calibri" w:hAnsi="Calibri"/>
+                      <w:sz w:val="20"/>
+                    </w:rPr>
+                    <w:t xml:space="preserve">After ATLS</w:t>
+                  </w:r>
+                </w:p>
+              </w:tc>
+              <w:tc>
+                <w:tcPr>
+                  <w:tcBorders>
+                    <w:bottom w:val="single" w:sz="16" w:space="0" w:color="D3D3D3"/>
+                    <w:end w:val="single" w:space="0" w:color="D3D3D3"/>
+                  </w:tcBorders>
+                </w:tcPr>
+                <w:p>
+                  <w:pPr>
+                    <w:spacing w:before="0" w:after="60"/>
+                    <w:keepNext/>
+                    <w:jc w:val="center"/>
+                  </w:pPr>
+                  <w:r>
+                    <w:rPr>
+                      <w:b w:val="true"/>
+                      <w:rFonts w:ascii="Calibri" w:hAnsi="Calibri"/>
+                      <w:sz w:val="20"/>
+                    </w:rPr>
+                    <w:t xml:space="preserve">Overall</w:t>
+                  </w:r>
+                </w:p>
+              </w:tc>
+            </w:tr>
+            <w:tr>
+              <w:trPr>
+                <w:cantSplit/>
+              </w:trPr>
+              <w:tc>
+                <w:tcPr>
+                  <w:tcBorders>
+                    <w:top w:val="single" w:space="0" w:color="D3D3D3"/>
+                    <w:bottom w:val="single" w:space="0" w:color="D3D3D3"/>
+                    <w:start w:val="single" w:space="0" w:color="D3D3D3"/>
+                    <w:end w:val="single" w:space="0" w:color="D3D3D3"/>
+                  </w:tcBorders>
+                </w:tcPr>
+                <w:p>
+                  <w:pPr>
+                    <w:spacing w:before="0" w:after="60"/>
+                    <w:keepNext/>
+                    <w:jc w:val="start"/>
+                  </w:pPr>
+                  <w:r>
+                    <w:rPr>
+                      <w:rFonts w:ascii="Calibri" w:hAnsi="Calibri"/>
+                      <w:sz w:val="20"/>
+                    </w:rPr>
+                    <w:t xml:space="default">Age (years), Median (Q1, Q3)</w:t>
+                  </w:r>
+                </w:p>
+              </w:tc>
+              <w:tc>
+                <w:tcPr>
+                  <w:tcBorders>
+                    <w:top w:val="single" w:space="0" w:color="D3D3D3"/>
+                    <w:bottom w:val="single" w:space="0" w:color="D3D3D3"/>
+                    <w:start w:val="single" w:space="0" w:color="D3D3D3"/>
+                    <w:end w:val="single" w:space="0" w:color="D3D3D3"/>
+                  </w:tcBorders>
+                </w:tcPr>
+                <w:p>
+                  <w:pPr>
+                    <w:spacing w:before="0" w:after="60"/>
+                    <w:keepNext/>
+                    <w:jc w:val="center"/>
+                  </w:pPr>
+                  <w:r>
+                    <w:rPr>
+                      <w:rFonts w:ascii="Calibri" w:hAnsi="Calibri"/>
+                      <w:sz w:val="20"/>
+                    </w:rPr>
+                    <w:t xml:space="default"/>
+                  </w:r>
+                </w:p>
+              </w:tc>
+              <w:tc>
+                <w:tcPr>
+                  <w:tcBorders>
+                    <w:top w:val="single" w:space="0" w:color="D3D3D3"/>
+                    <w:bottom w:val="single" w:space="0" w:color="D3D3D3"/>
+                    <w:start w:val="single" w:space="0" w:color="D3D3D3"/>
+                    <w:end w:val="single" w:space="0" w:color="D3D3D3"/>
+                  </w:tcBorders>
+                </w:tcPr>
+                <w:p>
+                  <w:pPr>
+                    <w:spacing w:before="0" w:after="60"/>
+                    <w:keepNext/>
+                    <w:jc w:val="center"/>
+                  </w:pPr>
+                  <w:r>
+                    <w:rPr>
+                      <w:rFonts w:ascii="Calibri" w:hAnsi="Calibri"/>
+                      <w:sz w:val="20"/>
+                    </w:rPr>
+                    <w:t xml:space="default"/>
+                  </w:r>
+                </w:p>
+              </w:tc>
+              <w:tc>
+                <w:tcPr>
+                  <w:tcBorders>
+                    <w:top w:val="single" w:space="0" w:color="D3D3D3"/>
+                    <w:bottom w:val="single" w:space="0" w:color="D3D3D3"/>
+                    <w:start w:val="single" w:space="0" w:color="D3D3D3"/>
+                    <w:end w:val="single" w:space="0" w:color="D3D3D3"/>
+                  </w:tcBorders>
+                </w:tcPr>
+                <w:p>
+                  <w:pPr>
+                    <w:spacing w:before="0" w:after="60"/>
+                    <w:keepNext/>
+                    <w:jc w:val="center"/>
+                  </w:pPr>
+                  <w:r>
+                    <w:rPr>
+                      <w:rFonts w:ascii="Calibri" w:hAnsi="Calibri"/>
+                      <w:sz w:val="20"/>
+                    </w:rPr>
+                    <w:t xml:space="default"/>
+                  </w:r>
+                </w:p>
+              </w:tc>
+            </w:tr>
+            <w:tr>
+              <w:trPr>
+                <w:cantSplit/>
+              </w:trPr>
+              <w:tc>
+                <w:tcPr>
+                  <w:tcBorders>
+                    <w:top w:val="single" w:space="0" w:color="D3D3D3"/>
+                    <w:bottom w:val="single" w:space="0" w:color="D3D3D3"/>
+                    <w:start w:val="single" w:space="0" w:color="D3D3D3"/>
+                    <w:end w:val="single" w:space="0" w:color="D3D3D3"/>
+                  </w:tcBorders>
+                </w:tcPr>
+                <w:p>
+                  <w:pPr>
+                    <w:spacing w:before="0" w:after="60"/>
+                    <w:keepNext/>
+                    <w:jc w:val="start"/>
+                  </w:pPr>
+                  <w:r>
+                    <w:rPr>
+                      <w:rFonts w:ascii="Calibri" w:hAnsi="Calibri"/>
+                      <w:sz w:val="20"/>
+                    </w:rPr>
+                    <w:t xml:space="default">    Missing</w:t>
+                  </w:r>
+                </w:p>
+              </w:tc>
+              <w:tc>
+                <w:tcPr>
+                  <w:tcBorders>
+                    <w:top w:val="single" w:space="0" w:color="D3D3D3"/>
+                    <w:bottom w:val="single" w:space="0" w:color="D3D3D3"/>
+                    <w:start w:val="single" w:space="0" w:color="D3D3D3"/>
+                    <w:end w:val="single" w:space="0" w:color="D3D3D3"/>
+                  </w:tcBorders>
+                </w:tcPr>
+                <w:p>
+                  <w:pPr>
+                    <w:spacing w:before="0" w:after="60"/>
+                    <w:keepNext/>
+                    <w:jc w:val="center"/>
+                  </w:pPr>
+                  <w:r>
+                    <w:rPr>
+                      <w:rFonts w:ascii="Calibri" w:hAnsi="Calibri"/>
+                      <w:sz w:val="20"/>
+                    </w:rPr>
+                    <w:t xml:space="default"/>
+                  </w:r>
+                </w:p>
+              </w:tc>
+              <w:tc>
+                <w:tcPr>
+                  <w:tcBorders>
+                    <w:top w:val="single" w:space="0" w:color="D3D3D3"/>
+                    <w:bottom w:val="single" w:space="0" w:color="D3D3D3"/>
+                    <w:start w:val="single" w:space="0" w:color="D3D3D3"/>
+                    <w:end w:val="single" w:space="0" w:color="D3D3D3"/>
+                  </w:tcBorders>
+                </w:tcPr>
+                <w:p>
+                  <w:pPr>
+                    <w:spacing w:before="0" w:after="60"/>
+                    <w:keepNext/>
+                    <w:jc w:val="center"/>
+                  </w:pPr>
+                  <w:r>
+                    <w:rPr>
+                      <w:rFonts w:ascii="Calibri" w:hAnsi="Calibri"/>
+                      <w:sz w:val="20"/>
+                    </w:rPr>
+                    <w:t xml:space="default"/>
+                  </w:r>
+                </w:p>
+              </w:tc>
+              <w:tc>
+                <w:tcPr>
+                  <w:tcBorders>
+                    <w:top w:val="single" w:space="0" w:color="D3D3D3"/>
+                    <w:bottom w:val="single" w:space="0" w:color="D3D3D3"/>
+                    <w:start w:val="single" w:space="0" w:color="D3D3D3"/>
+                    <w:end w:val="single" w:space="0" w:color="D3D3D3"/>
+                  </w:tcBorders>
+                </w:tcPr>
+                <w:p>
+                  <w:pPr>
+                    <w:spacing w:before="0" w:after="60"/>
+                    <w:keepNext/>
+                    <w:jc w:val="center"/>
+                  </w:pPr>
+                  <w:r>
+                    <w:rPr>
+                      <w:rFonts w:ascii="Calibri" w:hAnsi="Calibri"/>
+                      <w:sz w:val="20"/>
+                    </w:rPr>
+                    <w:t xml:space="default"/>
+                  </w:r>
+                </w:p>
+              </w:tc>
+            </w:tr>
+            <w:tr>
+              <w:trPr>
+                <w:cantSplit/>
+              </w:trPr>
+              <w:tc>
+                <w:tcPr>
+                  <w:tcBorders>
+                    <w:top w:val="single" w:space="0" w:color="D3D3D3"/>
+                    <w:bottom w:val="single" w:space="0" w:color="D3D3D3"/>
+                    <w:start w:val="single" w:space="0" w:color="D3D3D3"/>
+                    <w:end w:val="single" w:space="0" w:color="D3D3D3"/>
+                  </w:tcBorders>
+                </w:tcPr>
+                <w:p>
+                  <w:pPr>
+                    <w:spacing w:before="0" w:after="60"/>
+                    <w:keepNext/>
+                    <w:jc w:val="start"/>
+                  </w:pPr>
+                  <w:r>
+                    <w:rPr>
+                      <w:rFonts w:ascii="Calibri" w:hAnsi="Calibri"/>
+                      <w:sz w:val="20"/>
+                    </w:rPr>
+                    <w:t xml:space="default">Sex, n (%)</w:t>
+                  </w:r>
+                </w:p>
+              </w:tc>
+              <w:tc>
+                <w:tcPr>
+                  <w:tcBorders>
+                    <w:top w:val="single" w:space="0" w:color="D3D3D3"/>
+                    <w:bottom w:val="single" w:space="0" w:color="D3D3D3"/>
+                    <w:start w:val="single" w:space="0" w:color="D3D3D3"/>
+                    <w:end w:val="single" w:space="0" w:color="D3D3D3"/>
+                  </w:tcBorders>
+                </w:tcPr>
+                <w:p>
+                  <w:pPr>
+                    <w:spacing w:before="0" w:after="60"/>
+                    <w:keepNext/>
+                    <w:jc w:val="center"/>
+                  </w:pPr>
+                  <w:r>
+                    <w:rPr>
+                      <w:rFonts w:ascii="Calibri" w:hAnsi="Calibri"/>
+                      <w:sz w:val="20"/>
+                    </w:rPr>
+                    <w:t xml:space="default"/>
+                  </w:r>
+                </w:p>
+              </w:tc>
+              <w:tc>
+                <w:tcPr>
+                  <w:tcBorders>
+                    <w:top w:val="single" w:space="0" w:color="D3D3D3"/>
+                    <w:bottom w:val="single" w:space="0" w:color="D3D3D3"/>
+                    <w:start w:val="single" w:space="0" w:color="D3D3D3"/>
+                    <w:end w:val="single" w:space="0" w:color="D3D3D3"/>
+                  </w:tcBorders>
+                </w:tcPr>
+                <w:p>
+                  <w:pPr>
+                    <w:spacing w:before="0" w:after="60"/>
+                    <w:keepNext/>
+                    <w:jc w:val="center"/>
+                  </w:pPr>
+                  <w:r>
+                    <w:rPr>
+                      <w:rFonts w:ascii="Calibri" w:hAnsi="Calibri"/>
+                      <w:sz w:val="20"/>
+                    </w:rPr>
+                    <w:t xml:space="default"/>
+                  </w:r>
+                </w:p>
+              </w:tc>
+              <w:tc>
+                <w:tcPr>
+                  <w:tcBorders>
+                    <w:top w:val="single" w:space="0" w:color="D3D3D3"/>
+                    <w:bottom w:val="single" w:space="0" w:color="D3D3D3"/>
+                    <w:start w:val="single" w:space="0" w:color="D3D3D3"/>
+                    <w:end w:val="single" w:space="0" w:color="D3D3D3"/>
+                  </w:tcBorders>
+                </w:tcPr>
+                <w:p>
+                  <w:pPr>
+                    <w:spacing w:before="0" w:after="60"/>
+                    <w:keepNext/>
+                    <w:jc w:val="center"/>
+                  </w:pPr>
+                  <w:r>
+                    <w:rPr>
+                      <w:rFonts w:ascii="Calibri" w:hAnsi="Calibri"/>
+                      <w:sz w:val="20"/>
+                    </w:rPr>
+                    <w:t xml:space="default"/>
+                  </w:r>
+                </w:p>
+              </w:tc>
+            </w:tr>
+            <w:tr>
+              <w:trPr>
+                <w:cantSplit/>
+              </w:trPr>
+              <w:tc>
+                <w:tcPr>
+                  <w:tcBorders>
+                    <w:top w:val="single" w:space="0" w:color="D3D3D3"/>
+                    <w:bottom w:val="single" w:space="0" w:color="D3D3D3"/>
+                    <w:start w:val="single" w:space="0" w:color="D3D3D3"/>
+                    <w:end w:val="single" w:space="0" w:color="D3D3D3"/>
+                  </w:tcBorders>
+                </w:tcPr>
+                <w:p>
+                  <w:pPr>
+                    <w:spacing w:before="0" w:after="60"/>
+                    <w:keepNext/>
+                    <w:jc w:val="start"/>
+                  </w:pPr>
+                  <w:r>
+                    <w:rPr>
+                      <w:rFonts w:ascii="Calibri" w:hAnsi="Calibri"/>
+                      <w:sz w:val="20"/>
+                    </w:rPr>
+                    <w:t xml:space="default">    Female</w:t>
+                  </w:r>
+                </w:p>
+              </w:tc>
+              <w:tc>
+                <w:tcPr>
+                  <w:tcBorders>
+                    <w:top w:val="single" w:space="0" w:color="D3D3D3"/>
+                    <w:bottom w:val="single" w:space="0" w:color="D3D3D3"/>
+                    <w:start w:val="single" w:space="0" w:color="D3D3D3"/>
+                    <w:end w:val="single" w:space="0" w:color="D3D3D3"/>
+                  </w:tcBorders>
+                </w:tcPr>
+                <w:p>
+                  <w:pPr>
+                    <w:spacing w:before="0" w:after="60"/>
+                    <w:keepNext/>
+                    <w:jc w:val="center"/>
+                  </w:pPr>
+                  <w:r>
+                    <w:rPr>
+                      <w:rFonts w:ascii="Calibri" w:hAnsi="Calibri"/>
+                      <w:sz w:val="20"/>
+                    </w:rPr>
+                    <w:t xml:space="default"/>
+                  </w:r>
+                </w:p>
+              </w:tc>
+              <w:tc>
+                <w:tcPr>
+                  <w:tcBorders>
+                    <w:top w:val="single" w:space="0" w:color="D3D3D3"/>
+                    <w:bottom w:val="single" w:space="0" w:color="D3D3D3"/>
+                    <w:start w:val="single" w:space="0" w:color="D3D3D3"/>
+                    <w:end w:val="single" w:space="0" w:color="D3D3D3"/>
+                  </w:tcBorders>
+                </w:tcPr>
+                <w:p>
+                  <w:pPr>
+                    <w:spacing w:before="0" w:after="60"/>
+                    <w:keepNext/>
+                    <w:jc w:val="center"/>
+                  </w:pPr>
+                  <w:r>
+                    <w:rPr>
+                      <w:rFonts w:ascii="Calibri" w:hAnsi="Calibri"/>
+                      <w:sz w:val="20"/>
+                    </w:rPr>
+                    <w:t xml:space="default"/>
+                  </w:r>
+                </w:p>
+              </w:tc>
+              <w:tc>
+                <w:tcPr>
+                  <w:tcBorders>
+                    <w:top w:val="single" w:space="0" w:color="D3D3D3"/>
+                    <w:bottom w:val="single" w:space="0" w:color="D3D3D3"/>
+                    <w:start w:val="single" w:space="0" w:color="D3D3D3"/>
+                    <w:end w:val="single" w:space="0" w:color="D3D3D3"/>
+                  </w:tcBorders>
+                </w:tcPr>
+                <w:p>
+                  <w:pPr>
+                    <w:spacing w:before="0" w:after="60"/>
+                    <w:keepNext/>
+                    <w:jc w:val="center"/>
+                  </w:pPr>
+                  <w:r>
+                    <w:rPr>
+                      <w:rFonts w:ascii="Calibri" w:hAnsi="Calibri"/>
+                      <w:sz w:val="20"/>
+                    </w:rPr>
+                    <w:t xml:space="default"/>
+                  </w:r>
+                </w:p>
+              </w:tc>
+            </w:tr>
+            <w:tr>
+              <w:trPr>
+                <w:cantSplit/>
+              </w:trPr>
+              <w:tc>
+                <w:tcPr>
+                  <w:tcBorders>
+                    <w:top w:val="single" w:space="0" w:color="D3D3D3"/>
+                    <w:bottom w:val="single" w:space="0" w:color="D3D3D3"/>
+                    <w:start w:val="single" w:space="0" w:color="D3D3D3"/>
+                    <w:end w:val="single" w:space="0" w:color="D3D3D3"/>
+                  </w:tcBorders>
+                </w:tcPr>
+                <w:p>
+                  <w:pPr>
+                    <w:spacing w:before="0" w:after="60"/>
+                    <w:keepNext/>
+                    <w:jc w:val="start"/>
+                  </w:pPr>
+                  <w:r>
+                    <w:rPr>
+                      <w:rFonts w:ascii="Calibri" w:hAnsi="Calibri"/>
+                      <w:sz w:val="20"/>
+                    </w:rPr>
+                    <w:t xml:space="default">    Male</w:t>
+                  </w:r>
+                </w:p>
+              </w:tc>
+              <w:tc>
+                <w:tcPr>
+                  <w:tcBorders>
+                    <w:top w:val="single" w:space="0" w:color="D3D3D3"/>
+                    <w:bottom w:val="single" w:space="0" w:color="D3D3D3"/>
+                    <w:start w:val="single" w:space="0" w:color="D3D3D3"/>
+                    <w:end w:val="single" w:space="0" w:color="D3D3D3"/>
+                  </w:tcBorders>
+                </w:tcPr>
+                <w:p>
+                  <w:pPr>
+                    <w:spacing w:before="0" w:after="60"/>
+                    <w:keepNext/>
+                    <w:jc w:val="center"/>
+                  </w:pPr>
+                  <w:r>
+                    <w:rPr>
+                      <w:rFonts w:ascii="Calibri" w:hAnsi="Calibri"/>
+                      <w:sz w:val="20"/>
+                    </w:rPr>
+                    <w:t xml:space="default"/>
+                  </w:r>
+                </w:p>
+              </w:tc>
+              <w:tc>
+                <w:tcPr>
+                  <w:tcBorders>
+                    <w:top w:val="single" w:space="0" w:color="D3D3D3"/>
+                    <w:bottom w:val="single" w:space="0" w:color="D3D3D3"/>
+                    <w:start w:val="single" w:space="0" w:color="D3D3D3"/>
+                    <w:end w:val="single" w:space="0" w:color="D3D3D3"/>
+                  </w:tcBorders>
+                </w:tcPr>
+                <w:p>
+                  <w:pPr>
+                    <w:spacing w:before="0" w:after="60"/>
+                    <w:keepNext/>
+                    <w:jc w:val="center"/>
+                  </w:pPr>
+                  <w:r>
+                    <w:rPr>
+                      <w:rFonts w:ascii="Calibri" w:hAnsi="Calibri"/>
+                      <w:sz w:val="20"/>
+                    </w:rPr>
+                    <w:t xml:space="default"/>
+                  </w:r>
+                </w:p>
+              </w:tc>
+              <w:tc>
+                <w:tcPr>
+                  <w:tcBorders>
+                    <w:top w:val="single" w:space="0" w:color="D3D3D3"/>
+                    <w:bottom w:val="single" w:space="0" w:color="D3D3D3"/>
+                    <w:start w:val="single" w:space="0" w:color="D3D3D3"/>
+                    <w:end w:val="single" w:space="0" w:color="D3D3D3"/>
+                  </w:tcBorders>
+                </w:tcPr>
+                <w:p>
+                  <w:pPr>
+                    <w:spacing w:before="0" w:after="60"/>
+                    <w:keepNext/>
+                    <w:jc w:val="center"/>
+                  </w:pPr>
+                  <w:r>
+                    <w:rPr>
+                      <w:rFonts w:ascii="Calibri" w:hAnsi="Calibri"/>
+                      <w:sz w:val="20"/>
+                    </w:rPr>
+                    <w:t xml:space="default"/>
+                  </w:r>
+                </w:p>
+              </w:tc>
+            </w:tr>
+            <w:tr>
+              <w:trPr>
+                <w:cantSplit/>
+              </w:trPr>
+              <w:tc>
+                <w:tcPr>
+                  <w:tcBorders>
+                    <w:top w:val="single" w:space="0" w:color="D3D3D3"/>
+                    <w:bottom w:val="single" w:space="0" w:color="D3D3D3"/>
+                    <w:start w:val="single" w:space="0" w:color="D3D3D3"/>
+                    <w:end w:val="single" w:space="0" w:color="D3D3D3"/>
+                  </w:tcBorders>
+                </w:tcPr>
+                <w:p>
+                  <w:pPr>
+                    <w:spacing w:before="0" w:after="60"/>
+                    <w:keepNext/>
+                    <w:jc w:val="start"/>
+                  </w:pPr>
+                  <w:r>
+                    <w:rPr>
+                      <w:rFonts w:ascii="Calibri" w:hAnsi="Calibri"/>
+                      <w:sz w:val="20"/>
+                    </w:rPr>
+                    <w:t xml:space="default">    Other</w:t>
+                  </w:r>
+                </w:p>
+              </w:tc>
+              <w:tc>
+                <w:tcPr>
+                  <w:tcBorders>
+                    <w:top w:val="single" w:space="0" w:color="D3D3D3"/>
+                    <w:bottom w:val="single" w:space="0" w:color="D3D3D3"/>
+                    <w:start w:val="single" w:space="0" w:color="D3D3D3"/>
+                    <w:end w:val="single" w:space="0" w:color="D3D3D3"/>
+                  </w:tcBorders>
+                </w:tcPr>
+                <w:p>
+                  <w:pPr>
+                    <w:spacing w:before="0" w:after="60"/>
+                    <w:keepNext/>
+                    <w:jc w:val="center"/>
+                  </w:pPr>
+                  <w:r>
+                    <w:rPr>
+                      <w:rFonts w:ascii="Calibri" w:hAnsi="Calibri"/>
+                      <w:sz w:val="20"/>
+                    </w:rPr>
+                    <w:t xml:space="default"/>
+                  </w:r>
+                </w:p>
+              </w:tc>
+              <w:tc>
+                <w:tcPr>
+                  <w:tcBorders>
+                    <w:top w:val="single" w:space="0" w:color="D3D3D3"/>
+                    <w:bottom w:val="single" w:space="0" w:color="D3D3D3"/>
+                    <w:start w:val="single" w:space="0" w:color="D3D3D3"/>
+                    <w:end w:val="single" w:space="0" w:color="D3D3D3"/>
+                  </w:tcBorders>
+                </w:tcPr>
+                <w:p>
+                  <w:pPr>
+                    <w:spacing w:before="0" w:after="60"/>
+                    <w:keepNext/>
+                    <w:jc w:val="center"/>
+                  </w:pPr>
+                  <w:r>
+                    <w:rPr>
+                      <w:rFonts w:ascii="Calibri" w:hAnsi="Calibri"/>
+                      <w:sz w:val="20"/>
+                    </w:rPr>
+                    <w:t xml:space="default"/>
+                  </w:r>
+                </w:p>
+              </w:tc>
+              <w:tc>
+                <w:tcPr>
+                  <w:tcBorders>
+                    <w:top w:val="single" w:space="0" w:color="D3D3D3"/>
+                    <w:bottom w:val="single" w:space="0" w:color="D3D3D3"/>
+                    <w:start w:val="single" w:space="0" w:color="D3D3D3"/>
+                    <w:end w:val="single" w:space="0" w:color="D3D3D3"/>
+                  </w:tcBorders>
+                </w:tcPr>
+                <w:p>
+                  <w:pPr>
+                    <w:spacing w:before="0" w:after="60"/>
+                    <w:keepNext/>
+                    <w:jc w:val="center"/>
+                  </w:pPr>
+                  <w:r>
+                    <w:rPr>
+                      <w:rFonts w:ascii="Calibri" w:hAnsi="Calibri"/>
+                      <w:sz w:val="20"/>
+                    </w:rPr>
+                    <w:t xml:space="default"/>
+                  </w:r>
+                </w:p>
+              </w:tc>
+            </w:tr>
+            <w:tr>
+              <w:trPr>
+                <w:cantSplit/>
+              </w:trPr>
+              <w:tc>
+                <w:tcPr>
+                  <w:tcBorders>
+                    <w:top w:val="single" w:space="0" w:color="D3D3D3"/>
+                    <w:bottom w:val="single" w:space="0" w:color="D3D3D3"/>
+                    <w:start w:val="single" w:space="0" w:color="D3D3D3"/>
+                    <w:end w:val="single" w:space="0" w:color="D3D3D3"/>
+                  </w:tcBorders>
+                </w:tcPr>
+                <w:p>
+                  <w:pPr>
+                    <w:spacing w:before="0" w:after="60"/>
+                    <w:keepNext/>
+                    <w:jc w:val="start"/>
+                  </w:pPr>
+                  <w:r>
+                    <w:rPr>
+                      <w:rFonts w:ascii="Calibri" w:hAnsi="Calibri"/>
+                      <w:sz w:val="20"/>
+                    </w:rPr>
+                    <w:t xml:space="default">    Missing</w:t>
+                  </w:r>
+                </w:p>
+              </w:tc>
+              <w:tc>
+                <w:tcPr>
+                  <w:tcBorders>
+                    <w:top w:val="single" w:space="0" w:color="D3D3D3"/>
+                    <w:bottom w:val="single" w:space="0" w:color="D3D3D3"/>
+                    <w:start w:val="single" w:space="0" w:color="D3D3D3"/>
+                    <w:end w:val="single" w:space="0" w:color="D3D3D3"/>
+                  </w:tcBorders>
+                </w:tcPr>
+                <w:p>
+                  <w:pPr>
+                    <w:spacing w:before="0" w:after="60"/>
+                    <w:keepNext/>
+                    <w:jc w:val="center"/>
+                  </w:pPr>
+                  <w:r>
+                    <w:rPr>
+                      <w:rFonts w:ascii="Calibri" w:hAnsi="Calibri"/>
+                      <w:sz w:val="20"/>
+                    </w:rPr>
+                    <w:t xml:space="default"/>
+                  </w:r>
+                </w:p>
+              </w:tc>
+              <w:tc>
+                <w:tcPr>
+                  <w:tcBorders>
+                    <w:top w:val="single" w:space="0" w:color="D3D3D3"/>
+                    <w:bottom w:val="single" w:space="0" w:color="D3D3D3"/>
+                    <w:start w:val="single" w:space="0" w:color="D3D3D3"/>
+                    <w:end w:val="single" w:space="0" w:color="D3D3D3"/>
+                  </w:tcBorders>
+                </w:tcPr>
+                <w:p>
+                  <w:pPr>
+                    <w:spacing w:before="0" w:after="60"/>
+                    <w:keepNext/>
+                    <w:jc w:val="center"/>
+                  </w:pPr>
+                  <w:r>
+                    <w:rPr>
+                      <w:rFonts w:ascii="Calibri" w:hAnsi="Calibri"/>
+                      <w:sz w:val="20"/>
+                    </w:rPr>
+                    <w:t xml:space="default"/>
+                  </w:r>
+                </w:p>
+              </w:tc>
+              <w:tc>
+                <w:tcPr>
+                  <w:tcBorders>
+                    <w:top w:val="single" w:space="0" w:color="D3D3D3"/>
+                    <w:bottom w:val="single" w:space="0" w:color="D3D3D3"/>
+                    <w:start w:val="single" w:space="0" w:color="D3D3D3"/>
+                    <w:end w:val="single" w:space="0" w:color="D3D3D3"/>
+                  </w:tcBorders>
+                </w:tcPr>
+                <w:p>
+                  <w:pPr>
+                    <w:spacing w:before="0" w:after="60"/>
+                    <w:keepNext/>
+                    <w:jc w:val="center"/>
+                  </w:pPr>
+                  <w:r>
+                    <w:rPr>
+                      <w:rFonts w:ascii="Calibri" w:hAnsi="Calibri"/>
+                      <w:sz w:val="20"/>
+                    </w:rPr>
+                    <w:t xml:space="default"/>
+                  </w:r>
+                </w:p>
+              </w:tc>
+            </w:tr>
+            <w:tr>
+              <w:trPr>
+                <w:cantSplit/>
+              </w:trPr>
+              <w:tc>
+                <w:tcPr>
+                  <w:tcBorders>
+                    <w:top w:val="single" w:space="0" w:color="D3D3D3"/>
+                    <w:bottom w:val="single" w:space="0" w:color="D3D3D3"/>
+                    <w:start w:val="single" w:space="0" w:color="D3D3D3"/>
+                    <w:end w:val="single" w:space="0" w:color="D3D3D3"/>
+                  </w:tcBorders>
+                </w:tcPr>
+                <w:p>
+                  <w:pPr>
+                    <w:spacing w:before="0" w:after="60"/>
+                    <w:keepNext/>
+                    <w:jc w:val="start"/>
+                  </w:pPr>
+                  <w:r>
+                    <w:rPr>
+                      <w:rFonts w:ascii="Calibri" w:hAnsi="Calibri"/>
+                      <w:sz w:val="20"/>
+                    </w:rPr>
+                    <w:t xml:space="default">Transferred in, n (%)</w:t>
+                  </w:r>
+                </w:p>
+              </w:tc>
+              <w:tc>
+                <w:tcPr>
+                  <w:tcBorders>
+                    <w:top w:val="single" w:space="0" w:color="D3D3D3"/>
+                    <w:bottom w:val="single" w:space="0" w:color="D3D3D3"/>
+                    <w:start w:val="single" w:space="0" w:color="D3D3D3"/>
+                    <w:end w:val="single" w:space="0" w:color="D3D3D3"/>
+                  </w:tcBorders>
+                </w:tcPr>
+                <w:p>
+                  <w:pPr>
+                    <w:spacing w:before="0" w:after="60"/>
+                    <w:keepNext/>
+                    <w:jc w:val="center"/>
+                  </w:pPr>
+                  <w:r>
+                    <w:rPr>
+                      <w:rFonts w:ascii="Calibri" w:hAnsi="Calibri"/>
+                      <w:sz w:val="20"/>
+                    </w:rPr>
+                    <w:t xml:space="default"/>
+                  </w:r>
+                </w:p>
+              </w:tc>
+              <w:tc>
+                <w:tcPr>
+                  <w:tcBorders>
+                    <w:top w:val="single" w:space="0" w:color="D3D3D3"/>
+                    <w:bottom w:val="single" w:space="0" w:color="D3D3D3"/>
+                    <w:start w:val="single" w:space="0" w:color="D3D3D3"/>
+                    <w:end w:val="single" w:space="0" w:color="D3D3D3"/>
+                  </w:tcBorders>
+                </w:tcPr>
+                <w:p>
+                  <w:pPr>
+                    <w:spacing w:before="0" w:after="60"/>
+                    <w:keepNext/>
+                    <w:jc w:val="center"/>
+                  </w:pPr>
+                  <w:r>
+                    <w:rPr>
+                      <w:rFonts w:ascii="Calibri" w:hAnsi="Calibri"/>
+                      <w:sz w:val="20"/>
+                    </w:rPr>
+                    <w:t xml:space="default"/>
+                  </w:r>
+                </w:p>
+              </w:tc>
+              <w:tc>
+                <w:tcPr>
+                  <w:tcBorders>
+                    <w:top w:val="single" w:space="0" w:color="D3D3D3"/>
+                    <w:bottom w:val="single" w:space="0" w:color="D3D3D3"/>
+                    <w:start w:val="single" w:space="0" w:color="D3D3D3"/>
+                    <w:end w:val="single" w:space="0" w:color="D3D3D3"/>
+                  </w:tcBorders>
+                </w:tcPr>
+                <w:p>
+                  <w:pPr>
+                    <w:spacing w:before="0" w:after="60"/>
+                    <w:keepNext/>
+                    <w:jc w:val="center"/>
+                  </w:pPr>
+                  <w:r>
+                    <w:rPr>
+                      <w:rFonts w:ascii="Calibri" w:hAnsi="Calibri"/>
+                      <w:sz w:val="20"/>
+                    </w:rPr>
+                    <w:t xml:space="default"/>
+                  </w:r>
+                </w:p>
+              </w:tc>
+            </w:tr>
+            <w:tr>
+              <w:trPr>
+                <w:cantSplit/>
+              </w:trPr>
+              <w:tc>
+                <w:tcPr>
+                  <w:tcBorders>
+                    <w:top w:val="single" w:space="0" w:color="D3D3D3"/>
+                    <w:bottom w:val="single" w:space="0" w:color="D3D3D3"/>
+                    <w:start w:val="single" w:space="0" w:color="D3D3D3"/>
+                    <w:end w:val="single" w:space="0" w:color="D3D3D3"/>
+                  </w:tcBorders>
+                </w:tcPr>
+                <w:p>
+                  <w:pPr>
+                    <w:spacing w:before="0" w:after="60"/>
+                    <w:keepNext/>
+                    <w:jc w:val="start"/>
+                  </w:pPr>
+                  <w:r>
+                    <w:rPr>
+                      <w:rFonts w:ascii="Calibri" w:hAnsi="Calibri"/>
+                      <w:sz w:val="20"/>
+                    </w:rPr>
+                    <w:t xml:space="default">    Missing</w:t>
+                  </w:r>
+                </w:p>
+              </w:tc>
+              <w:tc>
+                <w:tcPr>
+                  <w:tcBorders>
+                    <w:top w:val="single" w:space="0" w:color="D3D3D3"/>
+                    <w:bottom w:val="single" w:space="0" w:color="D3D3D3"/>
+                    <w:start w:val="single" w:space="0" w:color="D3D3D3"/>
+                    <w:end w:val="single" w:space="0" w:color="D3D3D3"/>
+                  </w:tcBorders>
+                </w:tcPr>
+                <w:p>
+                  <w:pPr>
+                    <w:spacing w:before="0" w:after="60"/>
+                    <w:keepNext/>
+                    <w:jc w:val="center"/>
+                  </w:pPr>
+                  <w:r>
+                    <w:rPr>
+                      <w:rFonts w:ascii="Calibri" w:hAnsi="Calibri"/>
+                      <w:sz w:val="20"/>
+                    </w:rPr>
+                    <w:t xml:space="default"/>
+                  </w:r>
+                </w:p>
+              </w:tc>
+              <w:tc>
+                <w:tcPr>
+                  <w:tcBorders>
+                    <w:top w:val="single" w:space="0" w:color="D3D3D3"/>
+                    <w:bottom w:val="single" w:space="0" w:color="D3D3D3"/>
+                    <w:start w:val="single" w:space="0" w:color="D3D3D3"/>
+                    <w:end w:val="single" w:space="0" w:color="D3D3D3"/>
+                  </w:tcBorders>
+                </w:tcPr>
+                <w:p>
+                  <w:pPr>
+                    <w:spacing w:before="0" w:after="60"/>
+                    <w:keepNext/>
+                    <w:jc w:val="center"/>
+                  </w:pPr>
+                  <w:r>
+                    <w:rPr>
+                      <w:rFonts w:ascii="Calibri" w:hAnsi="Calibri"/>
+                      <w:sz w:val="20"/>
+                    </w:rPr>
+                    <w:t xml:space="default"/>
+                  </w:r>
+                </w:p>
+              </w:tc>
+              <w:tc>
+                <w:tcPr>
+                  <w:tcBorders>
+                    <w:top w:val="single" w:space="0" w:color="D3D3D3"/>
+                    <w:bottom w:val="single" w:space="0" w:color="D3D3D3"/>
+                    <w:start w:val="single" w:space="0" w:color="D3D3D3"/>
+                    <w:end w:val="single" w:space="0" w:color="D3D3D3"/>
+                  </w:tcBorders>
+                </w:tcPr>
+                <w:p>
+                  <w:pPr>
+                    <w:spacing w:before="0" w:after="60"/>
+                    <w:keepNext/>
+                    <w:jc w:val="center"/>
+                  </w:pPr>
+                  <w:r>
+                    <w:rPr>
+                      <w:rFonts w:ascii="Calibri" w:hAnsi="Calibri"/>
+                      <w:sz w:val="20"/>
+                    </w:rPr>
+                    <w:t xml:space="default"/>
+                  </w:r>
+                </w:p>
+              </w:tc>
+            </w:tr>
+            <w:tr>
+              <w:trPr>
+                <w:cantSplit/>
+              </w:trPr>
+              <w:tc>
+                <w:tcPr>
+                  <w:tcBorders>
+                    <w:top w:val="single" w:space="0" w:color="D3D3D3"/>
+                    <w:bottom w:val="single" w:space="0" w:color="D3D3D3"/>
+                    <w:start w:val="single" w:space="0" w:color="D3D3D3"/>
+                    <w:end w:val="single" w:space="0" w:color="D3D3D3"/>
+                  </w:tcBorders>
+                </w:tcPr>
+                <w:p>
+                  <w:pPr>
+                    <w:spacing w:before="0" w:after="60"/>
+                    <w:keepNext/>
+                    <w:jc w:val="start"/>
+                  </w:pPr>
+                  <w:r>
+                    <w:rPr>
+                      <w:rFonts w:ascii="Calibri" w:hAnsi="Calibri"/>
+                      <w:sz w:val="20"/>
+                    </w:rPr>
+                    <w:t xml:space="default">Mechanism of injury, n (%)</w:t>
+                  </w:r>
+                </w:p>
+              </w:tc>
+              <w:tc>
+                <w:tcPr>
+                  <w:tcBorders>
+                    <w:top w:val="single" w:space="0" w:color="D3D3D3"/>
+                    <w:bottom w:val="single" w:space="0" w:color="D3D3D3"/>
+                    <w:start w:val="single" w:space="0" w:color="D3D3D3"/>
+                    <w:end w:val="single" w:space="0" w:color="D3D3D3"/>
+                  </w:tcBorders>
+                </w:tcPr>
+                <w:p>
+                  <w:pPr>
+                    <w:spacing w:before="0" w:after="60"/>
+                    <w:keepNext/>
+                    <w:jc w:val="center"/>
+                  </w:pPr>
+                  <w:r>
+                    <w:rPr>
+                      <w:rFonts w:ascii="Calibri" w:hAnsi="Calibri"/>
+                      <w:sz w:val="20"/>
+                    </w:rPr>
+                    <w:t xml:space="default"/>
+                  </w:r>
+                </w:p>
+              </w:tc>
+              <w:tc>
+                <w:tcPr>
+                  <w:tcBorders>
+                    <w:top w:val="single" w:space="0" w:color="D3D3D3"/>
+                    <w:bottom w:val="single" w:space="0" w:color="D3D3D3"/>
+                    <w:start w:val="single" w:space="0" w:color="D3D3D3"/>
+                    <w:end w:val="single" w:space="0" w:color="D3D3D3"/>
+                  </w:tcBorders>
+                </w:tcPr>
+                <w:p>
+                  <w:pPr>
+                    <w:spacing w:before="0" w:after="60"/>
+                    <w:keepNext/>
+                    <w:jc w:val="center"/>
+                  </w:pPr>
+                  <w:r>
+                    <w:rPr>
+                      <w:rFonts w:ascii="Calibri" w:hAnsi="Calibri"/>
+                      <w:sz w:val="20"/>
+                    </w:rPr>
+                    <w:t xml:space="default"/>
+                  </w:r>
+                </w:p>
+              </w:tc>
+              <w:tc>
+                <w:tcPr>
+                  <w:tcBorders>
+                    <w:top w:val="single" w:space="0" w:color="D3D3D3"/>
+                    <w:bottom w:val="single" w:space="0" w:color="D3D3D3"/>
+                    <w:start w:val="single" w:space="0" w:color="D3D3D3"/>
+                    <w:end w:val="single" w:space="0" w:color="D3D3D3"/>
+                  </w:tcBorders>
+                </w:tcPr>
+                <w:p>
+                  <w:pPr>
+                    <w:spacing w:before="0" w:after="60"/>
+                    <w:keepNext/>
+                    <w:jc w:val="center"/>
+                  </w:pPr>
+                  <w:r>
+                    <w:rPr>
+                      <w:rFonts w:ascii="Calibri" w:hAnsi="Calibri"/>
+                      <w:sz w:val="20"/>
+                    </w:rPr>
+                    <w:t xml:space="default"/>
+                  </w:r>
+                </w:p>
+              </w:tc>
+            </w:tr>
+            <w:tr>
+              <w:trPr>
+                <w:cantSplit/>
+              </w:trPr>
+              <w:tc>
+                <w:tcPr>
+                  <w:tcBorders>
+                    <w:top w:val="single" w:space="0" w:color="D3D3D3"/>
+                    <w:bottom w:val="single" w:space="0" w:color="D3D3D3"/>
+                    <w:start w:val="single" w:space="0" w:color="D3D3D3"/>
+                    <w:end w:val="single" w:space="0" w:color="D3D3D3"/>
+                  </w:tcBorders>
+                </w:tcPr>
+                <w:p>
+                  <w:pPr>
+                    <w:spacing w:before="0" w:after="60"/>
+                    <w:keepNext/>
+                    <w:jc w:val="start"/>
+                  </w:pPr>
+                  <w:r>
+                    <w:rPr>
+                      <w:rFonts w:ascii="Calibri" w:hAnsi="Calibri"/>
+                      <w:sz w:val="20"/>
+                    </w:rPr>
+                    <w:t xml:space="default">    Road traffic injury</w:t>
+                  </w:r>
+                </w:p>
+              </w:tc>
+              <w:tc>
+                <w:tcPr>
+                  <w:tcBorders>
+                    <w:top w:val="single" w:space="0" w:color="D3D3D3"/>
+                    <w:bottom w:val="single" w:space="0" w:color="D3D3D3"/>
+                    <w:start w:val="single" w:space="0" w:color="D3D3D3"/>
+                    <w:end w:val="single" w:space="0" w:color="D3D3D3"/>
+                  </w:tcBorders>
+                </w:tcPr>
+                <w:p>
+                  <w:pPr>
+                    <w:spacing w:before="0" w:after="60"/>
+                    <w:keepNext/>
+                    <w:jc w:val="center"/>
+                  </w:pPr>
+                  <w:r>
+                    <w:rPr>
+                      <w:rFonts w:ascii="Calibri" w:hAnsi="Calibri"/>
+                      <w:sz w:val="20"/>
+                    </w:rPr>
+                    <w:t xml:space="default"/>
+                  </w:r>
+                </w:p>
+              </w:tc>
+              <w:tc>
+                <w:tcPr>
+                  <w:tcBorders>
+                    <w:top w:val="single" w:space="0" w:color="D3D3D3"/>
+                    <w:bottom w:val="single" w:space="0" w:color="D3D3D3"/>
+                    <w:start w:val="single" w:space="0" w:color="D3D3D3"/>
+                    <w:end w:val="single" w:space="0" w:color="D3D3D3"/>
+                  </w:tcBorders>
+                </w:tcPr>
+                <w:p>
+                  <w:pPr>
+                    <w:spacing w:before="0" w:after="60"/>
+                    <w:keepNext/>
+                    <w:jc w:val="center"/>
+                  </w:pPr>
+                  <w:r>
+                    <w:rPr>
+                      <w:rFonts w:ascii="Calibri" w:hAnsi="Calibri"/>
+                      <w:sz w:val="20"/>
+                    </w:rPr>
+                    <w:t xml:space="default"/>
+                  </w:r>
+                </w:p>
+              </w:tc>
+              <w:tc>
+                <w:tcPr>
+                  <w:tcBorders>
+                    <w:top w:val="single" w:space="0" w:color="D3D3D3"/>
+                    <w:bottom w:val="single" w:space="0" w:color="D3D3D3"/>
+                    <w:start w:val="single" w:space="0" w:color="D3D3D3"/>
+                    <w:end w:val="single" w:space="0" w:color="D3D3D3"/>
+                  </w:tcBorders>
+                </w:tcPr>
+                <w:p>
+                  <w:pPr>
+                    <w:spacing w:before="0" w:after="60"/>
+                    <w:keepNext/>
+                    <w:jc w:val="center"/>
+                  </w:pPr>
+                  <w:r>
+                    <w:rPr>
+                      <w:rFonts w:ascii="Calibri" w:hAnsi="Calibri"/>
+                      <w:sz w:val="20"/>
+                    </w:rPr>
+                    <w:t xml:space="default"/>
+                  </w:r>
+                </w:p>
+              </w:tc>
+            </w:tr>
+            <w:tr>
+              <w:trPr>
+                <w:cantSplit/>
+              </w:trPr>
+              <w:tc>
+                <w:tcPr>
+                  <w:tcBorders>
+                    <w:top w:val="single" w:space="0" w:color="D3D3D3"/>
+                    <w:bottom w:val="single" w:space="0" w:color="D3D3D3"/>
+                    <w:start w:val="single" w:space="0" w:color="D3D3D3"/>
+                    <w:end w:val="single" w:space="0" w:color="D3D3D3"/>
+                  </w:tcBorders>
+                </w:tcPr>
+                <w:p>
+                  <w:pPr>
+                    <w:spacing w:before="0" w:after="60"/>
+                    <w:keepNext/>
+                    <w:jc w:val="start"/>
+                  </w:pPr>
+                  <w:r>
+                    <w:rPr>
+                      <w:rFonts w:ascii="Calibri" w:hAnsi="Calibri"/>
+                      <w:sz w:val="20"/>
+                    </w:rPr>
+                    <w:t xml:space="default">    Fall</w:t>
+                  </w:r>
+                </w:p>
+              </w:tc>
+              <w:tc>
+                <w:tcPr>
+                  <w:tcBorders>
+                    <w:top w:val="single" w:space="0" w:color="D3D3D3"/>
+                    <w:bottom w:val="single" w:space="0" w:color="D3D3D3"/>
+                    <w:start w:val="single" w:space="0" w:color="D3D3D3"/>
+                    <w:end w:val="single" w:space="0" w:color="D3D3D3"/>
+                  </w:tcBorders>
+                </w:tcPr>
+                <w:p>
+                  <w:pPr>
+                    <w:spacing w:before="0" w:after="60"/>
+                    <w:keepNext/>
+                    <w:jc w:val="center"/>
+                  </w:pPr>
+                  <w:r>
+                    <w:rPr>
+                      <w:rFonts w:ascii="Calibri" w:hAnsi="Calibri"/>
+                      <w:sz w:val="20"/>
+                    </w:rPr>
+                    <w:t xml:space="default"/>
+                  </w:r>
+                </w:p>
+              </w:tc>
+              <w:tc>
+                <w:tcPr>
+                  <w:tcBorders>
+                    <w:top w:val="single" w:space="0" w:color="D3D3D3"/>
+                    <w:bottom w:val="single" w:space="0" w:color="D3D3D3"/>
+                    <w:start w:val="single" w:space="0" w:color="D3D3D3"/>
+                    <w:end w:val="single" w:space="0" w:color="D3D3D3"/>
+                  </w:tcBorders>
+                </w:tcPr>
+                <w:p>
+                  <w:pPr>
+                    <w:spacing w:before="0" w:after="60"/>
+                    <w:keepNext/>
+                    <w:jc w:val="center"/>
+                  </w:pPr>
+                  <w:r>
+                    <w:rPr>
+                      <w:rFonts w:ascii="Calibri" w:hAnsi="Calibri"/>
+                      <w:sz w:val="20"/>
+                    </w:rPr>
+                    <w:t xml:space="default"/>
+                  </w:r>
+                </w:p>
+              </w:tc>
+              <w:tc>
+                <w:tcPr>
+                  <w:tcBorders>
+                    <w:top w:val="single" w:space="0" w:color="D3D3D3"/>
+                    <w:bottom w:val="single" w:space="0" w:color="D3D3D3"/>
+                    <w:start w:val="single" w:space="0" w:color="D3D3D3"/>
+                    <w:end w:val="single" w:space="0" w:color="D3D3D3"/>
+                  </w:tcBorders>
+                </w:tcPr>
+                <w:p>
+                  <w:pPr>
+                    <w:spacing w:before="0" w:after="60"/>
+                    <w:keepNext/>
+                    <w:jc w:val="center"/>
+                  </w:pPr>
+                  <w:r>
+                    <w:rPr>
+                      <w:rFonts w:ascii="Calibri" w:hAnsi="Calibri"/>
+                      <w:sz w:val="20"/>
+                    </w:rPr>
+                    <w:t xml:space="default"/>
+                  </w:r>
+                </w:p>
+              </w:tc>
+            </w:tr>
+            <w:tr>
+              <w:trPr>
+                <w:cantSplit/>
+              </w:trPr>
+              <w:tc>
+                <w:tcPr>
+                  <w:tcBorders>
+                    <w:top w:val="single" w:space="0" w:color="D3D3D3"/>
+                    <w:bottom w:val="single" w:space="0" w:color="D3D3D3"/>
+                    <w:start w:val="single" w:space="0" w:color="D3D3D3"/>
+                    <w:end w:val="single" w:space="0" w:color="D3D3D3"/>
+                  </w:tcBorders>
+                </w:tcPr>
+                <w:p>
+                  <w:pPr>
+                    <w:spacing w:before="0" w:after="60"/>
+                    <w:keepNext/>
+                    <w:jc w:val="start"/>
+                  </w:pPr>
+                  <w:r>
+                    <w:rPr>
+                      <w:rFonts w:ascii="Calibri" w:hAnsi="Calibri"/>
+                      <w:sz w:val="20"/>
+                    </w:rPr>
+                    <w:t xml:space="default">    Assault</w:t>
+                  </w:r>
+                </w:p>
+              </w:tc>
+              <w:tc>
+                <w:tcPr>
+                  <w:tcBorders>
+                    <w:top w:val="single" w:space="0" w:color="D3D3D3"/>
+                    <w:bottom w:val="single" w:space="0" w:color="D3D3D3"/>
+                    <w:start w:val="single" w:space="0" w:color="D3D3D3"/>
+                    <w:end w:val="single" w:space="0" w:color="D3D3D3"/>
+                  </w:tcBorders>
+                </w:tcPr>
+                <w:p>
+                  <w:pPr>
+                    <w:spacing w:before="0" w:after="60"/>
+                    <w:keepNext/>
+                    <w:jc w:val="center"/>
+                  </w:pPr>
+                  <w:r>
+                    <w:rPr>
+                      <w:rFonts w:ascii="Calibri" w:hAnsi="Calibri"/>
+                      <w:sz w:val="20"/>
+                    </w:rPr>
+                    <w:t xml:space="default"/>
+                  </w:r>
+                </w:p>
+              </w:tc>
+              <w:tc>
+                <w:tcPr>
+                  <w:tcBorders>
+                    <w:top w:val="single" w:space="0" w:color="D3D3D3"/>
+                    <w:bottom w:val="single" w:space="0" w:color="D3D3D3"/>
+                    <w:start w:val="single" w:space="0" w:color="D3D3D3"/>
+                    <w:end w:val="single" w:space="0" w:color="D3D3D3"/>
+                  </w:tcBorders>
+                </w:tcPr>
+                <w:p>
+                  <w:pPr>
+                    <w:spacing w:before="0" w:after="60"/>
+                    <w:keepNext/>
+                    <w:jc w:val="center"/>
+                  </w:pPr>
+                  <w:r>
+                    <w:rPr>
+                      <w:rFonts w:ascii="Calibri" w:hAnsi="Calibri"/>
+                      <w:sz w:val="20"/>
+                    </w:rPr>
+                    <w:t xml:space="default"/>
+                  </w:r>
+                </w:p>
+              </w:tc>
+              <w:tc>
+                <w:tcPr>
+                  <w:tcBorders>
+                    <w:top w:val="single" w:space="0" w:color="D3D3D3"/>
+                    <w:bottom w:val="single" w:space="0" w:color="D3D3D3"/>
+                    <w:start w:val="single" w:space="0" w:color="D3D3D3"/>
+                    <w:end w:val="single" w:space="0" w:color="D3D3D3"/>
+                  </w:tcBorders>
+                </w:tcPr>
+                <w:p>
+                  <w:pPr>
+                    <w:spacing w:before="0" w:after="60"/>
+                    <w:keepNext/>
+                    <w:jc w:val="center"/>
+                  </w:pPr>
+                  <w:r>
+                    <w:rPr>
+                      <w:rFonts w:ascii="Calibri" w:hAnsi="Calibri"/>
+                      <w:sz w:val="20"/>
+                    </w:rPr>
+                    <w:t xml:space="default"/>
+                  </w:r>
+                </w:p>
+              </w:tc>
+            </w:tr>
+            <w:tr>
+              <w:trPr>
+                <w:cantSplit/>
+              </w:trPr>
+              <w:tc>
+                <w:tcPr>
+                  <w:tcBorders>
+                    <w:top w:val="single" w:space="0" w:color="D3D3D3"/>
+                    <w:bottom w:val="single" w:space="0" w:color="D3D3D3"/>
+                    <w:start w:val="single" w:space="0" w:color="D3D3D3"/>
+                    <w:end w:val="single" w:space="0" w:color="D3D3D3"/>
+                  </w:tcBorders>
+                </w:tcPr>
+                <w:p>
+                  <w:pPr>
+                    <w:spacing w:before="0" w:after="60"/>
+                    <w:keepNext/>
+                    <w:jc w:val="start"/>
+                  </w:pPr>
+                  <w:r>
+                    <w:rPr>
+                      <w:rFonts w:ascii="Calibri" w:hAnsi="Calibri"/>
+                      <w:sz w:val="20"/>
+                    </w:rPr>
+                    <w:t xml:space="default">    Other</w:t>
+                  </w:r>
+                </w:p>
+              </w:tc>
+              <w:tc>
+                <w:tcPr>
+                  <w:tcBorders>
+                    <w:top w:val="single" w:space="0" w:color="D3D3D3"/>
+                    <w:bottom w:val="single" w:space="0" w:color="D3D3D3"/>
+                    <w:start w:val="single" w:space="0" w:color="D3D3D3"/>
+                    <w:end w:val="single" w:space="0" w:color="D3D3D3"/>
+                  </w:tcBorders>
+                </w:tcPr>
+                <w:p>
+                  <w:pPr>
+                    <w:spacing w:before="0" w:after="60"/>
+                    <w:keepNext/>
+                    <w:jc w:val="center"/>
+                  </w:pPr>
+                  <w:r>
+                    <w:rPr>
+                      <w:rFonts w:ascii="Calibri" w:hAnsi="Calibri"/>
+                      <w:sz w:val="20"/>
+                    </w:rPr>
+                    <w:t xml:space="default"/>
+                  </w:r>
+                </w:p>
+              </w:tc>
+              <w:tc>
+                <w:tcPr>
+                  <w:tcBorders>
+                    <w:top w:val="single" w:space="0" w:color="D3D3D3"/>
+                    <w:bottom w:val="single" w:space="0" w:color="D3D3D3"/>
+                    <w:start w:val="single" w:space="0" w:color="D3D3D3"/>
+                    <w:end w:val="single" w:space="0" w:color="D3D3D3"/>
+                  </w:tcBorders>
+                </w:tcPr>
+                <w:p>
+                  <w:pPr>
+                    <w:spacing w:before="0" w:after="60"/>
+                    <w:keepNext/>
+                    <w:jc w:val="center"/>
+                  </w:pPr>
+                  <w:r>
+                    <w:rPr>
+                      <w:rFonts w:ascii="Calibri" w:hAnsi="Calibri"/>
+                      <w:sz w:val="20"/>
+                    </w:rPr>
+                    <w:t xml:space="default"/>
+                  </w:r>
+                </w:p>
+              </w:tc>
+              <w:tc>
+                <w:tcPr>
+                  <w:tcBorders>
+                    <w:top w:val="single" w:space="0" w:color="D3D3D3"/>
+                    <w:bottom w:val="single" w:space="0" w:color="D3D3D3"/>
+                    <w:start w:val="single" w:space="0" w:color="D3D3D3"/>
+                    <w:end w:val="single" w:space="0" w:color="D3D3D3"/>
+                  </w:tcBorders>
+                </w:tcPr>
+                <w:p>
+                  <w:pPr>
+                    <w:spacing w:before="0" w:after="60"/>
+                    <w:keepNext/>
+                    <w:jc w:val="center"/>
+                  </w:pPr>
+                  <w:r>
+                    <w:rPr>
+                      <w:rFonts w:ascii="Calibri" w:hAnsi="Calibri"/>
+                      <w:sz w:val="20"/>
+                    </w:rPr>
+                    <w:t xml:space="default"/>
+                  </w:r>
+                </w:p>
+              </w:tc>
+            </w:tr>
+            <w:tr>
+              <w:trPr>
+                <w:cantSplit/>
+              </w:trPr>
+              <w:tc>
+                <w:tcPr>
+                  <w:tcBorders>
+                    <w:top w:val="single" w:space="0" w:color="D3D3D3"/>
+                    <w:bottom w:val="single" w:space="0" w:color="D3D3D3"/>
+                    <w:start w:val="single" w:space="0" w:color="D3D3D3"/>
+                    <w:end w:val="single" w:space="0" w:color="D3D3D3"/>
+                  </w:tcBorders>
+                </w:tcPr>
+                <w:p>
+                  <w:pPr>
+                    <w:spacing w:before="0" w:after="60"/>
+                    <w:keepNext/>
+                    <w:jc w:val="start"/>
+                  </w:pPr>
+                  <w:r>
+                    <w:rPr>
+                      <w:rFonts w:ascii="Calibri" w:hAnsi="Calibri"/>
+                      <w:sz w:val="20"/>
+                    </w:rPr>
+                    <w:t xml:space="default">    Missing</w:t>
+                  </w:r>
+                </w:p>
+              </w:tc>
+              <w:tc>
+                <w:tcPr>
+                  <w:tcBorders>
+                    <w:top w:val="single" w:space="0" w:color="D3D3D3"/>
+                    <w:bottom w:val="single" w:space="0" w:color="D3D3D3"/>
+                    <w:start w:val="single" w:space="0" w:color="D3D3D3"/>
+                    <w:end w:val="single" w:space="0" w:color="D3D3D3"/>
+                  </w:tcBorders>
+                </w:tcPr>
+                <w:p>
+                  <w:pPr>
+                    <w:spacing w:before="0" w:after="60"/>
+                    <w:keepNext/>
+                    <w:jc w:val="center"/>
+                  </w:pPr>
+                  <w:r>
+                    <w:rPr>
+                      <w:rFonts w:ascii="Calibri" w:hAnsi="Calibri"/>
+                      <w:sz w:val="20"/>
+                    </w:rPr>
+                    <w:t xml:space="default"/>
+                  </w:r>
+                </w:p>
+              </w:tc>
+              <w:tc>
+                <w:tcPr>
+                  <w:tcBorders>
+                    <w:top w:val="single" w:space="0" w:color="D3D3D3"/>
+                    <w:bottom w:val="single" w:space="0" w:color="D3D3D3"/>
+                    <w:start w:val="single" w:space="0" w:color="D3D3D3"/>
+                    <w:end w:val="single" w:space="0" w:color="D3D3D3"/>
+                  </w:tcBorders>
+                </w:tcPr>
+                <w:p>
+                  <w:pPr>
+                    <w:spacing w:before="0" w:after="60"/>
+                    <w:keepNext/>
+                    <w:jc w:val="center"/>
+                  </w:pPr>
+                  <w:r>
+                    <w:rPr>
+                      <w:rFonts w:ascii="Calibri" w:hAnsi="Calibri"/>
+                      <w:sz w:val="20"/>
+                    </w:rPr>
+                    <w:t xml:space="default"/>
+                  </w:r>
+                </w:p>
+              </w:tc>
+              <w:tc>
+                <w:tcPr>
+                  <w:tcBorders>
+                    <w:top w:val="single" w:space="0" w:color="D3D3D3"/>
+                    <w:bottom w:val="single" w:space="0" w:color="D3D3D3"/>
+                    <w:start w:val="single" w:space="0" w:color="D3D3D3"/>
+                    <w:end w:val="single" w:space="0" w:color="D3D3D3"/>
+                  </w:tcBorders>
+                </w:tcPr>
+                <w:p>
+                  <w:pPr>
+                    <w:spacing w:before="0" w:after="60"/>
+                    <w:keepNext/>
+                    <w:jc w:val="center"/>
+                  </w:pPr>
+                  <w:r>
+                    <w:rPr>
+                      <w:rFonts w:ascii="Calibri" w:hAnsi="Calibri"/>
+                      <w:sz w:val="20"/>
+                    </w:rPr>
+                    <w:t xml:space="default"/>
+                  </w:r>
+                </w:p>
+              </w:tc>
+            </w:tr>
+            <w:tr>
+              <w:trPr>
+                <w:cantSplit/>
+              </w:trPr>
+              <w:tc>
+                <w:tcPr>
+                  <w:tcBorders>
+                    <w:top w:val="single" w:space="0" w:color="D3D3D3"/>
+                    <w:bottom w:val="single" w:space="0" w:color="D3D3D3"/>
+                    <w:start w:val="single" w:space="0" w:color="D3D3D3"/>
+                    <w:end w:val="single" w:space="0" w:color="D3D3D3"/>
+                  </w:tcBorders>
+                </w:tcPr>
+                <w:p>
+                  <w:pPr>
+                    <w:spacing w:before="0" w:after="60"/>
+                    <w:keepNext/>
+                    <w:jc w:val="start"/>
+                  </w:pPr>
+                  <w:r>
+                    <w:rPr>
+                      <w:rFonts w:ascii="Calibri" w:hAnsi="Calibri"/>
+                      <w:sz w:val="20"/>
+                    </w:rPr>
+                    <w:t xml:space="default">Injury Severity Score, Median (Q1, Q3)</w:t>
+                  </w:r>
+                </w:p>
+              </w:tc>
+              <w:tc>
+                <w:tcPr>
+                  <w:tcBorders>
+                    <w:top w:val="single" w:space="0" w:color="D3D3D3"/>
+                    <w:bottom w:val="single" w:space="0" w:color="D3D3D3"/>
+                    <w:start w:val="single" w:space="0" w:color="D3D3D3"/>
+                    <w:end w:val="single" w:space="0" w:color="D3D3D3"/>
+                  </w:tcBorders>
+                </w:tcPr>
+                <w:p>
+                  <w:pPr>
+                    <w:spacing w:before="0" w:after="60"/>
+                    <w:keepNext/>
+                    <w:jc w:val="center"/>
+                  </w:pPr>
+                  <w:r>
+                    <w:rPr>
+                      <w:rFonts w:ascii="Calibri" w:hAnsi="Calibri"/>
+                      <w:sz w:val="20"/>
+                    </w:rPr>
+                    <w:t xml:space="default"/>
+                  </w:r>
+                </w:p>
+              </w:tc>
+              <w:tc>
+                <w:tcPr>
+                  <w:tcBorders>
+                    <w:top w:val="single" w:space="0" w:color="D3D3D3"/>
+                    <w:bottom w:val="single" w:space="0" w:color="D3D3D3"/>
+                    <w:start w:val="single" w:space="0" w:color="D3D3D3"/>
+                    <w:end w:val="single" w:space="0" w:color="D3D3D3"/>
+                  </w:tcBorders>
+                </w:tcPr>
+                <w:p>
+                  <w:pPr>
+                    <w:spacing w:before="0" w:after="60"/>
+                    <w:keepNext/>
+                    <w:jc w:val="center"/>
+                  </w:pPr>
+                  <w:r>
+                    <w:rPr>
+                      <w:rFonts w:ascii="Calibri" w:hAnsi="Calibri"/>
+                      <w:sz w:val="20"/>
+                    </w:rPr>
+                    <w:t xml:space="default"/>
+                  </w:r>
+                </w:p>
+              </w:tc>
+              <w:tc>
+                <w:tcPr>
+                  <w:tcBorders>
+                    <w:top w:val="single" w:space="0" w:color="D3D3D3"/>
+                    <w:bottom w:val="single" w:space="0" w:color="D3D3D3"/>
+                    <w:start w:val="single" w:space="0" w:color="D3D3D3"/>
+                    <w:end w:val="single" w:space="0" w:color="D3D3D3"/>
+                  </w:tcBorders>
+                </w:tcPr>
+                <w:p>
+                  <w:pPr>
+                    <w:spacing w:before="0" w:after="60"/>
+                    <w:keepNext/>
+                    <w:jc w:val="center"/>
+                  </w:pPr>
+                  <w:r>
+                    <w:rPr>
+                      <w:rFonts w:ascii="Calibri" w:hAnsi="Calibri"/>
+                      <w:sz w:val="20"/>
+                    </w:rPr>
+                    <w:t xml:space="default"/>
+                  </w:r>
+                </w:p>
+              </w:tc>
+            </w:tr>
+            <w:tr>
+              <w:trPr>
+                <w:cantSplit/>
+              </w:trPr>
+              <w:tc>
+                <w:tcPr>
+                  <w:tcBorders>
+                    <w:top w:val="single" w:space="0" w:color="D3D3D3"/>
+                    <w:bottom w:val="single" w:space="0" w:color="D3D3D3"/>
+                    <w:start w:val="single" w:space="0" w:color="D3D3D3"/>
+                    <w:end w:val="single" w:space="0" w:color="D3D3D3"/>
+                  </w:tcBorders>
+                </w:tcPr>
+                <w:p>
+                  <w:pPr>
+                    <w:spacing w:before="0" w:after="60"/>
+                    <w:keepNext/>
+                    <w:jc w:val="start"/>
+                  </w:pPr>
+                  <w:r>
+                    <w:rPr>
+                      <w:rFonts w:ascii="Calibri" w:hAnsi="Calibri"/>
+                      <w:sz w:val="20"/>
+                    </w:rPr>
+                    <w:t xml:space="default">    Missing</w:t>
+                  </w:r>
+                </w:p>
+              </w:tc>
+              <w:tc>
+                <w:tcPr>
+                  <w:tcBorders>
+                    <w:top w:val="single" w:space="0" w:color="D3D3D3"/>
+                    <w:bottom w:val="single" w:space="0" w:color="D3D3D3"/>
+                    <w:start w:val="single" w:space="0" w:color="D3D3D3"/>
+                    <w:end w:val="single" w:space="0" w:color="D3D3D3"/>
+                  </w:tcBorders>
+                </w:tcPr>
+                <w:p>
+                  <w:pPr>
+                    <w:spacing w:before="0" w:after="60"/>
+                    <w:keepNext/>
+                    <w:jc w:val="center"/>
+                  </w:pPr>
+                  <w:r>
+                    <w:rPr>
+                      <w:rFonts w:ascii="Calibri" w:hAnsi="Calibri"/>
+                      <w:sz w:val="20"/>
+                    </w:rPr>
+                    <w:t xml:space="default"/>
+                  </w:r>
+                </w:p>
+              </w:tc>
+              <w:tc>
+                <w:tcPr>
+                  <w:tcBorders>
+                    <w:top w:val="single" w:space="0" w:color="D3D3D3"/>
+                    <w:bottom w:val="single" w:space="0" w:color="D3D3D3"/>
+                    <w:start w:val="single" w:space="0" w:color="D3D3D3"/>
+                    <w:end w:val="single" w:space="0" w:color="D3D3D3"/>
+                  </w:tcBorders>
+                </w:tcPr>
+                <w:p>
+                  <w:pPr>
+                    <w:spacing w:before="0" w:after="60"/>
+                    <w:keepNext/>
+                    <w:jc w:val="center"/>
+                  </w:pPr>
+                  <w:r>
+                    <w:rPr>
+                      <w:rFonts w:ascii="Calibri" w:hAnsi="Calibri"/>
+                      <w:sz w:val="20"/>
+                    </w:rPr>
+                    <w:t xml:space="default"/>
+                  </w:r>
+                </w:p>
+              </w:tc>
+              <w:tc>
+                <w:tcPr>
+                  <w:tcBorders>
+                    <w:top w:val="single" w:space="0" w:color="D3D3D3"/>
+                    <w:bottom w:val="single" w:space="0" w:color="D3D3D3"/>
+                    <w:start w:val="single" w:space="0" w:color="D3D3D3"/>
+                    <w:end w:val="single" w:space="0" w:color="D3D3D3"/>
+                  </w:tcBorders>
+                </w:tcPr>
+                <w:p>
+                  <w:pPr>
+                    <w:spacing w:before="0" w:after="60"/>
+                    <w:keepNext/>
+                    <w:jc w:val="center"/>
+                  </w:pPr>
+                  <w:r>
+                    <w:rPr>
+                      <w:rFonts w:ascii="Calibri" w:hAnsi="Calibri"/>
+                      <w:sz w:val="20"/>
+                    </w:rPr>
+                    <w:t xml:space="default"/>
+                  </w:r>
+                </w:p>
+              </w:tc>
+            </w:tr>
+            <w:tr>
+              <w:trPr>
+                <w:cantSplit/>
+              </w:trPr>
+              <w:tc>
+                <w:tcPr>
+                  <w:tcBorders>
+                    <w:top w:val="single" w:space="0" w:color="D3D3D3"/>
+                    <w:bottom w:val="single" w:space="0" w:color="D3D3D3"/>
+                    <w:start w:val="single" w:space="0" w:color="D3D3D3"/>
+                    <w:end w:val="single" w:space="0" w:color="D3D3D3"/>
+                  </w:tcBorders>
+                </w:tcPr>
+                <w:p>
+                  <w:pPr>
+                    <w:spacing w:before="0" w:after="60"/>
+                    <w:keepNext/>
+                    <w:jc w:val="start"/>
+                  </w:pPr>
+                  <w:r>
+                    <w:rPr>
+                      <w:rFonts w:ascii="Calibri" w:hAnsi="Calibri"/>
+                      <w:sz w:val="20"/>
+                    </w:rPr>
+                    <w:t xml:space="default">Glasgow Coma Scale score, Median (Q1, Q3)</w:t>
+                  </w:r>
+                </w:p>
+              </w:tc>
+              <w:tc>
+                <w:tcPr>
+                  <w:tcBorders>
+                    <w:top w:val="single" w:space="0" w:color="D3D3D3"/>
+                    <w:bottom w:val="single" w:space="0" w:color="D3D3D3"/>
+                    <w:start w:val="single" w:space="0" w:color="D3D3D3"/>
+                    <w:end w:val="single" w:space="0" w:color="D3D3D3"/>
+                  </w:tcBorders>
+                </w:tcPr>
+                <w:p>
+                  <w:pPr>
+                    <w:spacing w:before="0" w:after="60"/>
+                    <w:keepNext/>
+                    <w:jc w:val="center"/>
+                  </w:pPr>
+                  <w:r>
+                    <w:rPr>
+                      <w:rFonts w:ascii="Calibri" w:hAnsi="Calibri"/>
+                      <w:sz w:val="20"/>
+                    </w:rPr>
+                    <w:t xml:space="default"/>
+                  </w:r>
+                </w:p>
+              </w:tc>
+              <w:tc>
+                <w:tcPr>
+                  <w:tcBorders>
+                    <w:top w:val="single" w:space="0" w:color="D3D3D3"/>
+                    <w:bottom w:val="single" w:space="0" w:color="D3D3D3"/>
+                    <w:start w:val="single" w:space="0" w:color="D3D3D3"/>
+                    <w:end w:val="single" w:space="0" w:color="D3D3D3"/>
+                  </w:tcBorders>
+                </w:tcPr>
+                <w:p>
+                  <w:pPr>
+                    <w:spacing w:before="0" w:after="60"/>
+                    <w:keepNext/>
+                    <w:jc w:val="center"/>
+                  </w:pPr>
+                  <w:r>
+                    <w:rPr>
+                      <w:rFonts w:ascii="Calibri" w:hAnsi="Calibri"/>
+                      <w:sz w:val="20"/>
+                    </w:rPr>
+                    <w:t xml:space="default"/>
+                  </w:r>
+                </w:p>
+              </w:tc>
+              <w:tc>
+                <w:tcPr>
+                  <w:tcBorders>
+                    <w:top w:val="single" w:space="0" w:color="D3D3D3"/>
+                    <w:bottom w:val="single" w:space="0" w:color="D3D3D3"/>
+                    <w:start w:val="single" w:space="0" w:color="D3D3D3"/>
+                    <w:end w:val="single" w:space="0" w:color="D3D3D3"/>
+                  </w:tcBorders>
+                </w:tcPr>
+                <w:p>
+                  <w:pPr>
+                    <w:spacing w:before="0" w:after="60"/>
+                    <w:keepNext/>
+                    <w:jc w:val="center"/>
+                  </w:pPr>
+                  <w:r>
+                    <w:rPr>
+                      <w:rFonts w:ascii="Calibri" w:hAnsi="Calibri"/>
+                      <w:sz w:val="20"/>
+                    </w:rPr>
+                    <w:t xml:space="default"/>
+                  </w:r>
+                </w:p>
+              </w:tc>
+            </w:tr>
+            <w:tr>
+              <w:trPr>
+                <w:cantSplit/>
+              </w:trPr>
+              <w:tc>
+                <w:tcPr>
+                  <w:tcBorders>
+                    <w:top w:val="single" w:space="0" w:color="D3D3D3"/>
+                    <w:bottom w:val="single" w:space="0" w:color="D3D3D3"/>
+                    <w:start w:val="single" w:space="0" w:color="D3D3D3"/>
+                    <w:end w:val="single" w:space="0" w:color="D3D3D3"/>
+                  </w:tcBorders>
+                </w:tcPr>
+                <w:p>
+                  <w:pPr>
+                    <w:spacing w:before="0" w:after="60"/>
+                    <w:keepNext/>
+                    <w:jc w:val="start"/>
+                  </w:pPr>
+                  <w:r>
+                    <w:rPr>
+                      <w:rFonts w:ascii="Calibri" w:hAnsi="Calibri"/>
+                      <w:sz w:val="20"/>
+                    </w:rPr>
+                    <w:t xml:space="default">    Missing</w:t>
+                  </w:r>
+                </w:p>
+              </w:tc>
+              <w:tc>
+                <w:tcPr>
+                  <w:tcBorders>
+                    <w:top w:val="single" w:space="0" w:color="D3D3D3"/>
+                    <w:bottom w:val="single" w:space="0" w:color="D3D3D3"/>
+                    <w:start w:val="single" w:space="0" w:color="D3D3D3"/>
+                    <w:end w:val="single" w:space="0" w:color="D3D3D3"/>
+                  </w:tcBorders>
+                </w:tcPr>
+                <w:p>
+                  <w:pPr>
+                    <w:spacing w:before="0" w:after="60"/>
+                    <w:keepNext/>
+                    <w:jc w:val="center"/>
+                  </w:pPr>
+                  <w:r>
+                    <w:rPr>
+                      <w:rFonts w:ascii="Calibri" w:hAnsi="Calibri"/>
+                      <w:sz w:val="20"/>
+                    </w:rPr>
+                    <w:t xml:space="default"/>
+                  </w:r>
+                </w:p>
+              </w:tc>
+              <w:tc>
+                <w:tcPr>
+                  <w:tcBorders>
+                    <w:top w:val="single" w:space="0" w:color="D3D3D3"/>
+                    <w:bottom w:val="single" w:space="0" w:color="D3D3D3"/>
+                    <w:start w:val="single" w:space="0" w:color="D3D3D3"/>
+                    <w:end w:val="single" w:space="0" w:color="D3D3D3"/>
+                  </w:tcBorders>
+                </w:tcPr>
+                <w:p>
+                  <w:pPr>
+                    <w:spacing w:before="0" w:after="60"/>
+                    <w:keepNext/>
+                    <w:jc w:val="center"/>
+                  </w:pPr>
+                  <w:r>
+                    <w:rPr>
+                      <w:rFonts w:ascii="Calibri" w:hAnsi="Calibri"/>
+                      <w:sz w:val="20"/>
+                    </w:rPr>
+                    <w:t xml:space="default"/>
+                  </w:r>
+                </w:p>
+              </w:tc>
+              <w:tc>
+                <w:tcPr>
+                  <w:tcBorders>
+                    <w:top w:val="single" w:space="0" w:color="D3D3D3"/>
+                    <w:bottom w:val="single" w:space="0" w:color="D3D3D3"/>
+                    <w:start w:val="single" w:space="0" w:color="D3D3D3"/>
+                    <w:end w:val="single" w:space="0" w:color="D3D3D3"/>
+                  </w:tcBorders>
+                </w:tcPr>
+                <w:p>
+                  <w:pPr>
+                    <w:spacing w:before="0" w:after="60"/>
+                    <w:keepNext/>
+                    <w:jc w:val="center"/>
+                  </w:pPr>
+                  <w:r>
+                    <w:rPr>
+                      <w:rFonts w:ascii="Calibri" w:hAnsi="Calibri"/>
+                      <w:sz w:val="20"/>
+                    </w:rPr>
+                    <w:t xml:space="default"/>
+                  </w:r>
+                </w:p>
+              </w:tc>
+            </w:tr>
+            <w:tr>
+              <w:trPr>
+                <w:cantSplit/>
+              </w:trPr>
+              <w:tc>
+                <w:tcPr>
+                  <w:tcBorders>
+                    <w:top w:val="single" w:space="0" w:color="D3D3D3"/>
+                    <w:bottom w:val="single" w:space="0" w:color="D3D3D3"/>
+                    <w:start w:val="single" w:space="0" w:color="D3D3D3"/>
+                    <w:end w:val="single" w:space="0" w:color="D3D3D3"/>
+                  </w:tcBorders>
+                </w:tcPr>
+                <w:p>
+                  <w:pPr>
+                    <w:spacing w:before="0" w:after="60"/>
+                    <w:keepNext/>
+                    <w:jc w:val="start"/>
+                  </w:pPr>
+                  <w:r>
+                    <w:rPr>
+                      <w:rFonts w:ascii="Calibri" w:hAnsi="Calibri"/>
+                      <w:sz w:val="20"/>
+                    </w:rPr>
+                    <w:t xml:space="default">Systolic blood pressure (mmHg), Median (Q1, Q3)</w:t>
+                  </w:r>
+                </w:p>
+              </w:tc>
+              <w:tc>
+                <w:tcPr>
+                  <w:tcBorders>
+                    <w:top w:val="single" w:space="0" w:color="D3D3D3"/>
+                    <w:bottom w:val="single" w:space="0" w:color="D3D3D3"/>
+                    <w:start w:val="single" w:space="0" w:color="D3D3D3"/>
+                    <w:end w:val="single" w:space="0" w:color="D3D3D3"/>
+                  </w:tcBorders>
+                </w:tcPr>
+                <w:p>
+                  <w:pPr>
+                    <w:spacing w:before="0" w:after="60"/>
+                    <w:keepNext/>
+                    <w:jc w:val="center"/>
+                  </w:pPr>
+                  <w:r>
+                    <w:rPr>
+                      <w:rFonts w:ascii="Calibri" w:hAnsi="Calibri"/>
+                      <w:sz w:val="20"/>
+                    </w:rPr>
+                    <w:t xml:space="default"/>
+                  </w:r>
+                </w:p>
+              </w:tc>
+              <w:tc>
+                <w:tcPr>
+                  <w:tcBorders>
+                    <w:top w:val="single" w:space="0" w:color="D3D3D3"/>
+                    <w:bottom w:val="single" w:space="0" w:color="D3D3D3"/>
+                    <w:start w:val="single" w:space="0" w:color="D3D3D3"/>
+                    <w:end w:val="single" w:space="0" w:color="D3D3D3"/>
+                  </w:tcBorders>
+                </w:tcPr>
+                <w:p>
+                  <w:pPr>
+                    <w:spacing w:before="0" w:after="60"/>
+                    <w:keepNext/>
+                    <w:jc w:val="center"/>
+                  </w:pPr>
+                  <w:r>
+                    <w:rPr>
+                      <w:rFonts w:ascii="Calibri" w:hAnsi="Calibri"/>
+                      <w:sz w:val="20"/>
+                    </w:rPr>
+                    <w:t xml:space="default"/>
+                  </w:r>
+                </w:p>
+              </w:tc>
+              <w:tc>
+                <w:tcPr>
+                  <w:tcBorders>
+                    <w:top w:val="single" w:space="0" w:color="D3D3D3"/>
+                    <w:bottom w:val="single" w:space="0" w:color="D3D3D3"/>
+                    <w:start w:val="single" w:space="0" w:color="D3D3D3"/>
+                    <w:end w:val="single" w:space="0" w:color="D3D3D3"/>
+                  </w:tcBorders>
+                </w:tcPr>
+                <w:p>
+                  <w:pPr>
+                    <w:spacing w:before="0" w:after="60"/>
+                    <w:keepNext/>
+                    <w:jc w:val="center"/>
+                  </w:pPr>
+                  <w:r>
+                    <w:rPr>
+                      <w:rFonts w:ascii="Calibri" w:hAnsi="Calibri"/>
+                      <w:sz w:val="20"/>
+                    </w:rPr>
+                    <w:t xml:space="default"/>
+                  </w:r>
+                </w:p>
+              </w:tc>
+            </w:tr>
+            <w:tr>
+              <w:trPr>
+                <w:cantSplit/>
+              </w:trPr>
+              <w:tc>
+                <w:tcPr>
+                  <w:tcBorders>
+                    <w:top w:val="single" w:space="0" w:color="D3D3D3"/>
+                    <w:bottom w:val="single" w:space="0" w:color="D3D3D3"/>
+                    <w:start w:val="single" w:space="0" w:color="D3D3D3"/>
+                    <w:end w:val="single" w:space="0" w:color="D3D3D3"/>
+                  </w:tcBorders>
+                </w:tcPr>
+                <w:p>
+                  <w:pPr>
+                    <w:spacing w:before="0" w:after="60"/>
+                    <w:keepNext/>
+                    <w:jc w:val="start"/>
+                  </w:pPr>
+                  <w:r>
+                    <w:rPr>
+                      <w:rFonts w:ascii="Calibri" w:hAnsi="Calibri"/>
+                      <w:sz w:val="20"/>
+                    </w:rPr>
+                    <w:t xml:space="default">    Missing</w:t>
+                  </w:r>
+                </w:p>
+              </w:tc>
+              <w:tc>
+                <w:tcPr>
+                  <w:tcBorders>
+                    <w:top w:val="single" w:space="0" w:color="D3D3D3"/>
+                    <w:bottom w:val="single" w:space="0" w:color="D3D3D3"/>
+                    <w:start w:val="single" w:space="0" w:color="D3D3D3"/>
+                    <w:end w:val="single" w:space="0" w:color="D3D3D3"/>
+                  </w:tcBorders>
+                </w:tcPr>
+                <w:p>
+                  <w:pPr>
+                    <w:spacing w:before="0" w:after="60"/>
+                    <w:keepNext/>
+                    <w:jc w:val="center"/>
+                  </w:pPr>
+                  <w:r>
+                    <w:rPr>
+                      <w:rFonts w:ascii="Calibri" w:hAnsi="Calibri"/>
+                      <w:sz w:val="20"/>
+                    </w:rPr>
+                    <w:t xml:space="default"/>
+                  </w:r>
+                </w:p>
+              </w:tc>
+              <w:tc>
+                <w:tcPr>
+                  <w:tcBorders>
+                    <w:top w:val="single" w:space="0" w:color="D3D3D3"/>
+                    <w:bottom w:val="single" w:space="0" w:color="D3D3D3"/>
+                    <w:start w:val="single" w:space="0" w:color="D3D3D3"/>
+                    <w:end w:val="single" w:space="0" w:color="D3D3D3"/>
+                  </w:tcBorders>
+                </w:tcPr>
+                <w:p>
+                  <w:pPr>
+                    <w:spacing w:before="0" w:after="60"/>
+                    <w:keepNext/>
+                    <w:jc w:val="center"/>
+                  </w:pPr>
+                  <w:r>
+                    <w:rPr>
+                      <w:rFonts w:ascii="Calibri" w:hAnsi="Calibri"/>
+                      <w:sz w:val="20"/>
+                    </w:rPr>
+                    <w:t xml:space="default"/>
+                  </w:r>
+                </w:p>
+              </w:tc>
+              <w:tc>
+                <w:tcPr>
+                  <w:tcBorders>
+                    <w:top w:val="single" w:space="0" w:color="D3D3D3"/>
+                    <w:bottom w:val="single" w:space="0" w:color="D3D3D3"/>
+                    <w:start w:val="single" w:space="0" w:color="D3D3D3"/>
+                    <w:end w:val="single" w:space="0" w:color="D3D3D3"/>
+                  </w:tcBorders>
+                </w:tcPr>
+                <w:p>
+                  <w:pPr>
+                    <w:spacing w:before="0" w:after="60"/>
+                    <w:keepNext/>
+                    <w:jc w:val="center"/>
+                  </w:pPr>
+                  <w:r>
+                    <w:rPr>
+                      <w:rFonts w:ascii="Calibri" w:hAnsi="Calibri"/>
+                      <w:sz w:val="20"/>
+                    </w:rPr>
+                    <w:t xml:space="default"/>
+                  </w:r>
+                </w:p>
+              </w:tc>
+            </w:tr>
+            <w:tr>
+              <w:trPr>
+                <w:cantSplit/>
+              </w:trPr>
+              <w:tc>
+                <w:tcPr>
+                  <w:tcBorders>
+                    <w:top w:val="single" w:space="0" w:color="D3D3D3"/>
+                    <w:bottom w:val="single" w:space="0" w:color="D3D3D3"/>
+                    <w:start w:val="single" w:space="0" w:color="D3D3D3"/>
+                    <w:end w:val="single" w:space="0" w:color="D3D3D3"/>
+                  </w:tcBorders>
+                </w:tcPr>
+                <w:p>
+                  <w:pPr>
+                    <w:spacing w:before="0" w:after="60"/>
+                    <w:keepNext/>
+                    <w:jc w:val="start"/>
+                  </w:pPr>
+                  <w:r>
+                    <w:rPr>
+                      <w:rFonts w:ascii="Calibri" w:hAnsi="Calibri"/>
+                      <w:sz w:val="20"/>
+                    </w:rPr>
+                    <w:t xml:space="default">Respiratory rate (breaths/min), Median (Q1, Q3)</w:t>
+                  </w:r>
+                </w:p>
+              </w:tc>
+              <w:tc>
+                <w:tcPr>
+                  <w:tcBorders>
+                    <w:top w:val="single" w:space="0" w:color="D3D3D3"/>
+                    <w:bottom w:val="single" w:space="0" w:color="D3D3D3"/>
+                    <w:start w:val="single" w:space="0" w:color="D3D3D3"/>
+                    <w:end w:val="single" w:space="0" w:color="D3D3D3"/>
+                  </w:tcBorders>
+                </w:tcPr>
+                <w:p>
+                  <w:pPr>
+                    <w:spacing w:before="0" w:after="60"/>
+                    <w:keepNext/>
+                    <w:jc w:val="center"/>
+                  </w:pPr>
+                  <w:r>
+                    <w:rPr>
+                      <w:rFonts w:ascii="Calibri" w:hAnsi="Calibri"/>
+                      <w:sz w:val="20"/>
+                    </w:rPr>
+                    <w:t xml:space="default"/>
+                  </w:r>
+                </w:p>
+              </w:tc>
+              <w:tc>
+                <w:tcPr>
+                  <w:tcBorders>
+                    <w:top w:val="single" w:space="0" w:color="D3D3D3"/>
+                    <w:bottom w:val="single" w:space="0" w:color="D3D3D3"/>
+                    <w:start w:val="single" w:space="0" w:color="D3D3D3"/>
+                    <w:end w:val="single" w:space="0" w:color="D3D3D3"/>
+                  </w:tcBorders>
+                </w:tcPr>
+                <w:p>
+                  <w:pPr>
+                    <w:spacing w:before="0" w:after="60"/>
+                    <w:keepNext/>
+                    <w:jc w:val="center"/>
+                  </w:pPr>
+                  <w:r>
+                    <w:rPr>
+                      <w:rFonts w:ascii="Calibri" w:hAnsi="Calibri"/>
+                      <w:sz w:val="20"/>
+                    </w:rPr>
+                    <w:t xml:space="default"/>
+                  </w:r>
+                </w:p>
+              </w:tc>
+              <w:tc>
+                <w:tcPr>
+                  <w:tcBorders>
+                    <w:top w:val="single" w:space="0" w:color="D3D3D3"/>
+                    <w:bottom w:val="single" w:space="0" w:color="D3D3D3"/>
+                    <w:start w:val="single" w:space="0" w:color="D3D3D3"/>
+                    <w:end w:val="single" w:space="0" w:color="D3D3D3"/>
+                  </w:tcBorders>
+                </w:tcPr>
+                <w:p>
+                  <w:pPr>
+                    <w:spacing w:before="0" w:after="60"/>
+                    <w:keepNext/>
+                    <w:jc w:val="center"/>
+                  </w:pPr>
+                  <w:r>
+                    <w:rPr>
+                      <w:rFonts w:ascii="Calibri" w:hAnsi="Calibri"/>
+                      <w:sz w:val="20"/>
+                    </w:rPr>
+                    <w:t xml:space="default"/>
+                  </w:r>
+                </w:p>
+              </w:tc>
+            </w:tr>
+            <w:tr>
+              <w:trPr>
+                <w:cantSplit/>
+              </w:trPr>
+              <w:tc>
+                <w:tcPr>
+                  <w:tcBorders>
+                    <w:top w:val="single" w:space="0" w:color="D3D3D3"/>
+                    <w:bottom w:val="single" w:space="0" w:color="D3D3D3"/>
+                    <w:start w:val="single" w:space="0" w:color="D3D3D3"/>
+                    <w:end w:val="single" w:space="0" w:color="D3D3D3"/>
+                  </w:tcBorders>
+                </w:tcPr>
+                <w:p>
+                  <w:pPr>
+                    <w:spacing w:before="0" w:after="60"/>
+                    <w:keepNext/>
+                    <w:jc w:val="start"/>
+                  </w:pPr>
+                  <w:r>
+                    <w:rPr>
+                      <w:rFonts w:ascii="Calibri" w:hAnsi="Calibri"/>
+                      <w:sz w:val="20"/>
+                    </w:rPr>
+                    <w:t xml:space="default">    Missing</w:t>
+                  </w:r>
+                </w:p>
+              </w:tc>
+              <w:tc>
+                <w:tcPr>
+                  <w:tcBorders>
+                    <w:top w:val="single" w:space="0" w:color="D3D3D3"/>
+                    <w:bottom w:val="single" w:space="0" w:color="D3D3D3"/>
+                    <w:start w:val="single" w:space="0" w:color="D3D3D3"/>
+                    <w:end w:val="single" w:space="0" w:color="D3D3D3"/>
+                  </w:tcBorders>
+                </w:tcPr>
+                <w:p>
+                  <w:pPr>
+                    <w:spacing w:before="0" w:after="60"/>
+                    <w:keepNext/>
+                    <w:jc w:val="center"/>
+                  </w:pPr>
+                  <w:r>
+                    <w:rPr>
+                      <w:rFonts w:ascii="Calibri" w:hAnsi="Calibri"/>
+                      <w:sz w:val="20"/>
+                    </w:rPr>
+                    <w:t xml:space="default"/>
+                  </w:r>
+                </w:p>
+              </w:tc>
+              <w:tc>
+                <w:tcPr>
+                  <w:tcBorders>
+                    <w:top w:val="single" w:space="0" w:color="D3D3D3"/>
+                    <w:bottom w:val="single" w:space="0" w:color="D3D3D3"/>
+                    <w:start w:val="single" w:space="0" w:color="D3D3D3"/>
+                    <w:end w:val="single" w:space="0" w:color="D3D3D3"/>
+                  </w:tcBorders>
+                </w:tcPr>
+                <w:p>
+                  <w:pPr>
+                    <w:spacing w:before="0" w:after="60"/>
+                    <w:keepNext/>
+                    <w:jc w:val="center"/>
+                  </w:pPr>
+                  <w:r>
+                    <w:rPr>
+                      <w:rFonts w:ascii="Calibri" w:hAnsi="Calibri"/>
+                      <w:sz w:val="20"/>
+                    </w:rPr>
+                    <w:t xml:space="default"/>
+                  </w:r>
+                </w:p>
+              </w:tc>
+              <w:tc>
+                <w:tcPr>
+                  <w:tcBorders>
+                    <w:top w:val="single" w:space="0" w:color="D3D3D3"/>
+                    <w:bottom w:val="single" w:space="0" w:color="D3D3D3"/>
+                    <w:start w:val="single" w:space="0" w:color="D3D3D3"/>
+                    <w:end w:val="single" w:space="0" w:color="D3D3D3"/>
+                  </w:tcBorders>
+                </w:tcPr>
+                <w:p>
+                  <w:pPr>
+                    <w:spacing w:before="0" w:after="60"/>
+                    <w:keepNext/>
+                    <w:jc w:val="center"/>
+                  </w:pPr>
+                  <w:r>
+                    <w:rPr>
+                      <w:rFonts w:ascii="Calibri" w:hAnsi="Calibri"/>
+                      <w:sz w:val="20"/>
+                    </w:rPr>
+                    <w:t xml:space="default"/>
+                  </w:r>
+                </w:p>
+              </w:tc>
+            </w:tr>
+            <w:tr>
+              <w:trPr>
+                <w:cantSplit/>
+              </w:trPr>
+              <w:tc>
+                <w:tcPr>
+                  <w:tcBorders>
+                    <w:top w:val="single" w:space="0" w:color="D3D3D3"/>
+                    <w:bottom w:val="single" w:space="0" w:color="D3D3D3"/>
+                    <w:start w:val="single" w:space="0" w:color="D3D3D3"/>
+                    <w:end w:val="single" w:space="0" w:color="D3D3D3"/>
+                  </w:tcBorders>
+                </w:tcPr>
+                <w:p>
+                  <w:pPr>
+                    <w:spacing w:before="0" w:after="60"/>
+                    <w:keepNext/>
+                    <w:jc w:val="start"/>
+                  </w:pPr>
+                  <w:r>
+                    <w:rPr>
+                      <w:rFonts w:ascii="Calibri" w:hAnsi="Calibri"/>
+                      <w:sz w:val="20"/>
+                    </w:rPr>
+                    <w:t xml:space="default">Oxygen saturation (%), Median (Q1, Q3)</w:t>
+                  </w:r>
+                </w:p>
+              </w:tc>
+              <w:tc>
+                <w:tcPr>
+                  <w:tcBorders>
+                    <w:top w:val="single" w:space="0" w:color="D3D3D3"/>
+                    <w:bottom w:val="single" w:space="0" w:color="D3D3D3"/>
+                    <w:start w:val="single" w:space="0" w:color="D3D3D3"/>
+                    <w:end w:val="single" w:space="0" w:color="D3D3D3"/>
+                  </w:tcBorders>
+                </w:tcPr>
+                <w:p>
+                  <w:pPr>
+                    <w:spacing w:before="0" w:after="60"/>
+                    <w:keepNext/>
+                    <w:jc w:val="center"/>
+                  </w:pPr>
+                  <w:r>
+                    <w:rPr>
+                      <w:rFonts w:ascii="Calibri" w:hAnsi="Calibri"/>
+                      <w:sz w:val="20"/>
+                    </w:rPr>
+                    <w:t xml:space="default"/>
+                  </w:r>
+                </w:p>
+              </w:tc>
+              <w:tc>
+                <w:tcPr>
+                  <w:tcBorders>
+                    <w:top w:val="single" w:space="0" w:color="D3D3D3"/>
+                    <w:bottom w:val="single" w:space="0" w:color="D3D3D3"/>
+                    <w:start w:val="single" w:space="0" w:color="D3D3D3"/>
+                    <w:end w:val="single" w:space="0" w:color="D3D3D3"/>
+                  </w:tcBorders>
+                </w:tcPr>
+                <w:p>
+                  <w:pPr>
+                    <w:spacing w:before="0" w:after="60"/>
+                    <w:keepNext/>
+                    <w:jc w:val="center"/>
+                  </w:pPr>
+                  <w:r>
+                    <w:rPr>
+                      <w:rFonts w:ascii="Calibri" w:hAnsi="Calibri"/>
+                      <w:sz w:val="20"/>
+                    </w:rPr>
+                    <w:t xml:space="default"/>
+                  </w:r>
+                </w:p>
+              </w:tc>
+              <w:tc>
+                <w:tcPr>
+                  <w:tcBorders>
+                    <w:top w:val="single" w:space="0" w:color="D3D3D3"/>
+                    <w:bottom w:val="single" w:space="0" w:color="D3D3D3"/>
+                    <w:start w:val="single" w:space="0" w:color="D3D3D3"/>
+                    <w:end w:val="single" w:space="0" w:color="D3D3D3"/>
+                  </w:tcBorders>
+                </w:tcPr>
+                <w:p>
+                  <w:pPr>
+                    <w:spacing w:before="0" w:after="60"/>
+                    <w:keepNext/>
+                    <w:jc w:val="center"/>
+                  </w:pPr>
+                  <w:r>
+                    <w:rPr>
+                      <w:rFonts w:ascii="Calibri" w:hAnsi="Calibri"/>
+                      <w:sz w:val="20"/>
+                    </w:rPr>
+                    <w:t xml:space="default"/>
+                  </w:r>
+                </w:p>
+              </w:tc>
+            </w:tr>
+            <w:tr>
+              <w:trPr>
+                <w:cantSplit/>
+              </w:trPr>
+              <w:tc>
+                <w:tcPr>
+                  <w:tcBorders>
+                    <w:top w:val="single" w:space="0" w:color="D3D3D3"/>
+                    <w:bottom w:val="single" w:space="0" w:color="D3D3D3"/>
+                    <w:start w:val="single" w:space="0" w:color="D3D3D3"/>
+                    <w:end w:val="single" w:space="0" w:color="D3D3D3"/>
+                  </w:tcBorders>
+                </w:tcPr>
+                <w:p>
+                  <w:pPr>
+                    <w:spacing w:before="0" w:after="60"/>
+                    <w:keepNext/>
+                    <w:jc w:val="start"/>
+                  </w:pPr>
+                  <w:r>
+                    <w:rPr>
+                      <w:rFonts w:ascii="Calibri" w:hAnsi="Calibri"/>
+                      <w:sz w:val="20"/>
+                    </w:rPr>
+                    <w:t xml:space="default">    Missing</w:t>
+                  </w:r>
+                </w:p>
+              </w:tc>
+              <w:tc>
+                <w:tcPr>
+                  <w:tcBorders>
+                    <w:top w:val="single" w:space="0" w:color="D3D3D3"/>
+                    <w:bottom w:val="single" w:space="0" w:color="D3D3D3"/>
+                    <w:start w:val="single" w:space="0" w:color="D3D3D3"/>
+                    <w:end w:val="single" w:space="0" w:color="D3D3D3"/>
+                  </w:tcBorders>
+                </w:tcPr>
+                <w:p>
+                  <w:pPr>
+                    <w:spacing w:before="0" w:after="60"/>
+                    <w:keepNext/>
+                    <w:jc w:val="center"/>
+                  </w:pPr>
+                  <w:r>
+                    <w:rPr>
+                      <w:rFonts w:ascii="Calibri" w:hAnsi="Calibri"/>
+                      <w:sz w:val="20"/>
+                    </w:rPr>
+                    <w:t xml:space="default"/>
+                  </w:r>
+                </w:p>
+              </w:tc>
+              <w:tc>
+                <w:tcPr>
+                  <w:tcBorders>
+                    <w:top w:val="single" w:space="0" w:color="D3D3D3"/>
+                    <w:bottom w:val="single" w:space="0" w:color="D3D3D3"/>
+                    <w:start w:val="single" w:space="0" w:color="D3D3D3"/>
+                    <w:end w:val="single" w:space="0" w:color="D3D3D3"/>
+                  </w:tcBorders>
+                </w:tcPr>
+                <w:p>
+                  <w:pPr>
+                    <w:spacing w:before="0" w:after="60"/>
+                    <w:keepNext/>
+                    <w:jc w:val="center"/>
+                  </w:pPr>
+                  <w:r>
+                    <w:rPr>
+                      <w:rFonts w:ascii="Calibri" w:hAnsi="Calibri"/>
+                      <w:sz w:val="20"/>
+                    </w:rPr>
+                    <w:t xml:space="default"/>
+                  </w:r>
+                </w:p>
+              </w:tc>
+              <w:tc>
+                <w:tcPr>
+                  <w:tcBorders>
+                    <w:top w:val="single" w:space="0" w:color="D3D3D3"/>
+                    <w:bottom w:val="single" w:space="0" w:color="D3D3D3"/>
+                    <w:start w:val="single" w:space="0" w:color="D3D3D3"/>
+                    <w:end w:val="single" w:space="0" w:color="D3D3D3"/>
+                  </w:tcBorders>
+                </w:tcPr>
+                <w:p>
+                  <w:pPr>
+                    <w:spacing w:before="0" w:after="60"/>
+                    <w:keepNext/>
+                    <w:jc w:val="center"/>
+                  </w:pPr>
+                  <w:r>
+                    <w:rPr>
+                      <w:rFonts w:ascii="Calibri" w:hAnsi="Calibri"/>
+                      <w:sz w:val="20"/>
+                    </w:rPr>
+                    <w:t xml:space="default"/>
+                  </w:r>
+                </w:p>
+              </w:tc>
+            </w:tr>
+            <w:tr>
+              <w:trPr>
+                <w:cantSplit/>
+              </w:trPr>
+              <w:tc>
+                <w:tcPr>
+                  <w:tcBorders>
+                    <w:top w:val="single" w:space="0" w:color="D3D3D3"/>
+                    <w:bottom w:val="single" w:space="0" w:color="D3D3D3"/>
+                    <w:start w:val="single" w:space="0" w:color="D3D3D3"/>
+                    <w:end w:val="single" w:space="0" w:color="D3D3D3"/>
+                  </w:tcBorders>
+                </w:tcPr>
+                <w:p>
+                  <w:pPr>
+                    <w:spacing w:before="0" w:after="60"/>
+                    <w:keepNext/>
+                    <w:jc w:val="start"/>
+                  </w:pPr>
+                  <w:r>
+                    <w:rPr>
+                      <w:rFonts w:ascii="Calibri" w:hAnsi="Calibri"/>
+                      <w:sz w:val="20"/>
+                    </w:rPr>
+                    <w:t xml:space="default">Surgery, n (%)</w:t>
+                  </w:r>
+                </w:p>
+              </w:tc>
+              <w:tc>
+                <w:tcPr>
+                  <w:tcBorders>
+                    <w:top w:val="single" w:space="0" w:color="D3D3D3"/>
+                    <w:bottom w:val="single" w:space="0" w:color="D3D3D3"/>
+                    <w:start w:val="single" w:space="0" w:color="D3D3D3"/>
+                    <w:end w:val="single" w:space="0" w:color="D3D3D3"/>
+                  </w:tcBorders>
+                </w:tcPr>
+                <w:p>
+                  <w:pPr>
+                    <w:spacing w:before="0" w:after="60"/>
+                    <w:keepNext/>
+                    <w:jc w:val="center"/>
+                  </w:pPr>
+                  <w:r>
+                    <w:rPr>
+                      <w:rFonts w:ascii="Calibri" w:hAnsi="Calibri"/>
+                      <w:sz w:val="20"/>
+                    </w:rPr>
+                    <w:t xml:space="default"/>
+                  </w:r>
+                </w:p>
+              </w:tc>
+              <w:tc>
+                <w:tcPr>
+                  <w:tcBorders>
+                    <w:top w:val="single" w:space="0" w:color="D3D3D3"/>
+                    <w:bottom w:val="single" w:space="0" w:color="D3D3D3"/>
+                    <w:start w:val="single" w:space="0" w:color="D3D3D3"/>
+                    <w:end w:val="single" w:space="0" w:color="D3D3D3"/>
+                  </w:tcBorders>
+                </w:tcPr>
+                <w:p>
+                  <w:pPr>
+                    <w:spacing w:before="0" w:after="60"/>
+                    <w:keepNext/>
+                    <w:jc w:val="center"/>
+                  </w:pPr>
+                  <w:r>
+                    <w:rPr>
+                      <w:rFonts w:ascii="Calibri" w:hAnsi="Calibri"/>
+                      <w:sz w:val="20"/>
+                    </w:rPr>
+                    <w:t xml:space="default"/>
+                  </w:r>
+                </w:p>
+              </w:tc>
+              <w:tc>
+                <w:tcPr>
+                  <w:tcBorders>
+                    <w:top w:val="single" w:space="0" w:color="D3D3D3"/>
+                    <w:bottom w:val="single" w:space="0" w:color="D3D3D3"/>
+                    <w:start w:val="single" w:space="0" w:color="D3D3D3"/>
+                    <w:end w:val="single" w:space="0" w:color="D3D3D3"/>
+                  </w:tcBorders>
+                </w:tcPr>
+                <w:p>
+                  <w:pPr>
+                    <w:spacing w:before="0" w:after="60"/>
+                    <w:keepNext/>
+                    <w:jc w:val="center"/>
+                  </w:pPr>
+                  <w:r>
+                    <w:rPr>
+                      <w:rFonts w:ascii="Calibri" w:hAnsi="Calibri"/>
+                      <w:sz w:val="20"/>
+                    </w:rPr>
+                    <w:t xml:space="default"/>
+                  </w:r>
+                </w:p>
+              </w:tc>
+            </w:tr>
+            <w:tr>
+              <w:trPr>
+                <w:cantSplit/>
+              </w:trPr>
+              <w:tc>
+                <w:tcPr>
+                  <w:tcBorders>
+                    <w:top w:val="single" w:space="0" w:color="D3D3D3"/>
+                    <w:bottom w:val="single" w:space="0" w:color="D3D3D3"/>
+                    <w:start w:val="single" w:space="0" w:color="D3D3D3"/>
+                    <w:end w:val="single" w:space="0" w:color="D3D3D3"/>
+                  </w:tcBorders>
+                </w:tcPr>
+                <w:p>
+                  <w:pPr>
+                    <w:spacing w:before="0" w:after="60"/>
+                    <w:keepNext/>
+                    <w:jc w:val="start"/>
+                  </w:pPr>
+                  <w:r>
+                    <w:rPr>
+                      <w:rFonts w:ascii="Calibri" w:hAnsi="Calibri"/>
+                      <w:sz w:val="20"/>
+                    </w:rPr>
+                    <w:t xml:space="default">    Missing</w:t>
+                  </w:r>
+                </w:p>
+              </w:tc>
+              <w:tc>
+                <w:tcPr>
+                  <w:tcBorders>
+                    <w:top w:val="single" w:space="0" w:color="D3D3D3"/>
+                    <w:bottom w:val="single" w:space="0" w:color="D3D3D3"/>
+                    <w:start w:val="single" w:space="0" w:color="D3D3D3"/>
+                    <w:end w:val="single" w:space="0" w:color="D3D3D3"/>
+                  </w:tcBorders>
+                </w:tcPr>
+                <w:p>
+                  <w:pPr>
+                    <w:spacing w:before="0" w:after="60"/>
+                    <w:keepNext/>
+                    <w:jc w:val="center"/>
+                  </w:pPr>
+                  <w:r>
+                    <w:rPr>
+                      <w:rFonts w:ascii="Calibri" w:hAnsi="Calibri"/>
+                      <w:sz w:val="20"/>
+                    </w:rPr>
+                    <w:t xml:space="default"/>
+                  </w:r>
+                </w:p>
+              </w:tc>
+              <w:tc>
+                <w:tcPr>
+                  <w:tcBorders>
+                    <w:top w:val="single" w:space="0" w:color="D3D3D3"/>
+                    <w:bottom w:val="single" w:space="0" w:color="D3D3D3"/>
+                    <w:start w:val="single" w:space="0" w:color="D3D3D3"/>
+                    <w:end w:val="single" w:space="0" w:color="D3D3D3"/>
+                  </w:tcBorders>
+                </w:tcPr>
+                <w:p>
+                  <w:pPr>
+                    <w:spacing w:before="0" w:after="60"/>
+                    <w:keepNext/>
+                    <w:jc w:val="center"/>
+                  </w:pPr>
+                  <w:r>
+                    <w:rPr>
+                      <w:rFonts w:ascii="Calibri" w:hAnsi="Calibri"/>
+                      <w:sz w:val="20"/>
+                    </w:rPr>
+                    <w:t xml:space="default"/>
+                  </w:r>
+                </w:p>
+              </w:tc>
+              <w:tc>
+                <w:tcPr>
+                  <w:tcBorders>
+                    <w:top w:val="single" w:space="0" w:color="D3D3D3"/>
+                    <w:bottom w:val="single" w:space="0" w:color="D3D3D3"/>
+                    <w:start w:val="single" w:space="0" w:color="D3D3D3"/>
+                    <w:end w:val="single" w:space="0" w:color="D3D3D3"/>
+                  </w:tcBorders>
+                </w:tcPr>
+                <w:p>
+                  <w:pPr>
+                    <w:spacing w:before="0" w:after="60"/>
+                    <w:keepNext/>
+                    <w:jc w:val="center"/>
+                  </w:pPr>
+                  <w:r>
+                    <w:rPr>
+                      <w:rFonts w:ascii="Calibri" w:hAnsi="Calibri"/>
+                      <w:sz w:val="20"/>
+                    </w:rPr>
+                    <w:t xml:space="default"/>
+                  </w:r>
+                </w:p>
+              </w:tc>
+            </w:tr>
+            <w:tr>
+              <w:trPr>
+                <w:cantSplit/>
+              </w:trPr>
+              <w:tc>
+                <w:tcPr>
+                  <w:tcBorders>
+                    <w:top w:val="single" w:space="0" w:color="D3D3D3"/>
+                    <w:bottom w:val="single" w:space="0" w:color="D3D3D3"/>
+                    <w:start w:val="single" w:space="0" w:color="D3D3D3"/>
+                    <w:end w:val="single" w:space="0" w:color="D3D3D3"/>
+                  </w:tcBorders>
+                </w:tcPr>
+                <w:p>
+                  <w:pPr>
+                    <w:spacing w:before="0" w:after="60"/>
+                    <w:keepNext/>
+                    <w:jc w:val="start"/>
+                  </w:pPr>
+                  <w:r>
+                    <w:rPr>
+                      <w:rFonts w:ascii="Calibri" w:hAnsi="Calibri"/>
+                      <w:sz w:val="20"/>
+                    </w:rPr>
+                    <w:t xml:space="default">Transfusion, n (%)</w:t>
+                  </w:r>
+                </w:p>
+              </w:tc>
+              <w:tc>
+                <w:tcPr>
+                  <w:tcBorders>
+                    <w:top w:val="single" w:space="0" w:color="D3D3D3"/>
+                    <w:bottom w:val="single" w:space="0" w:color="D3D3D3"/>
+                    <w:start w:val="single" w:space="0" w:color="D3D3D3"/>
+                    <w:end w:val="single" w:space="0" w:color="D3D3D3"/>
+                  </w:tcBorders>
+                </w:tcPr>
+                <w:p>
+                  <w:pPr>
+                    <w:spacing w:before="0" w:after="60"/>
+                    <w:keepNext/>
+                    <w:jc w:val="center"/>
+                  </w:pPr>
+                  <w:r>
+                    <w:rPr>
+                      <w:rFonts w:ascii="Calibri" w:hAnsi="Calibri"/>
+                      <w:sz w:val="20"/>
+                    </w:rPr>
+                    <w:t xml:space="default"/>
+                  </w:r>
+                </w:p>
+              </w:tc>
+              <w:tc>
+                <w:tcPr>
+                  <w:tcBorders>
+                    <w:top w:val="single" w:space="0" w:color="D3D3D3"/>
+                    <w:bottom w:val="single" w:space="0" w:color="D3D3D3"/>
+                    <w:start w:val="single" w:space="0" w:color="D3D3D3"/>
+                    <w:end w:val="single" w:space="0" w:color="D3D3D3"/>
+                  </w:tcBorders>
+                </w:tcPr>
+                <w:p>
+                  <w:pPr>
+                    <w:spacing w:before="0" w:after="60"/>
+                    <w:keepNext/>
+                    <w:jc w:val="center"/>
+                  </w:pPr>
+                  <w:r>
+                    <w:rPr>
+                      <w:rFonts w:ascii="Calibri" w:hAnsi="Calibri"/>
+                      <w:sz w:val="20"/>
+                    </w:rPr>
+                    <w:t xml:space="default"/>
+                  </w:r>
+                </w:p>
+              </w:tc>
+              <w:tc>
+                <w:tcPr>
+                  <w:tcBorders>
+                    <w:top w:val="single" w:space="0" w:color="D3D3D3"/>
+                    <w:bottom w:val="single" w:space="0" w:color="D3D3D3"/>
+                    <w:start w:val="single" w:space="0" w:color="D3D3D3"/>
+                    <w:end w:val="single" w:space="0" w:color="D3D3D3"/>
+                  </w:tcBorders>
+                </w:tcPr>
+                <w:p>
+                  <w:pPr>
+                    <w:spacing w:before="0" w:after="60"/>
+                    <w:keepNext/>
+                    <w:jc w:val="center"/>
+                  </w:pPr>
+                  <w:r>
+                    <w:rPr>
+                      <w:rFonts w:ascii="Calibri" w:hAnsi="Calibri"/>
+                      <w:sz w:val="20"/>
+                    </w:rPr>
+                    <w:t xml:space="default"/>
+                  </w:r>
+                </w:p>
+              </w:tc>
+            </w:tr>
+            <w:tr>
+              <w:trPr>
+                <w:cantSplit/>
+              </w:trPr>
+              <w:tc>
+                <w:tcPr>
+                  <w:tcBorders>
+                    <w:top w:val="single" w:space="0" w:color="D3D3D3"/>
+                    <w:bottom w:val="single" w:space="0" w:color="D3D3D3"/>
+                    <w:start w:val="single" w:space="0" w:color="D3D3D3"/>
+                    <w:end w:val="single" w:space="0" w:color="D3D3D3"/>
+                  </w:tcBorders>
+                </w:tcPr>
+                <w:p>
+                  <w:pPr>
+                    <w:spacing w:before="0" w:after="60"/>
+                    <w:keepNext/>
+                    <w:jc w:val="start"/>
+                  </w:pPr>
+                  <w:r>
+                    <w:rPr>
+                      <w:rFonts w:ascii="Calibri" w:hAnsi="Calibri"/>
+                      <w:sz w:val="20"/>
+                    </w:rPr>
+                    <w:t xml:space="default">    Missing</w:t>
+                  </w:r>
+                </w:p>
+              </w:tc>
+              <w:tc>
+                <w:tcPr>
+                  <w:tcBorders>
+                    <w:top w:val="single" w:space="0" w:color="D3D3D3"/>
+                    <w:bottom w:val="single" w:space="0" w:color="D3D3D3"/>
+                    <w:start w:val="single" w:space="0" w:color="D3D3D3"/>
+                    <w:end w:val="single" w:space="0" w:color="D3D3D3"/>
+                  </w:tcBorders>
+                </w:tcPr>
+                <w:p>
+                  <w:pPr>
+                    <w:spacing w:before="0" w:after="60"/>
+                    <w:keepNext/>
+                    <w:jc w:val="center"/>
+                  </w:pPr>
+                  <w:r>
+                    <w:rPr>
+                      <w:rFonts w:ascii="Calibri" w:hAnsi="Calibri"/>
+                      <w:sz w:val="20"/>
+                    </w:rPr>
+                    <w:t xml:space="default"/>
+                  </w:r>
+                </w:p>
+              </w:tc>
+              <w:tc>
+                <w:tcPr>
+                  <w:tcBorders>
+                    <w:top w:val="single" w:space="0" w:color="D3D3D3"/>
+                    <w:bottom w:val="single" w:space="0" w:color="D3D3D3"/>
+                    <w:start w:val="single" w:space="0" w:color="D3D3D3"/>
+                    <w:end w:val="single" w:space="0" w:color="D3D3D3"/>
+                  </w:tcBorders>
+                </w:tcPr>
+                <w:p>
+                  <w:pPr>
+                    <w:spacing w:before="0" w:after="60"/>
+                    <w:keepNext/>
+                    <w:jc w:val="center"/>
+                  </w:pPr>
+                  <w:r>
+                    <w:rPr>
+                      <w:rFonts w:ascii="Calibri" w:hAnsi="Calibri"/>
+                      <w:sz w:val="20"/>
+                    </w:rPr>
+                    <w:t xml:space="default"/>
+                  </w:r>
+                </w:p>
+              </w:tc>
+              <w:tc>
+                <w:tcPr>
+                  <w:tcBorders>
+                    <w:top w:val="single" w:space="0" w:color="D3D3D3"/>
+                    <w:bottom w:val="single" w:space="0" w:color="D3D3D3"/>
+                    <w:start w:val="single" w:space="0" w:color="D3D3D3"/>
+                    <w:end w:val="single" w:space="0" w:color="D3D3D3"/>
+                  </w:tcBorders>
+                </w:tcPr>
+                <w:p>
+                  <w:pPr>
+                    <w:spacing w:before="0" w:after="60"/>
+                    <w:keepNext/>
+                    <w:jc w:val="center"/>
+                  </w:pPr>
+                  <w:r>
+                    <w:rPr>
+                      <w:rFonts w:ascii="Calibri" w:hAnsi="Calibri"/>
+                      <w:sz w:val="20"/>
+                    </w:rPr>
+                    <w:t xml:space="default"/>
+                  </w:r>
+                </w:p>
+              </w:tc>
+            </w:tr>
+            <w:tr>
+              <w:trPr>
+                <w:cantSplit/>
+              </w:trPr>
+              <w:tc>
+                <w:tcPr>
+                  <w:tcBorders>
+                    <w:top w:val="single" w:space="0" w:color="D3D3D3"/>
+                    <w:bottom w:val="single" w:space="0" w:color="D3D3D3"/>
+                    <w:start w:val="single" w:space="0" w:color="D3D3D3"/>
+                    <w:end w:val="single" w:space="0" w:color="D3D3D3"/>
+                  </w:tcBorders>
+                </w:tcPr>
+                <w:p>
+                  <w:pPr>
+                    <w:spacing w:before="0" w:after="60"/>
+                    <w:keepNext/>
+                    <w:jc w:val="start"/>
+                  </w:pPr>
+                  <w:r>
+                    <w:rPr>
+                      <w:rFonts w:ascii="Calibri" w:hAnsi="Calibri"/>
+                      <w:sz w:val="20"/>
+                    </w:rPr>
+                    <w:t xml:space="default">Imaging, n (%)</w:t>
+                  </w:r>
+                </w:p>
+              </w:tc>
+              <w:tc>
+                <w:tcPr>
+                  <w:tcBorders>
+                    <w:top w:val="single" w:space="0" w:color="D3D3D3"/>
+                    <w:bottom w:val="single" w:space="0" w:color="D3D3D3"/>
+                    <w:start w:val="single" w:space="0" w:color="D3D3D3"/>
+                    <w:end w:val="single" w:space="0" w:color="D3D3D3"/>
+                  </w:tcBorders>
+                </w:tcPr>
+                <w:p>
+                  <w:pPr>
+                    <w:spacing w:before="0" w:after="60"/>
+                    <w:keepNext/>
+                    <w:jc w:val="center"/>
+                  </w:pPr>
+                  <w:r>
+                    <w:rPr>
+                      <w:rFonts w:ascii="Calibri" w:hAnsi="Calibri"/>
+                      <w:sz w:val="20"/>
+                    </w:rPr>
+                    <w:t xml:space="default"/>
+                  </w:r>
+                </w:p>
+              </w:tc>
+              <w:tc>
+                <w:tcPr>
+                  <w:tcBorders>
+                    <w:top w:val="single" w:space="0" w:color="D3D3D3"/>
+                    <w:bottom w:val="single" w:space="0" w:color="D3D3D3"/>
+                    <w:start w:val="single" w:space="0" w:color="D3D3D3"/>
+                    <w:end w:val="single" w:space="0" w:color="D3D3D3"/>
+                  </w:tcBorders>
+                </w:tcPr>
+                <w:p>
+                  <w:pPr>
+                    <w:spacing w:before="0" w:after="60"/>
+                    <w:keepNext/>
+                    <w:jc w:val="center"/>
+                  </w:pPr>
+                  <w:r>
+                    <w:rPr>
+                      <w:rFonts w:ascii="Calibri" w:hAnsi="Calibri"/>
+                      <w:sz w:val="20"/>
+                    </w:rPr>
+                    <w:t xml:space="default"/>
+                  </w:r>
+                </w:p>
+              </w:tc>
+              <w:tc>
+                <w:tcPr>
+                  <w:tcBorders>
+                    <w:top w:val="single" w:space="0" w:color="D3D3D3"/>
+                    <w:bottom w:val="single" w:space="0" w:color="D3D3D3"/>
+                    <w:start w:val="single" w:space="0" w:color="D3D3D3"/>
+                    <w:end w:val="single" w:space="0" w:color="D3D3D3"/>
+                  </w:tcBorders>
+                </w:tcPr>
+                <w:p>
+                  <w:pPr>
+                    <w:spacing w:before="0" w:after="60"/>
+                    <w:keepNext/>
+                    <w:jc w:val="center"/>
+                  </w:pPr>
+                  <w:r>
+                    <w:rPr>
+                      <w:rFonts w:ascii="Calibri" w:hAnsi="Calibri"/>
+                      <w:sz w:val="20"/>
+                    </w:rPr>
+                    <w:t xml:space="default"/>
+                  </w:r>
+                </w:p>
+              </w:tc>
+            </w:tr>
+            <w:tr>
+              <w:trPr>
+                <w:cantSplit/>
+              </w:trPr>
+              <w:tc>
+                <w:tcPr>
+                  <w:tcBorders>
+                    <w:top w:val="single" w:space="0" w:color="D3D3D3"/>
+                    <w:bottom w:val="single" w:space="0" w:color="D3D3D3"/>
+                    <w:start w:val="single" w:space="0" w:color="D3D3D3"/>
+                    <w:end w:val="single" w:space="0" w:color="D3D3D3"/>
+                  </w:tcBorders>
+                </w:tcPr>
+                <w:p>
+                  <w:pPr>
+                    <w:spacing w:before="0" w:after="60"/>
+                    <w:keepNext/>
+                    <w:jc w:val="start"/>
+                  </w:pPr>
+                  <w:r>
+                    <w:rPr>
+                      <w:rFonts w:ascii="Calibri" w:hAnsi="Calibri"/>
+                      <w:sz w:val="20"/>
+                    </w:rPr>
+                    <w:t xml:space="default">    Ultrasound</w:t>
+                  </w:r>
+                </w:p>
+              </w:tc>
+              <w:tc>
+                <w:tcPr>
+                  <w:tcBorders>
+                    <w:top w:val="single" w:space="0" w:color="D3D3D3"/>
+                    <w:bottom w:val="single" w:space="0" w:color="D3D3D3"/>
+                    <w:start w:val="single" w:space="0" w:color="D3D3D3"/>
+                    <w:end w:val="single" w:space="0" w:color="D3D3D3"/>
+                  </w:tcBorders>
+                </w:tcPr>
+                <w:p>
+                  <w:pPr>
+                    <w:spacing w:before="0" w:after="60"/>
+                    <w:keepNext/>
+                    <w:jc w:val="center"/>
+                  </w:pPr>
+                  <w:r>
+                    <w:rPr>
+                      <w:rFonts w:ascii="Calibri" w:hAnsi="Calibri"/>
+                      <w:sz w:val="20"/>
+                    </w:rPr>
+                    <w:t xml:space="default"/>
+                  </w:r>
+                </w:p>
+              </w:tc>
+              <w:tc>
+                <w:tcPr>
+                  <w:tcBorders>
+                    <w:top w:val="single" w:space="0" w:color="D3D3D3"/>
+                    <w:bottom w:val="single" w:space="0" w:color="D3D3D3"/>
+                    <w:start w:val="single" w:space="0" w:color="D3D3D3"/>
+                    <w:end w:val="single" w:space="0" w:color="D3D3D3"/>
+                  </w:tcBorders>
+                </w:tcPr>
+                <w:p>
+                  <w:pPr>
+                    <w:spacing w:before="0" w:after="60"/>
+                    <w:keepNext/>
+                    <w:jc w:val="center"/>
+                  </w:pPr>
+                  <w:r>
+                    <w:rPr>
+                      <w:rFonts w:ascii="Calibri" w:hAnsi="Calibri"/>
+                      <w:sz w:val="20"/>
+                    </w:rPr>
+                    <w:t xml:space="default"/>
+                  </w:r>
+                </w:p>
+              </w:tc>
+              <w:tc>
+                <w:tcPr>
+                  <w:tcBorders>
+                    <w:top w:val="single" w:space="0" w:color="D3D3D3"/>
+                    <w:bottom w:val="single" w:space="0" w:color="D3D3D3"/>
+                    <w:start w:val="single" w:space="0" w:color="D3D3D3"/>
+                    <w:end w:val="single" w:space="0" w:color="D3D3D3"/>
+                  </w:tcBorders>
+                </w:tcPr>
+                <w:p>
+                  <w:pPr>
+                    <w:spacing w:before="0" w:after="60"/>
+                    <w:keepNext/>
+                    <w:jc w:val="center"/>
+                  </w:pPr>
+                  <w:r>
+                    <w:rPr>
+                      <w:rFonts w:ascii="Calibri" w:hAnsi="Calibri"/>
+                      <w:sz w:val="20"/>
+                    </w:rPr>
+                    <w:t xml:space="default"/>
+                  </w:r>
+                </w:p>
+              </w:tc>
+            </w:tr>
+            <w:tr>
+              <w:trPr>
+                <w:cantSplit/>
+              </w:trPr>
+              <w:tc>
+                <w:tcPr>
+                  <w:tcBorders>
+                    <w:top w:val="single" w:space="0" w:color="D3D3D3"/>
+                    <w:bottom w:val="single" w:space="0" w:color="D3D3D3"/>
+                    <w:start w:val="single" w:space="0" w:color="D3D3D3"/>
+                    <w:end w:val="single" w:space="0" w:color="D3D3D3"/>
+                  </w:tcBorders>
+                </w:tcPr>
+                <w:p>
+                  <w:pPr>
+                    <w:spacing w:before="0" w:after="60"/>
+                    <w:keepNext/>
+                    <w:jc w:val="start"/>
+                  </w:pPr>
+                  <w:r>
+                    <w:rPr>
+                      <w:rFonts w:ascii="Calibri" w:hAnsi="Calibri"/>
+                      <w:sz w:val="20"/>
+                    </w:rPr>
+                    <w:t xml:space="default">    X-ray</w:t>
+                  </w:r>
+                </w:p>
+              </w:tc>
+              <w:tc>
+                <w:tcPr>
+                  <w:tcBorders>
+                    <w:top w:val="single" w:space="0" w:color="D3D3D3"/>
+                    <w:bottom w:val="single" w:space="0" w:color="D3D3D3"/>
+                    <w:start w:val="single" w:space="0" w:color="D3D3D3"/>
+                    <w:end w:val="single" w:space="0" w:color="D3D3D3"/>
+                  </w:tcBorders>
+                </w:tcPr>
+                <w:p>
+                  <w:pPr>
+                    <w:spacing w:before="0" w:after="60"/>
+                    <w:keepNext/>
+                    <w:jc w:val="center"/>
+                  </w:pPr>
+                  <w:r>
+                    <w:rPr>
+                      <w:rFonts w:ascii="Calibri" w:hAnsi="Calibri"/>
+                      <w:sz w:val="20"/>
+                    </w:rPr>
+                    <w:t xml:space="default"/>
+                  </w:r>
+                </w:p>
+              </w:tc>
+              <w:tc>
+                <w:tcPr>
+                  <w:tcBorders>
+                    <w:top w:val="single" w:space="0" w:color="D3D3D3"/>
+                    <w:bottom w:val="single" w:space="0" w:color="D3D3D3"/>
+                    <w:start w:val="single" w:space="0" w:color="D3D3D3"/>
+                    <w:end w:val="single" w:space="0" w:color="D3D3D3"/>
+                  </w:tcBorders>
+                </w:tcPr>
+                <w:p>
+                  <w:pPr>
+                    <w:spacing w:before="0" w:after="60"/>
+                    <w:keepNext/>
+                    <w:jc w:val="center"/>
+                  </w:pPr>
+                  <w:r>
+                    <w:rPr>
+                      <w:rFonts w:ascii="Calibri" w:hAnsi="Calibri"/>
+                      <w:sz w:val="20"/>
+                    </w:rPr>
+                    <w:t xml:space="default"/>
+                  </w:r>
+                </w:p>
+              </w:tc>
+              <w:tc>
+                <w:tcPr>
+                  <w:tcBorders>
+                    <w:top w:val="single" w:space="0" w:color="D3D3D3"/>
+                    <w:bottom w:val="single" w:space="0" w:color="D3D3D3"/>
+                    <w:start w:val="single" w:space="0" w:color="D3D3D3"/>
+                    <w:end w:val="single" w:space="0" w:color="D3D3D3"/>
+                  </w:tcBorders>
+                </w:tcPr>
+                <w:p>
+                  <w:pPr>
+                    <w:spacing w:before="0" w:after="60"/>
+                    <w:keepNext/>
+                    <w:jc w:val="center"/>
+                  </w:pPr>
+                  <w:r>
+                    <w:rPr>
+                      <w:rFonts w:ascii="Calibri" w:hAnsi="Calibri"/>
+                      <w:sz w:val="20"/>
+                    </w:rPr>
+                    <w:t xml:space="default"/>
+                  </w:r>
+                </w:p>
+              </w:tc>
+            </w:tr>
+            <w:tr>
+              <w:trPr>
+                <w:cantSplit/>
+              </w:trPr>
+              <w:tc>
+                <w:tcPr>
+                  <w:tcBorders>
+                    <w:top w:val="single" w:space="0" w:color="D3D3D3"/>
+                    <w:bottom w:val="single" w:space="0" w:color="D3D3D3"/>
+                    <w:start w:val="single" w:space="0" w:color="D3D3D3"/>
+                    <w:end w:val="single" w:space="0" w:color="D3D3D3"/>
+                  </w:tcBorders>
+                </w:tcPr>
+                <w:p>
+                  <w:pPr>
+                    <w:spacing w:before="0" w:after="60"/>
+                    <w:keepNext/>
+                    <w:jc w:val="start"/>
+                  </w:pPr>
+                  <w:r>
+                    <w:rPr>
+                      <w:rFonts w:ascii="Calibri" w:hAnsi="Calibri"/>
+                      <w:sz w:val="20"/>
+                    </w:rPr>
+                    <w:t xml:space="default">    CT</w:t>
+                  </w:r>
+                </w:p>
+              </w:tc>
+              <w:tc>
+                <w:tcPr>
+                  <w:tcBorders>
+                    <w:top w:val="single" w:space="0" w:color="D3D3D3"/>
+                    <w:bottom w:val="single" w:space="0" w:color="D3D3D3"/>
+                    <w:start w:val="single" w:space="0" w:color="D3D3D3"/>
+                    <w:end w:val="single" w:space="0" w:color="D3D3D3"/>
+                  </w:tcBorders>
+                </w:tcPr>
+                <w:p>
+                  <w:pPr>
+                    <w:spacing w:before="0" w:after="60"/>
+                    <w:keepNext/>
+                    <w:jc w:val="center"/>
+                  </w:pPr>
+                  <w:r>
+                    <w:rPr>
+                      <w:rFonts w:ascii="Calibri" w:hAnsi="Calibri"/>
+                      <w:sz w:val="20"/>
+                    </w:rPr>
+                    <w:t xml:space="default"/>
+                  </w:r>
+                </w:p>
+              </w:tc>
+              <w:tc>
+                <w:tcPr>
+                  <w:tcBorders>
+                    <w:top w:val="single" w:space="0" w:color="D3D3D3"/>
+                    <w:bottom w:val="single" w:space="0" w:color="D3D3D3"/>
+                    <w:start w:val="single" w:space="0" w:color="D3D3D3"/>
+                    <w:end w:val="single" w:space="0" w:color="D3D3D3"/>
+                  </w:tcBorders>
+                </w:tcPr>
+                <w:p>
+                  <w:pPr>
+                    <w:spacing w:before="0" w:after="60"/>
+                    <w:keepNext/>
+                    <w:jc w:val="center"/>
+                  </w:pPr>
+                  <w:r>
+                    <w:rPr>
+                      <w:rFonts w:ascii="Calibri" w:hAnsi="Calibri"/>
+                      <w:sz w:val="20"/>
+                    </w:rPr>
+                    <w:t xml:space="default"/>
+                  </w:r>
+                </w:p>
+              </w:tc>
+              <w:tc>
+                <w:tcPr>
+                  <w:tcBorders>
+                    <w:top w:val="single" w:space="0" w:color="D3D3D3"/>
+                    <w:bottom w:val="single" w:space="0" w:color="D3D3D3"/>
+                    <w:start w:val="single" w:space="0" w:color="D3D3D3"/>
+                    <w:end w:val="single" w:space="0" w:color="D3D3D3"/>
+                  </w:tcBorders>
+                </w:tcPr>
+                <w:p>
+                  <w:pPr>
+                    <w:spacing w:before="0" w:after="60"/>
+                    <w:keepNext/>
+                    <w:jc w:val="center"/>
+                  </w:pPr>
+                  <w:r>
+                    <w:rPr>
+                      <w:rFonts w:ascii="Calibri" w:hAnsi="Calibri"/>
+                      <w:sz w:val="20"/>
+                    </w:rPr>
+                    <w:t xml:space="default"/>
+                  </w:r>
+                </w:p>
+              </w:tc>
+            </w:tr>
+            <w:tr>
+              <w:trPr>
+                <w:cantSplit/>
+              </w:trPr>
+              <w:tc>
+                <w:tcPr>
+                  <w:tcBorders>
+                    <w:top w:val="single" w:space="0" w:color="D3D3D3"/>
+                    <w:bottom w:val="single" w:space="0" w:color="D3D3D3"/>
+                    <w:start w:val="single" w:space="0" w:color="D3D3D3"/>
+                    <w:end w:val="single" w:space="0" w:color="D3D3D3"/>
+                  </w:tcBorders>
+                </w:tcPr>
+                <w:p>
+                  <w:pPr>
+                    <w:spacing w:before="0" w:after="60"/>
+                    <w:keepNext/>
+                    <w:jc w:val="start"/>
+                  </w:pPr>
+                  <w:r>
+                    <w:rPr>
+                      <w:rFonts w:ascii="Calibri" w:hAnsi="Calibri"/>
+                      <w:sz w:val="20"/>
+                    </w:rPr>
+                    <w:t xml:space="default">    Missing</w:t>
+                  </w:r>
+                </w:p>
+              </w:tc>
+              <w:tc>
+                <w:tcPr>
+                  <w:tcBorders>
+                    <w:top w:val="single" w:space="0" w:color="D3D3D3"/>
+                    <w:bottom w:val="single" w:space="0" w:color="D3D3D3"/>
+                    <w:start w:val="single" w:space="0" w:color="D3D3D3"/>
+                    <w:end w:val="single" w:space="0" w:color="D3D3D3"/>
+                  </w:tcBorders>
+                </w:tcPr>
+                <w:p>
+                  <w:pPr>
+                    <w:spacing w:before="0" w:after="60"/>
+                    <w:keepNext/>
+                    <w:jc w:val="center"/>
+                  </w:pPr>
+                  <w:r>
+                    <w:rPr>
+                      <w:rFonts w:ascii="Calibri" w:hAnsi="Calibri"/>
+                      <w:sz w:val="20"/>
+                    </w:rPr>
+                    <w:t xml:space="default"/>
+                  </w:r>
+                </w:p>
+              </w:tc>
+              <w:tc>
+                <w:tcPr>
+                  <w:tcBorders>
+                    <w:top w:val="single" w:space="0" w:color="D3D3D3"/>
+                    <w:bottom w:val="single" w:space="0" w:color="D3D3D3"/>
+                    <w:start w:val="single" w:space="0" w:color="D3D3D3"/>
+                    <w:end w:val="single" w:space="0" w:color="D3D3D3"/>
+                  </w:tcBorders>
+                </w:tcPr>
+                <w:p>
+                  <w:pPr>
+                    <w:spacing w:before="0" w:after="60"/>
+                    <w:keepNext/>
+                    <w:jc w:val="center"/>
+                  </w:pPr>
+                  <w:r>
+                    <w:rPr>
+                      <w:rFonts w:ascii="Calibri" w:hAnsi="Calibri"/>
+                      <w:sz w:val="20"/>
+                    </w:rPr>
+                    <w:t xml:space="default"/>
+                  </w:r>
+                </w:p>
+              </w:tc>
+              <w:tc>
+                <w:tcPr>
+                  <w:tcBorders>
+                    <w:top w:val="single" w:space="0" w:color="D3D3D3"/>
+                    <w:bottom w:val="single" w:space="0" w:color="D3D3D3"/>
+                    <w:start w:val="single" w:space="0" w:color="D3D3D3"/>
+                    <w:end w:val="single" w:space="0" w:color="D3D3D3"/>
+                  </w:tcBorders>
+                </w:tcPr>
+                <w:p>
+                  <w:pPr>
+                    <w:spacing w:before="0" w:after="60"/>
+                    <w:keepNext/>
+                    <w:jc w:val="center"/>
+                  </w:pPr>
+                  <w:r>
+                    <w:rPr>
+                      <w:rFonts w:ascii="Calibri" w:hAnsi="Calibri"/>
+                      <w:sz w:val="20"/>
+                    </w:rPr>
+                    <w:t xml:space="default"/>
+                  </w:r>
+                </w:p>
+              </w:tc>
+            </w:tr>
+          </w:tbl>
+          <w:bookmarkEnd w:id="84"/>
+        </w:tc>
+      </w:tr>
+    </w:tbl>
     <w:bookmarkEnd w:id="85"/>
-    <w:bookmarkStart w:id="86" w:name="interim-analysis"/>
+    <w:bookmarkEnd w:id="86"/>
+    <w:bookmarkStart w:id="87" w:name="interim-analysis"/>
     <w:p>
       <w:pPr>
         <w:pStyle w:val="Heading2"/>
@@ -6308,8 +9971,8 @@
         <w:t xml:space="preserve">There will be one interim analysis after half of the batches have completed the trial. The interim analysis will be assessed by the joint Trial Steering and Data Monitoring Committee. The purposes of this interim analysis will be to assess the trial’s feasibility and recommend that the trial be stopped if it is not feasible (e.g. if hospitals fail to adhere to the randomisation schedule or if there are substantial missing data in outcomes), and to compare characteristics across intervention conditions to monitor for differential recruitment/ascertainment between the intervention and control groups. No efficacy stopping is planned because any estimates obtained at the time point of the interim analysis will be associated with major statistical uncertainties.</w:t>
       </w:r>
     </w:p>
-    <w:bookmarkEnd w:id="86"/>
-    <w:bookmarkStart w:id="108" w:name="analysis-of-the-primary-outcome"/>
+    <w:bookmarkEnd w:id="87"/>
+    <w:bookmarkStart w:id="109" w:name="analysis-of-the-primary-outcome"/>
     <w:p>
       <w:pPr>
         <w:pStyle w:val="Heading2"/>
@@ -6387,7 +10050,7 @@
       <w:pPr>
         <w:pStyle w:val="FirstParagraph"/>
       </w:pPr>
-      <w:bookmarkStart w:id="87" w:name="eq-primary-model"/>
+      <w:bookmarkStart w:id="88" w:name="eq-primary-model"/>
       <m:oMathPara>
         <m:oMathParaPr>
           <m:jc m:val="center"/>
@@ -6574,7 +10237,7 @@
           </m:d>
         </m:oMath>
       </m:oMathPara>
-      <w:bookmarkEnd w:id="87"/>
+      <w:bookmarkEnd w:id="88"/>
     </w:p>
     <w:p>
       <w:pPr>
@@ -6613,7 +10276,7 @@
       <w:pPr>
         <w:pStyle w:val="FirstParagraph"/>
       </w:pPr>
-      <w:bookmarkStart w:id="88" w:name="eq-simplified-random-effects-model"/>
+      <w:bookmarkStart w:id="89" w:name="eq-simplified-random-effects-model"/>
       <m:oMathPara>
         <m:oMathParaPr>
           <m:jc m:val="center"/>
@@ -6776,7 +10439,7 @@
           </m:d>
         </m:oMath>
       </m:oMathPara>
-      <w:bookmarkEnd w:id="88"/>
+      <w:bookmarkEnd w:id="89"/>
     </w:p>
     <w:p>
       <w:pPr>
@@ -6815,7 +10478,7 @@
       <w:pPr>
         <w:pStyle w:val="FirstParagraph"/>
       </w:pPr>
-      <w:bookmarkStart w:id="89" w:name="eq-shared-period-model"/>
+      <w:bookmarkStart w:id="90" w:name="eq-shared-period-model"/>
       <m:oMathPara>
         <m:oMathParaPr>
           <m:jc m:val="center"/>
@@ -6999,7 +10662,7 @@
           </m:d>
         </m:oMath>
       </m:oMathPara>
-      <w:bookmarkEnd w:id="89"/>
+      <w:bookmarkEnd w:id="90"/>
     </w:p>
     <w:p>
       <w:pPr>
@@ -7038,7 +10701,7 @@
       <w:pPr>
         <w:pStyle w:val="FirstParagraph"/>
       </w:pPr>
-      <w:bookmarkStart w:id="90" w:name="eq-combined-simplified-model"/>
+      <w:bookmarkStart w:id="91" w:name="eq-combined-simplified-model"/>
       <m:oMathPara>
         <m:oMathParaPr>
           <m:jc m:val="center"/>
@@ -7198,7 +10861,7 @@
           </m:d>
         </m:oMath>
       </m:oMathPara>
-      <w:bookmarkEnd w:id="90"/>
+      <w:bookmarkEnd w:id="91"/>
     </w:p>
     <w:p>
       <w:pPr>
@@ -8039,7 +11702,7 @@
       <w:pPr>
         <w:pStyle w:val="BodyText"/>
       </w:pPr>
-      <w:bookmarkStart w:id="91" w:name="eq-distributional-assumptions"/>
+      <w:bookmarkStart w:id="92" w:name="eq-distributional-assumptions"/>
       <m:oMathPara>
         <m:oMathParaPr>
           <m:jc m:val="center"/>
@@ -8315,7 +11978,7 @@
           </m:d>
         </m:oMath>
       </m:oMathPara>
-      <w:bookmarkEnd w:id="91"/>
+      <w:bookmarkEnd w:id="92"/>
     </w:p>
     <w:p>
       <w:pPr>
@@ -8342,7 +12005,7 @@
         <w:t xml:space="preserve">All models will be fitted using residual pseudo-likelihood estimation based on linearisation with subject-specific expansion (RSPL), due to its computational stability and robust performance in small-sample settings. If the binomial model with the logit link converges but the corresponding model with the identity link does not, then we will report only an OR.</w:t>
       </w:r>
     </w:p>
-    <w:bookmarkStart w:id="104" w:name="sensitivity-analyses"/>
+    <w:bookmarkStart w:id="105" w:name="sensitivity-analyses"/>
     <w:p>
       <w:pPr>
         <w:pStyle w:val="Heading3"/>
@@ -8370,7 +12033,7 @@
         <w:t xml:space="preserve">. Unless otherwise stated, each sensitivity analysis will be operationalised using two separate models, one with the logit link and one with the identity link.</w:t>
       </w:r>
     </w:p>
-    <w:bookmarkStart w:id="93" w:name="X22dda602ebb4652e0fd291705062d91648ada05"/>
+    <w:bookmarkStart w:id="94" w:name="X22dda602ebb4652e0fd291705062d91648ada05"/>
     <w:p>
       <w:pPr>
         <w:pStyle w:val="Heading4"/>
@@ -8413,7 +12076,7 @@
       <w:pPr>
         <w:pStyle w:val="BodyText"/>
       </w:pPr>
-      <w:bookmarkStart w:id="92" w:name="eq-ar1"/>
+      <w:bookmarkStart w:id="93" w:name="eq-ar1"/>
       <m:oMathPara>
         <m:oMathParaPr>
           <m:jc m:val="center"/>
@@ -8591,7 +12254,7 @@
           </m:d>
         </m:oMath>
       </m:oMathPara>
-      <w:bookmarkEnd w:id="92"/>
+      <w:bookmarkEnd w:id="93"/>
     </w:p>
     <w:p>
       <w:pPr>
@@ -8752,8 +12415,8 @@
         <w:t xml:space="preserve">is not directly equivalent to parameters used in other specifications and should not be interpreted interchangeably.</w:t>
       </w:r>
     </w:p>
-    <w:bookmarkEnd w:id="93"/>
-    <w:bookmarkStart w:id="95" w:name="X265de50a776706f6d9ec7b4549b866a94e548a1"/>
+    <w:bookmarkEnd w:id="94"/>
+    <w:bookmarkStart w:id="96" w:name="X265de50a776706f6d9ec7b4549b866a94e548a1"/>
     <w:p>
       <w:pPr>
         <w:pStyle w:val="Heading4"/>
@@ -8788,7 +12451,7 @@
       <w:pPr>
         <w:pStyle w:val="BodyText"/>
       </w:pPr>
-      <w:bookmarkStart w:id="94" w:name="eq-model-batch-trend"/>
+      <w:bookmarkStart w:id="95" w:name="eq-model-batch-trend"/>
       <m:oMathPara>
         <m:oMathParaPr>
           <m:jc m:val="center"/>
@@ -8996,7 +12659,7 @@
           </m:d>
         </m:oMath>
       </m:oMathPara>
-      <w:bookmarkEnd w:id="94"/>
+      <w:bookmarkEnd w:id="95"/>
     </w:p>
     <w:p>
       <w:pPr>
@@ -9057,8 +12720,8 @@
         <w:t xml:space="preserve">, capturing between-batch variation in secular trends over time.</w:t>
       </w:r>
     </w:p>
-    <w:bookmarkEnd w:id="95"/>
-    <w:bookmarkStart w:id="97" w:name="X831bc7e780a434f5c3512e5d33d43284b7d37ce"/>
+    <w:bookmarkEnd w:id="96"/>
+    <w:bookmarkStart w:id="98" w:name="X831bc7e780a434f5c3512e5d33d43284b7d37ce"/>
     <w:p>
       <w:pPr>
         <w:pStyle w:val="Heading4"/>
@@ -9093,7 +12756,7 @@
       <w:pPr>
         <w:pStyle w:val="BodyText"/>
       </w:pPr>
-      <w:bookmarkStart w:id="96" w:name="eq-model-random-cluster-intervention"/>
+      <w:bookmarkStart w:id="97" w:name="eq-model-random-cluster-intervention"/>
       <m:oMathPara>
         <m:oMathParaPr>
           <m:jc m:val="center"/>
@@ -9319,7 +12982,7 @@
           </m:d>
         </m:oMath>
       </m:oMathPara>
-      <w:bookmarkEnd w:id="96"/>
+      <w:bookmarkEnd w:id="97"/>
     </w:p>
     <w:p>
       <w:pPr>
@@ -9494,8 +13157,8 @@
         <w:t xml:space="preserve">.</w:t>
       </w:r>
     </w:p>
-    <w:bookmarkEnd w:id="97"/>
-    <w:bookmarkStart w:id="99" w:name="X0324ad02af1274e3e5fe3c1dbe99d3dad84fc47"/>
+    <w:bookmarkEnd w:id="98"/>
+    <w:bookmarkStart w:id="100" w:name="X0324ad02af1274e3e5fe3c1dbe99d3dad84fc47"/>
     <w:p>
       <w:pPr>
         <w:pStyle w:val="Heading4"/>
@@ -9608,7 +13271,7 @@
       <w:pPr>
         <w:pStyle w:val="BodyText"/>
       </w:pPr>
-      <w:bookmarkStart w:id="98" w:name="eq-model-correlated-random-effects"/>
+      <w:bookmarkStart w:id="99" w:name="eq-model-correlated-random-effects"/>
       <m:oMathPara>
         <m:oMathParaPr>
           <m:jc m:val="center"/>
@@ -9834,7 +13497,7 @@
           </m:d>
         </m:oMath>
       </m:oMathPara>
-      <w:bookmarkEnd w:id="98"/>
+      <w:bookmarkEnd w:id="99"/>
     </w:p>
     <w:p>
       <w:pPr>
@@ -10224,8 +13887,8 @@
         </m:oMath>
       </m:oMathPara>
     </w:p>
-    <w:bookmarkEnd w:id="99"/>
-    <w:bookmarkStart w:id="101" w:name="Xb7b1d3ff7c24f0b8dca2081a41dd1947ef59e07"/>
+    <w:bookmarkEnd w:id="100"/>
+    <w:bookmarkStart w:id="102" w:name="Xb7b1d3ff7c24f0b8dca2081a41dd1947ef59e07"/>
     <w:p>
       <w:pPr>
         <w:pStyle w:val="Heading4"/>
@@ -10269,7 +13932,7 @@
       <w:pPr>
         <w:pStyle w:val="BodyText"/>
       </w:pPr>
-      <w:bookmarkStart w:id="100" w:name="eq-spline-model"/>
+      <w:bookmarkStart w:id="101" w:name="eq-spline-model"/>
       <m:oMathPara>
         <m:oMathParaPr>
           <m:jc m:val="center"/>
@@ -10546,7 +14209,7 @@
           </m:d>
         </m:oMath>
       </m:oMathPara>
-      <w:bookmarkEnd w:id="100"/>
+      <w:bookmarkEnd w:id="101"/>
     </w:p>
     <w:p>
       <w:pPr>
@@ -10708,8 +14371,8 @@
         <w:t xml:space="preserve">th spline basis function.</w:t>
       </w:r>
     </w:p>
-    <w:bookmarkEnd w:id="101"/>
-    <w:bookmarkStart w:id="103" w:name="models-exploring-lag-and-weaning-effects"/>
+    <w:bookmarkEnd w:id="102"/>
+    <w:bookmarkStart w:id="104" w:name="models-exploring-lag-and-weaning-effects"/>
     <w:p>
       <w:pPr>
         <w:pStyle w:val="Heading4"/>
@@ -10744,7 +14407,7 @@
       <w:pPr>
         <w:pStyle w:val="BodyText"/>
       </w:pPr>
-      <w:bookmarkStart w:id="102" w:name="eq-lag-weaning-model"/>
+      <w:bookmarkStart w:id="103" w:name="eq-lag-weaning-model"/>
       <m:oMathPara>
         <m:oMathParaPr>
           <m:jc m:val="center"/>
@@ -10995,7 +14658,7 @@
           </m:d>
         </m:oMath>
       </m:oMathPara>
-      <w:bookmarkEnd w:id="102"/>
+      <w:bookmarkEnd w:id="103"/>
     </w:p>
     <w:p>
       <w:pPr>
@@ -11061,9 +14724,9 @@
         <w:t xml:space="preserve">is the number of periods since first exposure.</w:t>
       </w:r>
     </w:p>
-    <w:bookmarkEnd w:id="103"/>
     <w:bookmarkEnd w:id="104"/>
-    <w:bookmarkStart w:id="105" w:name="adjusted-analyses"/>
+    <w:bookmarkEnd w:id="105"/>
+    <w:bookmarkStart w:id="106" w:name="adjusted-analyses"/>
     <w:p>
       <w:pPr>
         <w:pStyle w:val="Heading3"/>
@@ -11183,8 +14846,8 @@
         <w:t xml:space="preserve">as fixed effects. We will model the continuous covariates assuming linear effects. We will assume no interaction between subgroups and secular time trends, which may be evaluated in future analyses if indicated.</w:t>
       </w:r>
     </w:p>
-    <w:bookmarkEnd w:id="105"/>
-    <w:bookmarkStart w:id="106" w:name="subgroup-analyses"/>
+    <w:bookmarkEnd w:id="106"/>
+    <w:bookmarkStart w:id="107" w:name="subgroup-analyses"/>
     <w:p>
       <w:pPr>
         <w:pStyle w:val="Heading3"/>
@@ -11310,8 +14973,8 @@
         <w:t xml:space="preserve">.</w:t>
       </w:r>
     </w:p>
-    <w:bookmarkEnd w:id="106"/>
-    <w:bookmarkStart w:id="107" w:name="sec-treatment-of-missing-data"/>
+    <w:bookmarkEnd w:id="107"/>
+    <w:bookmarkStart w:id="108" w:name="sec-treatment-of-missing-data"/>
     <w:p>
       <w:pPr>
         <w:pStyle w:val="Heading3"/>
@@ -11328,9 +14991,9 @@
         <w:t xml:space="preserve">We will present the frequency and percentage of missing data for all variables. If the percentage of missing data for the primary outcome is less than 10%, we will perform a complete case analysis. If the percentage of missing data for the primary outcome is 10% or more, we will handle missing data depending on the missing data mechanism. If the data are missing at random (MAR), we will perform multiple imputation using multiple imputation by chained equations (MICE), imputing data for the primary outcome as well as all covariates included in the fully adjusted model. The number of imputations will be determined by the percentage of missing data, with a minimum of 20 imputations. If there is evidence that the data are missing not at random (MNAR), we will explore the impact of this assumption using a sensitivity analysis (e.g., pattern mixture models or selection models) to assess how robust our findings are to different assumptions about the missing data mechanism. Evidence that data are MNAR may include systematic differences in missingness across observed covariates, patterns suggestive of non-random dropout, or clinical expectations that missingness is related to unmeasured outcomes. Additionally, we will perform diagnostic checks after multiple imputation to ensure the quality of the imputation process, including comparing distributions of observed and imputed data and checking convergence.</w:t>
       </w:r>
     </w:p>
-    <w:bookmarkEnd w:id="107"/>
     <w:bookmarkEnd w:id="108"/>
-    <w:bookmarkStart w:id="122" w:name="analysis-of-secondary-outcomes"/>
+    <w:bookmarkEnd w:id="109"/>
+    <w:bookmarkStart w:id="123" w:name="analysis-of-secondary-outcomes"/>
     <w:p>
       <w:pPr>
         <w:pStyle w:val="Heading2"/>
@@ -11347,7 +15010,7 @@
         <w:t xml:space="preserve">Unless otherwise stated, secondary outcomes will be analysed using the same mixed-effects modelling framework as specified for the primary outcome, including fixed effects for time and intervention exposure and random effects for cluster and cluster-by-period, with the link function and outcome distribution adapted to the scale of the outcome.</w:t>
       </w:r>
     </w:p>
-    <w:bookmarkStart w:id="109" w:name="Xf8ad26412ad98b449304d4475d81963b294c2ae"/>
+    <w:bookmarkStart w:id="110" w:name="Xf8ad26412ad98b449304d4475d81963b294c2ae"/>
     <w:p>
       <w:pPr>
         <w:pStyle w:val="Heading3"/>
@@ -11378,8 +15041,8 @@
         <w:t xml:space="preserve">, to estimate odds ratios and absolute risk differences.</w:t>
       </w:r>
     </w:p>
-    <w:bookmarkEnd w:id="109"/>
-    <w:bookmarkStart w:id="112" w:name="X89c97a0c38ba473d58b2facce729a073a7e8df9"/>
+    <w:bookmarkEnd w:id="110"/>
+    <w:bookmarkStart w:id="113" w:name="X89c97a0c38ba473d58b2facce729a073a7e8df9"/>
     <w:p>
       <w:pPr>
         <w:pStyle w:val="Heading3"/>
@@ -11408,7 +15071,7 @@
       <w:pPr>
         <w:pStyle w:val="BodyText"/>
       </w:pPr>
-      <w:bookmarkStart w:id="110" w:name="eq-ordinal-model"/>
+      <w:bookmarkStart w:id="111" w:name="eq-ordinal-model"/>
       <m:oMathPara>
         <m:oMathParaPr>
           <m:jc m:val="center"/>
@@ -11608,7 +15271,7 @@
           </m:d>
         </m:oMath>
       </m:oMathPara>
-      <w:bookmarkEnd w:id="110"/>
+      <w:bookmarkEnd w:id="111"/>
     </w:p>
     <w:p>
       <w:pPr>
@@ -11664,7 +15327,7 @@
       <w:pPr>
         <w:pStyle w:val="BodyText"/>
       </w:pPr>
-      <w:bookmarkStart w:id="111" w:name="eq-linear-model"/>
+      <w:bookmarkStart w:id="112" w:name="eq-linear-model"/>
       <m:oMathPara>
         <m:oMathParaPr>
           <m:jc m:val="center"/>
@@ -11916,10 +15579,10 @@
           </m:d>
         </m:oMath>
       </m:oMathPara>
-      <w:bookmarkEnd w:id="111"/>
-    </w:p>
-    <w:bookmarkEnd w:id="112"/>
-    <w:bookmarkStart w:id="113" w:name="X90cb4e0ebfb4fe618dcdd24cc99dbcaedd01b78"/>
+      <w:bookmarkEnd w:id="112"/>
+    </w:p>
+    <w:bookmarkEnd w:id="113"/>
+    <w:bookmarkStart w:id="114" w:name="X90cb4e0ebfb4fe618dcdd24cc99dbcaedd01b78"/>
     <w:p>
       <w:pPr>
         <w:pStyle w:val="Heading3"/>
@@ -11985,8 +15648,8 @@
         <w:t xml:space="preserve">.</w:t>
       </w:r>
     </w:p>
-    <w:bookmarkEnd w:id="113"/>
-    <w:bookmarkStart w:id="114" w:name="X0c0155e4b87aec11ab06b9d09220f8543002113"/>
+    <w:bookmarkEnd w:id="114"/>
+    <w:bookmarkStart w:id="115" w:name="X0c0155e4b87aec11ab06b9d09220f8543002113"/>
     <w:p>
       <w:pPr>
         <w:pStyle w:val="Heading3"/>
@@ -12020,8 +15683,8 @@
         <w:t xml:space="preserve">with the logit link.</w:t>
       </w:r>
     </w:p>
-    <w:bookmarkEnd w:id="114"/>
-    <w:bookmarkStart w:id="116" w:name="length-of-emergency-department-stay"/>
+    <w:bookmarkEnd w:id="115"/>
+    <w:bookmarkStart w:id="117" w:name="length-of-emergency-department-stay"/>
     <w:p>
       <w:pPr>
         <w:pStyle w:val="Heading3"/>
@@ -12056,7 +15719,7 @@
       <w:pPr>
         <w:pStyle w:val="BodyText"/>
       </w:pPr>
-      <w:bookmarkStart w:id="115" w:name="eq-competing-risks-model"/>
+      <w:bookmarkStart w:id="116" w:name="eq-competing-risks-model"/>
       <m:oMathPara>
         <m:oMathParaPr>
           <m:jc m:val="center"/>
@@ -12250,7 +15913,7 @@
           </m:d>
         </m:oMath>
       </m:oMathPara>
-      <w:bookmarkEnd w:id="115"/>
+      <w:bookmarkEnd w:id="116"/>
     </w:p>
     <w:p>
       <w:pPr>
@@ -12439,8 +16102,8 @@
         <w:t xml:space="preserve">All other terms are defined as in the primary analysis model.</w:t>
       </w:r>
     </w:p>
-    <w:bookmarkEnd w:id="116"/>
-    <w:bookmarkStart w:id="117" w:name="length-of-hospital-stay"/>
+    <w:bookmarkEnd w:id="117"/>
+    <w:bookmarkStart w:id="118" w:name="length-of-hospital-stay"/>
     <w:p>
       <w:pPr>
         <w:pStyle w:val="Heading3"/>
@@ -12471,8 +16134,8 @@
         <w:t xml:space="preserve">.</w:t>
       </w:r>
     </w:p>
-    <w:bookmarkEnd w:id="117"/>
-    <w:bookmarkStart w:id="118" w:name="intensive-care-unit-admission"/>
+    <w:bookmarkEnd w:id="118"/>
+    <w:bookmarkStart w:id="119" w:name="intensive-care-unit-admission"/>
     <w:p>
       <w:pPr>
         <w:pStyle w:val="Heading3"/>
@@ -12506,8 +16169,8 @@
         <w:t xml:space="preserve">with the logit link.</w:t>
       </w:r>
     </w:p>
-    <w:bookmarkEnd w:id="118"/>
-    <w:bookmarkStart w:id="119" w:name="length-of-intensive-care-unit-stay"/>
+    <w:bookmarkEnd w:id="119"/>
+    <w:bookmarkStart w:id="120" w:name="length-of-intensive-care-unit-stay"/>
     <w:p>
       <w:pPr>
         <w:pStyle w:val="Heading3"/>
@@ -12538,8 +16201,8 @@
         <w:t xml:space="preserve">.</w:t>
       </w:r>
     </w:p>
-    <w:bookmarkEnd w:id="119"/>
-    <w:bookmarkStart w:id="121" w:name="X5037a1d47abaf80439915bb3ba5c524d444c7d7"/>
+    <w:bookmarkEnd w:id="120"/>
+    <w:bookmarkStart w:id="122" w:name="X5037a1d47abaf80439915bb3ba5c524d444c7d7"/>
     <w:p>
       <w:pPr>
         <w:pStyle w:val="Heading3"/>
@@ -12580,7 +16243,7 @@
       <w:pPr>
         <w:pStyle w:val="BodyText"/>
       </w:pPr>
-      <w:bookmarkStart w:id="120" w:name="eq-beta-model"/>
+      <w:bookmarkStart w:id="121" w:name="eq-beta-model"/>
       <m:oMathPara>
         <m:oMathParaPr>
           <m:jc m:val="center"/>
@@ -12759,7 +16422,7 @@
           </m:d>
         </m:oMath>
       </m:oMathPara>
-      <w:bookmarkEnd w:id="120"/>
+      <w:bookmarkEnd w:id="121"/>
     </w:p>
     <w:p>
       <w:pPr>
@@ -12865,10 +16528,10 @@
         <w:t xml:space="preserve">prior to fitting the beta regression model. A beta regression precision (dispersion) parameter will be estimated as part of the model.</w:t>
       </w:r>
     </w:p>
-    <w:bookmarkEnd w:id="121"/>
     <w:bookmarkEnd w:id="122"/>
     <w:bookmarkEnd w:id="123"/>
-    <w:bookmarkStart w:id="145" w:name="references"/>
+    <w:bookmarkEnd w:id="124"/>
+    <w:bookmarkStart w:id="146" w:name="references"/>
     <w:p>
       <w:pPr>
         <w:pStyle w:val="Heading1"/>
@@ -12877,8 +16540,8 @@
         <w:t xml:space="preserve">6. References</w:t>
       </w:r>
     </w:p>
-    <w:bookmarkStart w:id="144" w:name="refs"/>
-    <w:bookmarkStart w:id="124" w:name="ref-Kasza2022"/>
+    <w:bookmarkStart w:id="145" w:name="refs"/>
+    <w:bookmarkStart w:id="125" w:name="ref-Kasza2022"/>
     <w:p>
       <w:pPr>
         <w:pStyle w:val="Bibliography"/>
@@ -12932,8 +16595,8 @@
         <w:t xml:space="preserve">, 3627–3641 (2022).</w:t>
       </w:r>
     </w:p>
-    <w:bookmarkEnd w:id="124"/>
-    <w:bookmarkStart w:id="125" w:name="ref-grantham_staircase_2024"/>
+    <w:bookmarkEnd w:id="125"/>
+    <w:bookmarkStart w:id="126" w:name="ref-grantham_staircase_2024"/>
     <w:p>
       <w:pPr>
         <w:pStyle w:val="Bibliography"/>
@@ -12999,8 +16662,8 @@
         <w:t xml:space="preserve">, 24–41 (2024).</w:t>
       </w:r>
     </w:p>
-    <w:bookmarkEnd w:id="125"/>
-    <w:bookmarkStart w:id="126" w:name="ref-aukstakalnis_impact_2024"/>
+    <w:bookmarkEnd w:id="126"/>
+    <w:bookmarkStart w:id="127" w:name="ref-aukstakalnis_impact_2024"/>
     <w:p>
       <w:pPr>
         <w:pStyle w:val="Bibliography"/>
@@ -13047,8 +16710,8 @@
         <w:t xml:space="preserve">(2024).</w:t>
       </w:r>
     </w:p>
-    <w:bookmarkEnd w:id="126"/>
-    <w:bookmarkStart w:id="127" w:name="ref-Hemming2020Feb"/>
+    <w:bookmarkEnd w:id="127"/>
+    <w:bookmarkStart w:id="128" w:name="ref-Hemming2020Feb"/>
     <w:p>
       <w:pPr>
         <w:pStyle w:val="Bibliography"/>
@@ -13102,8 +16765,8 @@
         <w:t xml:space="preserve">, 979–995 (2020).</w:t>
       </w:r>
     </w:p>
-    <w:bookmarkEnd w:id="127"/>
-    <w:bookmarkStart w:id="128" w:name="ref-nakhid_effect_2026"/>
+    <w:bookmarkEnd w:id="128"/>
+    <w:bookmarkStart w:id="129" w:name="ref-nakhid_effect_2026"/>
     <w:p>
       <w:pPr>
         <w:pStyle w:val="Bibliography"/>
@@ -13150,8 +16813,8 @@
         <w:t xml:space="preserve">(2026).</w:t>
       </w:r>
     </w:p>
-    <w:bookmarkEnd w:id="128"/>
-    <w:bookmarkStart w:id="129" w:name="ref-gerdin_warnberg_feasibility_2025"/>
+    <w:bookmarkEnd w:id="129"/>
+    <w:bookmarkStart w:id="130" w:name="ref-gerdin_warnberg_feasibility_2025"/>
     <w:p>
       <w:pPr>
         <w:pStyle w:val="Bibliography"/>
@@ -13214,8 +16877,8 @@
         <w:t xml:space="preserve">, e099020 (2025).</w:t>
       </w:r>
     </w:p>
-    <w:bookmarkEnd w:id="129"/>
-    <w:bookmarkStart w:id="130" w:name="ref-Campbell2005"/>
+    <w:bookmarkEnd w:id="130"/>
+    <w:bookmarkStart w:id="131" w:name="ref-Campbell2005"/>
     <w:p>
       <w:pPr>
         <w:pStyle w:val="Bibliography"/>
@@ -13269,8 +16932,8 @@
         <w:t xml:space="preserve">, 99–107 (2005).</w:t>
       </w:r>
     </w:p>
-    <w:bookmarkEnd w:id="130"/>
-    <w:bookmarkStart w:id="131" w:name="ref-Eldridge2015"/>
+    <w:bookmarkEnd w:id="131"/>
+    <w:bookmarkStart w:id="132" w:name="ref-Eldridge2015"/>
     <w:p>
       <w:pPr>
         <w:pStyle w:val="Bibliography"/>
@@ -13324,8 +16987,8 @@
         <w:t xml:space="preserve">, 1039–1056 (2015).</w:t>
       </w:r>
     </w:p>
-    <w:bookmarkEnd w:id="131"/>
-    <w:bookmarkStart w:id="132" w:name="ref-Martin2016"/>
+    <w:bookmarkEnd w:id="132"/>
+    <w:bookmarkStart w:id="133" w:name="ref-Martin2016"/>
     <w:p>
       <w:pPr>
         <w:pStyle w:val="Bibliography"/>
@@ -13379,8 +17042,8 @@
         <w:t xml:space="preserve">, (2016).</w:t>
       </w:r>
     </w:p>
-    <w:bookmarkEnd w:id="132"/>
-    <w:bookmarkStart w:id="133" w:name="ref-Korevaar2021"/>
+    <w:bookmarkEnd w:id="133"/>
+    <w:bookmarkStart w:id="134" w:name="ref-Korevaar2021"/>
     <w:p>
       <w:pPr>
         <w:pStyle w:val="Bibliography"/>
@@ -13434,8 +17097,8 @@
         <w:t xml:space="preserve">, 529–540 (2021).</w:t>
       </w:r>
     </w:p>
-    <w:bookmarkEnd w:id="133"/>
-    <w:bookmarkStart w:id="134" w:name="ref-lashoher_implementation_2017"/>
+    <w:bookmarkEnd w:id="134"/>
+    <w:bookmarkStart w:id="135" w:name="ref-lashoher_implementation_2017"/>
     <w:p>
       <w:pPr>
         <w:pStyle w:val="Bibliography"/>
@@ -13603,8 +17266,8 @@
         <w:t xml:space="preserve">, 954–962 (2017).</w:t>
       </w:r>
     </w:p>
-    <w:bookmarkEnd w:id="134"/>
-    <w:bookmarkStart w:id="135" w:name="ref-kapitan_effect_2024"/>
+    <w:bookmarkEnd w:id="135"/>
+    <w:bookmarkStart w:id="136" w:name="ref-kapitan_effect_2024"/>
     <w:p>
       <w:pPr>
         <w:pStyle w:val="Bibliography"/>
@@ -13660,8 +17323,8 @@
         <w:t xml:space="preserve">2024.09.28.24314529 (2024).</w:t>
       </w:r>
     </w:p>
-    <w:bookmarkEnd w:id="135"/>
-    <w:bookmarkStart w:id="136" w:name="ref-higgins_psychometric_2021"/>
+    <w:bookmarkEnd w:id="136"/>
+    <w:bookmarkStart w:id="137" w:name="ref-higgins_psychometric_2021"/>
     <w:p>
       <w:pPr>
         <w:pStyle w:val="Bibliography"/>
@@ -13727,8 +17390,8 @@
         <w:t xml:space="preserve">, 103–112 (2021).</w:t>
       </w:r>
     </w:p>
-    <w:bookmarkEnd w:id="136"/>
-    <w:bookmarkStart w:id="137" w:name="ref-R"/>
+    <w:bookmarkEnd w:id="137"/>
+    <w:bookmarkStart w:id="138" w:name="ref-R"/>
     <w:p>
       <w:pPr>
         <w:pStyle w:val="Bibliography"/>
@@ -13759,8 +17422,8 @@
         <w:t xml:space="preserve">. (R Foundation for Statistical Computing, 2023).</w:t>
       </w:r>
     </w:p>
-    <w:bookmarkEnd w:id="137"/>
-    <w:bookmarkStart w:id="138" w:name="ref-Hemming2018"/>
+    <w:bookmarkEnd w:id="138"/>
+    <w:bookmarkStart w:id="139" w:name="ref-Hemming2018"/>
     <w:p>
       <w:pPr>
         <w:pStyle w:val="Bibliography"/>
@@ -13807,8 +17470,8 @@
         <w:t xml:space="preserve">k1614 (2018).</w:t>
       </w:r>
     </w:p>
-    <w:bookmarkEnd w:id="138"/>
-    <w:bookmarkStart w:id="139" w:name="ref-grantham_evaluating_2022"/>
+    <w:bookmarkEnd w:id="139"/>
+    <w:bookmarkStart w:id="140" w:name="ref-grantham_evaluating_2022"/>
     <w:p>
       <w:pPr>
         <w:pStyle w:val="Bibliography"/>
@@ -13874,8 +17537,8 @@
         <w:t xml:space="preserve">, 112 (2022).</w:t>
       </w:r>
     </w:p>
-    <w:bookmarkEnd w:id="139"/>
-    <w:bookmarkStart w:id="140" w:name="ref-kenny_analysis_2022"/>
+    <w:bookmarkEnd w:id="140"/>
+    <w:bookmarkStart w:id="141" w:name="ref-kenny_analysis_2022"/>
     <w:p>
       <w:pPr>
         <w:pStyle w:val="Bibliography"/>
@@ -13922,8 +17585,8 @@
         <w:t xml:space="preserve">10.1002/sim.9511 (2022).</w:t>
       </w:r>
     </w:p>
-    <w:bookmarkEnd w:id="140"/>
-    <w:bookmarkStart w:id="141" w:name="ref-Diaz2021"/>
+    <w:bookmarkEnd w:id="141"/>
+    <w:bookmarkStart w:id="142" w:name="ref-Diaz2021"/>
     <w:p>
       <w:pPr>
         <w:pStyle w:val="Bibliography"/>
@@ -13977,8 +17640,8 @@
         <w:t xml:space="preserve">, e436–e443 (2021).</w:t>
       </w:r>
     </w:p>
-    <w:bookmarkEnd w:id="141"/>
-    <w:bookmarkStart w:id="142" w:name="ref-hornor_quality_2018"/>
+    <w:bookmarkEnd w:id="142"/>
+    <w:bookmarkStart w:id="143" w:name="ref-hornor_quality_2018"/>
     <w:p>
       <w:pPr>
         <w:pStyle w:val="Bibliography"/>
@@ -14074,8 +17737,8 @@
         <w:t xml:space="preserve">, 160–169 (2018).</w:t>
       </w:r>
     </w:p>
-    <w:bookmarkEnd w:id="142"/>
-    <w:bookmarkStart w:id="143" w:name="ref-ustun_measuring_2010"/>
+    <w:bookmarkEnd w:id="143"/>
+    <w:bookmarkStart w:id="144" w:name="ref-ustun_measuring_2010"/>
     <w:p>
       <w:pPr>
         <w:pStyle w:val="Bibliography"/>
@@ -14284,9 +17947,9 @@
         <w:t xml:space="preserve">. (World Health Organization, 2010).</w:t>
       </w:r>
     </w:p>
-    <w:bookmarkEnd w:id="143"/>
     <w:bookmarkEnd w:id="144"/>
     <w:bookmarkEnd w:id="145"/>
+    <w:bookmarkEnd w:id="146"/>
     <w:sectPr>
       <w:footnotePr>
         <w:numRestart w:val="eachSect"/>

</xml_diff>

<commit_message>
Fix bolding of secion headers
</commit_message>
<xml_diff>
--- a/statistical-analysis-plan/statistical-analysis-plan.docx
+++ b/statistical-analysis-plan/statistical-analysis-plan.docx
@@ -10234,8 +10234,9 @@
                     <w:rPr>
                       <w:rFonts w:ascii="Calibri" w:hAnsi="Calibri"/>
                       <w:sz w:val="20"/>
-                    </w:rPr>
-                    <w:t xml:space="default">**Primary outcome**, </w:t>
+                      <w:b w:val="true"/>
+                    </w:rPr>
+                    <w:t xml:space="default">Primary outcome, </w:t>
                   </w:r>
                 </w:p>
               </w:tc>
@@ -10537,8 +10538,9 @@
                     <w:rPr>
                       <w:rFonts w:ascii="Calibri" w:hAnsi="Calibri"/>
                       <w:sz w:val="20"/>
-                    </w:rPr>
-                    <w:t xml:space="default">**Secondary outcomes (main stepped-wedge design)**, </w:t>
+                      <w:b w:val="true"/>
+                    </w:rPr>
+                    <w:t xml:space="default">Secondary outcomes (main stepped-wedge design), </w:t>
                   </w:r>
                 </w:p>
               </w:tc>
@@ -12456,8 +12458,9 @@
                     <w:rPr>
                       <w:rFonts w:ascii="Calibri" w:hAnsi="Calibri"/>
                       <w:sz w:val="20"/>
-                    </w:rPr>
-                    <w:t xml:space="default">**Secondary outcomes (nested staircase design)**, </w:t>
+                      <w:b w:val="true"/>
+                    </w:rPr>
+                    <w:t xml:space="default">Secondary outcomes (nested staircase design), </w:t>
                   </w:r>
                 </w:p>
               </w:tc>

</xml_diff>

<commit_message>
Refactor EQ-5D-5L requests in outcomes table function; update statistical analysis plan for clarity and consistency in missing values presentation.
</commit_message>
<xml_diff>
--- a/statistical-analysis-plan/statistical-analysis-plan.docx
+++ b/statistical-analysis-plan/statistical-analysis-plan.docx
@@ -12965,7 +12965,7 @@
                       <w:rFonts w:ascii="Calibri" w:hAnsi="Calibri"/>
                       <w:sz w:val="20"/>
                     </w:rPr>
-                    <w:t xml:space="default">EQ-5D-5L visual analogue scale within seven days of discharge, Median (Q1, Q3)</w:t>
+                    <w:t xml:space="default">EQ-5D-5L index score at 30 days, Median (Q1, Q3)</w:t>
                   </w:r>
                 </w:p>
               </w:tc>
@@ -13167,613 +13167,7 @@
                       <w:rFonts w:ascii="Calibri" w:hAnsi="Calibri"/>
                       <w:sz w:val="20"/>
                     </w:rPr>
-                    <w:t xml:space="default">EQ-5D-5L index score at 30 days, Median (Q1, Q3)</w:t>
-                  </w:r>
-                </w:p>
-              </w:tc>
-              <w:tc>
-                <w:tcPr>
-                  <w:tcBorders>
-                    <w:top w:val="single" w:space="0" w:color="D3D3D3"/>
-                    <w:bottom w:val="single" w:space="0" w:color="D3D3D3"/>
-                    <w:start w:val="single" w:space="0" w:color="D3D3D3"/>
-                    <w:end w:val="single" w:space="0" w:color="D3D3D3"/>
-                  </w:tcBorders>
-                </w:tcPr>
-                <w:p>
-                  <w:pPr>
-                    <w:spacing w:before="0" w:after="60"/>
-                    <w:keepNext/>
-                    <w:jc w:val="center"/>
-                  </w:pPr>
-                  <w:r>
-                    <w:rPr>
-                      <w:rFonts w:ascii="Calibri" w:hAnsi="Calibri"/>
-                      <w:sz w:val="20"/>
-                    </w:rPr>
-                    <w:t xml:space="default"/>
-                  </w:r>
-                </w:p>
-              </w:tc>
-              <w:tc>
-                <w:tcPr>
-                  <w:tcBorders>
-                    <w:top w:val="single" w:space="0" w:color="D3D3D3"/>
-                    <w:bottom w:val="single" w:space="0" w:color="D3D3D3"/>
-                    <w:start w:val="single" w:space="0" w:color="D3D3D3"/>
-                    <w:end w:val="single" w:space="0" w:color="D3D3D3"/>
-                  </w:tcBorders>
-                </w:tcPr>
-                <w:p>
-                  <w:pPr>
-                    <w:spacing w:before="0" w:after="60"/>
-                    <w:keepNext/>
-                    <w:jc w:val="center"/>
-                  </w:pPr>
-                  <w:r>
-                    <w:rPr>
-                      <w:rFonts w:ascii="Calibri" w:hAnsi="Calibri"/>
-                      <w:sz w:val="20"/>
-                    </w:rPr>
-                    <w:t xml:space="default"/>
-                  </w:r>
-                </w:p>
-              </w:tc>
-              <w:tc>
-                <w:tcPr>
-                  <w:tcBorders>
-                    <w:top w:val="single" w:space="0" w:color="D3D3D3"/>
-                    <w:bottom w:val="single" w:space="0" w:color="D3D3D3"/>
-                    <w:start w:val="single" w:space="0" w:color="D3D3D3"/>
-                    <w:end w:val="single" w:space="0" w:color="D3D3D3"/>
-                  </w:tcBorders>
-                </w:tcPr>
-                <w:p>
-                  <w:pPr>
-                    <w:spacing w:before="0" w:after="60"/>
-                    <w:keepNext/>
-                    <w:jc w:val="center"/>
-                  </w:pPr>
-                  <w:r>
-                    <w:rPr>
-                      <w:rFonts w:ascii="Calibri" w:hAnsi="Calibri"/>
-                      <w:sz w:val="20"/>
-                    </w:rPr>
-                    <w:t xml:space="default"/>
-                  </w:r>
-                </w:p>
-              </w:tc>
-            </w:tr>
-            <w:tr>
-              <w:trPr>
-                <w:cantSplit/>
-              </w:trPr>
-              <w:tc>
-                <w:tcPr>
-                  <w:tcBorders>
-                    <w:top w:val="single" w:space="0" w:color="D3D3D3"/>
-                    <w:bottom w:val="single" w:space="0" w:color="D3D3D3"/>
-                    <w:start w:val="single" w:space="0" w:color="D3D3D3"/>
-                    <w:end w:val="single" w:space="0" w:color="D3D3D3"/>
-                  </w:tcBorders>
-                </w:tcPr>
-                <w:p>
-                  <w:pPr>
-                    <w:spacing w:before="0" w:after="60"/>
-                    <w:keepNext/>
-                    <w:jc w:val="start"/>
-                  </w:pPr>
-                  <w:r>
-                    <w:rPr>
-                      <w:rFonts w:ascii="Calibri" w:hAnsi="Calibri"/>
-                      <w:sz w:val="20"/>
-                    </w:rPr>
-                    <w:t xml:space="default">    Missing</w:t>
-                  </w:r>
-                </w:p>
-              </w:tc>
-              <w:tc>
-                <w:tcPr>
-                  <w:tcBorders>
-                    <w:top w:val="single" w:space="0" w:color="D3D3D3"/>
-                    <w:bottom w:val="single" w:space="0" w:color="D3D3D3"/>
-                    <w:start w:val="single" w:space="0" w:color="D3D3D3"/>
-                    <w:end w:val="single" w:space="0" w:color="D3D3D3"/>
-                  </w:tcBorders>
-                </w:tcPr>
-                <w:p>
-                  <w:pPr>
-                    <w:spacing w:before="0" w:after="60"/>
-                    <w:keepNext/>
-                    <w:jc w:val="center"/>
-                  </w:pPr>
-                  <w:r>
-                    <w:rPr>
-                      <w:rFonts w:ascii="Calibri" w:hAnsi="Calibri"/>
-                      <w:sz w:val="20"/>
-                    </w:rPr>
-                    <w:t xml:space="default"/>
-                  </w:r>
-                </w:p>
-              </w:tc>
-              <w:tc>
-                <w:tcPr>
-                  <w:tcBorders>
-                    <w:top w:val="single" w:space="0" w:color="D3D3D3"/>
-                    <w:bottom w:val="single" w:space="0" w:color="D3D3D3"/>
-                    <w:start w:val="single" w:space="0" w:color="D3D3D3"/>
-                    <w:end w:val="single" w:space="0" w:color="D3D3D3"/>
-                  </w:tcBorders>
-                </w:tcPr>
-                <w:p>
-                  <w:pPr>
-                    <w:spacing w:before="0" w:after="60"/>
-                    <w:keepNext/>
-                    <w:jc w:val="center"/>
-                  </w:pPr>
-                  <w:r>
-                    <w:rPr>
-                      <w:rFonts w:ascii="Calibri" w:hAnsi="Calibri"/>
-                      <w:sz w:val="20"/>
-                    </w:rPr>
-                    <w:t xml:space="default"/>
-                  </w:r>
-                </w:p>
-              </w:tc>
-              <w:tc>
-                <w:tcPr>
-                  <w:tcBorders>
-                    <w:top w:val="single" w:space="0" w:color="D3D3D3"/>
-                    <w:bottom w:val="single" w:space="0" w:color="D3D3D3"/>
-                    <w:start w:val="single" w:space="0" w:color="D3D3D3"/>
-                    <w:end w:val="single" w:space="0" w:color="D3D3D3"/>
-                  </w:tcBorders>
-                </w:tcPr>
-                <w:p>
-                  <w:pPr>
-                    <w:spacing w:before="0" w:after="60"/>
-                    <w:keepNext/>
-                    <w:jc w:val="center"/>
-                  </w:pPr>
-                  <w:r>
-                    <w:rPr>
-                      <w:rFonts w:ascii="Calibri" w:hAnsi="Calibri"/>
-                      <w:sz w:val="20"/>
-                    </w:rPr>
-                    <w:t xml:space="default"/>
-                  </w:r>
-                </w:p>
-              </w:tc>
-            </w:tr>
-            <w:tr>
-              <w:trPr>
-                <w:cantSplit/>
-              </w:trPr>
-              <w:tc>
-                <w:tcPr>
-                  <w:tcBorders>
-                    <w:top w:val="single" w:space="0" w:color="D3D3D3"/>
-                    <w:bottom w:val="single" w:space="0" w:color="D3D3D3"/>
-                    <w:start w:val="single" w:space="0" w:color="D3D3D3"/>
-                    <w:end w:val="single" w:space="0" w:color="D3D3D3"/>
-                  </w:tcBorders>
-                </w:tcPr>
-                <w:p>
-                  <w:pPr>
-                    <w:spacing w:before="0" w:after="60"/>
-                    <w:keepNext/>
-                    <w:jc w:val="start"/>
-                  </w:pPr>
-                  <w:r>
-                    <w:rPr>
-                      <w:rFonts w:ascii="Calibri" w:hAnsi="Calibri"/>
-                      <w:sz w:val="20"/>
-                    </w:rPr>
-                    <w:t xml:space="default">EQ-5D-5L visual analogue scale at 30 days, Median (Q1, Q3)</w:t>
-                  </w:r>
-                </w:p>
-              </w:tc>
-              <w:tc>
-                <w:tcPr>
-                  <w:tcBorders>
-                    <w:top w:val="single" w:space="0" w:color="D3D3D3"/>
-                    <w:bottom w:val="single" w:space="0" w:color="D3D3D3"/>
-                    <w:start w:val="single" w:space="0" w:color="D3D3D3"/>
-                    <w:end w:val="single" w:space="0" w:color="D3D3D3"/>
-                  </w:tcBorders>
-                </w:tcPr>
-                <w:p>
-                  <w:pPr>
-                    <w:spacing w:before="0" w:after="60"/>
-                    <w:keepNext/>
-                    <w:jc w:val="center"/>
-                  </w:pPr>
-                  <w:r>
-                    <w:rPr>
-                      <w:rFonts w:ascii="Calibri" w:hAnsi="Calibri"/>
-                      <w:sz w:val="20"/>
-                    </w:rPr>
-                    <w:t xml:space="default"/>
-                  </w:r>
-                </w:p>
-              </w:tc>
-              <w:tc>
-                <w:tcPr>
-                  <w:tcBorders>
-                    <w:top w:val="single" w:space="0" w:color="D3D3D3"/>
-                    <w:bottom w:val="single" w:space="0" w:color="D3D3D3"/>
-                    <w:start w:val="single" w:space="0" w:color="D3D3D3"/>
-                    <w:end w:val="single" w:space="0" w:color="D3D3D3"/>
-                  </w:tcBorders>
-                </w:tcPr>
-                <w:p>
-                  <w:pPr>
-                    <w:spacing w:before="0" w:after="60"/>
-                    <w:keepNext/>
-                    <w:jc w:val="center"/>
-                  </w:pPr>
-                  <w:r>
-                    <w:rPr>
-                      <w:rFonts w:ascii="Calibri" w:hAnsi="Calibri"/>
-                      <w:sz w:val="20"/>
-                    </w:rPr>
-                    <w:t xml:space="default"/>
-                  </w:r>
-                </w:p>
-              </w:tc>
-              <w:tc>
-                <w:tcPr>
-                  <w:tcBorders>
-                    <w:top w:val="single" w:space="0" w:color="D3D3D3"/>
-                    <w:bottom w:val="single" w:space="0" w:color="D3D3D3"/>
-                    <w:start w:val="single" w:space="0" w:color="D3D3D3"/>
-                    <w:end w:val="single" w:space="0" w:color="D3D3D3"/>
-                  </w:tcBorders>
-                </w:tcPr>
-                <w:p>
-                  <w:pPr>
-                    <w:spacing w:before="0" w:after="60"/>
-                    <w:keepNext/>
-                    <w:jc w:val="center"/>
-                  </w:pPr>
-                  <w:r>
-                    <w:rPr>
-                      <w:rFonts w:ascii="Calibri" w:hAnsi="Calibri"/>
-                      <w:sz w:val="20"/>
-                    </w:rPr>
-                    <w:t xml:space="default"/>
-                  </w:r>
-                </w:p>
-              </w:tc>
-            </w:tr>
-            <w:tr>
-              <w:trPr>
-                <w:cantSplit/>
-              </w:trPr>
-              <w:tc>
-                <w:tcPr>
-                  <w:tcBorders>
-                    <w:top w:val="single" w:space="0" w:color="D3D3D3"/>
-                    <w:bottom w:val="single" w:space="0" w:color="D3D3D3"/>
-                    <w:start w:val="single" w:space="0" w:color="D3D3D3"/>
-                    <w:end w:val="single" w:space="0" w:color="D3D3D3"/>
-                  </w:tcBorders>
-                </w:tcPr>
-                <w:p>
-                  <w:pPr>
-                    <w:spacing w:before="0" w:after="60"/>
-                    <w:keepNext/>
-                    <w:jc w:val="start"/>
-                  </w:pPr>
-                  <w:r>
-                    <w:rPr>
-                      <w:rFonts w:ascii="Calibri" w:hAnsi="Calibri"/>
-                      <w:sz w:val="20"/>
-                    </w:rPr>
-                    <w:t xml:space="default">    Missing</w:t>
-                  </w:r>
-                </w:p>
-              </w:tc>
-              <w:tc>
-                <w:tcPr>
-                  <w:tcBorders>
-                    <w:top w:val="single" w:space="0" w:color="D3D3D3"/>
-                    <w:bottom w:val="single" w:space="0" w:color="D3D3D3"/>
-                    <w:start w:val="single" w:space="0" w:color="D3D3D3"/>
-                    <w:end w:val="single" w:space="0" w:color="D3D3D3"/>
-                  </w:tcBorders>
-                </w:tcPr>
-                <w:p>
-                  <w:pPr>
-                    <w:spacing w:before="0" w:after="60"/>
-                    <w:keepNext/>
-                    <w:jc w:val="center"/>
-                  </w:pPr>
-                  <w:r>
-                    <w:rPr>
-                      <w:rFonts w:ascii="Calibri" w:hAnsi="Calibri"/>
-                      <w:sz w:val="20"/>
-                    </w:rPr>
-                    <w:t xml:space="default"/>
-                  </w:r>
-                </w:p>
-              </w:tc>
-              <w:tc>
-                <w:tcPr>
-                  <w:tcBorders>
-                    <w:top w:val="single" w:space="0" w:color="D3D3D3"/>
-                    <w:bottom w:val="single" w:space="0" w:color="D3D3D3"/>
-                    <w:start w:val="single" w:space="0" w:color="D3D3D3"/>
-                    <w:end w:val="single" w:space="0" w:color="D3D3D3"/>
-                  </w:tcBorders>
-                </w:tcPr>
-                <w:p>
-                  <w:pPr>
-                    <w:spacing w:before="0" w:after="60"/>
-                    <w:keepNext/>
-                    <w:jc w:val="center"/>
-                  </w:pPr>
-                  <w:r>
-                    <w:rPr>
-                      <w:rFonts w:ascii="Calibri" w:hAnsi="Calibri"/>
-                      <w:sz w:val="20"/>
-                    </w:rPr>
-                    <w:t xml:space="default"/>
-                  </w:r>
-                </w:p>
-              </w:tc>
-              <w:tc>
-                <w:tcPr>
-                  <w:tcBorders>
-                    <w:top w:val="single" w:space="0" w:color="D3D3D3"/>
-                    <w:bottom w:val="single" w:space="0" w:color="D3D3D3"/>
-                    <w:start w:val="single" w:space="0" w:color="D3D3D3"/>
-                    <w:end w:val="single" w:space="0" w:color="D3D3D3"/>
-                  </w:tcBorders>
-                </w:tcPr>
-                <w:p>
-                  <w:pPr>
-                    <w:spacing w:before="0" w:after="60"/>
-                    <w:keepNext/>
-                    <w:jc w:val="center"/>
-                  </w:pPr>
-                  <w:r>
-                    <w:rPr>
-                      <w:rFonts w:ascii="Calibri" w:hAnsi="Calibri"/>
-                      <w:sz w:val="20"/>
-                    </w:rPr>
-                    <w:t xml:space="default"/>
-                  </w:r>
-                </w:p>
-              </w:tc>
-            </w:tr>
-            <w:tr>
-              <w:trPr>
-                <w:cantSplit/>
-              </w:trPr>
-              <w:tc>
-                <w:tcPr>
-                  <w:tcBorders>
-                    <w:top w:val="single" w:space="0" w:color="D3D3D3"/>
-                    <w:bottom w:val="single" w:space="0" w:color="D3D3D3"/>
-                    <w:start w:val="single" w:space="0" w:color="D3D3D3"/>
-                    <w:end w:val="single" w:space="0" w:color="D3D3D3"/>
-                  </w:tcBorders>
-                </w:tcPr>
-                <w:p>
-                  <w:pPr>
-                    <w:spacing w:before="0" w:after="60"/>
-                    <w:keepNext/>
-                    <w:jc w:val="start"/>
-                  </w:pPr>
-                  <w:r>
-                    <w:rPr>
-                      <w:rFonts w:ascii="Calibri" w:hAnsi="Calibri"/>
-                      <w:sz w:val="20"/>
-                    </w:rPr>
                     <w:t xml:space="default">EQ-5D-5L index score at three months, Median (Q1, Q3)</w:t>
-                  </w:r>
-                </w:p>
-              </w:tc>
-              <w:tc>
-                <w:tcPr>
-                  <w:tcBorders>
-                    <w:top w:val="single" w:space="0" w:color="D3D3D3"/>
-                    <w:bottom w:val="single" w:space="0" w:color="D3D3D3"/>
-                    <w:start w:val="single" w:space="0" w:color="D3D3D3"/>
-                    <w:end w:val="single" w:space="0" w:color="D3D3D3"/>
-                  </w:tcBorders>
-                </w:tcPr>
-                <w:p>
-                  <w:pPr>
-                    <w:spacing w:before="0" w:after="60"/>
-                    <w:keepNext/>
-                    <w:jc w:val="center"/>
-                  </w:pPr>
-                  <w:r>
-                    <w:rPr>
-                      <w:rFonts w:ascii="Calibri" w:hAnsi="Calibri"/>
-                      <w:sz w:val="20"/>
-                    </w:rPr>
-                    <w:t xml:space="default"/>
-                  </w:r>
-                </w:p>
-              </w:tc>
-              <w:tc>
-                <w:tcPr>
-                  <w:tcBorders>
-                    <w:top w:val="single" w:space="0" w:color="D3D3D3"/>
-                    <w:bottom w:val="single" w:space="0" w:color="D3D3D3"/>
-                    <w:start w:val="single" w:space="0" w:color="D3D3D3"/>
-                    <w:end w:val="single" w:space="0" w:color="D3D3D3"/>
-                  </w:tcBorders>
-                </w:tcPr>
-                <w:p>
-                  <w:pPr>
-                    <w:spacing w:before="0" w:after="60"/>
-                    <w:keepNext/>
-                    <w:jc w:val="center"/>
-                  </w:pPr>
-                  <w:r>
-                    <w:rPr>
-                      <w:rFonts w:ascii="Calibri" w:hAnsi="Calibri"/>
-                      <w:sz w:val="20"/>
-                    </w:rPr>
-                    <w:t xml:space="default"/>
-                  </w:r>
-                </w:p>
-              </w:tc>
-              <w:tc>
-                <w:tcPr>
-                  <w:tcBorders>
-                    <w:top w:val="single" w:space="0" w:color="D3D3D3"/>
-                    <w:bottom w:val="single" w:space="0" w:color="D3D3D3"/>
-                    <w:start w:val="single" w:space="0" w:color="D3D3D3"/>
-                    <w:end w:val="single" w:space="0" w:color="D3D3D3"/>
-                  </w:tcBorders>
-                </w:tcPr>
-                <w:p>
-                  <w:pPr>
-                    <w:spacing w:before="0" w:after="60"/>
-                    <w:keepNext/>
-                    <w:jc w:val="center"/>
-                  </w:pPr>
-                  <w:r>
-                    <w:rPr>
-                      <w:rFonts w:ascii="Calibri" w:hAnsi="Calibri"/>
-                      <w:sz w:val="20"/>
-                    </w:rPr>
-                    <w:t xml:space="default"/>
-                  </w:r>
-                </w:p>
-              </w:tc>
-            </w:tr>
-            <w:tr>
-              <w:trPr>
-                <w:cantSplit/>
-              </w:trPr>
-              <w:tc>
-                <w:tcPr>
-                  <w:tcBorders>
-                    <w:top w:val="single" w:space="0" w:color="D3D3D3"/>
-                    <w:bottom w:val="single" w:space="0" w:color="D3D3D3"/>
-                    <w:start w:val="single" w:space="0" w:color="D3D3D3"/>
-                    <w:end w:val="single" w:space="0" w:color="D3D3D3"/>
-                  </w:tcBorders>
-                </w:tcPr>
-                <w:p>
-                  <w:pPr>
-                    <w:spacing w:before="0" w:after="60"/>
-                    <w:keepNext/>
-                    <w:jc w:val="start"/>
-                  </w:pPr>
-                  <w:r>
-                    <w:rPr>
-                      <w:rFonts w:ascii="Calibri" w:hAnsi="Calibri"/>
-                      <w:sz w:val="20"/>
-                    </w:rPr>
-                    <w:t xml:space="default">    Missing</w:t>
-                  </w:r>
-                </w:p>
-              </w:tc>
-              <w:tc>
-                <w:tcPr>
-                  <w:tcBorders>
-                    <w:top w:val="single" w:space="0" w:color="D3D3D3"/>
-                    <w:bottom w:val="single" w:space="0" w:color="D3D3D3"/>
-                    <w:start w:val="single" w:space="0" w:color="D3D3D3"/>
-                    <w:end w:val="single" w:space="0" w:color="D3D3D3"/>
-                  </w:tcBorders>
-                </w:tcPr>
-                <w:p>
-                  <w:pPr>
-                    <w:spacing w:before="0" w:after="60"/>
-                    <w:keepNext/>
-                    <w:jc w:val="center"/>
-                  </w:pPr>
-                  <w:r>
-                    <w:rPr>
-                      <w:rFonts w:ascii="Calibri" w:hAnsi="Calibri"/>
-                      <w:sz w:val="20"/>
-                    </w:rPr>
-                    <w:t xml:space="default"/>
-                  </w:r>
-                </w:p>
-              </w:tc>
-              <w:tc>
-                <w:tcPr>
-                  <w:tcBorders>
-                    <w:top w:val="single" w:space="0" w:color="D3D3D3"/>
-                    <w:bottom w:val="single" w:space="0" w:color="D3D3D3"/>
-                    <w:start w:val="single" w:space="0" w:color="D3D3D3"/>
-                    <w:end w:val="single" w:space="0" w:color="D3D3D3"/>
-                  </w:tcBorders>
-                </w:tcPr>
-                <w:p>
-                  <w:pPr>
-                    <w:spacing w:before="0" w:after="60"/>
-                    <w:keepNext/>
-                    <w:jc w:val="center"/>
-                  </w:pPr>
-                  <w:r>
-                    <w:rPr>
-                      <w:rFonts w:ascii="Calibri" w:hAnsi="Calibri"/>
-                      <w:sz w:val="20"/>
-                    </w:rPr>
-                    <w:t xml:space="default"/>
-                  </w:r>
-                </w:p>
-              </w:tc>
-              <w:tc>
-                <w:tcPr>
-                  <w:tcBorders>
-                    <w:top w:val="single" w:space="0" w:color="D3D3D3"/>
-                    <w:bottom w:val="single" w:space="0" w:color="D3D3D3"/>
-                    <w:start w:val="single" w:space="0" w:color="D3D3D3"/>
-                    <w:end w:val="single" w:space="0" w:color="D3D3D3"/>
-                  </w:tcBorders>
-                </w:tcPr>
-                <w:p>
-                  <w:pPr>
-                    <w:spacing w:before="0" w:after="60"/>
-                    <w:keepNext/>
-                    <w:jc w:val="center"/>
-                  </w:pPr>
-                  <w:r>
-                    <w:rPr>
-                      <w:rFonts w:ascii="Calibri" w:hAnsi="Calibri"/>
-                      <w:sz w:val="20"/>
-                    </w:rPr>
-                    <w:t xml:space="default"/>
-                  </w:r>
-                </w:p>
-              </w:tc>
-            </w:tr>
-            <w:tr>
-              <w:trPr>
-                <w:cantSplit/>
-              </w:trPr>
-              <w:tc>
-                <w:tcPr>
-                  <w:tcBorders>
-                    <w:top w:val="single" w:space="0" w:color="D3D3D3"/>
-                    <w:bottom w:val="single" w:space="0" w:color="D3D3D3"/>
-                    <w:start w:val="single" w:space="0" w:color="D3D3D3"/>
-                    <w:end w:val="single" w:space="0" w:color="D3D3D3"/>
-                  </w:tcBorders>
-                </w:tcPr>
-                <w:p>
-                  <w:pPr>
-                    <w:spacing w:before="0" w:after="60"/>
-                    <w:keepNext/>
-                    <w:jc w:val="start"/>
-                  </w:pPr>
-                  <w:r>
-                    <w:rPr>
-                      <w:rFonts w:ascii="Calibri" w:hAnsi="Calibri"/>
-                      <w:sz w:val="20"/>
-                    </w:rPr>
-                    <w:t xml:space="default">EQ-5D-5L visual analogue scale at three months, Median (Q1, Q3)</w:t>
                   </w:r>
                 </w:p>
               </w:tc>

</xml_diff>